<commit_message>
chore(reports): VPS full report 2026-06-26 02:38 UTC (46 settled, WR 63.0%, PF 1.0451)
</commit_message>
<xml_diff>
--- a/vps_full_reports/latest/report.docx
+++ b/vps_full_reports/latest/report.docx
@@ -20,7 +20,7 @@
           <w:color w:val="666666"/>
           <w:sz w:val="20"/>
         </w:rPr>
-        <w:t>PAPER ONLY  ·  reconciled=True  ·  ticks=8</w:t>
+        <w:t>PAPER ONLY  ·  reconciled=True  ·  ticks=93</w:t>
       </w:r>
     </w:p>
     <w:p>
@@ -33,7 +33,7 @@
     </w:p>
     <w:p>
       <w:r>
-        <w:t>Overall score: 76.5 / 100  (Grade: C+)</w:t>
+        <w:t>Overall score: 69.0 / 100  (Grade: D)</w:t>
       </w:r>
     </w:p>
     <w:tbl>
@@ -107,7 +107,7 @@
           </w:tcPr>
           <w:p>
             <w:r>
-              <w:t>72.1</w:t>
+              <w:t>67.7</w:t>
             </w:r>
           </w:p>
         </w:tc>
@@ -117,7 +117,7 @@
           </w:tcPr>
           <w:p>
             <w:r>
-              <w:t>C</w:t>
+              <w:t>D</w:t>
             </w:r>
           </w:p>
         </w:tc>
@@ -149,7 +149,7 @@
           </w:tcPr>
           <w:p>
             <w:r>
-              <w:t>90.3</w:t>
+              <w:t>90.6</w:t>
             </w:r>
           </w:p>
         </w:tc>
@@ -191,7 +191,7 @@
           </w:tcPr>
           <w:p>
             <w:r>
-              <w:t>71.4</w:t>
+              <w:t>49.9</w:t>
             </w:r>
           </w:p>
         </w:tc>
@@ -201,7 +201,7 @@
           </w:tcPr>
           <w:p>
             <w:r>
-              <w:t>C</w:t>
+              <w:t>F</w:t>
             </w:r>
           </w:p>
         </w:tc>
@@ -319,7 +319,7 @@
           </w:tcPr>
           <w:p>
             <w:r>
-              <w:t>2026-06-25 13:31:23</w:t>
+              <w:t>2026-06-25 22:38:02</w:t>
             </w:r>
           </w:p>
         </w:tc>
@@ -329,7 +329,7 @@
           </w:tcPr>
           <w:p>
             <w:r>
-              <w:t>29</w:t>
+              <w:t>35</w:t>
             </w:r>
           </w:p>
         </w:tc>
@@ -339,7 +339,7 @@
           </w:tcPr>
           <w:p>
             <w:r>
-              <w:t>72.1</w:t>
+              <w:t>54.1</w:t>
             </w:r>
           </w:p>
         </w:tc>
@@ -349,7 +349,7 @@
           </w:tcPr>
           <w:p>
             <w:r>
-              <w:t>90.3</w:t>
+              <w:t>90.5</w:t>
             </w:r>
           </w:p>
         </w:tc>
@@ -359,7 +359,7 @@
           </w:tcPr>
           <w:p>
             <w:r>
-              <w:t>71.4</w:t>
+              <w:t>54.8</w:t>
             </w:r>
           </w:p>
         </w:tc>
@@ -369,7 +369,1375 @@
           </w:tcPr>
           <w:p>
             <w:r>
-              <w:t>76.5</w:t>
+              <w:t>63.4</w:t>
+            </w:r>
+          </w:p>
+        </w:tc>
+        <w:tc>
+          <w:tcPr>
+            <w:tcW w:type="dxa" w:w="1234"/>
+          </w:tcPr>
+          <w:p>
+            <w:r>
+              <w:t>558</w:t>
+            </w:r>
+          </w:p>
+        </w:tc>
+      </w:tr>
+      <w:tr>
+        <w:tc>
+          <w:tcPr>
+            <w:tcW w:type="dxa" w:w="1234"/>
+          </w:tcPr>
+          <w:p>
+            <w:r>
+              <w:t>2026-06-25 22:42:42</w:t>
+            </w:r>
+          </w:p>
+        </w:tc>
+        <w:tc>
+          <w:tcPr>
+            <w:tcW w:type="dxa" w:w="1234"/>
+          </w:tcPr>
+          <w:p>
+            <w:r>
+              <w:t>36</w:t>
+            </w:r>
+          </w:p>
+        </w:tc>
+        <w:tc>
+          <w:tcPr>
+            <w:tcW w:type="dxa" w:w="1234"/>
+          </w:tcPr>
+          <w:p>
+            <w:r>
+              <w:t>56.5</w:t>
+            </w:r>
+          </w:p>
+        </w:tc>
+        <w:tc>
+          <w:tcPr>
+            <w:tcW w:type="dxa" w:w="1234"/>
+          </w:tcPr>
+          <w:p>
+            <w:r>
+              <w:t>90.5</w:t>
+            </w:r>
+          </w:p>
+        </w:tc>
+        <w:tc>
+          <w:tcPr>
+            <w:tcW w:type="dxa" w:w="1234"/>
+          </w:tcPr>
+          <w:p>
+            <w:r>
+              <w:t>52.6</w:t>
+            </w:r>
+          </w:p>
+        </w:tc>
+        <w:tc>
+          <w:tcPr>
+            <w:tcW w:type="dxa" w:w="1234"/>
+          </w:tcPr>
+          <w:p>
+            <w:r>
+              <w:t>64.0</w:t>
+            </w:r>
+          </w:p>
+        </w:tc>
+        <w:tc>
+          <w:tcPr>
+            <w:tcW w:type="dxa" w:w="1234"/>
+          </w:tcPr>
+          <w:p>
+            <w:r>
+              <w:t>628</w:t>
+            </w:r>
+          </w:p>
+        </w:tc>
+      </w:tr>
+      <w:tr>
+        <w:tc>
+          <w:tcPr>
+            <w:tcW w:type="dxa" w:w="1234"/>
+          </w:tcPr>
+          <w:p>
+            <w:r>
+              <w:t>2026-06-25 22:46:31</w:t>
+            </w:r>
+          </w:p>
+        </w:tc>
+        <w:tc>
+          <w:tcPr>
+            <w:tcW w:type="dxa" w:w="1234"/>
+          </w:tcPr>
+          <w:p>
+            <w:r>
+              <w:t>37</w:t>
+            </w:r>
+          </w:p>
+        </w:tc>
+        <w:tc>
+          <w:tcPr>
+            <w:tcW w:type="dxa" w:w="1234"/>
+          </w:tcPr>
+          <w:p>
+            <w:r>
+              <w:t>58.6</w:t>
+            </w:r>
+          </w:p>
+        </w:tc>
+        <w:tc>
+          <w:tcPr>
+            <w:tcW w:type="dxa" w:w="1234"/>
+          </w:tcPr>
+          <w:p>
+            <w:r>
+              <w:t>90.5</w:t>
+            </w:r>
+          </w:p>
+        </w:tc>
+        <w:tc>
+          <w:tcPr>
+            <w:tcW w:type="dxa" w:w="1234"/>
+          </w:tcPr>
+          <w:p>
+            <w:r>
+              <w:t>50.8</w:t>
+            </w:r>
+          </w:p>
+        </w:tc>
+        <w:tc>
+          <w:tcPr>
+            <w:tcW w:type="dxa" w:w="1234"/>
+          </w:tcPr>
+          <w:p>
+            <w:r>
+              <w:t>64.6</w:t>
+            </w:r>
+          </w:p>
+        </w:tc>
+        <w:tc>
+          <w:tcPr>
+            <w:tcW w:type="dxa" w:w="1234"/>
+          </w:tcPr>
+          <w:p>
+            <w:r>
+              <w:t>42</w:t>
+            </w:r>
+          </w:p>
+        </w:tc>
+      </w:tr>
+      <w:tr>
+        <w:tc>
+          <w:tcPr>
+            <w:tcW w:type="dxa" w:w="1234"/>
+          </w:tcPr>
+          <w:p>
+            <w:r>
+              <w:t>2026-06-25 23:16:34</w:t>
+            </w:r>
+          </w:p>
+        </w:tc>
+        <w:tc>
+          <w:tcPr>
+            <w:tcW w:type="dxa" w:w="1234"/>
+          </w:tcPr>
+          <w:p>
+            <w:r>
+              <w:t>37</w:t>
+            </w:r>
+          </w:p>
+        </w:tc>
+        <w:tc>
+          <w:tcPr>
+            <w:tcW w:type="dxa" w:w="1234"/>
+          </w:tcPr>
+          <w:p>
+            <w:r>
+              <w:t>58.6</w:t>
+            </w:r>
+          </w:p>
+        </w:tc>
+        <w:tc>
+          <w:tcPr>
+            <w:tcW w:type="dxa" w:w="1234"/>
+          </w:tcPr>
+          <w:p>
+            <w:r>
+              <w:t>90.6</w:t>
+            </w:r>
+          </w:p>
+        </w:tc>
+        <w:tc>
+          <w:tcPr>
+            <w:tcW w:type="dxa" w:w="1234"/>
+          </w:tcPr>
+          <w:p>
+            <w:r>
+              <w:t>50.8</w:t>
+            </w:r>
+          </w:p>
+        </w:tc>
+        <w:tc>
+          <w:tcPr>
+            <w:tcW w:type="dxa" w:w="1234"/>
+          </w:tcPr>
+          <w:p>
+            <w:r>
+              <w:t>64.7</w:t>
+            </w:r>
+          </w:p>
+        </w:tc>
+        <w:tc>
+          <w:tcPr>
+            <w:tcW w:type="dxa" w:w="1234"/>
+          </w:tcPr>
+          <w:p>
+            <w:r>
+              <w:t>428</w:t>
+            </w:r>
+          </w:p>
+        </w:tc>
+      </w:tr>
+      <w:tr>
+        <w:tc>
+          <w:tcPr>
+            <w:tcW w:type="dxa" w:w="1234"/>
+          </w:tcPr>
+          <w:p>
+            <w:r>
+              <w:t>2026-06-25 23:46:38</w:t>
+            </w:r>
+          </w:p>
+        </w:tc>
+        <w:tc>
+          <w:tcPr>
+            <w:tcW w:type="dxa" w:w="1234"/>
+          </w:tcPr>
+          <w:p>
+            <w:r>
+              <w:t>37</w:t>
+            </w:r>
+          </w:p>
+        </w:tc>
+        <w:tc>
+          <w:tcPr>
+            <w:tcW w:type="dxa" w:w="1234"/>
+          </w:tcPr>
+          <w:p>
+            <w:r>
+              <w:t>58.6</w:t>
+            </w:r>
+          </w:p>
+        </w:tc>
+        <w:tc>
+          <w:tcPr>
+            <w:tcW w:type="dxa" w:w="1234"/>
+          </w:tcPr>
+          <w:p>
+            <w:r>
+              <w:t>90.6</w:t>
+            </w:r>
+          </w:p>
+        </w:tc>
+        <w:tc>
+          <w:tcPr>
+            <w:tcW w:type="dxa" w:w="1234"/>
+          </w:tcPr>
+          <w:p>
+            <w:r>
+              <w:t>50.8</w:t>
+            </w:r>
+          </w:p>
+        </w:tc>
+        <w:tc>
+          <w:tcPr>
+            <w:tcW w:type="dxa" w:w="1234"/>
+          </w:tcPr>
+          <w:p>
+            <w:r>
+              <w:t>64.7</w:t>
+            </w:r>
+          </w:p>
+        </w:tc>
+        <w:tc>
+          <w:tcPr>
+            <w:tcW w:type="dxa" w:w="1234"/>
+          </w:tcPr>
+          <w:p>
+            <w:r>
+              <w:t>67</w:t>
+            </w:r>
+          </w:p>
+        </w:tc>
+      </w:tr>
+      <w:tr>
+        <w:tc>
+          <w:tcPr>
+            <w:tcW w:type="dxa" w:w="1234"/>
+          </w:tcPr>
+          <w:p>
+            <w:r>
+              <w:t>2026-06-26 00:02:45</w:t>
+            </w:r>
+          </w:p>
+        </w:tc>
+        <w:tc>
+          <w:tcPr>
+            <w:tcW w:type="dxa" w:w="1234"/>
+          </w:tcPr>
+          <w:p>
+            <w:r>
+              <w:t>38</w:t>
+            </w:r>
+          </w:p>
+        </w:tc>
+        <w:tc>
+          <w:tcPr>
+            <w:tcW w:type="dxa" w:w="1234"/>
+          </w:tcPr>
+          <w:p>
+            <w:r>
+              <w:t>61.4</w:t>
+            </w:r>
+          </w:p>
+        </w:tc>
+        <w:tc>
+          <w:tcPr>
+            <w:tcW w:type="dxa" w:w="1234"/>
+          </w:tcPr>
+          <w:p>
+            <w:r>
+              <w:t>90.6</w:t>
+            </w:r>
+          </w:p>
+        </w:tc>
+        <w:tc>
+          <w:tcPr>
+            <w:tcW w:type="dxa" w:w="1234"/>
+          </w:tcPr>
+          <w:p>
+            <w:r>
+              <w:t>52.7</w:t>
+            </w:r>
+          </w:p>
+        </w:tc>
+        <w:tc>
+          <w:tcPr>
+            <w:tcW w:type="dxa" w:w="1234"/>
+          </w:tcPr>
+          <w:p>
+            <w:r>
+              <w:t>66.5</w:t>
+            </w:r>
+          </w:p>
+        </w:tc>
+        <w:tc>
+          <w:tcPr>
+            <w:tcW w:type="dxa" w:w="1234"/>
+          </w:tcPr>
+          <w:p>
+            <w:r>
+              <w:t>309</w:t>
+            </w:r>
+          </w:p>
+        </w:tc>
+      </w:tr>
+      <w:tr>
+        <w:tc>
+          <w:tcPr>
+            <w:tcW w:type="dxa" w:w="1234"/>
+          </w:tcPr>
+          <w:p>
+            <w:r>
+              <w:t>2026-06-26 00:08:01</w:t>
+            </w:r>
+          </w:p>
+        </w:tc>
+        <w:tc>
+          <w:tcPr>
+            <w:tcW w:type="dxa" w:w="1234"/>
+          </w:tcPr>
+          <w:p>
+            <w:r>
+              <w:t>39</w:t>
+            </w:r>
+          </w:p>
+        </w:tc>
+        <w:tc>
+          <w:tcPr>
+            <w:tcW w:type="dxa" w:w="1234"/>
+          </w:tcPr>
+          <w:p>
+            <w:r>
+              <w:t>64.0</w:t>
+            </w:r>
+          </w:p>
+        </w:tc>
+        <w:tc>
+          <w:tcPr>
+            <w:tcW w:type="dxa" w:w="1234"/>
+          </w:tcPr>
+          <w:p>
+            <w:r>
+              <w:t>90.6</w:t>
+            </w:r>
+          </w:p>
+        </w:tc>
+        <w:tc>
+          <w:tcPr>
+            <w:tcW w:type="dxa" w:w="1234"/>
+          </w:tcPr>
+          <w:p>
+            <w:r>
+              <w:t>51.1</w:t>
+            </w:r>
+          </w:p>
+        </w:tc>
+        <w:tc>
+          <w:tcPr>
+            <w:tcW w:type="dxa" w:w="1234"/>
+          </w:tcPr>
+          <w:p>
+            <w:r>
+              <w:t>67.4</w:t>
+            </w:r>
+          </w:p>
+        </w:tc>
+        <w:tc>
+          <w:tcPr>
+            <w:tcW w:type="dxa" w:w="1234"/>
+          </w:tcPr>
+          <w:p>
+            <w:r>
+              <w:t>388</w:t>
+            </w:r>
+          </w:p>
+        </w:tc>
+      </w:tr>
+      <w:tr>
+        <w:tc>
+          <w:tcPr>
+            <w:tcW w:type="dxa" w:w="1234"/>
+          </w:tcPr>
+          <w:p>
+            <w:r>
+              <w:t>2026-06-26 00:13:01</w:t>
+            </w:r>
+          </w:p>
+        </w:tc>
+        <w:tc>
+          <w:tcPr>
+            <w:tcW w:type="dxa" w:w="1234"/>
+          </w:tcPr>
+          <w:p>
+            <w:r>
+              <w:t>40</w:t>
+            </w:r>
+          </w:p>
+        </w:tc>
+        <w:tc>
+          <w:tcPr>
+            <w:tcW w:type="dxa" w:w="1234"/>
+          </w:tcPr>
+          <w:p>
+            <w:r>
+              <w:t>66.3</w:t>
+            </w:r>
+          </w:p>
+        </w:tc>
+        <w:tc>
+          <w:tcPr>
+            <w:tcW w:type="dxa" w:w="1234"/>
+          </w:tcPr>
+          <w:p>
+            <w:r>
+              <w:t>90.6</w:t>
+            </w:r>
+          </w:p>
+        </w:tc>
+        <w:tc>
+          <w:tcPr>
+            <w:tcW w:type="dxa" w:w="1234"/>
+          </w:tcPr>
+          <w:p>
+            <w:r>
+              <w:t>51.1</w:t>
+            </w:r>
+          </w:p>
+        </w:tc>
+        <w:tc>
+          <w:tcPr>
+            <w:tcW w:type="dxa" w:w="1234"/>
+          </w:tcPr>
+          <w:p>
+            <w:r>
+              <w:t>68.6</w:t>
+            </w:r>
+          </w:p>
+        </w:tc>
+        <w:tc>
+          <w:tcPr>
+            <w:tcW w:type="dxa" w:w="1234"/>
+          </w:tcPr>
+          <w:p>
+            <w:r>
+              <w:t>463</w:t>
+            </w:r>
+          </w:p>
+        </w:tc>
+      </w:tr>
+      <w:tr>
+        <w:tc>
+          <w:tcPr>
+            <w:tcW w:type="dxa" w:w="1234"/>
+          </w:tcPr>
+          <w:p>
+            <w:r>
+              <w:t>2026-06-26 00:13:05</w:t>
+            </w:r>
+          </w:p>
+        </w:tc>
+        <w:tc>
+          <w:tcPr>
+            <w:tcW w:type="dxa" w:w="1234"/>
+          </w:tcPr>
+          <w:p>
+            <w:r>
+              <w:t>40</w:t>
+            </w:r>
+          </w:p>
+        </w:tc>
+        <w:tc>
+          <w:tcPr>
+            <w:tcW w:type="dxa" w:w="1234"/>
+          </w:tcPr>
+          <w:p>
+            <w:r>
+              <w:t>66.3</w:t>
+            </w:r>
+          </w:p>
+        </w:tc>
+        <w:tc>
+          <w:tcPr>
+            <w:tcW w:type="dxa" w:w="1234"/>
+          </w:tcPr>
+          <w:p>
+            <w:r>
+              <w:t>75.6</w:t>
+            </w:r>
+          </w:p>
+        </w:tc>
+        <w:tc>
+          <w:tcPr>
+            <w:tcW w:type="dxa" w:w="1234"/>
+          </w:tcPr>
+          <w:p>
+            <w:r>
+              <w:t>51.1</w:t>
+            </w:r>
+          </w:p>
+        </w:tc>
+        <w:tc>
+          <w:tcPr>
+            <w:tcW w:type="dxa" w:w="1234"/>
+          </w:tcPr>
+          <w:p>
+            <w:r>
+              <w:t>64.8</w:t>
+            </w:r>
+          </w:p>
+        </w:tc>
+        <w:tc>
+          <w:tcPr>
+            <w:tcW w:type="dxa" w:w="1234"/>
+          </w:tcPr>
+          <w:p>
+            <w:r>
+              <w:t>464</w:t>
+            </w:r>
+          </w:p>
+        </w:tc>
+      </w:tr>
+      <w:tr>
+        <w:tc>
+          <w:tcPr>
+            <w:tcW w:type="dxa" w:w="1234"/>
+          </w:tcPr>
+          <w:p>
+            <w:r>
+              <w:t>2026-06-26 00:18:02</w:t>
+            </w:r>
+          </w:p>
+        </w:tc>
+        <w:tc>
+          <w:tcPr>
+            <w:tcW w:type="dxa" w:w="1234"/>
+          </w:tcPr>
+          <w:p>
+            <w:r>
+              <w:t>41</w:t>
+            </w:r>
+          </w:p>
+        </w:tc>
+        <w:tc>
+          <w:tcPr>
+            <w:tcW w:type="dxa" w:w="1234"/>
+          </w:tcPr>
+          <w:p>
+            <w:r>
+              <w:t>69.4</w:t>
+            </w:r>
+          </w:p>
+        </w:tc>
+        <w:tc>
+          <w:tcPr>
+            <w:tcW w:type="dxa" w:w="1234"/>
+          </w:tcPr>
+          <w:p>
+            <w:r>
+              <w:t>75.6</w:t>
+            </w:r>
+          </w:p>
+        </w:tc>
+        <w:tc>
+          <w:tcPr>
+            <w:tcW w:type="dxa" w:w="1234"/>
+          </w:tcPr>
+          <w:p>
+            <w:r>
+              <w:t>51.1</w:t>
+            </w:r>
+          </w:p>
+        </w:tc>
+        <w:tc>
+          <w:tcPr>
+            <w:tcW w:type="dxa" w:w="1234"/>
+          </w:tcPr>
+          <w:p>
+            <w:r>
+              <w:t>66.4</w:t>
+            </w:r>
+          </w:p>
+        </w:tc>
+        <w:tc>
+          <w:tcPr>
+            <w:tcW w:type="dxa" w:w="1234"/>
+          </w:tcPr>
+          <w:p>
+            <w:r>
+              <w:t>538</w:t>
+            </w:r>
+          </w:p>
+        </w:tc>
+      </w:tr>
+      <w:tr>
+        <w:tc>
+          <w:tcPr>
+            <w:tcW w:type="dxa" w:w="1234"/>
+          </w:tcPr>
+          <w:p>
+            <w:r>
+              <w:t>2026-06-26 00:29:19</w:t>
+            </w:r>
+          </w:p>
+        </w:tc>
+        <w:tc>
+          <w:tcPr>
+            <w:tcW w:type="dxa" w:w="1234"/>
+          </w:tcPr>
+          <w:p>
+            <w:r>
+              <w:t>41</w:t>
+            </w:r>
+          </w:p>
+        </w:tc>
+        <w:tc>
+          <w:tcPr>
+            <w:tcW w:type="dxa" w:w="1234"/>
+          </w:tcPr>
+          <w:p>
+            <w:r>
+              <w:t>69.4</w:t>
+            </w:r>
+          </w:p>
+        </w:tc>
+        <w:tc>
+          <w:tcPr>
+            <w:tcW w:type="dxa" w:w="1234"/>
+          </w:tcPr>
+          <w:p>
+            <w:r>
+              <w:t>90.6</w:t>
+            </w:r>
+          </w:p>
+        </w:tc>
+        <w:tc>
+          <w:tcPr>
+            <w:tcW w:type="dxa" w:w="1234"/>
+          </w:tcPr>
+          <w:p>
+            <w:r>
+              <w:t>51.1</w:t>
+            </w:r>
+          </w:p>
+        </w:tc>
+        <w:tc>
+          <w:tcPr>
+            <w:tcW w:type="dxa" w:w="1234"/>
+          </w:tcPr>
+          <w:p>
+            <w:r>
+              <w:t>70.1</w:t>
+            </w:r>
+          </w:p>
+        </w:tc>
+        <w:tc>
+          <w:tcPr>
+            <w:tcW w:type="dxa" w:w="1234"/>
+          </w:tcPr>
+          <w:p>
+            <w:r>
+              <w:t>1</w:t>
+            </w:r>
+          </w:p>
+        </w:tc>
+      </w:tr>
+      <w:tr>
+        <w:tc>
+          <w:tcPr>
+            <w:tcW w:type="dxa" w:w="1234"/>
+          </w:tcPr>
+          <w:p>
+            <w:r>
+              <w:t>2026-06-26 00:38:02</w:t>
+            </w:r>
+          </w:p>
+        </w:tc>
+        <w:tc>
+          <w:tcPr>
+            <w:tcW w:type="dxa" w:w="1234"/>
+          </w:tcPr>
+          <w:p>
+            <w:r>
+              <w:t>42</w:t>
+            </w:r>
+          </w:p>
+        </w:tc>
+        <w:tc>
+          <w:tcPr>
+            <w:tcW w:type="dxa" w:w="1234"/>
+          </w:tcPr>
+          <w:p>
+            <w:r>
+              <w:t>64.0</w:t>
+            </w:r>
+          </w:p>
+        </w:tc>
+        <w:tc>
+          <w:tcPr>
+            <w:tcW w:type="dxa" w:w="1234"/>
+          </w:tcPr>
+          <w:p>
+            <w:r>
+              <w:t>90.6</w:t>
+            </w:r>
+          </w:p>
+        </w:tc>
+        <w:tc>
+          <w:tcPr>
+            <w:tcW w:type="dxa" w:w="1234"/>
+          </w:tcPr>
+          <w:p>
+            <w:r>
+              <w:t>48.5</w:t>
+            </w:r>
+          </w:p>
+        </w:tc>
+        <w:tc>
+          <w:tcPr>
+            <w:tcW w:type="dxa" w:w="1234"/>
+          </w:tcPr>
+          <w:p>
+            <w:r>
+              <w:t>66.8</w:t>
+            </w:r>
+          </w:p>
+        </w:tc>
+        <w:tc>
+          <w:tcPr>
+            <w:tcW w:type="dxa" w:w="1234"/>
+          </w:tcPr>
+          <w:p>
+            <w:r>
+              <w:t>132</w:t>
+            </w:r>
+          </w:p>
+        </w:tc>
+      </w:tr>
+      <w:tr>
+        <w:tc>
+          <w:tcPr>
+            <w:tcW w:type="dxa" w:w="1234"/>
+          </w:tcPr>
+          <w:p>
+            <w:r>
+              <w:t>2026-06-26 00:38:06</w:t>
+            </w:r>
+          </w:p>
+        </w:tc>
+        <w:tc>
+          <w:tcPr>
+            <w:tcW w:type="dxa" w:w="1234"/>
+          </w:tcPr>
+          <w:p>
+            <w:r>
+              <w:t>42</w:t>
+            </w:r>
+          </w:p>
+        </w:tc>
+        <w:tc>
+          <w:tcPr>
+            <w:tcW w:type="dxa" w:w="1234"/>
+          </w:tcPr>
+          <w:p>
+            <w:r>
+              <w:t>64.0</w:t>
+            </w:r>
+          </w:p>
+        </w:tc>
+        <w:tc>
+          <w:tcPr>
+            <w:tcW w:type="dxa" w:w="1234"/>
+          </w:tcPr>
+          <w:p>
+            <w:r>
+              <w:t>75.6</w:t>
+            </w:r>
+          </w:p>
+        </w:tc>
+        <w:tc>
+          <w:tcPr>
+            <w:tcW w:type="dxa" w:w="1234"/>
+          </w:tcPr>
+          <w:p>
+            <w:r>
+              <w:t>48.5</w:t>
+            </w:r>
+          </w:p>
+        </w:tc>
+        <w:tc>
+          <w:tcPr>
+            <w:tcW w:type="dxa" w:w="1234"/>
+          </w:tcPr>
+          <w:p>
+            <w:r>
+              <w:t>63.0</w:t>
+            </w:r>
+          </w:p>
+        </w:tc>
+        <w:tc>
+          <w:tcPr>
+            <w:tcW w:type="dxa" w:w="1234"/>
+          </w:tcPr>
+          <w:p>
+            <w:r>
+              <w:t>133</w:t>
+            </w:r>
+          </w:p>
+        </w:tc>
+      </w:tr>
+      <w:tr>
+        <w:tc>
+          <w:tcPr>
+            <w:tcW w:type="dxa" w:w="1234"/>
+          </w:tcPr>
+          <w:p>
+            <w:r>
+              <w:t>2026-06-26 00:43:03</w:t>
+            </w:r>
+          </w:p>
+        </w:tc>
+        <w:tc>
+          <w:tcPr>
+            <w:tcW w:type="dxa" w:w="1234"/>
+          </w:tcPr>
+          <w:p>
+            <w:r>
+              <w:t>43</w:t>
+            </w:r>
+          </w:p>
+        </w:tc>
+        <w:tc>
+          <w:tcPr>
+            <w:tcW w:type="dxa" w:w="1234"/>
+          </w:tcPr>
+          <w:p>
+            <w:r>
+              <w:t>66.7</w:t>
+            </w:r>
+          </w:p>
+        </w:tc>
+        <w:tc>
+          <w:tcPr>
+            <w:tcW w:type="dxa" w:w="1234"/>
+          </w:tcPr>
+          <w:p>
+            <w:r>
+              <w:t>75.6</w:t>
+            </w:r>
+          </w:p>
+        </w:tc>
+        <w:tc>
+          <w:tcPr>
+            <w:tcW w:type="dxa" w:w="1234"/>
+          </w:tcPr>
+          <w:p>
+            <w:r>
+              <w:t>50.4</w:t>
+            </w:r>
+          </w:p>
+        </w:tc>
+        <w:tc>
+          <w:tcPr>
+            <w:tcW w:type="dxa" w:w="1234"/>
+          </w:tcPr>
+          <w:p>
+            <w:r>
+              <w:t>64.8</w:t>
+            </w:r>
+          </w:p>
+        </w:tc>
+        <w:tc>
+          <w:tcPr>
+            <w:tcW w:type="dxa" w:w="1234"/>
+          </w:tcPr>
+          <w:p>
+            <w:r>
+              <w:t>207</w:t>
+            </w:r>
+          </w:p>
+        </w:tc>
+      </w:tr>
+      <w:tr>
+        <w:tc>
+          <w:tcPr>
+            <w:tcW w:type="dxa" w:w="1234"/>
+          </w:tcPr>
+          <w:p>
+            <w:r>
+              <w:t>2026-06-26 01:13:06</w:t>
+            </w:r>
+          </w:p>
+        </w:tc>
+        <w:tc>
+          <w:tcPr>
+            <w:tcW w:type="dxa" w:w="1234"/>
+          </w:tcPr>
+          <w:p>
+            <w:r>
+              <w:t>43</w:t>
+            </w:r>
+          </w:p>
+        </w:tc>
+        <w:tc>
+          <w:tcPr>
+            <w:tcW w:type="dxa" w:w="1234"/>
+          </w:tcPr>
+          <w:p>
+            <w:r>
+              <w:t>66.7</w:t>
+            </w:r>
+          </w:p>
+        </w:tc>
+        <w:tc>
+          <w:tcPr>
+            <w:tcW w:type="dxa" w:w="1234"/>
+          </w:tcPr>
+          <w:p>
+            <w:r>
+              <w:t>75.6</w:t>
+            </w:r>
+          </w:p>
+        </w:tc>
+        <w:tc>
+          <w:tcPr>
+            <w:tcW w:type="dxa" w:w="1234"/>
+          </w:tcPr>
+          <w:p>
+            <w:r>
+              <w:t>50.4</w:t>
+            </w:r>
+          </w:p>
+        </w:tc>
+        <w:tc>
+          <w:tcPr>
+            <w:tcW w:type="dxa" w:w="1234"/>
+          </w:tcPr>
+          <w:p>
+            <w:r>
+              <w:t>64.8</w:t>
+            </w:r>
+          </w:p>
+        </w:tc>
+        <w:tc>
+          <w:tcPr>
+            <w:tcW w:type="dxa" w:w="1234"/>
+          </w:tcPr>
+          <w:p>
+            <w:r>
+              <w:t>657</w:t>
+            </w:r>
+          </w:p>
+        </w:tc>
+      </w:tr>
+      <w:tr>
+        <w:tc>
+          <w:tcPr>
+            <w:tcW w:type="dxa" w:w="1234"/>
+          </w:tcPr>
+          <w:p>
+            <w:r>
+              <w:t>2026-06-26 01:41:44</w:t>
+            </w:r>
+          </w:p>
+        </w:tc>
+        <w:tc>
+          <w:tcPr>
+            <w:tcW w:type="dxa" w:w="1234"/>
+          </w:tcPr>
+          <w:p>
+            <w:r>
+              <w:t>43</w:t>
+            </w:r>
+          </w:p>
+        </w:tc>
+        <w:tc>
+          <w:tcPr>
+            <w:tcW w:type="dxa" w:w="1234"/>
+          </w:tcPr>
+          <w:p>
+            <w:r>
+              <w:t>66.7</w:t>
+            </w:r>
+          </w:p>
+        </w:tc>
+        <w:tc>
+          <w:tcPr>
+            <w:tcW w:type="dxa" w:w="1234"/>
+          </w:tcPr>
+          <w:p>
+            <w:r>
+              <w:t>90.6</w:t>
+            </w:r>
+          </w:p>
+        </w:tc>
+        <w:tc>
+          <w:tcPr>
+            <w:tcW w:type="dxa" w:w="1234"/>
+          </w:tcPr>
+          <w:p>
+            <w:r>
+              <w:t>50.4</w:t>
+            </w:r>
+          </w:p>
+        </w:tc>
+        <w:tc>
+          <w:tcPr>
+            <w:tcW w:type="dxa" w:w="1234"/>
+          </w:tcPr>
+          <w:p>
+            <w:r>
+              <w:t>68.6</w:t>
+            </w:r>
+          </w:p>
+        </w:tc>
+        <w:tc>
+          <w:tcPr>
+            <w:tcW w:type="dxa" w:w="1234"/>
+          </w:tcPr>
+          <w:p>
+            <w:r>
+              <w:t>1</w:t>
+            </w:r>
+          </w:p>
+        </w:tc>
+      </w:tr>
+      <w:tr>
+        <w:tc>
+          <w:tcPr>
+            <w:tcW w:type="dxa" w:w="1234"/>
+          </w:tcPr>
+          <w:p>
+            <w:r>
+              <w:t>2026-06-26 01:51:12</w:t>
+            </w:r>
+          </w:p>
+        </w:tc>
+        <w:tc>
+          <w:tcPr>
+            <w:tcW w:type="dxa" w:w="1234"/>
+          </w:tcPr>
+          <w:p>
+            <w:r>
+              <w:t>44</w:t>
+            </w:r>
+          </w:p>
+        </w:tc>
+        <w:tc>
+          <w:tcPr>
+            <w:tcW w:type="dxa" w:w="1234"/>
+          </w:tcPr>
+          <w:p>
+            <w:r>
+              <w:t>61.6</w:t>
+            </w:r>
+          </w:p>
+        </w:tc>
+        <w:tc>
+          <w:tcPr>
+            <w:tcW w:type="dxa" w:w="1234"/>
+          </w:tcPr>
+          <w:p>
+            <w:r>
+              <w:t>90.6</w:t>
+            </w:r>
+          </w:p>
+        </w:tc>
+        <w:tc>
+          <w:tcPr>
+            <w:tcW w:type="dxa" w:w="1234"/>
+          </w:tcPr>
+          <w:p>
+            <w:r>
+              <w:t>48.1</w:t>
+            </w:r>
+          </w:p>
+        </w:tc>
+        <w:tc>
+          <w:tcPr>
+            <w:tcW w:type="dxa" w:w="1234"/>
+          </w:tcPr>
+          <w:p>
+            <w:r>
+              <w:t>65.5</w:t>
+            </w:r>
+          </w:p>
+        </w:tc>
+        <w:tc>
+          <w:tcPr>
+            <w:tcW w:type="dxa" w:w="1234"/>
+          </w:tcPr>
+          <w:p>
+            <w:r>
+              <w:t>137</w:t>
+            </w:r>
+          </w:p>
+        </w:tc>
+      </w:tr>
+      <w:tr>
+        <w:tc>
+          <w:tcPr>
+            <w:tcW w:type="dxa" w:w="1234"/>
+          </w:tcPr>
+          <w:p>
+            <w:r>
+              <w:t>2026-06-26 02:21:15</w:t>
+            </w:r>
+          </w:p>
+        </w:tc>
+        <w:tc>
+          <w:tcPr>
+            <w:tcW w:type="dxa" w:w="1234"/>
+          </w:tcPr>
+          <w:p>
+            <w:r>
+              <w:t>44</w:t>
+            </w:r>
+          </w:p>
+        </w:tc>
+        <w:tc>
+          <w:tcPr>
+            <w:tcW w:type="dxa" w:w="1234"/>
+          </w:tcPr>
+          <w:p>
+            <w:r>
+              <w:t>61.6</w:t>
+            </w:r>
+          </w:p>
+        </w:tc>
+        <w:tc>
+          <w:tcPr>
+            <w:tcW w:type="dxa" w:w="1234"/>
+          </w:tcPr>
+          <w:p>
+            <w:r>
+              <w:t>90.6</w:t>
+            </w:r>
+          </w:p>
+        </w:tc>
+        <w:tc>
+          <w:tcPr>
+            <w:tcW w:type="dxa" w:w="1234"/>
+          </w:tcPr>
+          <w:p>
+            <w:r>
+              <w:t>48.1</w:t>
+            </w:r>
+          </w:p>
+        </w:tc>
+        <w:tc>
+          <w:tcPr>
+            <w:tcW w:type="dxa" w:w="1234"/>
+          </w:tcPr>
+          <w:p>
+            <w:r>
+              <w:t>65.5</w:t>
+            </w:r>
+          </w:p>
+        </w:tc>
+        <w:tc>
+          <w:tcPr>
+            <w:tcW w:type="dxa" w:w="1234"/>
+          </w:tcPr>
+          <w:p>
+            <w:r>
+              <w:t>588</w:t>
+            </w:r>
+          </w:p>
+        </w:tc>
+      </w:tr>
+      <w:tr>
+        <w:tc>
+          <w:tcPr>
+            <w:tcW w:type="dxa" w:w="1234"/>
+          </w:tcPr>
+          <w:p>
+            <w:r>
+              <w:t>2026-06-26 02:23:03</w:t>
+            </w:r>
+          </w:p>
+        </w:tc>
+        <w:tc>
+          <w:tcPr>
+            <w:tcW w:type="dxa" w:w="1234"/>
+          </w:tcPr>
+          <w:p>
+            <w:r>
+              <w:t>45</w:t>
+            </w:r>
+          </w:p>
+        </w:tc>
+        <w:tc>
+          <w:tcPr>
+            <w:tcW w:type="dxa" w:w="1234"/>
+          </w:tcPr>
+          <w:p>
+            <w:r>
+              <w:t>64.2</w:t>
+            </w:r>
+          </w:p>
+        </w:tc>
+        <w:tc>
+          <w:tcPr>
+            <w:tcW w:type="dxa" w:w="1234"/>
+          </w:tcPr>
+          <w:p>
+            <w:r>
+              <w:t>90.6</w:t>
+            </w:r>
+          </w:p>
+        </w:tc>
+        <w:tc>
+          <w:tcPr>
+            <w:tcW w:type="dxa" w:w="1234"/>
+          </w:tcPr>
+          <w:p>
+            <w:r>
+              <w:t>48.1</w:t>
+            </w:r>
+          </w:p>
+        </w:tc>
+        <w:tc>
+          <w:tcPr>
+            <w:tcW w:type="dxa" w:w="1234"/>
+          </w:tcPr>
+          <w:p>
+            <w:r>
+              <w:t>66.8</w:t>
+            </w:r>
+          </w:p>
+        </w:tc>
+        <w:tc>
+          <w:tcPr>
+            <w:tcW w:type="dxa" w:w="1234"/>
+          </w:tcPr>
+          <w:p>
+            <w:r>
+              <w:t>615</w:t>
+            </w:r>
+          </w:p>
+        </w:tc>
+      </w:tr>
+      <w:tr>
+        <w:tc>
+          <w:tcPr>
+            <w:tcW w:type="dxa" w:w="1234"/>
+          </w:tcPr>
+          <w:p>
+            <w:r>
+              <w:t>2026-06-26 02:27:37</w:t>
+            </w:r>
+          </w:p>
+        </w:tc>
+        <w:tc>
+          <w:tcPr>
+            <w:tcW w:type="dxa" w:w="1234"/>
+          </w:tcPr>
+          <w:p>
+            <w:r>
+              <w:t>46</w:t>
+            </w:r>
+          </w:p>
+        </w:tc>
+        <w:tc>
+          <w:tcPr>
+            <w:tcW w:type="dxa" w:w="1234"/>
+          </w:tcPr>
+          <w:p>
+            <w:r>
+              <w:t>67.7</w:t>
+            </w:r>
+          </w:p>
+        </w:tc>
+        <w:tc>
+          <w:tcPr>
+            <w:tcW w:type="dxa" w:w="1234"/>
+          </w:tcPr>
+          <w:p>
+            <w:r>
+              <w:t>90.6</w:t>
+            </w:r>
+          </w:p>
+        </w:tc>
+        <w:tc>
+          <w:tcPr>
+            <w:tcW w:type="dxa" w:w="1234"/>
+          </w:tcPr>
+          <w:p>
+            <w:r>
+              <w:t>49.9</w:t>
+            </w:r>
+          </w:p>
+        </w:tc>
+        <w:tc>
+          <w:tcPr>
+            <w:tcW w:type="dxa" w:w="1234"/>
+          </w:tcPr>
+          <w:p>
+            <w:r>
+              <w:t>69.0</w:t>
             </w:r>
           </w:p>
         </w:tc>
@@ -400,7 +1768,7 @@
     </w:p>
     <w:p>
       <w:r>
-        <w:t>Section score: 72.1 / 100  (Grade: C)</w:t>
+        <w:t>Section score: 67.7 / 100  (Grade: D)</w:t>
       </w:r>
     </w:p>
     <w:p>
@@ -511,7 +1879,7 @@
           </w:tcPr>
           <w:p>
             <w:r>
-              <w:t>56.8</w:t>
+              <w:t>56.3</w:t>
             </w:r>
           </w:p>
         </w:tc>
@@ -521,7 +1889,7 @@
           </w:tcPr>
           <w:p>
             <w:r>
-              <w:t>8.5</w:t>
+              <w:t>8.4</w:t>
             </w:r>
           </w:p>
         </w:tc>
@@ -543,7 +1911,7 @@
           </w:tcPr>
           <w:p>
             <w:r>
-              <w:t>46.9</w:t>
+              <w:t>43.1</w:t>
             </w:r>
           </w:p>
         </w:tc>
@@ -553,7 +1921,7 @@
           </w:tcPr>
           <w:p>
             <w:r>
-              <w:t>7.0</w:t>
+              <w:t>6.5</w:t>
             </w:r>
           </w:p>
         </w:tc>
@@ -575,7 +1943,7 @@
           </w:tcPr>
           <w:p>
             <w:r>
-              <w:t>87.8</w:t>
+              <w:t>87.6</w:t>
             </w:r>
           </w:p>
         </w:tc>
@@ -585,7 +1953,7 @@
           </w:tcPr>
           <w:p>
             <w:r>
-              <w:t>17.6</w:t>
+              <w:t>17.5</w:t>
             </w:r>
           </w:p>
         </w:tc>
@@ -607,7 +1975,7 @@
           </w:tcPr>
           <w:p>
             <w:r>
-              <w:t>96.6</w:t>
+              <w:t>100.0</w:t>
             </w:r>
           </w:p>
         </w:tc>
@@ -617,7 +1985,7 @@
           </w:tcPr>
           <w:p>
             <w:r>
-              <w:t>4.8</w:t>
+              <w:t>5.0</w:t>
             </w:r>
           </w:p>
         </w:tc>
@@ -639,7 +2007,7 @@
           </w:tcPr>
           <w:p>
             <w:r>
-              <w:t>96.3</w:t>
+              <w:t>86.9</w:t>
             </w:r>
           </w:p>
         </w:tc>
@@ -649,7 +2017,7 @@
           </w:tcPr>
           <w:p>
             <w:r>
-              <w:t>9.6</w:t>
+              <w:t>8.7</w:t>
             </w:r>
           </w:p>
         </w:tc>
@@ -671,7 +2039,7 @@
           </w:tcPr>
           <w:p>
             <w:r>
-              <w:t>57.9</w:t>
+              <w:t>46.1</w:t>
             </w:r>
           </w:p>
         </w:tc>
@@ -681,7 +2049,7 @@
           </w:tcPr>
           <w:p>
             <w:r>
-              <w:t>14.5</w:t>
+              <w:t>11.5</w:t>
             </w:r>
           </w:p>
         </w:tc>
@@ -722,7 +2090,7 @@
           </w:tcPr>
           <w:p>
             <w:r>
-              <w:t>$537.84</w:t>
+              <w:t>$537.62</w:t>
             </w:r>
           </w:p>
         </w:tc>
@@ -744,7 +2112,7 @@
           </w:tcPr>
           <w:p>
             <w:r>
-              <w:t>7.57%</w:t>
+              <w:t>7.52%</w:t>
             </w:r>
           </w:p>
         </w:tc>
@@ -766,7 +2134,7 @@
           </w:tcPr>
           <w:p>
             <w:r>
-              <w:t>$3.38</w:t>
+              <w:t>$3.16</w:t>
             </w:r>
           </w:p>
         </w:tc>
@@ -810,7 +2178,7 @@
           </w:tcPr>
           <w:p>
             <w:r>
-              <w:t>0.6897</w:t>
+              <w:t>0.6304</w:t>
             </w:r>
           </w:p>
         </w:tc>
@@ -832,7 +2200,7 @@
           </w:tcPr>
           <w:p>
             <w:r>
-              <w:t>0.5000 / 0.7895</w:t>
+              <w:t>0.5000 / 0.7308</w:t>
             </w:r>
           </w:p>
         </w:tc>
@@ -854,7 +2222,7 @@
           </w:tcPr>
           <w:p>
             <w:r>
-              <w:t>1.0752</w:t>
+              <w:t>1.0451</w:t>
             </w:r>
           </w:p>
         </w:tc>
@@ -876,7 +2244,7 @@
           </w:tcPr>
           <w:p>
             <w:r>
-              <w:t>29 / 29</w:t>
+              <w:t>46 / 46</w:t>
             </w:r>
           </w:p>
         </w:tc>
@@ -898,7 +2266,7 @@
           </w:tcPr>
           <w:p>
             <w:r>
-              <w:t>$0.12</w:t>
+              <w:t>$0.07</w:t>
             </w:r>
           </w:p>
         </w:tc>
@@ -1019,7 +2387,7 @@
           </w:tcPr>
           <w:p>
             <w:r>
-              <w:t>up</w:t>
+              <w:t>down</w:t>
             </w:r>
           </w:p>
         </w:tc>
@@ -1029,7 +2397,7 @@
           </w:tcPr>
           <w:p>
             <w:r>
-              <w:t>0.720</w:t>
+              <w:t>0.570</w:t>
             </w:r>
           </w:p>
         </w:tc>
@@ -1049,7 +2417,7 @@
           </w:tcPr>
           <w:p>
             <w:r>
-              <w:t>No</w:t>
+              <w:t>Yes</w:t>
             </w:r>
           </w:p>
         </w:tc>
@@ -1059,7 +2427,7 @@
           </w:tcPr>
           <w:p>
             <w:r>
-              <w:t>$-5.00</w:t>
+              <w:t>$3.77</w:t>
             </w:r>
           </w:p>
         </w:tc>
@@ -1081,7 +2449,7 @@
           </w:tcPr>
           <w:p>
             <w:r>
-              <w:t>0.720</w:t>
+              <w:t>0.660</w:t>
             </w:r>
           </w:p>
         </w:tc>
@@ -1111,7 +2479,7 @@
           </w:tcPr>
           <w:p>
             <w:r>
-              <w:t>$1.94</w:t>
+              <w:t>$2.58</w:t>
             </w:r>
           </w:p>
         </w:tc>
@@ -1123,6 +2491,26 @@
           </w:tcPr>
           <w:p>
             <w:r>
+              <w:t>down</w:t>
+            </w:r>
+          </w:p>
+        </w:tc>
+        <w:tc>
+          <w:tcPr>
+            <w:tcW w:type="dxa" w:w="1728"/>
+          </w:tcPr>
+          <w:p>
+            <w:r>
+              <w:t>0.680</w:t>
+            </w:r>
+          </w:p>
+        </w:tc>
+        <w:tc>
+          <w:tcPr>
+            <w:tcW w:type="dxa" w:w="1728"/>
+          </w:tcPr>
+          <w:p>
+            <w:r>
               <w:t>up</w:t>
             </w:r>
           </w:p>
@@ -1133,7 +2521,7 @@
           </w:tcPr>
           <w:p>
             <w:r>
-              <w:t>0.700</w:t>
+              <w:t>No</w:t>
             </w:r>
           </w:p>
         </w:tc>
@@ -1143,27 +2531,7 @@
           </w:tcPr>
           <w:p>
             <w:r>
-              <w:t>up</w:t>
-            </w:r>
-          </w:p>
-        </w:tc>
-        <w:tc>
-          <w:tcPr>
-            <w:tcW w:type="dxa" w:w="1728"/>
-          </w:tcPr>
-          <w:p>
-            <w:r>
-              <w:t>Yes</w:t>
-            </w:r>
-          </w:p>
-        </w:tc>
-        <w:tc>
-          <w:tcPr>
-            <w:tcW w:type="dxa" w:w="1728"/>
-          </w:tcPr>
-          <w:p>
-            <w:r>
-              <w:t>$2.14</w:t>
+              <w:t>$-5.00</w:t>
             </w:r>
           </w:p>
         </w:tc>
@@ -1185,7 +2553,7 @@
           </w:tcPr>
           <w:p>
             <w:r>
-              <w:t>0.620</w:t>
+              <w:t>0.660</w:t>
             </w:r>
           </w:p>
         </w:tc>
@@ -1215,7 +2583,7 @@
           </w:tcPr>
           <w:p>
             <w:r>
-              <w:t>$3.06</w:t>
+              <w:t>$2.58</w:t>
             </w:r>
           </w:p>
         </w:tc>
@@ -1227,6 +2595,26 @@
           </w:tcPr>
           <w:p>
             <w:r>
+              <w:t>down</w:t>
+            </w:r>
+          </w:p>
+        </w:tc>
+        <w:tc>
+          <w:tcPr>
+            <w:tcW w:type="dxa" w:w="1728"/>
+          </w:tcPr>
+          <w:p>
+            <w:r>
+              <w:t>0.700</w:t>
+            </w:r>
+          </w:p>
+        </w:tc>
+        <w:tc>
+          <w:tcPr>
+            <w:tcW w:type="dxa" w:w="1728"/>
+          </w:tcPr>
+          <w:p>
+            <w:r>
               <w:t>up</w:t>
             </w:r>
           </w:p>
@@ -1237,7 +2625,7 @@
           </w:tcPr>
           <w:p>
             <w:r>
-              <w:t>0.640</w:t>
+              <w:t>No</w:t>
             </w:r>
           </w:p>
         </w:tc>
@@ -1247,27 +2635,7 @@
           </w:tcPr>
           <w:p>
             <w:r>
-              <w:t>up</w:t>
-            </w:r>
-          </w:p>
-        </w:tc>
-        <w:tc>
-          <w:tcPr>
-            <w:tcW w:type="dxa" w:w="1728"/>
-          </w:tcPr>
-          <w:p>
-            <w:r>
-              <w:t>Yes</w:t>
-            </w:r>
-          </w:p>
-        </w:tc>
-        <w:tc>
-          <w:tcPr>
-            <w:tcW w:type="dxa" w:w="1728"/>
-          </w:tcPr>
-          <w:p>
-            <w:r>
-              <w:t>$2.81</w:t>
+              <w:t>$-5.00</w:t>
             </w:r>
           </w:p>
         </w:tc>
@@ -1279,7 +2647,7 @@
           </w:tcPr>
           <w:p>
             <w:r>
-              <w:t>down</w:t>
+              <w:t>up</w:t>
             </w:r>
           </w:p>
         </w:tc>
@@ -1299,7 +2667,7 @@
           </w:tcPr>
           <w:p>
             <w:r>
-              <w:t>down</w:t>
+              <w:t>up</w:t>
             </w:r>
           </w:p>
         </w:tc>
@@ -1331,7 +2699,7 @@
           </w:tcPr>
           <w:p>
             <w:r>
-              <w:t>down</w:t>
+              <w:t>up</w:t>
             </w:r>
           </w:p>
         </w:tc>
@@ -1341,7 +2709,7 @@
           </w:tcPr>
           <w:p>
             <w:r>
-              <w:t>0.720</w:t>
+              <w:t>0.650</w:t>
             </w:r>
           </w:p>
         </w:tc>
@@ -1351,7 +2719,7 @@
           </w:tcPr>
           <w:p>
             <w:r>
-              <w:t>down</w:t>
+              <w:t>up</w:t>
             </w:r>
           </w:p>
         </w:tc>
@@ -1371,7 +2739,7 @@
           </w:tcPr>
           <w:p>
             <w:r>
-              <w:t>$1.94</w:t>
+              <w:t>$2.69</w:t>
             </w:r>
           </w:p>
         </w:tc>
@@ -1383,7 +2751,7 @@
           </w:tcPr>
           <w:p>
             <w:r>
-              <w:t>down</w:t>
+              <w:t>up</w:t>
             </w:r>
           </w:p>
         </w:tc>
@@ -1393,7 +2761,7 @@
           </w:tcPr>
           <w:p>
             <w:r>
-              <w:t>0.600</w:t>
+              <w:t>0.640</w:t>
             </w:r>
           </w:p>
         </w:tc>
@@ -1403,7 +2771,7 @@
           </w:tcPr>
           <w:p>
             <w:r>
-              <w:t>down</w:t>
+              <w:t>up</w:t>
             </w:r>
           </w:p>
         </w:tc>
@@ -1423,7 +2791,7 @@
           </w:tcPr>
           <w:p>
             <w:r>
-              <w:t>$3.33</w:t>
+              <w:t>$2.81</w:t>
             </w:r>
           </w:p>
         </w:tc>
@@ -1435,7 +2803,7 @@
           </w:tcPr>
           <w:p>
             <w:r>
-              <w:t>up</w:t>
+              <w:t>down</w:t>
             </w:r>
           </w:p>
         </w:tc>
@@ -1445,7 +2813,7 @@
           </w:tcPr>
           <w:p>
             <w:r>
-              <w:t>0.680</w:t>
+              <w:t>0.650</w:t>
             </w:r>
           </w:p>
         </w:tc>
@@ -1455,7 +2823,7 @@
           </w:tcPr>
           <w:p>
             <w:r>
-              <w:t>up</w:t>
+              <w:t>down</w:t>
             </w:r>
           </w:p>
         </w:tc>
@@ -1475,7 +2843,7 @@
           </w:tcPr>
           <w:p>
             <w:r>
-              <w:t>$2.35</w:t>
+              <w:t>$2.69</w:t>
             </w:r>
           </w:p>
         </w:tc>
@@ -1487,7 +2855,7 @@
           </w:tcPr>
           <w:p>
             <w:r>
-              <w:t>down</w:t>
+              <w:t>up</w:t>
             </w:r>
           </w:p>
         </w:tc>
@@ -1497,7 +2865,7 @@
           </w:tcPr>
           <w:p>
             <w:r>
-              <w:t>0.770</w:t>
+              <w:t>0.560</w:t>
             </w:r>
           </w:p>
         </w:tc>
@@ -1507,7 +2875,7 @@
           </w:tcPr>
           <w:p>
             <w:r>
-              <w:t>down</w:t>
+              <w:t>up</w:t>
             </w:r>
           </w:p>
         </w:tc>
@@ -1527,7 +2895,7 @@
           </w:tcPr>
           <w:p>
             <w:r>
-              <w:t>$1.49</w:t>
+              <w:t>$1.96</w:t>
             </w:r>
           </w:p>
         </w:tc>
@@ -1539,7 +2907,7 @@
           </w:tcPr>
           <w:p>
             <w:r>
-              <w:t>down</w:t>
+              <w:t>up</w:t>
             </w:r>
           </w:p>
         </w:tc>
@@ -1549,7 +2917,7 @@
           </w:tcPr>
           <w:p>
             <w:r>
-              <w:t>0.620</w:t>
+              <w:t>0.530</w:t>
             </w:r>
           </w:p>
         </w:tc>
@@ -1559,7 +2927,7 @@
           </w:tcPr>
           <w:p>
             <w:r>
-              <w:t>down</w:t>
+              <w:t>up</w:t>
             </w:r>
           </w:p>
         </w:tc>
@@ -1579,7 +2947,7 @@
           </w:tcPr>
           <w:p>
             <w:r>
-              <w:t>$3.06</w:t>
+              <w:t>$2.22</w:t>
             </w:r>
           </w:p>
         </w:tc>
@@ -1601,7 +2969,7 @@
           </w:tcPr>
           <w:p>
             <w:r>
-              <w:t>0.530</w:t>
+              <w:t>0.590</w:t>
             </w:r>
           </w:p>
         </w:tc>
@@ -1631,7 +2999,7 @@
           </w:tcPr>
           <w:p>
             <w:r>
-              <w:t>$-5.00</w:t>
+              <w:t>$-2.50</w:t>
             </w:r>
           </w:p>
         </w:tc>
@@ -1683,7 +3051,7 @@
           </w:tcPr>
           <w:p>
             <w:r>
-              <w:t>$-5.00</w:t>
+              <w:t>$-2.50</w:t>
             </w:r>
           </w:p>
         </w:tc>
@@ -1695,6 +3063,26 @@
           </w:tcPr>
           <w:p>
             <w:r>
+              <w:t>up</w:t>
+            </w:r>
+          </w:p>
+        </w:tc>
+        <w:tc>
+          <w:tcPr>
+            <w:tcW w:type="dxa" w:w="1728"/>
+          </w:tcPr>
+          <w:p>
+            <w:r>
+              <w:t>0.500</w:t>
+            </w:r>
+          </w:p>
+        </w:tc>
+        <w:tc>
+          <w:tcPr>
+            <w:tcW w:type="dxa" w:w="1728"/>
+          </w:tcPr>
+          <w:p>
+            <w:r>
               <w:t>down</w:t>
             </w:r>
           </w:p>
@@ -1705,7 +3093,7 @@
           </w:tcPr>
           <w:p>
             <w:r>
-              <w:t>0.590</w:t>
+              <w:t>No</w:t>
             </w:r>
           </w:p>
         </w:tc>
@@ -1715,27 +3103,7 @@
           </w:tcPr>
           <w:p>
             <w:r>
-              <w:t>up</w:t>
-            </w:r>
-          </w:p>
-        </w:tc>
-        <w:tc>
-          <w:tcPr>
-            <w:tcW w:type="dxa" w:w="1728"/>
-          </w:tcPr>
-          <w:p>
-            <w:r>
-              <w:t>No</w:t>
-            </w:r>
-          </w:p>
-        </w:tc>
-        <w:tc>
-          <w:tcPr>
-            <w:tcW w:type="dxa" w:w="1728"/>
-          </w:tcPr>
-          <w:p>
-            <w:r>
-              <w:t>$-5.00</w:t>
+              <w:t>$-2.50</w:t>
             </w:r>
           </w:p>
         </w:tc>
@@ -1757,7 +3125,7 @@
           </w:tcPr>
           <w:p>
             <w:r>
-              <w:t>0.570</w:t>
+              <w:t>0.520</w:t>
             </w:r>
           </w:p>
         </w:tc>
@@ -1787,7 +3155,7 @@
           </w:tcPr>
           <w:p>
             <w:r>
-              <w:t>$-5.00</w:t>
+              <w:t>$-2.50</w:t>
             </w:r>
           </w:p>
         </w:tc>
@@ -1808,7 +3176,7 @@
     </w:p>
     <w:p>
       <w:r>
-        <w:t>Section score: 90.3 / 100  (Grade: A)</w:t>
+        <w:t>Section score: 90.6 / 100  (Grade: A)</w:t>
       </w:r>
     </w:p>
     <w:p>
@@ -1951,7 +3319,7 @@
           </w:tcPr>
           <w:p>
             <w:r>
-              <w:t>95.5</w:t>
+              <w:t>97.4</w:t>
             </w:r>
           </w:p>
         </w:tc>
@@ -1961,7 +3329,7 @@
           </w:tcPr>
           <w:p>
             <w:r>
-              <w:t>14.3</w:t>
+              <w:t>14.6</w:t>
             </w:r>
           </w:p>
         </w:tc>
@@ -2065,17 +3433,17 @@
     </w:tbl>
     <w:p>
       <w:r>
-        <w:t>Ticks: 8 · Reconciled: True · Readiness: not_ready</w:t>
+        <w:t>Ticks: 93 · Reconciled: True · Readiness: not_ready</w:t>
       </w:r>
     </w:p>
     <w:p>
       <w:r>
-        <w:t>Candidates created: 7096 · Terminals: {'accepted': 29, 'rejected': 6452, 'skipped': 597, 'expired': 0, 'missing_data': 18}</w:t>
+        <w:t>Candidates created: 17718 · Terminals: {'accepted': 46, 'rejected': 14509, 'skipped': 3086, 'expired': 0, 'missing_data': 77}</w:t>
       </w:r>
     </w:p>
     <w:p>
       <w:r>
-        <w:t>Rejected by stage: {'directional': 4064, 'execution_gate': 14, 'context_gate': 483, 'directional_allowlist': 1324, 'down_bias_gate': 501, 'mtf_gate': 66}</w:t>
+        <w:t>Rejected by stage: {'directional': 8127, 'execution_gate': 111, 'context_gate': 670, 'directional_allowlist': 1364, 'down_bias_gate': 538, 'mtf_gate': 160, 'grok_decider': 3425, 'execution_realistic': 3, 'verifier': 61, 'mispricing_gate': 50}</w:t>
       </w:r>
     </w:p>
     <w:p>
@@ -2259,7 +3627,7 @@
           </w:tcPr>
           <w:p>
             <w:r>
-              <w:t>warming_up(n&lt;30)</w:t>
+              <w:t>ok</w:t>
             </w:r>
           </w:p>
         </w:tc>
@@ -2547,6 +3915,48 @@
           </w:tcPr>
           <w:p>
             <w:r/>
+          </w:p>
+        </w:tc>
+      </w:tr>
+      <w:tr>
+        <w:tc>
+          <w:tcPr>
+            <w:tcW w:type="dxa" w:w="2160"/>
+          </w:tcPr>
+          <w:p>
+            <w:r>
+              <w:t>tradingview</w:t>
+            </w:r>
+          </w:p>
+        </w:tc>
+        <w:tc>
+          <w:tcPr>
+            <w:tcW w:type="dxa" w:w="2160"/>
+          </w:tcPr>
+          <w:p>
+            <w:r>
+              <w:t>context</w:t>
+            </w:r>
+          </w:p>
+        </w:tc>
+        <w:tc>
+          <w:tcPr>
+            <w:tcW w:type="dxa" w:w="2160"/>
+          </w:tcPr>
+          <w:p>
+            <w:r>
+              <w:t>webhook</w:t>
+            </w:r>
+          </w:p>
+        </w:tc>
+        <w:tc>
+          <w:tcPr>
+            <w:tcW w:type="dxa" w:w="2160"/>
+          </w:tcPr>
+          <w:p>
+            <w:r>
+              <w:t>ingest only — never trade authority</w:t>
+            </w:r>
           </w:p>
         </w:tc>
       </w:tr>
@@ -2608,7 +4018,7 @@
     </w:p>
     <w:p>
       <w:r>
-        <w:t>Section score: 71.4 / 100  (Grade: C)</w:t>
+        <w:t>Section score: 49.9 / 100  (Grade: F)</w:t>
       </w:r>
     </w:p>
     <w:p>
@@ -2751,7 +4161,7 @@
           </w:tcPr>
           <w:p>
             <w:r>
-              <w:t>16.5</w:t>
+              <w:t>2.5</w:t>
             </w:r>
           </w:p>
         </w:tc>
@@ -2761,7 +4171,7 @@
           </w:tcPr>
           <w:p>
             <w:r>
-              <w:t>2.5</w:t>
+              <w:t>0.4</w:t>
             </w:r>
           </w:p>
         </w:tc>
@@ -2815,7 +4225,7 @@
           </w:tcPr>
           <w:p>
             <w:r>
-              <w:t>100.0</w:t>
+              <w:t>47.9</w:t>
             </w:r>
           </w:p>
         </w:tc>
@@ -2825,7 +4235,7 @@
           </w:tcPr>
           <w:p>
             <w:r>
-              <w:t>30.0</w:t>
+              <w:t>14.4</w:t>
             </w:r>
           </w:p>
         </w:tc>
@@ -2847,7 +4257,7 @@
           </w:tcPr>
           <w:p>
             <w:r>
-              <w:t>32.5</w:t>
+              <w:t>7.5</w:t>
             </w:r>
           </w:p>
         </w:tc>
@@ -2857,7 +4267,7 @@
           </w:tcPr>
           <w:p>
             <w:r>
-              <w:t>4.9</w:t>
+              <w:t>1.1</w:t>
             </w:r>
           </w:p>
         </w:tc>
@@ -2898,7 +4308,7 @@
           </w:tcPr>
           <w:p>
             <w:r>
-              <w:t>0.8889</w:t>
+              <w:t>0.5789</w:t>
             </w:r>
           </w:p>
         </w:tc>
@@ -2920,7 +4330,7 @@
           </w:tcPr>
           <w:p>
             <w:r>
-              <w:t>0.5556</w:t>
+              <w:t>0.6154</w:t>
             </w:r>
           </w:p>
         </w:tc>
@@ -2942,7 +4352,7 @@
           </w:tcPr>
           <w:p>
             <w:r>
-              <w:t>0.6667</w:t>
+              <w:t>0.5000</w:t>
             </w:r>
           </w:p>
         </w:tc>
@@ -2964,7 +4374,7 @@
           </w:tcPr>
           <w:p>
             <w:r>
-              <w:t>0.5600</w:t>
+              <w:t>0.4667</w:t>
             </w:r>
           </w:p>
         </w:tc>
@@ -2986,7 +4396,7 @@
           </w:tcPr>
           <w:p>
             <w:r>
-              <w:t>0.5116</w:t>
+              <w:t>0.4977</w:t>
             </w:r>
           </w:p>
         </w:tc>
@@ -3016,7 +4426,7 @@
     </w:tbl>
     <w:p>
       <w:r>
-        <w:t>TV alerts: received 235 · valid 224 · rejected 11</w:t>
+        <w:t>TV alerts: received 666 · valid 655 · rejected 11</w:t>
       </w:r>
     </w:p>
     <w:sectPr>

</xml_diff>

<commit_message>
chore(reports): VPS full report 2026-06-26 03:12 UTC (47 settled, WR 63.8%, PF 1.0928)
</commit_message>
<xml_diff>
--- a/vps_full_reports/latest/report.docx
+++ b/vps_full_reports/latest/report.docx
@@ -20,7 +20,7 @@
           <w:color w:val="666666"/>
           <w:sz w:val="20"/>
         </w:rPr>
-        <w:t>PAPER ONLY  ·  reconciled=True  ·  ticks=409</w:t>
+        <w:t>PAPER ONLY  ·  reconciled=True  ·  ticks=22</w:t>
       </w:r>
     </w:p>
     <w:p>
@@ -33,7 +33,7 @@
     </w:p>
     <w:p>
       <w:r>
-        <w:t>Overall score: 69.0 / 100  (Grade: D)</w:t>
+        <w:t>Overall score: 70.8 / 100  (Grade: C)</w:t>
       </w:r>
     </w:p>
     <w:tbl>
@@ -107,7 +107,7 @@
           </w:tcPr>
           <w:p>
             <w:r>
-              <w:t>67.7</w:t>
+              <w:t>70.8</w:t>
             </w:r>
           </w:p>
         </w:tc>
@@ -117,7 +117,7 @@
           </w:tcPr>
           <w:p>
             <w:r>
-              <w:t>D</w:t>
+              <w:t>C</w:t>
             </w:r>
           </w:p>
         </w:tc>
@@ -149,7 +149,7 @@
           </w:tcPr>
           <w:p>
             <w:r>
-              <w:t>90.5</w:t>
+              <w:t>90.2</w:t>
             </w:r>
           </w:p>
         </w:tc>
@@ -191,7 +191,7 @@
           </w:tcPr>
           <w:p>
             <w:r>
-              <w:t>49.9</w:t>
+              <w:t>51.5</w:t>
             </w:r>
           </w:p>
         </w:tc>
@@ -319,7 +319,7 @@
           </w:tcPr>
           <w:p>
             <w:r>
-              <w:t>2026-06-25 22:38:02</w:t>
+              <w:t>2026-06-25 22:46:31</w:t>
             </w:r>
           </w:p>
         </w:tc>
@@ -329,7 +329,7 @@
           </w:tcPr>
           <w:p>
             <w:r>
-              <w:t>35</w:t>
+              <w:t>37</w:t>
             </w:r>
           </w:p>
         </w:tc>
@@ -339,7 +339,7 @@
           </w:tcPr>
           <w:p>
             <w:r>
-              <w:t>54.1</w:t>
+              <w:t>58.6</w:t>
             </w:r>
           </w:p>
         </w:tc>
@@ -359,7 +359,7 @@
           </w:tcPr>
           <w:p>
             <w:r>
-              <w:t>54.8</w:t>
+              <w:t>50.8</w:t>
             </w:r>
           </w:p>
         </w:tc>
@@ -369,7 +369,7 @@
           </w:tcPr>
           <w:p>
             <w:r>
-              <w:t>63.4</w:t>
+              <w:t>64.6</w:t>
             </w:r>
           </w:p>
         </w:tc>
@@ -379,7 +379,7 @@
           </w:tcPr>
           <w:p>
             <w:r>
-              <w:t>558</w:t>
+              <w:t>42</w:t>
             </w:r>
           </w:p>
         </w:tc>
@@ -391,7 +391,7 @@
           </w:tcPr>
           <w:p>
             <w:r>
-              <w:t>2026-06-25 22:42:42</w:t>
+              <w:t>2026-06-25 23:16:34</w:t>
             </w:r>
           </w:p>
         </w:tc>
@@ -401,7 +401,7 @@
           </w:tcPr>
           <w:p>
             <w:r>
-              <w:t>36</w:t>
+              <w:t>37</w:t>
             </w:r>
           </w:p>
         </w:tc>
@@ -411,7 +411,7 @@
           </w:tcPr>
           <w:p>
             <w:r>
-              <w:t>56.5</w:t>
+              <w:t>58.6</w:t>
             </w:r>
           </w:p>
         </w:tc>
@@ -421,7 +421,7 @@
           </w:tcPr>
           <w:p>
             <w:r>
-              <w:t>90.5</w:t>
+              <w:t>90.6</w:t>
             </w:r>
           </w:p>
         </w:tc>
@@ -431,7 +431,7 @@
           </w:tcPr>
           <w:p>
             <w:r>
-              <w:t>52.6</w:t>
+              <w:t>50.8</w:t>
             </w:r>
           </w:p>
         </w:tc>
@@ -441,7 +441,7 @@
           </w:tcPr>
           <w:p>
             <w:r>
-              <w:t>64.0</w:t>
+              <w:t>64.7</w:t>
             </w:r>
           </w:p>
         </w:tc>
@@ -451,7 +451,7 @@
           </w:tcPr>
           <w:p>
             <w:r>
-              <w:t>628</w:t>
+              <w:t>428</w:t>
             </w:r>
           </w:p>
         </w:tc>
@@ -463,7 +463,7 @@
           </w:tcPr>
           <w:p>
             <w:r>
-              <w:t>2026-06-25 22:46:31</w:t>
+              <w:t>2026-06-25 23:46:38</w:t>
             </w:r>
           </w:p>
         </w:tc>
@@ -493,7 +493,7 @@
           </w:tcPr>
           <w:p>
             <w:r>
-              <w:t>90.5</w:t>
+              <w:t>90.6</w:t>
             </w:r>
           </w:p>
         </w:tc>
@@ -513,7 +513,7 @@
           </w:tcPr>
           <w:p>
             <w:r>
-              <w:t>64.6</w:t>
+              <w:t>64.7</w:t>
             </w:r>
           </w:p>
         </w:tc>
@@ -523,7 +523,7 @@
           </w:tcPr>
           <w:p>
             <w:r>
-              <w:t>42</w:t>
+              <w:t>67</w:t>
             </w:r>
           </w:p>
         </w:tc>
@@ -535,7 +535,7 @@
           </w:tcPr>
           <w:p>
             <w:r>
-              <w:t>2026-06-25 23:16:34</w:t>
+              <w:t>2026-06-26 00:02:45</w:t>
             </w:r>
           </w:p>
         </w:tc>
@@ -545,7 +545,7 @@
           </w:tcPr>
           <w:p>
             <w:r>
-              <w:t>37</w:t>
+              <w:t>38</w:t>
             </w:r>
           </w:p>
         </w:tc>
@@ -555,7 +555,7 @@
           </w:tcPr>
           <w:p>
             <w:r>
-              <w:t>58.6</w:t>
+              <w:t>61.4</w:t>
             </w:r>
           </w:p>
         </w:tc>
@@ -575,7 +575,7 @@
           </w:tcPr>
           <w:p>
             <w:r>
-              <w:t>50.8</w:t>
+              <w:t>52.7</w:t>
             </w:r>
           </w:p>
         </w:tc>
@@ -585,7 +585,7 @@
           </w:tcPr>
           <w:p>
             <w:r>
-              <w:t>64.7</w:t>
+              <w:t>66.5</w:t>
             </w:r>
           </w:p>
         </w:tc>
@@ -595,7 +595,7 @@
           </w:tcPr>
           <w:p>
             <w:r>
-              <w:t>428</w:t>
+              <w:t>309</w:t>
             </w:r>
           </w:p>
         </w:tc>
@@ -607,7 +607,7 @@
           </w:tcPr>
           <w:p>
             <w:r>
-              <w:t>2026-06-25 23:46:38</w:t>
+              <w:t>2026-06-26 00:08:01</w:t>
             </w:r>
           </w:p>
         </w:tc>
@@ -617,7 +617,7 @@
           </w:tcPr>
           <w:p>
             <w:r>
-              <w:t>37</w:t>
+              <w:t>39</w:t>
             </w:r>
           </w:p>
         </w:tc>
@@ -627,7 +627,7 @@
           </w:tcPr>
           <w:p>
             <w:r>
-              <w:t>58.6</w:t>
+              <w:t>64.0</w:t>
             </w:r>
           </w:p>
         </w:tc>
@@ -647,7 +647,7 @@
           </w:tcPr>
           <w:p>
             <w:r>
-              <w:t>50.8</w:t>
+              <w:t>51.1</w:t>
             </w:r>
           </w:p>
         </w:tc>
@@ -657,7 +657,7 @@
           </w:tcPr>
           <w:p>
             <w:r>
-              <w:t>64.7</w:t>
+              <w:t>67.4</w:t>
             </w:r>
           </w:p>
         </w:tc>
@@ -667,7 +667,7 @@
           </w:tcPr>
           <w:p>
             <w:r>
-              <w:t>67</w:t>
+              <w:t>388</w:t>
             </w:r>
           </w:p>
         </w:tc>
@@ -679,7 +679,7 @@
           </w:tcPr>
           <w:p>
             <w:r>
-              <w:t>2026-06-26 00:02:45</w:t>
+              <w:t>2026-06-26 00:13:01</w:t>
             </w:r>
           </w:p>
         </w:tc>
@@ -689,7 +689,7 @@
           </w:tcPr>
           <w:p>
             <w:r>
-              <w:t>38</w:t>
+              <w:t>40</w:t>
             </w:r>
           </w:p>
         </w:tc>
@@ -699,7 +699,7 @@
           </w:tcPr>
           <w:p>
             <w:r>
-              <w:t>61.4</w:t>
+              <w:t>66.3</w:t>
             </w:r>
           </w:p>
         </w:tc>
@@ -719,7 +719,7 @@
           </w:tcPr>
           <w:p>
             <w:r>
-              <w:t>52.7</w:t>
+              <w:t>51.1</w:t>
             </w:r>
           </w:p>
         </w:tc>
@@ -729,7 +729,7 @@
           </w:tcPr>
           <w:p>
             <w:r>
-              <w:t>66.5</w:t>
+              <w:t>68.6</w:t>
             </w:r>
           </w:p>
         </w:tc>
@@ -739,7 +739,7 @@
           </w:tcPr>
           <w:p>
             <w:r>
-              <w:t>309</w:t>
+              <w:t>463</w:t>
             </w:r>
           </w:p>
         </w:tc>
@@ -751,7 +751,7 @@
           </w:tcPr>
           <w:p>
             <w:r>
-              <w:t>2026-06-26 00:08:01</w:t>
+              <w:t>2026-06-26 00:13:05</w:t>
             </w:r>
           </w:p>
         </w:tc>
@@ -761,7 +761,7 @@
           </w:tcPr>
           <w:p>
             <w:r>
-              <w:t>39</w:t>
+              <w:t>40</w:t>
             </w:r>
           </w:p>
         </w:tc>
@@ -771,7 +771,7 @@
           </w:tcPr>
           <w:p>
             <w:r>
-              <w:t>64.0</w:t>
+              <w:t>66.3</w:t>
             </w:r>
           </w:p>
         </w:tc>
@@ -781,7 +781,7 @@
           </w:tcPr>
           <w:p>
             <w:r>
-              <w:t>90.6</w:t>
+              <w:t>75.6</w:t>
             </w:r>
           </w:p>
         </w:tc>
@@ -801,7 +801,7 @@
           </w:tcPr>
           <w:p>
             <w:r>
-              <w:t>67.4</w:t>
+              <w:t>64.8</w:t>
             </w:r>
           </w:p>
         </w:tc>
@@ -811,7 +811,7 @@
           </w:tcPr>
           <w:p>
             <w:r>
-              <w:t>388</w:t>
+              <w:t>464</w:t>
             </w:r>
           </w:p>
         </w:tc>
@@ -823,7 +823,7 @@
           </w:tcPr>
           <w:p>
             <w:r>
-              <w:t>2026-06-26 00:13:01</w:t>
+              <w:t>2026-06-26 00:18:02</w:t>
             </w:r>
           </w:p>
         </w:tc>
@@ -833,7 +833,7 @@
           </w:tcPr>
           <w:p>
             <w:r>
-              <w:t>40</w:t>
+              <w:t>41</w:t>
             </w:r>
           </w:p>
         </w:tc>
@@ -843,7 +843,7 @@
           </w:tcPr>
           <w:p>
             <w:r>
-              <w:t>66.3</w:t>
+              <w:t>69.4</w:t>
             </w:r>
           </w:p>
         </w:tc>
@@ -853,7 +853,7 @@
           </w:tcPr>
           <w:p>
             <w:r>
-              <w:t>90.6</w:t>
+              <w:t>75.6</w:t>
             </w:r>
           </w:p>
         </w:tc>
@@ -873,7 +873,7 @@
           </w:tcPr>
           <w:p>
             <w:r>
-              <w:t>68.6</w:t>
+              <w:t>66.4</w:t>
             </w:r>
           </w:p>
         </w:tc>
@@ -883,7 +883,7 @@
           </w:tcPr>
           <w:p>
             <w:r>
-              <w:t>463</w:t>
+              <w:t>538</w:t>
             </w:r>
           </w:p>
         </w:tc>
@@ -895,7 +895,7 @@
           </w:tcPr>
           <w:p>
             <w:r>
-              <w:t>2026-06-26 00:13:05</w:t>
+              <w:t>2026-06-26 00:29:19</w:t>
             </w:r>
           </w:p>
         </w:tc>
@@ -905,7 +905,7 @@
           </w:tcPr>
           <w:p>
             <w:r>
-              <w:t>40</w:t>
+              <w:t>41</w:t>
             </w:r>
           </w:p>
         </w:tc>
@@ -915,7 +915,7 @@
           </w:tcPr>
           <w:p>
             <w:r>
-              <w:t>66.3</w:t>
+              <w:t>69.4</w:t>
             </w:r>
           </w:p>
         </w:tc>
@@ -925,7 +925,7 @@
           </w:tcPr>
           <w:p>
             <w:r>
-              <w:t>75.6</w:t>
+              <w:t>90.6</w:t>
             </w:r>
           </w:p>
         </w:tc>
@@ -945,7 +945,7 @@
           </w:tcPr>
           <w:p>
             <w:r>
-              <w:t>64.8</w:t>
+              <w:t>70.1</w:t>
             </w:r>
           </w:p>
         </w:tc>
@@ -955,7 +955,7 @@
           </w:tcPr>
           <w:p>
             <w:r>
-              <w:t>464</w:t>
+              <w:t>1</w:t>
             </w:r>
           </w:p>
         </w:tc>
@@ -967,7 +967,7 @@
           </w:tcPr>
           <w:p>
             <w:r>
-              <w:t>2026-06-26 00:18:02</w:t>
+              <w:t>2026-06-26 00:38:02</w:t>
             </w:r>
           </w:p>
         </w:tc>
@@ -977,7 +977,7 @@
           </w:tcPr>
           <w:p>
             <w:r>
-              <w:t>41</w:t>
+              <w:t>42</w:t>
             </w:r>
           </w:p>
         </w:tc>
@@ -987,7 +987,7 @@
           </w:tcPr>
           <w:p>
             <w:r>
-              <w:t>69.4</w:t>
+              <w:t>64.0</w:t>
             </w:r>
           </w:p>
         </w:tc>
@@ -997,7 +997,7 @@
           </w:tcPr>
           <w:p>
             <w:r>
-              <w:t>75.6</w:t>
+              <w:t>90.6</w:t>
             </w:r>
           </w:p>
         </w:tc>
@@ -1007,7 +1007,7 @@
           </w:tcPr>
           <w:p>
             <w:r>
-              <w:t>51.1</w:t>
+              <w:t>48.5</w:t>
             </w:r>
           </w:p>
         </w:tc>
@@ -1017,7 +1017,7 @@
           </w:tcPr>
           <w:p>
             <w:r>
-              <w:t>66.4</w:t>
+              <w:t>66.8</w:t>
             </w:r>
           </w:p>
         </w:tc>
@@ -1027,7 +1027,7 @@
           </w:tcPr>
           <w:p>
             <w:r>
-              <w:t>538</w:t>
+              <w:t>132</w:t>
             </w:r>
           </w:p>
         </w:tc>
@@ -1039,7 +1039,7 @@
           </w:tcPr>
           <w:p>
             <w:r>
-              <w:t>2026-06-26 00:29:19</w:t>
+              <w:t>2026-06-26 00:38:06</w:t>
             </w:r>
           </w:p>
         </w:tc>
@@ -1049,7 +1049,7 @@
           </w:tcPr>
           <w:p>
             <w:r>
-              <w:t>41</w:t>
+              <w:t>42</w:t>
             </w:r>
           </w:p>
         </w:tc>
@@ -1059,7 +1059,7 @@
           </w:tcPr>
           <w:p>
             <w:r>
-              <w:t>69.4</w:t>
+              <w:t>64.0</w:t>
             </w:r>
           </w:p>
         </w:tc>
@@ -1069,7 +1069,7 @@
           </w:tcPr>
           <w:p>
             <w:r>
-              <w:t>90.6</w:t>
+              <w:t>75.6</w:t>
             </w:r>
           </w:p>
         </w:tc>
@@ -1079,7 +1079,7 @@
           </w:tcPr>
           <w:p>
             <w:r>
-              <w:t>51.1</w:t>
+              <w:t>48.5</w:t>
             </w:r>
           </w:p>
         </w:tc>
@@ -1089,7 +1089,7 @@
           </w:tcPr>
           <w:p>
             <w:r>
-              <w:t>70.1</w:t>
+              <w:t>63.0</w:t>
             </w:r>
           </w:p>
         </w:tc>
@@ -1099,7 +1099,7 @@
           </w:tcPr>
           <w:p>
             <w:r>
-              <w:t>1</w:t>
+              <w:t>133</w:t>
             </w:r>
           </w:p>
         </w:tc>
@@ -1111,7 +1111,7 @@
           </w:tcPr>
           <w:p>
             <w:r>
-              <w:t>2026-06-26 00:38:02</w:t>
+              <w:t>2026-06-26 00:43:03</w:t>
             </w:r>
           </w:p>
         </w:tc>
@@ -1121,7 +1121,7 @@
           </w:tcPr>
           <w:p>
             <w:r>
-              <w:t>42</w:t>
+              <w:t>43</w:t>
             </w:r>
           </w:p>
         </w:tc>
@@ -1131,7 +1131,7 @@
           </w:tcPr>
           <w:p>
             <w:r>
-              <w:t>64.0</w:t>
+              <w:t>66.7</w:t>
             </w:r>
           </w:p>
         </w:tc>
@@ -1141,7 +1141,7 @@
           </w:tcPr>
           <w:p>
             <w:r>
-              <w:t>90.6</w:t>
+              <w:t>75.6</w:t>
             </w:r>
           </w:p>
         </w:tc>
@@ -1151,7 +1151,7 @@
           </w:tcPr>
           <w:p>
             <w:r>
-              <w:t>48.5</w:t>
+              <w:t>50.4</w:t>
             </w:r>
           </w:p>
         </w:tc>
@@ -1161,7 +1161,7 @@
           </w:tcPr>
           <w:p>
             <w:r>
-              <w:t>66.8</w:t>
+              <w:t>64.8</w:t>
             </w:r>
           </w:p>
         </w:tc>
@@ -1171,7 +1171,7 @@
           </w:tcPr>
           <w:p>
             <w:r>
-              <w:t>132</w:t>
+              <w:t>207</w:t>
             </w:r>
           </w:p>
         </w:tc>
@@ -1183,7 +1183,7 @@
           </w:tcPr>
           <w:p>
             <w:r>
-              <w:t>2026-06-26 00:38:06</w:t>
+              <w:t>2026-06-26 01:13:06</w:t>
             </w:r>
           </w:p>
         </w:tc>
@@ -1193,7 +1193,7 @@
           </w:tcPr>
           <w:p>
             <w:r>
-              <w:t>42</w:t>
+              <w:t>43</w:t>
             </w:r>
           </w:p>
         </w:tc>
@@ -1203,7 +1203,7 @@
           </w:tcPr>
           <w:p>
             <w:r>
-              <w:t>64.0</w:t>
+              <w:t>66.7</w:t>
             </w:r>
           </w:p>
         </w:tc>
@@ -1223,7 +1223,7 @@
           </w:tcPr>
           <w:p>
             <w:r>
-              <w:t>48.5</w:t>
+              <w:t>50.4</w:t>
             </w:r>
           </w:p>
         </w:tc>
@@ -1233,7 +1233,7 @@
           </w:tcPr>
           <w:p>
             <w:r>
-              <w:t>63.0</w:t>
+              <w:t>64.8</w:t>
             </w:r>
           </w:p>
         </w:tc>
@@ -1243,7 +1243,7 @@
           </w:tcPr>
           <w:p>
             <w:r>
-              <w:t>133</w:t>
+              <w:t>657</w:t>
             </w:r>
           </w:p>
         </w:tc>
@@ -1255,7 +1255,7 @@
           </w:tcPr>
           <w:p>
             <w:r>
-              <w:t>2026-06-26 00:43:03</w:t>
+              <w:t>2026-06-26 01:41:44</w:t>
             </w:r>
           </w:p>
         </w:tc>
@@ -1285,7 +1285,7 @@
           </w:tcPr>
           <w:p>
             <w:r>
-              <w:t>75.6</w:t>
+              <w:t>90.6</w:t>
             </w:r>
           </w:p>
         </w:tc>
@@ -1305,7 +1305,7 @@
           </w:tcPr>
           <w:p>
             <w:r>
-              <w:t>64.8</w:t>
+              <w:t>68.6</w:t>
             </w:r>
           </w:p>
         </w:tc>
@@ -1315,7 +1315,7 @@
           </w:tcPr>
           <w:p>
             <w:r>
-              <w:t>207</w:t>
+              <w:t>1</w:t>
             </w:r>
           </w:p>
         </w:tc>
@@ -1327,7 +1327,7 @@
           </w:tcPr>
           <w:p>
             <w:r>
-              <w:t>2026-06-26 01:13:06</w:t>
+              <w:t>2026-06-26 01:51:12</w:t>
             </w:r>
           </w:p>
         </w:tc>
@@ -1337,7 +1337,7 @@
           </w:tcPr>
           <w:p>
             <w:r>
-              <w:t>43</w:t>
+              <w:t>44</w:t>
             </w:r>
           </w:p>
         </w:tc>
@@ -1347,7 +1347,7 @@
           </w:tcPr>
           <w:p>
             <w:r>
-              <w:t>66.7</w:t>
+              <w:t>61.6</w:t>
             </w:r>
           </w:p>
         </w:tc>
@@ -1357,7 +1357,7 @@
           </w:tcPr>
           <w:p>
             <w:r>
-              <w:t>75.6</w:t>
+              <w:t>90.6</w:t>
             </w:r>
           </w:p>
         </w:tc>
@@ -1367,7 +1367,7 @@
           </w:tcPr>
           <w:p>
             <w:r>
-              <w:t>50.4</w:t>
+              <w:t>48.1</w:t>
             </w:r>
           </w:p>
         </w:tc>
@@ -1377,7 +1377,7 @@
           </w:tcPr>
           <w:p>
             <w:r>
-              <w:t>64.8</w:t>
+              <w:t>65.5</w:t>
             </w:r>
           </w:p>
         </w:tc>
@@ -1387,7 +1387,7 @@
           </w:tcPr>
           <w:p>
             <w:r>
-              <w:t>657</w:t>
+              <w:t>137</w:t>
             </w:r>
           </w:p>
         </w:tc>
@@ -1399,7 +1399,7 @@
           </w:tcPr>
           <w:p>
             <w:r>
-              <w:t>2026-06-26 01:41:44</w:t>
+              <w:t>2026-06-26 02:21:15</w:t>
             </w:r>
           </w:p>
         </w:tc>
@@ -1409,7 +1409,7 @@
           </w:tcPr>
           <w:p>
             <w:r>
-              <w:t>43</w:t>
+              <w:t>44</w:t>
             </w:r>
           </w:p>
         </w:tc>
@@ -1419,7 +1419,7 @@
           </w:tcPr>
           <w:p>
             <w:r>
-              <w:t>66.7</w:t>
+              <w:t>61.6</w:t>
             </w:r>
           </w:p>
         </w:tc>
@@ -1439,7 +1439,7 @@
           </w:tcPr>
           <w:p>
             <w:r>
-              <w:t>50.4</w:t>
+              <w:t>48.1</w:t>
             </w:r>
           </w:p>
         </w:tc>
@@ -1449,7 +1449,7 @@
           </w:tcPr>
           <w:p>
             <w:r>
-              <w:t>68.6</w:t>
+              <w:t>65.5</w:t>
             </w:r>
           </w:p>
         </w:tc>
@@ -1459,7 +1459,7 @@
           </w:tcPr>
           <w:p>
             <w:r>
-              <w:t>1</w:t>
+              <w:t>588</w:t>
             </w:r>
           </w:p>
         </w:tc>
@@ -1471,7 +1471,7 @@
           </w:tcPr>
           <w:p>
             <w:r>
-              <w:t>2026-06-26 01:51:12</w:t>
+              <w:t>2026-06-26 02:23:03</w:t>
             </w:r>
           </w:p>
         </w:tc>
@@ -1481,7 +1481,7 @@
           </w:tcPr>
           <w:p>
             <w:r>
-              <w:t>44</w:t>
+              <w:t>45</w:t>
             </w:r>
           </w:p>
         </w:tc>
@@ -1491,7 +1491,7 @@
           </w:tcPr>
           <w:p>
             <w:r>
-              <w:t>61.6</w:t>
+              <w:t>64.2</w:t>
             </w:r>
           </w:p>
         </w:tc>
@@ -1521,7 +1521,7 @@
           </w:tcPr>
           <w:p>
             <w:r>
-              <w:t>65.5</w:t>
+              <w:t>66.8</w:t>
             </w:r>
           </w:p>
         </w:tc>
@@ -1531,7 +1531,7 @@
           </w:tcPr>
           <w:p>
             <w:r>
-              <w:t>137</w:t>
+              <w:t>615</w:t>
             </w:r>
           </w:p>
         </w:tc>
@@ -1543,7 +1543,7 @@
           </w:tcPr>
           <w:p>
             <w:r>
-              <w:t>2026-06-26 02:21:15</w:t>
+              <w:t>2026-06-26 02:27:37</w:t>
             </w:r>
           </w:p>
         </w:tc>
@@ -1553,7 +1553,7 @@
           </w:tcPr>
           <w:p>
             <w:r>
-              <w:t>44</w:t>
+              <w:t>46</w:t>
             </w:r>
           </w:p>
         </w:tc>
@@ -1563,7 +1563,7 @@
           </w:tcPr>
           <w:p>
             <w:r>
-              <w:t>61.6</w:t>
+              <w:t>67.7</w:t>
             </w:r>
           </w:p>
         </w:tc>
@@ -1583,7 +1583,7 @@
           </w:tcPr>
           <w:p>
             <w:r>
-              <w:t>48.1</w:t>
+              <w:t>49.9</w:t>
             </w:r>
           </w:p>
         </w:tc>
@@ -1593,7 +1593,7 @@
           </w:tcPr>
           <w:p>
             <w:r>
-              <w:t>65.5</w:t>
+              <w:t>69.0</w:t>
             </w:r>
           </w:p>
         </w:tc>
@@ -1603,7 +1603,7 @@
           </w:tcPr>
           <w:p>
             <w:r>
-              <w:t>588</w:t>
+              <w:t>1</w:t>
             </w:r>
           </w:p>
         </w:tc>
@@ -1615,7 +1615,7 @@
           </w:tcPr>
           <w:p>
             <w:r>
-              <w:t>2026-06-26 02:23:03</w:t>
+              <w:t>2026-06-26 02:57:41</w:t>
             </w:r>
           </w:p>
         </w:tc>
@@ -1625,7 +1625,7 @@
           </w:tcPr>
           <w:p>
             <w:r>
-              <w:t>45</w:t>
+              <w:t>46</w:t>
             </w:r>
           </w:p>
         </w:tc>
@@ -1635,7 +1635,7 @@
           </w:tcPr>
           <w:p>
             <w:r>
-              <w:t>64.2</w:t>
+              <w:t>67.7</w:t>
             </w:r>
           </w:p>
         </w:tc>
@@ -1645,7 +1645,7 @@
           </w:tcPr>
           <w:p>
             <w:r>
-              <w:t>90.6</w:t>
+              <w:t>90.3</w:t>
             </w:r>
           </w:p>
         </w:tc>
@@ -1655,7 +1655,7 @@
           </w:tcPr>
           <w:p>
             <w:r>
-              <w:t>48.1</w:t>
+              <w:t>49.9</w:t>
             </w:r>
           </w:p>
         </w:tc>
@@ -1665,7 +1665,7 @@
           </w:tcPr>
           <w:p>
             <w:r>
-              <w:t>66.8</w:t>
+              <w:t>68.9</w:t>
             </w:r>
           </w:p>
         </w:tc>
@@ -1675,7 +1675,7 @@
           </w:tcPr>
           <w:p>
             <w:r>
-              <w:t>615</w:t>
+              <w:t>11</w:t>
             </w:r>
           </w:p>
         </w:tc>
@@ -1687,7 +1687,7 @@
           </w:tcPr>
           <w:p>
             <w:r>
-              <w:t>2026-06-26 02:27:37</w:t>
+              <w:t>2026-06-26 02:57:53</w:t>
             </w:r>
           </w:p>
         </w:tc>
@@ -1697,7 +1697,7 @@
           </w:tcPr>
           <w:p>
             <w:r>
-              <w:t>46</w:t>
+              <w:t>47</w:t>
             </w:r>
           </w:p>
         </w:tc>
@@ -1707,7 +1707,7 @@
           </w:tcPr>
           <w:p>
             <w:r>
-              <w:t>67.7</w:t>
+              <w:t>70.8</w:t>
             </w:r>
           </w:p>
         </w:tc>
@@ -1717,7 +1717,7 @@
           </w:tcPr>
           <w:p>
             <w:r>
-              <w:t>90.6</w:t>
+              <w:t>90.3</w:t>
             </w:r>
           </w:p>
         </w:tc>
@@ -1727,7 +1727,7 @@
           </w:tcPr>
           <w:p>
             <w:r>
-              <w:t>49.9</w:t>
+              <w:t>51.5</w:t>
             </w:r>
           </w:p>
         </w:tc>
@@ -1737,7 +1737,7 @@
           </w:tcPr>
           <w:p>
             <w:r>
-              <w:t>69.0</w:t>
+              <w:t>70.8</w:t>
             </w:r>
           </w:p>
         </w:tc>
@@ -1747,7 +1747,7 @@
           </w:tcPr>
           <w:p>
             <w:r>
-              <w:t>1</w:t>
+              <w:t>14</w:t>
             </w:r>
           </w:p>
         </w:tc>
@@ -1768,7 +1768,7 @@
     </w:p>
     <w:p>
       <w:r>
-        <w:t>Section score: 67.7 / 100  (Grade: D)</w:t>
+        <w:t>Section score: 70.8 / 100  (Grade: C)</w:t>
       </w:r>
     </w:p>
     <w:p>
@@ -1879,7 +1879,7 @@
           </w:tcPr>
           <w:p>
             <w:r>
-              <w:t>56.3</w:t>
+              <w:t>63.0</w:t>
             </w:r>
           </w:p>
         </w:tc>
@@ -1889,7 +1889,7 @@
           </w:tcPr>
           <w:p>
             <w:r>
-              <w:t>8.4</w:t>
+              <w:t>9.4</w:t>
             </w:r>
           </w:p>
         </w:tc>
@@ -1911,7 +1911,7 @@
           </w:tcPr>
           <w:p>
             <w:r>
-              <w:t>43.1</w:t>
+              <w:t>49.1</w:t>
             </w:r>
           </w:p>
         </w:tc>
@@ -1921,7 +1921,7 @@
           </w:tcPr>
           <w:p>
             <w:r>
-              <w:t>6.5</w:t>
+              <w:t>7.4</w:t>
             </w:r>
           </w:p>
         </w:tc>
@@ -1943,7 +1943,7 @@
           </w:tcPr>
           <w:p>
             <w:r>
-              <w:t>87.6</w:t>
+              <w:t>90.9</w:t>
             </w:r>
           </w:p>
         </w:tc>
@@ -1953,7 +1953,7 @@
           </w:tcPr>
           <w:p>
             <w:r>
-              <w:t>17.5</w:t>
+              <w:t>18.2</w:t>
             </w:r>
           </w:p>
         </w:tc>
@@ -2007,7 +2007,7 @@
           </w:tcPr>
           <w:p>
             <w:r>
-              <w:t>86.9</w:t>
+              <w:t>88.5</w:t>
             </w:r>
           </w:p>
         </w:tc>
@@ -2017,7 +2017,7 @@
           </w:tcPr>
           <w:p>
             <w:r>
-              <w:t>8.7</w:t>
+              <w:t>8.9</w:t>
             </w:r>
           </w:p>
         </w:tc>
@@ -2039,7 +2039,7 @@
           </w:tcPr>
           <w:p>
             <w:r>
-              <w:t>46.1</w:t>
+              <w:t>47.7</w:t>
             </w:r>
           </w:p>
         </w:tc>
@@ -2049,7 +2049,7 @@
           </w:tcPr>
           <w:p>
             <w:r>
-              <w:t>11.5</w:t>
+              <w:t>11.9</w:t>
             </w:r>
           </w:p>
         </w:tc>
@@ -2090,7 +2090,7 @@
           </w:tcPr>
           <w:p>
             <w:r>
-              <w:t>$537.62</w:t>
+              <w:t>$540.95</w:t>
             </w:r>
           </w:p>
         </w:tc>
@@ -2112,7 +2112,7 @@
           </w:tcPr>
           <w:p>
             <w:r>
-              <w:t>7.52%</w:t>
+              <w:t>8.19%</w:t>
             </w:r>
           </w:p>
         </w:tc>
@@ -2134,7 +2134,7 @@
           </w:tcPr>
           <w:p>
             <w:r>
-              <w:t>$3.16</w:t>
+              <w:t>$6.49</w:t>
             </w:r>
           </w:p>
         </w:tc>
@@ -2178,7 +2178,7 @@
           </w:tcPr>
           <w:p>
             <w:r>
-              <w:t>0.6304</w:t>
+              <w:t>0.6383</w:t>
             </w:r>
           </w:p>
         </w:tc>
@@ -2200,7 +2200,7 @@
           </w:tcPr>
           <w:p>
             <w:r>
-              <w:t>0.5000 / 0.7308</w:t>
+              <w:t>0.5000 / 0.7407</w:t>
             </w:r>
           </w:p>
         </w:tc>
@@ -2222,7 +2222,7 @@
           </w:tcPr>
           <w:p>
             <w:r>
-              <w:t>1.0451</w:t>
+              <w:t>1.0928</w:t>
             </w:r>
           </w:p>
         </w:tc>
@@ -2244,7 +2244,7 @@
           </w:tcPr>
           <w:p>
             <w:r>
-              <w:t>47 / 46</w:t>
+              <w:t>47 / 47</w:t>
             </w:r>
           </w:p>
         </w:tc>
@@ -2266,7 +2266,7 @@
           </w:tcPr>
           <w:p>
             <w:r>
-              <w:t>$0.07</w:t>
+              <w:t>$0.14</w:t>
             </w:r>
           </w:p>
         </w:tc>
@@ -2407,7 +2407,7 @@
           </w:tcPr>
           <w:p>
             <w:r>
-              <w:t>—</w:t>
+              <w:t>down</w:t>
             </w:r>
           </w:p>
         </w:tc>
@@ -2417,7 +2417,7 @@
           </w:tcPr>
           <w:p>
             <w:r>
-              <w:t>—</w:t>
+              <w:t>Yes</w:t>
             </w:r>
           </w:p>
         </w:tc>
@@ -2427,7 +2427,7 @@
           </w:tcPr>
           <w:p>
             <w:r>
-              <w:t>$—</w:t>
+              <w:t>$3.33</w:t>
             </w:r>
           </w:p>
         </w:tc>
@@ -3176,7 +3176,7 @@
     </w:p>
     <w:p>
       <w:r>
-        <w:t>Section score: 90.5 / 100  (Grade: A)</w:t>
+        <w:t>Section score: 90.2 / 100  (Grade: A)</w:t>
       </w:r>
     </w:p>
     <w:p>
@@ -3319,7 +3319,7 @@
           </w:tcPr>
           <w:p>
             <w:r>
-              <w:t>96.5</w:t>
+              <w:t>94.8</w:t>
             </w:r>
           </w:p>
         </w:tc>
@@ -3329,7 +3329,7 @@
           </w:tcPr>
           <w:p>
             <w:r>
-              <w:t>14.5</w:t>
+              <w:t>14.2</w:t>
             </w:r>
           </w:p>
         </w:tc>
@@ -3433,17 +3433,17 @@
     </w:tbl>
     <w:p>
       <w:r>
-        <w:t>Ticks: 409 · Reconciled: True · Readiness: not_ready</w:t>
+        <w:t>Ticks: 22 · Reconciled: True · Readiness: not_ready</w:t>
       </w:r>
     </w:p>
     <w:p>
       <w:r>
-        <w:t>Candidates created: 17995 · Terminals: {'accepted': 47, 'rejected': 14785, 'skipped': 3086, 'expired': 0, 'missing_data': 77}</w:t>
+        <w:t>Candidates created: 18260 · Terminals: {'accepted': 47, 'rejected': 15002, 'skipped': 3130, 'expired': 0, 'missing_data': 81}</w:t>
       </w:r>
     </w:p>
     <w:p>
       <w:r>
-        <w:t>Rejected by stage: {'directional': 8312, 'execution_gate': 112, 'context_gate': 686, 'directional_allowlist': 1364, 'down_bias_gate': 538, 'mtf_gate': 189, 'grok_decider': 3470, 'execution_realistic': 3, 'verifier': 61, 'mispricing_gate': 50}</w:t>
+        <w:t>Rejected by stage: {'directional': 8461, 'execution_gate': 118, 'context_gate': 706, 'directional_allowlist': 1364, 'down_bias_gate': 538, 'mtf_gate': 210, 'grok_decider': 3491, 'execution_realistic': 3, 'verifier': 61, 'mispricing_gate': 50}</w:t>
       </w:r>
     </w:p>
     <w:p>
@@ -4018,7 +4018,7 @@
     </w:p>
     <w:p>
       <w:r>
-        <w:t>Section score: 49.9 / 100  (Grade: F)</w:t>
+        <w:t>Section score: 51.5 / 100  (Grade: F)</w:t>
       </w:r>
     </w:p>
     <w:p>
@@ -4225,7 +4225,7 @@
           </w:tcPr>
           <w:p>
             <w:r>
-              <w:t>47.9</w:t>
+              <w:t>52.2</w:t>
             </w:r>
           </w:p>
         </w:tc>
@@ -4235,7 +4235,7 @@
           </w:tcPr>
           <w:p>
             <w:r>
-              <w:t>14.4</w:t>
+              <w:t>15.6</w:t>
             </w:r>
           </w:p>
         </w:tc>
@@ -4257,7 +4257,7 @@
           </w:tcPr>
           <w:p>
             <w:r>
-              <w:t>7.5</w:t>
+              <w:t>9.8</w:t>
             </w:r>
           </w:p>
         </w:tc>
@@ -4267,7 +4267,7 @@
           </w:tcPr>
           <w:p>
             <w:r>
-              <w:t>1.1</w:t>
+              <w:t>1.5</w:t>
             </w:r>
           </w:p>
         </w:tc>
@@ -4308,7 +4308,7 @@
           </w:tcPr>
           <w:p>
             <w:r>
-              <w:t>0.5789</w:t>
+              <w:t>0.6000</w:t>
             </w:r>
           </w:p>
         </w:tc>
@@ -4352,7 +4352,7 @@
           </w:tcPr>
           <w:p>
             <w:r>
-              <w:t>0.5000</w:t>
+              <w:t>0.5152</w:t>
             </w:r>
           </w:p>
         </w:tc>
@@ -4396,7 +4396,7 @@
           </w:tcPr>
           <w:p>
             <w:r>
-              <w:t>0.4910</w:t>
+              <w:t>0.4911</w:t>
             </w:r>
           </w:p>
         </w:tc>
@@ -4426,7 +4426,7 @@
     </w:tbl>
     <w:p>
       <w:r>
-        <w:t>TV alerts: received 675 · valid 664 · rejected 11</w:t>
+        <w:t>TV alerts: received 691 · valid 680 · rejected 11</w:t>
       </w:r>
     </w:p>
     <w:sectPr>

</xml_diff>

<commit_message>
chore(reports): VPS full report 2026-06-26 03:24 UTC (47 settled, WR 63.8%, PF 1.0928)
</commit_message>
<xml_diff>
--- a/vps_full_reports/latest/report.docx
+++ b/vps_full_reports/latest/report.docx
@@ -20,7 +20,7 @@
           <w:color w:val="666666"/>
           <w:sz w:val="20"/>
         </w:rPr>
-        <w:t>PAPER ONLY  ·  reconciled=True  ·  ticks=22</w:t>
+        <w:t>PAPER ONLY  ·  reconciled=True  ·  ticks=205</w:t>
       </w:r>
     </w:p>
     <w:p>
@@ -3319,7 +3319,7 @@
           </w:tcPr>
           <w:p>
             <w:r>
-              <w:t>94.8</w:t>
+              <w:t>94.9</w:t>
             </w:r>
           </w:p>
         </w:tc>
@@ -3433,17 +3433,17 @@
     </w:tbl>
     <w:p>
       <w:r>
-        <w:t>Ticks: 22 · Reconciled: True · Readiness: not_ready</w:t>
+        <w:t>Ticks: 205 · Reconciled: True · Readiness: not_ready</w:t>
       </w:r>
     </w:p>
     <w:p>
       <w:r>
-        <w:t>Candidates created: 18260 · Terminals: {'accepted': 47, 'rejected': 15002, 'skipped': 3130, 'expired': 0, 'missing_data': 81}</w:t>
+        <w:t>Candidates created: 18443 · Terminals: {'accepted': 47, 'rejected': 15185, 'skipped': 3130, 'expired': 0, 'missing_data': 81}</w:t>
       </w:r>
     </w:p>
     <w:p>
       <w:r>
-        <w:t>Rejected by stage: {'directional': 8461, 'execution_gate': 118, 'context_gate': 706, 'directional_allowlist': 1364, 'down_bias_gate': 538, 'mtf_gate': 210, 'grok_decider': 3491, 'execution_realistic': 3, 'verifier': 61, 'mispricing_gate': 50}</w:t>
+        <w:t>Rejected by stage: {'directional': 8564, 'execution_gate': 118, 'context_gate': 716, 'directional_allowlist': 1364, 'down_bias_gate': 538, 'mtf_gate': 264, 'grok_decider': 3507, 'execution_realistic': 3, 'verifier': 61, 'mispricing_gate': 50}</w:t>
       </w:r>
     </w:p>
     <w:p>
@@ -4396,7 +4396,7 @@
           </w:tcPr>
           <w:p>
             <w:r>
-              <w:t>0.4911</w:t>
+              <w:t>0.4912</w:t>
             </w:r>
           </w:p>
         </w:tc>
@@ -4426,7 +4426,7 @@
     </w:tbl>
     <w:p>
       <w:r>
-        <w:t>TV alerts: received 691 · valid 680 · rejected 11</w:t>
+        <w:t>TV alerts: received 699 · valid 688 · rejected 11</w:t>
       </w:r>
     </w:p>
     <w:sectPr>

</xml_diff>

<commit_message>
chore(reports): VPS full report 2026-06-26 03:55 UTC (48 settled, WR 62.5%, PF 1.0199)
</commit_message>
<xml_diff>
--- a/vps_full_reports/latest/report.docx
+++ b/vps_full_reports/latest/report.docx
@@ -20,7 +20,7 @@
           <w:color w:val="666666"/>
           <w:sz w:val="20"/>
         </w:rPr>
-        <w:t>PAPER ONLY  ·  reconciled=True  ·  ticks=205</w:t>
+        <w:t>PAPER ONLY  ·  reconciled=True  ·  ticks=426</w:t>
       </w:r>
     </w:p>
     <w:p>
@@ -33,7 +33,7 @@
     </w:p>
     <w:p>
       <w:r>
-        <w:t>Overall score: 70.8 / 100  (Grade: C)</w:t>
+        <w:t>Overall score: 68.8 / 100  (Grade: D)</w:t>
       </w:r>
     </w:p>
     <w:tbl>
@@ -107,7 +107,7 @@
           </w:tcPr>
           <w:p>
             <w:r>
-              <w:t>70.8</w:t>
+              <w:t>65.8</w:t>
             </w:r>
           </w:p>
         </w:tc>
@@ -117,7 +117,7 @@
           </w:tcPr>
           <w:p>
             <w:r>
-              <w:t>C</w:t>
+              <w:t>D</w:t>
             </w:r>
           </w:p>
         </w:tc>
@@ -149,7 +149,7 @@
           </w:tcPr>
           <w:p>
             <w:r>
-              <w:t>90.2</w:t>
+              <w:t>90.0</w:t>
             </w:r>
           </w:p>
         </w:tc>
@@ -191,7 +191,7 @@
           </w:tcPr>
           <w:p>
             <w:r>
-              <w:t>51.5</w:t>
+              <w:t>53.7</w:t>
             </w:r>
           </w:p>
         </w:tc>
@@ -319,7 +319,7 @@
           </w:tcPr>
           <w:p>
             <w:r>
-              <w:t>2026-06-25 22:46:31</w:t>
+              <w:t>2026-06-25 23:46:38</w:t>
             </w:r>
           </w:p>
         </w:tc>
@@ -349,7 +349,7 @@
           </w:tcPr>
           <w:p>
             <w:r>
-              <w:t>90.5</w:t>
+              <w:t>90.6</w:t>
             </w:r>
           </w:p>
         </w:tc>
@@ -369,7 +369,7 @@
           </w:tcPr>
           <w:p>
             <w:r>
-              <w:t>64.6</w:t>
+              <w:t>64.7</w:t>
             </w:r>
           </w:p>
         </w:tc>
@@ -379,7 +379,7 @@
           </w:tcPr>
           <w:p>
             <w:r>
-              <w:t>42</w:t>
+              <w:t>67</w:t>
             </w:r>
           </w:p>
         </w:tc>
@@ -391,7 +391,7 @@
           </w:tcPr>
           <w:p>
             <w:r>
-              <w:t>2026-06-25 23:16:34</w:t>
+              <w:t>2026-06-26 00:02:45</w:t>
             </w:r>
           </w:p>
         </w:tc>
@@ -401,7 +401,7 @@
           </w:tcPr>
           <w:p>
             <w:r>
-              <w:t>37</w:t>
+              <w:t>38</w:t>
             </w:r>
           </w:p>
         </w:tc>
@@ -411,7 +411,7 @@
           </w:tcPr>
           <w:p>
             <w:r>
-              <w:t>58.6</w:t>
+              <w:t>61.4</w:t>
             </w:r>
           </w:p>
         </w:tc>
@@ -431,7 +431,7 @@
           </w:tcPr>
           <w:p>
             <w:r>
-              <w:t>50.8</w:t>
+              <w:t>52.7</w:t>
             </w:r>
           </w:p>
         </w:tc>
@@ -441,7 +441,7 @@
           </w:tcPr>
           <w:p>
             <w:r>
-              <w:t>64.7</w:t>
+              <w:t>66.5</w:t>
             </w:r>
           </w:p>
         </w:tc>
@@ -451,7 +451,7 @@
           </w:tcPr>
           <w:p>
             <w:r>
-              <w:t>428</w:t>
+              <w:t>309</w:t>
             </w:r>
           </w:p>
         </w:tc>
@@ -463,7 +463,7 @@
           </w:tcPr>
           <w:p>
             <w:r>
-              <w:t>2026-06-25 23:46:38</w:t>
+              <w:t>2026-06-26 00:08:01</w:t>
             </w:r>
           </w:p>
         </w:tc>
@@ -473,7 +473,7 @@
           </w:tcPr>
           <w:p>
             <w:r>
-              <w:t>37</w:t>
+              <w:t>39</w:t>
             </w:r>
           </w:p>
         </w:tc>
@@ -483,7 +483,7 @@
           </w:tcPr>
           <w:p>
             <w:r>
-              <w:t>58.6</w:t>
+              <w:t>64.0</w:t>
             </w:r>
           </w:p>
         </w:tc>
@@ -503,7 +503,7 @@
           </w:tcPr>
           <w:p>
             <w:r>
-              <w:t>50.8</w:t>
+              <w:t>51.1</w:t>
             </w:r>
           </w:p>
         </w:tc>
@@ -513,7 +513,7 @@
           </w:tcPr>
           <w:p>
             <w:r>
-              <w:t>64.7</w:t>
+              <w:t>67.4</w:t>
             </w:r>
           </w:p>
         </w:tc>
@@ -523,7 +523,7 @@
           </w:tcPr>
           <w:p>
             <w:r>
-              <w:t>67</w:t>
+              <w:t>388</w:t>
             </w:r>
           </w:p>
         </w:tc>
@@ -535,7 +535,7 @@
           </w:tcPr>
           <w:p>
             <w:r>
-              <w:t>2026-06-26 00:02:45</w:t>
+              <w:t>2026-06-26 00:13:01</w:t>
             </w:r>
           </w:p>
         </w:tc>
@@ -545,7 +545,7 @@
           </w:tcPr>
           <w:p>
             <w:r>
-              <w:t>38</w:t>
+              <w:t>40</w:t>
             </w:r>
           </w:p>
         </w:tc>
@@ -555,7 +555,7 @@
           </w:tcPr>
           <w:p>
             <w:r>
-              <w:t>61.4</w:t>
+              <w:t>66.3</w:t>
             </w:r>
           </w:p>
         </w:tc>
@@ -575,7 +575,7 @@
           </w:tcPr>
           <w:p>
             <w:r>
-              <w:t>52.7</w:t>
+              <w:t>51.1</w:t>
             </w:r>
           </w:p>
         </w:tc>
@@ -585,7 +585,7 @@
           </w:tcPr>
           <w:p>
             <w:r>
-              <w:t>66.5</w:t>
+              <w:t>68.6</w:t>
             </w:r>
           </w:p>
         </w:tc>
@@ -595,7 +595,7 @@
           </w:tcPr>
           <w:p>
             <w:r>
-              <w:t>309</w:t>
+              <w:t>463</w:t>
             </w:r>
           </w:p>
         </w:tc>
@@ -607,7 +607,7 @@
           </w:tcPr>
           <w:p>
             <w:r>
-              <w:t>2026-06-26 00:08:01</w:t>
+              <w:t>2026-06-26 00:13:05</w:t>
             </w:r>
           </w:p>
         </w:tc>
@@ -617,7 +617,7 @@
           </w:tcPr>
           <w:p>
             <w:r>
-              <w:t>39</w:t>
+              <w:t>40</w:t>
             </w:r>
           </w:p>
         </w:tc>
@@ -627,7 +627,7 @@
           </w:tcPr>
           <w:p>
             <w:r>
-              <w:t>64.0</w:t>
+              <w:t>66.3</w:t>
             </w:r>
           </w:p>
         </w:tc>
@@ -637,7 +637,7 @@
           </w:tcPr>
           <w:p>
             <w:r>
-              <w:t>90.6</w:t>
+              <w:t>75.6</w:t>
             </w:r>
           </w:p>
         </w:tc>
@@ -657,7 +657,7 @@
           </w:tcPr>
           <w:p>
             <w:r>
-              <w:t>67.4</w:t>
+              <w:t>64.8</w:t>
             </w:r>
           </w:p>
         </w:tc>
@@ -667,7 +667,7 @@
           </w:tcPr>
           <w:p>
             <w:r>
-              <w:t>388</w:t>
+              <w:t>464</w:t>
             </w:r>
           </w:p>
         </w:tc>
@@ -679,7 +679,7 @@
           </w:tcPr>
           <w:p>
             <w:r>
-              <w:t>2026-06-26 00:13:01</w:t>
+              <w:t>2026-06-26 00:18:02</w:t>
             </w:r>
           </w:p>
         </w:tc>
@@ -689,7 +689,7 @@
           </w:tcPr>
           <w:p>
             <w:r>
-              <w:t>40</w:t>
+              <w:t>41</w:t>
             </w:r>
           </w:p>
         </w:tc>
@@ -699,7 +699,7 @@
           </w:tcPr>
           <w:p>
             <w:r>
-              <w:t>66.3</w:t>
+              <w:t>69.4</w:t>
             </w:r>
           </w:p>
         </w:tc>
@@ -709,7 +709,7 @@
           </w:tcPr>
           <w:p>
             <w:r>
-              <w:t>90.6</w:t>
+              <w:t>75.6</w:t>
             </w:r>
           </w:p>
         </w:tc>
@@ -729,7 +729,7 @@
           </w:tcPr>
           <w:p>
             <w:r>
-              <w:t>68.6</w:t>
+              <w:t>66.4</w:t>
             </w:r>
           </w:p>
         </w:tc>
@@ -739,7 +739,7 @@
           </w:tcPr>
           <w:p>
             <w:r>
-              <w:t>463</w:t>
+              <w:t>538</w:t>
             </w:r>
           </w:p>
         </w:tc>
@@ -751,7 +751,7 @@
           </w:tcPr>
           <w:p>
             <w:r>
-              <w:t>2026-06-26 00:13:05</w:t>
+              <w:t>2026-06-26 00:29:19</w:t>
             </w:r>
           </w:p>
         </w:tc>
@@ -761,7 +761,7 @@
           </w:tcPr>
           <w:p>
             <w:r>
-              <w:t>40</w:t>
+              <w:t>41</w:t>
             </w:r>
           </w:p>
         </w:tc>
@@ -771,7 +771,7 @@
           </w:tcPr>
           <w:p>
             <w:r>
-              <w:t>66.3</w:t>
+              <w:t>69.4</w:t>
             </w:r>
           </w:p>
         </w:tc>
@@ -781,7 +781,7 @@
           </w:tcPr>
           <w:p>
             <w:r>
-              <w:t>75.6</w:t>
+              <w:t>90.6</w:t>
             </w:r>
           </w:p>
         </w:tc>
@@ -801,7 +801,7 @@
           </w:tcPr>
           <w:p>
             <w:r>
-              <w:t>64.8</w:t>
+              <w:t>70.1</w:t>
             </w:r>
           </w:p>
         </w:tc>
@@ -811,7 +811,7 @@
           </w:tcPr>
           <w:p>
             <w:r>
-              <w:t>464</w:t>
+              <w:t>1</w:t>
             </w:r>
           </w:p>
         </w:tc>
@@ -823,7 +823,7 @@
           </w:tcPr>
           <w:p>
             <w:r>
-              <w:t>2026-06-26 00:18:02</w:t>
+              <w:t>2026-06-26 00:38:02</w:t>
             </w:r>
           </w:p>
         </w:tc>
@@ -833,7 +833,7 @@
           </w:tcPr>
           <w:p>
             <w:r>
-              <w:t>41</w:t>
+              <w:t>42</w:t>
             </w:r>
           </w:p>
         </w:tc>
@@ -843,7 +843,7 @@
           </w:tcPr>
           <w:p>
             <w:r>
-              <w:t>69.4</w:t>
+              <w:t>64.0</w:t>
             </w:r>
           </w:p>
         </w:tc>
@@ -853,7 +853,7 @@
           </w:tcPr>
           <w:p>
             <w:r>
-              <w:t>75.6</w:t>
+              <w:t>90.6</w:t>
             </w:r>
           </w:p>
         </w:tc>
@@ -863,7 +863,7 @@
           </w:tcPr>
           <w:p>
             <w:r>
-              <w:t>51.1</w:t>
+              <w:t>48.5</w:t>
             </w:r>
           </w:p>
         </w:tc>
@@ -873,7 +873,7 @@
           </w:tcPr>
           <w:p>
             <w:r>
-              <w:t>66.4</w:t>
+              <w:t>66.8</w:t>
             </w:r>
           </w:p>
         </w:tc>
@@ -883,7 +883,7 @@
           </w:tcPr>
           <w:p>
             <w:r>
-              <w:t>538</w:t>
+              <w:t>132</w:t>
             </w:r>
           </w:p>
         </w:tc>
@@ -895,7 +895,7 @@
           </w:tcPr>
           <w:p>
             <w:r>
-              <w:t>2026-06-26 00:29:19</w:t>
+              <w:t>2026-06-26 00:38:06</w:t>
             </w:r>
           </w:p>
         </w:tc>
@@ -905,7 +905,7 @@
           </w:tcPr>
           <w:p>
             <w:r>
-              <w:t>41</w:t>
+              <w:t>42</w:t>
             </w:r>
           </w:p>
         </w:tc>
@@ -915,7 +915,7 @@
           </w:tcPr>
           <w:p>
             <w:r>
-              <w:t>69.4</w:t>
+              <w:t>64.0</w:t>
             </w:r>
           </w:p>
         </w:tc>
@@ -925,7 +925,7 @@
           </w:tcPr>
           <w:p>
             <w:r>
-              <w:t>90.6</w:t>
+              <w:t>75.6</w:t>
             </w:r>
           </w:p>
         </w:tc>
@@ -935,7 +935,7 @@
           </w:tcPr>
           <w:p>
             <w:r>
-              <w:t>51.1</w:t>
+              <w:t>48.5</w:t>
             </w:r>
           </w:p>
         </w:tc>
@@ -945,7 +945,7 @@
           </w:tcPr>
           <w:p>
             <w:r>
-              <w:t>70.1</w:t>
+              <w:t>63.0</w:t>
             </w:r>
           </w:p>
         </w:tc>
@@ -955,7 +955,7 @@
           </w:tcPr>
           <w:p>
             <w:r>
-              <w:t>1</w:t>
+              <w:t>133</w:t>
             </w:r>
           </w:p>
         </w:tc>
@@ -967,7 +967,7 @@
           </w:tcPr>
           <w:p>
             <w:r>
-              <w:t>2026-06-26 00:38:02</w:t>
+              <w:t>2026-06-26 00:43:03</w:t>
             </w:r>
           </w:p>
         </w:tc>
@@ -977,7 +977,7 @@
           </w:tcPr>
           <w:p>
             <w:r>
-              <w:t>42</w:t>
+              <w:t>43</w:t>
             </w:r>
           </w:p>
         </w:tc>
@@ -987,7 +987,7 @@
           </w:tcPr>
           <w:p>
             <w:r>
-              <w:t>64.0</w:t>
+              <w:t>66.7</w:t>
             </w:r>
           </w:p>
         </w:tc>
@@ -997,7 +997,7 @@
           </w:tcPr>
           <w:p>
             <w:r>
-              <w:t>90.6</w:t>
+              <w:t>75.6</w:t>
             </w:r>
           </w:p>
         </w:tc>
@@ -1007,7 +1007,7 @@
           </w:tcPr>
           <w:p>
             <w:r>
-              <w:t>48.5</w:t>
+              <w:t>50.4</w:t>
             </w:r>
           </w:p>
         </w:tc>
@@ -1017,7 +1017,7 @@
           </w:tcPr>
           <w:p>
             <w:r>
-              <w:t>66.8</w:t>
+              <w:t>64.8</w:t>
             </w:r>
           </w:p>
         </w:tc>
@@ -1027,7 +1027,7 @@
           </w:tcPr>
           <w:p>
             <w:r>
-              <w:t>132</w:t>
+              <w:t>207</w:t>
             </w:r>
           </w:p>
         </w:tc>
@@ -1039,7 +1039,7 @@
           </w:tcPr>
           <w:p>
             <w:r>
-              <w:t>2026-06-26 00:38:06</w:t>
+              <w:t>2026-06-26 01:13:06</w:t>
             </w:r>
           </w:p>
         </w:tc>
@@ -1049,7 +1049,7 @@
           </w:tcPr>
           <w:p>
             <w:r>
-              <w:t>42</w:t>
+              <w:t>43</w:t>
             </w:r>
           </w:p>
         </w:tc>
@@ -1059,7 +1059,7 @@
           </w:tcPr>
           <w:p>
             <w:r>
-              <w:t>64.0</w:t>
+              <w:t>66.7</w:t>
             </w:r>
           </w:p>
         </w:tc>
@@ -1079,7 +1079,7 @@
           </w:tcPr>
           <w:p>
             <w:r>
-              <w:t>48.5</w:t>
+              <w:t>50.4</w:t>
             </w:r>
           </w:p>
         </w:tc>
@@ -1089,7 +1089,7 @@
           </w:tcPr>
           <w:p>
             <w:r>
-              <w:t>63.0</w:t>
+              <w:t>64.8</w:t>
             </w:r>
           </w:p>
         </w:tc>
@@ -1099,7 +1099,7 @@
           </w:tcPr>
           <w:p>
             <w:r>
-              <w:t>133</w:t>
+              <w:t>657</w:t>
             </w:r>
           </w:p>
         </w:tc>
@@ -1111,7 +1111,7 @@
           </w:tcPr>
           <w:p>
             <w:r>
-              <w:t>2026-06-26 00:43:03</w:t>
+              <w:t>2026-06-26 01:41:44</w:t>
             </w:r>
           </w:p>
         </w:tc>
@@ -1141,7 +1141,7 @@
           </w:tcPr>
           <w:p>
             <w:r>
-              <w:t>75.6</w:t>
+              <w:t>90.6</w:t>
             </w:r>
           </w:p>
         </w:tc>
@@ -1161,7 +1161,7 @@
           </w:tcPr>
           <w:p>
             <w:r>
-              <w:t>64.8</w:t>
+              <w:t>68.6</w:t>
             </w:r>
           </w:p>
         </w:tc>
@@ -1171,7 +1171,7 @@
           </w:tcPr>
           <w:p>
             <w:r>
-              <w:t>207</w:t>
+              <w:t>1</w:t>
             </w:r>
           </w:p>
         </w:tc>
@@ -1183,7 +1183,7 @@
           </w:tcPr>
           <w:p>
             <w:r>
-              <w:t>2026-06-26 01:13:06</w:t>
+              <w:t>2026-06-26 01:51:12</w:t>
             </w:r>
           </w:p>
         </w:tc>
@@ -1193,7 +1193,7 @@
           </w:tcPr>
           <w:p>
             <w:r>
-              <w:t>43</w:t>
+              <w:t>44</w:t>
             </w:r>
           </w:p>
         </w:tc>
@@ -1203,7 +1203,7 @@
           </w:tcPr>
           <w:p>
             <w:r>
-              <w:t>66.7</w:t>
+              <w:t>61.6</w:t>
             </w:r>
           </w:p>
         </w:tc>
@@ -1213,7 +1213,7 @@
           </w:tcPr>
           <w:p>
             <w:r>
-              <w:t>75.6</w:t>
+              <w:t>90.6</w:t>
             </w:r>
           </w:p>
         </w:tc>
@@ -1223,7 +1223,7 @@
           </w:tcPr>
           <w:p>
             <w:r>
-              <w:t>50.4</w:t>
+              <w:t>48.1</w:t>
             </w:r>
           </w:p>
         </w:tc>
@@ -1233,7 +1233,7 @@
           </w:tcPr>
           <w:p>
             <w:r>
-              <w:t>64.8</w:t>
+              <w:t>65.5</w:t>
             </w:r>
           </w:p>
         </w:tc>
@@ -1243,7 +1243,7 @@
           </w:tcPr>
           <w:p>
             <w:r>
-              <w:t>657</w:t>
+              <w:t>137</w:t>
             </w:r>
           </w:p>
         </w:tc>
@@ -1255,7 +1255,7 @@
           </w:tcPr>
           <w:p>
             <w:r>
-              <w:t>2026-06-26 01:41:44</w:t>
+              <w:t>2026-06-26 02:21:15</w:t>
             </w:r>
           </w:p>
         </w:tc>
@@ -1265,7 +1265,7 @@
           </w:tcPr>
           <w:p>
             <w:r>
-              <w:t>43</w:t>
+              <w:t>44</w:t>
             </w:r>
           </w:p>
         </w:tc>
@@ -1275,7 +1275,7 @@
           </w:tcPr>
           <w:p>
             <w:r>
-              <w:t>66.7</w:t>
+              <w:t>61.6</w:t>
             </w:r>
           </w:p>
         </w:tc>
@@ -1295,7 +1295,7 @@
           </w:tcPr>
           <w:p>
             <w:r>
-              <w:t>50.4</w:t>
+              <w:t>48.1</w:t>
             </w:r>
           </w:p>
         </w:tc>
@@ -1305,7 +1305,7 @@
           </w:tcPr>
           <w:p>
             <w:r>
-              <w:t>68.6</w:t>
+              <w:t>65.5</w:t>
             </w:r>
           </w:p>
         </w:tc>
@@ -1315,7 +1315,7 @@
           </w:tcPr>
           <w:p>
             <w:r>
-              <w:t>1</w:t>
+              <w:t>588</w:t>
             </w:r>
           </w:p>
         </w:tc>
@@ -1327,7 +1327,7 @@
           </w:tcPr>
           <w:p>
             <w:r>
-              <w:t>2026-06-26 01:51:12</w:t>
+              <w:t>2026-06-26 02:23:03</w:t>
             </w:r>
           </w:p>
         </w:tc>
@@ -1337,7 +1337,7 @@
           </w:tcPr>
           <w:p>
             <w:r>
-              <w:t>44</w:t>
+              <w:t>45</w:t>
             </w:r>
           </w:p>
         </w:tc>
@@ -1347,7 +1347,7 @@
           </w:tcPr>
           <w:p>
             <w:r>
-              <w:t>61.6</w:t>
+              <w:t>64.2</w:t>
             </w:r>
           </w:p>
         </w:tc>
@@ -1377,7 +1377,7 @@
           </w:tcPr>
           <w:p>
             <w:r>
-              <w:t>65.5</w:t>
+              <w:t>66.8</w:t>
             </w:r>
           </w:p>
         </w:tc>
@@ -1387,7 +1387,7 @@
           </w:tcPr>
           <w:p>
             <w:r>
-              <w:t>137</w:t>
+              <w:t>615</w:t>
             </w:r>
           </w:p>
         </w:tc>
@@ -1399,7 +1399,7 @@
           </w:tcPr>
           <w:p>
             <w:r>
-              <w:t>2026-06-26 02:21:15</w:t>
+              <w:t>2026-06-26 02:27:37</w:t>
             </w:r>
           </w:p>
         </w:tc>
@@ -1409,7 +1409,7 @@
           </w:tcPr>
           <w:p>
             <w:r>
-              <w:t>44</w:t>
+              <w:t>46</w:t>
             </w:r>
           </w:p>
         </w:tc>
@@ -1419,7 +1419,7 @@
           </w:tcPr>
           <w:p>
             <w:r>
-              <w:t>61.6</w:t>
+              <w:t>67.7</w:t>
             </w:r>
           </w:p>
         </w:tc>
@@ -1439,7 +1439,7 @@
           </w:tcPr>
           <w:p>
             <w:r>
-              <w:t>48.1</w:t>
+              <w:t>49.9</w:t>
             </w:r>
           </w:p>
         </w:tc>
@@ -1449,7 +1449,7 @@
           </w:tcPr>
           <w:p>
             <w:r>
-              <w:t>65.5</w:t>
+              <w:t>69.0</w:t>
             </w:r>
           </w:p>
         </w:tc>
@@ -1459,7 +1459,7 @@
           </w:tcPr>
           <w:p>
             <w:r>
-              <w:t>588</w:t>
+              <w:t>1</w:t>
             </w:r>
           </w:p>
         </w:tc>
@@ -1471,7 +1471,7 @@
           </w:tcPr>
           <w:p>
             <w:r>
-              <w:t>2026-06-26 02:23:03</w:t>
+              <w:t>2026-06-26 02:57:41</w:t>
             </w:r>
           </w:p>
         </w:tc>
@@ -1481,7 +1481,7 @@
           </w:tcPr>
           <w:p>
             <w:r>
-              <w:t>45</w:t>
+              <w:t>46</w:t>
             </w:r>
           </w:p>
         </w:tc>
@@ -1491,7 +1491,7 @@
           </w:tcPr>
           <w:p>
             <w:r>
-              <w:t>64.2</w:t>
+              <w:t>67.7</w:t>
             </w:r>
           </w:p>
         </w:tc>
@@ -1501,7 +1501,7 @@
           </w:tcPr>
           <w:p>
             <w:r>
-              <w:t>90.6</w:t>
+              <w:t>90.3</w:t>
             </w:r>
           </w:p>
         </w:tc>
@@ -1511,7 +1511,7 @@
           </w:tcPr>
           <w:p>
             <w:r>
-              <w:t>48.1</w:t>
+              <w:t>49.9</w:t>
             </w:r>
           </w:p>
         </w:tc>
@@ -1521,7 +1521,7 @@
           </w:tcPr>
           <w:p>
             <w:r>
-              <w:t>66.8</w:t>
+              <w:t>68.9</w:t>
             </w:r>
           </w:p>
         </w:tc>
@@ -1531,7 +1531,7 @@
           </w:tcPr>
           <w:p>
             <w:r>
-              <w:t>615</w:t>
+              <w:t>11</w:t>
             </w:r>
           </w:p>
         </w:tc>
@@ -1543,7 +1543,7 @@
           </w:tcPr>
           <w:p>
             <w:r>
-              <w:t>2026-06-26 02:27:37</w:t>
+              <w:t>2026-06-26 02:57:53</w:t>
             </w:r>
           </w:p>
         </w:tc>
@@ -1553,7 +1553,7 @@
           </w:tcPr>
           <w:p>
             <w:r>
-              <w:t>46</w:t>
+              <w:t>47</w:t>
             </w:r>
           </w:p>
         </w:tc>
@@ -1563,7 +1563,7 @@
           </w:tcPr>
           <w:p>
             <w:r>
-              <w:t>67.7</w:t>
+              <w:t>70.8</w:t>
             </w:r>
           </w:p>
         </w:tc>
@@ -1573,7 +1573,7 @@
           </w:tcPr>
           <w:p>
             <w:r>
-              <w:t>90.6</w:t>
+              <w:t>90.3</w:t>
             </w:r>
           </w:p>
         </w:tc>
@@ -1583,7 +1583,7 @@
           </w:tcPr>
           <w:p>
             <w:r>
-              <w:t>49.9</w:t>
+              <w:t>51.5</w:t>
             </w:r>
           </w:p>
         </w:tc>
@@ -1593,7 +1593,7 @@
           </w:tcPr>
           <w:p>
             <w:r>
-              <w:t>69.0</w:t>
+              <w:t>70.8</w:t>
             </w:r>
           </w:p>
         </w:tc>
@@ -1603,7 +1603,7 @@
           </w:tcPr>
           <w:p>
             <w:r>
-              <w:t>1</w:t>
+              <w:t>14</w:t>
             </w:r>
           </w:p>
         </w:tc>
@@ -1615,7 +1615,7 @@
           </w:tcPr>
           <w:p>
             <w:r>
-              <w:t>2026-06-26 02:57:41</w:t>
+              <w:t>2026-06-26 03:27:55</w:t>
             </w:r>
           </w:p>
         </w:tc>
@@ -1625,7 +1625,7 @@
           </w:tcPr>
           <w:p>
             <w:r>
-              <w:t>46</w:t>
+              <w:t>47</w:t>
             </w:r>
           </w:p>
         </w:tc>
@@ -1635,7 +1635,7 @@
           </w:tcPr>
           <w:p>
             <w:r>
-              <w:t>67.7</w:t>
+              <w:t>70.8</w:t>
             </w:r>
           </w:p>
         </w:tc>
@@ -1645,7 +1645,7 @@
           </w:tcPr>
           <w:p>
             <w:r>
-              <w:t>90.3</w:t>
+              <w:t>90.2</w:t>
             </w:r>
           </w:p>
         </w:tc>
@@ -1655,7 +1655,7 @@
           </w:tcPr>
           <w:p>
             <w:r>
-              <w:t>49.9</w:t>
+              <w:t>51.5</w:t>
             </w:r>
           </w:p>
         </w:tc>
@@ -1665,7 +1665,7 @@
           </w:tcPr>
           <w:p>
             <w:r>
-              <w:t>68.9</w:t>
+              <w:t>70.8</w:t>
             </w:r>
           </w:p>
         </w:tc>
@@ -1675,7 +1675,7 @@
           </w:tcPr>
           <w:p>
             <w:r>
-              <w:t>11</w:t>
+              <w:t>21</w:t>
             </w:r>
           </w:p>
         </w:tc>
@@ -1687,7 +1687,7 @@
           </w:tcPr>
           <w:p>
             <w:r>
-              <w:t>2026-06-26 02:57:53</w:t>
+              <w:t>2026-06-26 03:47:11</w:t>
             </w:r>
           </w:p>
         </w:tc>
@@ -1697,7 +1697,7 @@
           </w:tcPr>
           <w:p>
             <w:r>
-              <w:t>47</w:t>
+              <w:t>48</w:t>
             </w:r>
           </w:p>
         </w:tc>
@@ -1707,7 +1707,7 @@
           </w:tcPr>
           <w:p>
             <w:r>
-              <w:t>70.8</w:t>
+              <w:t>65.8</w:t>
             </w:r>
           </w:p>
         </w:tc>
@@ -1717,7 +1717,7 @@
           </w:tcPr>
           <w:p>
             <w:r>
-              <w:t>90.3</w:t>
+              <w:t>90.0</w:t>
             </w:r>
           </w:p>
         </w:tc>
@@ -1727,7 +1727,7 @@
           </w:tcPr>
           <w:p>
             <w:r>
-              <w:t>51.5</w:t>
+              <w:t>53.7</w:t>
             </w:r>
           </w:p>
         </w:tc>
@@ -1737,7 +1737,7 @@
           </w:tcPr>
           <w:p>
             <w:r>
-              <w:t>70.8</w:t>
+              <w:t>68.8</w:t>
             </w:r>
           </w:p>
         </w:tc>
@@ -1747,7 +1747,7 @@
           </w:tcPr>
           <w:p>
             <w:r>
-              <w:t>14</w:t>
+              <w:t>310</w:t>
             </w:r>
           </w:p>
         </w:tc>
@@ -1768,7 +1768,7 @@
     </w:p>
     <w:p>
       <w:r>
-        <w:t>Section score: 70.8 / 100  (Grade: C)</w:t>
+        <w:t>Section score: 65.8 / 100  (Grade: D)</w:t>
       </w:r>
     </w:p>
     <w:p>
@@ -1879,7 +1879,7 @@
           </w:tcPr>
           <w:p>
             <w:r>
-              <w:t>63.0</w:t>
+              <w:t>53.0</w:t>
             </w:r>
           </w:p>
         </w:tc>
@@ -1889,7 +1889,7 @@
           </w:tcPr>
           <w:p>
             <w:r>
-              <w:t>9.4</w:t>
+              <w:t>7.9</w:t>
             </w:r>
           </w:p>
         </w:tc>
@@ -1911,7 +1911,7 @@
           </w:tcPr>
           <w:p>
             <w:r>
-              <w:t>49.1</w:t>
+              <w:t>40.0</w:t>
             </w:r>
           </w:p>
         </w:tc>
@@ -1921,7 +1921,7 @@
           </w:tcPr>
           <w:p>
             <w:r>
-              <w:t>7.4</w:t>
+              <w:t>6.0</w:t>
             </w:r>
           </w:p>
         </w:tc>
@@ -1943,7 +1943,7 @@
           </w:tcPr>
           <w:p>
             <w:r>
-              <w:t>90.9</w:t>
+              <w:t>86.0</w:t>
             </w:r>
           </w:p>
         </w:tc>
@@ -1953,7 +1953,7 @@
           </w:tcPr>
           <w:p>
             <w:r>
-              <w:t>18.2</w:t>
+              <w:t>17.2</w:t>
             </w:r>
           </w:p>
         </w:tc>
@@ -2007,7 +2007,7 @@
           </w:tcPr>
           <w:p>
             <w:r>
-              <w:t>88.5</w:t>
+              <w:t>84.3</w:t>
             </w:r>
           </w:p>
         </w:tc>
@@ -2017,7 +2017,7 @@
           </w:tcPr>
           <w:p>
             <w:r>
-              <w:t>8.9</w:t>
+              <w:t>8.4</w:t>
             </w:r>
           </w:p>
         </w:tc>
@@ -2039,7 +2039,7 @@
           </w:tcPr>
           <w:p>
             <w:r>
-              <w:t>47.7</w:t>
+              <w:t>45.0</w:t>
             </w:r>
           </w:p>
         </w:tc>
@@ -2049,7 +2049,7 @@
           </w:tcPr>
           <w:p>
             <w:r>
-              <w:t>11.9</w:t>
+              <w:t>11.2</w:t>
             </w:r>
           </w:p>
         </w:tc>
@@ -2090,7 +2090,7 @@
           </w:tcPr>
           <w:p>
             <w:r>
-              <w:t>$540.95</w:t>
+              <w:t>$535.95</w:t>
             </w:r>
           </w:p>
         </w:tc>
@@ -2112,7 +2112,7 @@
           </w:tcPr>
           <w:p>
             <w:r>
-              <w:t>8.19%</w:t>
+              <w:t>7.19%</w:t>
             </w:r>
           </w:p>
         </w:tc>
@@ -2134,7 +2134,7 @@
           </w:tcPr>
           <w:p>
             <w:r>
-              <w:t>$6.49</w:t>
+              <w:t>$1.49</w:t>
             </w:r>
           </w:p>
         </w:tc>
@@ -2178,7 +2178,7 @@
           </w:tcPr>
           <w:p>
             <w:r>
-              <w:t>0.6383</w:t>
+              <w:t>0.6250</w:t>
             </w:r>
           </w:p>
         </w:tc>
@@ -2200,7 +2200,7 @@
           </w:tcPr>
           <w:p>
             <w:r>
-              <w:t>0.5000 / 0.7407</w:t>
+              <w:t>0.5000 / 0.7143</w:t>
             </w:r>
           </w:p>
         </w:tc>
@@ -2222,7 +2222,7 @@
           </w:tcPr>
           <w:p>
             <w:r>
-              <w:t>1.0928</w:t>
+              <w:t>1.0199</w:t>
             </w:r>
           </w:p>
         </w:tc>
@@ -2244,7 +2244,7 @@
           </w:tcPr>
           <w:p>
             <w:r>
-              <w:t>47 / 47</w:t>
+              <w:t>48 / 48</w:t>
             </w:r>
           </w:p>
         </w:tc>
@@ -2266,7 +2266,7 @@
           </w:tcPr>
           <w:p>
             <w:r>
-              <w:t>$0.14</w:t>
+              <w:t>$0.03</w:t>
             </w:r>
           </w:p>
         </w:tc>
@@ -2397,7 +2397,7 @@
           </w:tcPr>
           <w:p>
             <w:r>
-              <w:t>0.600</w:t>
+              <w:t>0.620</w:t>
             </w:r>
           </w:p>
         </w:tc>
@@ -2407,7 +2407,7 @@
           </w:tcPr>
           <w:p>
             <w:r>
-              <w:t>down</w:t>
+              <w:t>up</w:t>
             </w:r>
           </w:p>
         </w:tc>
@@ -2417,7 +2417,7 @@
           </w:tcPr>
           <w:p>
             <w:r>
-              <w:t>Yes</w:t>
+              <w:t>No</w:t>
             </w:r>
           </w:p>
         </w:tc>
@@ -2427,7 +2427,7 @@
           </w:tcPr>
           <w:p>
             <w:r>
-              <w:t>$3.33</w:t>
+              <w:t>$-5.00</w:t>
             </w:r>
           </w:p>
         </w:tc>
@@ -2449,7 +2449,7 @@
           </w:tcPr>
           <w:p>
             <w:r>
-              <w:t>0.570</w:t>
+              <w:t>0.600</w:t>
             </w:r>
           </w:p>
         </w:tc>
@@ -2479,7 +2479,7 @@
           </w:tcPr>
           <w:p>
             <w:r>
-              <w:t>$3.77</w:t>
+              <w:t>$3.33</w:t>
             </w:r>
           </w:p>
         </w:tc>
@@ -2501,7 +2501,7 @@
           </w:tcPr>
           <w:p>
             <w:r>
-              <w:t>0.660</w:t>
+              <w:t>0.570</w:t>
             </w:r>
           </w:p>
         </w:tc>
@@ -2531,7 +2531,7 @@
           </w:tcPr>
           <w:p>
             <w:r>
-              <w:t>$2.58</w:t>
+              <w:t>$3.77</w:t>
             </w:r>
           </w:p>
         </w:tc>
@@ -2553,7 +2553,7 @@
           </w:tcPr>
           <w:p>
             <w:r>
-              <w:t>0.680</w:t>
+              <w:t>0.660</w:t>
             </w:r>
           </w:p>
         </w:tc>
@@ -2563,7 +2563,7 @@
           </w:tcPr>
           <w:p>
             <w:r>
-              <w:t>up</w:t>
+              <w:t>down</w:t>
             </w:r>
           </w:p>
         </w:tc>
@@ -2573,7 +2573,7 @@
           </w:tcPr>
           <w:p>
             <w:r>
-              <w:t>No</w:t>
+              <w:t>Yes</w:t>
             </w:r>
           </w:p>
         </w:tc>
@@ -2583,7 +2583,7 @@
           </w:tcPr>
           <w:p>
             <w:r>
-              <w:t>$-5.00</w:t>
+              <w:t>$2.58</w:t>
             </w:r>
           </w:p>
         </w:tc>
@@ -2605,7 +2605,7 @@
           </w:tcPr>
           <w:p>
             <w:r>
-              <w:t>0.660</w:t>
+              <w:t>0.680</w:t>
             </w:r>
           </w:p>
         </w:tc>
@@ -2615,7 +2615,7 @@
           </w:tcPr>
           <w:p>
             <w:r>
-              <w:t>down</w:t>
+              <w:t>up</w:t>
             </w:r>
           </w:p>
         </w:tc>
@@ -2625,7 +2625,7 @@
           </w:tcPr>
           <w:p>
             <w:r>
-              <w:t>Yes</w:t>
+              <w:t>No</w:t>
             </w:r>
           </w:p>
         </w:tc>
@@ -2635,7 +2635,7 @@
           </w:tcPr>
           <w:p>
             <w:r>
-              <w:t>$2.58</w:t>
+              <w:t>$-5.00</w:t>
             </w:r>
           </w:p>
         </w:tc>
@@ -2657,7 +2657,7 @@
           </w:tcPr>
           <w:p>
             <w:r>
-              <w:t>0.700</w:t>
+              <w:t>0.660</w:t>
             </w:r>
           </w:p>
         </w:tc>
@@ -2667,7 +2667,7 @@
           </w:tcPr>
           <w:p>
             <w:r>
-              <w:t>up</w:t>
+              <w:t>down</w:t>
             </w:r>
           </w:p>
         </w:tc>
@@ -2677,7 +2677,7 @@
           </w:tcPr>
           <w:p>
             <w:r>
-              <w:t>No</w:t>
+              <w:t>Yes</w:t>
             </w:r>
           </w:p>
         </w:tc>
@@ -2687,7 +2687,7 @@
           </w:tcPr>
           <w:p>
             <w:r>
-              <w:t>$-5.00</w:t>
+              <w:t>$2.58</w:t>
             </w:r>
           </w:p>
         </w:tc>
@@ -2699,6 +2699,26 @@
           </w:tcPr>
           <w:p>
             <w:r>
+              <w:t>down</w:t>
+            </w:r>
+          </w:p>
+        </w:tc>
+        <w:tc>
+          <w:tcPr>
+            <w:tcW w:type="dxa" w:w="1728"/>
+          </w:tcPr>
+          <w:p>
+            <w:r>
+              <w:t>0.700</w:t>
+            </w:r>
+          </w:p>
+        </w:tc>
+        <w:tc>
+          <w:tcPr>
+            <w:tcW w:type="dxa" w:w="1728"/>
+          </w:tcPr>
+          <w:p>
+            <w:r>
               <w:t>up</w:t>
             </w:r>
           </w:p>
@@ -2709,7 +2729,7 @@
           </w:tcPr>
           <w:p>
             <w:r>
-              <w:t>0.590</w:t>
+              <w:t>No</w:t>
             </w:r>
           </w:p>
         </w:tc>
@@ -2719,27 +2739,7 @@
           </w:tcPr>
           <w:p>
             <w:r>
-              <w:t>up</w:t>
-            </w:r>
-          </w:p>
-        </w:tc>
-        <w:tc>
-          <w:tcPr>
-            <w:tcW w:type="dxa" w:w="1728"/>
-          </w:tcPr>
-          <w:p>
-            <w:r>
-              <w:t>Yes</w:t>
-            </w:r>
-          </w:p>
-        </w:tc>
-        <w:tc>
-          <w:tcPr>
-            <w:tcW w:type="dxa" w:w="1728"/>
-          </w:tcPr>
-          <w:p>
-            <w:r>
-              <w:t>$3.47</w:t>
+              <w:t>$-5.00</w:t>
             </w:r>
           </w:p>
         </w:tc>
@@ -2761,7 +2761,7 @@
           </w:tcPr>
           <w:p>
             <w:r>
-              <w:t>0.650</w:t>
+              <w:t>0.590</w:t>
             </w:r>
           </w:p>
         </w:tc>
@@ -2791,7 +2791,7 @@
           </w:tcPr>
           <w:p>
             <w:r>
-              <w:t>$2.69</w:t>
+              <w:t>$3.47</w:t>
             </w:r>
           </w:p>
         </w:tc>
@@ -2813,7 +2813,7 @@
           </w:tcPr>
           <w:p>
             <w:r>
-              <w:t>0.640</w:t>
+              <w:t>0.650</w:t>
             </w:r>
           </w:p>
         </w:tc>
@@ -2843,7 +2843,7 @@
           </w:tcPr>
           <w:p>
             <w:r>
-              <w:t>$2.81</w:t>
+              <w:t>$2.69</w:t>
             </w:r>
           </w:p>
         </w:tc>
@@ -2855,7 +2855,7 @@
           </w:tcPr>
           <w:p>
             <w:r>
-              <w:t>down</w:t>
+              <w:t>up</w:t>
             </w:r>
           </w:p>
         </w:tc>
@@ -2865,7 +2865,7 @@
           </w:tcPr>
           <w:p>
             <w:r>
-              <w:t>0.650</w:t>
+              <w:t>0.640</w:t>
             </w:r>
           </w:p>
         </w:tc>
@@ -2875,7 +2875,7 @@
           </w:tcPr>
           <w:p>
             <w:r>
-              <w:t>down</w:t>
+              <w:t>up</w:t>
             </w:r>
           </w:p>
         </w:tc>
@@ -2895,7 +2895,7 @@
           </w:tcPr>
           <w:p>
             <w:r>
-              <w:t>$2.69</w:t>
+              <w:t>$2.81</w:t>
             </w:r>
           </w:p>
         </w:tc>
@@ -2907,7 +2907,7 @@
           </w:tcPr>
           <w:p>
             <w:r>
-              <w:t>up</w:t>
+              <w:t>down</w:t>
             </w:r>
           </w:p>
         </w:tc>
@@ -2917,7 +2917,7 @@
           </w:tcPr>
           <w:p>
             <w:r>
-              <w:t>0.560</w:t>
+              <w:t>0.650</w:t>
             </w:r>
           </w:p>
         </w:tc>
@@ -2927,7 +2927,7 @@
           </w:tcPr>
           <w:p>
             <w:r>
-              <w:t>up</w:t>
+              <w:t>down</w:t>
             </w:r>
           </w:p>
         </w:tc>
@@ -2947,7 +2947,7 @@
           </w:tcPr>
           <w:p>
             <w:r>
-              <w:t>$1.96</w:t>
+              <w:t>$2.69</w:t>
             </w:r>
           </w:p>
         </w:tc>
@@ -2969,7 +2969,7 @@
           </w:tcPr>
           <w:p>
             <w:r>
-              <w:t>0.530</w:t>
+              <w:t>0.560</w:t>
             </w:r>
           </w:p>
         </w:tc>
@@ -2999,7 +2999,7 @@
           </w:tcPr>
           <w:p>
             <w:r>
-              <w:t>$2.22</w:t>
+              <w:t>$1.96</w:t>
             </w:r>
           </w:p>
         </w:tc>
@@ -3021,7 +3021,7 @@
           </w:tcPr>
           <w:p>
             <w:r>
-              <w:t>0.590</w:t>
+              <w:t>0.530</w:t>
             </w:r>
           </w:p>
         </w:tc>
@@ -3031,7 +3031,7 @@
           </w:tcPr>
           <w:p>
             <w:r>
-              <w:t>down</w:t>
+              <w:t>up</w:t>
             </w:r>
           </w:p>
         </w:tc>
@@ -3041,7 +3041,7 @@
           </w:tcPr>
           <w:p>
             <w:r>
-              <w:t>No</w:t>
+              <w:t>Yes</w:t>
             </w:r>
           </w:p>
         </w:tc>
@@ -3051,7 +3051,7 @@
           </w:tcPr>
           <w:p>
             <w:r>
-              <w:t>$-2.50</w:t>
+              <w:t>$2.22</w:t>
             </w:r>
           </w:p>
         </w:tc>
@@ -3073,7 +3073,7 @@
           </w:tcPr>
           <w:p>
             <w:r>
-              <w:t>0.510</w:t>
+              <w:t>0.590</w:t>
             </w:r>
           </w:p>
         </w:tc>
@@ -3125,7 +3125,7 @@
           </w:tcPr>
           <w:p>
             <w:r>
-              <w:t>0.500</w:t>
+              <w:t>0.510</w:t>
             </w:r>
           </w:p>
         </w:tc>
@@ -3176,7 +3176,7 @@
     </w:p>
     <w:p>
       <w:r>
-        <w:t>Section score: 90.2 / 100  (Grade: A)</w:t>
+        <w:t>Section score: 90.0 / 100  (Grade: A)</w:t>
       </w:r>
     </w:p>
     <w:p>
@@ -3319,7 +3319,7 @@
           </w:tcPr>
           <w:p>
             <w:r>
-              <w:t>94.9</w:t>
+              <w:t>93.3</w:t>
             </w:r>
           </w:p>
         </w:tc>
@@ -3329,7 +3329,7 @@
           </w:tcPr>
           <w:p>
             <w:r>
-              <w:t>14.2</w:t>
+              <w:t>14.0</w:t>
             </w:r>
           </w:p>
         </w:tc>
@@ -3433,17 +3433,17 @@
     </w:tbl>
     <w:p>
       <w:r>
-        <w:t>Ticks: 205 · Reconciled: True · Readiness: not_ready</w:t>
+        <w:t>Ticks: 426 · Reconciled: True · Readiness: not_ready</w:t>
       </w:r>
     </w:p>
     <w:p>
       <w:r>
-        <w:t>Candidates created: 18443 · Terminals: {'accepted': 47, 'rejected': 15185, 'skipped': 3130, 'expired': 0, 'missing_data': 81}</w:t>
+        <w:t>Candidates created: 18853 · Terminals: {'accepted': 48, 'rejected': 15591, 'skipped': 3131, 'expired': 0, 'missing_data': 83}</w:t>
       </w:r>
     </w:p>
     <w:p>
       <w:r>
-        <w:t>Rejected by stage: {'directional': 8564, 'execution_gate': 118, 'context_gate': 716, 'directional_allowlist': 1364, 'down_bias_gate': 538, 'mtf_gate': 264, 'grok_decider': 3507, 'execution_realistic': 3, 'verifier': 61, 'mispricing_gate': 50}</w:t>
+        <w:t>Rejected by stage: {'directional': 8918, 'execution_gate': 127, 'context_gate': 725, 'directional_allowlist': 1364, 'down_bias_gate': 538, 'mtf_gate': 275, 'grok_decider': 3530, 'execution_realistic': 3, 'verifier': 61, 'mispricing_gate': 50}</w:t>
       </w:r>
     </w:p>
     <w:p>
@@ -4018,7 +4018,7 @@
     </w:p>
     <w:p>
       <w:r>
-        <w:t>Section score: 51.5 / 100  (Grade: F)</w:t>
+        <w:t>Section score: 53.7 / 100  (Grade: F)</w:t>
       </w:r>
     </w:p>
     <w:p>
@@ -4161,7 +4161,7 @@
           </w:tcPr>
           <w:p>
             <w:r>
-              <w:t>2.5</w:t>
+              <w:t>4.2</w:t>
             </w:r>
           </w:p>
         </w:tc>
@@ -4171,7 +4171,7 @@
           </w:tcPr>
           <w:p>
             <w:r>
-              <w:t>0.4</w:t>
+              <w:t>0.6</w:t>
             </w:r>
           </w:p>
         </w:tc>
@@ -4225,7 +4225,7 @@
           </w:tcPr>
           <w:p>
             <w:r>
-              <w:t>52.2</w:t>
+              <w:t>57.4</w:t>
             </w:r>
           </w:p>
         </w:tc>
@@ -4235,7 +4235,7 @@
           </w:tcPr>
           <w:p>
             <w:r>
-              <w:t>15.6</w:t>
+              <w:t>17.2</w:t>
             </w:r>
           </w:p>
         </w:tc>
@@ -4257,7 +4257,7 @@
           </w:tcPr>
           <w:p>
             <w:r>
-              <w:t>9.8</w:t>
+              <w:t>11.9</w:t>
             </w:r>
           </w:p>
         </w:tc>
@@ -4267,7 +4267,7 @@
           </w:tcPr>
           <w:p>
             <w:r>
-              <w:t>1.5</w:t>
+              <w:t>1.8</w:t>
             </w:r>
           </w:p>
         </w:tc>
@@ -4330,7 +4330,7 @@
           </w:tcPr>
           <w:p>
             <w:r>
-              <w:t>0.6154</w:t>
+              <w:t>0.5714</w:t>
             </w:r>
           </w:p>
         </w:tc>
@@ -4352,7 +4352,7 @@
           </w:tcPr>
           <w:p>
             <w:r>
-              <w:t>0.5152</w:t>
+              <w:t>0.5294</w:t>
             </w:r>
           </w:p>
         </w:tc>
@@ -4374,7 +4374,7 @@
           </w:tcPr>
           <w:p>
             <w:r>
-              <w:t>0.4667</w:t>
+              <w:t>0.4783</w:t>
             </w:r>
           </w:p>
         </w:tc>
@@ -4396,7 +4396,7 @@
           </w:tcPr>
           <w:p>
             <w:r>
-              <w:t>0.4912</w:t>
+              <w:t>0.4913</w:t>
             </w:r>
           </w:p>
         </w:tc>
@@ -4426,7 +4426,7 @@
     </w:tbl>
     <w:p>
       <w:r>
-        <w:t>TV alerts: received 699 · valid 688 · rejected 11</w:t>
+        <w:t>TV alerts: received 720 · valid 709 · rejected 11</w:t>
       </w:r>
     </w:p>
     <w:sectPr>

</xml_diff>

<commit_message>
chore(reports): VPS full report 2026-06-26 04:44 UTC (48 settled, WR 62.5%, PF 1.0199)
</commit_message>
<xml_diff>
--- a/vps_full_reports/latest/report.docx
+++ b/vps_full_reports/latest/report.docx
@@ -20,7 +20,7 @@
           <w:color w:val="666666"/>
           <w:sz w:val="20"/>
         </w:rPr>
-        <w:t>PAPER ONLY  ·  reconciled=True  ·  ticks=289</w:t>
+        <w:t>PAPER ONLY  ·  reconciled=True  ·  ticks=4</w:t>
       </w:r>
     </w:p>
     <w:p>
@@ -33,7 +33,7 @@
     </w:p>
     <w:p>
       <w:r>
-        <w:t>Overall score: 68.9 / 100  (Grade: D)</w:t>
+        <w:t>Overall score: 68.8 / 100  (Grade: D)</w:t>
       </w:r>
     </w:p>
     <w:tbl>
@@ -191,7 +191,7 @@
           </w:tcPr>
           <w:p>
             <w:r>
-              <w:t>53.9</w:t>
+              <w:t>53.7</w:t>
             </w:r>
           </w:p>
         </w:tc>
@@ -3319,7 +3319,7 @@
           </w:tcPr>
           <w:p>
             <w:r>
-              <w:t>93.5</w:t>
+              <w:t>93.6</w:t>
             </w:r>
           </w:p>
         </w:tc>
@@ -3433,17 +3433,17 @@
     </w:tbl>
     <w:p>
       <w:r>
-        <w:t>Ticks: 289 · Reconciled: True · Readiness: not_ready</w:t>
+        <w:t>Ticks: 4 · Reconciled: True · Readiness: not_ready</w:t>
       </w:r>
     </w:p>
     <w:p>
       <w:r>
-        <w:t>Candidates created: 19253 · Terminals: {'accepted': 48, 'rejected': 15945, 'skipped': 3175, 'expired': 0, 'missing_data': 85}</w:t>
+        <w:t>Candidates created: 19605 · Terminals: {'accepted': 48, 'rejected': 16194, 'skipped': 3271, 'expired': 0, 'missing_data': 92}</w:t>
       </w:r>
     </w:p>
     <w:p>
       <w:r>
-        <w:t>Rejected by stage: {'directional': 9228, 'execution_gate': 135, 'context_gate': 726, 'directional_allowlist': 1364, 'down_bias_gate': 538, 'mtf_gate': 275, 'grok_decider': 3531, 'execution_realistic': 3, 'verifier': 61, 'mispricing_gate': 50, 'baseline_cohort_gate': 34}</w:t>
+        <w:t>Rejected by stage: {'directional': 9378, 'execution_gate': 135, 'context_gate': 726, 'directional_allowlist': 1364, 'down_bias_gate': 538, 'mtf_gate': 275, 'grok_decider': 3531, 'execution_realistic': 3, 'verifier': 61, 'mispricing_gate': 50, 'baseline_cohort_gate': 133}</w:t>
       </w:r>
     </w:p>
     <w:p>
@@ -4018,7 +4018,7 @@
     </w:p>
     <w:p>
       <w:r>
-        <w:t>Section score: 53.9 / 100  (Grade: F)</w:t>
+        <w:t>Section score: 53.7 / 100  (Grade: F)</w:t>
       </w:r>
     </w:p>
     <w:p>
@@ -4161,7 +4161,7 @@
           </w:tcPr>
           <w:p>
             <w:r>
-              <w:t>5.9</w:t>
+              <w:t>4.4</w:t>
             </w:r>
           </w:p>
         </w:tc>
@@ -4171,7 +4171,7 @@
           </w:tcPr>
           <w:p>
             <w:r>
-              <w:t>0.9</w:t>
+              <w:t>0.7</w:t>
             </w:r>
           </w:p>
         </w:tc>
@@ -4374,7 +4374,7 @@
           </w:tcPr>
           <w:p>
             <w:r>
-              <w:t>0.4894</w:t>
+              <w:t>0.4792</w:t>
             </w:r>
           </w:p>
         </w:tc>
@@ -4396,7 +4396,7 @@
           </w:tcPr>
           <w:p>
             <w:r>
-              <w:t>0.4788</w:t>
+              <w:t>0.4750</w:t>
             </w:r>
           </w:p>
         </w:tc>
@@ -4426,7 +4426,7 @@
     </w:tbl>
     <w:p>
       <w:r>
-        <w:t>TV alerts: received 747 · valid 736 · rejected 11</w:t>
+        <w:t>TV alerts: received 765 · valid 754 · rejected 11</w:t>
       </w:r>
     </w:p>
     <w:sectPr>

</xml_diff>

<commit_message>
chore(reports): VPS full report 2026-06-26 07:12 UTC (48 settled, WR 62.5%, PF 1.0199)
</commit_message>
<xml_diff>
--- a/vps_full_reports/latest/report.docx
+++ b/vps_full_reports/latest/report.docx
@@ -20,7 +20,7 @@
           <w:color w:val="666666"/>
           <w:sz w:val="20"/>
         </w:rPr>
-        <w:t>PAPER ONLY  ·  reconciled=True  ·  ticks=4</w:t>
+        <w:t>PAPER ONLY  ·  reconciled=True  ·  ticks=1054</w:t>
       </w:r>
     </w:p>
     <w:p>
@@ -33,7 +33,7 @@
     </w:p>
     <w:p>
       <w:r>
-        <w:t>Overall score: 68.8 / 100  (Grade: D)</w:t>
+        <w:t>Overall score: 68.7 / 100  (Grade: D)</w:t>
       </w:r>
     </w:p>
     <w:tbl>
@@ -149,7 +149,7 @@
           </w:tcPr>
           <w:p>
             <w:r>
-              <w:t>90.0</w:t>
+              <w:t>90.2</w:t>
             </w:r>
           </w:p>
         </w:tc>
@@ -191,7 +191,7 @@
           </w:tcPr>
           <w:p>
             <w:r>
-              <w:t>53.7</w:t>
+              <w:t>53.1</w:t>
             </w:r>
           </w:p>
         </w:tc>
@@ -319,7 +319,7 @@
           </w:tcPr>
           <w:p>
             <w:r>
-              <w:t>2026-06-26 00:02:45</w:t>
+              <w:t>2026-06-26 00:29:19</w:t>
             </w:r>
           </w:p>
         </w:tc>
@@ -329,7 +329,7 @@
           </w:tcPr>
           <w:p>
             <w:r>
-              <w:t>38</w:t>
+              <w:t>41</w:t>
             </w:r>
           </w:p>
         </w:tc>
@@ -339,7 +339,7 @@
           </w:tcPr>
           <w:p>
             <w:r>
-              <w:t>61.4</w:t>
+              <w:t>69.4</w:t>
             </w:r>
           </w:p>
         </w:tc>
@@ -359,7 +359,7 @@
           </w:tcPr>
           <w:p>
             <w:r>
-              <w:t>52.7</w:t>
+              <w:t>51.1</w:t>
             </w:r>
           </w:p>
         </w:tc>
@@ -369,7 +369,7 @@
           </w:tcPr>
           <w:p>
             <w:r>
-              <w:t>66.5</w:t>
+              <w:t>70.1</w:t>
             </w:r>
           </w:p>
         </w:tc>
@@ -379,7 +379,7 @@
           </w:tcPr>
           <w:p>
             <w:r>
-              <w:t>309</w:t>
+              <w:t>1</w:t>
             </w:r>
           </w:p>
         </w:tc>
@@ -391,7 +391,7 @@
           </w:tcPr>
           <w:p>
             <w:r>
-              <w:t>2026-06-26 00:08:01</w:t>
+              <w:t>2026-06-26 00:38:02</w:t>
             </w:r>
           </w:p>
         </w:tc>
@@ -401,7 +401,7 @@
           </w:tcPr>
           <w:p>
             <w:r>
-              <w:t>39</w:t>
+              <w:t>42</w:t>
             </w:r>
           </w:p>
         </w:tc>
@@ -431,7 +431,7 @@
           </w:tcPr>
           <w:p>
             <w:r>
-              <w:t>51.1</w:t>
+              <w:t>48.5</w:t>
             </w:r>
           </w:p>
         </w:tc>
@@ -441,7 +441,7 @@
           </w:tcPr>
           <w:p>
             <w:r>
-              <w:t>67.4</w:t>
+              <w:t>66.8</w:t>
             </w:r>
           </w:p>
         </w:tc>
@@ -451,7 +451,7 @@
           </w:tcPr>
           <w:p>
             <w:r>
-              <w:t>388</w:t>
+              <w:t>132</w:t>
             </w:r>
           </w:p>
         </w:tc>
@@ -463,7 +463,7 @@
           </w:tcPr>
           <w:p>
             <w:r>
-              <w:t>2026-06-26 00:13:01</w:t>
+              <w:t>2026-06-26 00:38:06</w:t>
             </w:r>
           </w:p>
         </w:tc>
@@ -473,7 +473,7 @@
           </w:tcPr>
           <w:p>
             <w:r>
-              <w:t>40</w:t>
+              <w:t>42</w:t>
             </w:r>
           </w:p>
         </w:tc>
@@ -483,7 +483,7 @@
           </w:tcPr>
           <w:p>
             <w:r>
-              <w:t>66.3</w:t>
+              <w:t>64.0</w:t>
             </w:r>
           </w:p>
         </w:tc>
@@ -493,7 +493,7 @@
           </w:tcPr>
           <w:p>
             <w:r>
-              <w:t>90.6</w:t>
+              <w:t>75.6</w:t>
             </w:r>
           </w:p>
         </w:tc>
@@ -503,7 +503,7 @@
           </w:tcPr>
           <w:p>
             <w:r>
-              <w:t>51.1</w:t>
+              <w:t>48.5</w:t>
             </w:r>
           </w:p>
         </w:tc>
@@ -513,7 +513,7 @@
           </w:tcPr>
           <w:p>
             <w:r>
-              <w:t>68.6</w:t>
+              <w:t>63.0</w:t>
             </w:r>
           </w:p>
         </w:tc>
@@ -523,7 +523,7 @@
           </w:tcPr>
           <w:p>
             <w:r>
-              <w:t>463</w:t>
+              <w:t>133</w:t>
             </w:r>
           </w:p>
         </w:tc>
@@ -535,7 +535,7 @@
           </w:tcPr>
           <w:p>
             <w:r>
-              <w:t>2026-06-26 00:13:05</w:t>
+              <w:t>2026-06-26 00:43:03</w:t>
             </w:r>
           </w:p>
         </w:tc>
@@ -545,7 +545,7 @@
           </w:tcPr>
           <w:p>
             <w:r>
-              <w:t>40</w:t>
+              <w:t>43</w:t>
             </w:r>
           </w:p>
         </w:tc>
@@ -555,7 +555,7 @@
           </w:tcPr>
           <w:p>
             <w:r>
-              <w:t>66.3</w:t>
+              <w:t>66.7</w:t>
             </w:r>
           </w:p>
         </w:tc>
@@ -575,7 +575,7 @@
           </w:tcPr>
           <w:p>
             <w:r>
-              <w:t>51.1</w:t>
+              <w:t>50.4</w:t>
             </w:r>
           </w:p>
         </w:tc>
@@ -595,7 +595,7 @@
           </w:tcPr>
           <w:p>
             <w:r>
-              <w:t>464</w:t>
+              <w:t>207</w:t>
             </w:r>
           </w:p>
         </w:tc>
@@ -607,7 +607,7 @@
           </w:tcPr>
           <w:p>
             <w:r>
-              <w:t>2026-06-26 00:18:02</w:t>
+              <w:t>2026-06-26 01:13:06</w:t>
             </w:r>
           </w:p>
         </w:tc>
@@ -617,7 +617,7 @@
           </w:tcPr>
           <w:p>
             <w:r>
-              <w:t>41</w:t>
+              <w:t>43</w:t>
             </w:r>
           </w:p>
         </w:tc>
@@ -627,7 +627,7 @@
           </w:tcPr>
           <w:p>
             <w:r>
-              <w:t>69.4</w:t>
+              <w:t>66.7</w:t>
             </w:r>
           </w:p>
         </w:tc>
@@ -647,7 +647,7 @@
           </w:tcPr>
           <w:p>
             <w:r>
-              <w:t>51.1</w:t>
+              <w:t>50.4</w:t>
             </w:r>
           </w:p>
         </w:tc>
@@ -657,7 +657,7 @@
           </w:tcPr>
           <w:p>
             <w:r>
-              <w:t>66.4</w:t>
+              <w:t>64.8</w:t>
             </w:r>
           </w:p>
         </w:tc>
@@ -667,7 +667,7 @@
           </w:tcPr>
           <w:p>
             <w:r>
-              <w:t>538</w:t>
+              <w:t>657</w:t>
             </w:r>
           </w:p>
         </w:tc>
@@ -679,7 +679,7 @@
           </w:tcPr>
           <w:p>
             <w:r>
-              <w:t>2026-06-26 00:29:19</w:t>
+              <w:t>2026-06-26 01:41:44</w:t>
             </w:r>
           </w:p>
         </w:tc>
@@ -689,7 +689,7 @@
           </w:tcPr>
           <w:p>
             <w:r>
-              <w:t>41</w:t>
+              <w:t>43</w:t>
             </w:r>
           </w:p>
         </w:tc>
@@ -699,7 +699,7 @@
           </w:tcPr>
           <w:p>
             <w:r>
-              <w:t>69.4</w:t>
+              <w:t>66.7</w:t>
             </w:r>
           </w:p>
         </w:tc>
@@ -719,7 +719,7 @@
           </w:tcPr>
           <w:p>
             <w:r>
-              <w:t>51.1</w:t>
+              <w:t>50.4</w:t>
             </w:r>
           </w:p>
         </w:tc>
@@ -729,7 +729,7 @@
           </w:tcPr>
           <w:p>
             <w:r>
-              <w:t>70.1</w:t>
+              <w:t>68.6</w:t>
             </w:r>
           </w:p>
         </w:tc>
@@ -751,7 +751,7 @@
           </w:tcPr>
           <w:p>
             <w:r>
-              <w:t>2026-06-26 00:38:02</w:t>
+              <w:t>2026-06-26 01:51:12</w:t>
             </w:r>
           </w:p>
         </w:tc>
@@ -761,7 +761,7 @@
           </w:tcPr>
           <w:p>
             <w:r>
-              <w:t>42</w:t>
+              <w:t>44</w:t>
             </w:r>
           </w:p>
         </w:tc>
@@ -771,7 +771,7 @@
           </w:tcPr>
           <w:p>
             <w:r>
-              <w:t>64.0</w:t>
+              <w:t>61.6</w:t>
             </w:r>
           </w:p>
         </w:tc>
@@ -791,7 +791,7 @@
           </w:tcPr>
           <w:p>
             <w:r>
-              <w:t>48.5</w:t>
+              <w:t>48.1</w:t>
             </w:r>
           </w:p>
         </w:tc>
@@ -801,7 +801,7 @@
           </w:tcPr>
           <w:p>
             <w:r>
-              <w:t>66.8</w:t>
+              <w:t>65.5</w:t>
             </w:r>
           </w:p>
         </w:tc>
@@ -811,7 +811,7 @@
           </w:tcPr>
           <w:p>
             <w:r>
-              <w:t>132</w:t>
+              <w:t>137</w:t>
             </w:r>
           </w:p>
         </w:tc>
@@ -823,7 +823,7 @@
           </w:tcPr>
           <w:p>
             <w:r>
-              <w:t>2026-06-26 00:38:06</w:t>
+              <w:t>2026-06-26 02:21:15</w:t>
             </w:r>
           </w:p>
         </w:tc>
@@ -833,7 +833,7 @@
           </w:tcPr>
           <w:p>
             <w:r>
-              <w:t>42</w:t>
+              <w:t>44</w:t>
             </w:r>
           </w:p>
         </w:tc>
@@ -843,7 +843,7 @@
           </w:tcPr>
           <w:p>
             <w:r>
-              <w:t>64.0</w:t>
+              <w:t>61.6</w:t>
             </w:r>
           </w:p>
         </w:tc>
@@ -853,7 +853,7 @@
           </w:tcPr>
           <w:p>
             <w:r>
-              <w:t>75.6</w:t>
+              <w:t>90.6</w:t>
             </w:r>
           </w:p>
         </w:tc>
@@ -863,7 +863,7 @@
           </w:tcPr>
           <w:p>
             <w:r>
-              <w:t>48.5</w:t>
+              <w:t>48.1</w:t>
             </w:r>
           </w:p>
         </w:tc>
@@ -873,7 +873,7 @@
           </w:tcPr>
           <w:p>
             <w:r>
-              <w:t>63.0</w:t>
+              <w:t>65.5</w:t>
             </w:r>
           </w:p>
         </w:tc>
@@ -883,7 +883,7 @@
           </w:tcPr>
           <w:p>
             <w:r>
-              <w:t>133</w:t>
+              <w:t>588</w:t>
             </w:r>
           </w:p>
         </w:tc>
@@ -895,7 +895,7 @@
           </w:tcPr>
           <w:p>
             <w:r>
-              <w:t>2026-06-26 00:43:03</w:t>
+              <w:t>2026-06-26 02:23:03</w:t>
             </w:r>
           </w:p>
         </w:tc>
@@ -905,7 +905,7 @@
           </w:tcPr>
           <w:p>
             <w:r>
-              <w:t>43</w:t>
+              <w:t>45</w:t>
             </w:r>
           </w:p>
         </w:tc>
@@ -915,7 +915,7 @@
           </w:tcPr>
           <w:p>
             <w:r>
-              <w:t>66.7</w:t>
+              <w:t>64.2</w:t>
             </w:r>
           </w:p>
         </w:tc>
@@ -925,7 +925,7 @@
           </w:tcPr>
           <w:p>
             <w:r>
-              <w:t>75.6</w:t>
+              <w:t>90.6</w:t>
             </w:r>
           </w:p>
         </w:tc>
@@ -935,7 +935,7 @@
           </w:tcPr>
           <w:p>
             <w:r>
-              <w:t>50.4</w:t>
+              <w:t>48.1</w:t>
             </w:r>
           </w:p>
         </w:tc>
@@ -945,7 +945,7 @@
           </w:tcPr>
           <w:p>
             <w:r>
-              <w:t>64.8</w:t>
+              <w:t>66.8</w:t>
             </w:r>
           </w:p>
         </w:tc>
@@ -955,7 +955,7 @@
           </w:tcPr>
           <w:p>
             <w:r>
-              <w:t>207</w:t>
+              <w:t>615</w:t>
             </w:r>
           </w:p>
         </w:tc>
@@ -967,7 +967,7 @@
           </w:tcPr>
           <w:p>
             <w:r>
-              <w:t>2026-06-26 01:13:06</w:t>
+              <w:t>2026-06-26 02:27:37</w:t>
             </w:r>
           </w:p>
         </w:tc>
@@ -977,7 +977,7 @@
           </w:tcPr>
           <w:p>
             <w:r>
-              <w:t>43</w:t>
+              <w:t>46</w:t>
             </w:r>
           </w:p>
         </w:tc>
@@ -987,7 +987,7 @@
           </w:tcPr>
           <w:p>
             <w:r>
-              <w:t>66.7</w:t>
+              <w:t>67.7</w:t>
             </w:r>
           </w:p>
         </w:tc>
@@ -997,7 +997,7 @@
           </w:tcPr>
           <w:p>
             <w:r>
-              <w:t>75.6</w:t>
+              <w:t>90.6</w:t>
             </w:r>
           </w:p>
         </w:tc>
@@ -1007,7 +1007,7 @@
           </w:tcPr>
           <w:p>
             <w:r>
-              <w:t>50.4</w:t>
+              <w:t>49.9</w:t>
             </w:r>
           </w:p>
         </w:tc>
@@ -1017,7 +1017,7 @@
           </w:tcPr>
           <w:p>
             <w:r>
-              <w:t>64.8</w:t>
+              <w:t>69.0</w:t>
             </w:r>
           </w:p>
         </w:tc>
@@ -1027,7 +1027,7 @@
           </w:tcPr>
           <w:p>
             <w:r>
-              <w:t>657</w:t>
+              <w:t>1</w:t>
             </w:r>
           </w:p>
         </w:tc>
@@ -1039,7 +1039,7 @@
           </w:tcPr>
           <w:p>
             <w:r>
-              <w:t>2026-06-26 01:41:44</w:t>
+              <w:t>2026-06-26 02:57:41</w:t>
             </w:r>
           </w:p>
         </w:tc>
@@ -1049,7 +1049,7 @@
           </w:tcPr>
           <w:p>
             <w:r>
-              <w:t>43</w:t>
+              <w:t>46</w:t>
             </w:r>
           </w:p>
         </w:tc>
@@ -1059,7 +1059,7 @@
           </w:tcPr>
           <w:p>
             <w:r>
-              <w:t>66.7</w:t>
+              <w:t>67.7</w:t>
             </w:r>
           </w:p>
         </w:tc>
@@ -1069,7 +1069,7 @@
           </w:tcPr>
           <w:p>
             <w:r>
-              <w:t>90.6</w:t>
+              <w:t>90.3</w:t>
             </w:r>
           </w:p>
         </w:tc>
@@ -1079,7 +1079,7 @@
           </w:tcPr>
           <w:p>
             <w:r>
-              <w:t>50.4</w:t>
+              <w:t>49.9</w:t>
             </w:r>
           </w:p>
         </w:tc>
@@ -1089,7 +1089,7 @@
           </w:tcPr>
           <w:p>
             <w:r>
-              <w:t>68.6</w:t>
+              <w:t>68.9</w:t>
             </w:r>
           </w:p>
         </w:tc>
@@ -1099,7 +1099,7 @@
           </w:tcPr>
           <w:p>
             <w:r>
-              <w:t>1</w:t>
+              <w:t>11</w:t>
             </w:r>
           </w:p>
         </w:tc>
@@ -1111,7 +1111,7 @@
           </w:tcPr>
           <w:p>
             <w:r>
-              <w:t>2026-06-26 01:51:12</w:t>
+              <w:t>2026-06-26 02:57:53</w:t>
             </w:r>
           </w:p>
         </w:tc>
@@ -1121,7 +1121,7 @@
           </w:tcPr>
           <w:p>
             <w:r>
-              <w:t>44</w:t>
+              <w:t>47</w:t>
             </w:r>
           </w:p>
         </w:tc>
@@ -1131,7 +1131,7 @@
           </w:tcPr>
           <w:p>
             <w:r>
-              <w:t>61.6</w:t>
+              <w:t>70.8</w:t>
             </w:r>
           </w:p>
         </w:tc>
@@ -1141,7 +1141,7 @@
           </w:tcPr>
           <w:p>
             <w:r>
-              <w:t>90.6</w:t>
+              <w:t>90.3</w:t>
             </w:r>
           </w:p>
         </w:tc>
@@ -1151,7 +1151,7 @@
           </w:tcPr>
           <w:p>
             <w:r>
-              <w:t>48.1</w:t>
+              <w:t>51.5</w:t>
             </w:r>
           </w:p>
         </w:tc>
@@ -1161,7 +1161,7 @@
           </w:tcPr>
           <w:p>
             <w:r>
-              <w:t>65.5</w:t>
+              <w:t>70.8</w:t>
             </w:r>
           </w:p>
         </w:tc>
@@ -1171,7 +1171,7 @@
           </w:tcPr>
           <w:p>
             <w:r>
-              <w:t>137</w:t>
+              <w:t>14</w:t>
             </w:r>
           </w:p>
         </w:tc>
@@ -1183,7 +1183,7 @@
           </w:tcPr>
           <w:p>
             <w:r>
-              <w:t>2026-06-26 02:21:15</w:t>
+              <w:t>2026-06-26 03:27:55</w:t>
             </w:r>
           </w:p>
         </w:tc>
@@ -1193,7 +1193,7 @@
           </w:tcPr>
           <w:p>
             <w:r>
-              <w:t>44</w:t>
+              <w:t>47</w:t>
             </w:r>
           </w:p>
         </w:tc>
@@ -1203,7 +1203,7 @@
           </w:tcPr>
           <w:p>
             <w:r>
-              <w:t>61.6</w:t>
+              <w:t>70.8</w:t>
             </w:r>
           </w:p>
         </w:tc>
@@ -1213,7 +1213,7 @@
           </w:tcPr>
           <w:p>
             <w:r>
-              <w:t>90.6</w:t>
+              <w:t>90.2</w:t>
             </w:r>
           </w:p>
         </w:tc>
@@ -1223,7 +1223,7 @@
           </w:tcPr>
           <w:p>
             <w:r>
-              <w:t>48.1</w:t>
+              <w:t>51.5</w:t>
             </w:r>
           </w:p>
         </w:tc>
@@ -1233,7 +1233,7 @@
           </w:tcPr>
           <w:p>
             <w:r>
-              <w:t>65.5</w:t>
+              <w:t>70.8</w:t>
             </w:r>
           </w:p>
         </w:tc>
@@ -1243,7 +1243,7 @@
           </w:tcPr>
           <w:p>
             <w:r>
-              <w:t>588</w:t>
+              <w:t>21</w:t>
             </w:r>
           </w:p>
         </w:tc>
@@ -1255,7 +1255,7 @@
           </w:tcPr>
           <w:p>
             <w:r>
-              <w:t>2026-06-26 02:23:03</w:t>
+              <w:t>2026-06-26 03:47:11</w:t>
             </w:r>
           </w:p>
         </w:tc>
@@ -1265,7 +1265,7 @@
           </w:tcPr>
           <w:p>
             <w:r>
-              <w:t>45</w:t>
+              <w:t>48</w:t>
             </w:r>
           </w:p>
         </w:tc>
@@ -1275,7 +1275,7 @@
           </w:tcPr>
           <w:p>
             <w:r>
-              <w:t>64.2</w:t>
+              <w:t>65.8</w:t>
             </w:r>
           </w:p>
         </w:tc>
@@ -1285,7 +1285,7 @@
           </w:tcPr>
           <w:p>
             <w:r>
-              <w:t>90.6</w:t>
+              <w:t>90.0</w:t>
             </w:r>
           </w:p>
         </w:tc>
@@ -1295,7 +1295,7 @@
           </w:tcPr>
           <w:p>
             <w:r>
-              <w:t>48.1</w:t>
+              <w:t>53.7</w:t>
             </w:r>
           </w:p>
         </w:tc>
@@ -1305,7 +1305,7 @@
           </w:tcPr>
           <w:p>
             <w:r>
-              <w:t>66.8</w:t>
+              <w:t>68.8</w:t>
             </w:r>
           </w:p>
         </w:tc>
@@ -1315,7 +1315,7 @@
           </w:tcPr>
           <w:p>
             <w:r>
-              <w:t>615</w:t>
+              <w:t>310</w:t>
             </w:r>
           </w:p>
         </w:tc>
@@ -1327,7 +1327,7 @@
           </w:tcPr>
           <w:p>
             <w:r>
-              <w:t>2026-06-26 02:27:37</w:t>
+              <w:t>2026-06-26 04:17:12</w:t>
             </w:r>
           </w:p>
         </w:tc>
@@ -1337,7 +1337,7 @@
           </w:tcPr>
           <w:p>
             <w:r>
-              <w:t>46</w:t>
+              <w:t>48</w:t>
             </w:r>
           </w:p>
         </w:tc>
@@ -1347,7 +1347,7 @@
           </w:tcPr>
           <w:p>
             <w:r>
-              <w:t>67.7</w:t>
+              <w:t>65.8</w:t>
             </w:r>
           </w:p>
         </w:tc>
@@ -1357,7 +1357,7 @@
           </w:tcPr>
           <w:p>
             <w:r>
-              <w:t>90.6</w:t>
+              <w:t>90.0</w:t>
             </w:r>
           </w:p>
         </w:tc>
@@ -1367,7 +1367,7 @@
           </w:tcPr>
           <w:p>
             <w:r>
-              <w:t>49.9</w:t>
+              <w:t>53.9</w:t>
             </w:r>
           </w:p>
         </w:tc>
@@ -1377,7 +1377,7 @@
           </w:tcPr>
           <w:p>
             <w:r>
-              <w:t>69.0</w:t>
+              <w:t>68.9</w:t>
             </w:r>
           </w:p>
         </w:tc>
@@ -1387,7 +1387,7 @@
           </w:tcPr>
           <w:p>
             <w:r>
-              <w:t>1</w:t>
+              <w:t>224</w:t>
             </w:r>
           </w:p>
         </w:tc>
@@ -1399,7 +1399,7 @@
           </w:tcPr>
           <w:p>
             <w:r>
-              <w:t>2026-06-26 02:57:41</w:t>
+              <w:t>2026-06-26 04:47:16</w:t>
             </w:r>
           </w:p>
         </w:tc>
@@ -1409,7 +1409,7 @@
           </w:tcPr>
           <w:p>
             <w:r>
-              <w:t>46</w:t>
+              <w:t>48</w:t>
             </w:r>
           </w:p>
         </w:tc>
@@ -1419,7 +1419,7 @@
           </w:tcPr>
           <w:p>
             <w:r>
-              <w:t>67.7</w:t>
+              <w:t>65.8</w:t>
             </w:r>
           </w:p>
         </w:tc>
@@ -1429,7 +1429,7 @@
           </w:tcPr>
           <w:p>
             <w:r>
-              <w:t>90.3</w:t>
+              <w:t>90.0</w:t>
             </w:r>
           </w:p>
         </w:tc>
@@ -1439,7 +1439,7 @@
           </w:tcPr>
           <w:p>
             <w:r>
-              <w:t>49.9</w:t>
+              <w:t>53.7</w:t>
             </w:r>
           </w:p>
         </w:tc>
@@ -1449,7 +1449,7 @@
           </w:tcPr>
           <w:p>
             <w:r>
-              <w:t>68.9</w:t>
+              <w:t>68.8</w:t>
             </w:r>
           </w:p>
         </w:tc>
@@ -1459,7 +1459,7 @@
           </w:tcPr>
           <w:p>
             <w:r>
-              <w:t>11</w:t>
+              <w:t>29</w:t>
             </w:r>
           </w:p>
         </w:tc>
@@ -1471,7 +1471,7 @@
           </w:tcPr>
           <w:p>
             <w:r>
-              <w:t>2026-06-26 02:57:53</w:t>
+              <w:t>2026-06-26 05:17:18</w:t>
             </w:r>
           </w:p>
         </w:tc>
@@ -1481,7 +1481,7 @@
           </w:tcPr>
           <w:p>
             <w:r>
-              <w:t>47</w:t>
+              <w:t>48</w:t>
             </w:r>
           </w:p>
         </w:tc>
@@ -1491,7 +1491,7 @@
           </w:tcPr>
           <w:p>
             <w:r>
-              <w:t>70.8</w:t>
+              <w:t>65.8</w:t>
             </w:r>
           </w:p>
         </w:tc>
@@ -1501,7 +1501,7 @@
           </w:tcPr>
           <w:p>
             <w:r>
-              <w:t>90.3</w:t>
+              <w:t>90.1</w:t>
             </w:r>
           </w:p>
         </w:tc>
@@ -1511,7 +1511,7 @@
           </w:tcPr>
           <w:p>
             <w:r>
-              <w:t>51.5</w:t>
+              <w:t>53.9</w:t>
             </w:r>
           </w:p>
         </w:tc>
@@ -1521,7 +1521,7 @@
           </w:tcPr>
           <w:p>
             <w:r>
-              <w:t>70.8</w:t>
+              <w:t>68.9</w:t>
             </w:r>
           </w:p>
         </w:tc>
@@ -1531,7 +1531,7 @@
           </w:tcPr>
           <w:p>
             <w:r>
-              <w:t>14</w:t>
+              <w:t>48</w:t>
             </w:r>
           </w:p>
         </w:tc>
@@ -1543,7 +1543,7 @@
           </w:tcPr>
           <w:p>
             <w:r>
-              <w:t>2026-06-26 03:27:55</w:t>
+              <w:t>2026-06-26 05:47:21</w:t>
             </w:r>
           </w:p>
         </w:tc>
@@ -1553,7 +1553,7 @@
           </w:tcPr>
           <w:p>
             <w:r>
-              <w:t>47</w:t>
+              <w:t>48</w:t>
             </w:r>
           </w:p>
         </w:tc>
@@ -1563,7 +1563,7 @@
           </w:tcPr>
           <w:p>
             <w:r>
-              <w:t>70.8</w:t>
+              <w:t>65.8</w:t>
             </w:r>
           </w:p>
         </w:tc>
@@ -1573,7 +1573,7 @@
           </w:tcPr>
           <w:p>
             <w:r>
-              <w:t>90.2</w:t>
+              <w:t>90.1</w:t>
             </w:r>
           </w:p>
         </w:tc>
@@ -1583,7 +1583,7 @@
           </w:tcPr>
           <w:p>
             <w:r>
-              <w:t>51.5</w:t>
+              <w:t>53.7</w:t>
             </w:r>
           </w:p>
         </w:tc>
@@ -1593,7 +1593,7 @@
           </w:tcPr>
           <w:p>
             <w:r>
-              <w:t>70.8</w:t>
+              <w:t>68.8</w:t>
             </w:r>
           </w:p>
         </w:tc>
@@ -1603,7 +1603,7 @@
           </w:tcPr>
           <w:p>
             <w:r>
-              <w:t>21</w:t>
+              <w:t>483</w:t>
             </w:r>
           </w:p>
         </w:tc>
@@ -1615,7 +1615,7 @@
           </w:tcPr>
           <w:p>
             <w:r>
-              <w:t>2026-06-26 03:47:11</w:t>
+              <w:t>2026-06-26 06:17:24</w:t>
             </w:r>
           </w:p>
         </w:tc>
@@ -1645,7 +1645,7 @@
           </w:tcPr>
           <w:p>
             <w:r>
-              <w:t>90.0</w:t>
+              <w:t>90.1</w:t>
             </w:r>
           </w:p>
         </w:tc>
@@ -1655,7 +1655,7 @@
           </w:tcPr>
           <w:p>
             <w:r>
-              <w:t>53.7</w:t>
+              <w:t>53.5</w:t>
             </w:r>
           </w:p>
         </w:tc>
@@ -1675,7 +1675,7 @@
           </w:tcPr>
           <w:p>
             <w:r>
-              <w:t>310</w:t>
+              <w:t>268</w:t>
             </w:r>
           </w:p>
         </w:tc>
@@ -1687,7 +1687,7 @@
           </w:tcPr>
           <w:p>
             <w:r>
-              <w:t>2026-06-26 04:17:12</w:t>
+              <w:t>2026-06-26 06:47:28</w:t>
             </w:r>
           </w:p>
         </w:tc>
@@ -1717,7 +1717,7 @@
           </w:tcPr>
           <w:p>
             <w:r>
-              <w:t>90.0</w:t>
+              <w:t>90.2</w:t>
             </w:r>
           </w:p>
         </w:tc>
@@ -1727,7 +1727,7 @@
           </w:tcPr>
           <w:p>
             <w:r>
-              <w:t>53.9</w:t>
+              <w:t>53.3</w:t>
             </w:r>
           </w:p>
         </w:tc>
@@ -1737,7 +1737,7 @@
           </w:tcPr>
           <w:p>
             <w:r>
-              <w:t>68.9</w:t>
+              <w:t>68.8</w:t>
             </w:r>
           </w:p>
         </w:tc>
@@ -1747,7 +1747,7 @@
           </w:tcPr>
           <w:p>
             <w:r>
-              <w:t>224</w:t>
+              <w:t>698</w:t>
             </w:r>
           </w:p>
         </w:tc>
@@ -3176,7 +3176,7 @@
     </w:p>
     <w:p>
       <w:r>
-        <w:t>Section score: 90.0 / 100  (Grade: A)</w:t>
+        <w:t>Section score: 90.2 / 100  (Grade: A)</w:t>
       </w:r>
     </w:p>
     <w:p>
@@ -3319,7 +3319,7 @@
           </w:tcPr>
           <w:p>
             <w:r>
-              <w:t>93.6</w:t>
+              <w:t>94.5</w:t>
             </w:r>
           </w:p>
         </w:tc>
@@ -3329,7 +3329,7 @@
           </w:tcPr>
           <w:p>
             <w:r>
-              <w:t>14.0</w:t>
+              <w:t>14.2</w:t>
             </w:r>
           </w:p>
         </w:tc>
@@ -3433,17 +3433,17 @@
     </w:tbl>
     <w:p>
       <w:r>
-        <w:t>Ticks: 4 · Reconciled: True · Readiness: not_ready</w:t>
+        <w:t>Ticks: 1054 · Reconciled: True · Readiness: not_ready</w:t>
       </w:r>
     </w:p>
     <w:p>
       <w:r>
-        <w:t>Candidates created: 19605 · Terminals: {'accepted': 48, 'rejected': 16194, 'skipped': 3271, 'expired': 0, 'missing_data': 92}</w:t>
+        <w:t>Candidates created: 23873 · Terminals: {'accepted': 48, 'rejected': 20058, 'skipped': 3652, 'expired': 0, 'missing_data': 115}</w:t>
       </w:r>
     </w:p>
     <w:p>
       <w:r>
-        <w:t>Rejected by stage: {'directional': 9378, 'execution_gate': 135, 'context_gate': 726, 'directional_allowlist': 1364, 'down_bias_gate': 538, 'mtf_gate': 275, 'grok_decider': 3531, 'execution_realistic': 3, 'verifier': 61, 'mispricing_gate': 50, 'baseline_cohort_gate': 133}</w:t>
+        <w:t>Rejected by stage: {'directional': 12503, 'execution_gate': 135, 'context_gate': 780, 'directional_allowlist': 1364, 'down_bias_gate': 538, 'mtf_gate': 275, 'grok_decider': 3536, 'execution_realistic': 3, 'verifier': 61, 'mispricing_gate': 50, 'baseline_cohort_gate': 813}</w:t>
       </w:r>
     </w:p>
     <w:p>
@@ -4018,7 +4018,7 @@
     </w:p>
     <w:p>
       <w:r>
-        <w:t>Section score: 53.7 / 100  (Grade: F)</w:t>
+        <w:t>Section score: 53.1 / 100  (Grade: F)</w:t>
       </w:r>
     </w:p>
     <w:p>
@@ -4161,7 +4161,7 @@
           </w:tcPr>
           <w:p>
             <w:r>
-              <w:t>4.4</w:t>
+              <w:t>0.4</w:t>
             </w:r>
           </w:p>
         </w:tc>
@@ -4171,7 +4171,7 @@
           </w:tcPr>
           <w:p>
             <w:r>
-              <w:t>0.7</w:t>
+              <w:t>0.1</w:t>
             </w:r>
           </w:p>
         </w:tc>
@@ -4374,7 +4374,7 @@
           </w:tcPr>
           <w:p>
             <w:r>
-              <w:t>0.4792</w:t>
+              <w:t>0.4528</w:t>
             </w:r>
           </w:p>
         </w:tc>
@@ -4396,7 +4396,7 @@
           </w:tcPr>
           <w:p>
             <w:r>
-              <w:t>0.4750</w:t>
+              <w:t>0.4803</w:t>
             </w:r>
           </w:p>
         </w:tc>
@@ -4426,7 +4426,7 @@
     </w:tbl>
     <w:p>
       <w:r>
-        <w:t>TV alerts: received 765 · valid 754 · rejected 11</w:t>
+        <w:t>TV alerts: received 880 · valid 869 · rejected 11</w:t>
       </w:r>
     </w:p>
     <w:sectPr>

</xml_diff>

<commit_message>
chore(reports): VPS full report 2026-06-26 09:15 UTC (48 settled, WR 62.5%, PF 1.0199)
</commit_message>
<xml_diff>
--- a/vps_full_reports/latest/report.docx
+++ b/vps_full_reports/latest/report.docx
@@ -20,7 +20,7 @@
           <w:color w:val="666666"/>
           <w:sz w:val="20"/>
         </w:rPr>
-        <w:t>PAPER ONLY  ·  reconciled=True  ·  ticks=1054</w:t>
+        <w:t>PAPER ONLY  ·  reconciled=True  ·  ticks=1750</w:t>
       </w:r>
     </w:p>
     <w:p>
@@ -33,7 +33,7 @@
     </w:p>
     <w:p>
       <w:r>
-        <w:t>Overall score: 68.7 / 100  (Grade: D)</w:t>
+        <w:t>Overall score: 68.9 / 100  (Grade: D)</w:t>
       </w:r>
     </w:p>
     <w:tbl>
@@ -149,7 +149,7 @@
           </w:tcPr>
           <w:p>
             <w:r>
-              <w:t>90.2</w:t>
+              <w:t>90.3</w:t>
             </w:r>
           </w:p>
         </w:tc>
@@ -191,7 +191,7 @@
           </w:tcPr>
           <w:p>
             <w:r>
-              <w:t>53.1</w:t>
+              <w:t>53.9</w:t>
             </w:r>
           </w:p>
         </w:tc>
@@ -319,7 +319,7 @@
           </w:tcPr>
           <w:p>
             <w:r>
-              <w:t>2026-06-26 00:29:19</w:t>
+              <w:t>2026-06-26 01:13:06</w:t>
             </w:r>
           </w:p>
         </w:tc>
@@ -329,7 +329,7 @@
           </w:tcPr>
           <w:p>
             <w:r>
-              <w:t>41</w:t>
+              <w:t>43</w:t>
             </w:r>
           </w:p>
         </w:tc>
@@ -339,7 +339,7 @@
           </w:tcPr>
           <w:p>
             <w:r>
-              <w:t>69.4</w:t>
+              <w:t>66.7</w:t>
             </w:r>
           </w:p>
         </w:tc>
@@ -349,7 +349,7 @@
           </w:tcPr>
           <w:p>
             <w:r>
-              <w:t>90.6</w:t>
+              <w:t>75.6</w:t>
             </w:r>
           </w:p>
         </w:tc>
@@ -359,7 +359,7 @@
           </w:tcPr>
           <w:p>
             <w:r>
-              <w:t>51.1</w:t>
+              <w:t>50.4</w:t>
             </w:r>
           </w:p>
         </w:tc>
@@ -369,7 +369,7 @@
           </w:tcPr>
           <w:p>
             <w:r>
-              <w:t>70.1</w:t>
+              <w:t>64.8</w:t>
             </w:r>
           </w:p>
         </w:tc>
@@ -379,7 +379,7 @@
           </w:tcPr>
           <w:p>
             <w:r>
-              <w:t>1</w:t>
+              <w:t>657</w:t>
             </w:r>
           </w:p>
         </w:tc>
@@ -391,7 +391,7 @@
           </w:tcPr>
           <w:p>
             <w:r>
-              <w:t>2026-06-26 00:38:02</w:t>
+              <w:t>2026-06-26 01:41:44</w:t>
             </w:r>
           </w:p>
         </w:tc>
@@ -401,7 +401,7 @@
           </w:tcPr>
           <w:p>
             <w:r>
-              <w:t>42</w:t>
+              <w:t>43</w:t>
             </w:r>
           </w:p>
         </w:tc>
@@ -411,7 +411,7 @@
           </w:tcPr>
           <w:p>
             <w:r>
-              <w:t>64.0</w:t>
+              <w:t>66.7</w:t>
             </w:r>
           </w:p>
         </w:tc>
@@ -431,7 +431,7 @@
           </w:tcPr>
           <w:p>
             <w:r>
-              <w:t>48.5</w:t>
+              <w:t>50.4</w:t>
             </w:r>
           </w:p>
         </w:tc>
@@ -441,7 +441,7 @@
           </w:tcPr>
           <w:p>
             <w:r>
-              <w:t>66.8</w:t>
+              <w:t>68.6</w:t>
             </w:r>
           </w:p>
         </w:tc>
@@ -451,7 +451,7 @@
           </w:tcPr>
           <w:p>
             <w:r>
-              <w:t>132</w:t>
+              <w:t>1</w:t>
             </w:r>
           </w:p>
         </w:tc>
@@ -463,7 +463,7 @@
           </w:tcPr>
           <w:p>
             <w:r>
-              <w:t>2026-06-26 00:38:06</w:t>
+              <w:t>2026-06-26 01:51:12</w:t>
             </w:r>
           </w:p>
         </w:tc>
@@ -473,7 +473,7 @@
           </w:tcPr>
           <w:p>
             <w:r>
-              <w:t>42</w:t>
+              <w:t>44</w:t>
             </w:r>
           </w:p>
         </w:tc>
@@ -483,7 +483,7 @@
           </w:tcPr>
           <w:p>
             <w:r>
-              <w:t>64.0</w:t>
+              <w:t>61.6</w:t>
             </w:r>
           </w:p>
         </w:tc>
@@ -493,7 +493,7 @@
           </w:tcPr>
           <w:p>
             <w:r>
-              <w:t>75.6</w:t>
+              <w:t>90.6</w:t>
             </w:r>
           </w:p>
         </w:tc>
@@ -503,7 +503,7 @@
           </w:tcPr>
           <w:p>
             <w:r>
-              <w:t>48.5</w:t>
+              <w:t>48.1</w:t>
             </w:r>
           </w:p>
         </w:tc>
@@ -513,7 +513,7 @@
           </w:tcPr>
           <w:p>
             <w:r>
-              <w:t>63.0</w:t>
+              <w:t>65.5</w:t>
             </w:r>
           </w:p>
         </w:tc>
@@ -523,7 +523,7 @@
           </w:tcPr>
           <w:p>
             <w:r>
-              <w:t>133</w:t>
+              <w:t>137</w:t>
             </w:r>
           </w:p>
         </w:tc>
@@ -535,7 +535,7 @@
           </w:tcPr>
           <w:p>
             <w:r>
-              <w:t>2026-06-26 00:43:03</w:t>
+              <w:t>2026-06-26 02:21:15</w:t>
             </w:r>
           </w:p>
         </w:tc>
@@ -545,7 +545,7 @@
           </w:tcPr>
           <w:p>
             <w:r>
-              <w:t>43</w:t>
+              <w:t>44</w:t>
             </w:r>
           </w:p>
         </w:tc>
@@ -555,7 +555,7 @@
           </w:tcPr>
           <w:p>
             <w:r>
-              <w:t>66.7</w:t>
+              <w:t>61.6</w:t>
             </w:r>
           </w:p>
         </w:tc>
@@ -565,7 +565,7 @@
           </w:tcPr>
           <w:p>
             <w:r>
-              <w:t>75.6</w:t>
+              <w:t>90.6</w:t>
             </w:r>
           </w:p>
         </w:tc>
@@ -575,7 +575,7 @@
           </w:tcPr>
           <w:p>
             <w:r>
-              <w:t>50.4</w:t>
+              <w:t>48.1</w:t>
             </w:r>
           </w:p>
         </w:tc>
@@ -585,7 +585,7 @@
           </w:tcPr>
           <w:p>
             <w:r>
-              <w:t>64.8</w:t>
+              <w:t>65.5</w:t>
             </w:r>
           </w:p>
         </w:tc>
@@ -595,7 +595,7 @@
           </w:tcPr>
           <w:p>
             <w:r>
-              <w:t>207</w:t>
+              <w:t>588</w:t>
             </w:r>
           </w:p>
         </w:tc>
@@ -607,7 +607,7 @@
           </w:tcPr>
           <w:p>
             <w:r>
-              <w:t>2026-06-26 01:13:06</w:t>
+              <w:t>2026-06-26 02:23:03</w:t>
             </w:r>
           </w:p>
         </w:tc>
@@ -617,7 +617,7 @@
           </w:tcPr>
           <w:p>
             <w:r>
-              <w:t>43</w:t>
+              <w:t>45</w:t>
             </w:r>
           </w:p>
         </w:tc>
@@ -627,7 +627,7 @@
           </w:tcPr>
           <w:p>
             <w:r>
-              <w:t>66.7</w:t>
+              <w:t>64.2</w:t>
             </w:r>
           </w:p>
         </w:tc>
@@ -637,7 +637,7 @@
           </w:tcPr>
           <w:p>
             <w:r>
-              <w:t>75.6</w:t>
+              <w:t>90.6</w:t>
             </w:r>
           </w:p>
         </w:tc>
@@ -647,7 +647,7 @@
           </w:tcPr>
           <w:p>
             <w:r>
-              <w:t>50.4</w:t>
+              <w:t>48.1</w:t>
             </w:r>
           </w:p>
         </w:tc>
@@ -657,7 +657,7 @@
           </w:tcPr>
           <w:p>
             <w:r>
-              <w:t>64.8</w:t>
+              <w:t>66.8</w:t>
             </w:r>
           </w:p>
         </w:tc>
@@ -667,7 +667,7 @@
           </w:tcPr>
           <w:p>
             <w:r>
-              <w:t>657</w:t>
+              <w:t>615</w:t>
             </w:r>
           </w:p>
         </w:tc>
@@ -679,7 +679,7 @@
           </w:tcPr>
           <w:p>
             <w:r>
-              <w:t>2026-06-26 01:41:44</w:t>
+              <w:t>2026-06-26 02:27:37</w:t>
             </w:r>
           </w:p>
         </w:tc>
@@ -689,7 +689,7 @@
           </w:tcPr>
           <w:p>
             <w:r>
-              <w:t>43</w:t>
+              <w:t>46</w:t>
             </w:r>
           </w:p>
         </w:tc>
@@ -699,7 +699,7 @@
           </w:tcPr>
           <w:p>
             <w:r>
-              <w:t>66.7</w:t>
+              <w:t>67.7</w:t>
             </w:r>
           </w:p>
         </w:tc>
@@ -719,7 +719,7 @@
           </w:tcPr>
           <w:p>
             <w:r>
-              <w:t>50.4</w:t>
+              <w:t>49.9</w:t>
             </w:r>
           </w:p>
         </w:tc>
@@ -729,7 +729,7 @@
           </w:tcPr>
           <w:p>
             <w:r>
-              <w:t>68.6</w:t>
+              <w:t>69.0</w:t>
             </w:r>
           </w:p>
         </w:tc>
@@ -751,7 +751,7 @@
           </w:tcPr>
           <w:p>
             <w:r>
-              <w:t>2026-06-26 01:51:12</w:t>
+              <w:t>2026-06-26 02:57:41</w:t>
             </w:r>
           </w:p>
         </w:tc>
@@ -761,7 +761,7 @@
           </w:tcPr>
           <w:p>
             <w:r>
-              <w:t>44</w:t>
+              <w:t>46</w:t>
             </w:r>
           </w:p>
         </w:tc>
@@ -771,7 +771,7 @@
           </w:tcPr>
           <w:p>
             <w:r>
-              <w:t>61.6</w:t>
+              <w:t>67.7</w:t>
             </w:r>
           </w:p>
         </w:tc>
@@ -781,7 +781,7 @@
           </w:tcPr>
           <w:p>
             <w:r>
-              <w:t>90.6</w:t>
+              <w:t>90.3</w:t>
             </w:r>
           </w:p>
         </w:tc>
@@ -791,7 +791,7 @@
           </w:tcPr>
           <w:p>
             <w:r>
-              <w:t>48.1</w:t>
+              <w:t>49.9</w:t>
             </w:r>
           </w:p>
         </w:tc>
@@ -801,7 +801,7 @@
           </w:tcPr>
           <w:p>
             <w:r>
-              <w:t>65.5</w:t>
+              <w:t>68.9</w:t>
             </w:r>
           </w:p>
         </w:tc>
@@ -811,7 +811,7 @@
           </w:tcPr>
           <w:p>
             <w:r>
-              <w:t>137</w:t>
+              <w:t>11</w:t>
             </w:r>
           </w:p>
         </w:tc>
@@ -823,7 +823,7 @@
           </w:tcPr>
           <w:p>
             <w:r>
-              <w:t>2026-06-26 02:21:15</w:t>
+              <w:t>2026-06-26 02:57:53</w:t>
             </w:r>
           </w:p>
         </w:tc>
@@ -833,7 +833,7 @@
           </w:tcPr>
           <w:p>
             <w:r>
-              <w:t>44</w:t>
+              <w:t>47</w:t>
             </w:r>
           </w:p>
         </w:tc>
@@ -843,7 +843,7 @@
           </w:tcPr>
           <w:p>
             <w:r>
-              <w:t>61.6</w:t>
+              <w:t>70.8</w:t>
             </w:r>
           </w:p>
         </w:tc>
@@ -853,7 +853,7 @@
           </w:tcPr>
           <w:p>
             <w:r>
-              <w:t>90.6</w:t>
+              <w:t>90.3</w:t>
             </w:r>
           </w:p>
         </w:tc>
@@ -863,7 +863,7 @@
           </w:tcPr>
           <w:p>
             <w:r>
-              <w:t>48.1</w:t>
+              <w:t>51.5</w:t>
             </w:r>
           </w:p>
         </w:tc>
@@ -873,7 +873,7 @@
           </w:tcPr>
           <w:p>
             <w:r>
-              <w:t>65.5</w:t>
+              <w:t>70.8</w:t>
             </w:r>
           </w:p>
         </w:tc>
@@ -883,7 +883,7 @@
           </w:tcPr>
           <w:p>
             <w:r>
-              <w:t>588</w:t>
+              <w:t>14</w:t>
             </w:r>
           </w:p>
         </w:tc>
@@ -895,7 +895,7 @@
           </w:tcPr>
           <w:p>
             <w:r>
-              <w:t>2026-06-26 02:23:03</w:t>
+              <w:t>2026-06-26 03:27:55</w:t>
             </w:r>
           </w:p>
         </w:tc>
@@ -905,7 +905,7 @@
           </w:tcPr>
           <w:p>
             <w:r>
-              <w:t>45</w:t>
+              <w:t>47</w:t>
             </w:r>
           </w:p>
         </w:tc>
@@ -915,7 +915,7 @@
           </w:tcPr>
           <w:p>
             <w:r>
-              <w:t>64.2</w:t>
+              <w:t>70.8</w:t>
             </w:r>
           </w:p>
         </w:tc>
@@ -925,7 +925,7 @@
           </w:tcPr>
           <w:p>
             <w:r>
-              <w:t>90.6</w:t>
+              <w:t>90.2</w:t>
             </w:r>
           </w:p>
         </w:tc>
@@ -935,7 +935,7 @@
           </w:tcPr>
           <w:p>
             <w:r>
-              <w:t>48.1</w:t>
+              <w:t>51.5</w:t>
             </w:r>
           </w:p>
         </w:tc>
@@ -945,7 +945,7 @@
           </w:tcPr>
           <w:p>
             <w:r>
-              <w:t>66.8</w:t>
+              <w:t>70.8</w:t>
             </w:r>
           </w:p>
         </w:tc>
@@ -955,7 +955,7 @@
           </w:tcPr>
           <w:p>
             <w:r>
-              <w:t>615</w:t>
+              <w:t>21</w:t>
             </w:r>
           </w:p>
         </w:tc>
@@ -967,7 +967,7 @@
           </w:tcPr>
           <w:p>
             <w:r>
-              <w:t>2026-06-26 02:27:37</w:t>
+              <w:t>2026-06-26 03:47:11</w:t>
             </w:r>
           </w:p>
         </w:tc>
@@ -977,7 +977,7 @@
           </w:tcPr>
           <w:p>
             <w:r>
-              <w:t>46</w:t>
+              <w:t>48</w:t>
             </w:r>
           </w:p>
         </w:tc>
@@ -987,7 +987,7 @@
           </w:tcPr>
           <w:p>
             <w:r>
-              <w:t>67.7</w:t>
+              <w:t>65.8</w:t>
             </w:r>
           </w:p>
         </w:tc>
@@ -997,7 +997,7 @@
           </w:tcPr>
           <w:p>
             <w:r>
-              <w:t>90.6</w:t>
+              <w:t>90.0</w:t>
             </w:r>
           </w:p>
         </w:tc>
@@ -1007,7 +1007,7 @@
           </w:tcPr>
           <w:p>
             <w:r>
-              <w:t>49.9</w:t>
+              <w:t>53.7</w:t>
             </w:r>
           </w:p>
         </w:tc>
@@ -1017,7 +1017,7 @@
           </w:tcPr>
           <w:p>
             <w:r>
-              <w:t>69.0</w:t>
+              <w:t>68.8</w:t>
             </w:r>
           </w:p>
         </w:tc>
@@ -1027,7 +1027,7 @@
           </w:tcPr>
           <w:p>
             <w:r>
-              <w:t>1</w:t>
+              <w:t>310</w:t>
             </w:r>
           </w:p>
         </w:tc>
@@ -1039,7 +1039,7 @@
           </w:tcPr>
           <w:p>
             <w:r>
-              <w:t>2026-06-26 02:57:41</w:t>
+              <w:t>2026-06-26 04:17:12</w:t>
             </w:r>
           </w:p>
         </w:tc>
@@ -1049,7 +1049,7 @@
           </w:tcPr>
           <w:p>
             <w:r>
-              <w:t>46</w:t>
+              <w:t>48</w:t>
             </w:r>
           </w:p>
         </w:tc>
@@ -1059,7 +1059,7 @@
           </w:tcPr>
           <w:p>
             <w:r>
-              <w:t>67.7</w:t>
+              <w:t>65.8</w:t>
             </w:r>
           </w:p>
         </w:tc>
@@ -1069,7 +1069,7 @@
           </w:tcPr>
           <w:p>
             <w:r>
-              <w:t>90.3</w:t>
+              <w:t>90.0</w:t>
             </w:r>
           </w:p>
         </w:tc>
@@ -1079,7 +1079,7 @@
           </w:tcPr>
           <w:p>
             <w:r>
-              <w:t>49.9</w:t>
+              <w:t>53.9</w:t>
             </w:r>
           </w:p>
         </w:tc>
@@ -1099,7 +1099,7 @@
           </w:tcPr>
           <w:p>
             <w:r>
-              <w:t>11</w:t>
+              <w:t>224</w:t>
             </w:r>
           </w:p>
         </w:tc>
@@ -1111,7 +1111,7 @@
           </w:tcPr>
           <w:p>
             <w:r>
-              <w:t>2026-06-26 02:57:53</w:t>
+              <w:t>2026-06-26 04:47:16</w:t>
             </w:r>
           </w:p>
         </w:tc>
@@ -1121,7 +1121,7 @@
           </w:tcPr>
           <w:p>
             <w:r>
-              <w:t>47</w:t>
+              <w:t>48</w:t>
             </w:r>
           </w:p>
         </w:tc>
@@ -1131,7 +1131,7 @@
           </w:tcPr>
           <w:p>
             <w:r>
-              <w:t>70.8</w:t>
+              <w:t>65.8</w:t>
             </w:r>
           </w:p>
         </w:tc>
@@ -1141,7 +1141,7 @@
           </w:tcPr>
           <w:p>
             <w:r>
-              <w:t>90.3</w:t>
+              <w:t>90.0</w:t>
             </w:r>
           </w:p>
         </w:tc>
@@ -1151,7 +1151,7 @@
           </w:tcPr>
           <w:p>
             <w:r>
-              <w:t>51.5</w:t>
+              <w:t>53.7</w:t>
             </w:r>
           </w:p>
         </w:tc>
@@ -1161,7 +1161,7 @@
           </w:tcPr>
           <w:p>
             <w:r>
-              <w:t>70.8</w:t>
+              <w:t>68.8</w:t>
             </w:r>
           </w:p>
         </w:tc>
@@ -1171,7 +1171,7 @@
           </w:tcPr>
           <w:p>
             <w:r>
-              <w:t>14</w:t>
+              <w:t>29</w:t>
             </w:r>
           </w:p>
         </w:tc>
@@ -1183,7 +1183,7 @@
           </w:tcPr>
           <w:p>
             <w:r>
-              <w:t>2026-06-26 03:27:55</w:t>
+              <w:t>2026-06-26 05:17:18</w:t>
             </w:r>
           </w:p>
         </w:tc>
@@ -1193,7 +1193,7 @@
           </w:tcPr>
           <w:p>
             <w:r>
-              <w:t>47</w:t>
+              <w:t>48</w:t>
             </w:r>
           </w:p>
         </w:tc>
@@ -1203,7 +1203,7 @@
           </w:tcPr>
           <w:p>
             <w:r>
-              <w:t>70.8</w:t>
+              <w:t>65.8</w:t>
             </w:r>
           </w:p>
         </w:tc>
@@ -1213,7 +1213,7 @@
           </w:tcPr>
           <w:p>
             <w:r>
-              <w:t>90.2</w:t>
+              <w:t>90.1</w:t>
             </w:r>
           </w:p>
         </w:tc>
@@ -1223,7 +1223,7 @@
           </w:tcPr>
           <w:p>
             <w:r>
-              <w:t>51.5</w:t>
+              <w:t>53.9</w:t>
             </w:r>
           </w:p>
         </w:tc>
@@ -1233,7 +1233,7 @@
           </w:tcPr>
           <w:p>
             <w:r>
-              <w:t>70.8</w:t>
+              <w:t>68.9</w:t>
             </w:r>
           </w:p>
         </w:tc>
@@ -1243,7 +1243,7 @@
           </w:tcPr>
           <w:p>
             <w:r>
-              <w:t>21</w:t>
+              <w:t>48</w:t>
             </w:r>
           </w:p>
         </w:tc>
@@ -1255,7 +1255,7 @@
           </w:tcPr>
           <w:p>
             <w:r>
-              <w:t>2026-06-26 03:47:11</w:t>
+              <w:t>2026-06-26 05:47:21</w:t>
             </w:r>
           </w:p>
         </w:tc>
@@ -1285,7 +1285,7 @@
           </w:tcPr>
           <w:p>
             <w:r>
-              <w:t>90.0</w:t>
+              <w:t>90.1</w:t>
             </w:r>
           </w:p>
         </w:tc>
@@ -1315,7 +1315,7 @@
           </w:tcPr>
           <w:p>
             <w:r>
-              <w:t>310</w:t>
+              <w:t>483</w:t>
             </w:r>
           </w:p>
         </w:tc>
@@ -1327,7 +1327,7 @@
           </w:tcPr>
           <w:p>
             <w:r>
-              <w:t>2026-06-26 04:17:12</w:t>
+              <w:t>2026-06-26 06:17:24</w:t>
             </w:r>
           </w:p>
         </w:tc>
@@ -1357,7 +1357,7 @@
           </w:tcPr>
           <w:p>
             <w:r>
-              <w:t>90.0</w:t>
+              <w:t>90.1</w:t>
             </w:r>
           </w:p>
         </w:tc>
@@ -1367,7 +1367,7 @@
           </w:tcPr>
           <w:p>
             <w:r>
-              <w:t>53.9</w:t>
+              <w:t>53.5</w:t>
             </w:r>
           </w:p>
         </w:tc>
@@ -1377,7 +1377,7 @@
           </w:tcPr>
           <w:p>
             <w:r>
-              <w:t>68.9</w:t>
+              <w:t>68.8</w:t>
             </w:r>
           </w:p>
         </w:tc>
@@ -1387,7 +1387,7 @@
           </w:tcPr>
           <w:p>
             <w:r>
-              <w:t>224</w:t>
+              <w:t>268</w:t>
             </w:r>
           </w:p>
         </w:tc>
@@ -1399,7 +1399,7 @@
           </w:tcPr>
           <w:p>
             <w:r>
-              <w:t>2026-06-26 04:47:16</w:t>
+              <w:t>2026-06-26 06:47:28</w:t>
             </w:r>
           </w:p>
         </w:tc>
@@ -1429,7 +1429,7 @@
           </w:tcPr>
           <w:p>
             <w:r>
-              <w:t>90.0</w:t>
+              <w:t>90.2</w:t>
             </w:r>
           </w:p>
         </w:tc>
@@ -1439,7 +1439,7 @@
           </w:tcPr>
           <w:p>
             <w:r>
-              <w:t>53.7</w:t>
+              <w:t>53.3</w:t>
             </w:r>
           </w:p>
         </w:tc>
@@ -1459,7 +1459,7 @@
           </w:tcPr>
           <w:p>
             <w:r>
-              <w:t>29</w:t>
+              <w:t>698</w:t>
             </w:r>
           </w:p>
         </w:tc>
@@ -1471,7 +1471,7 @@
           </w:tcPr>
           <w:p>
             <w:r>
-              <w:t>2026-06-26 05:17:18</w:t>
+              <w:t>2026-06-26 07:17:32</w:t>
             </w:r>
           </w:p>
         </w:tc>
@@ -1501,7 +1501,7 @@
           </w:tcPr>
           <w:p>
             <w:r>
-              <w:t>90.1</w:t>
+              <w:t>90.2</w:t>
             </w:r>
           </w:p>
         </w:tc>
@@ -1511,7 +1511,7 @@
           </w:tcPr>
           <w:p>
             <w:r>
-              <w:t>53.9</w:t>
+              <w:t>53.1</w:t>
             </w:r>
           </w:p>
         </w:tc>
@@ -1521,7 +1521,7 @@
           </w:tcPr>
           <w:p>
             <w:r>
-              <w:t>68.9</w:t>
+              <w:t>68.7</w:t>
             </w:r>
           </w:p>
         </w:tc>
@@ -1531,7 +1531,7 @@
           </w:tcPr>
           <w:p>
             <w:r>
-              <w:t>48</w:t>
+              <w:t>46</w:t>
             </w:r>
           </w:p>
         </w:tc>
@@ -1543,7 +1543,7 @@
           </w:tcPr>
           <w:p>
             <w:r>
-              <w:t>2026-06-26 05:47:21</w:t>
+              <w:t>2026-06-26 07:47:33</w:t>
             </w:r>
           </w:p>
         </w:tc>
@@ -1573,7 +1573,7 @@
           </w:tcPr>
           <w:p>
             <w:r>
-              <w:t>90.1</w:t>
+              <w:t>90.2</w:t>
             </w:r>
           </w:p>
         </w:tc>
@@ -1583,7 +1583,7 @@
           </w:tcPr>
           <w:p>
             <w:r>
-              <w:t>53.7</w:t>
+              <w:t>53.5</w:t>
             </w:r>
           </w:p>
         </w:tc>
@@ -1603,7 +1603,7 @@
           </w:tcPr>
           <w:p>
             <w:r>
-              <w:t>483</w:t>
+              <w:t>474</w:t>
             </w:r>
           </w:p>
         </w:tc>
@@ -1615,7 +1615,7 @@
           </w:tcPr>
           <w:p>
             <w:r>
-              <w:t>2026-06-26 06:17:24</w:t>
+              <w:t>2026-06-26 08:17:34</w:t>
             </w:r>
           </w:p>
         </w:tc>
@@ -1645,7 +1645,7 @@
           </w:tcPr>
           <w:p>
             <w:r>
-              <w:t>90.1</w:t>
+              <w:t>90.2</w:t>
             </w:r>
           </w:p>
         </w:tc>
@@ -1675,7 +1675,7 @@
           </w:tcPr>
           <w:p>
             <w:r>
-              <w:t>268</w:t>
+              <w:t>907</w:t>
             </w:r>
           </w:p>
         </w:tc>
@@ -1687,7 +1687,7 @@
           </w:tcPr>
           <w:p>
             <w:r>
-              <w:t>2026-06-26 06:47:28</w:t>
+              <w:t>2026-06-26 08:47:35</w:t>
             </w:r>
           </w:p>
         </w:tc>
@@ -1727,7 +1727,7 @@
           </w:tcPr>
           <w:p>
             <w:r>
-              <w:t>53.3</w:t>
+              <w:t>53.8</w:t>
             </w:r>
           </w:p>
         </w:tc>
@@ -1737,7 +1737,7 @@
           </w:tcPr>
           <w:p>
             <w:r>
-              <w:t>68.8</w:t>
+              <w:t>68.9</w:t>
             </w:r>
           </w:p>
         </w:tc>
@@ -1747,7 +1747,7 @@
           </w:tcPr>
           <w:p>
             <w:r>
-              <w:t>698</w:t>
+              <w:t>1342</w:t>
             </w:r>
           </w:p>
         </w:tc>
@@ -3176,7 +3176,7 @@
     </w:p>
     <w:p>
       <w:r>
-        <w:t>Section score: 90.2 / 100  (Grade: A)</w:t>
+        <w:t>Section score: 90.3 / 100  (Grade: A)</w:t>
       </w:r>
     </w:p>
     <w:p>
@@ -3319,7 +3319,7 @@
           </w:tcPr>
           <w:p>
             <w:r>
-              <w:t>94.5</w:t>
+              <w:t>95.1</w:t>
             </w:r>
           </w:p>
         </w:tc>
@@ -3329,7 +3329,7 @@
           </w:tcPr>
           <w:p>
             <w:r>
-              <w:t>14.2</w:t>
+              <w:t>14.3</w:t>
             </w:r>
           </w:p>
         </w:tc>
@@ -3433,17 +3433,17 @@
     </w:tbl>
     <w:p>
       <w:r>
-        <w:t>Ticks: 1054 · Reconciled: True · Readiness: not_ready</w:t>
+        <w:t>Ticks: 1750 · Reconciled: True · Readiness: not_ready</w:t>
       </w:r>
     </w:p>
     <w:p>
       <w:r>
-        <w:t>Candidates created: 23873 · Terminals: {'accepted': 48, 'rejected': 20058, 'skipped': 3652, 'expired': 0, 'missing_data': 115}</w:t>
+        <w:t>Candidates created: 27437 · Terminals: {'accepted': 48, 'rejected': 23604, 'skipped': 3668, 'expired': 0, 'missing_data': 117}</w:t>
       </w:r>
     </w:p>
     <w:p>
       <w:r>
-        <w:t>Rejected by stage: {'directional': 12503, 'execution_gate': 135, 'context_gate': 780, 'directional_allowlist': 1364, 'down_bias_gate': 538, 'mtf_gate': 275, 'grok_decider': 3536, 'execution_realistic': 3, 'verifier': 61, 'mispricing_gate': 50, 'baseline_cohort_gate': 813}</w:t>
+        <w:t>Rejected by stage: {'directional': 15398, 'execution_gate': 135, 'context_gate': 827, 'directional_allowlist': 1364, 'down_bias_gate': 538, 'mtf_gate': 275, 'grok_decider': 3540, 'execution_realistic': 3, 'verifier': 61, 'mispricing_gate': 50, 'baseline_cohort_gate': 1413}</w:t>
       </w:r>
     </w:p>
     <w:p>
@@ -4018,7 +4018,7 @@
     </w:p>
     <w:p>
       <w:r>
-        <w:t>Section score: 53.1 / 100  (Grade: F)</w:t>
+        <w:t>Section score: 53.9 / 100  (Grade: F)</w:t>
       </w:r>
     </w:p>
     <w:p>
@@ -4161,7 +4161,7 @@
           </w:tcPr>
           <w:p>
             <w:r>
-              <w:t>0.4</w:t>
+              <w:t>6.2</w:t>
             </w:r>
           </w:p>
         </w:tc>
@@ -4171,7 +4171,7 @@
           </w:tcPr>
           <w:p>
             <w:r>
-              <w:t>0.1</w:t>
+              <w:t>0.9</w:t>
             </w:r>
           </w:p>
         </w:tc>
@@ -4374,7 +4374,7 @@
           </w:tcPr>
           <w:p>
             <w:r>
-              <w:t>0.4528</w:t>
+              <w:t>0.4915</w:t>
             </w:r>
           </w:p>
         </w:tc>
@@ -4396,7 +4396,7 @@
           </w:tcPr>
           <w:p>
             <w:r>
-              <w:t>0.4803</w:t>
+              <w:t>0.4920</w:t>
             </w:r>
           </w:p>
         </w:tc>
@@ -4426,7 +4426,7 @@
     </w:tbl>
     <w:p>
       <w:r>
-        <w:t>TV alerts: received 880 · valid 869 · rejected 11</w:t>
+        <w:t>TV alerts: received 934 · valid 923 · rejected 11</w:t>
       </w:r>
     </w:p>
     <w:sectPr>

</xml_diff>

<commit_message>
chore(reports): VPS full report 2026-06-26 11:18 UTC (48 settled, WR 62.5%, PF 1.0199)
</commit_message>
<xml_diff>
--- a/vps_full_reports/latest/report.docx
+++ b/vps_full_reports/latest/report.docx
@@ -20,7 +20,7 @@
           <w:color w:val="666666"/>
           <w:sz w:val="20"/>
         </w:rPr>
-        <w:t>PAPER ONLY  ·  reconciled=True  ·  ticks=1750</w:t>
+        <w:t>PAPER ONLY  ·  reconciled=True  ·  ticks=1769</w:t>
       </w:r>
     </w:p>
     <w:p>
@@ -33,7 +33,7 @@
     </w:p>
     <w:p>
       <w:r>
-        <w:t>Overall score: 68.9 / 100  (Grade: D)</w:t>
+        <w:t>Overall score: 69.0 / 100  (Grade: D)</w:t>
       </w:r>
     </w:p>
     <w:tbl>
@@ -191,7 +191,7 @@
           </w:tcPr>
           <w:p>
             <w:r>
-              <w:t>53.9</w:t>
+              <w:t>54.1</w:t>
             </w:r>
           </w:p>
         </w:tc>
@@ -319,7 +319,7 @@
           </w:tcPr>
           <w:p>
             <w:r>
-              <w:t>2026-06-26 01:13:06</w:t>
+              <w:t>2026-06-26 02:27:37</w:t>
             </w:r>
           </w:p>
         </w:tc>
@@ -329,7 +329,7 @@
           </w:tcPr>
           <w:p>
             <w:r>
-              <w:t>43</w:t>
+              <w:t>46</w:t>
             </w:r>
           </w:p>
         </w:tc>
@@ -339,7 +339,7 @@
           </w:tcPr>
           <w:p>
             <w:r>
-              <w:t>66.7</w:t>
+              <w:t>67.7</w:t>
             </w:r>
           </w:p>
         </w:tc>
@@ -349,7 +349,7 @@
           </w:tcPr>
           <w:p>
             <w:r>
-              <w:t>75.6</w:t>
+              <w:t>90.6</w:t>
             </w:r>
           </w:p>
         </w:tc>
@@ -359,7 +359,7 @@
           </w:tcPr>
           <w:p>
             <w:r>
-              <w:t>50.4</w:t>
+              <w:t>49.9</w:t>
             </w:r>
           </w:p>
         </w:tc>
@@ -369,7 +369,7 @@
           </w:tcPr>
           <w:p>
             <w:r>
-              <w:t>64.8</w:t>
+              <w:t>69.0</w:t>
             </w:r>
           </w:p>
         </w:tc>
@@ -379,7 +379,7 @@
           </w:tcPr>
           <w:p>
             <w:r>
-              <w:t>657</w:t>
+              <w:t>1</w:t>
             </w:r>
           </w:p>
         </w:tc>
@@ -391,7 +391,7 @@
           </w:tcPr>
           <w:p>
             <w:r>
-              <w:t>2026-06-26 01:41:44</w:t>
+              <w:t>2026-06-26 02:57:41</w:t>
             </w:r>
           </w:p>
         </w:tc>
@@ -401,7 +401,7 @@
           </w:tcPr>
           <w:p>
             <w:r>
-              <w:t>43</w:t>
+              <w:t>46</w:t>
             </w:r>
           </w:p>
         </w:tc>
@@ -411,7 +411,7 @@
           </w:tcPr>
           <w:p>
             <w:r>
-              <w:t>66.7</w:t>
+              <w:t>67.7</w:t>
             </w:r>
           </w:p>
         </w:tc>
@@ -421,7 +421,7 @@
           </w:tcPr>
           <w:p>
             <w:r>
-              <w:t>90.6</w:t>
+              <w:t>90.3</w:t>
             </w:r>
           </w:p>
         </w:tc>
@@ -431,7 +431,7 @@
           </w:tcPr>
           <w:p>
             <w:r>
-              <w:t>50.4</w:t>
+              <w:t>49.9</w:t>
             </w:r>
           </w:p>
         </w:tc>
@@ -441,7 +441,7 @@
           </w:tcPr>
           <w:p>
             <w:r>
-              <w:t>68.6</w:t>
+              <w:t>68.9</w:t>
             </w:r>
           </w:p>
         </w:tc>
@@ -451,7 +451,7 @@
           </w:tcPr>
           <w:p>
             <w:r>
-              <w:t>1</w:t>
+              <w:t>11</w:t>
             </w:r>
           </w:p>
         </w:tc>
@@ -463,7 +463,7 @@
           </w:tcPr>
           <w:p>
             <w:r>
-              <w:t>2026-06-26 01:51:12</w:t>
+              <w:t>2026-06-26 02:57:53</w:t>
             </w:r>
           </w:p>
         </w:tc>
@@ -473,7 +473,7 @@
           </w:tcPr>
           <w:p>
             <w:r>
-              <w:t>44</w:t>
+              <w:t>47</w:t>
             </w:r>
           </w:p>
         </w:tc>
@@ -483,7 +483,7 @@
           </w:tcPr>
           <w:p>
             <w:r>
-              <w:t>61.6</w:t>
+              <w:t>70.8</w:t>
             </w:r>
           </w:p>
         </w:tc>
@@ -493,7 +493,7 @@
           </w:tcPr>
           <w:p>
             <w:r>
-              <w:t>90.6</w:t>
+              <w:t>90.3</w:t>
             </w:r>
           </w:p>
         </w:tc>
@@ -503,7 +503,7 @@
           </w:tcPr>
           <w:p>
             <w:r>
-              <w:t>48.1</w:t>
+              <w:t>51.5</w:t>
             </w:r>
           </w:p>
         </w:tc>
@@ -513,7 +513,7 @@
           </w:tcPr>
           <w:p>
             <w:r>
-              <w:t>65.5</w:t>
+              <w:t>70.8</w:t>
             </w:r>
           </w:p>
         </w:tc>
@@ -523,7 +523,7 @@
           </w:tcPr>
           <w:p>
             <w:r>
-              <w:t>137</w:t>
+              <w:t>14</w:t>
             </w:r>
           </w:p>
         </w:tc>
@@ -535,7 +535,7 @@
           </w:tcPr>
           <w:p>
             <w:r>
-              <w:t>2026-06-26 02:21:15</w:t>
+              <w:t>2026-06-26 03:27:55</w:t>
             </w:r>
           </w:p>
         </w:tc>
@@ -545,7 +545,7 @@
           </w:tcPr>
           <w:p>
             <w:r>
-              <w:t>44</w:t>
+              <w:t>47</w:t>
             </w:r>
           </w:p>
         </w:tc>
@@ -555,7 +555,7 @@
           </w:tcPr>
           <w:p>
             <w:r>
-              <w:t>61.6</w:t>
+              <w:t>70.8</w:t>
             </w:r>
           </w:p>
         </w:tc>
@@ -565,7 +565,7 @@
           </w:tcPr>
           <w:p>
             <w:r>
-              <w:t>90.6</w:t>
+              <w:t>90.2</w:t>
             </w:r>
           </w:p>
         </w:tc>
@@ -575,7 +575,7 @@
           </w:tcPr>
           <w:p>
             <w:r>
-              <w:t>48.1</w:t>
+              <w:t>51.5</w:t>
             </w:r>
           </w:p>
         </w:tc>
@@ -585,7 +585,7 @@
           </w:tcPr>
           <w:p>
             <w:r>
-              <w:t>65.5</w:t>
+              <w:t>70.8</w:t>
             </w:r>
           </w:p>
         </w:tc>
@@ -595,7 +595,7 @@
           </w:tcPr>
           <w:p>
             <w:r>
-              <w:t>588</w:t>
+              <w:t>21</w:t>
             </w:r>
           </w:p>
         </w:tc>
@@ -607,7 +607,7 @@
           </w:tcPr>
           <w:p>
             <w:r>
-              <w:t>2026-06-26 02:23:03</w:t>
+              <w:t>2026-06-26 03:47:11</w:t>
             </w:r>
           </w:p>
         </w:tc>
@@ -617,7 +617,7 @@
           </w:tcPr>
           <w:p>
             <w:r>
-              <w:t>45</w:t>
+              <w:t>48</w:t>
             </w:r>
           </w:p>
         </w:tc>
@@ -627,7 +627,7 @@
           </w:tcPr>
           <w:p>
             <w:r>
-              <w:t>64.2</w:t>
+              <w:t>65.8</w:t>
             </w:r>
           </w:p>
         </w:tc>
@@ -637,7 +637,7 @@
           </w:tcPr>
           <w:p>
             <w:r>
-              <w:t>90.6</w:t>
+              <w:t>90.0</w:t>
             </w:r>
           </w:p>
         </w:tc>
@@ -647,7 +647,7 @@
           </w:tcPr>
           <w:p>
             <w:r>
-              <w:t>48.1</w:t>
+              <w:t>53.7</w:t>
             </w:r>
           </w:p>
         </w:tc>
@@ -657,7 +657,7 @@
           </w:tcPr>
           <w:p>
             <w:r>
-              <w:t>66.8</w:t>
+              <w:t>68.8</w:t>
             </w:r>
           </w:p>
         </w:tc>
@@ -667,7 +667,7 @@
           </w:tcPr>
           <w:p>
             <w:r>
-              <w:t>615</w:t>
+              <w:t>310</w:t>
             </w:r>
           </w:p>
         </w:tc>
@@ -679,7 +679,7 @@
           </w:tcPr>
           <w:p>
             <w:r>
-              <w:t>2026-06-26 02:27:37</w:t>
+              <w:t>2026-06-26 04:17:12</w:t>
             </w:r>
           </w:p>
         </w:tc>
@@ -689,7 +689,7 @@
           </w:tcPr>
           <w:p>
             <w:r>
-              <w:t>46</w:t>
+              <w:t>48</w:t>
             </w:r>
           </w:p>
         </w:tc>
@@ -699,7 +699,7 @@
           </w:tcPr>
           <w:p>
             <w:r>
-              <w:t>67.7</w:t>
+              <w:t>65.8</w:t>
             </w:r>
           </w:p>
         </w:tc>
@@ -709,7 +709,7 @@
           </w:tcPr>
           <w:p>
             <w:r>
-              <w:t>90.6</w:t>
+              <w:t>90.0</w:t>
             </w:r>
           </w:p>
         </w:tc>
@@ -719,7 +719,7 @@
           </w:tcPr>
           <w:p>
             <w:r>
-              <w:t>49.9</w:t>
+              <w:t>53.9</w:t>
             </w:r>
           </w:p>
         </w:tc>
@@ -729,7 +729,7 @@
           </w:tcPr>
           <w:p>
             <w:r>
-              <w:t>69.0</w:t>
+              <w:t>68.9</w:t>
             </w:r>
           </w:p>
         </w:tc>
@@ -739,7 +739,7 @@
           </w:tcPr>
           <w:p>
             <w:r>
-              <w:t>1</w:t>
+              <w:t>224</w:t>
             </w:r>
           </w:p>
         </w:tc>
@@ -751,7 +751,7 @@
           </w:tcPr>
           <w:p>
             <w:r>
-              <w:t>2026-06-26 02:57:41</w:t>
+              <w:t>2026-06-26 04:47:16</w:t>
             </w:r>
           </w:p>
         </w:tc>
@@ -761,7 +761,7 @@
           </w:tcPr>
           <w:p>
             <w:r>
-              <w:t>46</w:t>
+              <w:t>48</w:t>
             </w:r>
           </w:p>
         </w:tc>
@@ -771,7 +771,7 @@
           </w:tcPr>
           <w:p>
             <w:r>
-              <w:t>67.7</w:t>
+              <w:t>65.8</w:t>
             </w:r>
           </w:p>
         </w:tc>
@@ -781,7 +781,7 @@
           </w:tcPr>
           <w:p>
             <w:r>
-              <w:t>90.3</w:t>
+              <w:t>90.0</w:t>
             </w:r>
           </w:p>
         </w:tc>
@@ -791,7 +791,7 @@
           </w:tcPr>
           <w:p>
             <w:r>
-              <w:t>49.9</w:t>
+              <w:t>53.7</w:t>
             </w:r>
           </w:p>
         </w:tc>
@@ -801,7 +801,7 @@
           </w:tcPr>
           <w:p>
             <w:r>
-              <w:t>68.9</w:t>
+              <w:t>68.8</w:t>
             </w:r>
           </w:p>
         </w:tc>
@@ -811,7 +811,7 @@
           </w:tcPr>
           <w:p>
             <w:r>
-              <w:t>11</w:t>
+              <w:t>29</w:t>
             </w:r>
           </w:p>
         </w:tc>
@@ -823,7 +823,7 @@
           </w:tcPr>
           <w:p>
             <w:r>
-              <w:t>2026-06-26 02:57:53</w:t>
+              <w:t>2026-06-26 05:17:18</w:t>
             </w:r>
           </w:p>
         </w:tc>
@@ -833,7 +833,7 @@
           </w:tcPr>
           <w:p>
             <w:r>
-              <w:t>47</w:t>
+              <w:t>48</w:t>
             </w:r>
           </w:p>
         </w:tc>
@@ -843,7 +843,7 @@
           </w:tcPr>
           <w:p>
             <w:r>
-              <w:t>70.8</w:t>
+              <w:t>65.8</w:t>
             </w:r>
           </w:p>
         </w:tc>
@@ -853,7 +853,7 @@
           </w:tcPr>
           <w:p>
             <w:r>
-              <w:t>90.3</w:t>
+              <w:t>90.1</w:t>
             </w:r>
           </w:p>
         </w:tc>
@@ -863,7 +863,7 @@
           </w:tcPr>
           <w:p>
             <w:r>
-              <w:t>51.5</w:t>
+              <w:t>53.9</w:t>
             </w:r>
           </w:p>
         </w:tc>
@@ -873,7 +873,7 @@
           </w:tcPr>
           <w:p>
             <w:r>
-              <w:t>70.8</w:t>
+              <w:t>68.9</w:t>
             </w:r>
           </w:p>
         </w:tc>
@@ -883,7 +883,7 @@
           </w:tcPr>
           <w:p>
             <w:r>
-              <w:t>14</w:t>
+              <w:t>48</w:t>
             </w:r>
           </w:p>
         </w:tc>
@@ -895,7 +895,7 @@
           </w:tcPr>
           <w:p>
             <w:r>
-              <w:t>2026-06-26 03:27:55</w:t>
+              <w:t>2026-06-26 05:47:21</w:t>
             </w:r>
           </w:p>
         </w:tc>
@@ -905,7 +905,7 @@
           </w:tcPr>
           <w:p>
             <w:r>
-              <w:t>47</w:t>
+              <w:t>48</w:t>
             </w:r>
           </w:p>
         </w:tc>
@@ -915,7 +915,7 @@
           </w:tcPr>
           <w:p>
             <w:r>
-              <w:t>70.8</w:t>
+              <w:t>65.8</w:t>
             </w:r>
           </w:p>
         </w:tc>
@@ -925,7 +925,7 @@
           </w:tcPr>
           <w:p>
             <w:r>
-              <w:t>90.2</w:t>
+              <w:t>90.1</w:t>
             </w:r>
           </w:p>
         </w:tc>
@@ -935,7 +935,7 @@
           </w:tcPr>
           <w:p>
             <w:r>
-              <w:t>51.5</w:t>
+              <w:t>53.7</w:t>
             </w:r>
           </w:p>
         </w:tc>
@@ -945,7 +945,7 @@
           </w:tcPr>
           <w:p>
             <w:r>
-              <w:t>70.8</w:t>
+              <w:t>68.8</w:t>
             </w:r>
           </w:p>
         </w:tc>
@@ -955,7 +955,7 @@
           </w:tcPr>
           <w:p>
             <w:r>
-              <w:t>21</w:t>
+              <w:t>483</w:t>
             </w:r>
           </w:p>
         </w:tc>
@@ -967,7 +967,7 @@
           </w:tcPr>
           <w:p>
             <w:r>
-              <w:t>2026-06-26 03:47:11</w:t>
+              <w:t>2026-06-26 06:17:24</w:t>
             </w:r>
           </w:p>
         </w:tc>
@@ -997,7 +997,7 @@
           </w:tcPr>
           <w:p>
             <w:r>
-              <w:t>90.0</w:t>
+              <w:t>90.1</w:t>
             </w:r>
           </w:p>
         </w:tc>
@@ -1007,7 +1007,7 @@
           </w:tcPr>
           <w:p>
             <w:r>
-              <w:t>53.7</w:t>
+              <w:t>53.5</w:t>
             </w:r>
           </w:p>
         </w:tc>
@@ -1027,7 +1027,7 @@
           </w:tcPr>
           <w:p>
             <w:r>
-              <w:t>310</w:t>
+              <w:t>268</w:t>
             </w:r>
           </w:p>
         </w:tc>
@@ -1039,7 +1039,7 @@
           </w:tcPr>
           <w:p>
             <w:r>
-              <w:t>2026-06-26 04:17:12</w:t>
+              <w:t>2026-06-26 06:47:28</w:t>
             </w:r>
           </w:p>
         </w:tc>
@@ -1069,7 +1069,7 @@
           </w:tcPr>
           <w:p>
             <w:r>
-              <w:t>90.0</w:t>
+              <w:t>90.2</w:t>
             </w:r>
           </w:p>
         </w:tc>
@@ -1079,7 +1079,7 @@
           </w:tcPr>
           <w:p>
             <w:r>
-              <w:t>53.9</w:t>
+              <w:t>53.3</w:t>
             </w:r>
           </w:p>
         </w:tc>
@@ -1089,7 +1089,7 @@
           </w:tcPr>
           <w:p>
             <w:r>
-              <w:t>68.9</w:t>
+              <w:t>68.8</w:t>
             </w:r>
           </w:p>
         </w:tc>
@@ -1099,7 +1099,7 @@
           </w:tcPr>
           <w:p>
             <w:r>
-              <w:t>224</w:t>
+              <w:t>698</w:t>
             </w:r>
           </w:p>
         </w:tc>
@@ -1111,7 +1111,7 @@
           </w:tcPr>
           <w:p>
             <w:r>
-              <w:t>2026-06-26 04:47:16</w:t>
+              <w:t>2026-06-26 07:17:32</w:t>
             </w:r>
           </w:p>
         </w:tc>
@@ -1141,7 +1141,7 @@
           </w:tcPr>
           <w:p>
             <w:r>
-              <w:t>90.0</w:t>
+              <w:t>90.2</w:t>
             </w:r>
           </w:p>
         </w:tc>
@@ -1151,7 +1151,7 @@
           </w:tcPr>
           <w:p>
             <w:r>
-              <w:t>53.7</w:t>
+              <w:t>53.1</w:t>
             </w:r>
           </w:p>
         </w:tc>
@@ -1161,7 +1161,7 @@
           </w:tcPr>
           <w:p>
             <w:r>
-              <w:t>68.8</w:t>
+              <w:t>68.7</w:t>
             </w:r>
           </w:p>
         </w:tc>
@@ -1171,7 +1171,7 @@
           </w:tcPr>
           <w:p>
             <w:r>
-              <w:t>29</w:t>
+              <w:t>46</w:t>
             </w:r>
           </w:p>
         </w:tc>
@@ -1183,7 +1183,7 @@
           </w:tcPr>
           <w:p>
             <w:r>
-              <w:t>2026-06-26 05:17:18</w:t>
+              <w:t>2026-06-26 07:47:33</w:t>
             </w:r>
           </w:p>
         </w:tc>
@@ -1213,7 +1213,7 @@
           </w:tcPr>
           <w:p>
             <w:r>
-              <w:t>90.1</w:t>
+              <w:t>90.2</w:t>
             </w:r>
           </w:p>
         </w:tc>
@@ -1223,7 +1223,7 @@
           </w:tcPr>
           <w:p>
             <w:r>
-              <w:t>53.9</w:t>
+              <w:t>53.5</w:t>
             </w:r>
           </w:p>
         </w:tc>
@@ -1233,7 +1233,7 @@
           </w:tcPr>
           <w:p>
             <w:r>
-              <w:t>68.9</w:t>
+              <w:t>68.8</w:t>
             </w:r>
           </w:p>
         </w:tc>
@@ -1243,7 +1243,7 @@
           </w:tcPr>
           <w:p>
             <w:r>
-              <w:t>48</w:t>
+              <w:t>474</w:t>
             </w:r>
           </w:p>
         </w:tc>
@@ -1255,7 +1255,7 @@
           </w:tcPr>
           <w:p>
             <w:r>
-              <w:t>2026-06-26 05:47:21</w:t>
+              <w:t>2026-06-26 08:17:34</w:t>
             </w:r>
           </w:p>
         </w:tc>
@@ -1285,7 +1285,7 @@
           </w:tcPr>
           <w:p>
             <w:r>
-              <w:t>90.1</w:t>
+              <w:t>90.2</w:t>
             </w:r>
           </w:p>
         </w:tc>
@@ -1295,7 +1295,7 @@
           </w:tcPr>
           <w:p>
             <w:r>
-              <w:t>53.7</w:t>
+              <w:t>53.5</w:t>
             </w:r>
           </w:p>
         </w:tc>
@@ -1315,7 +1315,7 @@
           </w:tcPr>
           <w:p>
             <w:r>
-              <w:t>483</w:t>
+              <w:t>907</w:t>
             </w:r>
           </w:p>
         </w:tc>
@@ -1327,7 +1327,7 @@
           </w:tcPr>
           <w:p>
             <w:r>
-              <w:t>2026-06-26 06:17:24</w:t>
+              <w:t>2026-06-26 08:47:35</w:t>
             </w:r>
           </w:p>
         </w:tc>
@@ -1357,7 +1357,7 @@
           </w:tcPr>
           <w:p>
             <w:r>
-              <w:t>90.1</w:t>
+              <w:t>90.2</w:t>
             </w:r>
           </w:p>
         </w:tc>
@@ -1367,7 +1367,7 @@
           </w:tcPr>
           <w:p>
             <w:r>
-              <w:t>53.5</w:t>
+              <w:t>53.8</w:t>
             </w:r>
           </w:p>
         </w:tc>
@@ -1377,7 +1377,7 @@
           </w:tcPr>
           <w:p>
             <w:r>
-              <w:t>68.8</w:t>
+              <w:t>68.9</w:t>
             </w:r>
           </w:p>
         </w:tc>
@@ -1387,7 +1387,7 @@
           </w:tcPr>
           <w:p>
             <w:r>
-              <w:t>268</w:t>
+              <w:t>1342</w:t>
             </w:r>
           </w:p>
         </w:tc>
@@ -1399,7 +1399,7 @@
           </w:tcPr>
           <w:p>
             <w:r>
-              <w:t>2026-06-26 06:47:28</w:t>
+              <w:t>2026-06-26 09:17:36</w:t>
             </w:r>
           </w:p>
         </w:tc>
@@ -1429,7 +1429,7 @@
           </w:tcPr>
           <w:p>
             <w:r>
-              <w:t>90.2</w:t>
+              <w:t>90.3</w:t>
             </w:r>
           </w:p>
         </w:tc>
@@ -1439,7 +1439,7 @@
           </w:tcPr>
           <w:p>
             <w:r>
-              <w:t>53.3</w:t>
+              <w:t>53.9</w:t>
             </w:r>
           </w:p>
         </w:tc>
@@ -1449,7 +1449,7 @@
           </w:tcPr>
           <w:p>
             <w:r>
-              <w:t>68.8</w:t>
+              <w:t>68.9</w:t>
             </w:r>
           </w:p>
         </w:tc>
@@ -1459,7 +1459,7 @@
           </w:tcPr>
           <w:p>
             <w:r>
-              <w:t>698</w:t>
+              <w:t>1780</w:t>
             </w:r>
           </w:p>
         </w:tc>
@@ -1471,7 +1471,7 @@
           </w:tcPr>
           <w:p>
             <w:r>
-              <w:t>2026-06-26 07:17:32</w:t>
+              <w:t>2026-06-26 09:47:37</w:t>
             </w:r>
           </w:p>
         </w:tc>
@@ -1501,7 +1501,7 @@
           </w:tcPr>
           <w:p>
             <w:r>
-              <w:t>90.2</w:t>
+              <w:t>90.3</w:t>
             </w:r>
           </w:p>
         </w:tc>
@@ -1511,7 +1511,7 @@
           </w:tcPr>
           <w:p>
             <w:r>
-              <w:t>53.1</w:t>
+              <w:t>53.9</w:t>
             </w:r>
           </w:p>
         </w:tc>
@@ -1521,7 +1521,7 @@
           </w:tcPr>
           <w:p>
             <w:r>
-              <w:t>68.7</w:t>
+              <w:t>68.9</w:t>
             </w:r>
           </w:p>
         </w:tc>
@@ -1531,7 +1531,7 @@
           </w:tcPr>
           <w:p>
             <w:r>
-              <w:t>46</w:t>
+              <w:t>439</w:t>
             </w:r>
           </w:p>
         </w:tc>
@@ -1543,7 +1543,7 @@
           </w:tcPr>
           <w:p>
             <w:r>
-              <w:t>2026-06-26 07:47:33</w:t>
+              <w:t>2026-06-26 10:17:40</w:t>
             </w:r>
           </w:p>
         </w:tc>
@@ -1573,7 +1573,7 @@
           </w:tcPr>
           <w:p>
             <w:r>
-              <w:t>90.2</w:t>
+              <w:t>90.3</w:t>
             </w:r>
           </w:p>
         </w:tc>
@@ -1583,7 +1583,7 @@
           </w:tcPr>
           <w:p>
             <w:r>
-              <w:t>53.5</w:t>
+              <w:t>54.1</w:t>
             </w:r>
           </w:p>
         </w:tc>
@@ -1593,7 +1593,7 @@
           </w:tcPr>
           <w:p>
             <w:r>
-              <w:t>68.8</w:t>
+              <w:t>69.0</w:t>
             </w:r>
           </w:p>
         </w:tc>
@@ -1603,7 +1603,7 @@
           </w:tcPr>
           <w:p>
             <w:r>
-              <w:t>474</w:t>
+              <w:t>878</w:t>
             </w:r>
           </w:p>
         </w:tc>
@@ -1615,7 +1615,7 @@
           </w:tcPr>
           <w:p>
             <w:r>
-              <w:t>2026-06-26 08:17:34</w:t>
+              <w:t>2026-06-26 10:47:41</w:t>
             </w:r>
           </w:p>
         </w:tc>
@@ -1645,7 +1645,7 @@
           </w:tcPr>
           <w:p>
             <w:r>
-              <w:t>90.2</w:t>
+              <w:t>90.3</w:t>
             </w:r>
           </w:p>
         </w:tc>
@@ -1655,7 +1655,7 @@
           </w:tcPr>
           <w:p>
             <w:r>
-              <w:t>53.5</w:t>
+              <w:t>54.3</w:t>
             </w:r>
           </w:p>
         </w:tc>
@@ -1665,7 +1665,7 @@
           </w:tcPr>
           <w:p>
             <w:r>
-              <w:t>68.8</w:t>
+              <w:t>69.0</w:t>
             </w:r>
           </w:p>
         </w:tc>
@@ -1675,7 +1675,7 @@
           </w:tcPr>
           <w:p>
             <w:r>
-              <w:t>907</w:t>
+              <w:t>1316</w:t>
             </w:r>
           </w:p>
         </w:tc>
@@ -1687,7 +1687,7 @@
           </w:tcPr>
           <w:p>
             <w:r>
-              <w:t>2026-06-26 08:47:35</w:t>
+              <w:t>2026-06-26 11:17:43</w:t>
             </w:r>
           </w:p>
         </w:tc>
@@ -1717,7 +1717,7 @@
           </w:tcPr>
           <w:p>
             <w:r>
-              <w:t>90.2</w:t>
+              <w:t>90.3</w:t>
             </w:r>
           </w:p>
         </w:tc>
@@ -1727,7 +1727,7 @@
           </w:tcPr>
           <w:p>
             <w:r>
-              <w:t>53.8</w:t>
+              <w:t>54.1</w:t>
             </w:r>
           </w:p>
         </w:tc>
@@ -1737,7 +1737,7 @@
           </w:tcPr>
           <w:p>
             <w:r>
-              <w:t>68.9</w:t>
+              <w:t>69.0</w:t>
             </w:r>
           </w:p>
         </w:tc>
@@ -1747,7 +1747,7 @@
           </w:tcPr>
           <w:p>
             <w:r>
-              <w:t>1342</w:t>
+              <w:t>1753</w:t>
             </w:r>
           </w:p>
         </w:tc>
@@ -3319,7 +3319,7 @@
           </w:tcPr>
           <w:p>
             <w:r>
-              <w:t>95.1</w:t>
+              <w:t>95.5</w:t>
             </w:r>
           </w:p>
         </w:tc>
@@ -3433,17 +3433,17 @@
     </w:tbl>
     <w:p>
       <w:r>
-        <w:t>Ticks: 1750 · Reconciled: True · Readiness: not_ready</w:t>
+        <w:t>Ticks: 1769 · Reconciled: True · Readiness: not_ready</w:t>
       </w:r>
     </w:p>
     <w:p>
       <w:r>
-        <w:t>Candidates created: 27437 · Terminals: {'accepted': 48, 'rejected': 23604, 'skipped': 3668, 'expired': 0, 'missing_data': 117}</w:t>
+        <w:t>Candidates created: 31043 · Terminals: {'accepted': 48, 'rejected': 26998, 'skipped': 3878, 'expired': 0, 'missing_data': 119}</w:t>
       </w:r>
     </w:p>
     <w:p>
       <w:r>
-        <w:t>Rejected by stage: {'directional': 15398, 'execution_gate': 135, 'context_gate': 827, 'directional_allowlist': 1364, 'down_bias_gate': 538, 'mtf_gate': 275, 'grok_decider': 3540, 'execution_realistic': 3, 'verifier': 61, 'mispricing_gate': 50, 'baseline_cohort_gate': 1413}</w:t>
+        <w:t>Rejected by stage: {'directional': 18327, 'execution_gate': 135, 'context_gate': 855, 'directional_allowlist': 1364, 'down_bias_gate': 538, 'mtf_gate': 275, 'grok_decider': 3540, 'execution_realistic': 3, 'verifier': 61, 'mispricing_gate': 50, 'baseline_cohort_gate': 1850}</w:t>
       </w:r>
     </w:p>
     <w:p>
@@ -4018,7 +4018,7 @@
     </w:p>
     <w:p>
       <w:r>
-        <w:t>Section score: 53.9 / 100  (Grade: F)</w:t>
+        <w:t>Section score: 54.1 / 100  (Grade: F)</w:t>
       </w:r>
     </w:p>
     <w:p>
@@ -4161,7 +4161,7 @@
           </w:tcPr>
           <w:p>
             <w:r>
-              <w:t>6.2</w:t>
+              <w:t>7.5</w:t>
             </w:r>
           </w:p>
         </w:tc>
@@ -4171,7 +4171,7 @@
           </w:tcPr>
           <w:p>
             <w:r>
-              <w:t>0.9</w:t>
+              <w:t>1.1</w:t>
             </w:r>
           </w:p>
         </w:tc>
@@ -4374,7 +4374,7 @@
           </w:tcPr>
           <w:p>
             <w:r>
-              <w:t>0.4915</w:t>
+              <w:t>0.5000</w:t>
             </w:r>
           </w:p>
         </w:tc>
@@ -4396,7 +4396,7 @@
           </w:tcPr>
           <w:p>
             <w:r>
-              <w:t>0.4920</w:t>
+              <w:t>0.5159</w:t>
             </w:r>
           </w:p>
         </w:tc>
@@ -4426,7 +4426,7 @@
     </w:tbl>
     <w:p>
       <w:r>
-        <w:t>TV alerts: received 934 · valid 923 · rejected 11</w:t>
+        <w:t>TV alerts: received 1005 · valid 994 · rejected 11</w:t>
       </w:r>
     </w:p>
     <w:sectPr>

</xml_diff>

<commit_message>
chore(reports): VPS full report 2026-06-26 20:05 UTC (72 settled, WR 66.7%, PF 1.2301)
</commit_message>
<xml_diff>
--- a/vps_full_reports/latest/report.docx
+++ b/vps_full_reports/latest/report.docx
@@ -20,7 +20,7 @@
           <w:color w:val="666666"/>
           <w:sz w:val="20"/>
         </w:rPr>
-        <w:t>PAPER ONLY  ·  reconciled=True  ·  ticks=775</w:t>
+        <w:t>PAPER ONLY  ·  reconciled=True  ·  ticks=273</w:t>
       </w:r>
     </w:p>
     <w:p>
@@ -33,7 +33,7 @@
     </w:p>
     <w:p>
       <w:r>
-        <w:t>Overall score: 71.1 / 100  (Grade: C)</w:t>
+        <w:t>Overall score: 72.5 / 100  (Grade: C)</w:t>
       </w:r>
     </w:p>
     <w:tbl>
@@ -107,7 +107,7 @@
           </w:tcPr>
           <w:p>
             <w:r>
-              <w:t>78.4</w:t>
+              <w:t>81.7</w:t>
             </w:r>
           </w:p>
         </w:tc>
@@ -117,7 +117,7 @@
           </w:tcPr>
           <w:p>
             <w:r>
-              <w:t>C+</w:t>
+              <w:t>B</w:t>
             </w:r>
           </w:p>
         </w:tc>
@@ -191,7 +191,7 @@
           </w:tcPr>
           <w:p>
             <w:r>
-              <w:t>37.1</w:t>
+              <w:t>36.4</w:t>
             </w:r>
           </w:p>
         </w:tc>
@@ -319,7 +319,7 @@
           </w:tcPr>
           <w:p>
             <w:r>
-              <w:t>2026-06-26 15:43:06</w:t>
+              <w:t>2026-06-26 16:00:05</w:t>
             </w:r>
           </w:p>
         </w:tc>
@@ -329,7 +329,7 @@
           </w:tcPr>
           <w:p>
             <w:r>
-              <w:t>51</w:t>
+              <w:t>54</w:t>
             </w:r>
           </w:p>
         </w:tc>
@@ -339,7 +339,7 @@
           </w:tcPr>
           <w:p>
             <w:r>
-              <w:t>69.6</w:t>
+              <w:t>69.5</w:t>
             </w:r>
           </w:p>
         </w:tc>
@@ -359,7 +359,7 @@
           </w:tcPr>
           <w:p>
             <w:r>
-              <w:t>42.2</w:t>
+              <w:t>42.3</w:t>
             </w:r>
           </w:p>
         </w:tc>
@@ -379,7 +379,7 @@
           </w:tcPr>
           <w:p>
             <w:r>
-              <w:t>488</w:t>
+              <w:t>729</w:t>
             </w:r>
           </w:p>
         </w:tc>
@@ -391,7 +391,7 @@
           </w:tcPr>
           <w:p>
             <w:r>
-              <w:t>2026-06-26 15:45:06</w:t>
+              <w:t>2026-06-26 16:15:33</w:t>
             </w:r>
           </w:p>
         </w:tc>
@@ -401,7 +401,7 @@
           </w:tcPr>
           <w:p>
             <w:r>
-              <w:t>52</w:t>
+              <w:t>55</w:t>
             </w:r>
           </w:p>
         </w:tc>
@@ -411,7 +411,7 @@
           </w:tcPr>
           <w:p>
             <w:r>
-              <w:t>65.9</w:t>
+              <w:t>71.5</w:t>
             </w:r>
           </w:p>
         </w:tc>
@@ -431,7 +431,7 @@
           </w:tcPr>
           <w:p>
             <w:r>
-              <w:t>43.5</w:t>
+              <w:t>41.3</w:t>
             </w:r>
           </w:p>
         </w:tc>
@@ -441,7 +441,7 @@
           </w:tcPr>
           <w:p>
             <w:r>
-              <w:t>66.4</w:t>
+              <w:t>68.7</w:t>
             </w:r>
           </w:p>
         </w:tc>
@@ -451,7 +451,7 @@
           </w:tcPr>
           <w:p>
             <w:r>
-              <w:t>517</w:t>
+              <w:t>928</w:t>
             </w:r>
           </w:p>
         </w:tc>
@@ -463,7 +463,7 @@
           </w:tcPr>
           <w:p>
             <w:r>
-              <w:t>2026-06-26 15:48:05</w:t>
+              <w:t>2026-06-26 16:28:05</w:t>
             </w:r>
           </w:p>
         </w:tc>
@@ -473,7 +473,7 @@
           </w:tcPr>
           <w:p>
             <w:r>
-              <w:t>53</w:t>
+              <w:t>56</w:t>
             </w:r>
           </w:p>
         </w:tc>
@@ -483,7 +483,7 @@
           </w:tcPr>
           <w:p>
             <w:r>
-              <w:t>67.6</w:t>
+              <w:t>73.4</w:t>
             </w:r>
           </w:p>
         </w:tc>
@@ -503,7 +503,7 @@
           </w:tcPr>
           <w:p>
             <w:r>
-              <w:t>43.6</w:t>
+              <w:t>41.4</w:t>
             </w:r>
           </w:p>
         </w:tc>
@@ -513,7 +513,7 @@
           </w:tcPr>
           <w:p>
             <w:r>
-              <w:t>67.3</w:t>
+              <w:t>69.6</w:t>
             </w:r>
           </w:p>
         </w:tc>
@@ -523,7 +523,7 @@
           </w:tcPr>
           <w:p>
             <w:r>
-              <w:t>552</w:t>
+              <w:t>48</w:t>
             </w:r>
           </w:p>
         </w:tc>
@@ -535,7 +535,7 @@
           </w:tcPr>
           <w:p>
             <w:r>
-              <w:t>2026-06-26 16:00:05</w:t>
+              <w:t>2026-06-26 16:31:57</w:t>
             </w:r>
           </w:p>
         </w:tc>
@@ -545,7 +545,7 @@
           </w:tcPr>
           <w:p>
             <w:r>
-              <w:t>54</w:t>
+              <w:t>57</w:t>
             </w:r>
           </w:p>
         </w:tc>
@@ -555,7 +555,7 @@
           </w:tcPr>
           <w:p>
             <w:r>
-              <w:t>69.5</w:t>
+              <w:t>75.9</w:t>
             </w:r>
           </w:p>
         </w:tc>
@@ -575,7 +575,7 @@
           </w:tcPr>
           <w:p>
             <w:r>
-              <w:t>42.3</w:t>
+              <w:t>40.2</w:t>
             </w:r>
           </w:p>
         </w:tc>
@@ -585,7 +585,7 @@
           </w:tcPr>
           <w:p>
             <w:r>
-              <w:t>67.9</w:t>
+              <w:t>70.6</w:t>
             </w:r>
           </w:p>
         </w:tc>
@@ -595,7 +595,7 @@
           </w:tcPr>
           <w:p>
             <w:r>
-              <w:t>729</w:t>
+              <w:t>101</w:t>
             </w:r>
           </w:p>
         </w:tc>
@@ -607,7 +607,7 @@
           </w:tcPr>
           <w:p>
             <w:r>
-              <w:t>2026-06-26 16:15:33</w:t>
+              <w:t>2026-06-26 16:48:06</w:t>
             </w:r>
           </w:p>
         </w:tc>
@@ -617,7 +617,7 @@
           </w:tcPr>
           <w:p>
             <w:r>
-              <w:t>55</w:t>
+              <w:t>58</w:t>
             </w:r>
           </w:p>
         </w:tc>
@@ -627,7 +627,7 @@
           </w:tcPr>
           <w:p>
             <w:r>
-              <w:t>71.5</w:t>
+              <w:t>77.4</w:t>
             </w:r>
           </w:p>
         </w:tc>
@@ -647,7 +647,7 @@
           </w:tcPr>
           <w:p>
             <w:r>
-              <w:t>41.3</w:t>
+              <w:t>39.4</w:t>
             </w:r>
           </w:p>
         </w:tc>
@@ -657,7 +657,7 @@
           </w:tcPr>
           <w:p>
             <w:r>
-              <w:t>68.7</w:t>
+              <w:t>71.1</w:t>
             </w:r>
           </w:p>
         </w:tc>
@@ -667,7 +667,7 @@
           </w:tcPr>
           <w:p>
             <w:r>
-              <w:t>928</w:t>
+              <w:t>315</w:t>
             </w:r>
           </w:p>
         </w:tc>
@@ -679,7 +679,7 @@
           </w:tcPr>
           <w:p>
             <w:r>
-              <w:t>2026-06-26 16:28:05</w:t>
+              <w:t>2026-06-26 17:17:51</w:t>
             </w:r>
           </w:p>
         </w:tc>
@@ -689,7 +689,7 @@
           </w:tcPr>
           <w:p>
             <w:r>
-              <w:t>56</w:t>
+              <w:t>59</w:t>
             </w:r>
           </w:p>
         </w:tc>
@@ -699,7 +699,7 @@
           </w:tcPr>
           <w:p>
             <w:r>
-              <w:t>73.4</w:t>
+              <w:t>79.3</w:t>
             </w:r>
           </w:p>
         </w:tc>
@@ -719,7 +719,7 @@
           </w:tcPr>
           <w:p>
             <w:r>
-              <w:t>41.4</w:t>
+              <w:t>38.6</w:t>
             </w:r>
           </w:p>
         </w:tc>
@@ -729,7 +729,7 @@
           </w:tcPr>
           <w:p>
             <w:r>
-              <w:t>69.6</w:t>
+              <w:t>71.9</w:t>
             </w:r>
           </w:p>
         </w:tc>
@@ -739,7 +739,7 @@
           </w:tcPr>
           <w:p>
             <w:r>
-              <w:t>48</w:t>
+              <w:t>685</w:t>
             </w:r>
           </w:p>
         </w:tc>
@@ -751,7 +751,7 @@
           </w:tcPr>
           <w:p>
             <w:r>
-              <w:t>2026-06-26 16:31:57</w:t>
+              <w:t>2026-06-26 17:30:41</w:t>
             </w:r>
           </w:p>
         </w:tc>
@@ -761,7 +761,7 @@
           </w:tcPr>
           <w:p>
             <w:r>
-              <w:t>57</w:t>
+              <w:t>60</w:t>
             </w:r>
           </w:p>
         </w:tc>
@@ -771,7 +771,7 @@
           </w:tcPr>
           <w:p>
             <w:r>
-              <w:t>75.9</w:t>
+              <w:t>75.7</w:t>
             </w:r>
           </w:p>
         </w:tc>
@@ -791,7 +791,7 @@
           </w:tcPr>
           <w:p>
             <w:r>
-              <w:t>40.2</w:t>
+              <w:t>38.6</w:t>
             </w:r>
           </w:p>
         </w:tc>
@@ -801,7 +801,7 @@
           </w:tcPr>
           <w:p>
             <w:r>
-              <w:t>70.6</w:t>
+              <w:t>70.1</w:t>
             </w:r>
           </w:p>
         </w:tc>
@@ -811,7 +811,7 @@
           </w:tcPr>
           <w:p>
             <w:r>
-              <w:t>101</w:t>
+              <w:t>1</w:t>
             </w:r>
           </w:p>
         </w:tc>
@@ -823,7 +823,7 @@
           </w:tcPr>
           <w:p>
             <w:r>
-              <w:t>2026-06-26 16:48:06</w:t>
+              <w:t>2026-06-26 17:37:01</w:t>
             </w:r>
           </w:p>
         </w:tc>
@@ -833,7 +833,7 @@
           </w:tcPr>
           <w:p>
             <w:r>
-              <w:t>58</w:t>
+              <w:t>61</w:t>
             </w:r>
           </w:p>
         </w:tc>
@@ -863,7 +863,7 @@
           </w:tcPr>
           <w:p>
             <w:r>
-              <w:t>39.4</w:t>
+              <w:t>38.6</w:t>
             </w:r>
           </w:p>
         </w:tc>
@@ -873,7 +873,7 @@
           </w:tcPr>
           <w:p>
             <w:r>
-              <w:t>71.1</w:t>
+              <w:t>70.9</w:t>
             </w:r>
           </w:p>
         </w:tc>
@@ -883,7 +883,7 @@
           </w:tcPr>
           <w:p>
             <w:r>
-              <w:t>315</w:t>
+              <w:t>88</w:t>
             </w:r>
           </w:p>
         </w:tc>
@@ -895,7 +895,7 @@
           </w:tcPr>
           <w:p>
             <w:r>
-              <w:t>2026-06-26 17:17:51</w:t>
+              <w:t>2026-06-26 17:47:17</w:t>
             </w:r>
           </w:p>
         </w:tc>
@@ -905,7 +905,7 @@
           </w:tcPr>
           <w:p>
             <w:r>
-              <w:t>59</w:t>
+              <w:t>62</w:t>
             </w:r>
           </w:p>
         </w:tc>
@@ -915,7 +915,7 @@
           </w:tcPr>
           <w:p>
             <w:r>
-              <w:t>79.3</w:t>
+              <w:t>79.2</w:t>
             </w:r>
           </w:p>
         </w:tc>
@@ -945,7 +945,7 @@
           </w:tcPr>
           <w:p>
             <w:r>
-              <w:t>71.9</w:t>
+              <w:t>71.8</w:t>
             </w:r>
           </w:p>
         </w:tc>
@@ -955,7 +955,7 @@
           </w:tcPr>
           <w:p>
             <w:r>
-              <w:t>685</w:t>
+              <w:t>237</w:t>
             </w:r>
           </w:p>
         </w:tc>
@@ -967,7 +967,7 @@
           </w:tcPr>
           <w:p>
             <w:r>
-              <w:t>2026-06-26 17:30:41</w:t>
+              <w:t>2026-06-26 17:48:04</w:t>
             </w:r>
           </w:p>
         </w:tc>
@@ -977,7 +977,7 @@
           </w:tcPr>
           <w:p>
             <w:r>
-              <w:t>60</w:t>
+              <w:t>63</w:t>
             </w:r>
           </w:p>
         </w:tc>
@@ -987,7 +987,7 @@
           </w:tcPr>
           <w:p>
             <w:r>
-              <w:t>75.7</w:t>
+              <w:t>75.8</w:t>
             </w:r>
           </w:p>
         </w:tc>
@@ -1027,7 +1027,7 @@
           </w:tcPr>
           <w:p>
             <w:r>
-              <w:t>1</w:t>
+              <w:t>249</w:t>
             </w:r>
           </w:p>
         </w:tc>
@@ -1039,7 +1039,7 @@
           </w:tcPr>
           <w:p>
             <w:r>
-              <w:t>2026-06-26 17:37:01</w:t>
+              <w:t>2026-06-26 17:50:49</w:t>
             </w:r>
           </w:p>
         </w:tc>
@@ -1049,7 +1049,7 @@
           </w:tcPr>
           <w:p>
             <w:r>
-              <w:t>61</w:t>
+              <w:t>64</w:t>
             </w:r>
           </w:p>
         </w:tc>
@@ -1059,7 +1059,7 @@
           </w:tcPr>
           <w:p>
             <w:r>
-              <w:t>77.4</w:t>
+              <w:t>78.4</w:t>
             </w:r>
           </w:p>
         </w:tc>
@@ -1079,7 +1079,7 @@
           </w:tcPr>
           <w:p>
             <w:r>
-              <w:t>38.6</w:t>
+              <w:t>37.7</w:t>
             </w:r>
           </w:p>
         </w:tc>
@@ -1089,7 +1089,7 @@
           </w:tcPr>
           <w:p>
             <w:r>
-              <w:t>70.9</w:t>
+              <w:t>71.2</w:t>
             </w:r>
           </w:p>
         </w:tc>
@@ -1099,7 +1099,7 @@
           </w:tcPr>
           <w:p>
             <w:r>
-              <w:t>88</w:t>
+              <w:t>290</w:t>
             </w:r>
           </w:p>
         </w:tc>
@@ -1111,7 +1111,7 @@
           </w:tcPr>
           <w:p>
             <w:r>
-              <w:t>2026-06-26 17:47:17</w:t>
+              <w:t>2026-06-26 17:58:04</w:t>
             </w:r>
           </w:p>
         </w:tc>
@@ -1121,7 +1121,7 @@
           </w:tcPr>
           <w:p>
             <w:r>
-              <w:t>62</w:t>
+              <w:t>65</w:t>
             </w:r>
           </w:p>
         </w:tc>
@@ -1131,7 +1131,7 @@
           </w:tcPr>
           <w:p>
             <w:r>
-              <w:t>79.2</w:t>
+              <w:t>75.0</w:t>
             </w:r>
           </w:p>
         </w:tc>
@@ -1151,7 +1151,7 @@
           </w:tcPr>
           <w:p>
             <w:r>
-              <w:t>38.6</w:t>
+              <w:t>37.7</w:t>
             </w:r>
           </w:p>
         </w:tc>
@@ -1161,7 +1161,7 @@
           </w:tcPr>
           <w:p>
             <w:r>
-              <w:t>71.8</w:t>
+              <w:t>69.5</w:t>
             </w:r>
           </w:p>
         </w:tc>
@@ -1171,7 +1171,7 @@
           </w:tcPr>
           <w:p>
             <w:r>
-              <w:t>237</w:t>
+              <w:t>399</w:t>
             </w:r>
           </w:p>
         </w:tc>
@@ -1183,7 +1183,7 @@
           </w:tcPr>
           <w:p>
             <w:r>
-              <w:t>2026-06-26 17:48:04</w:t>
+              <w:t>2026-06-26 18:03:04</w:t>
             </w:r>
           </w:p>
         </w:tc>
@@ -1193,7 +1193,7 @@
           </w:tcPr>
           <w:p>
             <w:r>
-              <w:t>63</w:t>
+              <w:t>66</w:t>
             </w:r>
           </w:p>
         </w:tc>
@@ -1203,7 +1203,7 @@
           </w:tcPr>
           <w:p>
             <w:r>
-              <w:t>75.8</w:t>
+              <w:t>76.8</w:t>
             </w:r>
           </w:p>
         </w:tc>
@@ -1223,7 +1223,7 @@
           </w:tcPr>
           <w:p>
             <w:r>
-              <w:t>38.6</w:t>
+              <w:t>36.9</w:t>
             </w:r>
           </w:p>
         </w:tc>
@@ -1233,7 +1233,7 @@
           </w:tcPr>
           <w:p>
             <w:r>
-              <w:t>70.1</w:t>
+              <w:t>70.2</w:t>
             </w:r>
           </w:p>
         </w:tc>
@@ -1243,7 +1243,7 @@
           </w:tcPr>
           <w:p>
             <w:r>
-              <w:t>249</w:t>
+              <w:t>30</w:t>
             </w:r>
           </w:p>
         </w:tc>
@@ -1255,7 +1255,7 @@
           </w:tcPr>
           <w:p>
             <w:r>
-              <w:t>2026-06-26 17:50:49</w:t>
+              <w:t>2026-06-26 18:32:46</w:t>
             </w:r>
           </w:p>
         </w:tc>
@@ -1265,7 +1265,7 @@
           </w:tcPr>
           <w:p>
             <w:r>
-              <w:t>64</w:t>
+              <w:t>67</w:t>
             </w:r>
           </w:p>
         </w:tc>
@@ -1275,7 +1275,7 @@
           </w:tcPr>
           <w:p>
             <w:r>
-              <w:t>78.4</w:t>
+              <w:t>78.8</w:t>
             </w:r>
           </w:p>
         </w:tc>
@@ -1295,7 +1295,7 @@
           </w:tcPr>
           <w:p>
             <w:r>
-              <w:t>37.7</w:t>
+              <w:t>37.0</w:t>
             </w:r>
           </w:p>
         </w:tc>
@@ -1315,7 +1315,7 @@
           </w:tcPr>
           <w:p>
             <w:r>
-              <w:t>290</w:t>
+              <w:t>98</w:t>
             </w:r>
           </w:p>
         </w:tc>
@@ -1327,7 +1327,7 @@
           </w:tcPr>
           <w:p>
             <w:r>
-              <w:t>2026-06-26 17:58:04</w:t>
+              <w:t>2026-06-26 18:38:05</w:t>
             </w:r>
           </w:p>
         </w:tc>
@@ -1337,7 +1337,7 @@
           </w:tcPr>
           <w:p>
             <w:r>
-              <w:t>65</w:t>
+              <w:t>68</w:t>
             </w:r>
           </w:p>
         </w:tc>
@@ -1347,7 +1347,7 @@
           </w:tcPr>
           <w:p>
             <w:r>
-              <w:t>75.0</w:t>
+              <w:t>75.5</w:t>
             </w:r>
           </w:p>
         </w:tc>
@@ -1367,7 +1367,7 @@
           </w:tcPr>
           <w:p>
             <w:r>
-              <w:t>37.7</w:t>
+              <w:t>37.0</w:t>
             </w:r>
           </w:p>
         </w:tc>
@@ -1377,7 +1377,7 @@
           </w:tcPr>
           <w:p>
             <w:r>
-              <w:t>69.5</w:t>
+              <w:t>69.6</w:t>
             </w:r>
           </w:p>
         </w:tc>
@@ -1387,7 +1387,7 @@
           </w:tcPr>
           <w:p>
             <w:r>
-              <w:t>399</w:t>
+              <w:t>175</w:t>
             </w:r>
           </w:p>
         </w:tc>
@@ -1399,7 +1399,7 @@
           </w:tcPr>
           <w:p>
             <w:r>
-              <w:t>2026-06-26 18:03:04</w:t>
+              <w:t>2026-06-26 18:42:04</w:t>
             </w:r>
           </w:p>
         </w:tc>
@@ -1409,7 +1409,7 @@
           </w:tcPr>
           <w:p>
             <w:r>
-              <w:t>66</w:t>
+              <w:t>69</w:t>
             </w:r>
           </w:p>
         </w:tc>
@@ -1419,7 +1419,7 @@
           </w:tcPr>
           <w:p>
             <w:r>
-              <w:t>76.8</w:t>
+              <w:t>76.9</w:t>
             </w:r>
           </w:p>
         </w:tc>
@@ -1439,7 +1439,7 @@
           </w:tcPr>
           <w:p>
             <w:r>
-              <w:t>36.9</w:t>
+              <w:t>37.0</w:t>
             </w:r>
           </w:p>
         </w:tc>
@@ -1449,7 +1449,7 @@
           </w:tcPr>
           <w:p>
             <w:r>
-              <w:t>70.2</w:t>
+              <w:t>70.3</w:t>
             </w:r>
           </w:p>
         </w:tc>
@@ -1459,7 +1459,7 @@
           </w:tcPr>
           <w:p>
             <w:r>
-              <w:t>30</w:t>
+              <w:t>229</w:t>
             </w:r>
           </w:p>
         </w:tc>
@@ -1471,7 +1471,7 @@
           </w:tcPr>
           <w:p>
             <w:r>
-              <w:t>2026-06-26 18:32:46</w:t>
+              <w:t>2026-06-26 18:57:18</w:t>
             </w:r>
           </w:p>
         </w:tc>
@@ -1481,7 +1481,7 @@
           </w:tcPr>
           <w:p>
             <w:r>
-              <w:t>67</w:t>
+              <w:t>70</w:t>
             </w:r>
           </w:p>
         </w:tc>
@@ -1491,7 +1491,7 @@
           </w:tcPr>
           <w:p>
             <w:r>
-              <w:t>78.8</w:t>
+              <w:t>78.4</w:t>
             </w:r>
           </w:p>
         </w:tc>
@@ -1501,7 +1501,7 @@
           </w:tcPr>
           <w:p>
             <w:r>
-              <w:t>90.3</w:t>
+              <w:t>90.4</w:t>
             </w:r>
           </w:p>
         </w:tc>
@@ -1511,7 +1511,7 @@
           </w:tcPr>
           <w:p>
             <w:r>
-              <w:t>37.0</w:t>
+              <w:t>37.1</w:t>
             </w:r>
           </w:p>
         </w:tc>
@@ -1521,7 +1521,7 @@
           </w:tcPr>
           <w:p>
             <w:r>
-              <w:t>71.2</w:t>
+              <w:t>71.1</w:t>
             </w:r>
           </w:p>
         </w:tc>
@@ -1531,7 +1531,7 @@
           </w:tcPr>
           <w:p>
             <w:r>
-              <w:t>98</w:t>
+              <w:t>420</w:t>
             </w:r>
           </w:p>
         </w:tc>
@@ -1543,7 +1543,7 @@
           </w:tcPr>
           <w:p>
             <w:r>
-              <w:t>2026-06-26 18:38:05</w:t>
+              <w:t>2026-06-26 19:27:22</w:t>
             </w:r>
           </w:p>
         </w:tc>
@@ -1553,7 +1553,7 @@
           </w:tcPr>
           <w:p>
             <w:r>
-              <w:t>68</w:t>
+              <w:t>70</w:t>
             </w:r>
           </w:p>
         </w:tc>
@@ -1563,7 +1563,7 @@
           </w:tcPr>
           <w:p>
             <w:r>
-              <w:t>75.5</w:t>
+              <w:t>78.4</w:t>
             </w:r>
           </w:p>
         </w:tc>
@@ -1573,7 +1573,7 @@
           </w:tcPr>
           <w:p>
             <w:r>
-              <w:t>90.3</w:t>
+              <w:t>90.4</w:t>
             </w:r>
           </w:p>
         </w:tc>
@@ -1583,7 +1583,7 @@
           </w:tcPr>
           <w:p>
             <w:r>
-              <w:t>37.0</w:t>
+              <w:t>37.1</w:t>
             </w:r>
           </w:p>
         </w:tc>
@@ -1593,7 +1593,7 @@
           </w:tcPr>
           <w:p>
             <w:r>
-              <w:t>69.6</w:t>
+              <w:t>71.1</w:t>
             </w:r>
           </w:p>
         </w:tc>
@@ -1603,7 +1603,7 @@
           </w:tcPr>
           <w:p>
             <w:r>
-              <w:t>175</w:t>
+              <w:t>793</w:t>
             </w:r>
           </w:p>
         </w:tc>
@@ -1615,7 +1615,7 @@
           </w:tcPr>
           <w:p>
             <w:r>
-              <w:t>2026-06-26 18:42:04</w:t>
+              <w:t>2026-06-26 19:44:43</w:t>
             </w:r>
           </w:p>
         </w:tc>
@@ -1625,7 +1625,7 @@
           </w:tcPr>
           <w:p>
             <w:r>
-              <w:t>69</w:t>
+              <w:t>71</w:t>
             </w:r>
           </w:p>
         </w:tc>
@@ -1635,7 +1635,7 @@
           </w:tcPr>
           <w:p>
             <w:r>
-              <w:t>76.9</w:t>
+              <w:t>80.0</w:t>
             </w:r>
           </w:p>
         </w:tc>
@@ -1645,7 +1645,7 @@
           </w:tcPr>
           <w:p>
             <w:r>
-              <w:t>90.3</w:t>
+              <w:t>90.4</w:t>
             </w:r>
           </w:p>
         </w:tc>
@@ -1655,7 +1655,7 @@
           </w:tcPr>
           <w:p>
             <w:r>
-              <w:t>37.0</w:t>
+              <w:t>36.4</w:t>
             </w:r>
           </w:p>
         </w:tc>
@@ -1665,7 +1665,7 @@
           </w:tcPr>
           <w:p>
             <w:r>
-              <w:t>70.3</w:t>
+              <w:t>71.7</w:t>
             </w:r>
           </w:p>
         </w:tc>
@@ -1675,7 +1675,7 @@
           </w:tcPr>
           <w:p>
             <w:r>
-              <w:t>229</w:t>
+              <w:t>1</w:t>
             </w:r>
           </w:p>
         </w:tc>
@@ -1687,7 +1687,7 @@
           </w:tcPr>
           <w:p>
             <w:r>
-              <w:t>2026-06-26 18:57:18</w:t>
+              <w:t>2026-06-26 20:03:09</w:t>
             </w:r>
           </w:p>
         </w:tc>
@@ -1697,7 +1697,7 @@
           </w:tcPr>
           <w:p>
             <w:r>
-              <w:t>70</w:t>
+              <w:t>72</w:t>
             </w:r>
           </w:p>
         </w:tc>
@@ -1707,7 +1707,7 @@
           </w:tcPr>
           <w:p>
             <w:r>
-              <w:t>78.4</w:t>
+              <w:t>81.7</w:t>
             </w:r>
           </w:p>
         </w:tc>
@@ -1727,7 +1727,7 @@
           </w:tcPr>
           <w:p>
             <w:r>
-              <w:t>37.1</w:t>
+              <w:t>36.4</w:t>
             </w:r>
           </w:p>
         </w:tc>
@@ -1737,7 +1737,7 @@
           </w:tcPr>
           <w:p>
             <w:r>
-              <w:t>71.1</w:t>
+              <w:t>72.5</w:t>
             </w:r>
           </w:p>
         </w:tc>
@@ -1747,7 +1747,7 @@
           </w:tcPr>
           <w:p>
             <w:r>
-              <w:t>420</w:t>
+              <w:t>242</w:t>
             </w:r>
           </w:p>
         </w:tc>
@@ -1768,7 +1768,7 @@
     </w:p>
     <w:p>
       <w:r>
-        <w:t>Section score: 78.4 / 100  (Grade: C+)</w:t>
+        <w:t>Section score: 81.7 / 100  (Grade: B)</w:t>
       </w:r>
     </w:p>
     <w:p>
@@ -1879,7 +1879,7 @@
           </w:tcPr>
           <w:p>
             <w:r>
-              <w:t>87.1</w:t>
+              <w:t>98.3</w:t>
             </w:r>
           </w:p>
         </w:tc>
@@ -1889,7 +1889,7 @@
           </w:tcPr>
           <w:p>
             <w:r>
-              <w:t>13.1</w:t>
+              <w:t>14.7</w:t>
             </w:r>
           </w:p>
         </w:tc>
@@ -1911,7 +1911,7 @@
           </w:tcPr>
           <w:p>
             <w:r>
-              <w:t>59.5</w:t>
+              <w:t>66.3</w:t>
             </w:r>
           </w:p>
         </w:tc>
@@ -1921,7 +1921,7 @@
           </w:tcPr>
           <w:p>
             <w:r>
-              <w:t>8.9</w:t>
+              <w:t>9.9</w:t>
             </w:r>
           </w:p>
         </w:tc>
@@ -2007,7 +2007,7 @@
           </w:tcPr>
           <w:p>
             <w:r>
-              <w:t>85.2</w:t>
+              <w:t>86.9</w:t>
             </w:r>
           </w:p>
         </w:tc>
@@ -2017,7 +2017,7 @@
           </w:tcPr>
           <w:p>
             <w:r>
-              <w:t>8.5</w:t>
+              <w:t>8.7</w:t>
             </w:r>
           </w:p>
         </w:tc>
@@ -2039,7 +2039,7 @@
           </w:tcPr>
           <w:p>
             <w:r>
-              <w:t>51.4</w:t>
+              <w:t>53.3</w:t>
             </w:r>
           </w:p>
         </w:tc>
@@ -2049,7 +2049,7 @@
           </w:tcPr>
           <w:p>
             <w:r>
-              <w:t>12.9</w:t>
+              <w:t>13.3</w:t>
             </w:r>
           </w:p>
         </w:tc>
@@ -2090,7 +2090,7 @@
           </w:tcPr>
           <w:p>
             <w:r>
-              <w:t>$578.26</w:t>
+              <w:t>$583.89</w:t>
             </w:r>
           </w:p>
         </w:tc>
@@ -2112,7 +2112,7 @@
           </w:tcPr>
           <w:p>
             <w:r>
-              <w:t>15.65%</w:t>
+              <w:t>16.78%</w:t>
             </w:r>
           </w:p>
         </w:tc>
@@ -2134,7 +2134,7 @@
           </w:tcPr>
           <w:p>
             <w:r>
-              <w:t>$18.53</w:t>
+              <w:t>$24.16</w:t>
             </w:r>
           </w:p>
         </w:tc>
@@ -2178,7 +2178,7 @@
           </w:tcPr>
           <w:p>
             <w:r>
-              <w:t>0.6571</w:t>
+              <w:t>0.6667</w:t>
             </w:r>
           </w:p>
         </w:tc>
@@ -2200,7 +2200,7 @@
           </w:tcPr>
           <w:p>
             <w:r>
-              <w:t>0.5000 / 0.7200</w:t>
+              <w:t>0.5000 / 0.7308</w:t>
             </w:r>
           </w:p>
         </w:tc>
@@ -2222,7 +2222,7 @@
           </w:tcPr>
           <w:p>
             <w:r>
-              <w:t>1.1764</w:t>
+              <w:t>1.2301</w:t>
             </w:r>
           </w:p>
         </w:tc>
@@ -2244,7 +2244,7 @@
           </w:tcPr>
           <w:p>
             <w:r>
-              <w:t>71 / 70</w:t>
+              <w:t>72 / 72</w:t>
             </w:r>
           </w:p>
         </w:tc>
@@ -2266,7 +2266,7 @@
           </w:tcPr>
           <w:p>
             <w:r>
-              <w:t>$0.26</w:t>
+              <w:t>$0.34</w:t>
             </w:r>
           </w:p>
         </w:tc>
@@ -2397,7 +2397,7 @@
           </w:tcPr>
           <w:p>
             <w:r>
-              <w:t>0.650</w:t>
+              <w:t>0.630</w:t>
             </w:r>
           </w:p>
         </w:tc>
@@ -2407,7 +2407,7 @@
           </w:tcPr>
           <w:p>
             <w:r>
-              <w:t>—</w:t>
+              <w:t>down</w:t>
             </w:r>
           </w:p>
         </w:tc>
@@ -2417,7 +2417,7 @@
           </w:tcPr>
           <w:p>
             <w:r>
-              <w:t>—</w:t>
+              <w:t>Yes</w:t>
             </w:r>
           </w:p>
         </w:tc>
@@ -2427,7 +2427,7 @@
           </w:tcPr>
           <w:p>
             <w:r>
-              <w:t>$—</w:t>
+              <w:t>$2.94</w:t>
             </w:r>
           </w:p>
         </w:tc>
@@ -2449,7 +2449,7 @@
           </w:tcPr>
           <w:p>
             <w:r>
-              <w:t>0.670</w:t>
+              <w:t>0.650</w:t>
             </w:r>
           </w:p>
         </w:tc>
@@ -2479,7 +2479,7 @@
           </w:tcPr>
           <w:p>
             <w:r>
-              <w:t>$2.46</w:t>
+              <w:t>$2.69</w:t>
             </w:r>
           </w:p>
         </w:tc>
@@ -2501,7 +2501,7 @@
           </w:tcPr>
           <w:p>
             <w:r>
-              <w:t>0.700</w:t>
+              <w:t>0.670</w:t>
             </w:r>
           </w:p>
         </w:tc>
@@ -2531,7 +2531,7 @@
           </w:tcPr>
           <w:p>
             <w:r>
-              <w:t>$2.14</w:t>
+              <w:t>$2.46</w:t>
             </w:r>
           </w:p>
         </w:tc>
@@ -2553,7 +2553,7 @@
           </w:tcPr>
           <w:p>
             <w:r>
-              <w:t>0.680</w:t>
+              <w:t>0.700</w:t>
             </w:r>
           </w:p>
         </w:tc>
@@ -2563,7 +2563,7 @@
           </w:tcPr>
           <w:p>
             <w:r>
-              <w:t>up</w:t>
+              <w:t>down</w:t>
             </w:r>
           </w:p>
         </w:tc>
@@ -2573,7 +2573,7 @@
           </w:tcPr>
           <w:p>
             <w:r>
-              <w:t>No</w:t>
+              <w:t>Yes</w:t>
             </w:r>
           </w:p>
         </w:tc>
@@ -2583,7 +2583,7 @@
           </w:tcPr>
           <w:p>
             <w:r>
-              <w:t>$-5.00</w:t>
+              <w:t>$2.14</w:t>
             </w:r>
           </w:p>
         </w:tc>
@@ -2605,7 +2605,7 @@
           </w:tcPr>
           <w:p>
             <w:r>
-              <w:t>0.610</w:t>
+              <w:t>0.680</w:t>
             </w:r>
           </w:p>
         </w:tc>
@@ -2615,7 +2615,7 @@
           </w:tcPr>
           <w:p>
             <w:r>
-              <w:t>down</w:t>
+              <w:t>up</w:t>
             </w:r>
           </w:p>
         </w:tc>
@@ -2625,7 +2625,7 @@
           </w:tcPr>
           <w:p>
             <w:r>
-              <w:t>Yes</w:t>
+              <w:t>No</w:t>
             </w:r>
           </w:p>
         </w:tc>
@@ -2635,7 +2635,7 @@
           </w:tcPr>
           <w:p>
             <w:r>
-              <w:t>$3.20</w:t>
+              <w:t>$-5.00</w:t>
             </w:r>
           </w:p>
         </w:tc>
@@ -2657,7 +2657,7 @@
           </w:tcPr>
           <w:p>
             <w:r>
-              <w:t>0.590</w:t>
+              <w:t>0.610</w:t>
             </w:r>
           </w:p>
         </w:tc>
@@ -2667,7 +2667,7 @@
           </w:tcPr>
           <w:p>
             <w:r>
-              <w:t>up</w:t>
+              <w:t>down</w:t>
             </w:r>
           </w:p>
         </w:tc>
@@ -2677,7 +2677,7 @@
           </w:tcPr>
           <w:p>
             <w:r>
-              <w:t>No</w:t>
+              <w:t>Yes</w:t>
             </w:r>
           </w:p>
         </w:tc>
@@ -2687,7 +2687,7 @@
           </w:tcPr>
           <w:p>
             <w:r>
-              <w:t>$-5.00</w:t>
+              <w:t>$3.20</w:t>
             </w:r>
           </w:p>
         </w:tc>
@@ -2709,7 +2709,7 @@
           </w:tcPr>
           <w:p>
             <w:r>
-              <w:t>0.630</w:t>
+              <w:t>0.590</w:t>
             </w:r>
           </w:p>
         </w:tc>
@@ -2719,7 +2719,7 @@
           </w:tcPr>
           <w:p>
             <w:r>
-              <w:t>down</w:t>
+              <w:t>up</w:t>
             </w:r>
           </w:p>
         </w:tc>
@@ -2729,7 +2729,7 @@
           </w:tcPr>
           <w:p>
             <w:r>
-              <w:t>Yes</w:t>
+              <w:t>No</w:t>
             </w:r>
           </w:p>
         </w:tc>
@@ -2739,7 +2739,7 @@
           </w:tcPr>
           <w:p>
             <w:r>
-              <w:t>$2.94</w:t>
+              <w:t>$-5.00</w:t>
             </w:r>
           </w:p>
         </w:tc>
@@ -2761,7 +2761,7 @@
           </w:tcPr>
           <w:p>
             <w:r>
-              <w:t>0.520</w:t>
+              <w:t>0.630</w:t>
             </w:r>
           </w:p>
         </w:tc>
@@ -2791,7 +2791,7 @@
           </w:tcPr>
           <w:p>
             <w:r>
-              <w:t>$4.62</w:t>
+              <w:t>$2.94</w:t>
             </w:r>
           </w:p>
         </w:tc>
@@ -2813,7 +2813,7 @@
           </w:tcPr>
           <w:p>
             <w:r>
-              <w:t>0.700</w:t>
+              <w:t>0.520</w:t>
             </w:r>
           </w:p>
         </w:tc>
@@ -2823,7 +2823,7 @@
           </w:tcPr>
           <w:p>
             <w:r>
-              <w:t>up</w:t>
+              <w:t>down</w:t>
             </w:r>
           </w:p>
         </w:tc>
@@ -2833,7 +2833,7 @@
           </w:tcPr>
           <w:p>
             <w:r>
-              <w:t>No</w:t>
+              <w:t>Yes</w:t>
             </w:r>
           </w:p>
         </w:tc>
@@ -2843,7 +2843,7 @@
           </w:tcPr>
           <w:p>
             <w:r>
-              <w:t>$-5.00</w:t>
+              <w:t>$4.62</w:t>
             </w:r>
           </w:p>
         </w:tc>
@@ -2865,7 +2865,7 @@
           </w:tcPr>
           <w:p>
             <w:r>
-              <w:t>0.630</w:t>
+              <w:t>0.700</w:t>
             </w:r>
           </w:p>
         </w:tc>
@@ -2875,7 +2875,7 @@
           </w:tcPr>
           <w:p>
             <w:r>
-              <w:t>down</w:t>
+              <w:t>up</w:t>
             </w:r>
           </w:p>
         </w:tc>
@@ -2885,7 +2885,7 @@
           </w:tcPr>
           <w:p>
             <w:r>
-              <w:t>Yes</w:t>
+              <w:t>No</w:t>
             </w:r>
           </w:p>
         </w:tc>
@@ -2895,7 +2895,7 @@
           </w:tcPr>
           <w:p>
             <w:r>
-              <w:t>$2.94</w:t>
+              <w:t>$-5.00</w:t>
             </w:r>
           </w:p>
         </w:tc>
@@ -2917,7 +2917,7 @@
           </w:tcPr>
           <w:p>
             <w:r>
-              <w:t>0.670</w:t>
+              <w:t>0.630</w:t>
             </w:r>
           </w:p>
         </w:tc>
@@ -2947,7 +2947,7 @@
           </w:tcPr>
           <w:p>
             <w:r>
-              <w:t>$2.46</w:t>
+              <w:t>$2.94</w:t>
             </w:r>
           </w:p>
         </w:tc>
@@ -2969,7 +2969,7 @@
           </w:tcPr>
           <w:p>
             <w:r>
-              <w:t>0.700</w:t>
+              <w:t>0.670</w:t>
             </w:r>
           </w:p>
         </w:tc>
@@ -2979,7 +2979,7 @@
           </w:tcPr>
           <w:p>
             <w:r>
-              <w:t>up</w:t>
+              <w:t>down</w:t>
             </w:r>
           </w:p>
         </w:tc>
@@ -2989,7 +2989,7 @@
           </w:tcPr>
           <w:p>
             <w:r>
-              <w:t>No</w:t>
+              <w:t>Yes</w:t>
             </w:r>
           </w:p>
         </w:tc>
@@ -2999,7 +2999,7 @@
           </w:tcPr>
           <w:p>
             <w:r>
-              <w:t>$-5.00</w:t>
+              <w:t>$2.46</w:t>
             </w:r>
           </w:p>
         </w:tc>
@@ -3021,7 +3021,7 @@
           </w:tcPr>
           <w:p>
             <w:r>
-              <w:t>0.630</w:t>
+              <w:t>0.700</w:t>
             </w:r>
           </w:p>
         </w:tc>
@@ -3031,7 +3031,7 @@
           </w:tcPr>
           <w:p>
             <w:r>
-              <w:t>down</w:t>
+              <w:t>up</w:t>
             </w:r>
           </w:p>
         </w:tc>
@@ -3041,7 +3041,7 @@
           </w:tcPr>
           <w:p>
             <w:r>
-              <w:t>Yes</w:t>
+              <w:t>No</w:t>
             </w:r>
           </w:p>
         </w:tc>
@@ -3051,7 +3051,7 @@
           </w:tcPr>
           <w:p>
             <w:r>
-              <w:t>$2.94</w:t>
+              <w:t>$-5.00</w:t>
             </w:r>
           </w:p>
         </w:tc>
@@ -3073,7 +3073,7 @@
           </w:tcPr>
           <w:p>
             <w:r>
-              <w:t>0.700</w:t>
+              <w:t>0.630</w:t>
             </w:r>
           </w:p>
         </w:tc>
@@ -3103,7 +3103,7 @@
           </w:tcPr>
           <w:p>
             <w:r>
-              <w:t>$2.14</w:t>
+              <w:t>$2.94</w:t>
             </w:r>
           </w:p>
         </w:tc>
@@ -3125,7 +3125,7 @@
           </w:tcPr>
           <w:p>
             <w:r>
-              <w:t>0.650</w:t>
+              <w:t>0.700</w:t>
             </w:r>
           </w:p>
         </w:tc>
@@ -3155,7 +3155,7 @@
           </w:tcPr>
           <w:p>
             <w:r>
-              <w:t>$2.69</w:t>
+              <w:t>$2.14</w:t>
             </w:r>
           </w:p>
         </w:tc>
@@ -3319,7 +3319,7 @@
           </w:tcPr>
           <w:p>
             <w:r>
-              <w:t>95.7</w:t>
+              <w:t>95.8</w:t>
             </w:r>
           </w:p>
         </w:tc>
@@ -3433,17 +3433,17 @@
     </w:tbl>
     <w:p>
       <w:r>
-        <w:t>Ticks: 775 · Reconciled: True · Readiness: not_ready</w:t>
+        <w:t>Ticks: 273 · Reconciled: True · Readiness: not_ready</w:t>
       </w:r>
     </w:p>
     <w:p>
       <w:r>
-        <w:t>Candidates created: 39929 · Terminals: {'accepted': 71, 'rejected': 35159, 'skipped': 4538, 'expired': 0, 'missing_data': 161}</w:t>
+        <w:t>Candidates created: 40359 · Terminals: {'accepted': 72, 'rejected': 35578, 'skipped': 4546, 'expired': 0, 'missing_data': 163}</w:t>
       </w:r>
     </w:p>
     <w:p>
       <w:r>
-        <w:t>Rejected by stage: {'directional': 25721, 'execution_gate': 144, 'context_gate': 876, 'directional_allowlist': 1364, 'down_bias_gate': 538, 'mtf_gate': 275, 'grok_decider': 3540, 'execution_realistic': 3, 'verifier': 61, 'mispricing_gate': 50, 'baseline_cohort_gate': 2587}</w:t>
+        <w:t>Rejected by stage: {'directional': 26070, 'execution_gate': 147, 'context_gate': 876, 'directional_allowlist': 1364, 'down_bias_gate': 538, 'mtf_gate': 275, 'grok_decider': 3540, 'execution_realistic': 3, 'verifier': 61, 'mispricing_gate': 50, 'baseline_cohort_gate': 2654}</w:t>
       </w:r>
     </w:p>
     <w:p>
@@ -4018,7 +4018,7 @@
     </w:p>
     <w:p>
       <w:r>
-        <w:t>Section score: 37.1 / 100  (Grade: F)</w:t>
+        <w:t>Section score: 36.4 / 100  (Grade: F)</w:t>
       </w:r>
     </w:p>
     <w:p>
@@ -4225,7 +4225,7 @@
           </w:tcPr>
           <w:p>
             <w:r>
-              <w:t>51.5</w:t>
+              <w:t>49.8</w:t>
             </w:r>
           </w:p>
         </w:tc>
@@ -4235,7 +4235,7 @@
           </w:tcPr>
           <w:p>
             <w:r>
-              <w:t>15.5</w:t>
+              <w:t>14.9</w:t>
             </w:r>
           </w:p>
         </w:tc>
@@ -4257,7 +4257,7 @@
           </w:tcPr>
           <w:p>
             <w:r>
-              <w:t>4.1</w:t>
+              <w:t>2.5</w:t>
             </w:r>
           </w:p>
         </w:tc>
@@ -4267,7 +4267,7 @@
           </w:tcPr>
           <w:p>
             <w:r>
-              <w:t>0.6</w:t>
+              <w:t>0.4</w:t>
             </w:r>
           </w:p>
         </w:tc>
@@ -4330,7 +4330,7 @@
           </w:tcPr>
           <w:p>
             <w:r>
-              <w:t>0.6522</w:t>
+              <w:t>0.6667</w:t>
             </w:r>
           </w:p>
         </w:tc>
@@ -4352,7 +4352,7 @@
           </w:tcPr>
           <w:p>
             <w:r>
-              <w:t>0.4773</w:t>
+              <w:t>0.4667</w:t>
             </w:r>
           </w:p>
         </w:tc>
@@ -4396,7 +4396,7 @@
           </w:tcPr>
           <w:p>
             <w:r>
-              <w:t>0.5033</w:t>
+              <w:t>0.5066</w:t>
             </w:r>
           </w:p>
         </w:tc>

</xml_diff>

<commit_message>
chore(reports): VPS full report 2026-06-26 23:22 UTC (78 settled, WR 64.1%, PF 1.0839)
</commit_message>
<xml_diff>
--- a/vps_full_reports/latest/report.docx
+++ b/vps_full_reports/latest/report.docx
@@ -20,7 +20,7 @@
           <w:color w:val="666666"/>
           <w:sz w:val="20"/>
         </w:rPr>
-        <w:t>PAPER ONLY  ·  reconciled=True  ·  ticks=989</w:t>
+        <w:t>PAPER ONLY  ·  reconciled=True  ·  ticks=357</w:t>
       </w:r>
     </w:p>
     <w:p>
@@ -33,7 +33,7 @@
     </w:p>
     <w:p>
       <w:r>
-        <w:t>Overall score: 70.0 / 100  (Grade: C)</w:t>
+        <w:t>Overall score: 68.3 / 100  (Grade: D)</w:t>
       </w:r>
     </w:p>
     <w:tbl>
@@ -107,7 +107,7 @@
           </w:tcPr>
           <w:p>
             <w:r>
-              <w:t>77.6</w:t>
+              <w:t>72.9</w:t>
             </w:r>
           </w:p>
         </w:tc>
@@ -117,7 +117,7 @@
           </w:tcPr>
           <w:p>
             <w:r>
-              <w:t>C+</w:t>
+              <w:t>C</w:t>
             </w:r>
           </w:p>
         </w:tc>
@@ -191,7 +191,7 @@
           </w:tcPr>
           <w:p>
             <w:r>
-              <w:t>34.6</w:t>
+              <w:t>36.9</w:t>
             </w:r>
           </w:p>
         </w:tc>
@@ -319,7 +319,7 @@
           </w:tcPr>
           <w:p>
             <w:r>
-              <w:t>2026-06-26 16:48:06</w:t>
+              <w:t>2026-06-26 17:50:49</w:t>
             </w:r>
           </w:p>
         </w:tc>
@@ -329,7 +329,7 @@
           </w:tcPr>
           <w:p>
             <w:r>
-              <w:t>58</w:t>
+              <w:t>64</w:t>
             </w:r>
           </w:p>
         </w:tc>
@@ -339,7 +339,7 @@
           </w:tcPr>
           <w:p>
             <w:r>
-              <w:t>77.4</w:t>
+              <w:t>78.4</w:t>
             </w:r>
           </w:p>
         </w:tc>
@@ -359,7 +359,7 @@
           </w:tcPr>
           <w:p>
             <w:r>
-              <w:t>39.4</w:t>
+              <w:t>37.7</w:t>
             </w:r>
           </w:p>
         </w:tc>
@@ -369,7 +369,7 @@
           </w:tcPr>
           <w:p>
             <w:r>
-              <w:t>71.1</w:t>
+              <w:t>71.2</w:t>
             </w:r>
           </w:p>
         </w:tc>
@@ -379,7 +379,7 @@
           </w:tcPr>
           <w:p>
             <w:r>
-              <w:t>315</w:t>
+              <w:t>290</w:t>
             </w:r>
           </w:p>
         </w:tc>
@@ -391,7 +391,7 @@
           </w:tcPr>
           <w:p>
             <w:r>
-              <w:t>2026-06-26 17:17:51</w:t>
+              <w:t>2026-06-26 17:58:04</w:t>
             </w:r>
           </w:p>
         </w:tc>
@@ -401,7 +401,7 @@
           </w:tcPr>
           <w:p>
             <w:r>
-              <w:t>59</w:t>
+              <w:t>65</w:t>
             </w:r>
           </w:p>
         </w:tc>
@@ -411,7 +411,7 @@
           </w:tcPr>
           <w:p>
             <w:r>
-              <w:t>79.3</w:t>
+              <w:t>75.0</w:t>
             </w:r>
           </w:p>
         </w:tc>
@@ -431,7 +431,7 @@
           </w:tcPr>
           <w:p>
             <w:r>
-              <w:t>38.6</w:t>
+              <w:t>37.7</w:t>
             </w:r>
           </w:p>
         </w:tc>
@@ -441,7 +441,7 @@
           </w:tcPr>
           <w:p>
             <w:r>
-              <w:t>71.9</w:t>
+              <w:t>69.5</w:t>
             </w:r>
           </w:p>
         </w:tc>
@@ -451,7 +451,7 @@
           </w:tcPr>
           <w:p>
             <w:r>
-              <w:t>685</w:t>
+              <w:t>399</w:t>
             </w:r>
           </w:p>
         </w:tc>
@@ -463,7 +463,7 @@
           </w:tcPr>
           <w:p>
             <w:r>
-              <w:t>2026-06-26 17:30:41</w:t>
+              <w:t>2026-06-26 18:03:04</w:t>
             </w:r>
           </w:p>
         </w:tc>
@@ -473,7 +473,7 @@
           </w:tcPr>
           <w:p>
             <w:r>
-              <w:t>60</w:t>
+              <w:t>66</w:t>
             </w:r>
           </w:p>
         </w:tc>
@@ -483,7 +483,7 @@
           </w:tcPr>
           <w:p>
             <w:r>
-              <w:t>75.7</w:t>
+              <w:t>76.8</w:t>
             </w:r>
           </w:p>
         </w:tc>
@@ -503,7 +503,7 @@
           </w:tcPr>
           <w:p>
             <w:r>
-              <w:t>38.6</w:t>
+              <w:t>36.9</w:t>
             </w:r>
           </w:p>
         </w:tc>
@@ -513,7 +513,7 @@
           </w:tcPr>
           <w:p>
             <w:r>
-              <w:t>70.1</w:t>
+              <w:t>70.2</w:t>
             </w:r>
           </w:p>
         </w:tc>
@@ -523,7 +523,7 @@
           </w:tcPr>
           <w:p>
             <w:r>
-              <w:t>1</w:t>
+              <w:t>30</w:t>
             </w:r>
           </w:p>
         </w:tc>
@@ -535,7 +535,7 @@
           </w:tcPr>
           <w:p>
             <w:r>
-              <w:t>2026-06-26 17:37:01</w:t>
+              <w:t>2026-06-26 18:32:46</w:t>
             </w:r>
           </w:p>
         </w:tc>
@@ -545,7 +545,7 @@
           </w:tcPr>
           <w:p>
             <w:r>
-              <w:t>61</w:t>
+              <w:t>67</w:t>
             </w:r>
           </w:p>
         </w:tc>
@@ -555,7 +555,7 @@
           </w:tcPr>
           <w:p>
             <w:r>
-              <w:t>77.4</w:t>
+              <w:t>78.8</w:t>
             </w:r>
           </w:p>
         </w:tc>
@@ -575,7 +575,7 @@
           </w:tcPr>
           <w:p>
             <w:r>
-              <w:t>38.6</w:t>
+              <w:t>37.0</w:t>
             </w:r>
           </w:p>
         </w:tc>
@@ -585,7 +585,7 @@
           </w:tcPr>
           <w:p>
             <w:r>
-              <w:t>70.9</w:t>
+              <w:t>71.2</w:t>
             </w:r>
           </w:p>
         </w:tc>
@@ -595,7 +595,7 @@
           </w:tcPr>
           <w:p>
             <w:r>
-              <w:t>88</w:t>
+              <w:t>98</w:t>
             </w:r>
           </w:p>
         </w:tc>
@@ -607,7 +607,7 @@
           </w:tcPr>
           <w:p>
             <w:r>
-              <w:t>2026-06-26 17:47:17</w:t>
+              <w:t>2026-06-26 18:38:05</w:t>
             </w:r>
           </w:p>
         </w:tc>
@@ -617,7 +617,7 @@
           </w:tcPr>
           <w:p>
             <w:r>
-              <w:t>62</w:t>
+              <w:t>68</w:t>
             </w:r>
           </w:p>
         </w:tc>
@@ -627,7 +627,7 @@
           </w:tcPr>
           <w:p>
             <w:r>
-              <w:t>79.2</w:t>
+              <w:t>75.5</w:t>
             </w:r>
           </w:p>
         </w:tc>
@@ -647,7 +647,7 @@
           </w:tcPr>
           <w:p>
             <w:r>
-              <w:t>38.6</w:t>
+              <w:t>37.0</w:t>
             </w:r>
           </w:p>
         </w:tc>
@@ -657,7 +657,7 @@
           </w:tcPr>
           <w:p>
             <w:r>
-              <w:t>71.8</w:t>
+              <w:t>69.6</w:t>
             </w:r>
           </w:p>
         </w:tc>
@@ -667,7 +667,7 @@
           </w:tcPr>
           <w:p>
             <w:r>
-              <w:t>237</w:t>
+              <w:t>175</w:t>
             </w:r>
           </w:p>
         </w:tc>
@@ -679,7 +679,7 @@
           </w:tcPr>
           <w:p>
             <w:r>
-              <w:t>2026-06-26 17:48:04</w:t>
+              <w:t>2026-06-26 18:42:04</w:t>
             </w:r>
           </w:p>
         </w:tc>
@@ -689,7 +689,7 @@
           </w:tcPr>
           <w:p>
             <w:r>
-              <w:t>63</w:t>
+              <w:t>69</w:t>
             </w:r>
           </w:p>
         </w:tc>
@@ -699,7 +699,7 @@
           </w:tcPr>
           <w:p>
             <w:r>
-              <w:t>75.8</w:t>
+              <w:t>76.9</w:t>
             </w:r>
           </w:p>
         </w:tc>
@@ -719,7 +719,7 @@
           </w:tcPr>
           <w:p>
             <w:r>
-              <w:t>38.6</w:t>
+              <w:t>37.0</w:t>
             </w:r>
           </w:p>
         </w:tc>
@@ -729,7 +729,7 @@
           </w:tcPr>
           <w:p>
             <w:r>
-              <w:t>70.1</w:t>
+              <w:t>70.3</w:t>
             </w:r>
           </w:p>
         </w:tc>
@@ -739,7 +739,7 @@
           </w:tcPr>
           <w:p>
             <w:r>
-              <w:t>249</w:t>
+              <w:t>229</w:t>
             </w:r>
           </w:p>
         </w:tc>
@@ -751,7 +751,7 @@
           </w:tcPr>
           <w:p>
             <w:r>
-              <w:t>2026-06-26 17:50:49</w:t>
+              <w:t>2026-06-26 18:57:18</w:t>
             </w:r>
           </w:p>
         </w:tc>
@@ -761,7 +761,7 @@
           </w:tcPr>
           <w:p>
             <w:r>
-              <w:t>64</w:t>
+              <w:t>70</w:t>
             </w:r>
           </w:p>
         </w:tc>
@@ -781,7 +781,7 @@
           </w:tcPr>
           <w:p>
             <w:r>
-              <w:t>90.3</w:t>
+              <w:t>90.4</w:t>
             </w:r>
           </w:p>
         </w:tc>
@@ -791,7 +791,7 @@
           </w:tcPr>
           <w:p>
             <w:r>
-              <w:t>37.7</w:t>
+              <w:t>37.1</w:t>
             </w:r>
           </w:p>
         </w:tc>
@@ -801,7 +801,7 @@
           </w:tcPr>
           <w:p>
             <w:r>
-              <w:t>71.2</w:t>
+              <w:t>71.1</w:t>
             </w:r>
           </w:p>
         </w:tc>
@@ -811,7 +811,7 @@
           </w:tcPr>
           <w:p>
             <w:r>
-              <w:t>290</w:t>
+              <w:t>420</w:t>
             </w:r>
           </w:p>
         </w:tc>
@@ -823,7 +823,7 @@
           </w:tcPr>
           <w:p>
             <w:r>
-              <w:t>2026-06-26 17:58:04</w:t>
+              <w:t>2026-06-26 19:27:22</w:t>
             </w:r>
           </w:p>
         </w:tc>
@@ -833,7 +833,7 @@
           </w:tcPr>
           <w:p>
             <w:r>
-              <w:t>65</w:t>
+              <w:t>70</w:t>
             </w:r>
           </w:p>
         </w:tc>
@@ -843,7 +843,7 @@
           </w:tcPr>
           <w:p>
             <w:r>
-              <w:t>75.0</w:t>
+              <w:t>78.4</w:t>
             </w:r>
           </w:p>
         </w:tc>
@@ -853,7 +853,7 @@
           </w:tcPr>
           <w:p>
             <w:r>
-              <w:t>90.3</w:t>
+              <w:t>90.4</w:t>
             </w:r>
           </w:p>
         </w:tc>
@@ -863,7 +863,7 @@
           </w:tcPr>
           <w:p>
             <w:r>
-              <w:t>37.7</w:t>
+              <w:t>37.1</w:t>
             </w:r>
           </w:p>
         </w:tc>
@@ -873,7 +873,7 @@
           </w:tcPr>
           <w:p>
             <w:r>
-              <w:t>69.5</w:t>
+              <w:t>71.1</w:t>
             </w:r>
           </w:p>
         </w:tc>
@@ -883,7 +883,7 @@
           </w:tcPr>
           <w:p>
             <w:r>
-              <w:t>399</w:t>
+              <w:t>793</w:t>
             </w:r>
           </w:p>
         </w:tc>
@@ -895,7 +895,7 @@
           </w:tcPr>
           <w:p>
             <w:r>
-              <w:t>2026-06-26 18:03:04</w:t>
+              <w:t>2026-06-26 19:44:43</w:t>
             </w:r>
           </w:p>
         </w:tc>
@@ -905,7 +905,7 @@
           </w:tcPr>
           <w:p>
             <w:r>
-              <w:t>66</w:t>
+              <w:t>71</w:t>
             </w:r>
           </w:p>
         </w:tc>
@@ -915,7 +915,7 @@
           </w:tcPr>
           <w:p>
             <w:r>
-              <w:t>76.8</w:t>
+              <w:t>80.0</w:t>
             </w:r>
           </w:p>
         </w:tc>
@@ -925,7 +925,7 @@
           </w:tcPr>
           <w:p>
             <w:r>
-              <w:t>90.3</w:t>
+              <w:t>90.4</w:t>
             </w:r>
           </w:p>
         </w:tc>
@@ -935,7 +935,7 @@
           </w:tcPr>
           <w:p>
             <w:r>
-              <w:t>36.9</w:t>
+              <w:t>36.4</w:t>
             </w:r>
           </w:p>
         </w:tc>
@@ -945,7 +945,7 @@
           </w:tcPr>
           <w:p>
             <w:r>
-              <w:t>70.2</w:t>
+              <w:t>71.7</w:t>
             </w:r>
           </w:p>
         </w:tc>
@@ -955,7 +955,7 @@
           </w:tcPr>
           <w:p>
             <w:r>
-              <w:t>30</w:t>
+              <w:t>1</w:t>
             </w:r>
           </w:p>
         </w:tc>
@@ -967,7 +967,7 @@
           </w:tcPr>
           <w:p>
             <w:r>
-              <w:t>2026-06-26 18:32:46</w:t>
+              <w:t>2026-06-26 20:03:09</w:t>
             </w:r>
           </w:p>
         </w:tc>
@@ -977,7 +977,7 @@
           </w:tcPr>
           <w:p>
             <w:r>
-              <w:t>67</w:t>
+              <w:t>72</w:t>
             </w:r>
           </w:p>
         </w:tc>
@@ -987,7 +987,7 @@
           </w:tcPr>
           <w:p>
             <w:r>
-              <w:t>78.8</w:t>
+              <w:t>81.7</w:t>
             </w:r>
           </w:p>
         </w:tc>
@@ -997,7 +997,7 @@
           </w:tcPr>
           <w:p>
             <w:r>
-              <w:t>90.3</w:t>
+              <w:t>90.4</w:t>
             </w:r>
           </w:p>
         </w:tc>
@@ -1007,7 +1007,7 @@
           </w:tcPr>
           <w:p>
             <w:r>
-              <w:t>37.0</w:t>
+              <w:t>36.4</w:t>
             </w:r>
           </w:p>
         </w:tc>
@@ -1017,7 +1017,7 @@
           </w:tcPr>
           <w:p>
             <w:r>
-              <w:t>71.2</w:t>
+              <w:t>72.5</w:t>
             </w:r>
           </w:p>
         </w:tc>
@@ -1027,7 +1027,7 @@
           </w:tcPr>
           <w:p>
             <w:r>
-              <w:t>98</w:t>
+              <w:t>242</w:t>
             </w:r>
           </w:p>
         </w:tc>
@@ -1039,7 +1039,7 @@
           </w:tcPr>
           <w:p>
             <w:r>
-              <w:t>2026-06-26 18:38:05</w:t>
+              <w:t>2026-06-26 20:33:07</w:t>
             </w:r>
           </w:p>
         </w:tc>
@@ -1049,7 +1049,7 @@
           </w:tcPr>
           <w:p>
             <w:r>
-              <w:t>68</w:t>
+              <w:t>73</w:t>
             </w:r>
           </w:p>
         </w:tc>
@@ -1059,7 +1059,7 @@
           </w:tcPr>
           <w:p>
             <w:r>
-              <w:t>75.5</w:t>
+              <w:t>78.5</w:t>
             </w:r>
           </w:p>
         </w:tc>
@@ -1069,7 +1069,7 @@
           </w:tcPr>
           <w:p>
             <w:r>
-              <w:t>90.3</w:t>
+              <w:t>90.4</w:t>
             </w:r>
           </w:p>
         </w:tc>
@@ -1079,7 +1079,7 @@
           </w:tcPr>
           <w:p>
             <w:r>
-              <w:t>37.0</w:t>
+              <w:t>36.4</w:t>
             </w:r>
           </w:p>
         </w:tc>
@@ -1089,7 +1089,7 @@
           </w:tcPr>
           <w:p>
             <w:r>
-              <w:t>69.6</w:t>
+              <w:t>71.0</w:t>
             </w:r>
           </w:p>
         </w:tc>
@@ -1099,7 +1099,7 @@
           </w:tcPr>
           <w:p>
             <w:r>
-              <w:t>175</w:t>
+              <w:t>361</w:t>
             </w:r>
           </w:p>
         </w:tc>
@@ -1111,7 +1111,7 @@
           </w:tcPr>
           <w:p>
             <w:r>
-              <w:t>2026-06-26 18:42:04</w:t>
+              <w:t>2026-06-26 20:42:23</w:t>
             </w:r>
           </w:p>
         </w:tc>
@@ -1121,7 +1121,7 @@
           </w:tcPr>
           <w:p>
             <w:r>
-              <w:t>69</w:t>
+              <w:t>74</w:t>
             </w:r>
           </w:p>
         </w:tc>
@@ -1131,7 +1131,7 @@
           </w:tcPr>
           <w:p>
             <w:r>
-              <w:t>76.9</w:t>
+              <w:t>75.4</w:t>
             </w:r>
           </w:p>
         </w:tc>
@@ -1141,7 +1141,7 @@
           </w:tcPr>
           <w:p>
             <w:r>
-              <w:t>90.3</w:t>
+              <w:t>90.4</w:t>
             </w:r>
           </w:p>
         </w:tc>
@@ -1151,7 +1151,7 @@
           </w:tcPr>
           <w:p>
             <w:r>
-              <w:t>37.0</w:t>
+              <w:t>34.5</w:t>
             </w:r>
           </w:p>
         </w:tc>
@@ -1161,7 +1161,7 @@
           </w:tcPr>
           <w:p>
             <w:r>
-              <w:t>70.3</w:t>
+              <w:t>68.9</w:t>
             </w:r>
           </w:p>
         </w:tc>
@@ -1171,7 +1171,7 @@
           </w:tcPr>
           <w:p>
             <w:r>
-              <w:t>229</w:t>
+              <w:t>485</w:t>
             </w:r>
           </w:p>
         </w:tc>
@@ -1183,7 +1183,7 @@
           </w:tcPr>
           <w:p>
             <w:r>
-              <w:t>2026-06-26 18:57:18</w:t>
+              <w:t>2026-06-26 21:12:24</w:t>
             </w:r>
           </w:p>
         </w:tc>
@@ -1193,7 +1193,7 @@
           </w:tcPr>
           <w:p>
             <w:r>
-              <w:t>70</w:t>
+              <w:t>74</w:t>
             </w:r>
           </w:p>
         </w:tc>
@@ -1203,7 +1203,7 @@
           </w:tcPr>
           <w:p>
             <w:r>
-              <w:t>78.4</w:t>
+              <w:t>75.4</w:t>
             </w:r>
           </w:p>
         </w:tc>
@@ -1223,7 +1223,7 @@
           </w:tcPr>
           <w:p>
             <w:r>
-              <w:t>37.1</w:t>
+              <w:t>34.6</w:t>
             </w:r>
           </w:p>
         </w:tc>
@@ -1233,7 +1233,7 @@
           </w:tcPr>
           <w:p>
             <w:r>
-              <w:t>71.1</w:t>
+              <w:t>69.0</w:t>
             </w:r>
           </w:p>
         </w:tc>
@@ -1243,7 +1243,7 @@
           </w:tcPr>
           <w:p>
             <w:r>
-              <w:t>420</w:t>
+              <w:t>853</w:t>
             </w:r>
           </w:p>
         </w:tc>
@@ -1255,7 +1255,7 @@
           </w:tcPr>
           <w:p>
             <w:r>
-              <w:t>2026-06-26 19:27:22</w:t>
+              <w:t>2026-06-26 21:21:11</w:t>
             </w:r>
           </w:p>
         </w:tc>
@@ -1265,7 +1265,7 @@
           </w:tcPr>
           <w:p>
             <w:r>
-              <w:t>70</w:t>
+              <w:t>75</w:t>
             </w:r>
           </w:p>
         </w:tc>
@@ -1275,7 +1275,7 @@
           </w:tcPr>
           <w:p>
             <w:r>
-              <w:t>78.4</w:t>
+              <w:t>77.6</w:t>
             </w:r>
           </w:p>
         </w:tc>
@@ -1295,7 +1295,7 @@
           </w:tcPr>
           <w:p>
             <w:r>
-              <w:t>37.1</w:t>
+              <w:t>34.6</w:t>
             </w:r>
           </w:p>
         </w:tc>
@@ -1305,7 +1305,7 @@
           </w:tcPr>
           <w:p>
             <w:r>
-              <w:t>71.1</w:t>
+              <w:t>70.0</w:t>
             </w:r>
           </w:p>
         </w:tc>
@@ -1315,7 +1315,7 @@
           </w:tcPr>
           <w:p>
             <w:r>
-              <w:t>793</w:t>
+              <w:t>972</w:t>
             </w:r>
           </w:p>
         </w:tc>
@@ -1327,7 +1327,7 @@
           </w:tcPr>
           <w:p>
             <w:r>
-              <w:t>2026-06-26 19:44:43</w:t>
+              <w:t>2026-06-26 21:51:11</w:t>
             </w:r>
           </w:p>
         </w:tc>
@@ -1337,7 +1337,7 @@
           </w:tcPr>
           <w:p>
             <w:r>
-              <w:t>71</w:t>
+              <w:t>75</w:t>
             </w:r>
           </w:p>
         </w:tc>
@@ -1347,7 +1347,7 @@
           </w:tcPr>
           <w:p>
             <w:r>
-              <w:t>80.0</w:t>
+              <w:t>77.6</w:t>
             </w:r>
           </w:p>
         </w:tc>
@@ -1367,7 +1367,7 @@
           </w:tcPr>
           <w:p>
             <w:r>
-              <w:t>36.4</w:t>
+              <w:t>34.6</w:t>
             </w:r>
           </w:p>
         </w:tc>
@@ -1377,7 +1377,7 @@
           </w:tcPr>
           <w:p>
             <w:r>
-              <w:t>71.7</w:t>
+              <w:t>70.0</w:t>
             </w:r>
           </w:p>
         </w:tc>
@@ -1387,7 +1387,7 @@
           </w:tcPr>
           <w:p>
             <w:r>
-              <w:t>1</w:t>
+              <w:t>22</w:t>
             </w:r>
           </w:p>
         </w:tc>
@@ -1399,7 +1399,7 @@
           </w:tcPr>
           <w:p>
             <w:r>
-              <w:t>2026-06-26 20:03:09</w:t>
+              <w:t>2026-06-26 21:52:24</w:t>
             </w:r>
           </w:p>
         </w:tc>
@@ -1409,7 +1409,7 @@
           </w:tcPr>
           <w:p>
             <w:r>
-              <w:t>72</w:t>
+              <w:t>76</w:t>
             </w:r>
           </w:p>
         </w:tc>
@@ -1419,7 +1419,7 @@
           </w:tcPr>
           <w:p>
             <w:r>
-              <w:t>81.7</w:t>
+              <w:t>78.9</w:t>
             </w:r>
           </w:p>
         </w:tc>
@@ -1439,7 +1439,7 @@
           </w:tcPr>
           <w:p>
             <w:r>
-              <w:t>36.4</w:t>
+              <w:t>34.0</w:t>
             </w:r>
           </w:p>
         </w:tc>
@@ -1449,7 +1449,7 @@
           </w:tcPr>
           <w:p>
             <w:r>
-              <w:t>72.5</w:t>
+              <w:t>70.6</w:t>
             </w:r>
           </w:p>
         </w:tc>
@@ -1459,7 +1459,7 @@
           </w:tcPr>
           <w:p>
             <w:r>
-              <w:t>242</w:t>
+              <w:t>40</w:t>
             </w:r>
           </w:p>
         </w:tc>
@@ -1471,7 +1471,7 @@
           </w:tcPr>
           <w:p>
             <w:r>
-              <w:t>2026-06-26 20:33:07</w:t>
+              <w:t>2026-06-26 22:22:25</w:t>
             </w:r>
           </w:p>
         </w:tc>
@@ -1481,7 +1481,7 @@
           </w:tcPr>
           <w:p>
             <w:r>
-              <w:t>73</w:t>
+              <w:t>76</w:t>
             </w:r>
           </w:p>
         </w:tc>
@@ -1491,7 +1491,7 @@
           </w:tcPr>
           <w:p>
             <w:r>
-              <w:t>78.5</w:t>
+              <w:t>78.9</w:t>
             </w:r>
           </w:p>
         </w:tc>
@@ -1511,7 +1511,7 @@
           </w:tcPr>
           <w:p>
             <w:r>
-              <w:t>36.4</w:t>
+              <w:t>34.1</w:t>
             </w:r>
           </w:p>
         </w:tc>
@@ -1521,7 +1521,7 @@
           </w:tcPr>
           <w:p>
             <w:r>
-              <w:t>71.0</w:t>
+              <w:t>70.6</w:t>
             </w:r>
           </w:p>
         </w:tc>
@@ -1531,7 +1531,7 @@
           </w:tcPr>
           <w:p>
             <w:r>
-              <w:t>361</w:t>
+              <w:t>490</w:t>
             </w:r>
           </w:p>
         </w:tc>
@@ -1543,7 +1543,7 @@
           </w:tcPr>
           <w:p>
             <w:r>
-              <w:t>2026-06-26 20:42:23</w:t>
+              <w:t>2026-06-26 22:52:28</w:t>
             </w:r>
           </w:p>
         </w:tc>
@@ -1553,7 +1553,7 @@
           </w:tcPr>
           <w:p>
             <w:r>
-              <w:t>74</w:t>
+              <w:t>76</w:t>
             </w:r>
           </w:p>
         </w:tc>
@@ -1563,7 +1563,7 @@
           </w:tcPr>
           <w:p>
             <w:r>
-              <w:t>75.4</w:t>
+              <w:t>78.9</w:t>
             </w:r>
           </w:p>
         </w:tc>
@@ -1583,7 +1583,7 @@
           </w:tcPr>
           <w:p>
             <w:r>
-              <w:t>34.5</w:t>
+              <w:t>34.4</w:t>
             </w:r>
           </w:p>
         </w:tc>
@@ -1593,7 +1593,7 @@
           </w:tcPr>
           <w:p>
             <w:r>
-              <w:t>68.9</w:t>
+              <w:t>70.7</w:t>
             </w:r>
           </w:p>
         </w:tc>
@@ -1603,7 +1603,7 @@
           </w:tcPr>
           <w:p>
             <w:r>
-              <w:t>485</w:t>
+              <w:t>278</w:t>
             </w:r>
           </w:p>
         </w:tc>
@@ -1615,7 +1615,7 @@
           </w:tcPr>
           <w:p>
             <w:r>
-              <w:t>2026-06-26 21:12:24</w:t>
+              <w:t>2026-06-26 23:00:58</w:t>
             </w:r>
           </w:p>
         </w:tc>
@@ -1625,7 +1625,7 @@
           </w:tcPr>
           <w:p>
             <w:r>
-              <w:t>74</w:t>
+              <w:t>77</w:t>
             </w:r>
           </w:p>
         </w:tc>
@@ -1635,7 +1635,7 @@
           </w:tcPr>
           <w:p>
             <w:r>
-              <w:t>75.4</w:t>
+              <w:t>75.9</w:t>
             </w:r>
           </w:p>
         </w:tc>
@@ -1655,7 +1655,7 @@
           </w:tcPr>
           <w:p>
             <w:r>
-              <w:t>34.6</w:t>
+              <w:t>35.6</w:t>
             </w:r>
           </w:p>
         </w:tc>
@@ -1665,7 +1665,7 @@
           </w:tcPr>
           <w:p>
             <w:r>
-              <w:t>69.0</w:t>
+              <w:t>69.5</w:t>
             </w:r>
           </w:p>
         </w:tc>
@@ -1675,7 +1675,7 @@
           </w:tcPr>
           <w:p>
             <w:r>
-              <w:t>853</w:t>
+              <w:t>35</w:t>
             </w:r>
           </w:p>
         </w:tc>
@@ -1687,7 +1687,7 @@
           </w:tcPr>
           <w:p>
             <w:r>
-              <w:t>2026-06-26 21:21:11</w:t>
+              <w:t>2026-06-26 23:18:02</w:t>
             </w:r>
           </w:p>
         </w:tc>
@@ -1697,7 +1697,7 @@
           </w:tcPr>
           <w:p>
             <w:r>
-              <w:t>75</w:t>
+              <w:t>78</w:t>
             </w:r>
           </w:p>
         </w:tc>
@@ -1707,7 +1707,7 @@
           </w:tcPr>
           <w:p>
             <w:r>
-              <w:t>77.6</w:t>
+              <w:t>72.9</w:t>
             </w:r>
           </w:p>
         </w:tc>
@@ -1727,7 +1727,7 @@
           </w:tcPr>
           <w:p>
             <w:r>
-              <w:t>34.6</w:t>
+              <w:t>36.9</w:t>
             </w:r>
           </w:p>
         </w:tc>
@@ -1737,7 +1737,7 @@
           </w:tcPr>
           <w:p>
             <w:r>
-              <w:t>70.0</w:t>
+              <w:t>68.3</w:t>
             </w:r>
           </w:p>
         </w:tc>
@@ -1747,7 +1747,7 @@
           </w:tcPr>
           <w:p>
             <w:r>
-              <w:t>972</w:t>
+              <w:t>291</w:t>
             </w:r>
           </w:p>
         </w:tc>
@@ -1768,7 +1768,7 @@
     </w:p>
     <w:p>
       <w:r>
-        <w:t>Section score: 77.6 / 100  (Grade: C+)</w:t>
+        <w:t>Section score: 72.9 / 100  (Grade: C)</w:t>
       </w:r>
     </w:p>
     <w:p>
@@ -1879,7 +1879,7 @@
           </w:tcPr>
           <w:p>
             <w:r>
-              <w:t>86.5</w:t>
+              <w:t>71.0</w:t>
             </w:r>
           </w:p>
         </w:tc>
@@ -1889,7 +1889,7 @@
           </w:tcPr>
           <w:p>
             <w:r>
-              <w:t>13.0</w:t>
+              <w:t>10.6</w:t>
             </w:r>
           </w:p>
         </w:tc>
@@ -1911,7 +1911,7 @@
           </w:tcPr>
           <w:p>
             <w:r>
-              <w:t>57.3</w:t>
+              <w:t>48.0</w:t>
             </w:r>
           </w:p>
         </w:tc>
@@ -1921,7 +1921,7 @@
           </w:tcPr>
           <w:p>
             <w:r>
-              <w:t>8.6</w:t>
+              <w:t>7.2</w:t>
             </w:r>
           </w:p>
         </w:tc>
@@ -2007,7 +2007,7 @@
           </w:tcPr>
           <w:p>
             <w:r>
-              <w:t>83.5</w:t>
+              <w:t>80.4</w:t>
             </w:r>
           </w:p>
         </w:tc>
@@ -2017,7 +2017,7 @@
           </w:tcPr>
           <w:p>
             <w:r>
-              <w:t>8.3</w:t>
+              <w:t>8.0</w:t>
             </w:r>
           </w:p>
         </w:tc>
@@ -2039,7 +2039,7 @@
           </w:tcPr>
           <w:p>
             <w:r>
-              <w:t>50.7</w:t>
+              <w:t>48.2</w:t>
             </w:r>
           </w:p>
         </w:tc>
@@ -2049,7 +2049,7 @@
           </w:tcPr>
           <w:p>
             <w:r>
-              <w:t>12.7</w:t>
+              <w:t>12.1</w:t>
             </w:r>
           </w:p>
         </w:tc>
@@ -2090,7 +2090,7 @@
           </w:tcPr>
           <w:p>
             <w:r>
-              <w:t>$577.98</w:t>
+              <w:t>$570.22</w:t>
             </w:r>
           </w:p>
         </w:tc>
@@ -2112,7 +2112,7 @@
           </w:tcPr>
           <w:p>
             <w:r>
-              <w:t>15.60%</w:t>
+              <w:t>14.04%</w:t>
             </w:r>
           </w:p>
         </w:tc>
@@ -2134,7 +2134,7 @@
           </w:tcPr>
           <w:p>
             <w:r>
-              <w:t>$18.25</w:t>
+              <w:t>$10.49</w:t>
             </w:r>
           </w:p>
         </w:tc>
@@ -2178,7 +2178,7 @@
           </w:tcPr>
           <w:p>
             <w:r>
-              <w:t>0.6533</w:t>
+              <w:t>0.6410</w:t>
             </w:r>
           </w:p>
         </w:tc>
@@ -2200,7 +2200,7 @@
           </w:tcPr>
           <w:p>
             <w:r>
-              <w:t>0.5000 / 0.7091</w:t>
+              <w:t>0.5000 / 0.6897</w:t>
             </w:r>
           </w:p>
         </w:tc>
@@ -2222,7 +2222,7 @@
           </w:tcPr>
           <w:p>
             <w:r>
-              <w:t>1.1587</w:t>
+              <w:t>1.0839</w:t>
             </w:r>
           </w:p>
         </w:tc>
@@ -2244,7 +2244,7 @@
           </w:tcPr>
           <w:p>
             <w:r>
-              <w:t>75 / 75</w:t>
+              <w:t>78 / 78</w:t>
             </w:r>
           </w:p>
         </w:tc>
@@ -2266,7 +2266,7 @@
           </w:tcPr>
           <w:p>
             <w:r>
-              <w:t>$0.24</w:t>
+              <w:t>$0.13</w:t>
             </w:r>
           </w:p>
         </w:tc>
@@ -2397,7 +2397,7 @@
           </w:tcPr>
           <w:p>
             <w:r>
-              <w:t>0.550</w:t>
+              <w:t>0.563</w:t>
             </w:r>
           </w:p>
         </w:tc>
@@ -2407,7 +2407,7 @@
           </w:tcPr>
           <w:p>
             <w:r>
-              <w:t>down</w:t>
+              <w:t>up</w:t>
             </w:r>
           </w:p>
         </w:tc>
@@ -2417,7 +2417,7 @@
           </w:tcPr>
           <w:p>
             <w:r>
-              <w:t>Yes</w:t>
+              <w:t>No</w:t>
             </w:r>
           </w:p>
         </w:tc>
@@ -2427,7 +2427,7 @@
           </w:tcPr>
           <w:p>
             <w:r>
-              <w:t>$4.09</w:t>
+              <w:t>$-5.00</w:t>
             </w:r>
           </w:p>
         </w:tc>
@@ -2449,7 +2449,7 @@
           </w:tcPr>
           <w:p>
             <w:r>
-              <w:t>0.650</w:t>
+              <w:t>0.670</w:t>
             </w:r>
           </w:p>
         </w:tc>
@@ -2501,7 +2501,7 @@
           </w:tcPr>
           <w:p>
             <w:r>
-              <w:t>0.700</w:t>
+              <w:t>0.690</w:t>
             </w:r>
           </w:p>
         </w:tc>
@@ -2511,7 +2511,7 @@
           </w:tcPr>
           <w:p>
             <w:r>
-              <w:t>up</w:t>
+              <w:t>down</w:t>
             </w:r>
           </w:p>
         </w:tc>
@@ -2521,7 +2521,7 @@
           </w:tcPr>
           <w:p>
             <w:r>
-              <w:t>No</w:t>
+              <w:t>Yes</w:t>
             </w:r>
           </w:p>
         </w:tc>
@@ -2531,7 +2531,7 @@
           </w:tcPr>
           <w:p>
             <w:r>
-              <w:t>$-5.00</w:t>
+              <w:t>$2.25</w:t>
             </w:r>
           </w:p>
         </w:tc>
@@ -2553,7 +2553,7 @@
           </w:tcPr>
           <w:p>
             <w:r>
-              <w:t>0.630</w:t>
+              <w:t>0.550</w:t>
             </w:r>
           </w:p>
         </w:tc>
@@ -2583,7 +2583,7 @@
           </w:tcPr>
           <w:p>
             <w:r>
-              <w:t>$2.94</w:t>
+              <w:t>$4.09</w:t>
             </w:r>
           </w:p>
         </w:tc>
@@ -2615,7 +2615,7 @@
           </w:tcPr>
           <w:p>
             <w:r>
-              <w:t>down</w:t>
+              <w:t>up</w:t>
             </w:r>
           </w:p>
         </w:tc>
@@ -2625,7 +2625,7 @@
           </w:tcPr>
           <w:p>
             <w:r>
-              <w:t>Yes</w:t>
+              <w:t>No</w:t>
             </w:r>
           </w:p>
         </w:tc>
@@ -2635,7 +2635,7 @@
           </w:tcPr>
           <w:p>
             <w:r>
-              <w:t>$2.69</w:t>
+              <w:t>$-5.00</w:t>
             </w:r>
           </w:p>
         </w:tc>
@@ -2657,7 +2657,7 @@
           </w:tcPr>
           <w:p>
             <w:r>
-              <w:t>0.670</w:t>
+              <w:t>0.700</w:t>
             </w:r>
           </w:p>
         </w:tc>
@@ -2667,7 +2667,7 @@
           </w:tcPr>
           <w:p>
             <w:r>
-              <w:t>down</w:t>
+              <w:t>up</w:t>
             </w:r>
           </w:p>
         </w:tc>
@@ -2677,7 +2677,7 @@
           </w:tcPr>
           <w:p>
             <w:r>
-              <w:t>Yes</w:t>
+              <w:t>No</w:t>
             </w:r>
           </w:p>
         </w:tc>
@@ -2687,7 +2687,7 @@
           </w:tcPr>
           <w:p>
             <w:r>
-              <w:t>$2.46</w:t>
+              <w:t>$-5.00</w:t>
             </w:r>
           </w:p>
         </w:tc>
@@ -2709,7 +2709,7 @@
           </w:tcPr>
           <w:p>
             <w:r>
-              <w:t>0.700</w:t>
+              <w:t>0.630</w:t>
             </w:r>
           </w:p>
         </w:tc>
@@ -2739,7 +2739,7 @@
           </w:tcPr>
           <w:p>
             <w:r>
-              <w:t>$2.14</w:t>
+              <w:t>$2.94</w:t>
             </w:r>
           </w:p>
         </w:tc>
@@ -2761,7 +2761,7 @@
           </w:tcPr>
           <w:p>
             <w:r>
-              <w:t>0.680</w:t>
+              <w:t>0.650</w:t>
             </w:r>
           </w:p>
         </w:tc>
@@ -2771,7 +2771,7 @@
           </w:tcPr>
           <w:p>
             <w:r>
-              <w:t>up</w:t>
+              <w:t>down</w:t>
             </w:r>
           </w:p>
         </w:tc>
@@ -2781,7 +2781,7 @@
           </w:tcPr>
           <w:p>
             <w:r>
-              <w:t>No</w:t>
+              <w:t>Yes</w:t>
             </w:r>
           </w:p>
         </w:tc>
@@ -2791,7 +2791,7 @@
           </w:tcPr>
           <w:p>
             <w:r>
-              <w:t>$-5.00</w:t>
+              <w:t>$2.69</w:t>
             </w:r>
           </w:p>
         </w:tc>
@@ -2813,7 +2813,7 @@
           </w:tcPr>
           <w:p>
             <w:r>
-              <w:t>0.610</w:t>
+              <w:t>0.670</w:t>
             </w:r>
           </w:p>
         </w:tc>
@@ -2843,7 +2843,7 @@
           </w:tcPr>
           <w:p>
             <w:r>
-              <w:t>$3.20</w:t>
+              <w:t>$2.46</w:t>
             </w:r>
           </w:p>
         </w:tc>
@@ -2865,7 +2865,7 @@
           </w:tcPr>
           <w:p>
             <w:r>
-              <w:t>0.590</w:t>
+              <w:t>0.700</w:t>
             </w:r>
           </w:p>
         </w:tc>
@@ -2875,7 +2875,7 @@
           </w:tcPr>
           <w:p>
             <w:r>
-              <w:t>up</w:t>
+              <w:t>down</w:t>
             </w:r>
           </w:p>
         </w:tc>
@@ -2885,7 +2885,7 @@
           </w:tcPr>
           <w:p>
             <w:r>
-              <w:t>No</w:t>
+              <w:t>Yes</w:t>
             </w:r>
           </w:p>
         </w:tc>
@@ -2895,7 +2895,7 @@
           </w:tcPr>
           <w:p>
             <w:r>
-              <w:t>$-5.00</w:t>
+              <w:t>$2.14</w:t>
             </w:r>
           </w:p>
         </w:tc>
@@ -2917,7 +2917,7 @@
           </w:tcPr>
           <w:p>
             <w:r>
-              <w:t>0.630</w:t>
+              <w:t>0.680</w:t>
             </w:r>
           </w:p>
         </w:tc>
@@ -2927,7 +2927,7 @@
           </w:tcPr>
           <w:p>
             <w:r>
-              <w:t>down</w:t>
+              <w:t>up</w:t>
             </w:r>
           </w:p>
         </w:tc>
@@ -2937,7 +2937,7 @@
           </w:tcPr>
           <w:p>
             <w:r>
-              <w:t>Yes</w:t>
+              <w:t>No</w:t>
             </w:r>
           </w:p>
         </w:tc>
@@ -2947,7 +2947,7 @@
           </w:tcPr>
           <w:p>
             <w:r>
-              <w:t>$2.94</w:t>
+              <w:t>$-5.00</w:t>
             </w:r>
           </w:p>
         </w:tc>
@@ -2969,7 +2969,7 @@
           </w:tcPr>
           <w:p>
             <w:r>
-              <w:t>0.520</w:t>
+              <w:t>0.610</w:t>
             </w:r>
           </w:p>
         </w:tc>
@@ -2999,7 +2999,7 @@
           </w:tcPr>
           <w:p>
             <w:r>
-              <w:t>$4.62</w:t>
+              <w:t>$3.20</w:t>
             </w:r>
           </w:p>
         </w:tc>
@@ -3021,7 +3021,7 @@
           </w:tcPr>
           <w:p>
             <w:r>
-              <w:t>0.700</w:t>
+              <w:t>0.590</w:t>
             </w:r>
           </w:p>
         </w:tc>
@@ -3125,7 +3125,7 @@
           </w:tcPr>
           <w:p>
             <w:r>
-              <w:t>0.670</w:t>
+              <w:t>0.520</w:t>
             </w:r>
           </w:p>
         </w:tc>
@@ -3155,7 +3155,7 @@
           </w:tcPr>
           <w:p>
             <w:r>
-              <w:t>$2.46</w:t>
+              <w:t>$4.62</w:t>
             </w:r>
           </w:p>
         </w:tc>
@@ -3319,7 +3319,7 @@
           </w:tcPr>
           <w:p>
             <w:r>
-              <w:t>96.0</w:t>
+              <w:t>96.1</w:t>
             </w:r>
           </w:p>
         </w:tc>
@@ -3433,17 +3433,17 @@
     </w:tbl>
     <w:p>
       <w:r>
-        <w:t>Ticks: 989 · Reconciled: True · Readiness: not_ready</w:t>
+        <w:t>Ticks: 357 · Reconciled: True · Readiness: not_ready</w:t>
       </w:r>
     </w:p>
     <w:p>
       <w:r>
-        <w:t>Candidates created: 42187 · Terminals: {'accepted': 75, 'rejected': 37274, 'skipped': 4672, 'expired': 0, 'missing_data': 166}</w:t>
+        <w:t>Candidates created: 43868 · Terminals: {'accepted': 78, 'rejected': 38542, 'skipped': 5075, 'expired': 0, 'missing_data': 173}</w:t>
       </w:r>
     </w:p>
     <w:p>
       <w:r>
-        <w:t>Rejected by stage: {'directional': 27632, 'execution_gate': 153, 'context_gate': 876, 'directional_allowlist': 1364, 'down_bias_gate': 538, 'mtf_gate': 275, 'grok_decider': 3540, 'execution_realistic': 3, 'verifier': 61, 'mispricing_gate': 50, 'baseline_cohort_gate': 2782}</w:t>
+        <w:t>Rejected by stage: {'directional': 28852, 'execution_gate': 153, 'context_gate': 876, 'directional_allowlist': 1364, 'down_bias_gate': 538, 'mtf_gate': 275, 'grok_decider': 3540, 'execution_realistic': 3, 'verifier': 61, 'mispricing_gate': 50, 'baseline_cohort_gate': 2830}</w:t>
       </w:r>
     </w:p>
     <w:p>
@@ -4018,7 +4018,7 @@
     </w:p>
     <w:p>
       <w:r>
-        <w:t>Section score: 34.6 / 100  (Grade: F)</w:t>
+        <w:t>Section score: 36.9 / 100  (Grade: F)</w:t>
       </w:r>
     </w:p>
     <w:p>
@@ -4161,7 +4161,7 @@
           </w:tcPr>
           <w:p>
             <w:r>
-              <w:t>0.4</w:t>
+              <w:t>0.0</w:t>
             </w:r>
           </w:p>
         </w:tc>
@@ -4171,7 +4171,7 @@
           </w:tcPr>
           <w:p>
             <w:r>
-              <w:t>0.1</w:t>
+              <w:t>0.0</w:t>
             </w:r>
           </w:p>
         </w:tc>
@@ -4193,7 +4193,7 @@
           </w:tcPr>
           <w:p>
             <w:r>
-              <w:t>14.0</w:t>
+              <w:t>19.4</w:t>
             </w:r>
           </w:p>
         </w:tc>
@@ -4203,7 +4203,7 @@
           </w:tcPr>
           <w:p>
             <w:r>
-              <w:t>2.1</w:t>
+              <w:t>2.9</w:t>
             </w:r>
           </w:p>
         </w:tc>
@@ -4225,7 +4225,7 @@
           </w:tcPr>
           <w:p>
             <w:r>
-              <w:t>44.2</w:t>
+              <w:t>48.6</w:t>
             </w:r>
           </w:p>
         </w:tc>
@@ -4235,7 +4235,7 @@
           </w:tcPr>
           <w:p>
             <w:r>
-              <w:t>13.3</w:t>
+              <w:t>14.6</w:t>
             </w:r>
           </w:p>
         </w:tc>
@@ -4257,7 +4257,7 @@
           </w:tcPr>
           <w:p>
             <w:r>
-              <w:t>1.0</w:t>
+              <w:t>2.9</w:t>
             </w:r>
           </w:p>
         </w:tc>
@@ -4267,7 +4267,7 @@
           </w:tcPr>
           <w:p>
             <w:r>
-              <w:t>0.1</w:t>
+              <w:t>0.4</w:t>
             </w:r>
           </w:p>
         </w:tc>
@@ -4330,7 +4330,7 @@
           </w:tcPr>
           <w:p>
             <w:r>
-              <w:t>0.6667</w:t>
+              <w:t>0.6296</w:t>
             </w:r>
           </w:p>
         </w:tc>
@@ -4352,7 +4352,7 @@
           </w:tcPr>
           <w:p>
             <w:r>
-              <w:t>0.4565</w:t>
+              <w:t>0.4694</w:t>
             </w:r>
           </w:p>
         </w:tc>
@@ -4374,7 +4374,7 @@
           </w:tcPr>
           <w:p>
             <w:r>
-              <w:t>0.4524</w:t>
+              <w:t>0.4471</w:t>
             </w:r>
           </w:p>
         </w:tc>
@@ -4396,7 +4396,7 @@
           </w:tcPr>
           <w:p>
             <w:r>
-              <w:t>0.5021</w:t>
+              <w:t>0.5000</w:t>
             </w:r>
           </w:p>
         </w:tc>
@@ -4426,7 +4426,7 @@
     </w:tbl>
     <w:p>
       <w:r>
-        <w:t>TV alerts: received 87 · valid 70 · rejected 17</w:t>
+        <w:t>TV alerts: received 114 · valid 97 · rejected 17</w:t>
       </w:r>
     </w:p>
     <w:sectPr>

</xml_diff>

<commit_message>
chore(reports): VPS full report 2026-06-27 00:25 UTC (81 settled, WR 61.7%, PF 0.9678)
</commit_message>
<xml_diff>
--- a/vps_full_reports/latest/report.docx
+++ b/vps_full_reports/latest/report.docx
@@ -20,7 +20,7 @@
           <w:color w:val="666666"/>
           <w:sz w:val="20"/>
         </w:rPr>
-        <w:t>PAPER ONLY  ·  reconciled=True  ·  ticks=357</w:t>
+        <w:t>PAPER ONLY  ·  reconciled=True  ·  ticks=45</w:t>
       </w:r>
     </w:p>
     <w:p>
@@ -33,7 +33,7 @@
     </w:p>
     <w:p>
       <w:r>
-        <w:t>Overall score: 68.3 / 100  (Grade: D)</w:t>
+        <w:t>Overall score: 67.4 / 100  (Grade: D)</w:t>
       </w:r>
     </w:p>
     <w:tbl>
@@ -107,7 +107,7 @@
           </w:tcPr>
           <w:p>
             <w:r>
-              <w:t>72.9</w:t>
+              <w:t>64.5</w:t>
             </w:r>
           </w:p>
         </w:tc>
@@ -117,7 +117,7 @@
           </w:tcPr>
           <w:p>
             <w:r>
-              <w:t>C</w:t>
+              <w:t>D</w:t>
             </w:r>
           </w:p>
         </w:tc>
@@ -191,7 +191,7 @@
           </w:tcPr>
           <w:p>
             <w:r>
-              <w:t>36.9</w:t>
+              <w:t>50.2</w:t>
             </w:r>
           </w:p>
         </w:tc>
@@ -319,7 +319,7 @@
           </w:tcPr>
           <w:p>
             <w:r>
-              <w:t>2026-06-26 17:50:49</w:t>
+              <w:t>2026-06-26 18:38:05</w:t>
             </w:r>
           </w:p>
         </w:tc>
@@ -329,7 +329,7 @@
           </w:tcPr>
           <w:p>
             <w:r>
-              <w:t>64</w:t>
+              <w:t>68</w:t>
             </w:r>
           </w:p>
         </w:tc>
@@ -339,7 +339,7 @@
           </w:tcPr>
           <w:p>
             <w:r>
-              <w:t>78.4</w:t>
+              <w:t>75.5</w:t>
             </w:r>
           </w:p>
         </w:tc>
@@ -359,7 +359,7 @@
           </w:tcPr>
           <w:p>
             <w:r>
-              <w:t>37.7</w:t>
+              <w:t>37.0</w:t>
             </w:r>
           </w:p>
         </w:tc>
@@ -369,7 +369,7 @@
           </w:tcPr>
           <w:p>
             <w:r>
-              <w:t>71.2</w:t>
+              <w:t>69.6</w:t>
             </w:r>
           </w:p>
         </w:tc>
@@ -379,7 +379,7 @@
           </w:tcPr>
           <w:p>
             <w:r>
-              <w:t>290</w:t>
+              <w:t>175</w:t>
             </w:r>
           </w:p>
         </w:tc>
@@ -391,7 +391,7 @@
           </w:tcPr>
           <w:p>
             <w:r>
-              <w:t>2026-06-26 17:58:04</w:t>
+              <w:t>2026-06-26 18:42:04</w:t>
             </w:r>
           </w:p>
         </w:tc>
@@ -401,7 +401,7 @@
           </w:tcPr>
           <w:p>
             <w:r>
-              <w:t>65</w:t>
+              <w:t>69</w:t>
             </w:r>
           </w:p>
         </w:tc>
@@ -411,7 +411,7 @@
           </w:tcPr>
           <w:p>
             <w:r>
-              <w:t>75.0</w:t>
+              <w:t>76.9</w:t>
             </w:r>
           </w:p>
         </w:tc>
@@ -431,7 +431,7 @@
           </w:tcPr>
           <w:p>
             <w:r>
-              <w:t>37.7</w:t>
+              <w:t>37.0</w:t>
             </w:r>
           </w:p>
         </w:tc>
@@ -441,7 +441,7 @@
           </w:tcPr>
           <w:p>
             <w:r>
-              <w:t>69.5</w:t>
+              <w:t>70.3</w:t>
             </w:r>
           </w:p>
         </w:tc>
@@ -451,7 +451,7 @@
           </w:tcPr>
           <w:p>
             <w:r>
-              <w:t>399</w:t>
+              <w:t>229</w:t>
             </w:r>
           </w:p>
         </w:tc>
@@ -463,7 +463,7 @@
           </w:tcPr>
           <w:p>
             <w:r>
-              <w:t>2026-06-26 18:03:04</w:t>
+              <w:t>2026-06-26 18:57:18</w:t>
             </w:r>
           </w:p>
         </w:tc>
@@ -473,7 +473,7 @@
           </w:tcPr>
           <w:p>
             <w:r>
-              <w:t>66</w:t>
+              <w:t>70</w:t>
             </w:r>
           </w:p>
         </w:tc>
@@ -483,7 +483,7 @@
           </w:tcPr>
           <w:p>
             <w:r>
-              <w:t>76.8</w:t>
+              <w:t>78.4</w:t>
             </w:r>
           </w:p>
         </w:tc>
@@ -493,7 +493,7 @@
           </w:tcPr>
           <w:p>
             <w:r>
-              <w:t>90.3</w:t>
+              <w:t>90.4</w:t>
             </w:r>
           </w:p>
         </w:tc>
@@ -503,7 +503,7 @@
           </w:tcPr>
           <w:p>
             <w:r>
-              <w:t>36.9</w:t>
+              <w:t>37.1</w:t>
             </w:r>
           </w:p>
         </w:tc>
@@ -513,7 +513,7 @@
           </w:tcPr>
           <w:p>
             <w:r>
-              <w:t>70.2</w:t>
+              <w:t>71.1</w:t>
             </w:r>
           </w:p>
         </w:tc>
@@ -523,7 +523,7 @@
           </w:tcPr>
           <w:p>
             <w:r>
-              <w:t>30</w:t>
+              <w:t>420</w:t>
             </w:r>
           </w:p>
         </w:tc>
@@ -535,7 +535,7 @@
           </w:tcPr>
           <w:p>
             <w:r>
-              <w:t>2026-06-26 18:32:46</w:t>
+              <w:t>2026-06-26 19:27:22</w:t>
             </w:r>
           </w:p>
         </w:tc>
@@ -545,7 +545,7 @@
           </w:tcPr>
           <w:p>
             <w:r>
-              <w:t>67</w:t>
+              <w:t>70</w:t>
             </w:r>
           </w:p>
         </w:tc>
@@ -555,7 +555,7 @@
           </w:tcPr>
           <w:p>
             <w:r>
-              <w:t>78.8</w:t>
+              <w:t>78.4</w:t>
             </w:r>
           </w:p>
         </w:tc>
@@ -565,7 +565,7 @@
           </w:tcPr>
           <w:p>
             <w:r>
-              <w:t>90.3</w:t>
+              <w:t>90.4</w:t>
             </w:r>
           </w:p>
         </w:tc>
@@ -575,7 +575,7 @@
           </w:tcPr>
           <w:p>
             <w:r>
-              <w:t>37.0</w:t>
+              <w:t>37.1</w:t>
             </w:r>
           </w:p>
         </w:tc>
@@ -585,7 +585,7 @@
           </w:tcPr>
           <w:p>
             <w:r>
-              <w:t>71.2</w:t>
+              <w:t>71.1</w:t>
             </w:r>
           </w:p>
         </w:tc>
@@ -595,7 +595,7 @@
           </w:tcPr>
           <w:p>
             <w:r>
-              <w:t>98</w:t>
+              <w:t>793</w:t>
             </w:r>
           </w:p>
         </w:tc>
@@ -607,7 +607,7 @@
           </w:tcPr>
           <w:p>
             <w:r>
-              <w:t>2026-06-26 18:38:05</w:t>
+              <w:t>2026-06-26 19:44:43</w:t>
             </w:r>
           </w:p>
         </w:tc>
@@ -617,7 +617,7 @@
           </w:tcPr>
           <w:p>
             <w:r>
-              <w:t>68</w:t>
+              <w:t>71</w:t>
             </w:r>
           </w:p>
         </w:tc>
@@ -627,7 +627,7 @@
           </w:tcPr>
           <w:p>
             <w:r>
-              <w:t>75.5</w:t>
+              <w:t>80.0</w:t>
             </w:r>
           </w:p>
         </w:tc>
@@ -637,7 +637,7 @@
           </w:tcPr>
           <w:p>
             <w:r>
-              <w:t>90.3</w:t>
+              <w:t>90.4</w:t>
             </w:r>
           </w:p>
         </w:tc>
@@ -647,7 +647,7 @@
           </w:tcPr>
           <w:p>
             <w:r>
-              <w:t>37.0</w:t>
+              <w:t>36.4</w:t>
             </w:r>
           </w:p>
         </w:tc>
@@ -657,7 +657,7 @@
           </w:tcPr>
           <w:p>
             <w:r>
-              <w:t>69.6</w:t>
+              <w:t>71.7</w:t>
             </w:r>
           </w:p>
         </w:tc>
@@ -667,7 +667,7 @@
           </w:tcPr>
           <w:p>
             <w:r>
-              <w:t>175</w:t>
+              <w:t>1</w:t>
             </w:r>
           </w:p>
         </w:tc>
@@ -679,7 +679,7 @@
           </w:tcPr>
           <w:p>
             <w:r>
-              <w:t>2026-06-26 18:42:04</w:t>
+              <w:t>2026-06-26 20:03:09</w:t>
             </w:r>
           </w:p>
         </w:tc>
@@ -689,7 +689,7 @@
           </w:tcPr>
           <w:p>
             <w:r>
-              <w:t>69</w:t>
+              <w:t>72</w:t>
             </w:r>
           </w:p>
         </w:tc>
@@ -699,7 +699,7 @@
           </w:tcPr>
           <w:p>
             <w:r>
-              <w:t>76.9</w:t>
+              <w:t>81.7</w:t>
             </w:r>
           </w:p>
         </w:tc>
@@ -709,7 +709,7 @@
           </w:tcPr>
           <w:p>
             <w:r>
-              <w:t>90.3</w:t>
+              <w:t>90.4</w:t>
             </w:r>
           </w:p>
         </w:tc>
@@ -719,7 +719,7 @@
           </w:tcPr>
           <w:p>
             <w:r>
-              <w:t>37.0</w:t>
+              <w:t>36.4</w:t>
             </w:r>
           </w:p>
         </w:tc>
@@ -729,7 +729,7 @@
           </w:tcPr>
           <w:p>
             <w:r>
-              <w:t>70.3</w:t>
+              <w:t>72.5</w:t>
             </w:r>
           </w:p>
         </w:tc>
@@ -739,7 +739,7 @@
           </w:tcPr>
           <w:p>
             <w:r>
-              <w:t>229</w:t>
+              <w:t>242</w:t>
             </w:r>
           </w:p>
         </w:tc>
@@ -751,7 +751,7 @@
           </w:tcPr>
           <w:p>
             <w:r>
-              <w:t>2026-06-26 18:57:18</w:t>
+              <w:t>2026-06-26 20:33:07</w:t>
             </w:r>
           </w:p>
         </w:tc>
@@ -761,7 +761,7 @@
           </w:tcPr>
           <w:p>
             <w:r>
-              <w:t>70</w:t>
+              <w:t>73</w:t>
             </w:r>
           </w:p>
         </w:tc>
@@ -771,7 +771,7 @@
           </w:tcPr>
           <w:p>
             <w:r>
-              <w:t>78.4</w:t>
+              <w:t>78.5</w:t>
             </w:r>
           </w:p>
         </w:tc>
@@ -791,7 +791,7 @@
           </w:tcPr>
           <w:p>
             <w:r>
-              <w:t>37.1</w:t>
+              <w:t>36.4</w:t>
             </w:r>
           </w:p>
         </w:tc>
@@ -801,7 +801,7 @@
           </w:tcPr>
           <w:p>
             <w:r>
-              <w:t>71.1</w:t>
+              <w:t>71.0</w:t>
             </w:r>
           </w:p>
         </w:tc>
@@ -811,7 +811,7 @@
           </w:tcPr>
           <w:p>
             <w:r>
-              <w:t>420</w:t>
+              <w:t>361</w:t>
             </w:r>
           </w:p>
         </w:tc>
@@ -823,7 +823,7 @@
           </w:tcPr>
           <w:p>
             <w:r>
-              <w:t>2026-06-26 19:27:22</w:t>
+              <w:t>2026-06-26 20:42:23</w:t>
             </w:r>
           </w:p>
         </w:tc>
@@ -833,7 +833,7 @@
           </w:tcPr>
           <w:p>
             <w:r>
-              <w:t>70</w:t>
+              <w:t>74</w:t>
             </w:r>
           </w:p>
         </w:tc>
@@ -843,7 +843,7 @@
           </w:tcPr>
           <w:p>
             <w:r>
-              <w:t>78.4</w:t>
+              <w:t>75.4</w:t>
             </w:r>
           </w:p>
         </w:tc>
@@ -863,7 +863,7 @@
           </w:tcPr>
           <w:p>
             <w:r>
-              <w:t>37.1</w:t>
+              <w:t>34.5</w:t>
             </w:r>
           </w:p>
         </w:tc>
@@ -873,7 +873,7 @@
           </w:tcPr>
           <w:p>
             <w:r>
-              <w:t>71.1</w:t>
+              <w:t>68.9</w:t>
             </w:r>
           </w:p>
         </w:tc>
@@ -883,7 +883,7 @@
           </w:tcPr>
           <w:p>
             <w:r>
-              <w:t>793</w:t>
+              <w:t>485</w:t>
             </w:r>
           </w:p>
         </w:tc>
@@ -895,7 +895,7 @@
           </w:tcPr>
           <w:p>
             <w:r>
-              <w:t>2026-06-26 19:44:43</w:t>
+              <w:t>2026-06-26 21:12:24</w:t>
             </w:r>
           </w:p>
         </w:tc>
@@ -905,7 +905,7 @@
           </w:tcPr>
           <w:p>
             <w:r>
-              <w:t>71</w:t>
+              <w:t>74</w:t>
             </w:r>
           </w:p>
         </w:tc>
@@ -915,7 +915,7 @@
           </w:tcPr>
           <w:p>
             <w:r>
-              <w:t>80.0</w:t>
+              <w:t>75.4</w:t>
             </w:r>
           </w:p>
         </w:tc>
@@ -935,7 +935,7 @@
           </w:tcPr>
           <w:p>
             <w:r>
-              <w:t>36.4</w:t>
+              <w:t>34.6</w:t>
             </w:r>
           </w:p>
         </w:tc>
@@ -945,7 +945,7 @@
           </w:tcPr>
           <w:p>
             <w:r>
-              <w:t>71.7</w:t>
+              <w:t>69.0</w:t>
             </w:r>
           </w:p>
         </w:tc>
@@ -955,7 +955,7 @@
           </w:tcPr>
           <w:p>
             <w:r>
-              <w:t>1</w:t>
+              <w:t>853</w:t>
             </w:r>
           </w:p>
         </w:tc>
@@ -967,7 +967,7 @@
           </w:tcPr>
           <w:p>
             <w:r>
-              <w:t>2026-06-26 20:03:09</w:t>
+              <w:t>2026-06-26 21:21:11</w:t>
             </w:r>
           </w:p>
         </w:tc>
@@ -977,7 +977,7 @@
           </w:tcPr>
           <w:p>
             <w:r>
-              <w:t>72</w:t>
+              <w:t>75</w:t>
             </w:r>
           </w:p>
         </w:tc>
@@ -987,7 +987,7 @@
           </w:tcPr>
           <w:p>
             <w:r>
-              <w:t>81.7</w:t>
+              <w:t>77.6</w:t>
             </w:r>
           </w:p>
         </w:tc>
@@ -1007,7 +1007,7 @@
           </w:tcPr>
           <w:p>
             <w:r>
-              <w:t>36.4</w:t>
+              <w:t>34.6</w:t>
             </w:r>
           </w:p>
         </w:tc>
@@ -1017,7 +1017,7 @@
           </w:tcPr>
           <w:p>
             <w:r>
-              <w:t>72.5</w:t>
+              <w:t>70.0</w:t>
             </w:r>
           </w:p>
         </w:tc>
@@ -1027,7 +1027,7 @@
           </w:tcPr>
           <w:p>
             <w:r>
-              <w:t>242</w:t>
+              <w:t>972</w:t>
             </w:r>
           </w:p>
         </w:tc>
@@ -1039,7 +1039,7 @@
           </w:tcPr>
           <w:p>
             <w:r>
-              <w:t>2026-06-26 20:33:07</w:t>
+              <w:t>2026-06-26 21:51:11</w:t>
             </w:r>
           </w:p>
         </w:tc>
@@ -1049,7 +1049,7 @@
           </w:tcPr>
           <w:p>
             <w:r>
-              <w:t>73</w:t>
+              <w:t>75</w:t>
             </w:r>
           </w:p>
         </w:tc>
@@ -1059,7 +1059,7 @@
           </w:tcPr>
           <w:p>
             <w:r>
-              <w:t>78.5</w:t>
+              <w:t>77.6</w:t>
             </w:r>
           </w:p>
         </w:tc>
@@ -1079,7 +1079,7 @@
           </w:tcPr>
           <w:p>
             <w:r>
-              <w:t>36.4</w:t>
+              <w:t>34.6</w:t>
             </w:r>
           </w:p>
         </w:tc>
@@ -1089,7 +1089,7 @@
           </w:tcPr>
           <w:p>
             <w:r>
-              <w:t>71.0</w:t>
+              <w:t>70.0</w:t>
             </w:r>
           </w:p>
         </w:tc>
@@ -1099,7 +1099,7 @@
           </w:tcPr>
           <w:p>
             <w:r>
-              <w:t>361</w:t>
+              <w:t>22</w:t>
             </w:r>
           </w:p>
         </w:tc>
@@ -1111,7 +1111,7 @@
           </w:tcPr>
           <w:p>
             <w:r>
-              <w:t>2026-06-26 20:42:23</w:t>
+              <w:t>2026-06-26 21:52:24</w:t>
             </w:r>
           </w:p>
         </w:tc>
@@ -1121,7 +1121,7 @@
           </w:tcPr>
           <w:p>
             <w:r>
-              <w:t>74</w:t>
+              <w:t>76</w:t>
             </w:r>
           </w:p>
         </w:tc>
@@ -1131,7 +1131,7 @@
           </w:tcPr>
           <w:p>
             <w:r>
-              <w:t>75.4</w:t>
+              <w:t>78.9</w:t>
             </w:r>
           </w:p>
         </w:tc>
@@ -1151,7 +1151,7 @@
           </w:tcPr>
           <w:p>
             <w:r>
-              <w:t>34.5</w:t>
+              <w:t>34.0</w:t>
             </w:r>
           </w:p>
         </w:tc>
@@ -1161,7 +1161,7 @@
           </w:tcPr>
           <w:p>
             <w:r>
-              <w:t>68.9</w:t>
+              <w:t>70.6</w:t>
             </w:r>
           </w:p>
         </w:tc>
@@ -1171,7 +1171,7 @@
           </w:tcPr>
           <w:p>
             <w:r>
-              <w:t>485</w:t>
+              <w:t>40</w:t>
             </w:r>
           </w:p>
         </w:tc>
@@ -1183,7 +1183,7 @@
           </w:tcPr>
           <w:p>
             <w:r>
-              <w:t>2026-06-26 21:12:24</w:t>
+              <w:t>2026-06-26 22:22:25</w:t>
             </w:r>
           </w:p>
         </w:tc>
@@ -1193,7 +1193,7 @@
           </w:tcPr>
           <w:p>
             <w:r>
-              <w:t>74</w:t>
+              <w:t>76</w:t>
             </w:r>
           </w:p>
         </w:tc>
@@ -1203,7 +1203,7 @@
           </w:tcPr>
           <w:p>
             <w:r>
-              <w:t>75.4</w:t>
+              <w:t>78.9</w:t>
             </w:r>
           </w:p>
         </w:tc>
@@ -1223,7 +1223,7 @@
           </w:tcPr>
           <w:p>
             <w:r>
-              <w:t>34.6</w:t>
+              <w:t>34.1</w:t>
             </w:r>
           </w:p>
         </w:tc>
@@ -1233,7 +1233,7 @@
           </w:tcPr>
           <w:p>
             <w:r>
-              <w:t>69.0</w:t>
+              <w:t>70.6</w:t>
             </w:r>
           </w:p>
         </w:tc>
@@ -1243,7 +1243,7 @@
           </w:tcPr>
           <w:p>
             <w:r>
-              <w:t>853</w:t>
+              <w:t>490</w:t>
             </w:r>
           </w:p>
         </w:tc>
@@ -1255,7 +1255,7 @@
           </w:tcPr>
           <w:p>
             <w:r>
-              <w:t>2026-06-26 21:21:11</w:t>
+              <w:t>2026-06-26 22:52:28</w:t>
             </w:r>
           </w:p>
         </w:tc>
@@ -1265,7 +1265,7 @@
           </w:tcPr>
           <w:p>
             <w:r>
-              <w:t>75</w:t>
+              <w:t>76</w:t>
             </w:r>
           </w:p>
         </w:tc>
@@ -1275,7 +1275,7 @@
           </w:tcPr>
           <w:p>
             <w:r>
-              <w:t>77.6</w:t>
+              <w:t>78.9</w:t>
             </w:r>
           </w:p>
         </w:tc>
@@ -1295,7 +1295,7 @@
           </w:tcPr>
           <w:p>
             <w:r>
-              <w:t>34.6</w:t>
+              <w:t>34.4</w:t>
             </w:r>
           </w:p>
         </w:tc>
@@ -1305,7 +1305,7 @@
           </w:tcPr>
           <w:p>
             <w:r>
-              <w:t>70.0</w:t>
+              <w:t>70.7</w:t>
             </w:r>
           </w:p>
         </w:tc>
@@ -1315,7 +1315,7 @@
           </w:tcPr>
           <w:p>
             <w:r>
-              <w:t>972</w:t>
+              <w:t>278</w:t>
             </w:r>
           </w:p>
         </w:tc>
@@ -1327,7 +1327,7 @@
           </w:tcPr>
           <w:p>
             <w:r>
-              <w:t>2026-06-26 21:51:11</w:t>
+              <w:t>2026-06-26 23:00:58</w:t>
             </w:r>
           </w:p>
         </w:tc>
@@ -1337,7 +1337,7 @@
           </w:tcPr>
           <w:p>
             <w:r>
-              <w:t>75</w:t>
+              <w:t>77</w:t>
             </w:r>
           </w:p>
         </w:tc>
@@ -1347,7 +1347,7 @@
           </w:tcPr>
           <w:p>
             <w:r>
-              <w:t>77.6</w:t>
+              <w:t>75.9</w:t>
             </w:r>
           </w:p>
         </w:tc>
@@ -1367,7 +1367,7 @@
           </w:tcPr>
           <w:p>
             <w:r>
-              <w:t>34.6</w:t>
+              <w:t>35.6</w:t>
             </w:r>
           </w:p>
         </w:tc>
@@ -1377,7 +1377,7 @@
           </w:tcPr>
           <w:p>
             <w:r>
-              <w:t>70.0</w:t>
+              <w:t>69.5</w:t>
             </w:r>
           </w:p>
         </w:tc>
@@ -1387,7 +1387,7 @@
           </w:tcPr>
           <w:p>
             <w:r>
-              <w:t>22</w:t>
+              <w:t>35</w:t>
             </w:r>
           </w:p>
         </w:tc>
@@ -1399,7 +1399,7 @@
           </w:tcPr>
           <w:p>
             <w:r>
-              <w:t>2026-06-26 21:52:24</w:t>
+              <w:t>2026-06-26 23:18:02</w:t>
             </w:r>
           </w:p>
         </w:tc>
@@ -1409,7 +1409,7 @@
           </w:tcPr>
           <w:p>
             <w:r>
-              <w:t>76</w:t>
+              <w:t>78</w:t>
             </w:r>
           </w:p>
         </w:tc>
@@ -1419,7 +1419,7 @@
           </w:tcPr>
           <w:p>
             <w:r>
-              <w:t>78.9</w:t>
+              <w:t>72.9</w:t>
             </w:r>
           </w:p>
         </w:tc>
@@ -1439,7 +1439,7 @@
           </w:tcPr>
           <w:p>
             <w:r>
-              <w:t>34.0</w:t>
+              <w:t>36.9</w:t>
             </w:r>
           </w:p>
         </w:tc>
@@ -1449,7 +1449,7 @@
           </w:tcPr>
           <w:p>
             <w:r>
-              <w:t>70.6</w:t>
+              <w:t>68.3</w:t>
             </w:r>
           </w:p>
         </w:tc>
@@ -1459,7 +1459,7 @@
           </w:tcPr>
           <w:p>
             <w:r>
-              <w:t>40</w:t>
+              <w:t>291</w:t>
             </w:r>
           </w:p>
         </w:tc>
@@ -1471,7 +1471,7 @@
           </w:tcPr>
           <w:p>
             <w:r>
-              <w:t>2026-06-26 22:22:25</w:t>
+              <w:t>2026-06-26 23:44:05</w:t>
             </w:r>
           </w:p>
         </w:tc>
@@ -1481,7 +1481,7 @@
           </w:tcPr>
           <w:p>
             <w:r>
-              <w:t>76</w:t>
+              <w:t>78</w:t>
             </w:r>
           </w:p>
         </w:tc>
@@ -1491,7 +1491,7 @@
           </w:tcPr>
           <w:p>
             <w:r>
-              <w:t>78.9</w:t>
+              <w:t>72.9</w:t>
             </w:r>
           </w:p>
         </w:tc>
@@ -1511,7 +1511,7 @@
           </w:tcPr>
           <w:p>
             <w:r>
-              <w:t>34.1</w:t>
+              <w:t>49.0</w:t>
             </w:r>
           </w:p>
         </w:tc>
@@ -1521,7 +1521,7 @@
           </w:tcPr>
           <w:p>
             <w:r>
-              <w:t>70.6</w:t>
+              <w:t>71.3</w:t>
             </w:r>
           </w:p>
         </w:tc>
@@ -1531,7 +1531,7 @@
           </w:tcPr>
           <w:p>
             <w:r>
-              <w:t>490</w:t>
+              <w:t>253</w:t>
             </w:r>
           </w:p>
         </w:tc>
@@ -1543,7 +1543,7 @@
           </w:tcPr>
           <w:p>
             <w:r>
-              <w:t>2026-06-26 22:52:28</w:t>
+              <w:t>2026-06-26 23:45:02</w:t>
             </w:r>
           </w:p>
         </w:tc>
@@ -1553,7 +1553,7 @@
           </w:tcPr>
           <w:p>
             <w:r>
-              <w:t>76</w:t>
+              <w:t>79</w:t>
             </w:r>
           </w:p>
         </w:tc>
@@ -1563,7 +1563,7 @@
           </w:tcPr>
           <w:p>
             <w:r>
-              <w:t>78.9</w:t>
+              <w:t>70.1</w:t>
             </w:r>
           </w:p>
         </w:tc>
@@ -1583,7 +1583,7 @@
           </w:tcPr>
           <w:p>
             <w:r>
-              <w:t>34.4</w:t>
+              <w:t>49.0</w:t>
             </w:r>
           </w:p>
         </w:tc>
@@ -1593,7 +1593,7 @@
           </w:tcPr>
           <w:p>
             <w:r>
-              <w:t>70.7</w:t>
+              <w:t>69.9</w:t>
             </w:r>
           </w:p>
         </w:tc>
@@ -1603,7 +1603,7 @@
           </w:tcPr>
           <w:p>
             <w:r>
-              <w:t>278</w:t>
+              <w:t>267</w:t>
             </w:r>
           </w:p>
         </w:tc>
@@ -1615,7 +1615,7 @@
           </w:tcPr>
           <w:p>
             <w:r>
-              <w:t>2026-06-26 23:00:58</w:t>
+              <w:t>2026-06-27 00:02:46</w:t>
             </w:r>
           </w:p>
         </w:tc>
@@ -1625,7 +1625,7 @@
           </w:tcPr>
           <w:p>
             <w:r>
-              <w:t>77</w:t>
+              <w:t>80</w:t>
             </w:r>
           </w:p>
         </w:tc>
@@ -1635,7 +1635,7 @@
           </w:tcPr>
           <w:p>
             <w:r>
-              <w:t>75.9</w:t>
+              <w:t>67.3</w:t>
             </w:r>
           </w:p>
         </w:tc>
@@ -1655,7 +1655,7 @@
           </w:tcPr>
           <w:p>
             <w:r>
-              <w:t>35.6</w:t>
+              <w:t>50.1</w:t>
             </w:r>
           </w:p>
         </w:tc>
@@ -1665,7 +1665,7 @@
           </w:tcPr>
           <w:p>
             <w:r>
-              <w:t>69.5</w:t>
+              <w:t>68.8</w:t>
             </w:r>
           </w:p>
         </w:tc>
@@ -1675,7 +1675,7 @@
           </w:tcPr>
           <w:p>
             <w:r>
-              <w:t>35</w:t>
+              <w:t>533</w:t>
             </w:r>
           </w:p>
         </w:tc>
@@ -1687,7 +1687,7 @@
           </w:tcPr>
           <w:p>
             <w:r>
-              <w:t>2026-06-26 23:18:02</w:t>
+              <w:t>2026-06-27 00:18:01</w:t>
             </w:r>
           </w:p>
         </w:tc>
@@ -1697,7 +1697,7 @@
           </w:tcPr>
           <w:p>
             <w:r>
-              <w:t>78</w:t>
+              <w:t>81</w:t>
             </w:r>
           </w:p>
         </w:tc>
@@ -1707,7 +1707,7 @@
           </w:tcPr>
           <w:p>
             <w:r>
-              <w:t>72.9</w:t>
+              <w:t>64.5</w:t>
             </w:r>
           </w:p>
         </w:tc>
@@ -1727,7 +1727,7 @@
           </w:tcPr>
           <w:p>
             <w:r>
-              <w:t>36.9</w:t>
+              <w:t>50.2</w:t>
             </w:r>
           </w:p>
         </w:tc>
@@ -1737,7 +1737,7 @@
           </w:tcPr>
           <w:p>
             <w:r>
-              <w:t>68.3</w:t>
+              <w:t>67.4</w:t>
             </w:r>
           </w:p>
         </w:tc>
@@ -1747,7 +1747,7 @@
           </w:tcPr>
           <w:p>
             <w:r>
-              <w:t>291</w:t>
+              <w:t>762</w:t>
             </w:r>
           </w:p>
         </w:tc>
@@ -1768,7 +1768,7 @@
     </w:p>
     <w:p>
       <w:r>
-        <w:t>Section score: 72.9 / 100  (Grade: C)</w:t>
+        <w:t>Section score: 64.5 / 100  (Grade: D)</w:t>
       </w:r>
     </w:p>
     <w:p>
@@ -1879,7 +1879,7 @@
           </w:tcPr>
           <w:p>
             <w:r>
-              <w:t>71.0</w:t>
+              <w:t>41.0</w:t>
             </w:r>
           </w:p>
         </w:tc>
@@ -1889,7 +1889,7 @@
           </w:tcPr>
           <w:p>
             <w:r>
-              <w:t>10.6</w:t>
+              <w:t>6.1</w:t>
             </w:r>
           </w:p>
         </w:tc>
@@ -1911,7 +1911,7 @@
           </w:tcPr>
           <w:p>
             <w:r>
-              <w:t>48.0</w:t>
+              <w:t>33.5</w:t>
             </w:r>
           </w:p>
         </w:tc>
@@ -1921,7 +1921,7 @@
           </w:tcPr>
           <w:p>
             <w:r>
-              <w:t>7.2</w:t>
+              <w:t>5.0</w:t>
             </w:r>
           </w:p>
         </w:tc>
@@ -2007,7 +2007,7 @@
           </w:tcPr>
           <w:p>
             <w:r>
-              <w:t>80.4</w:t>
+              <w:t>74.9</w:t>
             </w:r>
           </w:p>
         </w:tc>
@@ -2017,7 +2017,7 @@
           </w:tcPr>
           <w:p>
             <w:r>
-              <w:t>8.0</w:t>
+              <w:t>7.5</w:t>
             </w:r>
           </w:p>
         </w:tc>
@@ -2039,7 +2039,7 @@
           </w:tcPr>
           <w:p>
             <w:r>
-              <w:t>48.2</w:t>
+              <w:t>43.5</w:t>
             </w:r>
           </w:p>
         </w:tc>
@@ -2049,7 +2049,7 @@
           </w:tcPr>
           <w:p>
             <w:r>
-              <w:t>12.1</w:t>
+              <w:t>10.9</w:t>
             </w:r>
           </w:p>
         </w:tc>
@@ -2090,7 +2090,7 @@
           </w:tcPr>
           <w:p>
             <w:r>
-              <w:t>$570.22</w:t>
+              <w:t>$555.22</w:t>
             </w:r>
           </w:p>
         </w:tc>
@@ -2112,7 +2112,7 @@
           </w:tcPr>
           <w:p>
             <w:r>
-              <w:t>14.04%</w:t>
+              <w:t>11.04%</w:t>
             </w:r>
           </w:p>
         </w:tc>
@@ -2134,7 +2134,7 @@
           </w:tcPr>
           <w:p>
             <w:r>
-              <w:t>$10.49</w:t>
+              <w:t>$-4.51</w:t>
             </w:r>
           </w:p>
         </w:tc>
@@ -2178,7 +2178,7 @@
           </w:tcPr>
           <w:p>
             <w:r>
-              <w:t>0.6410</w:t>
+              <w:t>0.6173</w:t>
             </w:r>
           </w:p>
         </w:tc>
@@ -2200,7 +2200,7 @@
           </w:tcPr>
           <w:p>
             <w:r>
-              <w:t>0.5000 / 0.6897</w:t>
+              <w:t>0.5000 / 0.6557</w:t>
             </w:r>
           </w:p>
         </w:tc>
@@ -2222,7 +2222,7 @@
           </w:tcPr>
           <w:p>
             <w:r>
-              <w:t>1.0839</w:t>
+              <w:t>0.9678</w:t>
             </w:r>
           </w:p>
         </w:tc>
@@ -2244,7 +2244,7 @@
           </w:tcPr>
           <w:p>
             <w:r>
-              <w:t>78 / 78</w:t>
+              <w:t>82 / 81</w:t>
             </w:r>
           </w:p>
         </w:tc>
@@ -2266,7 +2266,7 @@
           </w:tcPr>
           <w:p>
             <w:r>
-              <w:t>$0.13</w:t>
+              <w:t>$-0.06</w:t>
             </w:r>
           </w:p>
         </w:tc>
@@ -2397,7 +2397,7 @@
           </w:tcPr>
           <w:p>
             <w:r>
-              <w:t>0.563</w:t>
+              <w:t>0.650</w:t>
             </w:r>
           </w:p>
         </w:tc>
@@ -2407,7 +2407,7 @@
           </w:tcPr>
           <w:p>
             <w:r>
-              <w:t>up</w:t>
+              <w:t>—</w:t>
             </w:r>
           </w:p>
         </w:tc>
@@ -2417,7 +2417,7 @@
           </w:tcPr>
           <w:p>
             <w:r>
-              <w:t>No</w:t>
+              <w:t>—</w:t>
             </w:r>
           </w:p>
         </w:tc>
@@ -2427,7 +2427,7 @@
           </w:tcPr>
           <w:p>
             <w:r>
-              <w:t>$-5.00</w:t>
+              <w:t>$—</w:t>
             </w:r>
           </w:p>
         </w:tc>
@@ -2449,7 +2449,7 @@
           </w:tcPr>
           <w:p>
             <w:r>
-              <w:t>0.670</w:t>
+              <w:t>0.690</w:t>
             </w:r>
           </w:p>
         </w:tc>
@@ -2501,7 +2501,7 @@
           </w:tcPr>
           <w:p>
             <w:r>
-              <w:t>0.690</w:t>
+              <w:t>0.570</w:t>
             </w:r>
           </w:p>
         </w:tc>
@@ -2511,7 +2511,7 @@
           </w:tcPr>
           <w:p>
             <w:r>
-              <w:t>down</w:t>
+              <w:t>up</w:t>
             </w:r>
           </w:p>
         </w:tc>
@@ -2521,7 +2521,7 @@
           </w:tcPr>
           <w:p>
             <w:r>
-              <w:t>Yes</w:t>
+              <w:t>No</w:t>
             </w:r>
           </w:p>
         </w:tc>
@@ -2531,7 +2531,7 @@
           </w:tcPr>
           <w:p>
             <w:r>
-              <w:t>$2.25</w:t>
+              <w:t>$-5.00</w:t>
             </w:r>
           </w:p>
         </w:tc>
@@ -2553,7 +2553,7 @@
           </w:tcPr>
           <w:p>
             <w:r>
-              <w:t>0.550</w:t>
+              <w:t>0.600</w:t>
             </w:r>
           </w:p>
         </w:tc>
@@ -2563,7 +2563,7 @@
           </w:tcPr>
           <w:p>
             <w:r>
-              <w:t>down</w:t>
+              <w:t>up</w:t>
             </w:r>
           </w:p>
         </w:tc>
@@ -2573,7 +2573,7 @@
           </w:tcPr>
           <w:p>
             <w:r>
-              <w:t>Yes</w:t>
+              <w:t>No</w:t>
             </w:r>
           </w:p>
         </w:tc>
@@ -2583,7 +2583,7 @@
           </w:tcPr>
           <w:p>
             <w:r>
-              <w:t>$4.09</w:t>
+              <w:t>$-5.00</w:t>
             </w:r>
           </w:p>
         </w:tc>
@@ -2605,7 +2605,7 @@
           </w:tcPr>
           <w:p>
             <w:r>
-              <w:t>0.650</w:t>
+              <w:t>0.563</w:t>
             </w:r>
           </w:p>
         </w:tc>
@@ -2657,7 +2657,7 @@
           </w:tcPr>
           <w:p>
             <w:r>
-              <w:t>0.700</w:t>
+              <w:t>0.670</w:t>
             </w:r>
           </w:p>
         </w:tc>
@@ -2709,7 +2709,7 @@
           </w:tcPr>
           <w:p>
             <w:r>
-              <w:t>0.630</w:t>
+              <w:t>0.690</w:t>
             </w:r>
           </w:p>
         </w:tc>
@@ -2739,7 +2739,7 @@
           </w:tcPr>
           <w:p>
             <w:r>
-              <w:t>$2.94</w:t>
+              <w:t>$2.25</w:t>
             </w:r>
           </w:p>
         </w:tc>
@@ -2761,7 +2761,7 @@
           </w:tcPr>
           <w:p>
             <w:r>
-              <w:t>0.650</w:t>
+              <w:t>0.550</w:t>
             </w:r>
           </w:p>
         </w:tc>
@@ -2791,7 +2791,7 @@
           </w:tcPr>
           <w:p>
             <w:r>
-              <w:t>$2.69</w:t>
+              <w:t>$4.09</w:t>
             </w:r>
           </w:p>
         </w:tc>
@@ -2813,7 +2813,7 @@
           </w:tcPr>
           <w:p>
             <w:r>
-              <w:t>0.670</w:t>
+              <w:t>0.650</w:t>
             </w:r>
           </w:p>
         </w:tc>
@@ -2823,7 +2823,7 @@
           </w:tcPr>
           <w:p>
             <w:r>
-              <w:t>down</w:t>
+              <w:t>up</w:t>
             </w:r>
           </w:p>
         </w:tc>
@@ -2833,7 +2833,7 @@
           </w:tcPr>
           <w:p>
             <w:r>
-              <w:t>Yes</w:t>
+              <w:t>No</w:t>
             </w:r>
           </w:p>
         </w:tc>
@@ -2843,7 +2843,7 @@
           </w:tcPr>
           <w:p>
             <w:r>
-              <w:t>$2.46</w:t>
+              <w:t>$-5.00</w:t>
             </w:r>
           </w:p>
         </w:tc>
@@ -2875,7 +2875,7 @@
           </w:tcPr>
           <w:p>
             <w:r>
-              <w:t>down</w:t>
+              <w:t>up</w:t>
             </w:r>
           </w:p>
         </w:tc>
@@ -2885,7 +2885,7 @@
           </w:tcPr>
           <w:p>
             <w:r>
-              <w:t>Yes</w:t>
+              <w:t>No</w:t>
             </w:r>
           </w:p>
         </w:tc>
@@ -2895,7 +2895,7 @@
           </w:tcPr>
           <w:p>
             <w:r>
-              <w:t>$2.14</w:t>
+              <w:t>$-5.00</w:t>
             </w:r>
           </w:p>
         </w:tc>
@@ -2917,7 +2917,7 @@
           </w:tcPr>
           <w:p>
             <w:r>
-              <w:t>0.680</w:t>
+              <w:t>0.630</w:t>
             </w:r>
           </w:p>
         </w:tc>
@@ -2927,7 +2927,7 @@
           </w:tcPr>
           <w:p>
             <w:r>
-              <w:t>up</w:t>
+              <w:t>down</w:t>
             </w:r>
           </w:p>
         </w:tc>
@@ -2937,7 +2937,7 @@
           </w:tcPr>
           <w:p>
             <w:r>
-              <w:t>No</w:t>
+              <w:t>Yes</w:t>
             </w:r>
           </w:p>
         </w:tc>
@@ -2947,7 +2947,7 @@
           </w:tcPr>
           <w:p>
             <w:r>
-              <w:t>$-5.00</w:t>
+              <w:t>$2.94</w:t>
             </w:r>
           </w:p>
         </w:tc>
@@ -2969,7 +2969,7 @@
           </w:tcPr>
           <w:p>
             <w:r>
-              <w:t>0.610</w:t>
+              <w:t>0.650</w:t>
             </w:r>
           </w:p>
         </w:tc>
@@ -2999,7 +2999,7 @@
           </w:tcPr>
           <w:p>
             <w:r>
-              <w:t>$3.20</w:t>
+              <w:t>$2.69</w:t>
             </w:r>
           </w:p>
         </w:tc>
@@ -3021,7 +3021,7 @@
           </w:tcPr>
           <w:p>
             <w:r>
-              <w:t>0.590</w:t>
+              <w:t>0.670</w:t>
             </w:r>
           </w:p>
         </w:tc>
@@ -3031,7 +3031,7 @@
           </w:tcPr>
           <w:p>
             <w:r>
-              <w:t>up</w:t>
+              <w:t>down</w:t>
             </w:r>
           </w:p>
         </w:tc>
@@ -3041,7 +3041,7 @@
           </w:tcPr>
           <w:p>
             <w:r>
-              <w:t>No</w:t>
+              <w:t>Yes</w:t>
             </w:r>
           </w:p>
         </w:tc>
@@ -3051,7 +3051,7 @@
           </w:tcPr>
           <w:p>
             <w:r>
-              <w:t>$-5.00</w:t>
+              <w:t>$2.46</w:t>
             </w:r>
           </w:p>
         </w:tc>
@@ -3073,7 +3073,7 @@
           </w:tcPr>
           <w:p>
             <w:r>
-              <w:t>0.630</w:t>
+              <w:t>0.700</w:t>
             </w:r>
           </w:p>
         </w:tc>
@@ -3103,7 +3103,7 @@
           </w:tcPr>
           <w:p>
             <w:r>
-              <w:t>$2.94</w:t>
+              <w:t>$2.14</w:t>
             </w:r>
           </w:p>
         </w:tc>
@@ -3125,7 +3125,7 @@
           </w:tcPr>
           <w:p>
             <w:r>
-              <w:t>0.520</w:t>
+              <w:t>0.680</w:t>
             </w:r>
           </w:p>
         </w:tc>
@@ -3135,7 +3135,7 @@
           </w:tcPr>
           <w:p>
             <w:r>
-              <w:t>down</w:t>
+              <w:t>up</w:t>
             </w:r>
           </w:p>
         </w:tc>
@@ -3145,7 +3145,7 @@
           </w:tcPr>
           <w:p>
             <w:r>
-              <w:t>Yes</w:t>
+              <w:t>No</w:t>
             </w:r>
           </w:p>
         </w:tc>
@@ -3155,7 +3155,7 @@
           </w:tcPr>
           <w:p>
             <w:r>
-              <w:t>$4.62</w:t>
+              <w:t>$-5.00</w:t>
             </w:r>
           </w:p>
         </w:tc>
@@ -3433,17 +3433,17 @@
     </w:tbl>
     <w:p>
       <w:r>
-        <w:t>Ticks: 357 · Reconciled: True · Readiness: not_ready</w:t>
+        <w:t>Ticks: 45 · Reconciled: True · Readiness: not_ready</w:t>
       </w:r>
     </w:p>
     <w:p>
       <w:r>
-        <w:t>Candidates created: 43868 · Terminals: {'accepted': 78, 'rejected': 38542, 'skipped': 5075, 'expired': 0, 'missing_data': 173}</w:t>
+        <w:t>Candidates created: 44184 · Terminals: {'accepted': 82, 'rejected': 38767, 'skipped': 5158, 'expired': 0, 'missing_data': 177}</w:t>
       </w:r>
     </w:p>
     <w:p>
       <w:r>
-        <w:t>Rejected by stage: {'directional': 28852, 'execution_gate': 153, 'context_gate': 876, 'directional_allowlist': 1364, 'down_bias_gate': 538, 'mtf_gate': 275, 'grok_decider': 3540, 'execution_realistic': 3, 'verifier': 61, 'mispricing_gate': 50, 'baseline_cohort_gate': 2830}</w:t>
+        <w:t>Rejected by stage: {'directional': 29072, 'execution_gate': 155, 'context_gate': 879, 'directional_allowlist': 1364, 'down_bias_gate': 538, 'mtf_gate': 275, 'grok_decider': 3540, 'execution_realistic': 3, 'verifier': 61, 'mispricing_gate': 50, 'baseline_cohort_gate': 2830}</w:t>
       </w:r>
     </w:p>
     <w:p>
@@ -4018,7 +4018,7 @@
     </w:p>
     <w:p>
       <w:r>
-        <w:t>Section score: 36.9 / 100  (Grade: F)</w:t>
+        <w:t>Section score: 50.2 / 100  (Grade: F)</w:t>
       </w:r>
     </w:p>
     <w:p>
@@ -4161,7 +4161,7 @@
           </w:tcPr>
           <w:p>
             <w:r>
-              <w:t>0.0</w:t>
+              <w:t>0.5</w:t>
             </w:r>
           </w:p>
         </w:tc>
@@ -4171,7 +4171,7 @@
           </w:tcPr>
           <w:p>
             <w:r>
-              <w:t>0.0</w:t>
+              <w:t>0.1</w:t>
             </w:r>
           </w:p>
         </w:tc>
@@ -4193,7 +4193,7 @@
           </w:tcPr>
           <w:p>
             <w:r>
-              <w:t>19.4</w:t>
+              <w:t>100.0</w:t>
             </w:r>
           </w:p>
         </w:tc>
@@ -4203,7 +4203,7 @@
           </w:tcPr>
           <w:p>
             <w:r>
-              <w:t>2.9</w:t>
+              <w:t>15.0</w:t>
             </w:r>
           </w:p>
         </w:tc>
@@ -4225,7 +4225,7 @@
           </w:tcPr>
           <w:p>
             <w:r>
-              <w:t>48.6</w:t>
+              <w:t>51.3</w:t>
             </w:r>
           </w:p>
         </w:tc>
@@ -4235,7 +4235,7 @@
           </w:tcPr>
           <w:p>
             <w:r>
-              <w:t>14.6</w:t>
+              <w:t>15.4</w:t>
             </w:r>
           </w:p>
         </w:tc>
@@ -4257,7 +4257,7 @@
           </w:tcPr>
           <w:p>
             <w:r>
-              <w:t>2.9</w:t>
+              <w:t>4.5</w:t>
             </w:r>
           </w:p>
         </w:tc>
@@ -4267,7 +4267,7 @@
           </w:tcPr>
           <w:p>
             <w:r>
-              <w:t>0.4</w:t>
+              <w:t>0.7</w:t>
             </w:r>
           </w:p>
         </w:tc>
@@ -4330,7 +4330,7 @@
           </w:tcPr>
           <w:p>
             <w:r>
-              <w:t>0.6296</w:t>
+              <w:t>0.6071</w:t>
             </w:r>
           </w:p>
         </w:tc>
@@ -4352,7 +4352,7 @@
           </w:tcPr>
           <w:p>
             <w:r>
-              <w:t>0.4694</w:t>
+              <w:t>0.4800</w:t>
             </w:r>
           </w:p>
         </w:tc>
@@ -4374,7 +4374,7 @@
           </w:tcPr>
           <w:p>
             <w:r>
-              <w:t>0.4471</w:t>
+              <w:t>0.4535</w:t>
             </w:r>
           </w:p>
         </w:tc>
@@ -4426,7 +4426,7 @@
     </w:tbl>
     <w:p>
       <w:r>
-        <w:t>TV alerts: received 114 · valid 97 · rejected 17</w:t>
+        <w:t>TV alerts: received 126 · valid 109 · rejected 17</w:t>
       </w:r>
     </w:p>
     <w:sectPr>

</xml_diff>

<commit_message>
chore(reports): VPS full report 2026-06-27 02:22 UTC (84 settled, WR 61.9%, PF 0.9848)
</commit_message>
<xml_diff>
--- a/vps_full_reports/latest/report.docx
+++ b/vps_full_reports/latest/report.docx
@@ -20,7 +20,7 @@
           <w:color w:val="666666"/>
           <w:sz w:val="20"/>
         </w:rPr>
-        <w:t>PAPER ONLY  ·  reconciled=True  ·  ticks=45</w:t>
+        <w:t>PAPER ONLY  ·  reconciled=True  ·  ticks=65</w:t>
       </w:r>
     </w:p>
     <w:p>
@@ -33,7 +33,7 @@
     </w:p>
     <w:p>
       <w:r>
-        <w:t>Overall score: 67.4 / 100  (Grade: D)</w:t>
+        <w:t>Overall score: 67.3 / 100  (Grade: D)</w:t>
       </w:r>
     </w:p>
     <w:tbl>
@@ -107,7 +107,7 @@
           </w:tcPr>
           <w:p>
             <w:r>
-              <w:t>64.5</w:t>
+              <w:t>65.6</w:t>
             </w:r>
           </w:p>
         </w:tc>
@@ -191,7 +191,7 @@
           </w:tcPr>
           <w:p>
             <w:r>
-              <w:t>50.2</w:t>
+              <w:t>47.7</w:t>
             </w:r>
           </w:p>
         </w:tc>
@@ -319,7 +319,7 @@
           </w:tcPr>
           <w:p>
             <w:r>
-              <w:t>2026-06-26 18:38:05</w:t>
+              <w:t>2026-06-26 19:44:43</w:t>
             </w:r>
           </w:p>
         </w:tc>
@@ -329,7 +329,7 @@
           </w:tcPr>
           <w:p>
             <w:r>
-              <w:t>68</w:t>
+              <w:t>71</w:t>
             </w:r>
           </w:p>
         </w:tc>
@@ -339,7 +339,7 @@
           </w:tcPr>
           <w:p>
             <w:r>
-              <w:t>75.5</w:t>
+              <w:t>80.0</w:t>
             </w:r>
           </w:p>
         </w:tc>
@@ -349,7 +349,7 @@
           </w:tcPr>
           <w:p>
             <w:r>
-              <w:t>90.3</w:t>
+              <w:t>90.4</w:t>
             </w:r>
           </w:p>
         </w:tc>
@@ -359,7 +359,7 @@
           </w:tcPr>
           <w:p>
             <w:r>
-              <w:t>37.0</w:t>
+              <w:t>36.4</w:t>
             </w:r>
           </w:p>
         </w:tc>
@@ -369,7 +369,7 @@
           </w:tcPr>
           <w:p>
             <w:r>
-              <w:t>69.6</w:t>
+              <w:t>71.7</w:t>
             </w:r>
           </w:p>
         </w:tc>
@@ -379,7 +379,7 @@
           </w:tcPr>
           <w:p>
             <w:r>
-              <w:t>175</w:t>
+              <w:t>1</w:t>
             </w:r>
           </w:p>
         </w:tc>
@@ -391,7 +391,7 @@
           </w:tcPr>
           <w:p>
             <w:r>
-              <w:t>2026-06-26 18:42:04</w:t>
+              <w:t>2026-06-26 20:03:09</w:t>
             </w:r>
           </w:p>
         </w:tc>
@@ -401,7 +401,7 @@
           </w:tcPr>
           <w:p>
             <w:r>
-              <w:t>69</w:t>
+              <w:t>72</w:t>
             </w:r>
           </w:p>
         </w:tc>
@@ -411,7 +411,7 @@
           </w:tcPr>
           <w:p>
             <w:r>
-              <w:t>76.9</w:t>
+              <w:t>81.7</w:t>
             </w:r>
           </w:p>
         </w:tc>
@@ -421,7 +421,7 @@
           </w:tcPr>
           <w:p>
             <w:r>
-              <w:t>90.3</w:t>
+              <w:t>90.4</w:t>
             </w:r>
           </w:p>
         </w:tc>
@@ -431,7 +431,7 @@
           </w:tcPr>
           <w:p>
             <w:r>
-              <w:t>37.0</w:t>
+              <w:t>36.4</w:t>
             </w:r>
           </w:p>
         </w:tc>
@@ -441,7 +441,7 @@
           </w:tcPr>
           <w:p>
             <w:r>
-              <w:t>70.3</w:t>
+              <w:t>72.5</w:t>
             </w:r>
           </w:p>
         </w:tc>
@@ -451,7 +451,7 @@
           </w:tcPr>
           <w:p>
             <w:r>
-              <w:t>229</w:t>
+              <w:t>242</w:t>
             </w:r>
           </w:p>
         </w:tc>
@@ -463,7 +463,7 @@
           </w:tcPr>
           <w:p>
             <w:r>
-              <w:t>2026-06-26 18:57:18</w:t>
+              <w:t>2026-06-26 20:33:07</w:t>
             </w:r>
           </w:p>
         </w:tc>
@@ -473,7 +473,7 @@
           </w:tcPr>
           <w:p>
             <w:r>
-              <w:t>70</w:t>
+              <w:t>73</w:t>
             </w:r>
           </w:p>
         </w:tc>
@@ -483,7 +483,7 @@
           </w:tcPr>
           <w:p>
             <w:r>
-              <w:t>78.4</w:t>
+              <w:t>78.5</w:t>
             </w:r>
           </w:p>
         </w:tc>
@@ -503,7 +503,7 @@
           </w:tcPr>
           <w:p>
             <w:r>
-              <w:t>37.1</w:t>
+              <w:t>36.4</w:t>
             </w:r>
           </w:p>
         </w:tc>
@@ -513,7 +513,7 @@
           </w:tcPr>
           <w:p>
             <w:r>
-              <w:t>71.1</w:t>
+              <w:t>71.0</w:t>
             </w:r>
           </w:p>
         </w:tc>
@@ -523,7 +523,7 @@
           </w:tcPr>
           <w:p>
             <w:r>
-              <w:t>420</w:t>
+              <w:t>361</w:t>
             </w:r>
           </w:p>
         </w:tc>
@@ -535,7 +535,7 @@
           </w:tcPr>
           <w:p>
             <w:r>
-              <w:t>2026-06-26 19:27:22</w:t>
+              <w:t>2026-06-26 20:42:23</w:t>
             </w:r>
           </w:p>
         </w:tc>
@@ -545,7 +545,7 @@
           </w:tcPr>
           <w:p>
             <w:r>
-              <w:t>70</w:t>
+              <w:t>74</w:t>
             </w:r>
           </w:p>
         </w:tc>
@@ -555,7 +555,7 @@
           </w:tcPr>
           <w:p>
             <w:r>
-              <w:t>78.4</w:t>
+              <w:t>75.4</w:t>
             </w:r>
           </w:p>
         </w:tc>
@@ -575,7 +575,7 @@
           </w:tcPr>
           <w:p>
             <w:r>
-              <w:t>37.1</w:t>
+              <w:t>34.5</w:t>
             </w:r>
           </w:p>
         </w:tc>
@@ -585,7 +585,7 @@
           </w:tcPr>
           <w:p>
             <w:r>
-              <w:t>71.1</w:t>
+              <w:t>68.9</w:t>
             </w:r>
           </w:p>
         </w:tc>
@@ -595,7 +595,7 @@
           </w:tcPr>
           <w:p>
             <w:r>
-              <w:t>793</w:t>
+              <w:t>485</w:t>
             </w:r>
           </w:p>
         </w:tc>
@@ -607,7 +607,7 @@
           </w:tcPr>
           <w:p>
             <w:r>
-              <w:t>2026-06-26 19:44:43</w:t>
+              <w:t>2026-06-26 21:12:24</w:t>
             </w:r>
           </w:p>
         </w:tc>
@@ -617,7 +617,7 @@
           </w:tcPr>
           <w:p>
             <w:r>
-              <w:t>71</w:t>
+              <w:t>74</w:t>
             </w:r>
           </w:p>
         </w:tc>
@@ -627,7 +627,7 @@
           </w:tcPr>
           <w:p>
             <w:r>
-              <w:t>80.0</w:t>
+              <w:t>75.4</w:t>
             </w:r>
           </w:p>
         </w:tc>
@@ -647,7 +647,7 @@
           </w:tcPr>
           <w:p>
             <w:r>
-              <w:t>36.4</w:t>
+              <w:t>34.6</w:t>
             </w:r>
           </w:p>
         </w:tc>
@@ -657,7 +657,7 @@
           </w:tcPr>
           <w:p>
             <w:r>
-              <w:t>71.7</w:t>
+              <w:t>69.0</w:t>
             </w:r>
           </w:p>
         </w:tc>
@@ -667,7 +667,7 @@
           </w:tcPr>
           <w:p>
             <w:r>
-              <w:t>1</w:t>
+              <w:t>853</w:t>
             </w:r>
           </w:p>
         </w:tc>
@@ -679,7 +679,7 @@
           </w:tcPr>
           <w:p>
             <w:r>
-              <w:t>2026-06-26 20:03:09</w:t>
+              <w:t>2026-06-26 21:21:11</w:t>
             </w:r>
           </w:p>
         </w:tc>
@@ -689,7 +689,7 @@
           </w:tcPr>
           <w:p>
             <w:r>
-              <w:t>72</w:t>
+              <w:t>75</w:t>
             </w:r>
           </w:p>
         </w:tc>
@@ -699,7 +699,7 @@
           </w:tcPr>
           <w:p>
             <w:r>
-              <w:t>81.7</w:t>
+              <w:t>77.6</w:t>
             </w:r>
           </w:p>
         </w:tc>
@@ -719,7 +719,7 @@
           </w:tcPr>
           <w:p>
             <w:r>
-              <w:t>36.4</w:t>
+              <w:t>34.6</w:t>
             </w:r>
           </w:p>
         </w:tc>
@@ -729,7 +729,7 @@
           </w:tcPr>
           <w:p>
             <w:r>
-              <w:t>72.5</w:t>
+              <w:t>70.0</w:t>
             </w:r>
           </w:p>
         </w:tc>
@@ -739,7 +739,7 @@
           </w:tcPr>
           <w:p>
             <w:r>
-              <w:t>242</w:t>
+              <w:t>972</w:t>
             </w:r>
           </w:p>
         </w:tc>
@@ -751,7 +751,7 @@
           </w:tcPr>
           <w:p>
             <w:r>
-              <w:t>2026-06-26 20:33:07</w:t>
+              <w:t>2026-06-26 21:51:11</w:t>
             </w:r>
           </w:p>
         </w:tc>
@@ -761,7 +761,7 @@
           </w:tcPr>
           <w:p>
             <w:r>
-              <w:t>73</w:t>
+              <w:t>75</w:t>
             </w:r>
           </w:p>
         </w:tc>
@@ -771,7 +771,7 @@
           </w:tcPr>
           <w:p>
             <w:r>
-              <w:t>78.5</w:t>
+              <w:t>77.6</w:t>
             </w:r>
           </w:p>
         </w:tc>
@@ -791,7 +791,7 @@
           </w:tcPr>
           <w:p>
             <w:r>
-              <w:t>36.4</w:t>
+              <w:t>34.6</w:t>
             </w:r>
           </w:p>
         </w:tc>
@@ -801,7 +801,7 @@
           </w:tcPr>
           <w:p>
             <w:r>
-              <w:t>71.0</w:t>
+              <w:t>70.0</w:t>
             </w:r>
           </w:p>
         </w:tc>
@@ -811,7 +811,7 @@
           </w:tcPr>
           <w:p>
             <w:r>
-              <w:t>361</w:t>
+              <w:t>22</w:t>
             </w:r>
           </w:p>
         </w:tc>
@@ -823,7 +823,7 @@
           </w:tcPr>
           <w:p>
             <w:r>
-              <w:t>2026-06-26 20:42:23</w:t>
+              <w:t>2026-06-26 21:52:24</w:t>
             </w:r>
           </w:p>
         </w:tc>
@@ -833,7 +833,7 @@
           </w:tcPr>
           <w:p>
             <w:r>
-              <w:t>74</w:t>
+              <w:t>76</w:t>
             </w:r>
           </w:p>
         </w:tc>
@@ -843,7 +843,7 @@
           </w:tcPr>
           <w:p>
             <w:r>
-              <w:t>75.4</w:t>
+              <w:t>78.9</w:t>
             </w:r>
           </w:p>
         </w:tc>
@@ -863,7 +863,7 @@
           </w:tcPr>
           <w:p>
             <w:r>
-              <w:t>34.5</w:t>
+              <w:t>34.0</w:t>
             </w:r>
           </w:p>
         </w:tc>
@@ -873,7 +873,7 @@
           </w:tcPr>
           <w:p>
             <w:r>
-              <w:t>68.9</w:t>
+              <w:t>70.6</w:t>
             </w:r>
           </w:p>
         </w:tc>
@@ -883,7 +883,7 @@
           </w:tcPr>
           <w:p>
             <w:r>
-              <w:t>485</w:t>
+              <w:t>40</w:t>
             </w:r>
           </w:p>
         </w:tc>
@@ -895,7 +895,7 @@
           </w:tcPr>
           <w:p>
             <w:r>
-              <w:t>2026-06-26 21:12:24</w:t>
+              <w:t>2026-06-26 22:22:25</w:t>
             </w:r>
           </w:p>
         </w:tc>
@@ -905,7 +905,7 @@
           </w:tcPr>
           <w:p>
             <w:r>
-              <w:t>74</w:t>
+              <w:t>76</w:t>
             </w:r>
           </w:p>
         </w:tc>
@@ -915,7 +915,7 @@
           </w:tcPr>
           <w:p>
             <w:r>
-              <w:t>75.4</w:t>
+              <w:t>78.9</w:t>
             </w:r>
           </w:p>
         </w:tc>
@@ -935,7 +935,7 @@
           </w:tcPr>
           <w:p>
             <w:r>
-              <w:t>34.6</w:t>
+              <w:t>34.1</w:t>
             </w:r>
           </w:p>
         </w:tc>
@@ -945,7 +945,7 @@
           </w:tcPr>
           <w:p>
             <w:r>
-              <w:t>69.0</w:t>
+              <w:t>70.6</w:t>
             </w:r>
           </w:p>
         </w:tc>
@@ -955,7 +955,7 @@
           </w:tcPr>
           <w:p>
             <w:r>
-              <w:t>853</w:t>
+              <w:t>490</w:t>
             </w:r>
           </w:p>
         </w:tc>
@@ -967,7 +967,7 @@
           </w:tcPr>
           <w:p>
             <w:r>
-              <w:t>2026-06-26 21:21:11</w:t>
+              <w:t>2026-06-26 22:52:28</w:t>
             </w:r>
           </w:p>
         </w:tc>
@@ -977,7 +977,7 @@
           </w:tcPr>
           <w:p>
             <w:r>
-              <w:t>75</w:t>
+              <w:t>76</w:t>
             </w:r>
           </w:p>
         </w:tc>
@@ -987,7 +987,7 @@
           </w:tcPr>
           <w:p>
             <w:r>
-              <w:t>77.6</w:t>
+              <w:t>78.9</w:t>
             </w:r>
           </w:p>
         </w:tc>
@@ -1007,7 +1007,7 @@
           </w:tcPr>
           <w:p>
             <w:r>
-              <w:t>34.6</w:t>
+              <w:t>34.4</w:t>
             </w:r>
           </w:p>
         </w:tc>
@@ -1017,7 +1017,7 @@
           </w:tcPr>
           <w:p>
             <w:r>
-              <w:t>70.0</w:t>
+              <w:t>70.7</w:t>
             </w:r>
           </w:p>
         </w:tc>
@@ -1027,7 +1027,7 @@
           </w:tcPr>
           <w:p>
             <w:r>
-              <w:t>972</w:t>
+              <w:t>278</w:t>
             </w:r>
           </w:p>
         </w:tc>
@@ -1039,7 +1039,7 @@
           </w:tcPr>
           <w:p>
             <w:r>
-              <w:t>2026-06-26 21:51:11</w:t>
+              <w:t>2026-06-26 23:00:58</w:t>
             </w:r>
           </w:p>
         </w:tc>
@@ -1049,7 +1049,7 @@
           </w:tcPr>
           <w:p>
             <w:r>
-              <w:t>75</w:t>
+              <w:t>77</w:t>
             </w:r>
           </w:p>
         </w:tc>
@@ -1059,7 +1059,7 @@
           </w:tcPr>
           <w:p>
             <w:r>
-              <w:t>77.6</w:t>
+              <w:t>75.9</w:t>
             </w:r>
           </w:p>
         </w:tc>
@@ -1079,7 +1079,7 @@
           </w:tcPr>
           <w:p>
             <w:r>
-              <w:t>34.6</w:t>
+              <w:t>35.6</w:t>
             </w:r>
           </w:p>
         </w:tc>
@@ -1089,7 +1089,7 @@
           </w:tcPr>
           <w:p>
             <w:r>
-              <w:t>70.0</w:t>
+              <w:t>69.5</w:t>
             </w:r>
           </w:p>
         </w:tc>
@@ -1099,7 +1099,7 @@
           </w:tcPr>
           <w:p>
             <w:r>
-              <w:t>22</w:t>
+              <w:t>35</w:t>
             </w:r>
           </w:p>
         </w:tc>
@@ -1111,7 +1111,7 @@
           </w:tcPr>
           <w:p>
             <w:r>
-              <w:t>2026-06-26 21:52:24</w:t>
+              <w:t>2026-06-26 23:18:02</w:t>
             </w:r>
           </w:p>
         </w:tc>
@@ -1121,7 +1121,7 @@
           </w:tcPr>
           <w:p>
             <w:r>
-              <w:t>76</w:t>
+              <w:t>78</w:t>
             </w:r>
           </w:p>
         </w:tc>
@@ -1131,7 +1131,7 @@
           </w:tcPr>
           <w:p>
             <w:r>
-              <w:t>78.9</w:t>
+              <w:t>72.9</w:t>
             </w:r>
           </w:p>
         </w:tc>
@@ -1151,7 +1151,7 @@
           </w:tcPr>
           <w:p>
             <w:r>
-              <w:t>34.0</w:t>
+              <w:t>36.9</w:t>
             </w:r>
           </w:p>
         </w:tc>
@@ -1161,7 +1161,7 @@
           </w:tcPr>
           <w:p>
             <w:r>
-              <w:t>70.6</w:t>
+              <w:t>68.3</w:t>
             </w:r>
           </w:p>
         </w:tc>
@@ -1171,7 +1171,7 @@
           </w:tcPr>
           <w:p>
             <w:r>
-              <w:t>40</w:t>
+              <w:t>291</w:t>
             </w:r>
           </w:p>
         </w:tc>
@@ -1183,7 +1183,7 @@
           </w:tcPr>
           <w:p>
             <w:r>
-              <w:t>2026-06-26 22:22:25</w:t>
+              <w:t>2026-06-26 23:44:05</w:t>
             </w:r>
           </w:p>
         </w:tc>
@@ -1193,7 +1193,7 @@
           </w:tcPr>
           <w:p>
             <w:r>
-              <w:t>76</w:t>
+              <w:t>78</w:t>
             </w:r>
           </w:p>
         </w:tc>
@@ -1203,7 +1203,7 @@
           </w:tcPr>
           <w:p>
             <w:r>
-              <w:t>78.9</w:t>
+              <w:t>72.9</w:t>
             </w:r>
           </w:p>
         </w:tc>
@@ -1223,7 +1223,7 @@
           </w:tcPr>
           <w:p>
             <w:r>
-              <w:t>34.1</w:t>
+              <w:t>49.0</w:t>
             </w:r>
           </w:p>
         </w:tc>
@@ -1233,7 +1233,7 @@
           </w:tcPr>
           <w:p>
             <w:r>
-              <w:t>70.6</w:t>
+              <w:t>71.3</w:t>
             </w:r>
           </w:p>
         </w:tc>
@@ -1243,7 +1243,7 @@
           </w:tcPr>
           <w:p>
             <w:r>
-              <w:t>490</w:t>
+              <w:t>253</w:t>
             </w:r>
           </w:p>
         </w:tc>
@@ -1255,7 +1255,7 @@
           </w:tcPr>
           <w:p>
             <w:r>
-              <w:t>2026-06-26 22:52:28</w:t>
+              <w:t>2026-06-26 23:45:02</w:t>
             </w:r>
           </w:p>
         </w:tc>
@@ -1265,7 +1265,7 @@
           </w:tcPr>
           <w:p>
             <w:r>
-              <w:t>76</w:t>
+              <w:t>79</w:t>
             </w:r>
           </w:p>
         </w:tc>
@@ -1275,7 +1275,7 @@
           </w:tcPr>
           <w:p>
             <w:r>
-              <w:t>78.9</w:t>
+              <w:t>70.1</w:t>
             </w:r>
           </w:p>
         </w:tc>
@@ -1295,7 +1295,7 @@
           </w:tcPr>
           <w:p>
             <w:r>
-              <w:t>34.4</w:t>
+              <w:t>49.0</w:t>
             </w:r>
           </w:p>
         </w:tc>
@@ -1305,7 +1305,7 @@
           </w:tcPr>
           <w:p>
             <w:r>
-              <w:t>70.7</w:t>
+              <w:t>69.9</w:t>
             </w:r>
           </w:p>
         </w:tc>
@@ -1315,7 +1315,7 @@
           </w:tcPr>
           <w:p>
             <w:r>
-              <w:t>278</w:t>
+              <w:t>267</w:t>
             </w:r>
           </w:p>
         </w:tc>
@@ -1327,7 +1327,7 @@
           </w:tcPr>
           <w:p>
             <w:r>
-              <w:t>2026-06-26 23:00:58</w:t>
+              <w:t>2026-06-27 00:02:46</w:t>
             </w:r>
           </w:p>
         </w:tc>
@@ -1337,7 +1337,7 @@
           </w:tcPr>
           <w:p>
             <w:r>
-              <w:t>77</w:t>
+              <w:t>80</w:t>
             </w:r>
           </w:p>
         </w:tc>
@@ -1347,7 +1347,7 @@
           </w:tcPr>
           <w:p>
             <w:r>
-              <w:t>75.9</w:t>
+              <w:t>67.3</w:t>
             </w:r>
           </w:p>
         </w:tc>
@@ -1367,7 +1367,7 @@
           </w:tcPr>
           <w:p>
             <w:r>
-              <w:t>35.6</w:t>
+              <w:t>50.1</w:t>
             </w:r>
           </w:p>
         </w:tc>
@@ -1377,7 +1377,7 @@
           </w:tcPr>
           <w:p>
             <w:r>
-              <w:t>69.5</w:t>
+              <w:t>68.8</w:t>
             </w:r>
           </w:p>
         </w:tc>
@@ -1387,7 +1387,7 @@
           </w:tcPr>
           <w:p>
             <w:r>
-              <w:t>35</w:t>
+              <w:t>533</w:t>
             </w:r>
           </w:p>
         </w:tc>
@@ -1399,7 +1399,7 @@
           </w:tcPr>
           <w:p>
             <w:r>
-              <w:t>2026-06-26 23:18:02</w:t>
+              <w:t>2026-06-27 00:18:01</w:t>
             </w:r>
           </w:p>
         </w:tc>
@@ -1409,7 +1409,7 @@
           </w:tcPr>
           <w:p>
             <w:r>
-              <w:t>78</w:t>
+              <w:t>81</w:t>
             </w:r>
           </w:p>
         </w:tc>
@@ -1419,7 +1419,7 @@
           </w:tcPr>
           <w:p>
             <w:r>
-              <w:t>72.9</w:t>
+              <w:t>64.5</w:t>
             </w:r>
           </w:p>
         </w:tc>
@@ -1439,7 +1439,7 @@
           </w:tcPr>
           <w:p>
             <w:r>
-              <w:t>36.9</w:t>
+              <w:t>50.2</w:t>
             </w:r>
           </w:p>
         </w:tc>
@@ -1449,7 +1449,7 @@
           </w:tcPr>
           <w:p>
             <w:r>
-              <w:t>68.3</w:t>
+              <w:t>67.4</w:t>
             </w:r>
           </w:p>
         </w:tc>
@@ -1459,7 +1459,7 @@
           </w:tcPr>
           <w:p>
             <w:r>
-              <w:t>291</w:t>
+              <w:t>762</w:t>
             </w:r>
           </w:p>
         </w:tc>
@@ -1471,7 +1471,7 @@
           </w:tcPr>
           <w:p>
             <w:r>
-              <w:t>2026-06-26 23:44:05</w:t>
+              <w:t>2026-06-27 00:33:02</w:t>
             </w:r>
           </w:p>
         </w:tc>
@@ -1481,7 +1481,7 @@
           </w:tcPr>
           <w:p>
             <w:r>
-              <w:t>78</w:t>
+              <w:t>82</w:t>
             </w:r>
           </w:p>
         </w:tc>
@@ -1491,7 +1491,7 @@
           </w:tcPr>
           <w:p>
             <w:r>
-              <w:t>72.9</w:t>
+              <w:t>66.0</w:t>
             </w:r>
           </w:p>
         </w:tc>
@@ -1511,7 +1511,7 @@
           </w:tcPr>
           <w:p>
             <w:r>
-              <w:t>49.0</w:t>
+              <w:t>49.5</w:t>
             </w:r>
           </w:p>
         </w:tc>
@@ -1521,7 +1521,7 @@
           </w:tcPr>
           <w:p>
             <w:r>
-              <w:t>71.3</w:t>
+              <w:t>68.0</w:t>
             </w:r>
           </w:p>
         </w:tc>
@@ -1531,7 +1531,7 @@
           </w:tcPr>
           <w:p>
             <w:r>
-              <w:t>253</w:t>
+              <w:t>75</w:t>
             </w:r>
           </w:p>
         </w:tc>
@@ -1543,7 +1543,7 @@
           </w:tcPr>
           <w:p>
             <w:r>
-              <w:t>2026-06-26 23:45:02</w:t>
+              <w:t>2026-06-27 01:03:02</w:t>
             </w:r>
           </w:p>
         </w:tc>
@@ -1553,7 +1553,7 @@
           </w:tcPr>
           <w:p>
             <w:r>
-              <w:t>79</w:t>
+              <w:t>83</w:t>
             </w:r>
           </w:p>
         </w:tc>
@@ -1563,7 +1563,7 @@
           </w:tcPr>
           <w:p>
             <w:r>
-              <w:t>70.1</w:t>
+              <w:t>63.3</w:t>
             </w:r>
           </w:p>
         </w:tc>
@@ -1583,7 +1583,7 @@
           </w:tcPr>
           <w:p>
             <w:r>
-              <w:t>49.0</w:t>
+              <w:t>47.7</w:t>
             </w:r>
           </w:p>
         </w:tc>
@@ -1593,7 +1593,7 @@
           </w:tcPr>
           <w:p>
             <w:r>
-              <w:t>69.9</w:t>
+              <w:t>66.2</w:t>
             </w:r>
           </w:p>
         </w:tc>
@@ -1603,7 +1603,7 @@
           </w:tcPr>
           <w:p>
             <w:r>
-              <w:t>267</w:t>
+              <w:t>525</w:t>
             </w:r>
           </w:p>
         </w:tc>
@@ -1615,7 +1615,7 @@
           </w:tcPr>
           <w:p>
             <w:r>
-              <w:t>2026-06-27 00:02:46</w:t>
+              <w:t>2026-06-27 01:33:05</w:t>
             </w:r>
           </w:p>
         </w:tc>
@@ -1625,7 +1625,7 @@
           </w:tcPr>
           <w:p>
             <w:r>
-              <w:t>80</w:t>
+              <w:t>83</w:t>
             </w:r>
           </w:p>
         </w:tc>
@@ -1635,7 +1635,7 @@
           </w:tcPr>
           <w:p>
             <w:r>
-              <w:t>67.3</w:t>
+              <w:t>63.3</w:t>
             </w:r>
           </w:p>
         </w:tc>
@@ -1655,7 +1655,7 @@
           </w:tcPr>
           <w:p>
             <w:r>
-              <w:t>50.1</w:t>
+              <w:t>47.7</w:t>
             </w:r>
           </w:p>
         </w:tc>
@@ -1665,7 +1665,7 @@
           </w:tcPr>
           <w:p>
             <w:r>
-              <w:t>68.8</w:t>
+              <w:t>66.2</w:t>
             </w:r>
           </w:p>
         </w:tc>
@@ -1675,7 +1675,7 @@
           </w:tcPr>
           <w:p>
             <w:r>
-              <w:t>533</w:t>
+              <w:t>304</w:t>
             </w:r>
           </w:p>
         </w:tc>
@@ -1687,7 +1687,7 @@
           </w:tcPr>
           <w:p>
             <w:r>
-              <w:t>2026-06-27 00:18:01</w:t>
+              <w:t>2026-06-27 02:03:05</w:t>
             </w:r>
           </w:p>
         </w:tc>
@@ -1697,7 +1697,7 @@
           </w:tcPr>
           <w:p>
             <w:r>
-              <w:t>81</w:t>
+              <w:t>84</w:t>
             </w:r>
           </w:p>
         </w:tc>
@@ -1707,7 +1707,7 @@
           </w:tcPr>
           <w:p>
             <w:r>
-              <w:t>64.5</w:t>
+              <w:t>65.6</w:t>
             </w:r>
           </w:p>
         </w:tc>
@@ -1727,7 +1727,7 @@
           </w:tcPr>
           <w:p>
             <w:r>
-              <w:t>50.2</w:t>
+              <w:t>47.7</w:t>
             </w:r>
           </w:p>
         </w:tc>
@@ -1737,7 +1737,7 @@
           </w:tcPr>
           <w:p>
             <w:r>
-              <w:t>67.4</w:t>
+              <w:t>67.3</w:t>
             </w:r>
           </w:p>
         </w:tc>
@@ -1747,7 +1747,7 @@
           </w:tcPr>
           <w:p>
             <w:r>
-              <w:t>762</w:t>
+              <w:t>754</w:t>
             </w:r>
           </w:p>
         </w:tc>
@@ -1768,7 +1768,7 @@
     </w:p>
     <w:p>
       <w:r>
-        <w:t>Section score: 64.5 / 100  (Grade: D)</w:t>
+        <w:t>Section score: 65.6 / 100  (Grade: D)</w:t>
       </w:r>
     </w:p>
     <w:p>
@@ -1879,7 +1879,7 @@
           </w:tcPr>
           <w:p>
             <w:r>
-              <w:t>41.0</w:t>
+              <w:t>45.6</w:t>
             </w:r>
           </w:p>
         </w:tc>
@@ -1889,7 +1889,7 @@
           </w:tcPr>
           <w:p>
             <w:r>
-              <w:t>6.1</w:t>
+              <w:t>6.8</w:t>
             </w:r>
           </w:p>
         </w:tc>
@@ -1911,7 +1911,7 @@
           </w:tcPr>
           <w:p>
             <w:r>
-              <w:t>33.5</w:t>
+              <w:t>35.6</w:t>
             </w:r>
           </w:p>
         </w:tc>
@@ -1921,7 +1921,7 @@
           </w:tcPr>
           <w:p>
             <w:r>
-              <w:t>5.0</w:t>
+              <w:t>5.3</w:t>
             </w:r>
           </w:p>
         </w:tc>
@@ -2007,7 +2007,7 @@
           </w:tcPr>
           <w:p>
             <w:r>
-              <w:t>74.9</w:t>
+              <w:t>75.0</w:t>
             </w:r>
           </w:p>
         </w:tc>
@@ -2039,7 +2039,7 @@
           </w:tcPr>
           <w:p>
             <w:r>
-              <w:t>43.5</w:t>
+              <w:t>43.8</w:t>
             </w:r>
           </w:p>
         </w:tc>
@@ -2090,7 +2090,7 @@
           </w:tcPr>
           <w:p>
             <w:r>
-              <w:t>$555.22</w:t>
+              <w:t>$557.53</w:t>
             </w:r>
           </w:p>
         </w:tc>
@@ -2112,7 +2112,7 @@
           </w:tcPr>
           <w:p>
             <w:r>
-              <w:t>11.04%</w:t>
+              <w:t>11.51%</w:t>
             </w:r>
           </w:p>
         </w:tc>
@@ -2134,7 +2134,7 @@
           </w:tcPr>
           <w:p>
             <w:r>
-              <w:t>$-4.51</w:t>
+              <w:t>$-2.20</w:t>
             </w:r>
           </w:p>
         </w:tc>
@@ -2178,7 +2178,7 @@
           </w:tcPr>
           <w:p>
             <w:r>
-              <w:t>0.6173</w:t>
+              <w:t>0.6190</w:t>
             </w:r>
           </w:p>
         </w:tc>
@@ -2200,7 +2200,7 @@
           </w:tcPr>
           <w:p>
             <w:r>
-              <w:t>0.5000 / 0.6557</w:t>
+              <w:t>0.5000 / 0.6562</w:t>
             </w:r>
           </w:p>
         </w:tc>
@@ -2222,7 +2222,7 @@
           </w:tcPr>
           <w:p>
             <w:r>
-              <w:t>0.9678</w:t>
+              <w:t>0.9848</w:t>
             </w:r>
           </w:p>
         </w:tc>
@@ -2244,7 +2244,7 @@
           </w:tcPr>
           <w:p>
             <w:r>
-              <w:t>82 / 81</w:t>
+              <w:t>84 / 84</w:t>
             </w:r>
           </w:p>
         </w:tc>
@@ -2266,7 +2266,7 @@
           </w:tcPr>
           <w:p>
             <w:r>
-              <w:t>$-0.06</w:t>
+              <w:t>$-0.03</w:t>
             </w:r>
           </w:p>
         </w:tc>
@@ -2397,7 +2397,7 @@
           </w:tcPr>
           <w:p>
             <w:r>
-              <w:t>0.650</w:t>
+              <w:t>0.520</w:t>
             </w:r>
           </w:p>
         </w:tc>
@@ -2407,7 +2407,7 @@
           </w:tcPr>
           <w:p>
             <w:r>
-              <w:t>—</w:t>
+              <w:t>down</w:t>
             </w:r>
           </w:p>
         </w:tc>
@@ -2417,7 +2417,7 @@
           </w:tcPr>
           <w:p>
             <w:r>
-              <w:t>—</w:t>
+              <w:t>Yes</w:t>
             </w:r>
           </w:p>
         </w:tc>
@@ -2427,7 +2427,7 @@
           </w:tcPr>
           <w:p>
             <w:r>
-              <w:t>$—</w:t>
+              <w:t>$4.62</w:t>
             </w:r>
           </w:p>
         </w:tc>
@@ -2449,7 +2449,7 @@
           </w:tcPr>
           <w:p>
             <w:r>
-              <w:t>0.690</w:t>
+              <w:t>0.570</w:t>
             </w:r>
           </w:p>
         </w:tc>
@@ -2501,7 +2501,7 @@
           </w:tcPr>
           <w:p>
             <w:r>
-              <w:t>0.570</w:t>
+              <w:t>0.650</w:t>
             </w:r>
           </w:p>
         </w:tc>
@@ -2511,7 +2511,7 @@
           </w:tcPr>
           <w:p>
             <w:r>
-              <w:t>up</w:t>
+              <w:t>down</w:t>
             </w:r>
           </w:p>
         </w:tc>
@@ -2521,7 +2521,7 @@
           </w:tcPr>
           <w:p>
             <w:r>
-              <w:t>No</w:t>
+              <w:t>Yes</w:t>
             </w:r>
           </w:p>
         </w:tc>
@@ -2531,7 +2531,7 @@
           </w:tcPr>
           <w:p>
             <w:r>
-              <w:t>$-5.00</w:t>
+              <w:t>$2.69</w:t>
             </w:r>
           </w:p>
         </w:tc>
@@ -2553,7 +2553,7 @@
           </w:tcPr>
           <w:p>
             <w:r>
-              <w:t>0.600</w:t>
+              <w:t>0.690</w:t>
             </w:r>
           </w:p>
         </w:tc>
@@ -2605,7 +2605,7 @@
           </w:tcPr>
           <w:p>
             <w:r>
-              <w:t>0.563</w:t>
+              <w:t>0.570</w:t>
             </w:r>
           </w:p>
         </w:tc>
@@ -2657,7 +2657,7 @@
           </w:tcPr>
           <w:p>
             <w:r>
-              <w:t>0.670</w:t>
+              <w:t>0.600</w:t>
             </w:r>
           </w:p>
         </w:tc>
@@ -2709,7 +2709,7 @@
           </w:tcPr>
           <w:p>
             <w:r>
-              <w:t>0.690</w:t>
+              <w:t>0.563</w:t>
             </w:r>
           </w:p>
         </w:tc>
@@ -2719,7 +2719,7 @@
           </w:tcPr>
           <w:p>
             <w:r>
-              <w:t>down</w:t>
+              <w:t>up</w:t>
             </w:r>
           </w:p>
         </w:tc>
@@ -2729,7 +2729,7 @@
           </w:tcPr>
           <w:p>
             <w:r>
-              <w:t>Yes</w:t>
+              <w:t>No</w:t>
             </w:r>
           </w:p>
         </w:tc>
@@ -2739,7 +2739,7 @@
           </w:tcPr>
           <w:p>
             <w:r>
-              <w:t>$2.25</w:t>
+              <w:t>$-5.00</w:t>
             </w:r>
           </w:p>
         </w:tc>
@@ -2761,7 +2761,7 @@
           </w:tcPr>
           <w:p>
             <w:r>
-              <w:t>0.550</w:t>
+              <w:t>0.670</w:t>
             </w:r>
           </w:p>
         </w:tc>
@@ -2771,7 +2771,7 @@
           </w:tcPr>
           <w:p>
             <w:r>
-              <w:t>down</w:t>
+              <w:t>up</w:t>
             </w:r>
           </w:p>
         </w:tc>
@@ -2781,7 +2781,7 @@
           </w:tcPr>
           <w:p>
             <w:r>
-              <w:t>Yes</w:t>
+              <w:t>No</w:t>
             </w:r>
           </w:p>
         </w:tc>
@@ -2791,7 +2791,7 @@
           </w:tcPr>
           <w:p>
             <w:r>
-              <w:t>$4.09</w:t>
+              <w:t>$-5.00</w:t>
             </w:r>
           </w:p>
         </w:tc>
@@ -2813,7 +2813,7 @@
           </w:tcPr>
           <w:p>
             <w:r>
-              <w:t>0.650</w:t>
+              <w:t>0.690</w:t>
             </w:r>
           </w:p>
         </w:tc>
@@ -2823,7 +2823,7 @@
           </w:tcPr>
           <w:p>
             <w:r>
-              <w:t>up</w:t>
+              <w:t>down</w:t>
             </w:r>
           </w:p>
         </w:tc>
@@ -2833,7 +2833,7 @@
           </w:tcPr>
           <w:p>
             <w:r>
-              <w:t>No</w:t>
+              <w:t>Yes</w:t>
             </w:r>
           </w:p>
         </w:tc>
@@ -2843,7 +2843,7 @@
           </w:tcPr>
           <w:p>
             <w:r>
-              <w:t>$-5.00</w:t>
+              <w:t>$2.25</w:t>
             </w:r>
           </w:p>
         </w:tc>
@@ -2865,7 +2865,7 @@
           </w:tcPr>
           <w:p>
             <w:r>
-              <w:t>0.700</w:t>
+              <w:t>0.550</w:t>
             </w:r>
           </w:p>
         </w:tc>
@@ -2875,7 +2875,7 @@
           </w:tcPr>
           <w:p>
             <w:r>
-              <w:t>up</w:t>
+              <w:t>down</w:t>
             </w:r>
           </w:p>
         </w:tc>
@@ -2885,7 +2885,7 @@
           </w:tcPr>
           <w:p>
             <w:r>
-              <w:t>No</w:t>
+              <w:t>Yes</w:t>
             </w:r>
           </w:p>
         </w:tc>
@@ -2895,7 +2895,7 @@
           </w:tcPr>
           <w:p>
             <w:r>
-              <w:t>$-5.00</w:t>
+              <w:t>$4.09</w:t>
             </w:r>
           </w:p>
         </w:tc>
@@ -2917,7 +2917,7 @@
           </w:tcPr>
           <w:p>
             <w:r>
-              <w:t>0.630</w:t>
+              <w:t>0.650</w:t>
             </w:r>
           </w:p>
         </w:tc>
@@ -2927,7 +2927,7 @@
           </w:tcPr>
           <w:p>
             <w:r>
-              <w:t>down</w:t>
+              <w:t>up</w:t>
             </w:r>
           </w:p>
         </w:tc>
@@ -2937,7 +2937,7 @@
           </w:tcPr>
           <w:p>
             <w:r>
-              <w:t>Yes</w:t>
+              <w:t>No</w:t>
             </w:r>
           </w:p>
         </w:tc>
@@ -2947,7 +2947,7 @@
           </w:tcPr>
           <w:p>
             <w:r>
-              <w:t>$2.94</w:t>
+              <w:t>$-5.00</w:t>
             </w:r>
           </w:p>
         </w:tc>
@@ -2969,7 +2969,7 @@
           </w:tcPr>
           <w:p>
             <w:r>
-              <w:t>0.650</w:t>
+              <w:t>0.700</w:t>
             </w:r>
           </w:p>
         </w:tc>
@@ -2979,7 +2979,7 @@
           </w:tcPr>
           <w:p>
             <w:r>
-              <w:t>down</w:t>
+              <w:t>up</w:t>
             </w:r>
           </w:p>
         </w:tc>
@@ -2989,7 +2989,7 @@
           </w:tcPr>
           <w:p>
             <w:r>
-              <w:t>Yes</w:t>
+              <w:t>No</w:t>
             </w:r>
           </w:p>
         </w:tc>
@@ -2999,7 +2999,7 @@
           </w:tcPr>
           <w:p>
             <w:r>
-              <w:t>$2.69</w:t>
+              <w:t>$-5.00</w:t>
             </w:r>
           </w:p>
         </w:tc>
@@ -3021,7 +3021,7 @@
           </w:tcPr>
           <w:p>
             <w:r>
-              <w:t>0.670</w:t>
+              <w:t>0.630</w:t>
             </w:r>
           </w:p>
         </w:tc>
@@ -3051,7 +3051,7 @@
           </w:tcPr>
           <w:p>
             <w:r>
-              <w:t>$2.46</w:t>
+              <w:t>$2.94</w:t>
             </w:r>
           </w:p>
         </w:tc>
@@ -3073,7 +3073,7 @@
           </w:tcPr>
           <w:p>
             <w:r>
-              <w:t>0.700</w:t>
+              <w:t>0.650</w:t>
             </w:r>
           </w:p>
         </w:tc>
@@ -3103,7 +3103,7 @@
           </w:tcPr>
           <w:p>
             <w:r>
-              <w:t>$2.14</w:t>
+              <w:t>$2.69</w:t>
             </w:r>
           </w:p>
         </w:tc>
@@ -3125,7 +3125,7 @@
           </w:tcPr>
           <w:p>
             <w:r>
-              <w:t>0.680</w:t>
+              <w:t>0.670</w:t>
             </w:r>
           </w:p>
         </w:tc>
@@ -3135,7 +3135,7 @@
           </w:tcPr>
           <w:p>
             <w:r>
-              <w:t>up</w:t>
+              <w:t>down</w:t>
             </w:r>
           </w:p>
         </w:tc>
@@ -3145,7 +3145,7 @@
           </w:tcPr>
           <w:p>
             <w:r>
-              <w:t>No</w:t>
+              <w:t>Yes</w:t>
             </w:r>
           </w:p>
         </w:tc>
@@ -3155,7 +3155,7 @@
           </w:tcPr>
           <w:p>
             <w:r>
-              <w:t>$-5.00</w:t>
+              <w:t>$2.46</w:t>
             </w:r>
           </w:p>
         </w:tc>
@@ -3319,7 +3319,7 @@
           </w:tcPr>
           <w:p>
             <w:r>
-              <w:t>96.1</w:t>
+              <w:t>96.2</w:t>
             </w:r>
           </w:p>
         </w:tc>
@@ -3433,17 +3433,17 @@
     </w:tbl>
     <w:p>
       <w:r>
-        <w:t>Ticks: 45 · Reconciled: True · Readiness: not_ready</w:t>
+        <w:t>Ticks: 65 · Reconciled: True · Readiness: not_ready</w:t>
       </w:r>
     </w:p>
     <w:p>
       <w:r>
-        <w:t>Candidates created: 44184 · Terminals: {'accepted': 82, 'rejected': 38767, 'skipped': 5158, 'expired': 0, 'missing_data': 177}</w:t>
+        <w:t>Candidates created: 46595 · Terminals: {'accepted': 84, 'rejected': 40011, 'skipped': 6317, 'expired': 0, 'missing_data': 183}</w:t>
       </w:r>
     </w:p>
     <w:p>
       <w:r>
-        <w:t>Rejected by stage: {'directional': 29072, 'execution_gate': 155, 'context_gate': 879, 'directional_allowlist': 1364, 'down_bias_gate': 538, 'mtf_gate': 275, 'grok_decider': 3540, 'execution_realistic': 3, 'verifier': 61, 'mispricing_gate': 50, 'baseline_cohort_gate': 2830}</w:t>
+        <w:t>Rejected by stage: {'directional': 30243, 'execution_gate': 155, 'context_gate': 879, 'directional_allowlist': 1364, 'down_bias_gate': 538, 'mtf_gate': 275, 'grok_decider': 3540, 'execution_realistic': 3, 'verifier': 61, 'mispricing_gate': 50, 'baseline_cohort_gate': 2903}</w:t>
       </w:r>
     </w:p>
     <w:p>
@@ -4018,7 +4018,7 @@
     </w:p>
     <w:p>
       <w:r>
-        <w:t>Section score: 50.2 / 100  (Grade: F)</w:t>
+        <w:t>Section score: 47.7 / 100  (Grade: F)</w:t>
       </w:r>
     </w:p>
     <w:p>
@@ -4225,7 +4225,7 @@
           </w:tcPr>
           <w:p>
             <w:r>
-              <w:t>51.3</w:t>
+              <w:t>44.6</w:t>
             </w:r>
           </w:p>
         </w:tc>
@@ -4235,7 +4235,7 @@
           </w:tcPr>
           <w:p>
             <w:r>
-              <w:t>15.4</w:t>
+              <w:t>13.4</w:t>
             </w:r>
           </w:p>
         </w:tc>
@@ -4257,7 +4257,7 @@
           </w:tcPr>
           <w:p>
             <w:r>
-              <w:t>4.5</w:t>
+              <w:t>1.7</w:t>
             </w:r>
           </w:p>
         </w:tc>
@@ -4267,7 +4267,7 @@
           </w:tcPr>
           <w:p>
             <w:r>
-              <w:t>0.7</w:t>
+              <w:t>0.3</w:t>
             </w:r>
           </w:p>
         </w:tc>
@@ -4308,7 +4308,7 @@
           </w:tcPr>
           <w:p>
             <w:r>
-              <w:t>0.5909</w:t>
+              <w:t>0.5652</w:t>
             </w:r>
           </w:p>
         </w:tc>
@@ -4330,7 +4330,7 @@
           </w:tcPr>
           <w:p>
             <w:r>
-              <w:t>0.6071</w:t>
+              <w:t>0.6207</w:t>
             </w:r>
           </w:p>
         </w:tc>
@@ -4352,7 +4352,7 @@
           </w:tcPr>
           <w:p>
             <w:r>
-              <w:t>0.4800</w:t>
+              <w:t>0.4615</w:t>
             </w:r>
           </w:p>
         </w:tc>
@@ -4396,7 +4396,7 @@
           </w:tcPr>
           <w:p>
             <w:r>
-              <w:t>0.5000</w:t>
+              <w:t>0.4980</w:t>
             </w:r>
           </w:p>
         </w:tc>
@@ -4426,7 +4426,7 @@
     </w:tbl>
     <w:p>
       <w:r>
-        <w:t>TV alerts: received 126 · valid 109 · rejected 17</w:t>
+        <w:t>TV alerts: received 134 · valid 117 · rejected 17</w:t>
       </w:r>
     </w:p>
     <w:sectPr>

</xml_diff>

<commit_message>
chore(reports): VPS full report 2026-06-27 04:22 UTC (86 settled, WR 61.6%, PF 0.9752)
</commit_message>
<xml_diff>
--- a/vps_full_reports/latest/report.docx
+++ b/vps_full_reports/latest/report.docx
@@ -20,7 +20,7 @@
           <w:color w:val="666666"/>
           <w:sz w:val="20"/>
         </w:rPr>
-        <w:t>PAPER ONLY  ·  reconciled=True  ·  ticks=350</w:t>
+        <w:t>PAPER ONLY  ·  reconciled=True  ·  ticks=14</w:t>
       </w:r>
     </w:p>
     <w:p>
@@ -33,7 +33,7 @@
     </w:p>
     <w:p>
       <w:r>
-        <w:t>Overall score: 68.1 / 100  (Grade: D)</w:t>
+        <w:t>Overall score: 66.7 / 100  (Grade: D)</w:t>
       </w:r>
     </w:p>
     <w:tbl>
@@ -107,7 +107,7 @@
           </w:tcPr>
           <w:p>
             <w:r>
-              <w:t>67.4</w:t>
+              <w:t>64.8</w:t>
             </w:r>
           </w:p>
         </w:tc>
@@ -149,7 +149,7 @@
           </w:tcPr>
           <w:p>
             <w:r>
-              <w:t>90.4</w:t>
+              <w:t>90.3</w:t>
             </w:r>
           </w:p>
         </w:tc>
@@ -319,7 +319,7 @@
           </w:tcPr>
           <w:p>
             <w:r>
-              <w:t>2026-06-26 20:33:07</w:t>
+              <w:t>2026-06-26 21:21:11</w:t>
             </w:r>
           </w:p>
         </w:tc>
@@ -329,7 +329,7 @@
           </w:tcPr>
           <w:p>
             <w:r>
-              <w:t>73</w:t>
+              <w:t>75</w:t>
             </w:r>
           </w:p>
         </w:tc>
@@ -339,7 +339,7 @@
           </w:tcPr>
           <w:p>
             <w:r>
-              <w:t>78.5</w:t>
+              <w:t>77.6</w:t>
             </w:r>
           </w:p>
         </w:tc>
@@ -359,7 +359,7 @@
           </w:tcPr>
           <w:p>
             <w:r>
-              <w:t>36.4</w:t>
+              <w:t>34.6</w:t>
             </w:r>
           </w:p>
         </w:tc>
@@ -369,7 +369,7 @@
           </w:tcPr>
           <w:p>
             <w:r>
-              <w:t>71.0</w:t>
+              <w:t>70.0</w:t>
             </w:r>
           </w:p>
         </w:tc>
@@ -379,7 +379,7 @@
           </w:tcPr>
           <w:p>
             <w:r>
-              <w:t>361</w:t>
+              <w:t>972</w:t>
             </w:r>
           </w:p>
         </w:tc>
@@ -391,7 +391,7 @@
           </w:tcPr>
           <w:p>
             <w:r>
-              <w:t>2026-06-26 20:42:23</w:t>
+              <w:t>2026-06-26 21:51:11</w:t>
             </w:r>
           </w:p>
         </w:tc>
@@ -401,7 +401,7 @@
           </w:tcPr>
           <w:p>
             <w:r>
-              <w:t>74</w:t>
+              <w:t>75</w:t>
             </w:r>
           </w:p>
         </w:tc>
@@ -411,7 +411,7 @@
           </w:tcPr>
           <w:p>
             <w:r>
-              <w:t>75.4</w:t>
+              <w:t>77.6</w:t>
             </w:r>
           </w:p>
         </w:tc>
@@ -431,7 +431,7 @@
           </w:tcPr>
           <w:p>
             <w:r>
-              <w:t>34.5</w:t>
+              <w:t>34.6</w:t>
             </w:r>
           </w:p>
         </w:tc>
@@ -441,7 +441,7 @@
           </w:tcPr>
           <w:p>
             <w:r>
-              <w:t>68.9</w:t>
+              <w:t>70.0</w:t>
             </w:r>
           </w:p>
         </w:tc>
@@ -451,7 +451,7 @@
           </w:tcPr>
           <w:p>
             <w:r>
-              <w:t>485</w:t>
+              <w:t>22</w:t>
             </w:r>
           </w:p>
         </w:tc>
@@ -463,7 +463,7 @@
           </w:tcPr>
           <w:p>
             <w:r>
-              <w:t>2026-06-26 21:12:24</w:t>
+              <w:t>2026-06-26 21:52:24</w:t>
             </w:r>
           </w:p>
         </w:tc>
@@ -473,7 +473,7 @@
           </w:tcPr>
           <w:p>
             <w:r>
-              <w:t>74</w:t>
+              <w:t>76</w:t>
             </w:r>
           </w:p>
         </w:tc>
@@ -483,7 +483,7 @@
           </w:tcPr>
           <w:p>
             <w:r>
-              <w:t>75.4</w:t>
+              <w:t>78.9</w:t>
             </w:r>
           </w:p>
         </w:tc>
@@ -503,7 +503,7 @@
           </w:tcPr>
           <w:p>
             <w:r>
-              <w:t>34.6</w:t>
+              <w:t>34.0</w:t>
             </w:r>
           </w:p>
         </w:tc>
@@ -513,7 +513,7 @@
           </w:tcPr>
           <w:p>
             <w:r>
-              <w:t>69.0</w:t>
+              <w:t>70.6</w:t>
             </w:r>
           </w:p>
         </w:tc>
@@ -523,7 +523,7 @@
           </w:tcPr>
           <w:p>
             <w:r>
-              <w:t>853</w:t>
+              <w:t>40</w:t>
             </w:r>
           </w:p>
         </w:tc>
@@ -535,7 +535,7 @@
           </w:tcPr>
           <w:p>
             <w:r>
-              <w:t>2026-06-26 21:21:11</w:t>
+              <w:t>2026-06-26 22:22:25</w:t>
             </w:r>
           </w:p>
         </w:tc>
@@ -545,7 +545,7 @@
           </w:tcPr>
           <w:p>
             <w:r>
-              <w:t>75</w:t>
+              <w:t>76</w:t>
             </w:r>
           </w:p>
         </w:tc>
@@ -555,7 +555,7 @@
           </w:tcPr>
           <w:p>
             <w:r>
-              <w:t>77.6</w:t>
+              <w:t>78.9</w:t>
             </w:r>
           </w:p>
         </w:tc>
@@ -575,7 +575,7 @@
           </w:tcPr>
           <w:p>
             <w:r>
-              <w:t>34.6</w:t>
+              <w:t>34.1</w:t>
             </w:r>
           </w:p>
         </w:tc>
@@ -585,7 +585,7 @@
           </w:tcPr>
           <w:p>
             <w:r>
-              <w:t>70.0</w:t>
+              <w:t>70.6</w:t>
             </w:r>
           </w:p>
         </w:tc>
@@ -595,7 +595,7 @@
           </w:tcPr>
           <w:p>
             <w:r>
-              <w:t>972</w:t>
+              <w:t>490</w:t>
             </w:r>
           </w:p>
         </w:tc>
@@ -607,7 +607,7 @@
           </w:tcPr>
           <w:p>
             <w:r>
-              <w:t>2026-06-26 21:51:11</w:t>
+              <w:t>2026-06-26 22:52:28</w:t>
             </w:r>
           </w:p>
         </w:tc>
@@ -617,7 +617,7 @@
           </w:tcPr>
           <w:p>
             <w:r>
-              <w:t>75</w:t>
+              <w:t>76</w:t>
             </w:r>
           </w:p>
         </w:tc>
@@ -627,7 +627,7 @@
           </w:tcPr>
           <w:p>
             <w:r>
-              <w:t>77.6</w:t>
+              <w:t>78.9</w:t>
             </w:r>
           </w:p>
         </w:tc>
@@ -647,7 +647,7 @@
           </w:tcPr>
           <w:p>
             <w:r>
-              <w:t>34.6</w:t>
+              <w:t>34.4</w:t>
             </w:r>
           </w:p>
         </w:tc>
@@ -657,7 +657,7 @@
           </w:tcPr>
           <w:p>
             <w:r>
-              <w:t>70.0</w:t>
+              <w:t>70.7</w:t>
             </w:r>
           </w:p>
         </w:tc>
@@ -667,7 +667,7 @@
           </w:tcPr>
           <w:p>
             <w:r>
-              <w:t>22</w:t>
+              <w:t>278</w:t>
             </w:r>
           </w:p>
         </w:tc>
@@ -679,7 +679,7 @@
           </w:tcPr>
           <w:p>
             <w:r>
-              <w:t>2026-06-26 21:52:24</w:t>
+              <w:t>2026-06-26 23:00:58</w:t>
             </w:r>
           </w:p>
         </w:tc>
@@ -689,7 +689,7 @@
           </w:tcPr>
           <w:p>
             <w:r>
-              <w:t>76</w:t>
+              <w:t>77</w:t>
             </w:r>
           </w:p>
         </w:tc>
@@ -699,7 +699,7 @@
           </w:tcPr>
           <w:p>
             <w:r>
-              <w:t>78.9</w:t>
+              <w:t>75.9</w:t>
             </w:r>
           </w:p>
         </w:tc>
@@ -719,7 +719,7 @@
           </w:tcPr>
           <w:p>
             <w:r>
-              <w:t>34.0</w:t>
+              <w:t>35.6</w:t>
             </w:r>
           </w:p>
         </w:tc>
@@ -729,7 +729,7 @@
           </w:tcPr>
           <w:p>
             <w:r>
-              <w:t>70.6</w:t>
+              <w:t>69.5</w:t>
             </w:r>
           </w:p>
         </w:tc>
@@ -739,7 +739,7 @@
           </w:tcPr>
           <w:p>
             <w:r>
-              <w:t>40</w:t>
+              <w:t>35</w:t>
             </w:r>
           </w:p>
         </w:tc>
@@ -751,7 +751,7 @@
           </w:tcPr>
           <w:p>
             <w:r>
-              <w:t>2026-06-26 22:22:25</w:t>
+              <w:t>2026-06-26 23:18:02</w:t>
             </w:r>
           </w:p>
         </w:tc>
@@ -761,7 +761,7 @@
           </w:tcPr>
           <w:p>
             <w:r>
-              <w:t>76</w:t>
+              <w:t>78</w:t>
             </w:r>
           </w:p>
         </w:tc>
@@ -771,7 +771,7 @@
           </w:tcPr>
           <w:p>
             <w:r>
-              <w:t>78.9</w:t>
+              <w:t>72.9</w:t>
             </w:r>
           </w:p>
         </w:tc>
@@ -791,7 +791,7 @@
           </w:tcPr>
           <w:p>
             <w:r>
-              <w:t>34.1</w:t>
+              <w:t>36.9</w:t>
             </w:r>
           </w:p>
         </w:tc>
@@ -801,7 +801,7 @@
           </w:tcPr>
           <w:p>
             <w:r>
-              <w:t>70.6</w:t>
+              <w:t>68.3</w:t>
             </w:r>
           </w:p>
         </w:tc>
@@ -811,7 +811,7 @@
           </w:tcPr>
           <w:p>
             <w:r>
-              <w:t>490</w:t>
+              <w:t>291</w:t>
             </w:r>
           </w:p>
         </w:tc>
@@ -823,7 +823,7 @@
           </w:tcPr>
           <w:p>
             <w:r>
-              <w:t>2026-06-26 22:52:28</w:t>
+              <w:t>2026-06-26 23:44:05</w:t>
             </w:r>
           </w:p>
         </w:tc>
@@ -833,7 +833,7 @@
           </w:tcPr>
           <w:p>
             <w:r>
-              <w:t>76</w:t>
+              <w:t>78</w:t>
             </w:r>
           </w:p>
         </w:tc>
@@ -843,7 +843,7 @@
           </w:tcPr>
           <w:p>
             <w:r>
-              <w:t>78.9</w:t>
+              <w:t>72.9</w:t>
             </w:r>
           </w:p>
         </w:tc>
@@ -863,7 +863,7 @@
           </w:tcPr>
           <w:p>
             <w:r>
-              <w:t>34.4</w:t>
+              <w:t>49.0</w:t>
             </w:r>
           </w:p>
         </w:tc>
@@ -873,7 +873,7 @@
           </w:tcPr>
           <w:p>
             <w:r>
-              <w:t>70.7</w:t>
+              <w:t>71.3</w:t>
             </w:r>
           </w:p>
         </w:tc>
@@ -883,7 +883,7 @@
           </w:tcPr>
           <w:p>
             <w:r>
-              <w:t>278</w:t>
+              <w:t>253</w:t>
             </w:r>
           </w:p>
         </w:tc>
@@ -895,7 +895,7 @@
           </w:tcPr>
           <w:p>
             <w:r>
-              <w:t>2026-06-26 23:00:58</w:t>
+              <w:t>2026-06-26 23:45:02</w:t>
             </w:r>
           </w:p>
         </w:tc>
@@ -905,7 +905,7 @@
           </w:tcPr>
           <w:p>
             <w:r>
-              <w:t>77</w:t>
+              <w:t>79</w:t>
             </w:r>
           </w:p>
         </w:tc>
@@ -915,7 +915,7 @@
           </w:tcPr>
           <w:p>
             <w:r>
-              <w:t>75.9</w:t>
+              <w:t>70.1</w:t>
             </w:r>
           </w:p>
         </w:tc>
@@ -935,7 +935,7 @@
           </w:tcPr>
           <w:p>
             <w:r>
-              <w:t>35.6</w:t>
+              <w:t>49.0</w:t>
             </w:r>
           </w:p>
         </w:tc>
@@ -945,7 +945,7 @@
           </w:tcPr>
           <w:p>
             <w:r>
-              <w:t>69.5</w:t>
+              <w:t>69.9</w:t>
             </w:r>
           </w:p>
         </w:tc>
@@ -955,7 +955,7 @@
           </w:tcPr>
           <w:p>
             <w:r>
-              <w:t>35</w:t>
+              <w:t>267</w:t>
             </w:r>
           </w:p>
         </w:tc>
@@ -967,7 +967,7 @@
           </w:tcPr>
           <w:p>
             <w:r>
-              <w:t>2026-06-26 23:18:02</w:t>
+              <w:t>2026-06-27 00:02:46</w:t>
             </w:r>
           </w:p>
         </w:tc>
@@ -977,7 +977,7 @@
           </w:tcPr>
           <w:p>
             <w:r>
-              <w:t>78</w:t>
+              <w:t>80</w:t>
             </w:r>
           </w:p>
         </w:tc>
@@ -987,7 +987,7 @@
           </w:tcPr>
           <w:p>
             <w:r>
-              <w:t>72.9</w:t>
+              <w:t>67.3</w:t>
             </w:r>
           </w:p>
         </w:tc>
@@ -1007,7 +1007,7 @@
           </w:tcPr>
           <w:p>
             <w:r>
-              <w:t>36.9</w:t>
+              <w:t>50.1</w:t>
             </w:r>
           </w:p>
         </w:tc>
@@ -1017,7 +1017,7 @@
           </w:tcPr>
           <w:p>
             <w:r>
-              <w:t>68.3</w:t>
+              <w:t>68.8</w:t>
             </w:r>
           </w:p>
         </w:tc>
@@ -1027,7 +1027,7 @@
           </w:tcPr>
           <w:p>
             <w:r>
-              <w:t>291</w:t>
+              <w:t>533</w:t>
             </w:r>
           </w:p>
         </w:tc>
@@ -1039,7 +1039,7 @@
           </w:tcPr>
           <w:p>
             <w:r>
-              <w:t>2026-06-26 23:44:05</w:t>
+              <w:t>2026-06-27 00:18:01</w:t>
             </w:r>
           </w:p>
         </w:tc>
@@ -1049,7 +1049,7 @@
           </w:tcPr>
           <w:p>
             <w:r>
-              <w:t>78</w:t>
+              <w:t>81</w:t>
             </w:r>
           </w:p>
         </w:tc>
@@ -1059,7 +1059,7 @@
           </w:tcPr>
           <w:p>
             <w:r>
-              <w:t>72.9</w:t>
+              <w:t>64.5</w:t>
             </w:r>
           </w:p>
         </w:tc>
@@ -1079,7 +1079,7 @@
           </w:tcPr>
           <w:p>
             <w:r>
-              <w:t>49.0</w:t>
+              <w:t>50.2</w:t>
             </w:r>
           </w:p>
         </w:tc>
@@ -1089,7 +1089,7 @@
           </w:tcPr>
           <w:p>
             <w:r>
-              <w:t>71.3</w:t>
+              <w:t>67.4</w:t>
             </w:r>
           </w:p>
         </w:tc>
@@ -1099,7 +1099,7 @@
           </w:tcPr>
           <w:p>
             <w:r>
-              <w:t>253</w:t>
+              <w:t>762</w:t>
             </w:r>
           </w:p>
         </w:tc>
@@ -1111,7 +1111,7 @@
           </w:tcPr>
           <w:p>
             <w:r>
-              <w:t>2026-06-26 23:45:02</w:t>
+              <w:t>2026-06-27 00:33:02</w:t>
             </w:r>
           </w:p>
         </w:tc>
@@ -1121,7 +1121,7 @@
           </w:tcPr>
           <w:p>
             <w:r>
-              <w:t>79</w:t>
+              <w:t>82</w:t>
             </w:r>
           </w:p>
         </w:tc>
@@ -1131,7 +1131,7 @@
           </w:tcPr>
           <w:p>
             <w:r>
-              <w:t>70.1</w:t>
+              <w:t>66.0</w:t>
             </w:r>
           </w:p>
         </w:tc>
@@ -1151,7 +1151,7 @@
           </w:tcPr>
           <w:p>
             <w:r>
-              <w:t>49.0</w:t>
+              <w:t>49.5</w:t>
             </w:r>
           </w:p>
         </w:tc>
@@ -1161,7 +1161,7 @@
           </w:tcPr>
           <w:p>
             <w:r>
-              <w:t>69.9</w:t>
+              <w:t>68.0</w:t>
             </w:r>
           </w:p>
         </w:tc>
@@ -1171,7 +1171,7 @@
           </w:tcPr>
           <w:p>
             <w:r>
-              <w:t>267</w:t>
+              <w:t>75</w:t>
             </w:r>
           </w:p>
         </w:tc>
@@ -1183,7 +1183,7 @@
           </w:tcPr>
           <w:p>
             <w:r>
-              <w:t>2026-06-27 00:02:46</w:t>
+              <w:t>2026-06-27 01:03:02</w:t>
             </w:r>
           </w:p>
         </w:tc>
@@ -1193,7 +1193,7 @@
           </w:tcPr>
           <w:p>
             <w:r>
-              <w:t>80</w:t>
+              <w:t>83</w:t>
             </w:r>
           </w:p>
         </w:tc>
@@ -1203,7 +1203,7 @@
           </w:tcPr>
           <w:p>
             <w:r>
-              <w:t>67.3</w:t>
+              <w:t>63.3</w:t>
             </w:r>
           </w:p>
         </w:tc>
@@ -1223,7 +1223,7 @@
           </w:tcPr>
           <w:p>
             <w:r>
-              <w:t>50.1</w:t>
+              <w:t>47.7</w:t>
             </w:r>
           </w:p>
         </w:tc>
@@ -1233,7 +1233,7 @@
           </w:tcPr>
           <w:p>
             <w:r>
-              <w:t>68.8</w:t>
+              <w:t>66.2</w:t>
             </w:r>
           </w:p>
         </w:tc>
@@ -1243,7 +1243,7 @@
           </w:tcPr>
           <w:p>
             <w:r>
-              <w:t>533</w:t>
+              <w:t>525</w:t>
             </w:r>
           </w:p>
         </w:tc>
@@ -1255,7 +1255,7 @@
           </w:tcPr>
           <w:p>
             <w:r>
-              <w:t>2026-06-27 00:18:01</w:t>
+              <w:t>2026-06-27 01:33:05</w:t>
             </w:r>
           </w:p>
         </w:tc>
@@ -1265,7 +1265,7 @@
           </w:tcPr>
           <w:p>
             <w:r>
-              <w:t>81</w:t>
+              <w:t>83</w:t>
             </w:r>
           </w:p>
         </w:tc>
@@ -1275,7 +1275,7 @@
           </w:tcPr>
           <w:p>
             <w:r>
-              <w:t>64.5</w:t>
+              <w:t>63.3</w:t>
             </w:r>
           </w:p>
         </w:tc>
@@ -1295,7 +1295,7 @@
           </w:tcPr>
           <w:p>
             <w:r>
-              <w:t>50.2</w:t>
+              <w:t>47.7</w:t>
             </w:r>
           </w:p>
         </w:tc>
@@ -1305,7 +1305,7 @@
           </w:tcPr>
           <w:p>
             <w:r>
-              <w:t>67.4</w:t>
+              <w:t>66.2</w:t>
             </w:r>
           </w:p>
         </w:tc>
@@ -1315,7 +1315,7 @@
           </w:tcPr>
           <w:p>
             <w:r>
-              <w:t>762</w:t>
+              <w:t>304</w:t>
             </w:r>
           </w:p>
         </w:tc>
@@ -1327,7 +1327,7 @@
           </w:tcPr>
           <w:p>
             <w:r>
-              <w:t>2026-06-27 00:33:02</w:t>
+              <w:t>2026-06-27 02:03:05</w:t>
             </w:r>
           </w:p>
         </w:tc>
@@ -1337,7 +1337,7 @@
           </w:tcPr>
           <w:p>
             <w:r>
-              <w:t>82</w:t>
+              <w:t>84</w:t>
             </w:r>
           </w:p>
         </w:tc>
@@ -1347,7 +1347,7 @@
           </w:tcPr>
           <w:p>
             <w:r>
-              <w:t>66.0</w:t>
+              <w:t>65.6</w:t>
             </w:r>
           </w:p>
         </w:tc>
@@ -1367,7 +1367,7 @@
           </w:tcPr>
           <w:p>
             <w:r>
-              <w:t>49.5</w:t>
+              <w:t>47.7</w:t>
             </w:r>
           </w:p>
         </w:tc>
@@ -1377,7 +1377,7 @@
           </w:tcPr>
           <w:p>
             <w:r>
-              <w:t>68.0</w:t>
+              <w:t>67.3</w:t>
             </w:r>
           </w:p>
         </w:tc>
@@ -1387,7 +1387,7 @@
           </w:tcPr>
           <w:p>
             <w:r>
-              <w:t>75</w:t>
+              <w:t>754</w:t>
             </w:r>
           </w:p>
         </w:tc>
@@ -1399,7 +1399,7 @@
           </w:tcPr>
           <w:p>
             <w:r>
-              <w:t>2026-06-27 01:03:02</w:t>
+              <w:t>2026-06-27 02:33:07</w:t>
             </w:r>
           </w:p>
         </w:tc>
@@ -1409,7 +1409,7 @@
           </w:tcPr>
           <w:p>
             <w:r>
-              <w:t>83</w:t>
+              <w:t>84</w:t>
             </w:r>
           </w:p>
         </w:tc>
@@ -1419,7 +1419,7 @@
           </w:tcPr>
           <w:p>
             <w:r>
-              <w:t>63.3</w:t>
+              <w:t>65.6</w:t>
             </w:r>
           </w:p>
         </w:tc>
@@ -1449,7 +1449,7 @@
           </w:tcPr>
           <w:p>
             <w:r>
-              <w:t>66.2</w:t>
+              <w:t>67.3</w:t>
             </w:r>
           </w:p>
         </w:tc>
@@ -1459,7 +1459,7 @@
           </w:tcPr>
           <w:p>
             <w:r>
-              <w:t>525</w:t>
+              <w:t>4</w:t>
             </w:r>
           </w:p>
         </w:tc>
@@ -1471,7 +1471,7 @@
           </w:tcPr>
           <w:p>
             <w:r>
-              <w:t>2026-06-27 01:33:05</w:t>
+              <w:t>2026-06-27 03:03:04</w:t>
             </w:r>
           </w:p>
         </w:tc>
@@ -1481,7 +1481,7 @@
           </w:tcPr>
           <w:p>
             <w:r>
-              <w:t>83</w:t>
+              <w:t>85</w:t>
             </w:r>
           </w:p>
         </w:tc>
@@ -1491,7 +1491,7 @@
           </w:tcPr>
           <w:p>
             <w:r>
-              <w:t>63.3</w:t>
+              <w:t>67.4</w:t>
             </w:r>
           </w:p>
         </w:tc>
@@ -1511,7 +1511,7 @@
           </w:tcPr>
           <w:p>
             <w:r>
-              <w:t>47.7</w:t>
+              <w:t>47.1</w:t>
             </w:r>
           </w:p>
         </w:tc>
@@ -1521,7 +1521,7 @@
           </w:tcPr>
           <w:p>
             <w:r>
-              <w:t>66.2</w:t>
+              <w:t>68.1</w:t>
             </w:r>
           </w:p>
         </w:tc>
@@ -1531,7 +1531,7 @@
           </w:tcPr>
           <w:p>
             <w:r>
-              <w:t>304</w:t>
+              <w:t>58</w:t>
             </w:r>
           </w:p>
         </w:tc>
@@ -1543,7 +1543,7 @@
           </w:tcPr>
           <w:p>
             <w:r>
-              <w:t>2026-06-27 02:03:05</w:t>
+              <w:t>2026-06-27 03:33:05</w:t>
             </w:r>
           </w:p>
         </w:tc>
@@ -1553,7 +1553,7 @@
           </w:tcPr>
           <w:p>
             <w:r>
-              <w:t>84</w:t>
+              <w:t>85</w:t>
             </w:r>
           </w:p>
         </w:tc>
@@ -1563,7 +1563,7 @@
           </w:tcPr>
           <w:p>
             <w:r>
-              <w:t>65.6</w:t>
+              <w:t>67.4</w:t>
             </w:r>
           </w:p>
         </w:tc>
@@ -1583,7 +1583,7 @@
           </w:tcPr>
           <w:p>
             <w:r>
-              <w:t>47.7</w:t>
+              <w:t>47.0</w:t>
             </w:r>
           </w:p>
         </w:tc>
@@ -1593,7 +1593,7 @@
           </w:tcPr>
           <w:p>
             <w:r>
-              <w:t>67.3</w:t>
+              <w:t>68.1</w:t>
             </w:r>
           </w:p>
         </w:tc>
@@ -1603,7 +1603,7 @@
           </w:tcPr>
           <w:p>
             <w:r>
-              <w:t>754</w:t>
+              <w:t>125</w:t>
             </w:r>
           </w:p>
         </w:tc>
@@ -1615,7 +1615,7 @@
           </w:tcPr>
           <w:p>
             <w:r>
-              <w:t>2026-06-27 02:33:07</w:t>
+              <w:t>2026-06-27 03:48:02</w:t>
             </w:r>
           </w:p>
         </w:tc>
@@ -1625,7 +1625,7 @@
           </w:tcPr>
           <w:p>
             <w:r>
-              <w:t>84</w:t>
+              <w:t>86</w:t>
             </w:r>
           </w:p>
         </w:tc>
@@ -1635,7 +1635,7 @@
           </w:tcPr>
           <w:p>
             <w:r>
-              <w:t>65.6</w:t>
+              <w:t>64.8</w:t>
             </w:r>
           </w:p>
         </w:tc>
@@ -1655,7 +1655,7 @@
           </w:tcPr>
           <w:p>
             <w:r>
-              <w:t>47.7</w:t>
+              <w:t>47.0</w:t>
             </w:r>
           </w:p>
         </w:tc>
@@ -1665,7 +1665,7 @@
           </w:tcPr>
           <w:p>
             <w:r>
-              <w:t>67.3</w:t>
+              <w:t>66.8</w:t>
             </w:r>
           </w:p>
         </w:tc>
@@ -1675,7 +1675,7 @@
           </w:tcPr>
           <w:p>
             <w:r>
-              <w:t>4</w:t>
+              <w:t>349</w:t>
             </w:r>
           </w:p>
         </w:tc>
@@ -1687,7 +1687,7 @@
           </w:tcPr>
           <w:p>
             <w:r>
-              <w:t>2026-06-27 03:03:04</w:t>
+              <w:t>2026-06-27 04:18:30</w:t>
             </w:r>
           </w:p>
         </w:tc>
@@ -1697,7 +1697,7 @@
           </w:tcPr>
           <w:p>
             <w:r>
-              <w:t>85</w:t>
+              <w:t>86</w:t>
             </w:r>
           </w:p>
         </w:tc>
@@ -1707,7 +1707,7 @@
           </w:tcPr>
           <w:p>
             <w:r>
-              <w:t>67.4</w:t>
+              <w:t>64.8</w:t>
             </w:r>
           </w:p>
         </w:tc>
@@ -1717,7 +1717,7 @@
           </w:tcPr>
           <w:p>
             <w:r>
-              <w:t>90.4</w:t>
+              <w:t>90.3</w:t>
             </w:r>
           </w:p>
         </w:tc>
@@ -1727,7 +1727,7 @@
           </w:tcPr>
           <w:p>
             <w:r>
-              <w:t>47.1</w:t>
+              <w:t>47.0</w:t>
             </w:r>
           </w:p>
         </w:tc>
@@ -1737,7 +1737,7 @@
           </w:tcPr>
           <w:p>
             <w:r>
-              <w:t>68.1</w:t>
+              <w:t>66.7</w:t>
             </w:r>
           </w:p>
         </w:tc>
@@ -1747,7 +1747,7 @@
           </w:tcPr>
           <w:p>
             <w:r>
-              <w:t>58</w:t>
+              <w:t>11</w:t>
             </w:r>
           </w:p>
         </w:tc>
@@ -1768,7 +1768,7 @@
     </w:p>
     <w:p>
       <w:r>
-        <w:t>Section score: 67.4 / 100  (Grade: D)</w:t>
+        <w:t>Section score: 64.8 / 100  (Grade: D)</w:t>
       </w:r>
     </w:p>
     <w:p>
@@ -1879,7 +1879,7 @@
           </w:tcPr>
           <w:p>
             <w:r>
-              <w:t>52.6</w:t>
+              <w:t>42.6</w:t>
             </w:r>
           </w:p>
         </w:tc>
@@ -1889,7 +1889,7 @@
           </w:tcPr>
           <w:p>
             <w:r>
-              <w:t>7.9</w:t>
+              <w:t>6.4</w:t>
             </w:r>
           </w:p>
         </w:tc>
@@ -1911,7 +1911,7 @@
           </w:tcPr>
           <w:p>
             <w:r>
-              <w:t>38.6</w:t>
+              <w:t>34.4</w:t>
             </w:r>
           </w:p>
         </w:tc>
@@ -1921,7 +1921,7 @@
           </w:tcPr>
           <w:p>
             <w:r>
-              <w:t>5.8</w:t>
+              <w:t>5.2</w:t>
             </w:r>
           </w:p>
         </w:tc>
@@ -2007,7 +2007,7 @@
           </w:tcPr>
           <w:p>
             <w:r>
-              <w:t>75.8</w:t>
+              <w:t>74.2</w:t>
             </w:r>
           </w:p>
         </w:tc>
@@ -2017,7 +2017,7 @@
           </w:tcPr>
           <w:p>
             <w:r>
-              <w:t>7.6</w:t>
+              <w:t>7.4</w:t>
             </w:r>
           </w:p>
         </w:tc>
@@ -2039,7 +2039,7 @@
           </w:tcPr>
           <w:p>
             <w:r>
-              <w:t>44.7</w:t>
+              <w:t>43.3</w:t>
             </w:r>
           </w:p>
         </w:tc>
@@ -2049,7 +2049,7 @@
           </w:tcPr>
           <w:p>
             <w:r>
-              <w:t>11.2</w:t>
+              <w:t>10.8</w:t>
             </w:r>
           </w:p>
         </w:tc>
@@ -2090,7 +2090,7 @@
           </w:tcPr>
           <w:p>
             <w:r>
-              <w:t>$561.01</w:t>
+              <w:t>$556.01</w:t>
             </w:r>
           </w:p>
         </w:tc>
@@ -2112,7 +2112,7 @@
           </w:tcPr>
           <w:p>
             <w:r>
-              <w:t>12.20%</w:t>
+              <w:t>11.20%</w:t>
             </w:r>
           </w:p>
         </w:tc>
@@ -2134,7 +2134,7 @@
           </w:tcPr>
           <w:p>
             <w:r>
-              <w:t>$1.28</w:t>
+              <w:t>$-3.72</w:t>
             </w:r>
           </w:p>
         </w:tc>
@@ -2178,7 +2178,7 @@
           </w:tcPr>
           <w:p>
             <w:r>
-              <w:t>0.6235</w:t>
+              <w:t>0.6163</w:t>
             </w:r>
           </w:p>
         </w:tc>
@@ -2200,7 +2200,7 @@
           </w:tcPr>
           <w:p>
             <w:r>
-              <w:t>0.5000 / 0.6615</w:t>
+              <w:t>0.5000 / 0.6515</w:t>
             </w:r>
           </w:p>
         </w:tc>
@@ -2222,7 +2222,7 @@
           </w:tcPr>
           <w:p>
             <w:r>
-              <w:t>1.0088</w:t>
+              <w:t>0.9752</w:t>
             </w:r>
           </w:p>
         </w:tc>
@@ -2244,7 +2244,7 @@
           </w:tcPr>
           <w:p>
             <w:r>
-              <w:t>85 / 85</w:t>
+              <w:t>86 / 86</w:t>
             </w:r>
           </w:p>
         </w:tc>
@@ -2266,7 +2266,7 @@
           </w:tcPr>
           <w:p>
             <w:r>
-              <w:t>$0.01</w:t>
+              <w:t>$-0.04</w:t>
             </w:r>
           </w:p>
         </w:tc>
@@ -2397,7 +2397,7 @@
           </w:tcPr>
           <w:p>
             <w:r>
-              <w:t>0.590</w:t>
+              <w:t>0.550</w:t>
             </w:r>
           </w:p>
         </w:tc>
@@ -2407,7 +2407,7 @@
           </w:tcPr>
           <w:p>
             <w:r>
-              <w:t>down</w:t>
+              <w:t>up</w:t>
             </w:r>
           </w:p>
         </w:tc>
@@ -2417,7 +2417,7 @@
           </w:tcPr>
           <w:p>
             <w:r>
-              <w:t>Yes</w:t>
+              <w:t>No</w:t>
             </w:r>
           </w:p>
         </w:tc>
@@ -2427,7 +2427,7 @@
           </w:tcPr>
           <w:p>
             <w:r>
-              <w:t>$3.47</w:t>
+              <w:t>$-5.00</w:t>
             </w:r>
           </w:p>
         </w:tc>
@@ -2449,7 +2449,7 @@
           </w:tcPr>
           <w:p>
             <w:r>
-              <w:t>0.520</w:t>
+              <w:t>0.590</w:t>
             </w:r>
           </w:p>
         </w:tc>
@@ -2479,7 +2479,7 @@
           </w:tcPr>
           <w:p>
             <w:r>
-              <w:t>$4.62</w:t>
+              <w:t>$3.47</w:t>
             </w:r>
           </w:p>
         </w:tc>
@@ -2501,7 +2501,7 @@
           </w:tcPr>
           <w:p>
             <w:r>
-              <w:t>0.570</w:t>
+              <w:t>0.520</w:t>
             </w:r>
           </w:p>
         </w:tc>
@@ -2511,7 +2511,7 @@
           </w:tcPr>
           <w:p>
             <w:r>
-              <w:t>up</w:t>
+              <w:t>down</w:t>
             </w:r>
           </w:p>
         </w:tc>
@@ -2521,7 +2521,7 @@
           </w:tcPr>
           <w:p>
             <w:r>
-              <w:t>No</w:t>
+              <w:t>Yes</w:t>
             </w:r>
           </w:p>
         </w:tc>
@@ -2531,7 +2531,7 @@
           </w:tcPr>
           <w:p>
             <w:r>
-              <w:t>$-5.00</w:t>
+              <w:t>$4.62</w:t>
             </w:r>
           </w:p>
         </w:tc>
@@ -2553,7 +2553,7 @@
           </w:tcPr>
           <w:p>
             <w:r>
-              <w:t>0.650</w:t>
+              <w:t>0.570</w:t>
             </w:r>
           </w:p>
         </w:tc>
@@ -2563,7 +2563,7 @@
           </w:tcPr>
           <w:p>
             <w:r>
-              <w:t>down</w:t>
+              <w:t>up</w:t>
             </w:r>
           </w:p>
         </w:tc>
@@ -2573,7 +2573,7 @@
           </w:tcPr>
           <w:p>
             <w:r>
-              <w:t>Yes</w:t>
+              <w:t>No</w:t>
             </w:r>
           </w:p>
         </w:tc>
@@ -2583,7 +2583,7 @@
           </w:tcPr>
           <w:p>
             <w:r>
-              <w:t>$2.69</w:t>
+              <w:t>$-5.00</w:t>
             </w:r>
           </w:p>
         </w:tc>
@@ -2605,7 +2605,7 @@
           </w:tcPr>
           <w:p>
             <w:r>
-              <w:t>0.690</w:t>
+              <w:t>0.650</w:t>
             </w:r>
           </w:p>
         </w:tc>
@@ -2615,7 +2615,7 @@
           </w:tcPr>
           <w:p>
             <w:r>
-              <w:t>up</w:t>
+              <w:t>down</w:t>
             </w:r>
           </w:p>
         </w:tc>
@@ -2625,7 +2625,7 @@
           </w:tcPr>
           <w:p>
             <w:r>
-              <w:t>No</w:t>
+              <w:t>Yes</w:t>
             </w:r>
           </w:p>
         </w:tc>
@@ -2635,7 +2635,7 @@
           </w:tcPr>
           <w:p>
             <w:r>
-              <w:t>$-5.00</w:t>
+              <w:t>$2.69</w:t>
             </w:r>
           </w:p>
         </w:tc>
@@ -2657,7 +2657,7 @@
           </w:tcPr>
           <w:p>
             <w:r>
-              <w:t>0.570</w:t>
+              <w:t>0.690</w:t>
             </w:r>
           </w:p>
         </w:tc>
@@ -2709,7 +2709,7 @@
           </w:tcPr>
           <w:p>
             <w:r>
-              <w:t>0.600</w:t>
+              <w:t>0.570</w:t>
             </w:r>
           </w:p>
         </w:tc>
@@ -2761,7 +2761,7 @@
           </w:tcPr>
           <w:p>
             <w:r>
-              <w:t>0.563</w:t>
+              <w:t>0.600</w:t>
             </w:r>
           </w:p>
         </w:tc>
@@ -2813,7 +2813,7 @@
           </w:tcPr>
           <w:p>
             <w:r>
-              <w:t>0.670</w:t>
+              <w:t>0.563</w:t>
             </w:r>
           </w:p>
         </w:tc>
@@ -2865,7 +2865,7 @@
           </w:tcPr>
           <w:p>
             <w:r>
-              <w:t>0.690</w:t>
+              <w:t>0.670</w:t>
             </w:r>
           </w:p>
         </w:tc>
@@ -2875,7 +2875,7 @@
           </w:tcPr>
           <w:p>
             <w:r>
-              <w:t>down</w:t>
+              <w:t>up</w:t>
             </w:r>
           </w:p>
         </w:tc>
@@ -2885,7 +2885,7 @@
           </w:tcPr>
           <w:p>
             <w:r>
-              <w:t>Yes</w:t>
+              <w:t>No</w:t>
             </w:r>
           </w:p>
         </w:tc>
@@ -2895,7 +2895,7 @@
           </w:tcPr>
           <w:p>
             <w:r>
-              <w:t>$2.25</w:t>
+              <w:t>$-5.00</w:t>
             </w:r>
           </w:p>
         </w:tc>
@@ -2917,7 +2917,7 @@
           </w:tcPr>
           <w:p>
             <w:r>
-              <w:t>0.550</w:t>
+              <w:t>0.690</w:t>
             </w:r>
           </w:p>
         </w:tc>
@@ -2947,7 +2947,7 @@
           </w:tcPr>
           <w:p>
             <w:r>
-              <w:t>$4.09</w:t>
+              <w:t>$2.25</w:t>
             </w:r>
           </w:p>
         </w:tc>
@@ -2969,7 +2969,7 @@
           </w:tcPr>
           <w:p>
             <w:r>
-              <w:t>0.650</w:t>
+              <w:t>0.550</w:t>
             </w:r>
           </w:p>
         </w:tc>
@@ -2979,7 +2979,7 @@
           </w:tcPr>
           <w:p>
             <w:r>
-              <w:t>up</w:t>
+              <w:t>down</w:t>
             </w:r>
           </w:p>
         </w:tc>
@@ -2989,7 +2989,7 @@
           </w:tcPr>
           <w:p>
             <w:r>
-              <w:t>No</w:t>
+              <w:t>Yes</w:t>
             </w:r>
           </w:p>
         </w:tc>
@@ -2999,7 +2999,7 @@
           </w:tcPr>
           <w:p>
             <w:r>
-              <w:t>$-5.00</w:t>
+              <w:t>$4.09</w:t>
             </w:r>
           </w:p>
         </w:tc>
@@ -3021,7 +3021,7 @@
           </w:tcPr>
           <w:p>
             <w:r>
-              <w:t>0.700</w:t>
+              <w:t>0.650</w:t>
             </w:r>
           </w:p>
         </w:tc>
@@ -3073,7 +3073,7 @@
           </w:tcPr>
           <w:p>
             <w:r>
-              <w:t>0.630</w:t>
+              <w:t>0.700</w:t>
             </w:r>
           </w:p>
         </w:tc>
@@ -3083,7 +3083,7 @@
           </w:tcPr>
           <w:p>
             <w:r>
-              <w:t>down</w:t>
+              <w:t>up</w:t>
             </w:r>
           </w:p>
         </w:tc>
@@ -3093,7 +3093,7 @@
           </w:tcPr>
           <w:p>
             <w:r>
-              <w:t>Yes</w:t>
+              <w:t>No</w:t>
             </w:r>
           </w:p>
         </w:tc>
@@ -3103,7 +3103,7 @@
           </w:tcPr>
           <w:p>
             <w:r>
-              <w:t>$2.94</w:t>
+              <w:t>$-5.00</w:t>
             </w:r>
           </w:p>
         </w:tc>
@@ -3125,7 +3125,7 @@
           </w:tcPr>
           <w:p>
             <w:r>
-              <w:t>0.650</w:t>
+              <w:t>0.630</w:t>
             </w:r>
           </w:p>
         </w:tc>
@@ -3155,7 +3155,7 @@
           </w:tcPr>
           <w:p>
             <w:r>
-              <w:t>$2.69</w:t>
+              <w:t>$2.94</w:t>
             </w:r>
           </w:p>
         </w:tc>
@@ -3176,7 +3176,7 @@
     </w:p>
     <w:p>
       <w:r>
-        <w:t>Section score: 90.4 / 100  (Grade: A)</w:t>
+        <w:t>Section score: 90.3 / 100  (Grade: A)</w:t>
       </w:r>
     </w:p>
     <w:p>
@@ -3319,7 +3319,7 @@
           </w:tcPr>
           <w:p>
             <w:r>
-              <w:t>95.8</w:t>
+              <w:t>95.5</w:t>
             </w:r>
           </w:p>
         </w:tc>
@@ -3329,7 +3329,7 @@
           </w:tcPr>
           <w:p>
             <w:r>
-              <w:t>14.4</w:t>
+              <w:t>14.3</w:t>
             </w:r>
           </w:p>
         </w:tc>
@@ -3433,17 +3433,17 @@
     </w:tbl>
     <w:p>
       <w:r>
-        <w:t>Ticks: 350 · Reconciled: True · Readiness: not_ready</w:t>
+        <w:t>Ticks: 14 · Reconciled: True · Readiness: not_ready</w:t>
       </w:r>
     </w:p>
     <w:p>
       <w:r>
-        <w:t>Candidates created: 47701 · Terminals: {'accepted': 85, 'rejected': 40467, 'skipped': 6958, 'expired': 0, 'missing_data': 191}</w:t>
+        <w:t>Candidates created: 48242 · Terminals: {'accepted': 86, 'rejected': 40922, 'skipped': 7041, 'expired': 0, 'missing_data': 193}</w:t>
       </w:r>
     </w:p>
     <w:p>
       <w:r>
-        <w:t>Rejected by stage: {'directional': 30661, 'execution_gate': 155, 'context_gate': 879, 'directional_allowlist': 1364, 'down_bias_gate': 538, 'mtf_gate': 275, 'grok_decider': 3540, 'execution_realistic': 3, 'verifier': 61, 'mispricing_gate': 50, 'baseline_cohort_gate': 2941}</w:t>
+        <w:t>Rejected by stage: {'directional': 31044, 'execution_gate': 155, 'context_gate': 879, 'directional_allowlist': 1364, 'down_bias_gate': 538, 'mtf_gate': 275, 'grok_decider': 3540, 'execution_realistic': 3, 'verifier': 61, 'mispricing_gate': 50, 'baseline_cohort_gate': 3013}</w:t>
       </w:r>
     </w:p>
     <w:p>
@@ -4396,7 +4396,7 @@
           </w:tcPr>
           <w:p>
             <w:r>
-              <w:t>0.4970</w:t>
+              <w:t>0.4941</w:t>
             </w:r>
           </w:p>
         </w:tc>
@@ -4426,7 +4426,7 @@
     </w:tbl>
     <w:p>
       <w:r>
-        <w:t>TV alerts: received 149 · valid 132 · rejected 17</w:t>
+        <w:t>TV alerts: received 162 · valid 145 · rejected 17</w:t>
       </w:r>
     </w:p>
     <w:sectPr>

</xml_diff>

<commit_message>
chore(reports): VPS full report 2026-06-27 05:37 UTC (86 settled, WR 61.6%, PF 0.9752)
</commit_message>
<xml_diff>
--- a/vps_full_reports/latest/report.docx
+++ b/vps_full_reports/latest/report.docx
@@ -20,7 +20,7 @@
           <w:color w:val="666666"/>
           <w:sz w:val="20"/>
         </w:rPr>
-        <w:t>PAPER ONLY  ·  reconciled=True  ·  ticks=5</w:t>
+        <w:t>PAPER ONLY  ·  reconciled=True  ·  ticks=6</w:t>
       </w:r>
     </w:p>
     <w:p>
@@ -3433,17 +3433,17 @@
     </w:tbl>
     <w:p>
       <w:r>
-        <w:t>Ticks: 5 · Reconciled: True · Readiness: not_ready</w:t>
+        <w:t>Ticks: 6 · Reconciled: True · Readiness: not_ready</w:t>
       </w:r>
     </w:p>
     <w:p>
       <w:r>
-        <w:t>Candidates created: 48314 · Terminals: {'accepted': 86, 'rejected': 40966, 'skipped': 7062, 'expired': 0, 'missing_data': 200}</w:t>
+        <w:t>Candidates created: 48321 · Terminals: {'accepted': 86, 'rejected': 40967, 'skipped': 7067, 'expired': 0, 'missing_data': 201}</w:t>
       </w:r>
     </w:p>
     <w:p>
       <w:r>
-        <w:t>Rejected by stage: {'directional': 31086, 'execution_gate': 155, 'context_gate': 879, 'directional_allowlist': 1364, 'down_bias_gate': 538, 'mtf_gate': 275, 'grok_decider': 3540, 'execution_realistic': 3, 'verifier': 61, 'mispricing_gate': 50, 'baseline_cohort_gate': 3015}</w:t>
+        <w:t>Rejected by stage: {'directional': 31086, 'execution_gate': 155, 'context_gate': 879, 'directional_allowlist': 1364, 'down_bias_gate': 538, 'mtf_gate': 275, 'grok_decider': 3540, 'execution_realistic': 3, 'verifier': 61, 'mispricing_gate': 50, 'baseline_cohort_gate': 3016}</w:t>
       </w:r>
     </w:p>
     <w:p>
@@ -4374,7 +4374,7 @@
           </w:tcPr>
           <w:p>
             <w:r>
-              <w:t>0.4432</w:t>
+              <w:t>0.4382</w:t>
             </w:r>
           </w:p>
         </w:tc>
@@ -4396,7 +4396,7 @@
           </w:tcPr>
           <w:p>
             <w:r>
-              <w:t>0.4941</w:t>
+              <w:t>0.4951</w:t>
             </w:r>
           </w:p>
         </w:tc>

</xml_diff>

<commit_message>
chore(reports): VPS full report 2026-06-27 06:33 UTC (86 settled, WR 61.6%, PF 0.9752)
</commit_message>
<xml_diff>
--- a/vps_full_reports/latest/report.docx
+++ b/vps_full_reports/latest/report.docx
@@ -20,7 +20,7 @@
           <w:color w:val="666666"/>
           <w:sz w:val="20"/>
         </w:rPr>
-        <w:t>PAPER ONLY  ·  reconciled=True  ·  ticks=6</w:t>
+        <w:t>PAPER ONLY  ·  reconciled=True  ·  ticks=63</w:t>
       </w:r>
     </w:p>
     <w:p>
@@ -319,7 +319,7 @@
           </w:tcPr>
           <w:p>
             <w:r>
-              <w:t>2026-06-26 21:52:24</w:t>
+              <w:t>2026-06-26 22:52:28</w:t>
             </w:r>
           </w:p>
         </w:tc>
@@ -359,7 +359,7 @@
           </w:tcPr>
           <w:p>
             <w:r>
-              <w:t>34.0</w:t>
+              <w:t>34.4</w:t>
             </w:r>
           </w:p>
         </w:tc>
@@ -369,7 +369,7 @@
           </w:tcPr>
           <w:p>
             <w:r>
-              <w:t>70.6</w:t>
+              <w:t>70.7</w:t>
             </w:r>
           </w:p>
         </w:tc>
@@ -379,7 +379,7 @@
           </w:tcPr>
           <w:p>
             <w:r>
-              <w:t>40</w:t>
+              <w:t>278</w:t>
             </w:r>
           </w:p>
         </w:tc>
@@ -391,7 +391,7 @@
           </w:tcPr>
           <w:p>
             <w:r>
-              <w:t>2026-06-26 22:22:25</w:t>
+              <w:t>2026-06-26 23:00:58</w:t>
             </w:r>
           </w:p>
         </w:tc>
@@ -401,7 +401,7 @@
           </w:tcPr>
           <w:p>
             <w:r>
-              <w:t>76</w:t>
+              <w:t>77</w:t>
             </w:r>
           </w:p>
         </w:tc>
@@ -411,7 +411,7 @@
           </w:tcPr>
           <w:p>
             <w:r>
-              <w:t>78.9</w:t>
+              <w:t>75.9</w:t>
             </w:r>
           </w:p>
         </w:tc>
@@ -431,7 +431,7 @@
           </w:tcPr>
           <w:p>
             <w:r>
-              <w:t>34.1</w:t>
+              <w:t>35.6</w:t>
             </w:r>
           </w:p>
         </w:tc>
@@ -441,7 +441,7 @@
           </w:tcPr>
           <w:p>
             <w:r>
-              <w:t>70.6</w:t>
+              <w:t>69.5</w:t>
             </w:r>
           </w:p>
         </w:tc>
@@ -451,7 +451,7 @@
           </w:tcPr>
           <w:p>
             <w:r>
-              <w:t>490</w:t>
+              <w:t>35</w:t>
             </w:r>
           </w:p>
         </w:tc>
@@ -463,7 +463,7 @@
           </w:tcPr>
           <w:p>
             <w:r>
-              <w:t>2026-06-26 22:52:28</w:t>
+              <w:t>2026-06-26 23:18:02</w:t>
             </w:r>
           </w:p>
         </w:tc>
@@ -473,7 +473,7 @@
           </w:tcPr>
           <w:p>
             <w:r>
-              <w:t>76</w:t>
+              <w:t>78</w:t>
             </w:r>
           </w:p>
         </w:tc>
@@ -483,7 +483,7 @@
           </w:tcPr>
           <w:p>
             <w:r>
-              <w:t>78.9</w:t>
+              <w:t>72.9</w:t>
             </w:r>
           </w:p>
         </w:tc>
@@ -503,7 +503,7 @@
           </w:tcPr>
           <w:p>
             <w:r>
-              <w:t>34.4</w:t>
+              <w:t>36.9</w:t>
             </w:r>
           </w:p>
         </w:tc>
@@ -513,7 +513,7 @@
           </w:tcPr>
           <w:p>
             <w:r>
-              <w:t>70.7</w:t>
+              <w:t>68.3</w:t>
             </w:r>
           </w:p>
         </w:tc>
@@ -523,7 +523,7 @@
           </w:tcPr>
           <w:p>
             <w:r>
-              <w:t>278</w:t>
+              <w:t>291</w:t>
             </w:r>
           </w:p>
         </w:tc>
@@ -535,7 +535,7 @@
           </w:tcPr>
           <w:p>
             <w:r>
-              <w:t>2026-06-26 23:00:58</w:t>
+              <w:t>2026-06-26 23:44:05</w:t>
             </w:r>
           </w:p>
         </w:tc>
@@ -545,7 +545,7 @@
           </w:tcPr>
           <w:p>
             <w:r>
-              <w:t>77</w:t>
+              <w:t>78</w:t>
             </w:r>
           </w:p>
         </w:tc>
@@ -555,7 +555,7 @@
           </w:tcPr>
           <w:p>
             <w:r>
-              <w:t>75.9</w:t>
+              <w:t>72.9</w:t>
             </w:r>
           </w:p>
         </w:tc>
@@ -575,7 +575,7 @@
           </w:tcPr>
           <w:p>
             <w:r>
-              <w:t>35.6</w:t>
+              <w:t>49.0</w:t>
             </w:r>
           </w:p>
         </w:tc>
@@ -585,7 +585,7 @@
           </w:tcPr>
           <w:p>
             <w:r>
-              <w:t>69.5</w:t>
+              <w:t>71.3</w:t>
             </w:r>
           </w:p>
         </w:tc>
@@ -595,7 +595,7 @@
           </w:tcPr>
           <w:p>
             <w:r>
-              <w:t>35</w:t>
+              <w:t>253</w:t>
             </w:r>
           </w:p>
         </w:tc>
@@ -607,7 +607,7 @@
           </w:tcPr>
           <w:p>
             <w:r>
-              <w:t>2026-06-26 23:18:02</w:t>
+              <w:t>2026-06-26 23:45:02</w:t>
             </w:r>
           </w:p>
         </w:tc>
@@ -617,7 +617,7 @@
           </w:tcPr>
           <w:p>
             <w:r>
-              <w:t>78</w:t>
+              <w:t>79</w:t>
             </w:r>
           </w:p>
         </w:tc>
@@ -627,7 +627,7 @@
           </w:tcPr>
           <w:p>
             <w:r>
-              <w:t>72.9</w:t>
+              <w:t>70.1</w:t>
             </w:r>
           </w:p>
         </w:tc>
@@ -647,7 +647,7 @@
           </w:tcPr>
           <w:p>
             <w:r>
-              <w:t>36.9</w:t>
+              <w:t>49.0</w:t>
             </w:r>
           </w:p>
         </w:tc>
@@ -657,7 +657,7 @@
           </w:tcPr>
           <w:p>
             <w:r>
-              <w:t>68.3</w:t>
+              <w:t>69.9</w:t>
             </w:r>
           </w:p>
         </w:tc>
@@ -667,7 +667,7 @@
           </w:tcPr>
           <w:p>
             <w:r>
-              <w:t>291</w:t>
+              <w:t>267</w:t>
             </w:r>
           </w:p>
         </w:tc>
@@ -679,7 +679,7 @@
           </w:tcPr>
           <w:p>
             <w:r>
-              <w:t>2026-06-26 23:44:05</w:t>
+              <w:t>2026-06-27 00:02:46</w:t>
             </w:r>
           </w:p>
         </w:tc>
@@ -689,7 +689,7 @@
           </w:tcPr>
           <w:p>
             <w:r>
-              <w:t>78</w:t>
+              <w:t>80</w:t>
             </w:r>
           </w:p>
         </w:tc>
@@ -699,7 +699,7 @@
           </w:tcPr>
           <w:p>
             <w:r>
-              <w:t>72.9</w:t>
+              <w:t>67.3</w:t>
             </w:r>
           </w:p>
         </w:tc>
@@ -719,7 +719,7 @@
           </w:tcPr>
           <w:p>
             <w:r>
-              <w:t>49.0</w:t>
+              <w:t>50.1</w:t>
             </w:r>
           </w:p>
         </w:tc>
@@ -729,7 +729,7 @@
           </w:tcPr>
           <w:p>
             <w:r>
-              <w:t>71.3</w:t>
+              <w:t>68.8</w:t>
             </w:r>
           </w:p>
         </w:tc>
@@ -739,7 +739,7 @@
           </w:tcPr>
           <w:p>
             <w:r>
-              <w:t>253</w:t>
+              <w:t>533</w:t>
             </w:r>
           </w:p>
         </w:tc>
@@ -751,7 +751,7 @@
           </w:tcPr>
           <w:p>
             <w:r>
-              <w:t>2026-06-26 23:45:02</w:t>
+              <w:t>2026-06-27 00:18:01</w:t>
             </w:r>
           </w:p>
         </w:tc>
@@ -761,7 +761,7 @@
           </w:tcPr>
           <w:p>
             <w:r>
-              <w:t>79</w:t>
+              <w:t>81</w:t>
             </w:r>
           </w:p>
         </w:tc>
@@ -771,7 +771,7 @@
           </w:tcPr>
           <w:p>
             <w:r>
-              <w:t>70.1</w:t>
+              <w:t>64.5</w:t>
             </w:r>
           </w:p>
         </w:tc>
@@ -791,7 +791,7 @@
           </w:tcPr>
           <w:p>
             <w:r>
-              <w:t>49.0</w:t>
+              <w:t>50.2</w:t>
             </w:r>
           </w:p>
         </w:tc>
@@ -801,7 +801,7 @@
           </w:tcPr>
           <w:p>
             <w:r>
-              <w:t>69.9</w:t>
+              <w:t>67.4</w:t>
             </w:r>
           </w:p>
         </w:tc>
@@ -811,7 +811,7 @@
           </w:tcPr>
           <w:p>
             <w:r>
-              <w:t>267</w:t>
+              <w:t>762</w:t>
             </w:r>
           </w:p>
         </w:tc>
@@ -823,7 +823,7 @@
           </w:tcPr>
           <w:p>
             <w:r>
-              <w:t>2026-06-27 00:02:46</w:t>
+              <w:t>2026-06-27 00:33:02</w:t>
             </w:r>
           </w:p>
         </w:tc>
@@ -833,7 +833,7 @@
           </w:tcPr>
           <w:p>
             <w:r>
-              <w:t>80</w:t>
+              <w:t>82</w:t>
             </w:r>
           </w:p>
         </w:tc>
@@ -843,7 +843,7 @@
           </w:tcPr>
           <w:p>
             <w:r>
-              <w:t>67.3</w:t>
+              <w:t>66.0</w:t>
             </w:r>
           </w:p>
         </w:tc>
@@ -863,7 +863,7 @@
           </w:tcPr>
           <w:p>
             <w:r>
-              <w:t>50.1</w:t>
+              <w:t>49.5</w:t>
             </w:r>
           </w:p>
         </w:tc>
@@ -873,7 +873,7 @@
           </w:tcPr>
           <w:p>
             <w:r>
-              <w:t>68.8</w:t>
+              <w:t>68.0</w:t>
             </w:r>
           </w:p>
         </w:tc>
@@ -883,7 +883,7 @@
           </w:tcPr>
           <w:p>
             <w:r>
-              <w:t>533</w:t>
+              <w:t>75</w:t>
             </w:r>
           </w:p>
         </w:tc>
@@ -895,7 +895,7 @@
           </w:tcPr>
           <w:p>
             <w:r>
-              <w:t>2026-06-27 00:18:01</w:t>
+              <w:t>2026-06-27 01:03:02</w:t>
             </w:r>
           </w:p>
         </w:tc>
@@ -905,7 +905,7 @@
           </w:tcPr>
           <w:p>
             <w:r>
-              <w:t>81</w:t>
+              <w:t>83</w:t>
             </w:r>
           </w:p>
         </w:tc>
@@ -915,7 +915,7 @@
           </w:tcPr>
           <w:p>
             <w:r>
-              <w:t>64.5</w:t>
+              <w:t>63.3</w:t>
             </w:r>
           </w:p>
         </w:tc>
@@ -935,7 +935,7 @@
           </w:tcPr>
           <w:p>
             <w:r>
-              <w:t>50.2</w:t>
+              <w:t>47.7</w:t>
             </w:r>
           </w:p>
         </w:tc>
@@ -945,7 +945,7 @@
           </w:tcPr>
           <w:p>
             <w:r>
-              <w:t>67.4</w:t>
+              <w:t>66.2</w:t>
             </w:r>
           </w:p>
         </w:tc>
@@ -955,7 +955,7 @@
           </w:tcPr>
           <w:p>
             <w:r>
-              <w:t>762</w:t>
+              <w:t>525</w:t>
             </w:r>
           </w:p>
         </w:tc>
@@ -967,7 +967,7 @@
           </w:tcPr>
           <w:p>
             <w:r>
-              <w:t>2026-06-27 00:33:02</w:t>
+              <w:t>2026-06-27 01:33:05</w:t>
             </w:r>
           </w:p>
         </w:tc>
@@ -977,7 +977,7 @@
           </w:tcPr>
           <w:p>
             <w:r>
-              <w:t>82</w:t>
+              <w:t>83</w:t>
             </w:r>
           </w:p>
         </w:tc>
@@ -987,7 +987,7 @@
           </w:tcPr>
           <w:p>
             <w:r>
-              <w:t>66.0</w:t>
+              <w:t>63.3</w:t>
             </w:r>
           </w:p>
         </w:tc>
@@ -1007,7 +1007,7 @@
           </w:tcPr>
           <w:p>
             <w:r>
-              <w:t>49.5</w:t>
+              <w:t>47.7</w:t>
             </w:r>
           </w:p>
         </w:tc>
@@ -1017,7 +1017,7 @@
           </w:tcPr>
           <w:p>
             <w:r>
-              <w:t>68.0</w:t>
+              <w:t>66.2</w:t>
             </w:r>
           </w:p>
         </w:tc>
@@ -1027,7 +1027,7 @@
           </w:tcPr>
           <w:p>
             <w:r>
-              <w:t>75</w:t>
+              <w:t>304</w:t>
             </w:r>
           </w:p>
         </w:tc>
@@ -1039,7 +1039,7 @@
           </w:tcPr>
           <w:p>
             <w:r>
-              <w:t>2026-06-27 01:03:02</w:t>
+              <w:t>2026-06-27 02:03:05</w:t>
             </w:r>
           </w:p>
         </w:tc>
@@ -1049,7 +1049,7 @@
           </w:tcPr>
           <w:p>
             <w:r>
-              <w:t>83</w:t>
+              <w:t>84</w:t>
             </w:r>
           </w:p>
         </w:tc>
@@ -1059,7 +1059,7 @@
           </w:tcPr>
           <w:p>
             <w:r>
-              <w:t>63.3</w:t>
+              <w:t>65.6</w:t>
             </w:r>
           </w:p>
         </w:tc>
@@ -1089,7 +1089,7 @@
           </w:tcPr>
           <w:p>
             <w:r>
-              <w:t>66.2</w:t>
+              <w:t>67.3</w:t>
             </w:r>
           </w:p>
         </w:tc>
@@ -1099,7 +1099,7 @@
           </w:tcPr>
           <w:p>
             <w:r>
-              <w:t>525</w:t>
+              <w:t>754</w:t>
             </w:r>
           </w:p>
         </w:tc>
@@ -1111,7 +1111,7 @@
           </w:tcPr>
           <w:p>
             <w:r>
-              <w:t>2026-06-27 01:33:05</w:t>
+              <w:t>2026-06-27 02:33:07</w:t>
             </w:r>
           </w:p>
         </w:tc>
@@ -1121,7 +1121,7 @@
           </w:tcPr>
           <w:p>
             <w:r>
-              <w:t>83</w:t>
+              <w:t>84</w:t>
             </w:r>
           </w:p>
         </w:tc>
@@ -1131,7 +1131,7 @@
           </w:tcPr>
           <w:p>
             <w:r>
-              <w:t>63.3</w:t>
+              <w:t>65.6</w:t>
             </w:r>
           </w:p>
         </w:tc>
@@ -1161,7 +1161,7 @@
           </w:tcPr>
           <w:p>
             <w:r>
-              <w:t>66.2</w:t>
+              <w:t>67.3</w:t>
             </w:r>
           </w:p>
         </w:tc>
@@ -1171,7 +1171,7 @@
           </w:tcPr>
           <w:p>
             <w:r>
-              <w:t>304</w:t>
+              <w:t>4</w:t>
             </w:r>
           </w:p>
         </w:tc>
@@ -1183,7 +1183,7 @@
           </w:tcPr>
           <w:p>
             <w:r>
-              <w:t>2026-06-27 02:03:05</w:t>
+              <w:t>2026-06-27 03:03:04</w:t>
             </w:r>
           </w:p>
         </w:tc>
@@ -1193,7 +1193,7 @@
           </w:tcPr>
           <w:p>
             <w:r>
-              <w:t>84</w:t>
+              <w:t>85</w:t>
             </w:r>
           </w:p>
         </w:tc>
@@ -1203,7 +1203,7 @@
           </w:tcPr>
           <w:p>
             <w:r>
-              <w:t>65.6</w:t>
+              <w:t>67.4</w:t>
             </w:r>
           </w:p>
         </w:tc>
@@ -1223,7 +1223,7 @@
           </w:tcPr>
           <w:p>
             <w:r>
-              <w:t>47.7</w:t>
+              <w:t>47.1</w:t>
             </w:r>
           </w:p>
         </w:tc>
@@ -1233,7 +1233,7 @@
           </w:tcPr>
           <w:p>
             <w:r>
-              <w:t>67.3</w:t>
+              <w:t>68.1</w:t>
             </w:r>
           </w:p>
         </w:tc>
@@ -1243,7 +1243,7 @@
           </w:tcPr>
           <w:p>
             <w:r>
-              <w:t>754</w:t>
+              <w:t>58</w:t>
             </w:r>
           </w:p>
         </w:tc>
@@ -1255,7 +1255,7 @@
           </w:tcPr>
           <w:p>
             <w:r>
-              <w:t>2026-06-27 02:33:07</w:t>
+              <w:t>2026-06-27 03:33:05</w:t>
             </w:r>
           </w:p>
         </w:tc>
@@ -1265,7 +1265,7 @@
           </w:tcPr>
           <w:p>
             <w:r>
-              <w:t>84</w:t>
+              <w:t>85</w:t>
             </w:r>
           </w:p>
         </w:tc>
@@ -1275,7 +1275,7 @@
           </w:tcPr>
           <w:p>
             <w:r>
-              <w:t>65.6</w:t>
+              <w:t>67.4</w:t>
             </w:r>
           </w:p>
         </w:tc>
@@ -1295,7 +1295,7 @@
           </w:tcPr>
           <w:p>
             <w:r>
-              <w:t>47.7</w:t>
+              <w:t>47.0</w:t>
             </w:r>
           </w:p>
         </w:tc>
@@ -1305,7 +1305,7 @@
           </w:tcPr>
           <w:p>
             <w:r>
-              <w:t>67.3</w:t>
+              <w:t>68.1</w:t>
             </w:r>
           </w:p>
         </w:tc>
@@ -1315,7 +1315,7 @@
           </w:tcPr>
           <w:p>
             <w:r>
-              <w:t>4</w:t>
+              <w:t>125</w:t>
             </w:r>
           </w:p>
         </w:tc>
@@ -1327,7 +1327,7 @@
           </w:tcPr>
           <w:p>
             <w:r>
-              <w:t>2026-06-27 03:03:04</w:t>
+              <w:t>2026-06-27 03:48:02</w:t>
             </w:r>
           </w:p>
         </w:tc>
@@ -1337,7 +1337,7 @@
           </w:tcPr>
           <w:p>
             <w:r>
-              <w:t>85</w:t>
+              <w:t>86</w:t>
             </w:r>
           </w:p>
         </w:tc>
@@ -1347,7 +1347,7 @@
           </w:tcPr>
           <w:p>
             <w:r>
-              <w:t>67.4</w:t>
+              <w:t>64.8</w:t>
             </w:r>
           </w:p>
         </w:tc>
@@ -1367,7 +1367,7 @@
           </w:tcPr>
           <w:p>
             <w:r>
-              <w:t>47.1</w:t>
+              <w:t>47.0</w:t>
             </w:r>
           </w:p>
         </w:tc>
@@ -1377,7 +1377,7 @@
           </w:tcPr>
           <w:p>
             <w:r>
-              <w:t>68.1</w:t>
+              <w:t>66.8</w:t>
             </w:r>
           </w:p>
         </w:tc>
@@ -1387,7 +1387,7 @@
           </w:tcPr>
           <w:p>
             <w:r>
-              <w:t>58</w:t>
+              <w:t>349</w:t>
             </w:r>
           </w:p>
         </w:tc>
@@ -1399,7 +1399,7 @@
           </w:tcPr>
           <w:p>
             <w:r>
-              <w:t>2026-06-27 03:33:05</w:t>
+              <w:t>2026-06-27 04:18:30</w:t>
             </w:r>
           </w:p>
         </w:tc>
@@ -1409,7 +1409,7 @@
           </w:tcPr>
           <w:p>
             <w:r>
-              <w:t>85</w:t>
+              <w:t>86</w:t>
             </w:r>
           </w:p>
         </w:tc>
@@ -1419,7 +1419,7 @@
           </w:tcPr>
           <w:p>
             <w:r>
-              <w:t>67.4</w:t>
+              <w:t>64.8</w:t>
             </w:r>
           </w:p>
         </w:tc>
@@ -1429,7 +1429,7 @@
           </w:tcPr>
           <w:p>
             <w:r>
-              <w:t>90.4</w:t>
+              <w:t>90.3</w:t>
             </w:r>
           </w:p>
         </w:tc>
@@ -1449,7 +1449,7 @@
           </w:tcPr>
           <w:p>
             <w:r>
-              <w:t>68.1</w:t>
+              <w:t>66.7</w:t>
             </w:r>
           </w:p>
         </w:tc>
@@ -1459,7 +1459,7 @@
           </w:tcPr>
           <w:p>
             <w:r>
-              <w:t>125</w:t>
+              <w:t>11</w:t>
             </w:r>
           </w:p>
         </w:tc>
@@ -1471,7 +1471,7 @@
           </w:tcPr>
           <w:p>
             <w:r>
-              <w:t>2026-06-27 03:48:02</w:t>
+              <w:t>2026-06-27 04:49:25</w:t>
             </w:r>
           </w:p>
         </w:tc>
@@ -1501,7 +1501,7 @@
           </w:tcPr>
           <w:p>
             <w:r>
-              <w:t>90.4</w:t>
+              <w:t>90.3</w:t>
             </w:r>
           </w:p>
         </w:tc>
@@ -1521,7 +1521,7 @@
           </w:tcPr>
           <w:p>
             <w:r>
-              <w:t>66.8</w:t>
+              <w:t>66.7</w:t>
             </w:r>
           </w:p>
         </w:tc>
@@ -1531,7 +1531,7 @@
           </w:tcPr>
           <w:p>
             <w:r>
-              <w:t>349</w:t>
+              <w:t>26</w:t>
             </w:r>
           </w:p>
         </w:tc>
@@ -1543,7 +1543,7 @@
           </w:tcPr>
           <w:p>
             <w:r>
-              <w:t>2026-06-27 04:18:30</w:t>
+              <w:t>2026-06-27 05:20:05</w:t>
             </w:r>
           </w:p>
         </w:tc>
@@ -1603,7 +1603,7 @@
           </w:tcPr>
           <w:p>
             <w:r>
-              <w:t>11</w:t>
+              <w:t>14</w:t>
             </w:r>
           </w:p>
         </w:tc>
@@ -1615,7 +1615,7 @@
           </w:tcPr>
           <w:p>
             <w:r>
-              <w:t>2026-06-27 04:49:25</w:t>
+              <w:t>2026-06-27 05:50:49</w:t>
             </w:r>
           </w:p>
         </w:tc>
@@ -1675,7 +1675,7 @@
           </w:tcPr>
           <w:p>
             <w:r>
-              <w:t>26</w:t>
+              <w:t>20</w:t>
             </w:r>
           </w:p>
         </w:tc>
@@ -1687,7 +1687,7 @@
           </w:tcPr>
           <w:p>
             <w:r>
-              <w:t>2026-06-27 05:20:05</w:t>
+              <w:t>2026-06-27 06:21:49</w:t>
             </w:r>
           </w:p>
         </w:tc>
@@ -1747,7 +1747,7 @@
           </w:tcPr>
           <w:p>
             <w:r>
-              <w:t>14</w:t>
+              <w:t>51</w:t>
             </w:r>
           </w:p>
         </w:tc>
@@ -3433,17 +3433,17 @@
     </w:tbl>
     <w:p>
       <w:r>
-        <w:t>Ticks: 6 · Reconciled: True · Readiness: not_ready</w:t>
+        <w:t>Ticks: 63 · Reconciled: True · Readiness: not_ready</w:t>
       </w:r>
     </w:p>
     <w:p>
       <w:r>
-        <w:t>Candidates created: 48321 · Terminals: {'accepted': 86, 'rejected': 40967, 'skipped': 7067, 'expired': 0, 'missing_data': 201}</w:t>
+        <w:t>Candidates created: 48378 · Terminals: {'accepted': 86, 'rejected': 41016, 'skipped': 7075, 'expired': 0, 'missing_data': 201}</w:t>
       </w:r>
     </w:p>
     <w:p>
       <w:r>
-        <w:t>Rejected by stage: {'directional': 31086, 'execution_gate': 155, 'context_gate': 879, 'directional_allowlist': 1364, 'down_bias_gate': 538, 'mtf_gate': 275, 'grok_decider': 3540, 'execution_realistic': 3, 'verifier': 61, 'mispricing_gate': 50, 'baseline_cohort_gate': 3016}</w:t>
+        <w:t>Rejected by stage: {'directional': 31126, 'execution_gate': 155, 'context_gate': 879, 'directional_allowlist': 1364, 'down_bias_gate': 538, 'mtf_gate': 275, 'grok_decider': 3540, 'execution_realistic': 3, 'verifier': 61, 'mispricing_gate': 50, 'baseline_cohort_gate': 3025}</w:t>
       </w:r>
     </w:p>
     <w:p>
@@ -4374,7 +4374,7 @@
           </w:tcPr>
           <w:p>
             <w:r>
-              <w:t>0.4382</w:t>
+              <w:t>0.4333</w:t>
             </w:r>
           </w:p>
         </w:tc>
@@ -4396,7 +4396,7 @@
           </w:tcPr>
           <w:p>
             <w:r>
-              <w:t>0.4951</w:t>
+              <w:t>0.4942</w:t>
             </w:r>
           </w:p>
         </w:tc>
@@ -4426,7 +4426,7 @@
     </w:tbl>
     <w:p>
       <w:r>
-        <w:t>TV alerts: received 167 · valid 150 · rejected 17</w:t>
+        <w:t>TV alerts: received 186 · valid 169 · rejected 17</w:t>
       </w:r>
     </w:p>
     <w:sectPr>

</xml_diff>

<commit_message>
chore(reports): VPS full report 2026-06-27 10:33 UTC (86 settled, WR 61.6%, PF 0.9752)
</commit_message>
<xml_diff>
--- a/vps_full_reports/latest/report.docx
+++ b/vps_full_reports/latest/report.docx
@@ -33,7 +33,7 @@
     </w:p>
     <w:p>
       <w:r>
-        <w:t>Overall score: 66.7 / 100  (Grade: D)</w:t>
+        <w:t>Overall score: 66.8 / 100  (Grade: D)</w:t>
       </w:r>
     </w:p>
     <w:tbl>
@@ -149,7 +149,7 @@
           </w:tcPr>
           <w:p>
             <w:r>
-              <w:t>90.3</w:t>
+              <w:t>90.4</w:t>
             </w:r>
           </w:p>
         </w:tc>
@@ -319,7 +319,7 @@
           </w:tcPr>
           <w:p>
             <w:r>
-              <w:t>2026-06-26 23:45:02</w:t>
+              <w:t>2026-06-27 01:03:02</w:t>
             </w:r>
           </w:p>
         </w:tc>
@@ -329,7 +329,7 @@
           </w:tcPr>
           <w:p>
             <w:r>
-              <w:t>79</w:t>
+              <w:t>83</w:t>
             </w:r>
           </w:p>
         </w:tc>
@@ -339,7 +339,7 @@
           </w:tcPr>
           <w:p>
             <w:r>
-              <w:t>70.1</w:t>
+              <w:t>63.3</w:t>
             </w:r>
           </w:p>
         </w:tc>
@@ -359,7 +359,7 @@
           </w:tcPr>
           <w:p>
             <w:r>
-              <w:t>49.0</w:t>
+              <w:t>47.7</w:t>
             </w:r>
           </w:p>
         </w:tc>
@@ -369,7 +369,7 @@
           </w:tcPr>
           <w:p>
             <w:r>
-              <w:t>69.9</w:t>
+              <w:t>66.2</w:t>
             </w:r>
           </w:p>
         </w:tc>
@@ -379,7 +379,7 @@
           </w:tcPr>
           <w:p>
             <w:r>
-              <w:t>267</w:t>
+              <w:t>525</w:t>
             </w:r>
           </w:p>
         </w:tc>
@@ -391,7 +391,7 @@
           </w:tcPr>
           <w:p>
             <w:r>
-              <w:t>2026-06-27 00:02:46</w:t>
+              <w:t>2026-06-27 01:33:05</w:t>
             </w:r>
           </w:p>
         </w:tc>
@@ -401,7 +401,7 @@
           </w:tcPr>
           <w:p>
             <w:r>
-              <w:t>80</w:t>
+              <w:t>83</w:t>
             </w:r>
           </w:p>
         </w:tc>
@@ -411,7 +411,7 @@
           </w:tcPr>
           <w:p>
             <w:r>
-              <w:t>67.3</w:t>
+              <w:t>63.3</w:t>
             </w:r>
           </w:p>
         </w:tc>
@@ -431,7 +431,7 @@
           </w:tcPr>
           <w:p>
             <w:r>
-              <w:t>50.1</w:t>
+              <w:t>47.7</w:t>
             </w:r>
           </w:p>
         </w:tc>
@@ -441,7 +441,7 @@
           </w:tcPr>
           <w:p>
             <w:r>
-              <w:t>68.8</w:t>
+              <w:t>66.2</w:t>
             </w:r>
           </w:p>
         </w:tc>
@@ -451,7 +451,7 @@
           </w:tcPr>
           <w:p>
             <w:r>
-              <w:t>533</w:t>
+              <w:t>304</w:t>
             </w:r>
           </w:p>
         </w:tc>
@@ -463,7 +463,7 @@
           </w:tcPr>
           <w:p>
             <w:r>
-              <w:t>2026-06-27 00:18:01</w:t>
+              <w:t>2026-06-27 02:03:05</w:t>
             </w:r>
           </w:p>
         </w:tc>
@@ -473,7 +473,7 @@
           </w:tcPr>
           <w:p>
             <w:r>
-              <w:t>81</w:t>
+              <w:t>84</w:t>
             </w:r>
           </w:p>
         </w:tc>
@@ -483,7 +483,7 @@
           </w:tcPr>
           <w:p>
             <w:r>
-              <w:t>64.5</w:t>
+              <w:t>65.6</w:t>
             </w:r>
           </w:p>
         </w:tc>
@@ -503,7 +503,7 @@
           </w:tcPr>
           <w:p>
             <w:r>
-              <w:t>50.2</w:t>
+              <w:t>47.7</w:t>
             </w:r>
           </w:p>
         </w:tc>
@@ -513,7 +513,7 @@
           </w:tcPr>
           <w:p>
             <w:r>
-              <w:t>67.4</w:t>
+              <w:t>67.3</w:t>
             </w:r>
           </w:p>
         </w:tc>
@@ -523,7 +523,7 @@
           </w:tcPr>
           <w:p>
             <w:r>
-              <w:t>762</w:t>
+              <w:t>754</w:t>
             </w:r>
           </w:p>
         </w:tc>
@@ -535,7 +535,7 @@
           </w:tcPr>
           <w:p>
             <w:r>
-              <w:t>2026-06-27 00:33:02</w:t>
+              <w:t>2026-06-27 02:33:07</w:t>
             </w:r>
           </w:p>
         </w:tc>
@@ -545,7 +545,7 @@
           </w:tcPr>
           <w:p>
             <w:r>
-              <w:t>82</w:t>
+              <w:t>84</w:t>
             </w:r>
           </w:p>
         </w:tc>
@@ -555,7 +555,7 @@
           </w:tcPr>
           <w:p>
             <w:r>
-              <w:t>66.0</w:t>
+              <w:t>65.6</w:t>
             </w:r>
           </w:p>
         </w:tc>
@@ -575,7 +575,7 @@
           </w:tcPr>
           <w:p>
             <w:r>
-              <w:t>49.5</w:t>
+              <w:t>47.7</w:t>
             </w:r>
           </w:p>
         </w:tc>
@@ -585,7 +585,7 @@
           </w:tcPr>
           <w:p>
             <w:r>
-              <w:t>68.0</w:t>
+              <w:t>67.3</w:t>
             </w:r>
           </w:p>
         </w:tc>
@@ -595,7 +595,7 @@
           </w:tcPr>
           <w:p>
             <w:r>
-              <w:t>75</w:t>
+              <w:t>4</w:t>
             </w:r>
           </w:p>
         </w:tc>
@@ -607,7 +607,7 @@
           </w:tcPr>
           <w:p>
             <w:r>
-              <w:t>2026-06-27 01:03:02</w:t>
+              <w:t>2026-06-27 03:03:04</w:t>
             </w:r>
           </w:p>
         </w:tc>
@@ -617,7 +617,7 @@
           </w:tcPr>
           <w:p>
             <w:r>
-              <w:t>83</w:t>
+              <w:t>85</w:t>
             </w:r>
           </w:p>
         </w:tc>
@@ -627,7 +627,7 @@
           </w:tcPr>
           <w:p>
             <w:r>
-              <w:t>63.3</w:t>
+              <w:t>67.4</w:t>
             </w:r>
           </w:p>
         </w:tc>
@@ -647,7 +647,7 @@
           </w:tcPr>
           <w:p>
             <w:r>
-              <w:t>47.7</w:t>
+              <w:t>47.1</w:t>
             </w:r>
           </w:p>
         </w:tc>
@@ -657,7 +657,7 @@
           </w:tcPr>
           <w:p>
             <w:r>
-              <w:t>66.2</w:t>
+              <w:t>68.1</w:t>
             </w:r>
           </w:p>
         </w:tc>
@@ -667,7 +667,7 @@
           </w:tcPr>
           <w:p>
             <w:r>
-              <w:t>525</w:t>
+              <w:t>58</w:t>
             </w:r>
           </w:p>
         </w:tc>
@@ -679,7 +679,7 @@
           </w:tcPr>
           <w:p>
             <w:r>
-              <w:t>2026-06-27 01:33:05</w:t>
+              <w:t>2026-06-27 03:33:05</w:t>
             </w:r>
           </w:p>
         </w:tc>
@@ -689,7 +689,7 @@
           </w:tcPr>
           <w:p>
             <w:r>
-              <w:t>83</w:t>
+              <w:t>85</w:t>
             </w:r>
           </w:p>
         </w:tc>
@@ -699,7 +699,7 @@
           </w:tcPr>
           <w:p>
             <w:r>
-              <w:t>63.3</w:t>
+              <w:t>67.4</w:t>
             </w:r>
           </w:p>
         </w:tc>
@@ -719,7 +719,7 @@
           </w:tcPr>
           <w:p>
             <w:r>
-              <w:t>47.7</w:t>
+              <w:t>47.0</w:t>
             </w:r>
           </w:p>
         </w:tc>
@@ -729,7 +729,7 @@
           </w:tcPr>
           <w:p>
             <w:r>
-              <w:t>66.2</w:t>
+              <w:t>68.1</w:t>
             </w:r>
           </w:p>
         </w:tc>
@@ -739,7 +739,7 @@
           </w:tcPr>
           <w:p>
             <w:r>
-              <w:t>304</w:t>
+              <w:t>125</w:t>
             </w:r>
           </w:p>
         </w:tc>
@@ -751,7 +751,7 @@
           </w:tcPr>
           <w:p>
             <w:r>
-              <w:t>2026-06-27 02:03:05</w:t>
+              <w:t>2026-06-27 03:48:02</w:t>
             </w:r>
           </w:p>
         </w:tc>
@@ -761,7 +761,7 @@
           </w:tcPr>
           <w:p>
             <w:r>
-              <w:t>84</w:t>
+              <w:t>86</w:t>
             </w:r>
           </w:p>
         </w:tc>
@@ -771,7 +771,7 @@
           </w:tcPr>
           <w:p>
             <w:r>
-              <w:t>65.6</w:t>
+              <w:t>64.8</w:t>
             </w:r>
           </w:p>
         </w:tc>
@@ -791,7 +791,7 @@
           </w:tcPr>
           <w:p>
             <w:r>
-              <w:t>47.7</w:t>
+              <w:t>47.0</w:t>
             </w:r>
           </w:p>
         </w:tc>
@@ -801,7 +801,7 @@
           </w:tcPr>
           <w:p>
             <w:r>
-              <w:t>67.3</w:t>
+              <w:t>66.8</w:t>
             </w:r>
           </w:p>
         </w:tc>
@@ -811,7 +811,7 @@
           </w:tcPr>
           <w:p>
             <w:r>
-              <w:t>754</w:t>
+              <w:t>349</w:t>
             </w:r>
           </w:p>
         </w:tc>
@@ -823,7 +823,7 @@
           </w:tcPr>
           <w:p>
             <w:r>
-              <w:t>2026-06-27 02:33:07</w:t>
+              <w:t>2026-06-27 04:18:30</w:t>
             </w:r>
           </w:p>
         </w:tc>
@@ -833,7 +833,7 @@
           </w:tcPr>
           <w:p>
             <w:r>
-              <w:t>84</w:t>
+              <w:t>86</w:t>
             </w:r>
           </w:p>
         </w:tc>
@@ -843,7 +843,7 @@
           </w:tcPr>
           <w:p>
             <w:r>
-              <w:t>65.6</w:t>
+              <w:t>64.8</w:t>
             </w:r>
           </w:p>
         </w:tc>
@@ -853,7 +853,7 @@
           </w:tcPr>
           <w:p>
             <w:r>
-              <w:t>90.4</w:t>
+              <w:t>90.3</w:t>
             </w:r>
           </w:p>
         </w:tc>
@@ -863,7 +863,7 @@
           </w:tcPr>
           <w:p>
             <w:r>
-              <w:t>47.7</w:t>
+              <w:t>47.0</w:t>
             </w:r>
           </w:p>
         </w:tc>
@@ -873,7 +873,7 @@
           </w:tcPr>
           <w:p>
             <w:r>
-              <w:t>67.3</w:t>
+              <w:t>66.7</w:t>
             </w:r>
           </w:p>
         </w:tc>
@@ -883,7 +883,7 @@
           </w:tcPr>
           <w:p>
             <w:r>
-              <w:t>4</w:t>
+              <w:t>11</w:t>
             </w:r>
           </w:p>
         </w:tc>
@@ -895,7 +895,7 @@
           </w:tcPr>
           <w:p>
             <w:r>
-              <w:t>2026-06-27 03:03:04</w:t>
+              <w:t>2026-06-27 04:49:25</w:t>
             </w:r>
           </w:p>
         </w:tc>
@@ -905,7 +905,7 @@
           </w:tcPr>
           <w:p>
             <w:r>
-              <w:t>85</w:t>
+              <w:t>86</w:t>
             </w:r>
           </w:p>
         </w:tc>
@@ -915,7 +915,7 @@
           </w:tcPr>
           <w:p>
             <w:r>
-              <w:t>67.4</w:t>
+              <w:t>64.8</w:t>
             </w:r>
           </w:p>
         </w:tc>
@@ -925,7 +925,7 @@
           </w:tcPr>
           <w:p>
             <w:r>
-              <w:t>90.4</w:t>
+              <w:t>90.3</w:t>
             </w:r>
           </w:p>
         </w:tc>
@@ -935,7 +935,7 @@
           </w:tcPr>
           <w:p>
             <w:r>
-              <w:t>47.1</w:t>
+              <w:t>47.0</w:t>
             </w:r>
           </w:p>
         </w:tc>
@@ -945,7 +945,7 @@
           </w:tcPr>
           <w:p>
             <w:r>
-              <w:t>68.1</w:t>
+              <w:t>66.7</w:t>
             </w:r>
           </w:p>
         </w:tc>
@@ -955,7 +955,7 @@
           </w:tcPr>
           <w:p>
             <w:r>
-              <w:t>58</w:t>
+              <w:t>26</w:t>
             </w:r>
           </w:p>
         </w:tc>
@@ -967,7 +967,7 @@
           </w:tcPr>
           <w:p>
             <w:r>
-              <w:t>2026-06-27 03:33:05</w:t>
+              <w:t>2026-06-27 05:20:05</w:t>
             </w:r>
           </w:p>
         </w:tc>
@@ -977,7 +977,7 @@
           </w:tcPr>
           <w:p>
             <w:r>
-              <w:t>85</w:t>
+              <w:t>86</w:t>
             </w:r>
           </w:p>
         </w:tc>
@@ -987,7 +987,7 @@
           </w:tcPr>
           <w:p>
             <w:r>
-              <w:t>67.4</w:t>
+              <w:t>64.8</w:t>
             </w:r>
           </w:p>
         </w:tc>
@@ -997,7 +997,7 @@
           </w:tcPr>
           <w:p>
             <w:r>
-              <w:t>90.4</w:t>
+              <w:t>90.3</w:t>
             </w:r>
           </w:p>
         </w:tc>
@@ -1017,7 +1017,7 @@
           </w:tcPr>
           <w:p>
             <w:r>
-              <w:t>68.1</w:t>
+              <w:t>66.7</w:t>
             </w:r>
           </w:p>
         </w:tc>
@@ -1027,7 +1027,7 @@
           </w:tcPr>
           <w:p>
             <w:r>
-              <w:t>125</w:t>
+              <w:t>14</w:t>
             </w:r>
           </w:p>
         </w:tc>
@@ -1039,7 +1039,7 @@
           </w:tcPr>
           <w:p>
             <w:r>
-              <w:t>2026-06-27 03:48:02</w:t>
+              <w:t>2026-06-27 05:50:49</w:t>
             </w:r>
           </w:p>
         </w:tc>
@@ -1069,7 +1069,7 @@
           </w:tcPr>
           <w:p>
             <w:r>
-              <w:t>90.4</w:t>
+              <w:t>90.3</w:t>
             </w:r>
           </w:p>
         </w:tc>
@@ -1089,7 +1089,7 @@
           </w:tcPr>
           <w:p>
             <w:r>
-              <w:t>66.8</w:t>
+              <w:t>66.7</w:t>
             </w:r>
           </w:p>
         </w:tc>
@@ -1099,7 +1099,7 @@
           </w:tcPr>
           <w:p>
             <w:r>
-              <w:t>349</w:t>
+              <w:t>20</w:t>
             </w:r>
           </w:p>
         </w:tc>
@@ -1111,7 +1111,7 @@
           </w:tcPr>
           <w:p>
             <w:r>
-              <w:t>2026-06-27 04:18:30</w:t>
+              <w:t>2026-06-27 06:21:49</w:t>
             </w:r>
           </w:p>
         </w:tc>
@@ -1171,7 +1171,7 @@
           </w:tcPr>
           <w:p>
             <w:r>
-              <w:t>11</w:t>
+              <w:t>51</w:t>
             </w:r>
           </w:p>
         </w:tc>
@@ -1183,7 +1183,7 @@
           </w:tcPr>
           <w:p>
             <w:r>
-              <w:t>2026-06-27 04:49:25</w:t>
+              <w:t>2026-06-27 06:52:41</w:t>
             </w:r>
           </w:p>
         </w:tc>
@@ -1243,7 +1243,7 @@
           </w:tcPr>
           <w:p>
             <w:r>
-              <w:t>26</w:t>
+              <w:t>16</w:t>
             </w:r>
           </w:p>
         </w:tc>
@@ -1255,7 +1255,7 @@
           </w:tcPr>
           <w:p>
             <w:r>
-              <w:t>2026-06-27 05:20:05</w:t>
+              <w:t>2026-06-27 07:23:41</w:t>
             </w:r>
           </w:p>
         </w:tc>
@@ -1315,7 +1315,7 @@
           </w:tcPr>
           <w:p>
             <w:r>
-              <w:t>14</w:t>
+              <w:t>47</w:t>
             </w:r>
           </w:p>
         </w:tc>
@@ -1327,7 +1327,7 @@
           </w:tcPr>
           <w:p>
             <w:r>
-              <w:t>2026-06-27 05:50:49</w:t>
+              <w:t>2026-06-27 07:54:41</w:t>
             </w:r>
           </w:p>
         </w:tc>
@@ -1387,7 +1387,7 @@
           </w:tcPr>
           <w:p>
             <w:r>
-              <w:t>20</w:t>
+              <w:t>78</w:t>
             </w:r>
           </w:p>
         </w:tc>
@@ -1399,7 +1399,7 @@
           </w:tcPr>
           <w:p>
             <w:r>
-              <w:t>2026-06-27 06:21:49</w:t>
+              <w:t>2026-06-27 08:24:41</w:t>
             </w:r>
           </w:p>
         </w:tc>
@@ -1459,7 +1459,7 @@
           </w:tcPr>
           <w:p>
             <w:r>
-              <w:t>51</w:t>
+              <w:t>108</w:t>
             </w:r>
           </w:p>
         </w:tc>
@@ -1471,7 +1471,7 @@
           </w:tcPr>
           <w:p>
             <w:r>
-              <w:t>2026-06-27 06:52:41</w:t>
+              <w:t>2026-06-27 08:55:14</w:t>
             </w:r>
           </w:p>
         </w:tc>
@@ -1531,7 +1531,7 @@
           </w:tcPr>
           <w:p>
             <w:r>
-              <w:t>16</w:t>
+              <w:t>19</w:t>
             </w:r>
           </w:p>
         </w:tc>
@@ -1543,7 +1543,7 @@
           </w:tcPr>
           <w:p>
             <w:r>
-              <w:t>2026-06-27 07:23:41</w:t>
+              <w:t>2026-06-27 09:25:14</w:t>
             </w:r>
           </w:p>
         </w:tc>
@@ -1603,7 +1603,7 @@
           </w:tcPr>
           <w:p>
             <w:r>
-              <w:t>47</w:t>
+              <w:t>49</w:t>
             </w:r>
           </w:p>
         </w:tc>
@@ -1615,7 +1615,7 @@
           </w:tcPr>
           <w:p>
             <w:r>
-              <w:t>2026-06-27 07:54:41</w:t>
+              <w:t>2026-06-27 09:56:14</w:t>
             </w:r>
           </w:p>
         </w:tc>
@@ -1675,7 +1675,7 @@
           </w:tcPr>
           <w:p>
             <w:r>
-              <w:t>78</w:t>
+              <w:t>80</w:t>
             </w:r>
           </w:p>
         </w:tc>
@@ -1687,7 +1687,7 @@
           </w:tcPr>
           <w:p>
             <w:r>
-              <w:t>2026-06-27 08:24:41</w:t>
+              <w:t>2026-06-27 10:26:14</w:t>
             </w:r>
           </w:p>
         </w:tc>
@@ -1747,7 +1747,7 @@
           </w:tcPr>
           <w:p>
             <w:r>
-              <w:t>108</w:t>
+              <w:t>110</w:t>
             </w:r>
           </w:p>
         </w:tc>
@@ -3176,7 +3176,7 @@
     </w:p>
     <w:p>
       <w:r>
-        <w:t>Section score: 90.3 / 100  (Grade: A)</w:t>
+        <w:t>Section score: 90.4 / 100  (Grade: A)</w:t>
       </w:r>
     </w:p>
     <w:p>
@@ -3319,7 +3319,7 @@
           </w:tcPr>
           <w:p>
             <w:r>
-              <w:t>95.6</w:t>
+              <w:t>95.7</w:t>
             </w:r>
           </w:p>
         </w:tc>
@@ -3329,7 +3329,7 @@
           </w:tcPr>
           <w:p>
             <w:r>
-              <w:t>14.3</w:t>
+              <w:t>14.4</w:t>
             </w:r>
           </w:p>
         </w:tc>
@@ -3438,12 +3438,12 @@
     </w:p>
     <w:p>
       <w:r>
-        <w:t>Candidates created: 48500 · Terminals: {'accepted': 86, 'rejected': 41127, 'skipped': 7082, 'expired': 0, 'missing_data': 205}</w:t>
+        <w:t>Candidates created: 48621 · Terminals: {'accepted': 86, 'rejected': 41238, 'skipped': 7089, 'expired': 0, 'missing_data': 208}</w:t>
       </w:r>
     </w:p>
     <w:p>
       <w:r>
-        <w:t>Rejected by stage: {'directional': 31206, 'execution_gate': 155, 'context_gate': 879, 'directional_allowlist': 1364, 'down_bias_gate': 538, 'mtf_gate': 275, 'grok_decider': 3540, 'execution_realistic': 3, 'verifier': 61, 'mispricing_gate': 50, 'baseline_cohort_gate': 3056}</w:t>
+        <w:t>Rejected by stage: {'directional': 31301, 'execution_gate': 155, 'context_gate': 879, 'directional_allowlist': 1364, 'down_bias_gate': 538, 'mtf_gate': 275, 'grok_decider': 3540, 'execution_realistic': 3, 'verifier': 61, 'mispricing_gate': 50, 'baseline_cohort_gate': 3072}</w:t>
       </w:r>
     </w:p>
     <w:p>
@@ -4374,7 +4374,7 @@
           </w:tcPr>
           <w:p>
             <w:r>
-              <w:t>0.4316</w:t>
+              <w:t>0.4227</w:t>
             </w:r>
           </w:p>
         </w:tc>
@@ -4396,7 +4396,7 @@
           </w:tcPr>
           <w:p>
             <w:r>
-              <w:t>0.4943</w:t>
+              <w:t>0.4925</w:t>
             </w:r>
           </w:p>
         </w:tc>
@@ -4426,7 +4426,7 @@
     </w:tbl>
     <w:p>
       <w:r>
-        <w:t>TV alerts: received 268 · valid 251 · rejected 17</w:t>
+        <w:t>TV alerts: received 316 · valid 299 · rejected 17</w:t>
       </w:r>
     </w:p>
     <w:sectPr>

</xml_diff>

<commit_message>
chore(reports): VPS full report 2026-06-27 13:33 UTC (86 settled, WR 61.6%, PF 0.9752)
</commit_message>
<xml_diff>
--- a/vps_full_reports/latest/report.docx
+++ b/vps_full_reports/latest/report.docx
@@ -20,7 +20,7 @@
           <w:color w:val="666666"/>
           <w:sz w:val="20"/>
         </w:rPr>
-        <w:t>PAPER ONLY  ·  reconciled=True  ·  ticks=118</w:t>
+        <w:t>PAPER ONLY  ·  reconciled=True  ·  ticks=57</w:t>
       </w:r>
     </w:p>
     <w:p>
@@ -319,7 +319,7 @@
           </w:tcPr>
           <w:p>
             <w:r>
-              <w:t>2026-06-27 03:03:04</w:t>
+              <w:t>2026-06-27 03:48:02</w:t>
             </w:r>
           </w:p>
         </w:tc>
@@ -329,7 +329,7 @@
           </w:tcPr>
           <w:p>
             <w:r>
-              <w:t>85</w:t>
+              <w:t>86</w:t>
             </w:r>
           </w:p>
         </w:tc>
@@ -339,7 +339,7 @@
           </w:tcPr>
           <w:p>
             <w:r>
-              <w:t>67.4</w:t>
+              <w:t>64.8</w:t>
             </w:r>
           </w:p>
         </w:tc>
@@ -359,7 +359,7 @@
           </w:tcPr>
           <w:p>
             <w:r>
-              <w:t>47.1</w:t>
+              <w:t>47.0</w:t>
             </w:r>
           </w:p>
         </w:tc>
@@ -369,7 +369,7 @@
           </w:tcPr>
           <w:p>
             <w:r>
-              <w:t>68.1</w:t>
+              <w:t>66.8</w:t>
             </w:r>
           </w:p>
         </w:tc>
@@ -379,7 +379,7 @@
           </w:tcPr>
           <w:p>
             <w:r>
-              <w:t>58</w:t>
+              <w:t>349</w:t>
             </w:r>
           </w:p>
         </w:tc>
@@ -391,7 +391,7 @@
           </w:tcPr>
           <w:p>
             <w:r>
-              <w:t>2026-06-27 03:33:05</w:t>
+              <w:t>2026-06-27 04:18:30</w:t>
             </w:r>
           </w:p>
         </w:tc>
@@ -401,7 +401,7 @@
           </w:tcPr>
           <w:p>
             <w:r>
-              <w:t>85</w:t>
+              <w:t>86</w:t>
             </w:r>
           </w:p>
         </w:tc>
@@ -411,7 +411,7 @@
           </w:tcPr>
           <w:p>
             <w:r>
-              <w:t>67.4</w:t>
+              <w:t>64.8</w:t>
             </w:r>
           </w:p>
         </w:tc>
@@ -421,7 +421,7 @@
           </w:tcPr>
           <w:p>
             <w:r>
-              <w:t>90.4</w:t>
+              <w:t>90.3</w:t>
             </w:r>
           </w:p>
         </w:tc>
@@ -441,7 +441,7 @@
           </w:tcPr>
           <w:p>
             <w:r>
-              <w:t>68.1</w:t>
+              <w:t>66.7</w:t>
             </w:r>
           </w:p>
         </w:tc>
@@ -451,7 +451,7 @@
           </w:tcPr>
           <w:p>
             <w:r>
-              <w:t>125</w:t>
+              <w:t>11</w:t>
             </w:r>
           </w:p>
         </w:tc>
@@ -463,7 +463,7 @@
           </w:tcPr>
           <w:p>
             <w:r>
-              <w:t>2026-06-27 03:48:02</w:t>
+              <w:t>2026-06-27 04:49:25</w:t>
             </w:r>
           </w:p>
         </w:tc>
@@ -493,7 +493,7 @@
           </w:tcPr>
           <w:p>
             <w:r>
-              <w:t>90.4</w:t>
+              <w:t>90.3</w:t>
             </w:r>
           </w:p>
         </w:tc>
@@ -513,7 +513,7 @@
           </w:tcPr>
           <w:p>
             <w:r>
-              <w:t>66.8</w:t>
+              <w:t>66.7</w:t>
             </w:r>
           </w:p>
         </w:tc>
@@ -523,7 +523,7 @@
           </w:tcPr>
           <w:p>
             <w:r>
-              <w:t>349</w:t>
+              <w:t>26</w:t>
             </w:r>
           </w:p>
         </w:tc>
@@ -535,7 +535,7 @@
           </w:tcPr>
           <w:p>
             <w:r>
-              <w:t>2026-06-27 04:18:30</w:t>
+              <w:t>2026-06-27 05:20:05</w:t>
             </w:r>
           </w:p>
         </w:tc>
@@ -595,7 +595,7 @@
           </w:tcPr>
           <w:p>
             <w:r>
-              <w:t>11</w:t>
+              <w:t>14</w:t>
             </w:r>
           </w:p>
         </w:tc>
@@ -607,7 +607,7 @@
           </w:tcPr>
           <w:p>
             <w:r>
-              <w:t>2026-06-27 04:49:25</w:t>
+              <w:t>2026-06-27 05:50:49</w:t>
             </w:r>
           </w:p>
         </w:tc>
@@ -667,7 +667,7 @@
           </w:tcPr>
           <w:p>
             <w:r>
-              <w:t>26</w:t>
+              <w:t>20</w:t>
             </w:r>
           </w:p>
         </w:tc>
@@ -679,7 +679,7 @@
           </w:tcPr>
           <w:p>
             <w:r>
-              <w:t>2026-06-27 05:20:05</w:t>
+              <w:t>2026-06-27 06:21:49</w:t>
             </w:r>
           </w:p>
         </w:tc>
@@ -739,7 +739,7 @@
           </w:tcPr>
           <w:p>
             <w:r>
-              <w:t>14</w:t>
+              <w:t>51</w:t>
             </w:r>
           </w:p>
         </w:tc>
@@ -751,7 +751,7 @@
           </w:tcPr>
           <w:p>
             <w:r>
-              <w:t>2026-06-27 05:50:49</w:t>
+              <w:t>2026-06-27 06:52:41</w:t>
             </w:r>
           </w:p>
         </w:tc>
@@ -811,7 +811,7 @@
           </w:tcPr>
           <w:p>
             <w:r>
-              <w:t>20</w:t>
+              <w:t>16</w:t>
             </w:r>
           </w:p>
         </w:tc>
@@ -823,7 +823,7 @@
           </w:tcPr>
           <w:p>
             <w:r>
-              <w:t>2026-06-27 06:21:49</w:t>
+              <w:t>2026-06-27 07:23:41</w:t>
             </w:r>
           </w:p>
         </w:tc>
@@ -883,7 +883,7 @@
           </w:tcPr>
           <w:p>
             <w:r>
-              <w:t>51</w:t>
+              <w:t>47</w:t>
             </w:r>
           </w:p>
         </w:tc>
@@ -895,7 +895,7 @@
           </w:tcPr>
           <w:p>
             <w:r>
-              <w:t>2026-06-27 06:52:41</w:t>
+              <w:t>2026-06-27 07:54:41</w:t>
             </w:r>
           </w:p>
         </w:tc>
@@ -955,7 +955,7 @@
           </w:tcPr>
           <w:p>
             <w:r>
-              <w:t>16</w:t>
+              <w:t>78</w:t>
             </w:r>
           </w:p>
         </w:tc>
@@ -967,7 +967,7 @@
           </w:tcPr>
           <w:p>
             <w:r>
-              <w:t>2026-06-27 07:23:41</w:t>
+              <w:t>2026-06-27 08:24:41</w:t>
             </w:r>
           </w:p>
         </w:tc>
@@ -1027,7 +1027,7 @@
           </w:tcPr>
           <w:p>
             <w:r>
-              <w:t>47</w:t>
+              <w:t>108</w:t>
             </w:r>
           </w:p>
         </w:tc>
@@ -1039,7 +1039,7 @@
           </w:tcPr>
           <w:p>
             <w:r>
-              <w:t>2026-06-27 07:54:41</w:t>
+              <w:t>2026-06-27 08:55:14</w:t>
             </w:r>
           </w:p>
         </w:tc>
@@ -1099,7 +1099,7 @@
           </w:tcPr>
           <w:p>
             <w:r>
-              <w:t>78</w:t>
+              <w:t>19</w:t>
             </w:r>
           </w:p>
         </w:tc>
@@ -1111,7 +1111,7 @@
           </w:tcPr>
           <w:p>
             <w:r>
-              <w:t>2026-06-27 08:24:41</w:t>
+              <w:t>2026-06-27 09:25:14</w:t>
             </w:r>
           </w:p>
         </w:tc>
@@ -1171,7 +1171,7 @@
           </w:tcPr>
           <w:p>
             <w:r>
-              <w:t>108</w:t>
+              <w:t>49</w:t>
             </w:r>
           </w:p>
         </w:tc>
@@ -1183,7 +1183,7 @@
           </w:tcPr>
           <w:p>
             <w:r>
-              <w:t>2026-06-27 08:55:14</w:t>
+              <w:t>2026-06-27 09:56:14</w:t>
             </w:r>
           </w:p>
         </w:tc>
@@ -1243,7 +1243,7 @@
           </w:tcPr>
           <w:p>
             <w:r>
-              <w:t>19</w:t>
+              <w:t>80</w:t>
             </w:r>
           </w:p>
         </w:tc>
@@ -1255,7 +1255,7 @@
           </w:tcPr>
           <w:p>
             <w:r>
-              <w:t>2026-06-27 09:25:14</w:t>
+              <w:t>2026-06-27 10:26:14</w:t>
             </w:r>
           </w:p>
         </w:tc>
@@ -1315,7 +1315,7 @@
           </w:tcPr>
           <w:p>
             <w:r>
-              <w:t>49</w:t>
+              <w:t>110</w:t>
             </w:r>
           </w:p>
         </w:tc>
@@ -1327,7 +1327,7 @@
           </w:tcPr>
           <w:p>
             <w:r>
-              <w:t>2026-06-27 09:56:14</w:t>
+              <w:t>2026-06-27 10:57:04</w:t>
             </w:r>
           </w:p>
         </w:tc>
@@ -1357,7 +1357,7 @@
           </w:tcPr>
           <w:p>
             <w:r>
-              <w:t>90.3</w:t>
+              <w:t>90.4</w:t>
             </w:r>
           </w:p>
         </w:tc>
@@ -1377,7 +1377,7 @@
           </w:tcPr>
           <w:p>
             <w:r>
-              <w:t>66.7</w:t>
+              <w:t>66.8</w:t>
             </w:r>
           </w:p>
         </w:tc>
@@ -1387,7 +1387,7 @@
           </w:tcPr>
           <w:p>
             <w:r>
-              <w:t>80</w:t>
+              <w:t>22</w:t>
             </w:r>
           </w:p>
         </w:tc>
@@ -1399,7 +1399,7 @@
           </w:tcPr>
           <w:p>
             <w:r>
-              <w:t>2026-06-27 10:26:14</w:t>
+              <w:t>2026-06-27 11:28:04</w:t>
             </w:r>
           </w:p>
         </w:tc>
@@ -1429,7 +1429,7 @@
           </w:tcPr>
           <w:p>
             <w:r>
-              <w:t>90.3</w:t>
+              <w:t>90.4</w:t>
             </w:r>
           </w:p>
         </w:tc>
@@ -1449,7 +1449,7 @@
           </w:tcPr>
           <w:p>
             <w:r>
-              <w:t>66.7</w:t>
+              <w:t>66.8</w:t>
             </w:r>
           </w:p>
         </w:tc>
@@ -1459,7 +1459,7 @@
           </w:tcPr>
           <w:p>
             <w:r>
-              <w:t>110</w:t>
+              <w:t>53</w:t>
             </w:r>
           </w:p>
         </w:tc>
@@ -1471,7 +1471,7 @@
           </w:tcPr>
           <w:p>
             <w:r>
-              <w:t>2026-06-27 10:57:04</w:t>
+              <w:t>2026-06-27 11:59:04</w:t>
             </w:r>
           </w:p>
         </w:tc>
@@ -1531,7 +1531,7 @@
           </w:tcPr>
           <w:p>
             <w:r>
-              <w:t>22</w:t>
+              <w:t>84</w:t>
             </w:r>
           </w:p>
         </w:tc>
@@ -1543,7 +1543,7 @@
           </w:tcPr>
           <w:p>
             <w:r>
-              <w:t>2026-06-27 11:28:04</w:t>
+              <w:t>2026-06-27 12:29:05</w:t>
             </w:r>
           </w:p>
         </w:tc>
@@ -1603,7 +1603,7 @@
           </w:tcPr>
           <w:p>
             <w:r>
-              <w:t>53</w:t>
+              <w:t>114</w:t>
             </w:r>
           </w:p>
         </w:tc>
@@ -1615,7 +1615,7 @@
           </w:tcPr>
           <w:p>
             <w:r>
-              <w:t>2026-06-27 11:59:04</w:t>
+              <w:t>2026-06-27 12:59:50</w:t>
             </w:r>
           </w:p>
         </w:tc>
@@ -1675,7 +1675,7 @@
           </w:tcPr>
           <w:p>
             <w:r>
-              <w:t>84</w:t>
+              <w:t>24</w:t>
             </w:r>
           </w:p>
         </w:tc>
@@ -1687,7 +1687,7 @@
           </w:tcPr>
           <w:p>
             <w:r>
-              <w:t>2026-06-27 12:29:05</w:t>
+              <w:t>2026-06-27 13:29:51</w:t>
             </w:r>
           </w:p>
         </w:tc>
@@ -1747,7 +1747,7 @@
           </w:tcPr>
           <w:p>
             <w:r>
-              <w:t>114</w:t>
+              <w:t>54</w:t>
             </w:r>
           </w:p>
         </w:tc>
@@ -3319,7 +3319,7 @@
           </w:tcPr>
           <w:p>
             <w:r>
-              <w:t>95.7</w:t>
+              <w:t>95.8</w:t>
             </w:r>
           </w:p>
         </w:tc>
@@ -3433,17 +3433,17 @@
     </w:tbl>
     <w:p>
       <w:r>
-        <w:t>Ticks: 118 · Reconciled: True · Readiness: not_ready</w:t>
+        <w:t>Ticks: 57 · Reconciled: True · Readiness: not_ready</w:t>
       </w:r>
     </w:p>
     <w:p>
       <w:r>
-        <w:t>Candidates created: 48742 · Terminals: {'accepted': 86, 'rejected': 41348, 'skipped': 7097, 'expired': 0, 'missing_data': 211}</w:t>
+        <w:t>Candidates created: 48803 · Terminals: {'accepted': 86, 'rejected': 41399, 'skipped': 7105, 'expired': 0, 'missing_data': 213}</w:t>
       </w:r>
     </w:p>
     <w:p>
       <w:r>
-        <w:t>Rejected by stage: {'directional': 31404, 'execution_gate': 156, 'context_gate': 879, 'directional_allowlist': 1364, 'down_bias_gate': 538, 'mtf_gate': 275, 'grok_decider': 3540, 'execution_realistic': 3, 'verifier': 61, 'mispricing_gate': 50, 'baseline_cohort_gate': 3078}</w:t>
+        <w:t>Rejected by stage: {'directional': 31452, 'execution_gate': 156, 'context_gate': 879, 'directional_allowlist': 1364, 'down_bias_gate': 538, 'mtf_gate': 276, 'grok_decider': 3540, 'execution_realistic': 3, 'verifier': 61, 'mispricing_gate': 50, 'baseline_cohort_gate': 3080}</w:t>
       </w:r>
     </w:p>
     <w:p>
@@ -4374,7 +4374,7 @@
           </w:tcPr>
           <w:p>
             <w:r>
-              <w:t>0.4158</w:t>
+              <w:t>0.4216</w:t>
             </w:r>
           </w:p>
         </w:tc>
@@ -4396,7 +4396,7 @@
           </w:tcPr>
           <w:p>
             <w:r>
-              <w:t>0.4907</w:t>
+              <w:t>0.4890</w:t>
             </w:r>
           </w:p>
         </w:tc>
@@ -4426,7 +4426,7 @@
     </w:tbl>
     <w:p>
       <w:r>
-        <w:t>TV alerts: received 359 · valid 342 · rejected 17</w:t>
+        <w:t>TV alerts: received 395 · valid 378 · rejected 17</w:t>
       </w:r>
     </w:p>
     <w:sectPr>

</xml_diff>

<commit_message>
chore(reports): VPS full report 2026-06-27 14:06 UTC (86 settled, WR 61.6%, PF 0.9752)
</commit_message>
<xml_diff>
--- a/vps_full_reports/latest/report.docx
+++ b/vps_full_reports/latest/report.docx
@@ -20,7 +20,7 @@
           <w:color w:val="666666"/>
           <w:sz w:val="20"/>
         </w:rPr>
-        <w:t>PAPER ONLY  ·  reconciled=True  ·  ticks=57</w:t>
+        <w:t>PAPER ONLY  ·  reconciled=True  ·  ticks=30</w:t>
       </w:r>
     </w:p>
     <w:p>
@@ -319,7 +319,7 @@
           </w:tcPr>
           <w:p>
             <w:r>
-              <w:t>2026-06-27 03:48:02</w:t>
+              <w:t>2026-06-27 04:18:30</w:t>
             </w:r>
           </w:p>
         </w:tc>
@@ -349,7 +349,7 @@
           </w:tcPr>
           <w:p>
             <w:r>
-              <w:t>90.4</w:t>
+              <w:t>90.3</w:t>
             </w:r>
           </w:p>
         </w:tc>
@@ -369,7 +369,7 @@
           </w:tcPr>
           <w:p>
             <w:r>
-              <w:t>66.8</w:t>
+              <w:t>66.7</w:t>
             </w:r>
           </w:p>
         </w:tc>
@@ -379,7 +379,7 @@
           </w:tcPr>
           <w:p>
             <w:r>
-              <w:t>349</w:t>
+              <w:t>11</w:t>
             </w:r>
           </w:p>
         </w:tc>
@@ -391,7 +391,7 @@
           </w:tcPr>
           <w:p>
             <w:r>
-              <w:t>2026-06-27 04:18:30</w:t>
+              <w:t>2026-06-27 04:49:25</w:t>
             </w:r>
           </w:p>
         </w:tc>
@@ -451,7 +451,7 @@
           </w:tcPr>
           <w:p>
             <w:r>
-              <w:t>11</w:t>
+              <w:t>26</w:t>
             </w:r>
           </w:p>
         </w:tc>
@@ -463,7 +463,7 @@
           </w:tcPr>
           <w:p>
             <w:r>
-              <w:t>2026-06-27 04:49:25</w:t>
+              <w:t>2026-06-27 05:20:05</w:t>
             </w:r>
           </w:p>
         </w:tc>
@@ -523,7 +523,7 @@
           </w:tcPr>
           <w:p>
             <w:r>
-              <w:t>26</w:t>
+              <w:t>14</w:t>
             </w:r>
           </w:p>
         </w:tc>
@@ -535,7 +535,7 @@
           </w:tcPr>
           <w:p>
             <w:r>
-              <w:t>2026-06-27 05:20:05</w:t>
+              <w:t>2026-06-27 05:50:49</w:t>
             </w:r>
           </w:p>
         </w:tc>
@@ -595,7 +595,7 @@
           </w:tcPr>
           <w:p>
             <w:r>
-              <w:t>14</w:t>
+              <w:t>20</w:t>
             </w:r>
           </w:p>
         </w:tc>
@@ -607,7 +607,7 @@
           </w:tcPr>
           <w:p>
             <w:r>
-              <w:t>2026-06-27 05:50:49</w:t>
+              <w:t>2026-06-27 06:21:49</w:t>
             </w:r>
           </w:p>
         </w:tc>
@@ -667,7 +667,7 @@
           </w:tcPr>
           <w:p>
             <w:r>
-              <w:t>20</w:t>
+              <w:t>51</w:t>
             </w:r>
           </w:p>
         </w:tc>
@@ -679,7 +679,7 @@
           </w:tcPr>
           <w:p>
             <w:r>
-              <w:t>2026-06-27 06:21:49</w:t>
+              <w:t>2026-06-27 06:52:41</w:t>
             </w:r>
           </w:p>
         </w:tc>
@@ -739,7 +739,7 @@
           </w:tcPr>
           <w:p>
             <w:r>
-              <w:t>51</w:t>
+              <w:t>16</w:t>
             </w:r>
           </w:p>
         </w:tc>
@@ -751,7 +751,7 @@
           </w:tcPr>
           <w:p>
             <w:r>
-              <w:t>2026-06-27 06:52:41</w:t>
+              <w:t>2026-06-27 07:23:41</w:t>
             </w:r>
           </w:p>
         </w:tc>
@@ -811,7 +811,7 @@
           </w:tcPr>
           <w:p>
             <w:r>
-              <w:t>16</w:t>
+              <w:t>47</w:t>
             </w:r>
           </w:p>
         </w:tc>
@@ -823,7 +823,7 @@
           </w:tcPr>
           <w:p>
             <w:r>
-              <w:t>2026-06-27 07:23:41</w:t>
+              <w:t>2026-06-27 07:54:41</w:t>
             </w:r>
           </w:p>
         </w:tc>
@@ -883,7 +883,7 @@
           </w:tcPr>
           <w:p>
             <w:r>
-              <w:t>47</w:t>
+              <w:t>78</w:t>
             </w:r>
           </w:p>
         </w:tc>
@@ -895,7 +895,7 @@
           </w:tcPr>
           <w:p>
             <w:r>
-              <w:t>2026-06-27 07:54:41</w:t>
+              <w:t>2026-06-27 08:24:41</w:t>
             </w:r>
           </w:p>
         </w:tc>
@@ -955,7 +955,7 @@
           </w:tcPr>
           <w:p>
             <w:r>
-              <w:t>78</w:t>
+              <w:t>108</w:t>
             </w:r>
           </w:p>
         </w:tc>
@@ -967,7 +967,7 @@
           </w:tcPr>
           <w:p>
             <w:r>
-              <w:t>2026-06-27 08:24:41</w:t>
+              <w:t>2026-06-27 08:55:14</w:t>
             </w:r>
           </w:p>
         </w:tc>
@@ -1027,7 +1027,7 @@
           </w:tcPr>
           <w:p>
             <w:r>
-              <w:t>108</w:t>
+              <w:t>19</w:t>
             </w:r>
           </w:p>
         </w:tc>
@@ -1039,7 +1039,7 @@
           </w:tcPr>
           <w:p>
             <w:r>
-              <w:t>2026-06-27 08:55:14</w:t>
+              <w:t>2026-06-27 09:25:14</w:t>
             </w:r>
           </w:p>
         </w:tc>
@@ -1099,7 +1099,7 @@
           </w:tcPr>
           <w:p>
             <w:r>
-              <w:t>19</w:t>
+              <w:t>49</w:t>
             </w:r>
           </w:p>
         </w:tc>
@@ -1111,7 +1111,7 @@
           </w:tcPr>
           <w:p>
             <w:r>
-              <w:t>2026-06-27 09:25:14</w:t>
+              <w:t>2026-06-27 09:56:14</w:t>
             </w:r>
           </w:p>
         </w:tc>
@@ -1171,7 +1171,7 @@
           </w:tcPr>
           <w:p>
             <w:r>
-              <w:t>49</w:t>
+              <w:t>80</w:t>
             </w:r>
           </w:p>
         </w:tc>
@@ -1183,7 +1183,7 @@
           </w:tcPr>
           <w:p>
             <w:r>
-              <w:t>2026-06-27 09:56:14</w:t>
+              <w:t>2026-06-27 10:26:14</w:t>
             </w:r>
           </w:p>
         </w:tc>
@@ -1243,7 +1243,7 @@
           </w:tcPr>
           <w:p>
             <w:r>
-              <w:t>80</w:t>
+              <w:t>110</w:t>
             </w:r>
           </w:p>
         </w:tc>
@@ -1255,7 +1255,7 @@
           </w:tcPr>
           <w:p>
             <w:r>
-              <w:t>2026-06-27 10:26:14</w:t>
+              <w:t>2026-06-27 10:57:04</w:t>
             </w:r>
           </w:p>
         </w:tc>
@@ -1285,7 +1285,7 @@
           </w:tcPr>
           <w:p>
             <w:r>
-              <w:t>90.3</w:t>
+              <w:t>90.4</w:t>
             </w:r>
           </w:p>
         </w:tc>
@@ -1305,7 +1305,7 @@
           </w:tcPr>
           <w:p>
             <w:r>
-              <w:t>66.7</w:t>
+              <w:t>66.8</w:t>
             </w:r>
           </w:p>
         </w:tc>
@@ -1315,7 +1315,7 @@
           </w:tcPr>
           <w:p>
             <w:r>
-              <w:t>110</w:t>
+              <w:t>22</w:t>
             </w:r>
           </w:p>
         </w:tc>
@@ -1327,7 +1327,7 @@
           </w:tcPr>
           <w:p>
             <w:r>
-              <w:t>2026-06-27 10:57:04</w:t>
+              <w:t>2026-06-27 11:28:04</w:t>
             </w:r>
           </w:p>
         </w:tc>
@@ -1387,7 +1387,7 @@
           </w:tcPr>
           <w:p>
             <w:r>
-              <w:t>22</w:t>
+              <w:t>53</w:t>
             </w:r>
           </w:p>
         </w:tc>
@@ -1399,7 +1399,7 @@
           </w:tcPr>
           <w:p>
             <w:r>
-              <w:t>2026-06-27 11:28:04</w:t>
+              <w:t>2026-06-27 11:59:04</w:t>
             </w:r>
           </w:p>
         </w:tc>
@@ -1459,7 +1459,7 @@
           </w:tcPr>
           <w:p>
             <w:r>
-              <w:t>53</w:t>
+              <w:t>84</w:t>
             </w:r>
           </w:p>
         </w:tc>
@@ -1471,7 +1471,7 @@
           </w:tcPr>
           <w:p>
             <w:r>
-              <w:t>2026-06-27 11:59:04</w:t>
+              <w:t>2026-06-27 12:29:05</w:t>
             </w:r>
           </w:p>
         </w:tc>
@@ -1531,7 +1531,7 @@
           </w:tcPr>
           <w:p>
             <w:r>
-              <w:t>84</w:t>
+              <w:t>114</w:t>
             </w:r>
           </w:p>
         </w:tc>
@@ -1543,7 +1543,7 @@
           </w:tcPr>
           <w:p>
             <w:r>
-              <w:t>2026-06-27 12:29:05</w:t>
+              <w:t>2026-06-27 12:59:50</w:t>
             </w:r>
           </w:p>
         </w:tc>
@@ -1603,7 +1603,7 @@
           </w:tcPr>
           <w:p>
             <w:r>
-              <w:t>114</w:t>
+              <w:t>24</w:t>
             </w:r>
           </w:p>
         </w:tc>
@@ -1615,7 +1615,7 @@
           </w:tcPr>
           <w:p>
             <w:r>
-              <w:t>2026-06-27 12:59:50</w:t>
+              <w:t>2026-06-27 13:29:51</w:t>
             </w:r>
           </w:p>
         </w:tc>
@@ -1675,7 +1675,7 @@
           </w:tcPr>
           <w:p>
             <w:r>
-              <w:t>24</w:t>
+              <w:t>54</w:t>
             </w:r>
           </w:p>
         </w:tc>
@@ -1687,7 +1687,7 @@
           </w:tcPr>
           <w:p>
             <w:r>
-              <w:t>2026-06-27 13:29:51</w:t>
+              <w:t>2026-06-27 14:00:11</w:t>
             </w:r>
           </w:p>
         </w:tc>
@@ -1747,7 +1747,7 @@
           </w:tcPr>
           <w:p>
             <w:r>
-              <w:t>54</w:t>
+              <w:t>24</w:t>
             </w:r>
           </w:p>
         </w:tc>
@@ -3433,17 +3433,17 @@
     </w:tbl>
     <w:p>
       <w:r>
-        <w:t>Ticks: 57 · Reconciled: True · Readiness: not_ready</w:t>
+        <w:t>Ticks: 30 · Reconciled: True · Readiness: not_ready</w:t>
       </w:r>
     </w:p>
     <w:p>
       <w:r>
-        <w:t>Candidates created: 48803 · Terminals: {'accepted': 86, 'rejected': 41399, 'skipped': 7105, 'expired': 0, 'missing_data': 213}</w:t>
+        <w:t>Candidates created: 48838 · Terminals: {'accepted': 86, 'rejected': 41423, 'skipped': 7112, 'expired': 0, 'missing_data': 217}</w:t>
       </w:r>
     </w:p>
     <w:p>
       <w:r>
-        <w:t>Rejected by stage: {'directional': 31452, 'execution_gate': 156, 'context_gate': 879, 'directional_allowlist': 1364, 'down_bias_gate': 538, 'mtf_gate': 276, 'grok_decider': 3540, 'execution_realistic': 3, 'verifier': 61, 'mispricing_gate': 50, 'baseline_cohort_gate': 3080}</w:t>
+        <w:t>Rejected by stage: {'directional': 31476, 'execution_gate': 156, 'context_gate': 879, 'directional_allowlist': 1364, 'down_bias_gate': 538, 'mtf_gate': 276, 'grok_decider': 3540, 'execution_realistic': 3, 'verifier': 61, 'mispricing_gate': 50, 'baseline_cohort_gate': 3080}</w:t>
       </w:r>
     </w:p>
     <w:p>
@@ -4374,7 +4374,7 @@
           </w:tcPr>
           <w:p>
             <w:r>
-              <w:t>0.4216</w:t>
+              <w:t>0.4231</w:t>
             </w:r>
           </w:p>
         </w:tc>
@@ -4426,7 +4426,7 @@
     </w:tbl>
     <w:p>
       <w:r>
-        <w:t>TV alerts: received 395 · valid 378 · rejected 17</w:t>
+        <w:t>TV alerts: received 425 · valid 408 · rejected 17</w:t>
       </w:r>
     </w:p>
     <w:sectPr>

</xml_diff>

<commit_message>
chore(reports): VPS full report 2026-06-27 14:08 UTC (86 settled, WR 61.6%, PF 0.9752)
</commit_message>
<xml_diff>
--- a/vps_full_reports/latest/report.docx
+++ b/vps_full_reports/latest/report.docx
@@ -20,7 +20,7 @@
           <w:color w:val="666666"/>
           <w:sz w:val="20"/>
         </w:rPr>
-        <w:t>PAPER ONLY  ·  reconciled=True  ·  ticks=30</w:t>
+        <w:t>PAPER ONLY  ·  reconciled=True  ·  ticks=31</w:t>
       </w:r>
     </w:p>
     <w:p>
@@ -3433,17 +3433,17 @@
     </w:tbl>
     <w:p>
       <w:r>
-        <w:t>Ticks: 30 · Reconciled: True · Readiness: not_ready</w:t>
+        <w:t>Ticks: 31 · Reconciled: True · Readiness: not_ready</w:t>
       </w:r>
     </w:p>
     <w:p>
       <w:r>
-        <w:t>Candidates created: 48838 · Terminals: {'accepted': 86, 'rejected': 41423, 'skipped': 7112, 'expired': 0, 'missing_data': 217}</w:t>
+        <w:t>Candidates created: 48839 · Terminals: {'accepted': 86, 'rejected': 41424, 'skipped': 7112, 'expired': 0, 'missing_data': 217}</w:t>
       </w:r>
     </w:p>
     <w:p>
       <w:r>
-        <w:t>Rejected by stage: {'directional': 31476, 'execution_gate': 156, 'context_gate': 879, 'directional_allowlist': 1364, 'down_bias_gate': 538, 'mtf_gate': 276, 'grok_decider': 3540, 'execution_realistic': 3, 'verifier': 61, 'mispricing_gate': 50, 'baseline_cohort_gate': 3080}</w:t>
+        <w:t>Rejected by stage: {'directional': 31477, 'execution_gate': 156, 'context_gate': 879, 'directional_allowlist': 1364, 'down_bias_gate': 538, 'mtf_gate': 276, 'grok_decider': 3540, 'execution_realistic': 3, 'verifier': 61, 'mispricing_gate': 50, 'baseline_cohort_gate': 3080}</w:t>
       </w:r>
     </w:p>
     <w:p>

</xml_diff>

<commit_message>
chore(reports): VPS full report 2026-06-27 15:34 UTC (86 settled, WR 61.6%, PF 0.9752)
</commit_message>
<xml_diff>
--- a/vps_full_reports/latest/report.docx
+++ b/vps_full_reports/latest/report.docx
@@ -20,7 +20,7 @@
           <w:color w:val="666666"/>
           <w:sz w:val="20"/>
         </w:rPr>
-        <w:t>PAPER ONLY  ·  reconciled=True  ·  ticks=31</w:t>
+        <w:t>PAPER ONLY  ·  reconciled=True  ·  ticks=9</w:t>
       </w:r>
     </w:p>
     <w:p>
@@ -319,7 +319,7 @@
           </w:tcPr>
           <w:p>
             <w:r>
-              <w:t>2026-06-27 04:18:30</w:t>
+              <w:t>2026-06-27 05:50:49</w:t>
             </w:r>
           </w:p>
         </w:tc>
@@ -379,7 +379,7 @@
           </w:tcPr>
           <w:p>
             <w:r>
-              <w:t>11</w:t>
+              <w:t>20</w:t>
             </w:r>
           </w:p>
         </w:tc>
@@ -391,7 +391,7 @@
           </w:tcPr>
           <w:p>
             <w:r>
-              <w:t>2026-06-27 04:49:25</w:t>
+              <w:t>2026-06-27 06:21:49</w:t>
             </w:r>
           </w:p>
         </w:tc>
@@ -451,7 +451,7 @@
           </w:tcPr>
           <w:p>
             <w:r>
-              <w:t>26</w:t>
+              <w:t>51</w:t>
             </w:r>
           </w:p>
         </w:tc>
@@ -463,7 +463,7 @@
           </w:tcPr>
           <w:p>
             <w:r>
-              <w:t>2026-06-27 05:20:05</w:t>
+              <w:t>2026-06-27 06:52:41</w:t>
             </w:r>
           </w:p>
         </w:tc>
@@ -523,7 +523,7 @@
           </w:tcPr>
           <w:p>
             <w:r>
-              <w:t>14</w:t>
+              <w:t>16</w:t>
             </w:r>
           </w:p>
         </w:tc>
@@ -535,7 +535,7 @@
           </w:tcPr>
           <w:p>
             <w:r>
-              <w:t>2026-06-27 05:50:49</w:t>
+              <w:t>2026-06-27 07:23:41</w:t>
             </w:r>
           </w:p>
         </w:tc>
@@ -595,7 +595,7 @@
           </w:tcPr>
           <w:p>
             <w:r>
-              <w:t>20</w:t>
+              <w:t>47</w:t>
             </w:r>
           </w:p>
         </w:tc>
@@ -607,7 +607,7 @@
           </w:tcPr>
           <w:p>
             <w:r>
-              <w:t>2026-06-27 06:21:49</w:t>
+              <w:t>2026-06-27 07:54:41</w:t>
             </w:r>
           </w:p>
         </w:tc>
@@ -667,7 +667,7 @@
           </w:tcPr>
           <w:p>
             <w:r>
-              <w:t>51</w:t>
+              <w:t>78</w:t>
             </w:r>
           </w:p>
         </w:tc>
@@ -679,7 +679,7 @@
           </w:tcPr>
           <w:p>
             <w:r>
-              <w:t>2026-06-27 06:52:41</w:t>
+              <w:t>2026-06-27 08:24:41</w:t>
             </w:r>
           </w:p>
         </w:tc>
@@ -739,7 +739,7 @@
           </w:tcPr>
           <w:p>
             <w:r>
-              <w:t>16</w:t>
+              <w:t>108</w:t>
             </w:r>
           </w:p>
         </w:tc>
@@ -751,7 +751,7 @@
           </w:tcPr>
           <w:p>
             <w:r>
-              <w:t>2026-06-27 07:23:41</w:t>
+              <w:t>2026-06-27 08:55:14</w:t>
             </w:r>
           </w:p>
         </w:tc>
@@ -811,7 +811,7 @@
           </w:tcPr>
           <w:p>
             <w:r>
-              <w:t>47</w:t>
+              <w:t>19</w:t>
             </w:r>
           </w:p>
         </w:tc>
@@ -823,7 +823,7 @@
           </w:tcPr>
           <w:p>
             <w:r>
-              <w:t>2026-06-27 07:54:41</w:t>
+              <w:t>2026-06-27 09:25:14</w:t>
             </w:r>
           </w:p>
         </w:tc>
@@ -883,7 +883,7 @@
           </w:tcPr>
           <w:p>
             <w:r>
-              <w:t>78</w:t>
+              <w:t>49</w:t>
             </w:r>
           </w:p>
         </w:tc>
@@ -895,7 +895,7 @@
           </w:tcPr>
           <w:p>
             <w:r>
-              <w:t>2026-06-27 08:24:41</w:t>
+              <w:t>2026-06-27 09:56:14</w:t>
             </w:r>
           </w:p>
         </w:tc>
@@ -955,7 +955,7 @@
           </w:tcPr>
           <w:p>
             <w:r>
-              <w:t>108</w:t>
+              <w:t>80</w:t>
             </w:r>
           </w:p>
         </w:tc>
@@ -967,7 +967,7 @@
           </w:tcPr>
           <w:p>
             <w:r>
-              <w:t>2026-06-27 08:55:14</w:t>
+              <w:t>2026-06-27 10:26:14</w:t>
             </w:r>
           </w:p>
         </w:tc>
@@ -1027,7 +1027,7 @@
           </w:tcPr>
           <w:p>
             <w:r>
-              <w:t>19</w:t>
+              <w:t>110</w:t>
             </w:r>
           </w:p>
         </w:tc>
@@ -1039,7 +1039,7 @@
           </w:tcPr>
           <w:p>
             <w:r>
-              <w:t>2026-06-27 09:25:14</w:t>
+              <w:t>2026-06-27 10:57:04</w:t>
             </w:r>
           </w:p>
         </w:tc>
@@ -1069,7 +1069,7 @@
           </w:tcPr>
           <w:p>
             <w:r>
-              <w:t>90.3</w:t>
+              <w:t>90.4</w:t>
             </w:r>
           </w:p>
         </w:tc>
@@ -1089,7 +1089,7 @@
           </w:tcPr>
           <w:p>
             <w:r>
-              <w:t>66.7</w:t>
+              <w:t>66.8</w:t>
             </w:r>
           </w:p>
         </w:tc>
@@ -1099,7 +1099,7 @@
           </w:tcPr>
           <w:p>
             <w:r>
-              <w:t>49</w:t>
+              <w:t>22</w:t>
             </w:r>
           </w:p>
         </w:tc>
@@ -1111,7 +1111,7 @@
           </w:tcPr>
           <w:p>
             <w:r>
-              <w:t>2026-06-27 09:56:14</w:t>
+              <w:t>2026-06-27 11:28:04</w:t>
             </w:r>
           </w:p>
         </w:tc>
@@ -1141,7 +1141,7 @@
           </w:tcPr>
           <w:p>
             <w:r>
-              <w:t>90.3</w:t>
+              <w:t>90.4</w:t>
             </w:r>
           </w:p>
         </w:tc>
@@ -1161,7 +1161,7 @@
           </w:tcPr>
           <w:p>
             <w:r>
-              <w:t>66.7</w:t>
+              <w:t>66.8</w:t>
             </w:r>
           </w:p>
         </w:tc>
@@ -1171,7 +1171,7 @@
           </w:tcPr>
           <w:p>
             <w:r>
-              <w:t>80</w:t>
+              <w:t>53</w:t>
             </w:r>
           </w:p>
         </w:tc>
@@ -1183,7 +1183,7 @@
           </w:tcPr>
           <w:p>
             <w:r>
-              <w:t>2026-06-27 10:26:14</w:t>
+              <w:t>2026-06-27 11:59:04</w:t>
             </w:r>
           </w:p>
         </w:tc>
@@ -1213,7 +1213,7 @@
           </w:tcPr>
           <w:p>
             <w:r>
-              <w:t>90.3</w:t>
+              <w:t>90.4</w:t>
             </w:r>
           </w:p>
         </w:tc>
@@ -1233,7 +1233,7 @@
           </w:tcPr>
           <w:p>
             <w:r>
-              <w:t>66.7</w:t>
+              <w:t>66.8</w:t>
             </w:r>
           </w:p>
         </w:tc>
@@ -1243,7 +1243,7 @@
           </w:tcPr>
           <w:p>
             <w:r>
-              <w:t>110</w:t>
+              <w:t>84</w:t>
             </w:r>
           </w:p>
         </w:tc>
@@ -1255,7 +1255,7 @@
           </w:tcPr>
           <w:p>
             <w:r>
-              <w:t>2026-06-27 10:57:04</w:t>
+              <w:t>2026-06-27 12:29:05</w:t>
             </w:r>
           </w:p>
         </w:tc>
@@ -1315,7 +1315,7 @@
           </w:tcPr>
           <w:p>
             <w:r>
-              <w:t>22</w:t>
+              <w:t>114</w:t>
             </w:r>
           </w:p>
         </w:tc>
@@ -1327,7 +1327,7 @@
           </w:tcPr>
           <w:p>
             <w:r>
-              <w:t>2026-06-27 11:28:04</w:t>
+              <w:t>2026-06-27 12:59:50</w:t>
             </w:r>
           </w:p>
         </w:tc>
@@ -1387,7 +1387,7 @@
           </w:tcPr>
           <w:p>
             <w:r>
-              <w:t>53</w:t>
+              <w:t>24</w:t>
             </w:r>
           </w:p>
         </w:tc>
@@ -1399,7 +1399,7 @@
           </w:tcPr>
           <w:p>
             <w:r>
-              <w:t>2026-06-27 11:59:04</w:t>
+              <w:t>2026-06-27 13:29:51</w:t>
             </w:r>
           </w:p>
         </w:tc>
@@ -1459,7 +1459,7 @@
           </w:tcPr>
           <w:p>
             <w:r>
-              <w:t>84</w:t>
+              <w:t>54</w:t>
             </w:r>
           </w:p>
         </w:tc>
@@ -1471,7 +1471,7 @@
           </w:tcPr>
           <w:p>
             <w:r>
-              <w:t>2026-06-27 12:29:05</w:t>
+              <w:t>2026-06-27 14:00:11</w:t>
             </w:r>
           </w:p>
         </w:tc>
@@ -1531,7 +1531,7 @@
           </w:tcPr>
           <w:p>
             <w:r>
-              <w:t>114</w:t>
+              <w:t>24</w:t>
             </w:r>
           </w:p>
         </w:tc>
@@ -1543,7 +1543,7 @@
           </w:tcPr>
           <w:p>
             <w:r>
-              <w:t>2026-06-27 12:59:50</w:t>
+              <w:t>2026-06-27 14:30:34</w:t>
             </w:r>
           </w:p>
         </w:tc>
@@ -1603,7 +1603,7 @@
           </w:tcPr>
           <w:p>
             <w:r>
-              <w:t>24</w:t>
+              <w:t>9</w:t>
             </w:r>
           </w:p>
         </w:tc>
@@ -1615,7 +1615,7 @@
           </w:tcPr>
           <w:p>
             <w:r>
-              <w:t>2026-06-27 13:29:51</w:t>
+              <w:t>2026-06-27 15:01:01</w:t>
             </w:r>
           </w:p>
         </w:tc>
@@ -1675,7 +1675,7 @@
           </w:tcPr>
           <w:p>
             <w:r>
-              <w:t>54</w:t>
+              <w:t>19</w:t>
             </w:r>
           </w:p>
         </w:tc>
@@ -1687,7 +1687,7 @@
           </w:tcPr>
           <w:p>
             <w:r>
-              <w:t>2026-06-27 14:00:11</w:t>
+              <w:t>2026-06-27 15:31:08</w:t>
             </w:r>
           </w:p>
         </w:tc>
@@ -1747,7 +1747,7 @@
           </w:tcPr>
           <w:p>
             <w:r>
-              <w:t>24</w:t>
+              <w:t>4</w:t>
             </w:r>
           </w:p>
         </w:tc>
@@ -3433,17 +3433,17 @@
     </w:tbl>
     <w:p>
       <w:r>
-        <w:t>Ticks: 31 · Reconciled: True · Readiness: not_ready</w:t>
+        <w:t>Ticks: 9 · Reconciled: True · Readiness: not_ready</w:t>
       </w:r>
     </w:p>
     <w:p>
       <w:r>
-        <w:t>Candidates created: 48839 · Terminals: {'accepted': 86, 'rejected': 41424, 'skipped': 7112, 'expired': 0, 'missing_data': 217}</w:t>
+        <w:t>Candidates created: 48932 · Terminals: {'accepted': 86, 'rejected': 41493, 'skipped': 7129, 'expired': 0, 'missing_data': 224}</w:t>
       </w:r>
     </w:p>
     <w:p>
       <w:r>
-        <w:t>Rejected by stage: {'directional': 31477, 'execution_gate': 156, 'context_gate': 879, 'directional_allowlist': 1364, 'down_bias_gate': 538, 'mtf_gate': 276, 'grok_decider': 3540, 'execution_realistic': 3, 'verifier': 61, 'mispricing_gate': 50, 'baseline_cohort_gate': 3080}</w:t>
+        <w:t>Rejected by stage: {'directional': 31528, 'execution_gate': 156, 'context_gate': 879, 'directional_allowlist': 1364, 'down_bias_gate': 538, 'mtf_gate': 276, 'grok_decider': 3540, 'execution_realistic': 3, 'verifier': 61, 'mispricing_gate': 50, 'baseline_cohort_gate': 3098}</w:t>
       </w:r>
     </w:p>
     <w:p>
@@ -4374,7 +4374,7 @@
           </w:tcPr>
           <w:p>
             <w:r>
-              <w:t>0.4231</w:t>
+              <w:t>0.4151</w:t>
             </w:r>
           </w:p>
         </w:tc>
@@ -4396,7 +4396,7 @@
           </w:tcPr>
           <w:p>
             <w:r>
-              <w:t>0.4890</w:t>
+              <w:t>0.4891</w:t>
             </w:r>
           </w:p>
         </w:tc>
@@ -4426,7 +4426,7 @@
     </w:tbl>
     <w:p>
       <w:r>
-        <w:t>TV alerts: received 425 · valid 408 · rejected 17</w:t>
+        <w:t>TV alerts: received 477 · valid 460 · rejected 17</w:t>
       </w:r>
     </w:p>
     <w:sectPr>

</xml_diff>

<commit_message>
chore(reports): VPS full report 2026-06-27 17:34 UTC (87 settled, WR 60.9%, PF 0.9437)
</commit_message>
<xml_diff>
--- a/vps_full_reports/latest/report.docx
+++ b/vps_full_reports/latest/report.docx
@@ -20,7 +20,7 @@
           <w:color w:val="666666"/>
           <w:sz w:val="20"/>
         </w:rPr>
-        <w:t>PAPER ONLY  ·  reconciled=True  ·  ticks=9</w:t>
+        <w:t>PAPER ONLY  ·  reconciled=False  ·  ticks=133</w:t>
       </w:r>
     </w:p>
     <w:p>
@@ -33,7 +33,7 @@
     </w:p>
     <w:p>
       <w:r>
-        <w:t>Overall score: 66.8 / 100  (Grade: D)</w:t>
+        <w:t>Overall score: 55.5 / 100  (Grade: F)</w:t>
       </w:r>
     </w:p>
     <w:tbl>
@@ -107,7 +107,7 @@
           </w:tcPr>
           <w:p>
             <w:r>
-              <w:t>64.8</w:t>
+              <w:t>52.2</w:t>
             </w:r>
           </w:p>
         </w:tc>
@@ -117,7 +117,7 @@
           </w:tcPr>
           <w:p>
             <w:r>
-              <w:t>D</w:t>
+              <w:t>F</w:t>
             </w:r>
           </w:p>
         </w:tc>
@@ -149,7 +149,7 @@
           </w:tcPr>
           <w:p>
             <w:r>
-              <w:t>90.4</w:t>
+              <w:t>70.4</w:t>
             </w:r>
           </w:p>
         </w:tc>
@@ -159,7 +159,7 @@
           </w:tcPr>
           <w:p>
             <w:r>
-              <w:t>A</w:t>
+              <w:t>C</w:t>
             </w:r>
           </w:p>
         </w:tc>
@@ -319,7 +319,7 @@
           </w:tcPr>
           <w:p>
             <w:r>
-              <w:t>2026-06-27 05:50:49</w:t>
+              <w:t>2026-06-27 08:24:41</w:t>
             </w:r>
           </w:p>
         </w:tc>
@@ -379,7 +379,7 @@
           </w:tcPr>
           <w:p>
             <w:r>
-              <w:t>20</w:t>
+              <w:t>108</w:t>
             </w:r>
           </w:p>
         </w:tc>
@@ -391,7 +391,7 @@
           </w:tcPr>
           <w:p>
             <w:r>
-              <w:t>2026-06-27 06:21:49</w:t>
+              <w:t>2026-06-27 08:55:14</w:t>
             </w:r>
           </w:p>
         </w:tc>
@@ -451,7 +451,7 @@
           </w:tcPr>
           <w:p>
             <w:r>
-              <w:t>51</w:t>
+              <w:t>19</w:t>
             </w:r>
           </w:p>
         </w:tc>
@@ -463,7 +463,7 @@
           </w:tcPr>
           <w:p>
             <w:r>
-              <w:t>2026-06-27 06:52:41</w:t>
+              <w:t>2026-06-27 09:25:14</w:t>
             </w:r>
           </w:p>
         </w:tc>
@@ -523,7 +523,7 @@
           </w:tcPr>
           <w:p>
             <w:r>
-              <w:t>16</w:t>
+              <w:t>49</w:t>
             </w:r>
           </w:p>
         </w:tc>
@@ -535,7 +535,7 @@
           </w:tcPr>
           <w:p>
             <w:r>
-              <w:t>2026-06-27 07:23:41</w:t>
+              <w:t>2026-06-27 09:56:14</w:t>
             </w:r>
           </w:p>
         </w:tc>
@@ -595,7 +595,7 @@
           </w:tcPr>
           <w:p>
             <w:r>
-              <w:t>47</w:t>
+              <w:t>80</w:t>
             </w:r>
           </w:p>
         </w:tc>
@@ -607,7 +607,7 @@
           </w:tcPr>
           <w:p>
             <w:r>
-              <w:t>2026-06-27 07:54:41</w:t>
+              <w:t>2026-06-27 10:26:14</w:t>
             </w:r>
           </w:p>
         </w:tc>
@@ -667,7 +667,7 @@
           </w:tcPr>
           <w:p>
             <w:r>
-              <w:t>78</w:t>
+              <w:t>110</w:t>
             </w:r>
           </w:p>
         </w:tc>
@@ -679,7 +679,7 @@
           </w:tcPr>
           <w:p>
             <w:r>
-              <w:t>2026-06-27 08:24:41</w:t>
+              <w:t>2026-06-27 10:57:04</w:t>
             </w:r>
           </w:p>
         </w:tc>
@@ -709,7 +709,7 @@
           </w:tcPr>
           <w:p>
             <w:r>
-              <w:t>90.3</w:t>
+              <w:t>90.4</w:t>
             </w:r>
           </w:p>
         </w:tc>
@@ -729,7 +729,7 @@
           </w:tcPr>
           <w:p>
             <w:r>
-              <w:t>66.7</w:t>
+              <w:t>66.8</w:t>
             </w:r>
           </w:p>
         </w:tc>
@@ -739,7 +739,7 @@
           </w:tcPr>
           <w:p>
             <w:r>
-              <w:t>108</w:t>
+              <w:t>22</w:t>
             </w:r>
           </w:p>
         </w:tc>
@@ -751,7 +751,7 @@
           </w:tcPr>
           <w:p>
             <w:r>
-              <w:t>2026-06-27 08:55:14</w:t>
+              <w:t>2026-06-27 11:28:04</w:t>
             </w:r>
           </w:p>
         </w:tc>
@@ -781,7 +781,7 @@
           </w:tcPr>
           <w:p>
             <w:r>
-              <w:t>90.3</w:t>
+              <w:t>90.4</w:t>
             </w:r>
           </w:p>
         </w:tc>
@@ -801,7 +801,7 @@
           </w:tcPr>
           <w:p>
             <w:r>
-              <w:t>66.7</w:t>
+              <w:t>66.8</w:t>
             </w:r>
           </w:p>
         </w:tc>
@@ -811,7 +811,7 @@
           </w:tcPr>
           <w:p>
             <w:r>
-              <w:t>19</w:t>
+              <w:t>53</w:t>
             </w:r>
           </w:p>
         </w:tc>
@@ -823,7 +823,7 @@
           </w:tcPr>
           <w:p>
             <w:r>
-              <w:t>2026-06-27 09:25:14</w:t>
+              <w:t>2026-06-27 11:59:04</w:t>
             </w:r>
           </w:p>
         </w:tc>
@@ -853,7 +853,7 @@
           </w:tcPr>
           <w:p>
             <w:r>
-              <w:t>90.3</w:t>
+              <w:t>90.4</w:t>
             </w:r>
           </w:p>
         </w:tc>
@@ -873,7 +873,7 @@
           </w:tcPr>
           <w:p>
             <w:r>
-              <w:t>66.7</w:t>
+              <w:t>66.8</w:t>
             </w:r>
           </w:p>
         </w:tc>
@@ -883,7 +883,7 @@
           </w:tcPr>
           <w:p>
             <w:r>
-              <w:t>49</w:t>
+              <w:t>84</w:t>
             </w:r>
           </w:p>
         </w:tc>
@@ -895,7 +895,7 @@
           </w:tcPr>
           <w:p>
             <w:r>
-              <w:t>2026-06-27 09:56:14</w:t>
+              <w:t>2026-06-27 12:29:05</w:t>
             </w:r>
           </w:p>
         </w:tc>
@@ -925,7 +925,7 @@
           </w:tcPr>
           <w:p>
             <w:r>
-              <w:t>90.3</w:t>
+              <w:t>90.4</w:t>
             </w:r>
           </w:p>
         </w:tc>
@@ -945,7 +945,7 @@
           </w:tcPr>
           <w:p>
             <w:r>
-              <w:t>66.7</w:t>
+              <w:t>66.8</w:t>
             </w:r>
           </w:p>
         </w:tc>
@@ -955,7 +955,7 @@
           </w:tcPr>
           <w:p>
             <w:r>
-              <w:t>80</w:t>
+              <w:t>114</w:t>
             </w:r>
           </w:p>
         </w:tc>
@@ -967,7 +967,7 @@
           </w:tcPr>
           <w:p>
             <w:r>
-              <w:t>2026-06-27 10:26:14</w:t>
+              <w:t>2026-06-27 12:59:50</w:t>
             </w:r>
           </w:p>
         </w:tc>
@@ -997,7 +997,7 @@
           </w:tcPr>
           <w:p>
             <w:r>
-              <w:t>90.3</w:t>
+              <w:t>90.4</w:t>
             </w:r>
           </w:p>
         </w:tc>
@@ -1017,7 +1017,7 @@
           </w:tcPr>
           <w:p>
             <w:r>
-              <w:t>66.7</w:t>
+              <w:t>66.8</w:t>
             </w:r>
           </w:p>
         </w:tc>
@@ -1027,7 +1027,7 @@
           </w:tcPr>
           <w:p>
             <w:r>
-              <w:t>110</w:t>
+              <w:t>24</w:t>
             </w:r>
           </w:p>
         </w:tc>
@@ -1039,7 +1039,7 @@
           </w:tcPr>
           <w:p>
             <w:r>
-              <w:t>2026-06-27 10:57:04</w:t>
+              <w:t>2026-06-27 13:29:51</w:t>
             </w:r>
           </w:p>
         </w:tc>
@@ -1099,7 +1099,7 @@
           </w:tcPr>
           <w:p>
             <w:r>
-              <w:t>22</w:t>
+              <w:t>54</w:t>
             </w:r>
           </w:p>
         </w:tc>
@@ -1111,7 +1111,7 @@
           </w:tcPr>
           <w:p>
             <w:r>
-              <w:t>2026-06-27 11:28:04</w:t>
+              <w:t>2026-06-27 14:00:11</w:t>
             </w:r>
           </w:p>
         </w:tc>
@@ -1171,7 +1171,7 @@
           </w:tcPr>
           <w:p>
             <w:r>
-              <w:t>53</w:t>
+              <w:t>24</w:t>
             </w:r>
           </w:p>
         </w:tc>
@@ -1183,7 +1183,7 @@
           </w:tcPr>
           <w:p>
             <w:r>
-              <w:t>2026-06-27 11:59:04</w:t>
+              <w:t>2026-06-27 14:30:34</w:t>
             </w:r>
           </w:p>
         </w:tc>
@@ -1243,7 +1243,7 @@
           </w:tcPr>
           <w:p>
             <w:r>
-              <w:t>84</w:t>
+              <w:t>9</w:t>
             </w:r>
           </w:p>
         </w:tc>
@@ -1255,7 +1255,7 @@
           </w:tcPr>
           <w:p>
             <w:r>
-              <w:t>2026-06-27 12:29:05</w:t>
+              <w:t>2026-06-27 15:01:01</w:t>
             </w:r>
           </w:p>
         </w:tc>
@@ -1315,7 +1315,7 @@
           </w:tcPr>
           <w:p>
             <w:r>
-              <w:t>114</w:t>
+              <w:t>19</w:t>
             </w:r>
           </w:p>
         </w:tc>
@@ -1327,7 +1327,7 @@
           </w:tcPr>
           <w:p>
             <w:r>
-              <w:t>2026-06-27 12:59:50</w:t>
+              <w:t>2026-06-27 15:31:08</w:t>
             </w:r>
           </w:p>
         </w:tc>
@@ -1387,7 +1387,7 @@
           </w:tcPr>
           <w:p>
             <w:r>
-              <w:t>24</w:t>
+              <w:t>4</w:t>
             </w:r>
           </w:p>
         </w:tc>
@@ -1399,7 +1399,7 @@
           </w:tcPr>
           <w:p>
             <w:r>
-              <w:t>2026-06-27 13:29:51</w:t>
+              <w:t>2026-06-27 16:01:38</w:t>
             </w:r>
           </w:p>
         </w:tc>
@@ -1459,7 +1459,7 @@
           </w:tcPr>
           <w:p>
             <w:r>
-              <w:t>54</w:t>
+              <w:t>65</w:t>
             </w:r>
           </w:p>
         </w:tc>
@@ -1471,7 +1471,7 @@
           </w:tcPr>
           <w:p>
             <w:r>
-              <w:t>2026-06-27 14:00:11</w:t>
+              <w:t>2026-06-27 16:32:04</w:t>
             </w:r>
           </w:p>
         </w:tc>
@@ -1531,7 +1531,7 @@
           </w:tcPr>
           <w:p>
             <w:r>
-              <w:t>24</w:t>
+              <w:t>10</w:t>
             </w:r>
           </w:p>
         </w:tc>
@@ -1543,7 +1543,7 @@
           </w:tcPr>
           <w:p>
             <w:r>
-              <w:t>2026-06-27 14:30:34</w:t>
+              <w:t>2026-06-27 16:35:03</w:t>
             </w:r>
           </w:p>
         </w:tc>
@@ -1563,7 +1563,7 @@
           </w:tcPr>
           <w:p>
             <w:r>
-              <w:t>64.8</w:t>
+              <w:t>54.8</w:t>
             </w:r>
           </w:p>
         </w:tc>
@@ -1573,7 +1573,7 @@
           </w:tcPr>
           <w:p>
             <w:r>
-              <w:t>90.4</w:t>
+              <w:t>70.4</w:t>
             </w:r>
           </w:p>
         </w:tc>
@@ -1593,7 +1593,7 @@
           </w:tcPr>
           <w:p>
             <w:r>
-              <w:t>66.8</w:t>
+              <w:t>56.8</w:t>
             </w:r>
           </w:p>
         </w:tc>
@@ -1603,7 +1603,7 @@
           </w:tcPr>
           <w:p>
             <w:r>
-              <w:t>9</w:t>
+              <w:t>16</w:t>
             </w:r>
           </w:p>
         </w:tc>
@@ -1615,7 +1615,7 @@
           </w:tcPr>
           <w:p>
             <w:r>
-              <w:t>2026-06-27 15:01:01</w:t>
+              <w:t>2026-06-27 16:46:34</w:t>
             </w:r>
           </w:p>
         </w:tc>
@@ -1625,7 +1625,7 @@
           </w:tcPr>
           <w:p>
             <w:r>
-              <w:t>86</w:t>
+              <w:t>87</w:t>
             </w:r>
           </w:p>
         </w:tc>
@@ -1635,7 +1635,7 @@
           </w:tcPr>
           <w:p>
             <w:r>
-              <w:t>64.8</w:t>
+              <w:t>52.2</w:t>
             </w:r>
           </w:p>
         </w:tc>
@@ -1645,7 +1645,7 @@
           </w:tcPr>
           <w:p>
             <w:r>
-              <w:t>90.4</w:t>
+              <w:t>70.4</w:t>
             </w:r>
           </w:p>
         </w:tc>
@@ -1665,7 +1665,7 @@
           </w:tcPr>
           <w:p>
             <w:r>
-              <w:t>66.8</w:t>
+              <w:t>55.5</w:t>
             </w:r>
           </w:p>
         </w:tc>
@@ -1675,7 +1675,7 @@
           </w:tcPr>
           <w:p>
             <w:r>
-              <w:t>19</w:t>
+              <w:t>39</w:t>
             </w:r>
           </w:p>
         </w:tc>
@@ -1687,7 +1687,7 @@
           </w:tcPr>
           <w:p>
             <w:r>
-              <w:t>2026-06-27 15:31:08</w:t>
+              <w:t>2026-06-27 17:16:34</w:t>
             </w:r>
           </w:p>
         </w:tc>
@@ -1697,7 +1697,7 @@
           </w:tcPr>
           <w:p>
             <w:r>
-              <w:t>86</w:t>
+              <w:t>87</w:t>
             </w:r>
           </w:p>
         </w:tc>
@@ -1707,7 +1707,7 @@
           </w:tcPr>
           <w:p>
             <w:r>
-              <w:t>64.8</w:t>
+              <w:t>52.2</w:t>
             </w:r>
           </w:p>
         </w:tc>
@@ -1717,7 +1717,7 @@
           </w:tcPr>
           <w:p>
             <w:r>
-              <w:t>90.4</w:t>
+              <w:t>70.4</w:t>
             </w:r>
           </w:p>
         </w:tc>
@@ -1737,7 +1737,7 @@
           </w:tcPr>
           <w:p>
             <w:r>
-              <w:t>66.8</w:t>
+              <w:t>55.5</w:t>
             </w:r>
           </w:p>
         </w:tc>
@@ -1747,7 +1747,7 @@
           </w:tcPr>
           <w:p>
             <w:r>
-              <w:t>4</w:t>
+              <w:t>99</w:t>
             </w:r>
           </w:p>
         </w:tc>
@@ -1768,7 +1768,7 @@
     </w:p>
     <w:p>
       <w:r>
-        <w:t>Section score: 64.8 / 100  (Grade: D)</w:t>
+        <w:t>Section score: 52.2 / 100  (Grade: F)</w:t>
       </w:r>
     </w:p>
     <w:p>
@@ -1847,7 +1847,7 @@
           </w:tcPr>
           <w:p>
             <w:r>
-              <w:t>100.0</w:t>
+              <w:t>0.0</w:t>
             </w:r>
           </w:p>
         </w:tc>
@@ -1857,7 +1857,7 @@
           </w:tcPr>
           <w:p>
             <w:r>
-              <w:t>10.0</w:t>
+              <w:t>0.0</w:t>
             </w:r>
           </w:p>
         </w:tc>
@@ -1879,7 +1879,7 @@
           </w:tcPr>
           <w:p>
             <w:r>
-              <w:t>42.6</w:t>
+              <w:t>32.6</w:t>
             </w:r>
           </w:p>
         </w:tc>
@@ -1889,7 +1889,7 @@
           </w:tcPr>
           <w:p>
             <w:r>
-              <w:t>6.4</w:t>
+              <w:t>4.9</w:t>
             </w:r>
           </w:p>
         </w:tc>
@@ -1911,7 +1911,7 @@
           </w:tcPr>
           <w:p>
             <w:r>
-              <w:t>34.4</w:t>
+              <w:t>30.5</w:t>
             </w:r>
           </w:p>
         </w:tc>
@@ -1921,7 +1921,7 @@
           </w:tcPr>
           <w:p>
             <w:r>
-              <w:t>5.2</w:t>
+              <w:t>4.6</w:t>
             </w:r>
           </w:p>
         </w:tc>
@@ -2007,7 +2007,7 @@
           </w:tcPr>
           <w:p>
             <w:r>
-              <w:t>74.2</w:t>
+              <w:t>72.7</w:t>
             </w:r>
           </w:p>
         </w:tc>
@@ -2017,7 +2017,7 @@
           </w:tcPr>
           <w:p>
             <w:r>
-              <w:t>7.4</w:t>
+              <w:t>7.3</w:t>
             </w:r>
           </w:p>
         </w:tc>
@@ -2039,7 +2039,7 @@
           </w:tcPr>
           <w:p>
             <w:r>
-              <w:t>43.3</w:t>
+              <w:t>41.8</w:t>
             </w:r>
           </w:p>
         </w:tc>
@@ -2049,7 +2049,7 @@
           </w:tcPr>
           <w:p>
             <w:r>
-              <w:t>10.8</w:t>
+              <w:t>10.5</w:t>
             </w:r>
           </w:p>
         </w:tc>
@@ -2090,7 +2090,7 @@
           </w:tcPr>
           <w:p>
             <w:r>
-              <w:t>$556.01</w:t>
+              <w:t>$551.01</w:t>
             </w:r>
           </w:p>
         </w:tc>
@@ -2112,7 +2112,7 @@
           </w:tcPr>
           <w:p>
             <w:r>
-              <w:t>11.20%</w:t>
+              <w:t>10.20%</w:t>
             </w:r>
           </w:p>
         </w:tc>
@@ -2134,7 +2134,7 @@
           </w:tcPr>
           <w:p>
             <w:r>
-              <w:t>$-3.72</w:t>
+              <w:t>$-8.72</w:t>
             </w:r>
           </w:p>
         </w:tc>
@@ -2178,7 +2178,7 @@
           </w:tcPr>
           <w:p>
             <w:r>
-              <w:t>0.6163</w:t>
+              <w:t>0.6092</w:t>
             </w:r>
           </w:p>
         </w:tc>
@@ -2200,7 +2200,7 @@
           </w:tcPr>
           <w:p>
             <w:r>
-              <w:t>0.5000 / 0.6515</w:t>
+              <w:t>0.5000 / 0.6418</w:t>
             </w:r>
           </w:p>
         </w:tc>
@@ -2222,7 +2222,7 @@
           </w:tcPr>
           <w:p>
             <w:r>
-              <w:t>0.9752</w:t>
+              <w:t>0.9437</w:t>
             </w:r>
           </w:p>
         </w:tc>
@@ -2244,7 +2244,7 @@
           </w:tcPr>
           <w:p>
             <w:r>
-              <w:t>86 / 86</w:t>
+              <w:t>87 / 87</w:t>
             </w:r>
           </w:p>
         </w:tc>
@@ -2266,7 +2266,7 @@
           </w:tcPr>
           <w:p>
             <w:r>
-              <w:t>$-0.04</w:t>
+              <w:t>$-0.10</w:t>
             </w:r>
           </w:p>
         </w:tc>
@@ -2288,7 +2288,7 @@
           </w:tcPr>
           <w:p>
             <w:r>
-              <w:t>True</w:t>
+              <w:t>False</w:t>
             </w:r>
           </w:p>
         </w:tc>
@@ -2397,7 +2397,7 @@
           </w:tcPr>
           <w:p>
             <w:r>
-              <w:t>0.550</w:t>
+              <w:t>0.620</w:t>
             </w:r>
           </w:p>
         </w:tc>
@@ -2449,7 +2449,7 @@
           </w:tcPr>
           <w:p>
             <w:r>
-              <w:t>0.590</w:t>
+              <w:t>0.550</w:t>
             </w:r>
           </w:p>
         </w:tc>
@@ -2459,7 +2459,7 @@
           </w:tcPr>
           <w:p>
             <w:r>
-              <w:t>down</w:t>
+              <w:t>up</w:t>
             </w:r>
           </w:p>
         </w:tc>
@@ -2469,7 +2469,7 @@
           </w:tcPr>
           <w:p>
             <w:r>
-              <w:t>Yes</w:t>
+              <w:t>No</w:t>
             </w:r>
           </w:p>
         </w:tc>
@@ -2479,7 +2479,7 @@
           </w:tcPr>
           <w:p>
             <w:r>
-              <w:t>$3.47</w:t>
+              <w:t>$-5.00</w:t>
             </w:r>
           </w:p>
         </w:tc>
@@ -2501,7 +2501,7 @@
           </w:tcPr>
           <w:p>
             <w:r>
-              <w:t>0.520</w:t>
+              <w:t>0.590</w:t>
             </w:r>
           </w:p>
         </w:tc>
@@ -2531,7 +2531,7 @@
           </w:tcPr>
           <w:p>
             <w:r>
-              <w:t>$4.62</w:t>
+              <w:t>$3.47</w:t>
             </w:r>
           </w:p>
         </w:tc>
@@ -2553,7 +2553,7 @@
           </w:tcPr>
           <w:p>
             <w:r>
-              <w:t>0.570</w:t>
+              <w:t>0.520</w:t>
             </w:r>
           </w:p>
         </w:tc>
@@ -2563,7 +2563,7 @@
           </w:tcPr>
           <w:p>
             <w:r>
-              <w:t>up</w:t>
+              <w:t>down</w:t>
             </w:r>
           </w:p>
         </w:tc>
@@ -2573,7 +2573,7 @@
           </w:tcPr>
           <w:p>
             <w:r>
-              <w:t>No</w:t>
+              <w:t>Yes</w:t>
             </w:r>
           </w:p>
         </w:tc>
@@ -2583,7 +2583,7 @@
           </w:tcPr>
           <w:p>
             <w:r>
-              <w:t>$-5.00</w:t>
+              <w:t>$4.62</w:t>
             </w:r>
           </w:p>
         </w:tc>
@@ -2605,7 +2605,7 @@
           </w:tcPr>
           <w:p>
             <w:r>
-              <w:t>0.650</w:t>
+              <w:t>0.570</w:t>
             </w:r>
           </w:p>
         </w:tc>
@@ -2615,7 +2615,7 @@
           </w:tcPr>
           <w:p>
             <w:r>
-              <w:t>down</w:t>
+              <w:t>up</w:t>
             </w:r>
           </w:p>
         </w:tc>
@@ -2625,7 +2625,7 @@
           </w:tcPr>
           <w:p>
             <w:r>
-              <w:t>Yes</w:t>
+              <w:t>No</w:t>
             </w:r>
           </w:p>
         </w:tc>
@@ -2635,7 +2635,7 @@
           </w:tcPr>
           <w:p>
             <w:r>
-              <w:t>$2.69</w:t>
+              <w:t>$-5.00</w:t>
             </w:r>
           </w:p>
         </w:tc>
@@ -2657,7 +2657,7 @@
           </w:tcPr>
           <w:p>
             <w:r>
-              <w:t>0.690</w:t>
+              <w:t>0.650</w:t>
             </w:r>
           </w:p>
         </w:tc>
@@ -2667,7 +2667,7 @@
           </w:tcPr>
           <w:p>
             <w:r>
-              <w:t>up</w:t>
+              <w:t>down</w:t>
             </w:r>
           </w:p>
         </w:tc>
@@ -2677,7 +2677,7 @@
           </w:tcPr>
           <w:p>
             <w:r>
-              <w:t>No</w:t>
+              <w:t>Yes</w:t>
             </w:r>
           </w:p>
         </w:tc>
@@ -2687,7 +2687,7 @@
           </w:tcPr>
           <w:p>
             <w:r>
-              <w:t>$-5.00</w:t>
+              <w:t>$2.69</w:t>
             </w:r>
           </w:p>
         </w:tc>
@@ -2709,7 +2709,7 @@
           </w:tcPr>
           <w:p>
             <w:r>
-              <w:t>0.570</w:t>
+              <w:t>0.690</w:t>
             </w:r>
           </w:p>
         </w:tc>
@@ -2761,7 +2761,7 @@
           </w:tcPr>
           <w:p>
             <w:r>
-              <w:t>0.600</w:t>
+              <w:t>0.570</w:t>
             </w:r>
           </w:p>
         </w:tc>
@@ -2813,7 +2813,7 @@
           </w:tcPr>
           <w:p>
             <w:r>
-              <w:t>0.563</w:t>
+              <w:t>0.600</w:t>
             </w:r>
           </w:p>
         </w:tc>
@@ -2865,7 +2865,7 @@
           </w:tcPr>
           <w:p>
             <w:r>
-              <w:t>0.670</w:t>
+              <w:t>0.563</w:t>
             </w:r>
           </w:p>
         </w:tc>
@@ -2917,7 +2917,7 @@
           </w:tcPr>
           <w:p>
             <w:r>
-              <w:t>0.690</w:t>
+              <w:t>0.670</w:t>
             </w:r>
           </w:p>
         </w:tc>
@@ -2927,7 +2927,7 @@
           </w:tcPr>
           <w:p>
             <w:r>
-              <w:t>down</w:t>
+              <w:t>up</w:t>
             </w:r>
           </w:p>
         </w:tc>
@@ -2937,7 +2937,7 @@
           </w:tcPr>
           <w:p>
             <w:r>
-              <w:t>Yes</w:t>
+              <w:t>No</w:t>
             </w:r>
           </w:p>
         </w:tc>
@@ -2947,7 +2947,7 @@
           </w:tcPr>
           <w:p>
             <w:r>
-              <w:t>$2.25</w:t>
+              <w:t>$-5.00</w:t>
             </w:r>
           </w:p>
         </w:tc>
@@ -2969,7 +2969,7 @@
           </w:tcPr>
           <w:p>
             <w:r>
-              <w:t>0.550</w:t>
+              <w:t>0.690</w:t>
             </w:r>
           </w:p>
         </w:tc>
@@ -2999,7 +2999,7 @@
           </w:tcPr>
           <w:p>
             <w:r>
-              <w:t>$4.09</w:t>
+              <w:t>$2.25</w:t>
             </w:r>
           </w:p>
         </w:tc>
@@ -3021,7 +3021,7 @@
           </w:tcPr>
           <w:p>
             <w:r>
-              <w:t>0.650</w:t>
+              <w:t>0.550</w:t>
             </w:r>
           </w:p>
         </w:tc>
@@ -3031,7 +3031,7 @@
           </w:tcPr>
           <w:p>
             <w:r>
-              <w:t>up</w:t>
+              <w:t>down</w:t>
             </w:r>
           </w:p>
         </w:tc>
@@ -3041,7 +3041,7 @@
           </w:tcPr>
           <w:p>
             <w:r>
-              <w:t>No</w:t>
+              <w:t>Yes</w:t>
             </w:r>
           </w:p>
         </w:tc>
@@ -3051,7 +3051,7 @@
           </w:tcPr>
           <w:p>
             <w:r>
-              <w:t>$-5.00</w:t>
+              <w:t>$4.09</w:t>
             </w:r>
           </w:p>
         </w:tc>
@@ -3073,7 +3073,7 @@
           </w:tcPr>
           <w:p>
             <w:r>
-              <w:t>0.700</w:t>
+              <w:t>0.650</w:t>
             </w:r>
           </w:p>
         </w:tc>
@@ -3125,7 +3125,7 @@
           </w:tcPr>
           <w:p>
             <w:r>
-              <w:t>0.630</w:t>
+              <w:t>0.700</w:t>
             </w:r>
           </w:p>
         </w:tc>
@@ -3135,7 +3135,7 @@
           </w:tcPr>
           <w:p>
             <w:r>
-              <w:t>down</w:t>
+              <w:t>up</w:t>
             </w:r>
           </w:p>
         </w:tc>
@@ -3145,7 +3145,7 @@
           </w:tcPr>
           <w:p>
             <w:r>
-              <w:t>Yes</w:t>
+              <w:t>No</w:t>
             </w:r>
           </w:p>
         </w:tc>
@@ -3155,7 +3155,7 @@
           </w:tcPr>
           <w:p>
             <w:r>
-              <w:t>$2.94</w:t>
+              <w:t>$-5.00</w:t>
             </w:r>
           </w:p>
         </w:tc>
@@ -3176,7 +3176,7 @@
     </w:p>
     <w:p>
       <w:r>
-        <w:t>Section score: 90.4 / 100  (Grade: A)</w:t>
+        <w:t>Section score: 70.4 / 100  (Grade: C)</w:t>
       </w:r>
     </w:p>
     <w:p>
@@ -3255,7 +3255,7 @@
           </w:tcPr>
           <w:p>
             <w:r>
-              <w:t>100.0</w:t>
+              <w:t>0.0</w:t>
             </w:r>
           </w:p>
         </w:tc>
@@ -3265,7 +3265,7 @@
           </w:tcPr>
           <w:p>
             <w:r>
-              <w:t>20.0</w:t>
+              <w:t>0.0</w:t>
             </w:r>
           </w:p>
         </w:tc>
@@ -3319,7 +3319,7 @@
           </w:tcPr>
           <w:p>
             <w:r>
-              <w:t>95.8</w:t>
+              <w:t>95.9</w:t>
             </w:r>
           </w:p>
         </w:tc>
@@ -3433,17 +3433,17 @@
     </w:tbl>
     <w:p>
       <w:r>
-        <w:t>Ticks: 9 · Reconciled: True · Readiness: not_ready</w:t>
+        <w:t>Ticks: 133 · Reconciled: False · Readiness: not_ready</w:t>
       </w:r>
     </w:p>
     <w:p>
       <w:r>
-        <w:t>Candidates created: 48932 · Terminals: {'accepted': 86, 'rejected': 41493, 'skipped': 7129, 'expired': 0, 'missing_data': 224}</w:t>
+        <w:t>Candidates created: 49152 · Terminals: {'accepted': 86, 'rejected': 41681, 'skipped': 7159, 'expired': 0, 'missing_data': 226}</w:t>
       </w:r>
     </w:p>
     <w:p>
       <w:r>
-        <w:t>Rejected by stage: {'directional': 31528, 'execution_gate': 156, 'context_gate': 879, 'directional_allowlist': 1364, 'down_bias_gate': 538, 'mtf_gate': 276, 'grok_decider': 3540, 'execution_realistic': 3, 'verifier': 61, 'mispricing_gate': 50, 'baseline_cohort_gate': 3098}</w:t>
+        <w:t>Rejected by stage: {'directional': 31691, 'execution_gate': 156, 'context_gate': 879, 'directional_allowlist': 1364, 'down_bias_gate': 538, 'mtf_gate': 276, 'grok_decider': 3540, 'execution_realistic': 3, 'verifier': 61, 'mispricing_gate': 50, 'baseline_cohort_gate': 3123}</w:t>
       </w:r>
     </w:p>
     <w:p>
@@ -4374,7 +4374,7 @@
           </w:tcPr>
           <w:p>
             <w:r>
-              <w:t>0.4151</w:t>
+              <w:t>0.4167</w:t>
             </w:r>
           </w:p>
         </w:tc>
@@ -4396,7 +4396,7 @@
           </w:tcPr>
           <w:p>
             <w:r>
-              <w:t>0.4891</w:t>
+              <w:t>0.4893</w:t>
             </w:r>
           </w:p>
         </w:tc>
@@ -4426,7 +4426,7 @@
     </w:tbl>
     <w:p>
       <w:r>
-        <w:t>TV alerts: received 477 · valid 460 · rejected 17</w:t>
+        <w:t>TV alerts: received 535 · valid 518 · rejected 17</w:t>
       </w:r>
     </w:p>
     <w:sectPr>

</xml_diff>

<commit_message>
chore(reports): VPS full report 2026-06-27 19:34 UTC (90 settled, WR 60.0%, PF 0.9123)
</commit_message>
<xml_diff>
--- a/vps_full_reports/latest/report.docx
+++ b/vps_full_reports/latest/report.docx
@@ -20,7 +20,7 @@
           <w:color w:val="666666"/>
           <w:sz w:val="20"/>
         </w:rPr>
-        <w:t>PAPER ONLY  ·  reconciled=False  ·  ticks=133</w:t>
+        <w:t>PAPER ONLY  ·  reconciled=True  ·  ticks=3</w:t>
       </w:r>
     </w:p>
     <w:p>
@@ -33,7 +33,7 @@
     </w:p>
     <w:p>
       <w:r>
-        <w:t>Overall score: 55.5 / 100  (Grade: F)</w:t>
+        <w:t>Overall score: 63.5 / 100  (Grade: D)</w:t>
       </w:r>
     </w:p>
     <w:tbl>
@@ -107,7 +107,7 @@
           </w:tcPr>
           <w:p>
             <w:r>
-              <w:t>52.2</w:t>
+              <w:t>58.2</w:t>
             </w:r>
           </w:p>
         </w:tc>
@@ -149,7 +149,7 @@
           </w:tcPr>
           <w:p>
             <w:r>
-              <w:t>70.4</w:t>
+              <w:t>90.4</w:t>
             </w:r>
           </w:p>
         </w:tc>
@@ -159,7 +159,7 @@
           </w:tcPr>
           <w:p>
             <w:r>
-              <w:t>C</w:t>
+              <w:t>A</w:t>
             </w:r>
           </w:p>
         </w:tc>
@@ -319,7 +319,7 @@
           </w:tcPr>
           <w:p>
             <w:r>
-              <w:t>2026-06-27 08:24:41</w:t>
+              <w:t>2026-06-27 11:28:04</w:t>
             </w:r>
           </w:p>
         </w:tc>
@@ -349,7 +349,7 @@
           </w:tcPr>
           <w:p>
             <w:r>
-              <w:t>90.3</w:t>
+              <w:t>90.4</w:t>
             </w:r>
           </w:p>
         </w:tc>
@@ -369,7 +369,7 @@
           </w:tcPr>
           <w:p>
             <w:r>
-              <w:t>66.7</w:t>
+              <w:t>66.8</w:t>
             </w:r>
           </w:p>
         </w:tc>
@@ -379,7 +379,7 @@
           </w:tcPr>
           <w:p>
             <w:r>
-              <w:t>108</w:t>
+              <w:t>53</w:t>
             </w:r>
           </w:p>
         </w:tc>
@@ -391,7 +391,7 @@
           </w:tcPr>
           <w:p>
             <w:r>
-              <w:t>2026-06-27 08:55:14</w:t>
+              <w:t>2026-06-27 11:59:04</w:t>
             </w:r>
           </w:p>
         </w:tc>
@@ -421,7 +421,7 @@
           </w:tcPr>
           <w:p>
             <w:r>
-              <w:t>90.3</w:t>
+              <w:t>90.4</w:t>
             </w:r>
           </w:p>
         </w:tc>
@@ -441,7 +441,7 @@
           </w:tcPr>
           <w:p>
             <w:r>
-              <w:t>66.7</w:t>
+              <w:t>66.8</w:t>
             </w:r>
           </w:p>
         </w:tc>
@@ -451,7 +451,7 @@
           </w:tcPr>
           <w:p>
             <w:r>
-              <w:t>19</w:t>
+              <w:t>84</w:t>
             </w:r>
           </w:p>
         </w:tc>
@@ -463,7 +463,7 @@
           </w:tcPr>
           <w:p>
             <w:r>
-              <w:t>2026-06-27 09:25:14</w:t>
+              <w:t>2026-06-27 12:29:05</w:t>
             </w:r>
           </w:p>
         </w:tc>
@@ -493,7 +493,7 @@
           </w:tcPr>
           <w:p>
             <w:r>
-              <w:t>90.3</w:t>
+              <w:t>90.4</w:t>
             </w:r>
           </w:p>
         </w:tc>
@@ -513,7 +513,7 @@
           </w:tcPr>
           <w:p>
             <w:r>
-              <w:t>66.7</w:t>
+              <w:t>66.8</w:t>
             </w:r>
           </w:p>
         </w:tc>
@@ -523,7 +523,7 @@
           </w:tcPr>
           <w:p>
             <w:r>
-              <w:t>49</w:t>
+              <w:t>114</w:t>
             </w:r>
           </w:p>
         </w:tc>
@@ -535,7 +535,7 @@
           </w:tcPr>
           <w:p>
             <w:r>
-              <w:t>2026-06-27 09:56:14</w:t>
+              <w:t>2026-06-27 12:59:50</w:t>
             </w:r>
           </w:p>
         </w:tc>
@@ -565,7 +565,7 @@
           </w:tcPr>
           <w:p>
             <w:r>
-              <w:t>90.3</w:t>
+              <w:t>90.4</w:t>
             </w:r>
           </w:p>
         </w:tc>
@@ -585,7 +585,7 @@
           </w:tcPr>
           <w:p>
             <w:r>
-              <w:t>66.7</w:t>
+              <w:t>66.8</w:t>
             </w:r>
           </w:p>
         </w:tc>
@@ -595,7 +595,7 @@
           </w:tcPr>
           <w:p>
             <w:r>
-              <w:t>80</w:t>
+              <w:t>24</w:t>
             </w:r>
           </w:p>
         </w:tc>
@@ -607,7 +607,7 @@
           </w:tcPr>
           <w:p>
             <w:r>
-              <w:t>2026-06-27 10:26:14</w:t>
+              <w:t>2026-06-27 13:29:51</w:t>
             </w:r>
           </w:p>
         </w:tc>
@@ -637,7 +637,7 @@
           </w:tcPr>
           <w:p>
             <w:r>
-              <w:t>90.3</w:t>
+              <w:t>90.4</w:t>
             </w:r>
           </w:p>
         </w:tc>
@@ -657,7 +657,7 @@
           </w:tcPr>
           <w:p>
             <w:r>
-              <w:t>66.7</w:t>
+              <w:t>66.8</w:t>
             </w:r>
           </w:p>
         </w:tc>
@@ -667,7 +667,7 @@
           </w:tcPr>
           <w:p>
             <w:r>
-              <w:t>110</w:t>
+              <w:t>54</w:t>
             </w:r>
           </w:p>
         </w:tc>
@@ -679,7 +679,7 @@
           </w:tcPr>
           <w:p>
             <w:r>
-              <w:t>2026-06-27 10:57:04</w:t>
+              <w:t>2026-06-27 14:00:11</w:t>
             </w:r>
           </w:p>
         </w:tc>
@@ -739,7 +739,7 @@
           </w:tcPr>
           <w:p>
             <w:r>
-              <w:t>22</w:t>
+              <w:t>24</w:t>
             </w:r>
           </w:p>
         </w:tc>
@@ -751,7 +751,7 @@
           </w:tcPr>
           <w:p>
             <w:r>
-              <w:t>2026-06-27 11:28:04</w:t>
+              <w:t>2026-06-27 14:30:34</w:t>
             </w:r>
           </w:p>
         </w:tc>
@@ -811,7 +811,7 @@
           </w:tcPr>
           <w:p>
             <w:r>
-              <w:t>53</w:t>
+              <w:t>9</w:t>
             </w:r>
           </w:p>
         </w:tc>
@@ -823,7 +823,7 @@
           </w:tcPr>
           <w:p>
             <w:r>
-              <w:t>2026-06-27 11:59:04</w:t>
+              <w:t>2026-06-27 15:01:01</w:t>
             </w:r>
           </w:p>
         </w:tc>
@@ -883,7 +883,7 @@
           </w:tcPr>
           <w:p>
             <w:r>
-              <w:t>84</w:t>
+              <w:t>19</w:t>
             </w:r>
           </w:p>
         </w:tc>
@@ -895,7 +895,7 @@
           </w:tcPr>
           <w:p>
             <w:r>
-              <w:t>2026-06-27 12:29:05</w:t>
+              <w:t>2026-06-27 15:31:08</w:t>
             </w:r>
           </w:p>
         </w:tc>
@@ -955,7 +955,7 @@
           </w:tcPr>
           <w:p>
             <w:r>
-              <w:t>114</w:t>
+              <w:t>4</w:t>
             </w:r>
           </w:p>
         </w:tc>
@@ -967,7 +967,7 @@
           </w:tcPr>
           <w:p>
             <w:r>
-              <w:t>2026-06-27 12:59:50</w:t>
+              <w:t>2026-06-27 16:01:38</w:t>
             </w:r>
           </w:p>
         </w:tc>
@@ -1027,7 +1027,7 @@
           </w:tcPr>
           <w:p>
             <w:r>
-              <w:t>24</w:t>
+              <w:t>65</w:t>
             </w:r>
           </w:p>
         </w:tc>
@@ -1039,7 +1039,7 @@
           </w:tcPr>
           <w:p>
             <w:r>
-              <w:t>2026-06-27 13:29:51</w:t>
+              <w:t>2026-06-27 16:32:04</w:t>
             </w:r>
           </w:p>
         </w:tc>
@@ -1099,7 +1099,7 @@
           </w:tcPr>
           <w:p>
             <w:r>
-              <w:t>54</w:t>
+              <w:t>10</w:t>
             </w:r>
           </w:p>
         </w:tc>
@@ -1111,7 +1111,7 @@
           </w:tcPr>
           <w:p>
             <w:r>
-              <w:t>2026-06-27 14:00:11</w:t>
+              <w:t>2026-06-27 16:35:03</w:t>
             </w:r>
           </w:p>
         </w:tc>
@@ -1131,7 +1131,7 @@
           </w:tcPr>
           <w:p>
             <w:r>
-              <w:t>64.8</w:t>
+              <w:t>54.8</w:t>
             </w:r>
           </w:p>
         </w:tc>
@@ -1141,7 +1141,7 @@
           </w:tcPr>
           <w:p>
             <w:r>
-              <w:t>90.4</w:t>
+              <w:t>70.4</w:t>
             </w:r>
           </w:p>
         </w:tc>
@@ -1161,7 +1161,7 @@
           </w:tcPr>
           <w:p>
             <w:r>
-              <w:t>66.8</w:t>
+              <w:t>56.8</w:t>
             </w:r>
           </w:p>
         </w:tc>
@@ -1171,7 +1171,7 @@
           </w:tcPr>
           <w:p>
             <w:r>
-              <w:t>24</w:t>
+              <w:t>16</w:t>
             </w:r>
           </w:p>
         </w:tc>
@@ -1183,7 +1183,7 @@
           </w:tcPr>
           <w:p>
             <w:r>
-              <w:t>2026-06-27 14:30:34</w:t>
+              <w:t>2026-06-27 16:46:34</w:t>
             </w:r>
           </w:p>
         </w:tc>
@@ -1193,7 +1193,7 @@
           </w:tcPr>
           <w:p>
             <w:r>
-              <w:t>86</w:t>
+              <w:t>87</w:t>
             </w:r>
           </w:p>
         </w:tc>
@@ -1203,7 +1203,7 @@
           </w:tcPr>
           <w:p>
             <w:r>
-              <w:t>64.8</w:t>
+              <w:t>52.2</w:t>
             </w:r>
           </w:p>
         </w:tc>
@@ -1213,7 +1213,7 @@
           </w:tcPr>
           <w:p>
             <w:r>
-              <w:t>90.4</w:t>
+              <w:t>70.4</w:t>
             </w:r>
           </w:p>
         </w:tc>
@@ -1233,7 +1233,7 @@
           </w:tcPr>
           <w:p>
             <w:r>
-              <w:t>66.8</w:t>
+              <w:t>55.5</w:t>
             </w:r>
           </w:p>
         </w:tc>
@@ -1243,7 +1243,7 @@
           </w:tcPr>
           <w:p>
             <w:r>
-              <w:t>9</w:t>
+              <w:t>39</w:t>
             </w:r>
           </w:p>
         </w:tc>
@@ -1255,7 +1255,7 @@
           </w:tcPr>
           <w:p>
             <w:r>
-              <w:t>2026-06-27 15:01:01</w:t>
+              <w:t>2026-06-27 17:16:34</w:t>
             </w:r>
           </w:p>
         </w:tc>
@@ -1265,7 +1265,7 @@
           </w:tcPr>
           <w:p>
             <w:r>
-              <w:t>86</w:t>
+              <w:t>87</w:t>
             </w:r>
           </w:p>
         </w:tc>
@@ -1275,7 +1275,7 @@
           </w:tcPr>
           <w:p>
             <w:r>
-              <w:t>64.8</w:t>
+              <w:t>52.2</w:t>
             </w:r>
           </w:p>
         </w:tc>
@@ -1285,7 +1285,7 @@
           </w:tcPr>
           <w:p>
             <w:r>
-              <w:t>90.4</w:t>
+              <w:t>70.4</w:t>
             </w:r>
           </w:p>
         </w:tc>
@@ -1305,7 +1305,7 @@
           </w:tcPr>
           <w:p>
             <w:r>
-              <w:t>66.8</w:t>
+              <w:t>55.5</w:t>
             </w:r>
           </w:p>
         </w:tc>
@@ -1315,7 +1315,7 @@
           </w:tcPr>
           <w:p>
             <w:r>
-              <w:t>19</w:t>
+              <w:t>99</w:t>
             </w:r>
           </w:p>
         </w:tc>
@@ -1327,7 +1327,7 @@
           </w:tcPr>
           <w:p>
             <w:r>
-              <w:t>2026-06-27 15:31:08</w:t>
+              <w:t>2026-06-27 17:46:40</w:t>
             </w:r>
           </w:p>
         </w:tc>
@@ -1337,7 +1337,7 @@
           </w:tcPr>
           <w:p>
             <w:r>
-              <w:t>86</w:t>
+              <w:t>87</w:t>
             </w:r>
           </w:p>
         </w:tc>
@@ -1347,7 +1347,7 @@
           </w:tcPr>
           <w:p>
             <w:r>
-              <w:t>64.8</w:t>
+              <w:t>52.2</w:t>
             </w:r>
           </w:p>
         </w:tc>
@@ -1357,7 +1357,7 @@
           </w:tcPr>
           <w:p>
             <w:r>
-              <w:t>90.4</w:t>
+              <w:t>70.4</w:t>
             </w:r>
           </w:p>
         </w:tc>
@@ -1377,7 +1377,7 @@
           </w:tcPr>
           <w:p>
             <w:r>
-              <w:t>66.8</w:t>
+              <w:t>55.5</w:t>
             </w:r>
           </w:p>
         </w:tc>
@@ -1387,7 +1387,7 @@
           </w:tcPr>
           <w:p>
             <w:r>
-              <w:t>4</w:t>
+              <w:t>21</w:t>
             </w:r>
           </w:p>
         </w:tc>
@@ -1399,7 +1399,7 @@
           </w:tcPr>
           <w:p>
             <w:r>
-              <w:t>2026-06-27 16:01:38</w:t>
+              <w:t>2026-06-27 17:48:10</w:t>
             </w:r>
           </w:p>
         </w:tc>
@@ -1409,7 +1409,7 @@
           </w:tcPr>
           <w:p>
             <w:r>
-              <w:t>86</w:t>
+              <w:t>88</w:t>
             </w:r>
           </w:p>
         </w:tc>
@@ -1419,7 +1419,7 @@
           </w:tcPr>
           <w:p>
             <w:r>
-              <w:t>64.8</w:t>
+              <w:t>48.8</w:t>
             </w:r>
           </w:p>
         </w:tc>
@@ -1429,7 +1429,7 @@
           </w:tcPr>
           <w:p>
             <w:r>
-              <w:t>90.4</w:t>
+              <w:t>70.4</w:t>
             </w:r>
           </w:p>
         </w:tc>
@@ -1449,7 +1449,7 @@
           </w:tcPr>
           <w:p>
             <w:r>
-              <w:t>66.8</w:t>
+              <w:t>53.8</w:t>
             </w:r>
           </w:p>
         </w:tc>
@@ -1459,7 +1459,7 @@
           </w:tcPr>
           <w:p>
             <w:r>
-              <w:t>65</w:t>
+              <w:t>24</w:t>
             </w:r>
           </w:p>
         </w:tc>
@@ -1471,7 +1471,7 @@
           </w:tcPr>
           <w:p>
             <w:r>
-              <w:t>2026-06-27 16:32:04</w:t>
+              <w:t>2026-06-27 18:18:41</w:t>
             </w:r>
           </w:p>
         </w:tc>
@@ -1481,7 +1481,7 @@
           </w:tcPr>
           <w:p>
             <w:r>
-              <w:t>86</w:t>
+              <w:t>88</w:t>
             </w:r>
           </w:p>
         </w:tc>
@@ -1491,7 +1491,7 @@
           </w:tcPr>
           <w:p>
             <w:r>
-              <w:t>64.8</w:t>
+              <w:t>48.8</w:t>
             </w:r>
           </w:p>
         </w:tc>
@@ -1501,7 +1501,7 @@
           </w:tcPr>
           <w:p>
             <w:r>
-              <w:t>90.4</w:t>
+              <w:t>70.4</w:t>
             </w:r>
           </w:p>
         </w:tc>
@@ -1521,7 +1521,7 @@
           </w:tcPr>
           <w:p>
             <w:r>
-              <w:t>66.8</w:t>
+              <w:t>53.8</w:t>
             </w:r>
           </w:p>
         </w:tc>
@@ -1531,7 +1531,7 @@
           </w:tcPr>
           <w:p>
             <w:r>
-              <w:t>10</w:t>
+              <w:t>85</w:t>
             </w:r>
           </w:p>
         </w:tc>
@@ -1543,7 +1543,7 @@
           </w:tcPr>
           <w:p>
             <w:r>
-              <w:t>2026-06-27 16:35:03</w:t>
+              <w:t>2026-06-27 18:33:10</w:t>
             </w:r>
           </w:p>
         </w:tc>
@@ -1553,7 +1553,7 @@
           </w:tcPr>
           <w:p>
             <w:r>
-              <w:t>86</w:t>
+              <w:t>89</w:t>
             </w:r>
           </w:p>
         </w:tc>
@@ -1563,7 +1563,7 @@
           </w:tcPr>
           <w:p>
             <w:r>
-              <w:t>54.8</w:t>
+              <w:t>51.7</w:t>
             </w:r>
           </w:p>
         </w:tc>
@@ -1593,7 +1593,7 @@
           </w:tcPr>
           <w:p>
             <w:r>
-              <w:t>56.8</w:t>
+              <w:t>55.2</w:t>
             </w:r>
           </w:p>
         </w:tc>
@@ -1603,7 +1603,7 @@
           </w:tcPr>
           <w:p>
             <w:r>
-              <w:t>16</w:t>
+              <w:t>114</w:t>
             </w:r>
           </w:p>
         </w:tc>
@@ -1615,7 +1615,7 @@
           </w:tcPr>
           <w:p>
             <w:r>
-              <w:t>2026-06-27 16:46:34</w:t>
+              <w:t>2026-06-27 19:03:10</w:t>
             </w:r>
           </w:p>
         </w:tc>
@@ -1625,7 +1625,7 @@
           </w:tcPr>
           <w:p>
             <w:r>
-              <w:t>87</w:t>
+              <w:t>90</w:t>
             </w:r>
           </w:p>
         </w:tc>
@@ -1635,7 +1635,7 @@
           </w:tcPr>
           <w:p>
             <w:r>
-              <w:t>52.2</w:t>
+              <w:t>48.2</w:t>
             </w:r>
           </w:p>
         </w:tc>
@@ -1665,7 +1665,7 @@
           </w:tcPr>
           <w:p>
             <w:r>
-              <w:t>55.5</w:t>
+              <w:t>53.5</w:t>
             </w:r>
           </w:p>
         </w:tc>
@@ -1675,7 +1675,7 @@
           </w:tcPr>
           <w:p>
             <w:r>
-              <w:t>39</w:t>
+              <w:t>174</w:t>
             </w:r>
           </w:p>
         </w:tc>
@@ -1687,7 +1687,7 @@
           </w:tcPr>
           <w:p>
             <w:r>
-              <w:t>2026-06-27 17:16:34</w:t>
+              <w:t>2026-06-27 19:27:06</w:t>
             </w:r>
           </w:p>
         </w:tc>
@@ -1697,7 +1697,7 @@
           </w:tcPr>
           <w:p>
             <w:r>
-              <w:t>87</w:t>
+              <w:t>90</w:t>
             </w:r>
           </w:p>
         </w:tc>
@@ -1707,7 +1707,7 @@
           </w:tcPr>
           <w:p>
             <w:r>
-              <w:t>52.2</w:t>
+              <w:t>58.2</w:t>
             </w:r>
           </w:p>
         </w:tc>
@@ -1717,7 +1717,7 @@
           </w:tcPr>
           <w:p>
             <w:r>
-              <w:t>70.4</w:t>
+              <w:t>90.4</w:t>
             </w:r>
           </w:p>
         </w:tc>
@@ -1737,7 +1737,7 @@
           </w:tcPr>
           <w:p>
             <w:r>
-              <w:t>55.5</w:t>
+              <w:t>63.5</w:t>
             </w:r>
           </w:p>
         </w:tc>
@@ -1746,9 +1746,7 @@
             <w:tcW w:type="dxa" w:w="1234"/>
           </w:tcPr>
           <w:p>
-            <w:r>
-              <w:t>99</w:t>
-            </w:r>
+            <w:r/>
           </w:p>
         </w:tc>
       </w:tr>
@@ -1768,7 +1766,7 @@
     </w:p>
     <w:p>
       <w:r>
-        <w:t>Section score: 52.2 / 100  (Grade: F)</w:t>
+        <w:t>Section score: 58.2 / 100  (Grade: F)</w:t>
       </w:r>
     </w:p>
     <w:p>
@@ -1847,7 +1845,7 @@
           </w:tcPr>
           <w:p>
             <w:r>
-              <w:t>0.0</w:t>
+              <w:t>100.0</w:t>
             </w:r>
           </w:p>
         </w:tc>
@@ -1857,7 +1855,7 @@
           </w:tcPr>
           <w:p>
             <w:r>
-              <w:t>0.0</w:t>
+              <w:t>10.0</w:t>
             </w:r>
           </w:p>
         </w:tc>
@@ -1879,7 +1877,7 @@
           </w:tcPr>
           <w:p>
             <w:r>
-              <w:t>32.6</w:t>
+              <w:t>21.1</w:t>
             </w:r>
           </w:p>
         </w:tc>
@@ -1889,7 +1887,7 @@
           </w:tcPr>
           <w:p>
             <w:r>
-              <w:t>4.9</w:t>
+              <w:t>3.2</w:t>
             </w:r>
           </w:p>
         </w:tc>
@@ -1911,7 +1909,7 @@
           </w:tcPr>
           <w:p>
             <w:r>
-              <w:t>30.5</w:t>
+              <w:t>26.5</w:t>
             </w:r>
           </w:p>
         </w:tc>
@@ -1921,7 +1919,7 @@
           </w:tcPr>
           <w:p>
             <w:r>
-              <w:t>4.6</w:t>
+              <w:t>4.0</w:t>
             </w:r>
           </w:p>
         </w:tc>
@@ -1943,7 +1941,7 @@
           </w:tcPr>
           <w:p>
             <w:r>
-              <w:t>100.0</w:t>
+              <w:t>95.2</w:t>
             </w:r>
           </w:p>
         </w:tc>
@@ -1953,7 +1951,7 @@
           </w:tcPr>
           <w:p>
             <w:r>
-              <w:t>20.0</w:t>
+              <w:t>19.1</w:t>
             </w:r>
           </w:p>
         </w:tc>
@@ -2007,7 +2005,7 @@
           </w:tcPr>
           <w:p>
             <w:r>
-              <w:t>72.7</w:t>
+              <w:t>70.6</w:t>
             </w:r>
           </w:p>
         </w:tc>
@@ -2017,7 +2015,7 @@
           </w:tcPr>
           <w:p>
             <w:r>
-              <w:t>7.3</w:t>
+              <w:t>7.1</w:t>
             </w:r>
           </w:p>
         </w:tc>
@@ -2039,7 +2037,7 @@
           </w:tcPr>
           <w:p>
             <w:r>
-              <w:t>41.8</w:t>
+              <w:t>40.0</w:t>
             </w:r>
           </w:p>
         </w:tc>
@@ -2049,7 +2047,7 @@
           </w:tcPr>
           <w:p>
             <w:r>
-              <w:t>10.5</w:t>
+              <w:t>10.0</w:t>
             </w:r>
           </w:p>
         </w:tc>
@@ -2090,7 +2088,7 @@
           </w:tcPr>
           <w:p>
             <w:r>
-              <w:t>$551.01</w:t>
+              <w:t>$545.26</w:t>
             </w:r>
           </w:p>
         </w:tc>
@@ -2112,7 +2110,7 @@
           </w:tcPr>
           <w:p>
             <w:r>
-              <w:t>10.20%</w:t>
+              <w:t>9.05%</w:t>
             </w:r>
           </w:p>
         </w:tc>
@@ -2134,7 +2132,7 @@
           </w:tcPr>
           <w:p>
             <w:r>
-              <w:t>$-8.72</w:t>
+              <w:t>$-14.47</w:t>
             </w:r>
           </w:p>
         </w:tc>
@@ -2178,7 +2176,7 @@
           </w:tcPr>
           <w:p>
             <w:r>
-              <w:t>0.6092</w:t>
+              <w:t>0.6000</w:t>
             </w:r>
           </w:p>
         </w:tc>
@@ -2200,7 +2198,7 @@
           </w:tcPr>
           <w:p>
             <w:r>
-              <w:t>0.5000 / 0.6418</w:t>
+              <w:t>0.5000 / 0.6286</w:t>
             </w:r>
           </w:p>
         </w:tc>
@@ -2222,7 +2220,7 @@
           </w:tcPr>
           <w:p>
             <w:r>
-              <w:t>0.9437</w:t>
+              <w:t>0.9123</w:t>
             </w:r>
           </w:p>
         </w:tc>
@@ -2244,7 +2242,7 @@
           </w:tcPr>
           <w:p>
             <w:r>
-              <w:t>87 / 87</w:t>
+              <w:t>90 / 90</w:t>
             </w:r>
           </w:p>
         </w:tc>
@@ -2266,7 +2264,7 @@
           </w:tcPr>
           <w:p>
             <w:r>
-              <w:t>$-0.10</w:t>
+              <w:t>$-0.16</w:t>
             </w:r>
           </w:p>
         </w:tc>
@@ -2288,7 +2286,7 @@
           </w:tcPr>
           <w:p>
             <w:r>
-              <w:t>False</w:t>
+              <w:t>True</w:t>
             </w:r>
           </w:p>
         </w:tc>
@@ -2397,7 +2395,7 @@
           </w:tcPr>
           <w:p>
             <w:r>
-              <w:t>0.620</w:t>
+              <w:t>0.640</w:t>
             </w:r>
           </w:p>
         </w:tc>
@@ -2449,7 +2447,7 @@
           </w:tcPr>
           <w:p>
             <w:r>
-              <w:t>0.550</w:t>
+              <w:t>0.540</w:t>
             </w:r>
           </w:p>
         </w:tc>
@@ -2459,7 +2457,7 @@
           </w:tcPr>
           <w:p>
             <w:r>
-              <w:t>up</w:t>
+              <w:t>down</w:t>
             </w:r>
           </w:p>
         </w:tc>
@@ -2469,7 +2467,7 @@
           </w:tcPr>
           <w:p>
             <w:r>
-              <w:t>No</w:t>
+              <w:t>Yes</w:t>
             </w:r>
           </w:p>
         </w:tc>
@@ -2479,7 +2477,7 @@
           </w:tcPr>
           <w:p>
             <w:r>
-              <w:t>$-5.00</w:t>
+              <w:t>$4.26</w:t>
             </w:r>
           </w:p>
         </w:tc>
@@ -2501,7 +2499,7 @@
           </w:tcPr>
           <w:p>
             <w:r>
-              <w:t>0.590</w:t>
+              <w:t>0.520</w:t>
             </w:r>
           </w:p>
         </w:tc>
@@ -2511,7 +2509,7 @@
           </w:tcPr>
           <w:p>
             <w:r>
-              <w:t>down</w:t>
+              <w:t>up</w:t>
             </w:r>
           </w:p>
         </w:tc>
@@ -2521,7 +2519,7 @@
           </w:tcPr>
           <w:p>
             <w:r>
-              <w:t>Yes</w:t>
+              <w:t>No</w:t>
             </w:r>
           </w:p>
         </w:tc>
@@ -2531,7 +2529,7 @@
           </w:tcPr>
           <w:p>
             <w:r>
-              <w:t>$3.47</w:t>
+              <w:t>$-5.00</w:t>
             </w:r>
           </w:p>
         </w:tc>
@@ -2553,7 +2551,7 @@
           </w:tcPr>
           <w:p>
             <w:r>
-              <w:t>0.520</w:t>
+              <w:t>0.620</w:t>
             </w:r>
           </w:p>
         </w:tc>
@@ -2563,7 +2561,7 @@
           </w:tcPr>
           <w:p>
             <w:r>
-              <w:t>down</w:t>
+              <w:t>up</w:t>
             </w:r>
           </w:p>
         </w:tc>
@@ -2573,7 +2571,7 @@
           </w:tcPr>
           <w:p>
             <w:r>
-              <w:t>Yes</w:t>
+              <w:t>No</w:t>
             </w:r>
           </w:p>
         </w:tc>
@@ -2583,7 +2581,7 @@
           </w:tcPr>
           <w:p>
             <w:r>
-              <w:t>$4.62</w:t>
+              <w:t>$-5.00</w:t>
             </w:r>
           </w:p>
         </w:tc>
@@ -2605,7 +2603,7 @@
           </w:tcPr>
           <w:p>
             <w:r>
-              <w:t>0.570</w:t>
+              <w:t>0.550</w:t>
             </w:r>
           </w:p>
         </w:tc>
@@ -2657,7 +2655,7 @@
           </w:tcPr>
           <w:p>
             <w:r>
-              <w:t>0.650</w:t>
+              <w:t>0.590</w:t>
             </w:r>
           </w:p>
         </w:tc>
@@ -2687,7 +2685,7 @@
           </w:tcPr>
           <w:p>
             <w:r>
-              <w:t>$2.69</w:t>
+              <w:t>$3.47</w:t>
             </w:r>
           </w:p>
         </w:tc>
@@ -2709,7 +2707,7 @@
           </w:tcPr>
           <w:p>
             <w:r>
-              <w:t>0.690</w:t>
+              <w:t>0.520</w:t>
             </w:r>
           </w:p>
         </w:tc>
@@ -2719,7 +2717,7 @@
           </w:tcPr>
           <w:p>
             <w:r>
-              <w:t>up</w:t>
+              <w:t>down</w:t>
             </w:r>
           </w:p>
         </w:tc>
@@ -2729,7 +2727,7 @@
           </w:tcPr>
           <w:p>
             <w:r>
-              <w:t>No</w:t>
+              <w:t>Yes</w:t>
             </w:r>
           </w:p>
         </w:tc>
@@ -2739,7 +2737,7 @@
           </w:tcPr>
           <w:p>
             <w:r>
-              <w:t>$-5.00</w:t>
+              <w:t>$4.62</w:t>
             </w:r>
           </w:p>
         </w:tc>
@@ -2813,7 +2811,7 @@
           </w:tcPr>
           <w:p>
             <w:r>
-              <w:t>0.600</w:t>
+              <w:t>0.650</w:t>
             </w:r>
           </w:p>
         </w:tc>
@@ -2823,7 +2821,7 @@
           </w:tcPr>
           <w:p>
             <w:r>
-              <w:t>up</w:t>
+              <w:t>down</w:t>
             </w:r>
           </w:p>
         </w:tc>
@@ -2833,7 +2831,7 @@
           </w:tcPr>
           <w:p>
             <w:r>
-              <w:t>No</w:t>
+              <w:t>Yes</w:t>
             </w:r>
           </w:p>
         </w:tc>
@@ -2843,7 +2841,7 @@
           </w:tcPr>
           <w:p>
             <w:r>
-              <w:t>$-5.00</w:t>
+              <w:t>$2.69</w:t>
             </w:r>
           </w:p>
         </w:tc>
@@ -2865,7 +2863,7 @@
           </w:tcPr>
           <w:p>
             <w:r>
-              <w:t>0.563</w:t>
+              <w:t>0.690</w:t>
             </w:r>
           </w:p>
         </w:tc>
@@ -2917,7 +2915,7 @@
           </w:tcPr>
           <w:p>
             <w:r>
-              <w:t>0.670</w:t>
+              <w:t>0.570</w:t>
             </w:r>
           </w:p>
         </w:tc>
@@ -2969,7 +2967,7 @@
           </w:tcPr>
           <w:p>
             <w:r>
-              <w:t>0.690</w:t>
+              <w:t>0.600</w:t>
             </w:r>
           </w:p>
         </w:tc>
@@ -2979,7 +2977,7 @@
           </w:tcPr>
           <w:p>
             <w:r>
-              <w:t>down</w:t>
+              <w:t>up</w:t>
             </w:r>
           </w:p>
         </w:tc>
@@ -2989,7 +2987,7 @@
           </w:tcPr>
           <w:p>
             <w:r>
-              <w:t>Yes</w:t>
+              <w:t>No</w:t>
             </w:r>
           </w:p>
         </w:tc>
@@ -2999,7 +2997,7 @@
           </w:tcPr>
           <w:p>
             <w:r>
-              <w:t>$2.25</w:t>
+              <w:t>$-5.00</w:t>
             </w:r>
           </w:p>
         </w:tc>
@@ -3021,7 +3019,7 @@
           </w:tcPr>
           <w:p>
             <w:r>
-              <w:t>0.550</w:t>
+              <w:t>0.563</w:t>
             </w:r>
           </w:p>
         </w:tc>
@@ -3031,7 +3029,7 @@
           </w:tcPr>
           <w:p>
             <w:r>
-              <w:t>down</w:t>
+              <w:t>up</w:t>
             </w:r>
           </w:p>
         </w:tc>
@@ -3041,7 +3039,7 @@
           </w:tcPr>
           <w:p>
             <w:r>
-              <w:t>Yes</w:t>
+              <w:t>No</w:t>
             </w:r>
           </w:p>
         </w:tc>
@@ -3051,7 +3049,7 @@
           </w:tcPr>
           <w:p>
             <w:r>
-              <w:t>$4.09</w:t>
+              <w:t>$-5.00</w:t>
             </w:r>
           </w:p>
         </w:tc>
@@ -3073,7 +3071,7 @@
           </w:tcPr>
           <w:p>
             <w:r>
-              <w:t>0.650</w:t>
+              <w:t>0.670</w:t>
             </w:r>
           </w:p>
         </w:tc>
@@ -3125,7 +3123,7 @@
           </w:tcPr>
           <w:p>
             <w:r>
-              <w:t>0.700</w:t>
+              <w:t>0.690</w:t>
             </w:r>
           </w:p>
         </w:tc>
@@ -3135,7 +3133,7 @@
           </w:tcPr>
           <w:p>
             <w:r>
-              <w:t>up</w:t>
+              <w:t>down</w:t>
             </w:r>
           </w:p>
         </w:tc>
@@ -3145,7 +3143,7 @@
           </w:tcPr>
           <w:p>
             <w:r>
-              <w:t>No</w:t>
+              <w:t>Yes</w:t>
             </w:r>
           </w:p>
         </w:tc>
@@ -3155,7 +3153,7 @@
           </w:tcPr>
           <w:p>
             <w:r>
-              <w:t>$-5.00</w:t>
+              <w:t>$2.25</w:t>
             </w:r>
           </w:p>
         </w:tc>
@@ -3176,7 +3174,7 @@
     </w:p>
     <w:p>
       <w:r>
-        <w:t>Section score: 70.4 / 100  (Grade: C)</w:t>
+        <w:t>Section score: 90.4 / 100  (Grade: A)</w:t>
       </w:r>
     </w:p>
     <w:p>
@@ -3255,7 +3253,7 @@
           </w:tcPr>
           <w:p>
             <w:r>
-              <w:t>0.0</w:t>
+              <w:t>100.0</w:t>
             </w:r>
           </w:p>
         </w:tc>
@@ -3265,7 +3263,7 @@
           </w:tcPr>
           <w:p>
             <w:r>
-              <w:t>0.0</w:t>
+              <w:t>20.0</w:t>
             </w:r>
           </w:p>
         </w:tc>
@@ -3433,17 +3431,17 @@
     </w:tbl>
     <w:p>
       <w:r>
-        <w:t>Ticks: 133 · Reconciled: False · Readiness: not_ready</w:t>
+        <w:t>Ticks: 3 · Reconciled: True · Readiness: not_ready</w:t>
       </w:r>
     </w:p>
     <w:p>
       <w:r>
-        <w:t>Candidates created: 49152 · Terminals: {'accepted': 86, 'rejected': 41681, 'skipped': 7159, 'expired': 0, 'missing_data': 226}</w:t>
+        <w:t>Candidates created: 49330 · Terminals: {'accepted': 86, 'rejected': 41850, 'skipped': 7166, 'expired': 0, 'missing_data': 228}</w:t>
       </w:r>
     </w:p>
     <w:p>
       <w:r>
-        <w:t>Rejected by stage: {'directional': 31691, 'execution_gate': 156, 'context_gate': 879, 'directional_allowlist': 1364, 'down_bias_gate': 538, 'mtf_gate': 276, 'grok_decider': 3540, 'execution_realistic': 3, 'verifier': 61, 'mispricing_gate': 50, 'baseline_cohort_gate': 3123}</w:t>
+        <w:t>Rejected by stage: {'directional': 31849, 'execution_gate': 156, 'context_gate': 879, 'directional_allowlist': 1364, 'down_bias_gate': 538, 'mtf_gate': 276, 'grok_decider': 3540, 'execution_realistic': 3, 'verifier': 61, 'mispricing_gate': 50, 'baseline_cohort_gate': 3134}</w:t>
       </w:r>
     </w:p>
     <w:p>
@@ -4374,7 +4372,7 @@
           </w:tcPr>
           <w:p>
             <w:r>
-              <w:t>0.4167</w:t>
+              <w:t>0.4182</w:t>
             </w:r>
           </w:p>
         </w:tc>
@@ -4396,7 +4394,7 @@
           </w:tcPr>
           <w:p>
             <w:r>
-              <w:t>0.4893</w:t>
+              <w:t>0.4894</w:t>
             </w:r>
           </w:p>
         </w:tc>
@@ -4426,7 +4424,7 @@
     </w:tbl>
     <w:p>
       <w:r>
-        <w:t>TV alerts: received 535 · valid 518 · rejected 17</w:t>
+        <w:t>TV alerts: received 574 · valid 557 · rejected 17</w:t>
       </w:r>
     </w:p>
     <w:sectPr>

</xml_diff>

<commit_message>
chore(reports): VPS full report 2026-06-27 23:42 UTC (93 settled, WR 60.2%, PF 0.941, grade C)
</commit_message>
<xml_diff>
--- a/vps_full_reports/latest/report.docx
+++ b/vps_full_reports/latest/report.docx
@@ -20,7 +20,7 @@
           <w:color w:val="666666"/>
           <w:sz w:val="20"/>
         </w:rPr>
-        <w:t>PAPER ONLY  ·  reconciled=False  ·  ticks=488</w:t>
+        <w:t>PAPER ONLY  ·  reconciled=True  ·  ticks=4</w:t>
       </w:r>
     </w:p>
     <w:p>
@@ -33,7 +33,7 @@
     </w:p>
     <w:p>
       <w:r>
-        <w:t>Overall score: 54.9 / 100  (Grade: F)</w:t>
+        <w:t>Overall score: 64.9 / 100  (Grade: D)</w:t>
       </w:r>
     </w:p>
     <w:tbl>
@@ -107,7 +107,7 @@
           </w:tcPr>
           <w:p>
             <w:r>
-              <w:t>51.1</w:t>
+              <w:t>61.1</w:t>
             </w:r>
           </w:p>
         </w:tc>
@@ -117,7 +117,7 @@
           </w:tcPr>
           <w:p>
             <w:r>
-              <w:t>F</w:t>
+              <w:t>D</w:t>
             </w:r>
           </w:p>
         </w:tc>
@@ -149,7 +149,7 @@
           </w:tcPr>
           <w:p>
             <w:r>
-              <w:t>70.4</w:t>
+              <w:t>90.4</w:t>
             </w:r>
           </w:p>
         </w:tc>
@@ -159,7 +159,7 @@
           </w:tcPr>
           <w:p>
             <w:r>
-              <w:t>C</w:t>
+              <w:t>A</w:t>
             </w:r>
           </w:p>
         </w:tc>
@@ -319,7 +319,7 @@
           </w:tcPr>
           <w:p>
             <w:r>
-              <w:t>2026-06-27 17:16:34</w:t>
+              <w:t>2026-06-27 17:46:40</w:t>
             </w:r>
           </w:p>
         </w:tc>
@@ -379,7 +379,7 @@
           </w:tcPr>
           <w:p>
             <w:r>
-              <w:t>99</w:t>
+              <w:t>21</w:t>
             </w:r>
           </w:p>
         </w:tc>
@@ -391,7 +391,7 @@
           </w:tcPr>
           <w:p>
             <w:r>
-              <w:t>2026-06-27 17:46:40</w:t>
+              <w:t>2026-06-27 17:48:10</w:t>
             </w:r>
           </w:p>
         </w:tc>
@@ -401,7 +401,7 @@
           </w:tcPr>
           <w:p>
             <w:r>
-              <w:t>87</w:t>
+              <w:t>88</w:t>
             </w:r>
           </w:p>
         </w:tc>
@@ -411,7 +411,7 @@
           </w:tcPr>
           <w:p>
             <w:r>
-              <w:t>52.2</w:t>
+              <w:t>48.8</w:t>
             </w:r>
           </w:p>
         </w:tc>
@@ -441,7 +441,7 @@
           </w:tcPr>
           <w:p>
             <w:r>
-              <w:t>55.5</w:t>
+              <w:t>53.8</w:t>
             </w:r>
           </w:p>
         </w:tc>
@@ -451,7 +451,7 @@
           </w:tcPr>
           <w:p>
             <w:r>
-              <w:t>21</w:t>
+              <w:t>24</w:t>
             </w:r>
           </w:p>
         </w:tc>
@@ -463,7 +463,7 @@
           </w:tcPr>
           <w:p>
             <w:r>
-              <w:t>2026-06-27 17:48:10</w:t>
+              <w:t>2026-06-27 18:18:41</w:t>
             </w:r>
           </w:p>
         </w:tc>
@@ -523,7 +523,7 @@
           </w:tcPr>
           <w:p>
             <w:r>
-              <w:t>24</w:t>
+              <w:t>85</w:t>
             </w:r>
           </w:p>
         </w:tc>
@@ -535,7 +535,7 @@
           </w:tcPr>
           <w:p>
             <w:r>
-              <w:t>2026-06-27 18:18:41</w:t>
+              <w:t>2026-06-27 18:33:10</w:t>
             </w:r>
           </w:p>
         </w:tc>
@@ -545,7 +545,7 @@
           </w:tcPr>
           <w:p>
             <w:r>
-              <w:t>88</w:t>
+              <w:t>89</w:t>
             </w:r>
           </w:p>
         </w:tc>
@@ -555,7 +555,7 @@
           </w:tcPr>
           <w:p>
             <w:r>
-              <w:t>48.8</w:t>
+              <w:t>51.7</w:t>
             </w:r>
           </w:p>
         </w:tc>
@@ -585,7 +585,7 @@
           </w:tcPr>
           <w:p>
             <w:r>
-              <w:t>53.8</w:t>
+              <w:t>55.2</w:t>
             </w:r>
           </w:p>
         </w:tc>
@@ -595,7 +595,7 @@
           </w:tcPr>
           <w:p>
             <w:r>
-              <w:t>85</w:t>
+              <w:t>114</w:t>
             </w:r>
           </w:p>
         </w:tc>
@@ -607,7 +607,7 @@
           </w:tcPr>
           <w:p>
             <w:r>
-              <w:t>2026-06-27 18:33:10</w:t>
+              <w:t>2026-06-27 19:03:10</w:t>
             </w:r>
           </w:p>
         </w:tc>
@@ -617,7 +617,7 @@
           </w:tcPr>
           <w:p>
             <w:r>
-              <w:t>89</w:t>
+              <w:t>90</w:t>
             </w:r>
           </w:p>
         </w:tc>
@@ -627,7 +627,7 @@
           </w:tcPr>
           <w:p>
             <w:r>
-              <w:t>51.7</w:t>
+              <w:t>48.2</w:t>
             </w:r>
           </w:p>
         </w:tc>
@@ -657,7 +657,7 @@
           </w:tcPr>
           <w:p>
             <w:r>
-              <w:t>55.2</w:t>
+              <w:t>53.5</w:t>
             </w:r>
           </w:p>
         </w:tc>
@@ -667,7 +667,7 @@
           </w:tcPr>
           <w:p>
             <w:r>
-              <w:t>114</w:t>
+              <w:t>174</w:t>
             </w:r>
           </w:p>
         </w:tc>
@@ -679,7 +679,7 @@
           </w:tcPr>
           <w:p>
             <w:r>
-              <w:t>2026-06-27 19:03:10</w:t>
+              <w:t>2026-06-27 19:27:06</w:t>
             </w:r>
           </w:p>
         </w:tc>
@@ -699,7 +699,7 @@
           </w:tcPr>
           <w:p>
             <w:r>
-              <w:t>48.2</w:t>
+              <w:t>58.2</w:t>
             </w:r>
           </w:p>
         </w:tc>
@@ -709,7 +709,7 @@
           </w:tcPr>
           <w:p>
             <w:r>
-              <w:t>70.4</w:t>
+              <w:t>90.4</w:t>
             </w:r>
           </w:p>
         </w:tc>
@@ -729,7 +729,7 @@
           </w:tcPr>
           <w:p>
             <w:r>
-              <w:t>53.5</w:t>
+              <w:t>63.5</w:t>
             </w:r>
           </w:p>
         </w:tc>
@@ -738,9 +738,7 @@
             <w:tcW w:type="dxa" w:w="1234"/>
           </w:tcPr>
           <w:p>
-            <w:r>
-              <w:t>174</w:t>
-            </w:r>
+            <w:r/>
           </w:p>
         </w:tc>
       </w:tr>
@@ -751,7 +749,7 @@
           </w:tcPr>
           <w:p>
             <w:r>
-              <w:t>2026-06-27 19:27:06</w:t>
+              <w:t>2026-06-27 19:57:28</w:t>
             </w:r>
           </w:p>
         </w:tc>
@@ -810,7 +808,9 @@
             <w:tcW w:type="dxa" w:w="1234"/>
           </w:tcPr>
           <w:p>
-            <w:r/>
+            <w:r>
+              <w:t>36</w:t>
+            </w:r>
           </w:p>
         </w:tc>
       </w:tr>
@@ -821,7 +821,7 @@
           </w:tcPr>
           <w:p>
             <w:r>
-              <w:t>2026-06-27 19:57:28</w:t>
+              <w:t>2026-06-27 20:27:30</w:t>
             </w:r>
           </w:p>
         </w:tc>
@@ -881,7 +881,7 @@
           </w:tcPr>
           <w:p>
             <w:r>
-              <w:t>36</w:t>
+              <w:t>64</w:t>
             </w:r>
           </w:p>
         </w:tc>
@@ -893,7 +893,7 @@
           </w:tcPr>
           <w:p>
             <w:r>
-              <w:t>2026-06-27 20:27:30</w:t>
+              <w:t>2026-06-27 20:57:30</w:t>
             </w:r>
           </w:p>
         </w:tc>
@@ -953,7 +953,7 @@
           </w:tcPr>
           <w:p>
             <w:r>
-              <w:t>64</w:t>
+              <w:t>184</w:t>
             </w:r>
           </w:p>
         </w:tc>
@@ -965,7 +965,7 @@
           </w:tcPr>
           <w:p>
             <w:r>
-              <w:t>2026-06-27 20:57:30</w:t>
+              <w:t>2026-06-27 21:19:20</w:t>
             </w:r>
           </w:p>
         </w:tc>
@@ -985,7 +985,7 @@
           </w:tcPr>
           <w:p>
             <w:r>
-              <w:t>58.2</w:t>
+              <w:t>48.2</w:t>
             </w:r>
           </w:p>
         </w:tc>
@@ -995,7 +995,7 @@
           </w:tcPr>
           <w:p>
             <w:r>
-              <w:t>90.4</w:t>
+              <w:t>70.4</w:t>
             </w:r>
           </w:p>
         </w:tc>
@@ -1015,7 +1015,7 @@
           </w:tcPr>
           <w:p>
             <w:r>
-              <w:t>63.5</w:t>
+              <w:t>53.5</w:t>
             </w:r>
           </w:p>
         </w:tc>
@@ -1025,7 +1025,7 @@
           </w:tcPr>
           <w:p>
             <w:r>
-              <w:t>184</w:t>
+              <w:t>31</w:t>
             </w:r>
           </w:p>
         </w:tc>
@@ -1037,7 +1037,7 @@
           </w:tcPr>
           <w:p>
             <w:r>
-              <w:t>2026-06-27 21:19:20</w:t>
+              <w:t>2026-06-27 21:32:40</w:t>
             </w:r>
           </w:p>
         </w:tc>
@@ -1057,7 +1057,7 @@
           </w:tcPr>
           <w:p>
             <w:r>
-              <w:t>48.2</w:t>
+              <w:t>58.2</w:t>
             </w:r>
           </w:p>
         </w:tc>
@@ -1067,7 +1067,7 @@
           </w:tcPr>
           <w:p>
             <w:r>
-              <w:t>70.4</w:t>
+              <w:t>90.4</w:t>
             </w:r>
           </w:p>
         </w:tc>
@@ -1087,7 +1087,7 @@
           </w:tcPr>
           <w:p>
             <w:r>
-              <w:t>53.5</w:t>
+              <w:t>63.5</w:t>
             </w:r>
           </w:p>
         </w:tc>
@@ -1096,9 +1096,7 @@
             <w:tcW w:type="dxa" w:w="1234"/>
           </w:tcPr>
           <w:p>
-            <w:r>
-              <w:t>31</w:t>
-            </w:r>
+            <w:r/>
           </w:p>
         </w:tc>
       </w:tr>
@@ -1109,7 +1107,7 @@
           </w:tcPr>
           <w:p>
             <w:r>
-              <w:t>2026-06-27 21:32:40</w:t>
+              <w:t>2026-06-27 21:33:10</w:t>
             </w:r>
           </w:p>
         </w:tc>
@@ -1119,7 +1117,7 @@
           </w:tcPr>
           <w:p>
             <w:r>
-              <w:t>90</w:t>
+              <w:t>91</w:t>
             </w:r>
           </w:p>
         </w:tc>
@@ -1129,7 +1127,7 @@
           </w:tcPr>
           <w:p>
             <w:r>
-              <w:t>58.2</w:t>
+              <w:t>54.8</w:t>
             </w:r>
           </w:p>
         </w:tc>
@@ -1159,7 +1157,7 @@
           </w:tcPr>
           <w:p>
             <w:r>
-              <w:t>63.5</w:t>
+              <w:t>61.8</w:t>
             </w:r>
           </w:p>
         </w:tc>
@@ -1168,7 +1166,9 @@
             <w:tcW w:type="dxa" w:w="1234"/>
           </w:tcPr>
           <w:p>
-            <w:r/>
+            <w:r>
+              <w:t>3</w:t>
+            </w:r>
           </w:p>
         </w:tc>
       </w:tr>
@@ -1179,7 +1179,7 @@
           </w:tcPr>
           <w:p>
             <w:r>
-              <w:t>2026-06-27 21:33:10</w:t>
+              <w:t>2026-06-27 21:33:25</w:t>
             </w:r>
           </w:p>
         </w:tc>
@@ -1209,7 +1209,7 @@
           </w:tcPr>
           <w:p>
             <w:r>
-              <w:t>90.4</w:t>
+              <w:t>75.4</w:t>
             </w:r>
           </w:p>
         </w:tc>
@@ -1229,7 +1229,7 @@
           </w:tcPr>
           <w:p>
             <w:r>
-              <w:t>61.8</w:t>
+              <w:t>58.0</w:t>
             </w:r>
           </w:p>
         </w:tc>
@@ -1239,7 +1239,7 @@
           </w:tcPr>
           <w:p>
             <w:r>
-              <w:t>3</w:t>
+              <w:t>4</w:t>
             </w:r>
           </w:p>
         </w:tc>
@@ -1251,7 +1251,7 @@
           </w:tcPr>
           <w:p>
             <w:r>
-              <w:t>2026-06-27 21:33:25</w:t>
+              <w:t>2026-06-27 21:35:54</w:t>
             </w:r>
           </w:p>
         </w:tc>
@@ -1281,7 +1281,7 @@
           </w:tcPr>
           <w:p>
             <w:r>
-              <w:t>75.4</w:t>
+              <w:t>90.4</w:t>
             </w:r>
           </w:p>
         </w:tc>
@@ -1301,7 +1301,7 @@
           </w:tcPr>
           <w:p>
             <w:r>
-              <w:t>58.0</w:t>
+              <w:t>61.8</w:t>
             </w:r>
           </w:p>
         </w:tc>
@@ -1311,7 +1311,7 @@
           </w:tcPr>
           <w:p>
             <w:r>
-              <w:t>4</w:t>
+              <w:t>1</w:t>
             </w:r>
           </w:p>
         </w:tc>
@@ -1323,7 +1323,7 @@
           </w:tcPr>
           <w:p>
             <w:r>
-              <w:t>2026-06-27 21:35:54</w:t>
+              <w:t>2026-06-27 21:50:54</w:t>
             </w:r>
           </w:p>
         </w:tc>
@@ -1343,7 +1343,7 @@
           </w:tcPr>
           <w:p>
             <w:r>
-              <w:t>54.8</w:t>
+              <w:t>44.8</w:t>
             </w:r>
           </w:p>
         </w:tc>
@@ -1353,7 +1353,7 @@
           </w:tcPr>
           <w:p>
             <w:r>
-              <w:t>90.4</w:t>
+              <w:t>70.4</w:t>
             </w:r>
           </w:p>
         </w:tc>
@@ -1373,7 +1373,7 @@
           </w:tcPr>
           <w:p>
             <w:r>
-              <w:t>61.8</w:t>
+              <w:t>51.8</w:t>
             </w:r>
           </w:p>
         </w:tc>
@@ -1383,7 +1383,7 @@
           </w:tcPr>
           <w:p>
             <w:r>
-              <w:t>1</w:t>
+              <w:t>55</w:t>
             </w:r>
           </w:p>
         </w:tc>
@@ -1395,7 +1395,7 @@
           </w:tcPr>
           <w:p>
             <w:r>
-              <w:t>2026-06-27 21:50:54</w:t>
+              <w:t>2026-06-27 22:03:10</w:t>
             </w:r>
           </w:p>
         </w:tc>
@@ -1405,7 +1405,7 @@
           </w:tcPr>
           <w:p>
             <w:r>
-              <w:t>91</w:t>
+              <w:t>92</w:t>
             </w:r>
           </w:p>
         </w:tc>
@@ -1415,7 +1415,7 @@
           </w:tcPr>
           <w:p>
             <w:r>
-              <w:t>44.8</w:t>
+              <w:t>48.1</w:t>
             </w:r>
           </w:p>
         </w:tc>
@@ -1445,7 +1445,7 @@
           </w:tcPr>
           <w:p>
             <w:r>
-              <w:t>51.8</w:t>
+              <w:t>53.4</w:t>
             </w:r>
           </w:p>
         </w:tc>
@@ -1455,7 +1455,7 @@
           </w:tcPr>
           <w:p>
             <w:r>
-              <w:t>55</w:t>
+              <w:t>104</w:t>
             </w:r>
           </w:p>
         </w:tc>
@@ -1467,7 +1467,7 @@
           </w:tcPr>
           <w:p>
             <w:r>
-              <w:t>2026-06-27 22:03:10</w:t>
+              <w:t>2026-06-27 22:33:25</w:t>
             </w:r>
           </w:p>
         </w:tc>
@@ -1527,7 +1527,7 @@
           </w:tcPr>
           <w:p>
             <w:r>
-              <w:t>104</w:t>
+              <w:t>225</w:t>
             </w:r>
           </w:p>
         </w:tc>
@@ -1539,7 +1539,7 @@
           </w:tcPr>
           <w:p>
             <w:r>
-              <w:t>2026-06-27 22:33:25</w:t>
+              <w:t>2026-06-27 23:03:40</w:t>
             </w:r>
           </w:p>
         </w:tc>
@@ -1599,7 +1599,7 @@
           </w:tcPr>
           <w:p>
             <w:r>
-              <w:t>225</w:t>
+              <w:t>346</w:t>
             </w:r>
           </w:p>
         </w:tc>
@@ -1611,7 +1611,7 @@
           </w:tcPr>
           <w:p>
             <w:r>
-              <w:t>2026-06-27 23:03:40</w:t>
+              <w:t>2026-06-27 23:30:10</w:t>
             </w:r>
           </w:p>
         </w:tc>
@@ -1621,7 +1621,7 @@
           </w:tcPr>
           <w:p>
             <w:r>
-              <w:t>92</w:t>
+              <w:t>93</w:t>
             </w:r>
           </w:p>
         </w:tc>
@@ -1631,7 +1631,7 @@
           </w:tcPr>
           <w:p>
             <w:r>
-              <w:t>48.1</w:t>
+              <w:t>51.1</w:t>
             </w:r>
           </w:p>
         </w:tc>
@@ -1661,7 +1661,7 @@
           </w:tcPr>
           <w:p>
             <w:r>
-              <w:t>53.4</w:t>
+              <w:t>54.9</w:t>
             </w:r>
           </w:p>
         </w:tc>
@@ -1671,7 +1671,7 @@
           </w:tcPr>
           <w:p>
             <w:r>
-              <w:t>346</w:t>
+              <w:t>452</w:t>
             </w:r>
           </w:p>
         </w:tc>
@@ -1683,7 +1683,7 @@
           </w:tcPr>
           <w:p>
             <w:r>
-              <w:t>2026-06-27 23:30:10</w:t>
+              <w:t>2026-06-27 23:39:44</w:t>
             </w:r>
           </w:p>
         </w:tc>
@@ -1703,7 +1703,7 @@
           </w:tcPr>
           <w:p>
             <w:r>
-              <w:t>51.1</w:t>
+              <w:t>61.1</w:t>
             </w:r>
           </w:p>
         </w:tc>
@@ -1713,7 +1713,7 @@
           </w:tcPr>
           <w:p>
             <w:r>
-              <w:t>70.4</w:t>
+              <w:t>90.4</w:t>
             </w:r>
           </w:p>
         </w:tc>
@@ -1733,7 +1733,7 @@
           </w:tcPr>
           <w:p>
             <w:r>
-              <w:t>54.9</w:t>
+              <w:t>64.9</w:t>
             </w:r>
           </w:p>
         </w:tc>
@@ -1742,9 +1742,7 @@
             <w:tcW w:type="dxa" w:w="1234"/>
           </w:tcPr>
           <w:p>
-            <w:r>
-              <w:t>452</w:t>
-            </w:r>
+            <w:r/>
           </w:p>
         </w:tc>
       </w:tr>
@@ -1764,7 +1762,7 @@
     </w:p>
     <w:p>
       <w:r>
-        <w:t>Section score: 51.1 / 100  (Grade: F)</w:t>
+        <w:t>Section score: 61.1 / 100  (Grade: D)</w:t>
       </w:r>
     </w:p>
     <w:p>
@@ -1843,7 +1841,7 @@
           </w:tcPr>
           <w:p>
             <w:r>
-              <w:t>0.0</w:t>
+              <w:t>100.0</w:t>
             </w:r>
           </w:p>
         </w:tc>
@@ -1853,7 +1851,7 @@
           </w:tcPr>
           <w:p>
             <w:r>
-              <w:t>0.0</w:t>
+              <w:t>10.0</w:t>
             </w:r>
           </w:p>
         </w:tc>
@@ -2284,7 +2282,7 @@
           </w:tcPr>
           <w:p>
             <w:r>
-              <w:t>False</w:t>
+              <w:t>True</w:t>
             </w:r>
           </w:p>
         </w:tc>
@@ -3172,7 +3170,7 @@
     </w:p>
     <w:p>
       <w:r>
-        <w:t>Section score: 70.4 / 100  (Grade: C)</w:t>
+        <w:t>Section score: 90.4 / 100  (Grade: A)</w:t>
       </w:r>
     </w:p>
     <w:p>
@@ -3251,7 +3249,7 @@
           </w:tcPr>
           <w:p>
             <w:r>
-              <w:t>0.0</w:t>
+              <w:t>100.0</w:t>
             </w:r>
           </w:p>
         </w:tc>
@@ -3261,7 +3259,7 @@
           </w:tcPr>
           <w:p>
             <w:r>
-              <w:t>0.0</w:t>
+              <w:t>20.0</w:t>
             </w:r>
           </w:p>
         </w:tc>
@@ -3429,17 +3427,17 @@
     </w:tbl>
     <w:p>
       <w:r>
-        <w:t>Ticks: 488 · Reconciled: False · Readiness: not_ready</w:t>
+        <w:t>Ticks: 4 · Reconciled: True · Readiness: not_ready</w:t>
       </w:r>
     </w:p>
     <w:p>
       <w:r>
-        <w:t>Candidates created: 50117 · Terminals: {'accepted': 86, 'rejected': 42570, 'skipped': 7222, 'expired': 0, 'missing_data': 239}</w:t>
+        <w:t>Candidates created: 50139 · Terminals: {'accepted': 86, 'rejected': 42579, 'skipped': 7231, 'expired': 0, 'missing_data': 243}</w:t>
       </w:r>
     </w:p>
     <w:p>
       <w:r>
-        <w:t>Rejected by stage: {'directional': 32481, 'execution_gate': 171, 'context_gate': 879, 'directional_allowlist': 1364, 'down_bias_gate': 538, 'mtf_gate': 276, 'grok_decider': 3540, 'execution_realistic': 3, 'verifier': 61, 'mispricing_gate': 50, 'baseline_cohort_gate': 3207}</w:t>
+        <w:t>Rejected by stage: {'directional': 32490, 'execution_gate': 171, 'context_gate': 879, 'directional_allowlist': 1364, 'down_bias_gate': 538, 'mtf_gate': 276, 'grok_decider': 3540, 'execution_realistic': 3, 'verifier': 61, 'mispricing_gate': 50, 'baseline_cohort_gate': 3207}</w:t>
       </w:r>
     </w:p>
     <w:p>

</xml_diff>

<commit_message>
chore(reports): VPS full report 2026-06-28 02:34 UTC (97 settled, WR 60.8%, PF 0.9807, grade C)
</commit_message>
<xml_diff>
--- a/vps_full_reports/latest/report.docx
+++ b/vps_full_reports/latest/report.docx
@@ -20,7 +20,7 @@
           <w:color w:val="666666"/>
           <w:sz w:val="20"/>
         </w:rPr>
-        <w:t>PAPER ONLY  ·  reconciled=True  ·  ticks=4</w:t>
+        <w:t>PAPER ONLY  ·  reconciled=True  ·  ticks=1</w:t>
       </w:r>
     </w:p>
     <w:p>
@@ -33,7 +33,7 @@
     </w:p>
     <w:p>
       <w:r>
-        <w:t>Overall score: 64.9 / 100  (Grade: D)</w:t>
+        <w:t>Overall score: 66.7 / 100  (Grade: D)</w:t>
       </w:r>
     </w:p>
     <w:tbl>
@@ -107,7 +107,7 @@
           </w:tcPr>
           <w:p>
             <w:r>
-              <w:t>61.1</w:t>
+              <w:t>64.3</w:t>
             </w:r>
           </w:p>
         </w:tc>
@@ -149,7 +149,7 @@
           </w:tcPr>
           <w:p>
             <w:r>
-              <w:t>90.4</w:t>
+              <w:t>91.0</w:t>
             </w:r>
           </w:p>
         </w:tc>
@@ -319,7 +319,7 @@
           </w:tcPr>
           <w:p>
             <w:r>
-              <w:t>2026-06-27 17:46:40</w:t>
+              <w:t>2026-06-27 20:27:30</w:t>
             </w:r>
           </w:p>
         </w:tc>
@@ -329,7 +329,7 @@
           </w:tcPr>
           <w:p>
             <w:r>
-              <w:t>87</w:t>
+              <w:t>90</w:t>
             </w:r>
           </w:p>
         </w:tc>
@@ -339,7 +339,7 @@
           </w:tcPr>
           <w:p>
             <w:r>
-              <w:t>52.2</w:t>
+              <w:t>58.2</w:t>
             </w:r>
           </w:p>
         </w:tc>
@@ -349,7 +349,7 @@
           </w:tcPr>
           <w:p>
             <w:r>
-              <w:t>70.4</w:t>
+              <w:t>90.4</w:t>
             </w:r>
           </w:p>
         </w:tc>
@@ -369,7 +369,7 @@
           </w:tcPr>
           <w:p>
             <w:r>
-              <w:t>55.5</w:t>
+              <w:t>63.5</w:t>
             </w:r>
           </w:p>
         </w:tc>
@@ -379,7 +379,7 @@
           </w:tcPr>
           <w:p>
             <w:r>
-              <w:t>21</w:t>
+              <w:t>64</w:t>
             </w:r>
           </w:p>
         </w:tc>
@@ -391,7 +391,7 @@
           </w:tcPr>
           <w:p>
             <w:r>
-              <w:t>2026-06-27 17:48:10</w:t>
+              <w:t>2026-06-27 20:57:30</w:t>
             </w:r>
           </w:p>
         </w:tc>
@@ -401,7 +401,7 @@
           </w:tcPr>
           <w:p>
             <w:r>
-              <w:t>88</w:t>
+              <w:t>90</w:t>
             </w:r>
           </w:p>
         </w:tc>
@@ -411,7 +411,7 @@
           </w:tcPr>
           <w:p>
             <w:r>
-              <w:t>48.8</w:t>
+              <w:t>58.2</w:t>
             </w:r>
           </w:p>
         </w:tc>
@@ -421,7 +421,7 @@
           </w:tcPr>
           <w:p>
             <w:r>
-              <w:t>70.4</w:t>
+              <w:t>90.4</w:t>
             </w:r>
           </w:p>
         </w:tc>
@@ -441,7 +441,7 @@
           </w:tcPr>
           <w:p>
             <w:r>
-              <w:t>53.8</w:t>
+              <w:t>63.5</w:t>
             </w:r>
           </w:p>
         </w:tc>
@@ -451,7 +451,7 @@
           </w:tcPr>
           <w:p>
             <w:r>
-              <w:t>24</w:t>
+              <w:t>184</w:t>
             </w:r>
           </w:p>
         </w:tc>
@@ -463,7 +463,7 @@
           </w:tcPr>
           <w:p>
             <w:r>
-              <w:t>2026-06-27 18:18:41</w:t>
+              <w:t>2026-06-27 21:19:20</w:t>
             </w:r>
           </w:p>
         </w:tc>
@@ -473,7 +473,7 @@
           </w:tcPr>
           <w:p>
             <w:r>
-              <w:t>88</w:t>
+              <w:t>90</w:t>
             </w:r>
           </w:p>
         </w:tc>
@@ -483,7 +483,7 @@
           </w:tcPr>
           <w:p>
             <w:r>
-              <w:t>48.8</w:t>
+              <w:t>48.2</w:t>
             </w:r>
           </w:p>
         </w:tc>
@@ -513,7 +513,7 @@
           </w:tcPr>
           <w:p>
             <w:r>
-              <w:t>53.8</w:t>
+              <w:t>53.5</w:t>
             </w:r>
           </w:p>
         </w:tc>
@@ -523,7 +523,7 @@
           </w:tcPr>
           <w:p>
             <w:r>
-              <w:t>85</w:t>
+              <w:t>31</w:t>
             </w:r>
           </w:p>
         </w:tc>
@@ -535,7 +535,7 @@
           </w:tcPr>
           <w:p>
             <w:r>
-              <w:t>2026-06-27 18:33:10</w:t>
+              <w:t>2026-06-27 21:32:40</w:t>
             </w:r>
           </w:p>
         </w:tc>
@@ -545,7 +545,7 @@
           </w:tcPr>
           <w:p>
             <w:r>
-              <w:t>89</w:t>
+              <w:t>90</w:t>
             </w:r>
           </w:p>
         </w:tc>
@@ -555,7 +555,7 @@
           </w:tcPr>
           <w:p>
             <w:r>
-              <w:t>51.7</w:t>
+              <w:t>58.2</w:t>
             </w:r>
           </w:p>
         </w:tc>
@@ -565,7 +565,7 @@
           </w:tcPr>
           <w:p>
             <w:r>
-              <w:t>70.4</w:t>
+              <w:t>90.4</w:t>
             </w:r>
           </w:p>
         </w:tc>
@@ -585,7 +585,7 @@
           </w:tcPr>
           <w:p>
             <w:r>
-              <w:t>55.2</w:t>
+              <w:t>63.5</w:t>
             </w:r>
           </w:p>
         </w:tc>
@@ -594,9 +594,7 @@
             <w:tcW w:type="dxa" w:w="1234"/>
           </w:tcPr>
           <w:p>
-            <w:r>
-              <w:t>114</w:t>
-            </w:r>
+            <w:r/>
           </w:p>
         </w:tc>
       </w:tr>
@@ -607,7 +605,7 @@
           </w:tcPr>
           <w:p>
             <w:r>
-              <w:t>2026-06-27 19:03:10</w:t>
+              <w:t>2026-06-27 21:33:10</w:t>
             </w:r>
           </w:p>
         </w:tc>
@@ -617,7 +615,7 @@
           </w:tcPr>
           <w:p>
             <w:r>
-              <w:t>90</w:t>
+              <w:t>91</w:t>
             </w:r>
           </w:p>
         </w:tc>
@@ -627,7 +625,7 @@
           </w:tcPr>
           <w:p>
             <w:r>
-              <w:t>48.2</w:t>
+              <w:t>54.8</w:t>
             </w:r>
           </w:p>
         </w:tc>
@@ -637,7 +635,7 @@
           </w:tcPr>
           <w:p>
             <w:r>
-              <w:t>70.4</w:t>
+              <w:t>90.4</w:t>
             </w:r>
           </w:p>
         </w:tc>
@@ -657,7 +655,7 @@
           </w:tcPr>
           <w:p>
             <w:r>
-              <w:t>53.5</w:t>
+              <w:t>61.8</w:t>
             </w:r>
           </w:p>
         </w:tc>
@@ -667,7 +665,7 @@
           </w:tcPr>
           <w:p>
             <w:r>
-              <w:t>174</w:t>
+              <w:t>3</w:t>
             </w:r>
           </w:p>
         </w:tc>
@@ -679,7 +677,7 @@
           </w:tcPr>
           <w:p>
             <w:r>
-              <w:t>2026-06-27 19:27:06</w:t>
+              <w:t>2026-06-27 21:33:25</w:t>
             </w:r>
           </w:p>
         </w:tc>
@@ -689,7 +687,7 @@
           </w:tcPr>
           <w:p>
             <w:r>
-              <w:t>90</w:t>
+              <w:t>91</w:t>
             </w:r>
           </w:p>
         </w:tc>
@@ -699,7 +697,7 @@
           </w:tcPr>
           <w:p>
             <w:r>
-              <w:t>58.2</w:t>
+              <w:t>54.8</w:t>
             </w:r>
           </w:p>
         </w:tc>
@@ -709,7 +707,7 @@
           </w:tcPr>
           <w:p>
             <w:r>
-              <w:t>90.4</w:t>
+              <w:t>75.4</w:t>
             </w:r>
           </w:p>
         </w:tc>
@@ -729,7 +727,7 @@
           </w:tcPr>
           <w:p>
             <w:r>
-              <w:t>63.5</w:t>
+              <w:t>58.0</w:t>
             </w:r>
           </w:p>
         </w:tc>
@@ -738,7 +736,9 @@
             <w:tcW w:type="dxa" w:w="1234"/>
           </w:tcPr>
           <w:p>
-            <w:r/>
+            <w:r>
+              <w:t>4</w:t>
+            </w:r>
           </w:p>
         </w:tc>
       </w:tr>
@@ -749,7 +749,7 @@
           </w:tcPr>
           <w:p>
             <w:r>
-              <w:t>2026-06-27 19:57:28</w:t>
+              <w:t>2026-06-27 21:35:54</w:t>
             </w:r>
           </w:p>
         </w:tc>
@@ -759,7 +759,7 @@
           </w:tcPr>
           <w:p>
             <w:r>
-              <w:t>90</w:t>
+              <w:t>91</w:t>
             </w:r>
           </w:p>
         </w:tc>
@@ -769,7 +769,7 @@
           </w:tcPr>
           <w:p>
             <w:r>
-              <w:t>58.2</w:t>
+              <w:t>54.8</w:t>
             </w:r>
           </w:p>
         </w:tc>
@@ -799,7 +799,7 @@
           </w:tcPr>
           <w:p>
             <w:r>
-              <w:t>63.5</w:t>
+              <w:t>61.8</w:t>
             </w:r>
           </w:p>
         </w:tc>
@@ -809,7 +809,7 @@
           </w:tcPr>
           <w:p>
             <w:r>
-              <w:t>36</w:t>
+              <w:t>1</w:t>
             </w:r>
           </w:p>
         </w:tc>
@@ -821,7 +821,7 @@
           </w:tcPr>
           <w:p>
             <w:r>
-              <w:t>2026-06-27 20:27:30</w:t>
+              <w:t>2026-06-27 21:50:54</w:t>
             </w:r>
           </w:p>
         </w:tc>
@@ -831,7 +831,7 @@
           </w:tcPr>
           <w:p>
             <w:r>
-              <w:t>90</w:t>
+              <w:t>91</w:t>
             </w:r>
           </w:p>
         </w:tc>
@@ -841,7 +841,7 @@
           </w:tcPr>
           <w:p>
             <w:r>
-              <w:t>58.2</w:t>
+              <w:t>44.8</w:t>
             </w:r>
           </w:p>
         </w:tc>
@@ -851,7 +851,7 @@
           </w:tcPr>
           <w:p>
             <w:r>
-              <w:t>90.4</w:t>
+              <w:t>70.4</w:t>
             </w:r>
           </w:p>
         </w:tc>
@@ -871,7 +871,7 @@
           </w:tcPr>
           <w:p>
             <w:r>
-              <w:t>63.5</w:t>
+              <w:t>51.8</w:t>
             </w:r>
           </w:p>
         </w:tc>
@@ -881,7 +881,7 @@
           </w:tcPr>
           <w:p>
             <w:r>
-              <w:t>64</w:t>
+              <w:t>55</w:t>
             </w:r>
           </w:p>
         </w:tc>
@@ -893,7 +893,7 @@
           </w:tcPr>
           <w:p>
             <w:r>
-              <w:t>2026-06-27 20:57:30</w:t>
+              <w:t>2026-06-27 22:03:10</w:t>
             </w:r>
           </w:p>
         </w:tc>
@@ -903,7 +903,7 @@
           </w:tcPr>
           <w:p>
             <w:r>
-              <w:t>90</w:t>
+              <w:t>92</w:t>
             </w:r>
           </w:p>
         </w:tc>
@@ -913,7 +913,7 @@
           </w:tcPr>
           <w:p>
             <w:r>
-              <w:t>58.2</w:t>
+              <w:t>48.1</w:t>
             </w:r>
           </w:p>
         </w:tc>
@@ -923,7 +923,7 @@
           </w:tcPr>
           <w:p>
             <w:r>
-              <w:t>90.4</w:t>
+              <w:t>70.4</w:t>
             </w:r>
           </w:p>
         </w:tc>
@@ -943,7 +943,7 @@
           </w:tcPr>
           <w:p>
             <w:r>
-              <w:t>63.5</w:t>
+              <w:t>53.4</w:t>
             </w:r>
           </w:p>
         </w:tc>
@@ -953,7 +953,7 @@
           </w:tcPr>
           <w:p>
             <w:r>
-              <w:t>184</w:t>
+              <w:t>104</w:t>
             </w:r>
           </w:p>
         </w:tc>
@@ -965,7 +965,7 @@
           </w:tcPr>
           <w:p>
             <w:r>
-              <w:t>2026-06-27 21:19:20</w:t>
+              <w:t>2026-06-27 22:33:25</w:t>
             </w:r>
           </w:p>
         </w:tc>
@@ -975,7 +975,7 @@
           </w:tcPr>
           <w:p>
             <w:r>
-              <w:t>90</w:t>
+              <w:t>92</w:t>
             </w:r>
           </w:p>
         </w:tc>
@@ -985,7 +985,7 @@
           </w:tcPr>
           <w:p>
             <w:r>
-              <w:t>48.2</w:t>
+              <w:t>48.1</w:t>
             </w:r>
           </w:p>
         </w:tc>
@@ -1015,7 +1015,7 @@
           </w:tcPr>
           <w:p>
             <w:r>
-              <w:t>53.5</w:t>
+              <w:t>53.4</w:t>
             </w:r>
           </w:p>
         </w:tc>
@@ -1025,7 +1025,7 @@
           </w:tcPr>
           <w:p>
             <w:r>
-              <w:t>31</w:t>
+              <w:t>225</w:t>
             </w:r>
           </w:p>
         </w:tc>
@@ -1037,7 +1037,7 @@
           </w:tcPr>
           <w:p>
             <w:r>
-              <w:t>2026-06-27 21:32:40</w:t>
+              <w:t>2026-06-27 23:03:40</w:t>
             </w:r>
           </w:p>
         </w:tc>
@@ -1047,7 +1047,7 @@
           </w:tcPr>
           <w:p>
             <w:r>
-              <w:t>90</w:t>
+              <w:t>92</w:t>
             </w:r>
           </w:p>
         </w:tc>
@@ -1057,7 +1057,7 @@
           </w:tcPr>
           <w:p>
             <w:r>
-              <w:t>58.2</w:t>
+              <w:t>48.1</w:t>
             </w:r>
           </w:p>
         </w:tc>
@@ -1067,7 +1067,7 @@
           </w:tcPr>
           <w:p>
             <w:r>
-              <w:t>90.4</w:t>
+              <w:t>70.4</w:t>
             </w:r>
           </w:p>
         </w:tc>
@@ -1087,7 +1087,7 @@
           </w:tcPr>
           <w:p>
             <w:r>
-              <w:t>63.5</w:t>
+              <w:t>53.4</w:t>
             </w:r>
           </w:p>
         </w:tc>
@@ -1096,7 +1096,9 @@
             <w:tcW w:type="dxa" w:w="1234"/>
           </w:tcPr>
           <w:p>
-            <w:r/>
+            <w:r>
+              <w:t>346</w:t>
+            </w:r>
           </w:p>
         </w:tc>
       </w:tr>
@@ -1107,7 +1109,7 @@
           </w:tcPr>
           <w:p>
             <w:r>
-              <w:t>2026-06-27 21:33:10</w:t>
+              <w:t>2026-06-27 23:30:10</w:t>
             </w:r>
           </w:p>
         </w:tc>
@@ -1117,7 +1119,7 @@
           </w:tcPr>
           <w:p>
             <w:r>
-              <w:t>91</w:t>
+              <w:t>93</w:t>
             </w:r>
           </w:p>
         </w:tc>
@@ -1127,7 +1129,7 @@
           </w:tcPr>
           <w:p>
             <w:r>
-              <w:t>54.8</w:t>
+              <w:t>51.1</w:t>
             </w:r>
           </w:p>
         </w:tc>
@@ -1137,7 +1139,7 @@
           </w:tcPr>
           <w:p>
             <w:r>
-              <w:t>90.4</w:t>
+              <w:t>70.4</w:t>
             </w:r>
           </w:p>
         </w:tc>
@@ -1157,7 +1159,7 @@
           </w:tcPr>
           <w:p>
             <w:r>
-              <w:t>61.8</w:t>
+              <w:t>54.9</w:t>
             </w:r>
           </w:p>
         </w:tc>
@@ -1167,7 +1169,7 @@
           </w:tcPr>
           <w:p>
             <w:r>
-              <w:t>3</w:t>
+              <w:t>452</w:t>
             </w:r>
           </w:p>
         </w:tc>
@@ -1179,7 +1181,7 @@
           </w:tcPr>
           <w:p>
             <w:r>
-              <w:t>2026-06-27 21:33:25</w:t>
+              <w:t>2026-06-27 23:39:44</w:t>
             </w:r>
           </w:p>
         </w:tc>
@@ -1189,7 +1191,7 @@
           </w:tcPr>
           <w:p>
             <w:r>
-              <w:t>91</w:t>
+              <w:t>93</w:t>
             </w:r>
           </w:p>
         </w:tc>
@@ -1199,7 +1201,7 @@
           </w:tcPr>
           <w:p>
             <w:r>
-              <w:t>54.8</w:t>
+              <w:t>61.1</w:t>
             </w:r>
           </w:p>
         </w:tc>
@@ -1209,7 +1211,7 @@
           </w:tcPr>
           <w:p>
             <w:r>
-              <w:t>75.4</w:t>
+              <w:t>90.4</w:t>
             </w:r>
           </w:p>
         </w:tc>
@@ -1229,7 +1231,7 @@
           </w:tcPr>
           <w:p>
             <w:r>
-              <w:t>58.0</w:t>
+              <w:t>64.9</w:t>
             </w:r>
           </w:p>
         </w:tc>
@@ -1238,9 +1240,7 @@
             <w:tcW w:type="dxa" w:w="1234"/>
           </w:tcPr>
           <w:p>
-            <w:r>
-              <w:t>4</w:t>
-            </w:r>
+            <w:r/>
           </w:p>
         </w:tc>
       </w:tr>
@@ -1251,7 +1251,7 @@
           </w:tcPr>
           <w:p>
             <w:r>
-              <w:t>2026-06-27 21:35:54</w:t>
+              <w:t>2026-06-28 00:03:03</w:t>
             </w:r>
           </w:p>
         </w:tc>
@@ -1261,7 +1261,7 @@
           </w:tcPr>
           <w:p>
             <w:r>
-              <w:t>91</w:t>
+              <w:t>94</w:t>
             </w:r>
           </w:p>
         </w:tc>
@@ -1271,7 +1271,7 @@
           </w:tcPr>
           <w:p>
             <w:r>
-              <w:t>54.8</w:t>
+              <w:t>63.2</w:t>
             </w:r>
           </w:p>
         </w:tc>
@@ -1301,7 +1301,7 @@
           </w:tcPr>
           <w:p>
             <w:r>
-              <w:t>61.8</w:t>
+              <w:t>66.0</w:t>
             </w:r>
           </w:p>
         </w:tc>
@@ -1311,7 +1311,7 @@
           </w:tcPr>
           <w:p>
             <w:r>
-              <w:t>1</w:t>
+              <w:t>75</w:t>
             </w:r>
           </w:p>
         </w:tc>
@@ -1323,7 +1323,7 @@
           </w:tcPr>
           <w:p>
             <w:r>
-              <w:t>2026-06-27 21:50:54</w:t>
+              <w:t>2026-06-28 00:33:04</w:t>
             </w:r>
           </w:p>
         </w:tc>
@@ -1333,7 +1333,7 @@
           </w:tcPr>
           <w:p>
             <w:r>
-              <w:t>91</w:t>
+              <w:t>94</w:t>
             </w:r>
           </w:p>
         </w:tc>
@@ -1343,7 +1343,7 @@
           </w:tcPr>
           <w:p>
             <w:r>
-              <w:t>44.8</w:t>
+              <w:t>63.2</w:t>
             </w:r>
           </w:p>
         </w:tc>
@@ -1353,7 +1353,7 @@
           </w:tcPr>
           <w:p>
             <w:r>
-              <w:t>70.4</w:t>
+              <w:t>90.4</w:t>
             </w:r>
           </w:p>
         </w:tc>
@@ -1373,7 +1373,7 @@
           </w:tcPr>
           <w:p>
             <w:r>
-              <w:t>51.8</w:t>
+              <w:t>66.0</w:t>
             </w:r>
           </w:p>
         </w:tc>
@@ -1383,7 +1383,7 @@
           </w:tcPr>
           <w:p>
             <w:r>
-              <w:t>55</w:t>
+              <w:t>195</w:t>
             </w:r>
           </w:p>
         </w:tc>
@@ -1395,7 +1395,7 @@
           </w:tcPr>
           <w:p>
             <w:r>
-              <w:t>2026-06-27 22:03:10</w:t>
+              <w:t>2026-06-28 00:48:03</w:t>
             </w:r>
           </w:p>
         </w:tc>
@@ -1405,7 +1405,7 @@
           </w:tcPr>
           <w:p>
             <w:r>
-              <w:t>92</w:t>
+              <w:t>95</w:t>
             </w:r>
           </w:p>
         </w:tc>
@@ -1415,7 +1415,7 @@
           </w:tcPr>
           <w:p>
             <w:r>
-              <w:t>48.1</w:t>
+              <w:t>60.5</w:t>
             </w:r>
           </w:p>
         </w:tc>
@@ -1425,7 +1425,7 @@
           </w:tcPr>
           <w:p>
             <w:r>
-              <w:t>70.4</w:t>
+              <w:t>90.4</w:t>
             </w:r>
           </w:p>
         </w:tc>
@@ -1445,7 +1445,7 @@
           </w:tcPr>
           <w:p>
             <w:r>
-              <w:t>53.4</w:t>
+              <w:t>64.6</w:t>
             </w:r>
           </w:p>
         </w:tc>
@@ -1455,7 +1455,7 @@
           </w:tcPr>
           <w:p>
             <w:r>
-              <w:t>104</w:t>
+              <w:t>255</w:t>
             </w:r>
           </w:p>
         </w:tc>
@@ -1467,7 +1467,7 @@
           </w:tcPr>
           <w:p>
             <w:r>
-              <w:t>2026-06-27 22:33:25</w:t>
+              <w:t>2026-06-28 01:03:04</w:t>
             </w:r>
           </w:p>
         </w:tc>
@@ -1477,7 +1477,7 @@
           </w:tcPr>
           <w:p>
             <w:r>
-              <w:t>92</w:t>
+              <w:t>96</w:t>
             </w:r>
           </w:p>
         </w:tc>
@@ -1487,7 +1487,7 @@
           </w:tcPr>
           <w:p>
             <w:r>
-              <w:t>48.1</w:t>
+              <w:t>62.7</w:t>
             </w:r>
           </w:p>
         </w:tc>
@@ -1497,7 +1497,7 @@
           </w:tcPr>
           <w:p>
             <w:r>
-              <w:t>70.4</w:t>
+              <w:t>90.4</w:t>
             </w:r>
           </w:p>
         </w:tc>
@@ -1517,7 +1517,7 @@
           </w:tcPr>
           <w:p>
             <w:r>
-              <w:t>53.4</w:t>
+              <w:t>65.7</w:t>
             </w:r>
           </w:p>
         </w:tc>
@@ -1527,7 +1527,7 @@
           </w:tcPr>
           <w:p>
             <w:r>
-              <w:t>225</w:t>
+              <w:t>315</w:t>
             </w:r>
           </w:p>
         </w:tc>
@@ -1539,7 +1539,7 @@
           </w:tcPr>
           <w:p>
             <w:r>
-              <w:t>2026-06-27 23:03:40</w:t>
+              <w:t>2026-06-28 01:33:15</w:t>
             </w:r>
           </w:p>
         </w:tc>
@@ -1549,7 +1549,7 @@
           </w:tcPr>
           <w:p>
             <w:r>
-              <w:t>92</w:t>
+              <w:t>96</w:t>
             </w:r>
           </w:p>
         </w:tc>
@@ -1559,7 +1559,7 @@
           </w:tcPr>
           <w:p>
             <w:r>
-              <w:t>48.1</w:t>
+              <w:t>62.7</w:t>
             </w:r>
           </w:p>
         </w:tc>
@@ -1569,7 +1569,7 @@
           </w:tcPr>
           <w:p>
             <w:r>
-              <w:t>70.4</w:t>
+              <w:t>90.4</w:t>
             </w:r>
           </w:p>
         </w:tc>
@@ -1589,7 +1589,7 @@
           </w:tcPr>
           <w:p>
             <w:r>
-              <w:t>53.4</w:t>
+              <w:t>65.7</w:t>
             </w:r>
           </w:p>
         </w:tc>
@@ -1599,7 +1599,7 @@
           </w:tcPr>
           <w:p>
             <w:r>
-              <w:t>346</w:t>
+              <w:t>51</w:t>
             </w:r>
           </w:p>
         </w:tc>
@@ -1611,7 +1611,7 @@
           </w:tcPr>
           <w:p>
             <w:r>
-              <w:t>2026-06-27 23:30:10</w:t>
+              <w:t>2026-06-28 02:02:51</w:t>
             </w:r>
           </w:p>
         </w:tc>
@@ -1621,7 +1621,7 @@
           </w:tcPr>
           <w:p>
             <w:r>
-              <w:t>93</w:t>
+              <w:t>97</w:t>
             </w:r>
           </w:p>
         </w:tc>
@@ -1631,7 +1631,7 @@
           </w:tcPr>
           <w:p>
             <w:r>
-              <w:t>51.1</w:t>
+              <w:t>64.3</w:t>
             </w:r>
           </w:p>
         </w:tc>
@@ -1641,7 +1641,7 @@
           </w:tcPr>
           <w:p>
             <w:r>
-              <w:t>70.4</w:t>
+              <w:t>90.4</w:t>
             </w:r>
           </w:p>
         </w:tc>
@@ -1661,7 +1661,7 @@
           </w:tcPr>
           <w:p>
             <w:r>
-              <w:t>54.9</w:t>
+              <w:t>66.5</w:t>
             </w:r>
           </w:p>
         </w:tc>
@@ -1671,7 +1671,7 @@
           </w:tcPr>
           <w:p>
             <w:r>
-              <w:t>452</w:t>
+              <w:t>91</w:t>
             </w:r>
           </w:p>
         </w:tc>
@@ -1683,7 +1683,7 @@
           </w:tcPr>
           <w:p>
             <w:r>
-              <w:t>2026-06-27 23:39:44</w:t>
+              <w:t>2026-06-28 02:33:06</w:t>
             </w:r>
           </w:p>
         </w:tc>
@@ -1693,7 +1693,7 @@
           </w:tcPr>
           <w:p>
             <w:r>
-              <w:t>93</w:t>
+              <w:t>97</w:t>
             </w:r>
           </w:p>
         </w:tc>
@@ -1703,7 +1703,7 @@
           </w:tcPr>
           <w:p>
             <w:r>
-              <w:t>61.1</w:t>
+              <w:t>64.3</w:t>
             </w:r>
           </w:p>
         </w:tc>
@@ -1733,7 +1733,7 @@
           </w:tcPr>
           <w:p>
             <w:r>
-              <w:t>64.9</w:t>
+              <w:t>66.5</w:t>
             </w:r>
           </w:p>
         </w:tc>
@@ -1742,7 +1742,9 @@
             <w:tcW w:type="dxa" w:w="1234"/>
           </w:tcPr>
           <w:p>
-            <w:r/>
+            <w:r>
+              <w:t>3</w:t>
+            </w:r>
           </w:p>
         </w:tc>
       </w:tr>
@@ -1762,7 +1764,7 @@
     </w:p>
     <w:p>
       <w:r>
-        <w:t>Section score: 61.1 / 100  (Grade: D)</w:t>
+        <w:t>Section score: 64.3 / 100  (Grade: D)</w:t>
       </w:r>
     </w:p>
     <w:p>
@@ -1873,7 +1875,7 @@
           </w:tcPr>
           <w:p>
             <w:r>
-              <w:t>29.9</w:t>
+              <w:t>43.2</w:t>
             </w:r>
           </w:p>
         </w:tc>
@@ -1883,7 +1885,7 @@
           </w:tcPr>
           <w:p>
             <w:r>
-              <w:t>4.5</w:t>
+              <w:t>6.5</w:t>
             </w:r>
           </w:p>
         </w:tc>
@@ -1905,7 +1907,7 @@
           </w:tcPr>
           <w:p>
             <w:r>
-              <w:t>30.1</w:t>
+              <w:t>35.1</w:t>
             </w:r>
           </w:p>
         </w:tc>
@@ -1915,7 +1917,7 @@
           </w:tcPr>
           <w:p>
             <w:r>
-              <w:t>4.5</w:t>
+              <w:t>5.3</w:t>
             </w:r>
           </w:p>
         </w:tc>
@@ -1937,7 +1939,7 @@
           </w:tcPr>
           <w:p>
             <w:r>
-              <w:t>99.7</w:t>
+              <w:t>100.0</w:t>
             </w:r>
           </w:p>
         </w:tc>
@@ -1947,7 +1949,7 @@
           </w:tcPr>
           <w:p>
             <w:r>
-              <w:t>19.9</w:t>
+              <w:t>20.0</w:t>
             </w:r>
           </w:p>
         </w:tc>
@@ -2001,7 +2003,7 @@
           </w:tcPr>
           <w:p>
             <w:r>
-              <w:t>70.8</w:t>
+              <w:t>71.8</w:t>
             </w:r>
           </w:p>
         </w:tc>
@@ -2011,7 +2013,7 @@
           </w:tcPr>
           <w:p>
             <w:r>
-              <w:t>7.1</w:t>
+              <w:t>7.2</w:t>
             </w:r>
           </w:p>
         </w:tc>
@@ -2033,7 +2035,7 @@
           </w:tcPr>
           <w:p>
             <w:r>
-              <w:t>40.4</w:t>
+              <w:t>41.6</w:t>
             </w:r>
           </w:p>
         </w:tc>
@@ -2043,7 +2045,7 @@
           </w:tcPr>
           <w:p>
             <w:r>
-              <w:t>10.1</w:t>
+              <w:t>10.4</w:t>
             </w:r>
           </w:p>
         </w:tc>
@@ -2084,7 +2086,7 @@
           </w:tcPr>
           <w:p>
             <w:r>
-              <w:t>$549.70</w:t>
+              <w:t>$576.78</w:t>
             </w:r>
           </w:p>
         </w:tc>
@@ -2106,7 +2108,7 @@
           </w:tcPr>
           <w:p>
             <w:r>
-              <w:t>9.94%</w:t>
+              <w:t>15.36%</w:t>
             </w:r>
           </w:p>
         </w:tc>
@@ -2128,7 +2130,7 @@
           </w:tcPr>
           <w:p>
             <w:r>
-              <w:t>$-10.03</w:t>
+              <w:t>$-3.38</w:t>
             </w:r>
           </w:p>
         </w:tc>
@@ -2172,7 +2174,7 @@
           </w:tcPr>
           <w:p>
             <w:r>
-              <w:t>0.6022</w:t>
+              <w:t>0.6082</w:t>
             </w:r>
           </w:p>
         </w:tc>
@@ -2194,7 +2196,7 @@
           </w:tcPr>
           <w:p>
             <w:r>
-              <w:t>0.5000 / 0.6301</w:t>
+              <w:t>0.5000 / 0.6364</w:t>
             </w:r>
           </w:p>
         </w:tc>
@@ -2216,7 +2218,7 @@
           </w:tcPr>
           <w:p>
             <w:r>
-              <w:t>0.9410</w:t>
+              <w:t>0.9807</w:t>
             </w:r>
           </w:p>
         </w:tc>
@@ -2238,7 +2240,7 @@
           </w:tcPr>
           <w:p>
             <w:r>
-              <w:t>93 / 93</w:t>
+              <w:t>97 / 97</w:t>
             </w:r>
           </w:p>
         </w:tc>
@@ -2260,7 +2262,7 @@
           </w:tcPr>
           <w:p>
             <w:r>
-              <w:t>$-0.11</w:t>
+              <w:t>$-0.03</w:t>
             </w:r>
           </w:p>
         </w:tc>
@@ -2391,7 +2393,7 @@
           </w:tcPr>
           <w:p>
             <w:r>
-              <w:t>0.530</w:t>
+              <w:t>0.590</w:t>
             </w:r>
           </w:p>
         </w:tc>
@@ -2421,7 +2423,7 @@
           </w:tcPr>
           <w:p>
             <w:r>
-              <w:t>$4.43</w:t>
+              <w:t>$3.47</w:t>
             </w:r>
           </w:p>
         </w:tc>
@@ -2443,7 +2445,7 @@
           </w:tcPr>
           <w:p>
             <w:r>
-              <w:t>0.500</w:t>
+              <w:t>0.550</w:t>
             </w:r>
           </w:p>
         </w:tc>
@@ -2473,7 +2475,7 @@
           </w:tcPr>
           <w:p>
             <w:r>
-              <w:t>$5.00</w:t>
+              <w:t>$4.09</w:t>
             </w:r>
           </w:p>
         </w:tc>
@@ -2495,7 +2497,7 @@
           </w:tcPr>
           <w:p>
             <w:r>
-              <w:t>0.640</w:t>
+              <w:t>0.632</w:t>
             </w:r>
           </w:p>
         </w:tc>
@@ -2547,7 +2549,7 @@
           </w:tcPr>
           <w:p>
             <w:r>
-              <w:t>0.640</w:t>
+              <w:t>0.550</w:t>
             </w:r>
           </w:p>
         </w:tc>
@@ -2557,7 +2559,7 @@
           </w:tcPr>
           <w:p>
             <w:r>
-              <w:t>up</w:t>
+              <w:t>down</w:t>
             </w:r>
           </w:p>
         </w:tc>
@@ -2567,7 +2569,7 @@
           </w:tcPr>
           <w:p>
             <w:r>
-              <w:t>No</w:t>
+              <w:t>Yes</w:t>
             </w:r>
           </w:p>
         </w:tc>
@@ -2577,7 +2579,7 @@
           </w:tcPr>
           <w:p>
             <w:r>
-              <w:t>$-5.00</w:t>
+              <w:t>$4.09</w:t>
             </w:r>
           </w:p>
         </w:tc>
@@ -2599,7 +2601,7 @@
           </w:tcPr>
           <w:p>
             <w:r>
-              <w:t>0.540</w:t>
+              <w:t>0.530</w:t>
             </w:r>
           </w:p>
         </w:tc>
@@ -2629,7 +2631,7 @@
           </w:tcPr>
           <w:p>
             <w:r>
-              <w:t>$4.26</w:t>
+              <w:t>$4.43</w:t>
             </w:r>
           </w:p>
         </w:tc>
@@ -2651,7 +2653,7 @@
           </w:tcPr>
           <w:p>
             <w:r>
-              <w:t>0.520</w:t>
+              <w:t>0.500</w:t>
             </w:r>
           </w:p>
         </w:tc>
@@ -2661,7 +2663,7 @@
           </w:tcPr>
           <w:p>
             <w:r>
-              <w:t>up</w:t>
+              <w:t>down</w:t>
             </w:r>
           </w:p>
         </w:tc>
@@ -2671,7 +2673,7 @@
           </w:tcPr>
           <w:p>
             <w:r>
-              <w:t>No</w:t>
+              <w:t>Yes</w:t>
             </w:r>
           </w:p>
         </w:tc>
@@ -2681,7 +2683,7 @@
           </w:tcPr>
           <w:p>
             <w:r>
-              <w:t>$-5.00</w:t>
+              <w:t>$5.00</w:t>
             </w:r>
           </w:p>
         </w:tc>
@@ -2703,7 +2705,7 @@
           </w:tcPr>
           <w:p>
             <w:r>
-              <w:t>0.620</w:t>
+              <w:t>0.640</w:t>
             </w:r>
           </w:p>
         </w:tc>
@@ -2755,7 +2757,7 @@
           </w:tcPr>
           <w:p>
             <w:r>
-              <w:t>0.550</w:t>
+              <w:t>0.640</w:t>
             </w:r>
           </w:p>
         </w:tc>
@@ -2807,7 +2809,7 @@
           </w:tcPr>
           <w:p>
             <w:r>
-              <w:t>0.590</w:t>
+              <w:t>0.540</w:t>
             </w:r>
           </w:p>
         </w:tc>
@@ -2837,7 +2839,7 @@
           </w:tcPr>
           <w:p>
             <w:r>
-              <w:t>$3.47</w:t>
+              <w:t>$4.26</w:t>
             </w:r>
           </w:p>
         </w:tc>
@@ -2869,7 +2871,7 @@
           </w:tcPr>
           <w:p>
             <w:r>
-              <w:t>down</w:t>
+              <w:t>up</w:t>
             </w:r>
           </w:p>
         </w:tc>
@@ -2879,7 +2881,7 @@
           </w:tcPr>
           <w:p>
             <w:r>
-              <w:t>Yes</w:t>
+              <w:t>No</w:t>
             </w:r>
           </w:p>
         </w:tc>
@@ -2889,7 +2891,7 @@
           </w:tcPr>
           <w:p>
             <w:r>
-              <w:t>$4.62</w:t>
+              <w:t>$-5.00</w:t>
             </w:r>
           </w:p>
         </w:tc>
@@ -2911,7 +2913,7 @@
           </w:tcPr>
           <w:p>
             <w:r>
-              <w:t>0.570</w:t>
+              <w:t>0.620</w:t>
             </w:r>
           </w:p>
         </w:tc>
@@ -2963,7 +2965,7 @@
           </w:tcPr>
           <w:p>
             <w:r>
-              <w:t>0.650</w:t>
+              <w:t>0.550</w:t>
             </w:r>
           </w:p>
         </w:tc>
@@ -2973,7 +2975,7 @@
           </w:tcPr>
           <w:p>
             <w:r>
-              <w:t>down</w:t>
+              <w:t>up</w:t>
             </w:r>
           </w:p>
         </w:tc>
@@ -2983,7 +2985,7 @@
           </w:tcPr>
           <w:p>
             <w:r>
-              <w:t>Yes</w:t>
+              <w:t>No</w:t>
             </w:r>
           </w:p>
         </w:tc>
@@ -2993,7 +2995,7 @@
           </w:tcPr>
           <w:p>
             <w:r>
-              <w:t>$2.69</w:t>
+              <w:t>$-5.00</w:t>
             </w:r>
           </w:p>
         </w:tc>
@@ -3015,7 +3017,7 @@
           </w:tcPr>
           <w:p>
             <w:r>
-              <w:t>0.690</w:t>
+              <w:t>0.590</w:t>
             </w:r>
           </w:p>
         </w:tc>
@@ -3025,7 +3027,7 @@
           </w:tcPr>
           <w:p>
             <w:r>
-              <w:t>up</w:t>
+              <w:t>down</w:t>
             </w:r>
           </w:p>
         </w:tc>
@@ -3035,7 +3037,7 @@
           </w:tcPr>
           <w:p>
             <w:r>
-              <w:t>No</w:t>
+              <w:t>Yes</w:t>
             </w:r>
           </w:p>
         </w:tc>
@@ -3045,7 +3047,7 @@
           </w:tcPr>
           <w:p>
             <w:r>
-              <w:t>$-5.00</w:t>
+              <w:t>$3.47</w:t>
             </w:r>
           </w:p>
         </w:tc>
@@ -3067,7 +3069,7 @@
           </w:tcPr>
           <w:p>
             <w:r>
-              <w:t>0.570</w:t>
+              <w:t>0.520</w:t>
             </w:r>
           </w:p>
         </w:tc>
@@ -3077,7 +3079,7 @@
           </w:tcPr>
           <w:p>
             <w:r>
-              <w:t>up</w:t>
+              <w:t>down</w:t>
             </w:r>
           </w:p>
         </w:tc>
@@ -3087,7 +3089,7 @@
           </w:tcPr>
           <w:p>
             <w:r>
-              <w:t>No</w:t>
+              <w:t>Yes</w:t>
             </w:r>
           </w:p>
         </w:tc>
@@ -3097,7 +3099,7 @@
           </w:tcPr>
           <w:p>
             <w:r>
-              <w:t>$-5.00</w:t>
+              <w:t>$4.62</w:t>
             </w:r>
           </w:p>
         </w:tc>
@@ -3119,7 +3121,7 @@
           </w:tcPr>
           <w:p>
             <w:r>
-              <w:t>0.600</w:t>
+              <w:t>0.570</w:t>
             </w:r>
           </w:p>
         </w:tc>
@@ -3170,7 +3172,7 @@
     </w:p>
     <w:p>
       <w:r>
-        <w:t>Section score: 90.4 / 100  (Grade: A)</w:t>
+        <w:t>Section score: 91.0 / 100  (Grade: A)</w:t>
       </w:r>
     </w:p>
     <w:p>
@@ -3313,7 +3315,7 @@
           </w:tcPr>
           <w:p>
             <w:r>
-              <w:t>96.1</w:t>
+              <w:t>100.0</w:t>
             </w:r>
           </w:p>
         </w:tc>
@@ -3323,7 +3325,7 @@
           </w:tcPr>
           <w:p>
             <w:r>
-              <w:t>14.4</w:t>
+              <w:t>15.0</w:t>
             </w:r>
           </w:p>
         </w:tc>
@@ -3427,17 +3429,17 @@
     </w:tbl>
     <w:p>
       <w:r>
-        <w:t>Ticks: 4 · Reconciled: True · Readiness: not_ready</w:t>
+        <w:t>Ticks: 1 · Reconciled: True · Readiness: not_ready</w:t>
       </w:r>
     </w:p>
     <w:p>
       <w:r>
-        <w:t>Candidates created: 50139 · Terminals: {'accepted': 86, 'rejected': 42579, 'skipped': 7231, 'expired': 0, 'missing_data': 243}</w:t>
+        <w:t>Candidates created: 51344 · Terminals: {'accepted': 86, 'rejected': 43087, 'skipped': 7914, 'expired': 0, 'missing_data': 257}</w:t>
       </w:r>
     </w:p>
     <w:p>
       <w:r>
-        <w:t>Rejected by stage: {'directional': 32490, 'execution_gate': 171, 'context_gate': 879, 'directional_allowlist': 1364, 'down_bias_gate': 538, 'mtf_gate': 276, 'grok_decider': 3540, 'execution_realistic': 3, 'verifier': 61, 'mispricing_gate': 50, 'baseline_cohort_gate': 3207}</w:t>
+        <w:t>Rejected by stage: {'directional': 32970, 'execution_gate': 172, 'context_gate': 879, 'directional_allowlist': 1364, 'down_bias_gate': 538, 'mtf_gate': 276, 'grok_decider': 3540, 'execution_realistic': 3, 'verifier': 61, 'mispricing_gate': 50, 'baseline_cohort_gate': 3234}</w:t>
       </w:r>
     </w:p>
     <w:p>
@@ -4368,7 +4370,7 @@
           </w:tcPr>
           <w:p>
             <w:r>
-              <w:t>0.4071</w:t>
+              <w:t>0.4035</w:t>
             </w:r>
           </w:p>
         </w:tc>
@@ -4390,7 +4392,7 @@
           </w:tcPr>
           <w:p>
             <w:r>
-              <w:t>0.4829</w:t>
+              <w:t>0.4799</w:t>
             </w:r>
           </w:p>
         </w:tc>
@@ -4420,7 +4422,7 @@
     </w:tbl>
     <w:p>
       <w:r>
-        <w:t>TV alerts: received 711 · valid 694 · rejected 17</w:t>
+        <w:t>TV alerts: received 818 · valid 801 · rejected 17</w:t>
       </w:r>
     </w:p>
     <w:sectPr>

</xml_diff>

<commit_message>
chore(reports): VPS full report 2026-06-28 09:33 UTC (110 settled, WR 61.8%, PF 1.0906, grade C+)
</commit_message>
<xml_diff>
--- a/vps_full_reports/latest/report.docx
+++ b/vps_full_reports/latest/report.docx
@@ -20,7 +20,7 @@
           <w:color w:val="666666"/>
           <w:sz w:val="20"/>
         </w:rPr>
-        <w:t>PAPER ONLY  ·  reconciled=True  ·  ticks=34</w:t>
+        <w:t>PAPER ONLY  ·  reconciled=True  ·  ticks=386</w:t>
       </w:r>
     </w:p>
     <w:p>
@@ -33,7 +33,7 @@
     </w:p>
     <w:p>
       <w:r>
-        <w:t>Overall score: 67.7 / 100  (Grade: D)</w:t>
+        <w:t>Overall score: 70.8 / 100  (Grade: C)</w:t>
       </w:r>
     </w:p>
     <w:tbl>
@@ -107,7 +107,7 @@
           </w:tcPr>
           <w:p>
             <w:r>
-              <w:t>67.0</w:t>
+              <w:t>73.3</w:t>
             </w:r>
           </w:p>
         </w:tc>
@@ -117,7 +117,7 @@
           </w:tcPr>
           <w:p>
             <w:r>
-              <w:t>D</w:t>
+              <w:t>C</w:t>
             </w:r>
           </w:p>
         </w:tc>
@@ -319,7 +319,7 @@
           </w:tcPr>
           <w:p>
             <w:r>
-              <w:t>2026-06-27 23:39:44</w:t>
+              <w:t>2026-06-28 02:33:06</w:t>
             </w:r>
           </w:p>
         </w:tc>
@@ -329,7 +329,7 @@
           </w:tcPr>
           <w:p>
             <w:r>
-              <w:t>93</w:t>
+              <w:t>97</w:t>
             </w:r>
           </w:p>
         </w:tc>
@@ -339,7 +339,7 @@
           </w:tcPr>
           <w:p>
             <w:r>
-              <w:t>61.1</w:t>
+              <w:t>64.3</w:t>
             </w:r>
           </w:p>
         </w:tc>
@@ -369,7 +369,7 @@
           </w:tcPr>
           <w:p>
             <w:r>
-              <w:t>64.9</w:t>
+              <w:t>66.5</w:t>
             </w:r>
           </w:p>
         </w:tc>
@@ -378,7 +378,9 @@
             <w:tcW w:type="dxa" w:w="1234"/>
           </w:tcPr>
           <w:p>
-            <w:r/>
+            <w:r>
+              <w:t>3</w:t>
+            </w:r>
           </w:p>
         </w:tc>
       </w:tr>
@@ -389,7 +391,7 @@
           </w:tcPr>
           <w:p>
             <w:r>
-              <w:t>2026-06-28 00:03:03</w:t>
+              <w:t>2026-06-28 03:03:10</w:t>
             </w:r>
           </w:p>
         </w:tc>
@@ -399,7 +401,7 @@
           </w:tcPr>
           <w:p>
             <w:r>
-              <w:t>94</w:t>
+              <w:t>98</w:t>
             </w:r>
           </w:p>
         </w:tc>
@@ -409,7 +411,7 @@
           </w:tcPr>
           <w:p>
             <w:r>
-              <w:t>63.2</w:t>
+              <w:t>61.9</w:t>
             </w:r>
           </w:p>
         </w:tc>
@@ -419,7 +421,7 @@
           </w:tcPr>
           <w:p>
             <w:r>
-              <w:t>90.4</w:t>
+              <w:t>90.9</w:t>
             </w:r>
           </w:p>
         </w:tc>
@@ -439,7 +441,7 @@
           </w:tcPr>
           <w:p>
             <w:r>
-              <w:t>66.0</w:t>
+              <w:t>65.4</w:t>
             </w:r>
           </w:p>
         </w:tc>
@@ -449,7 +451,7 @@
           </w:tcPr>
           <w:p>
             <w:r>
-              <w:t>75</w:t>
+              <w:t>111</w:t>
             </w:r>
           </w:p>
         </w:tc>
@@ -461,7 +463,7 @@
           </w:tcPr>
           <w:p>
             <w:r>
-              <w:t>2026-06-28 00:33:04</w:t>
+              <w:t>2026-06-28 03:33:10</w:t>
             </w:r>
           </w:p>
         </w:tc>
@@ -471,7 +473,7 @@
           </w:tcPr>
           <w:p>
             <w:r>
-              <w:t>94</w:t>
+              <w:t>98</w:t>
             </w:r>
           </w:p>
         </w:tc>
@@ -481,7 +483,7 @@
           </w:tcPr>
           <w:p>
             <w:r>
-              <w:t>63.2</w:t>
+              <w:t>61.9</w:t>
             </w:r>
           </w:p>
         </w:tc>
@@ -491,7 +493,7 @@
           </w:tcPr>
           <w:p>
             <w:r>
-              <w:t>90.4</w:t>
+              <w:t>90.9</w:t>
             </w:r>
           </w:p>
         </w:tc>
@@ -511,7 +513,7 @@
           </w:tcPr>
           <w:p>
             <w:r>
-              <w:t>66.0</w:t>
+              <w:t>65.4</w:t>
             </w:r>
           </w:p>
         </w:tc>
@@ -521,7 +523,7 @@
           </w:tcPr>
           <w:p>
             <w:r>
-              <w:t>195</w:t>
+              <w:t>231</w:t>
             </w:r>
           </w:p>
         </w:tc>
@@ -533,7 +535,7 @@
           </w:tcPr>
           <w:p>
             <w:r>
-              <w:t>2026-06-28 00:48:03</w:t>
+              <w:t>2026-06-28 04:03:25</w:t>
             </w:r>
           </w:p>
         </w:tc>
@@ -543,7 +545,7 @@
           </w:tcPr>
           <w:p>
             <w:r>
-              <w:t>95</w:t>
+              <w:t>98</w:t>
             </w:r>
           </w:p>
         </w:tc>
@@ -553,7 +555,7 @@
           </w:tcPr>
           <w:p>
             <w:r>
-              <w:t>60.5</w:t>
+              <w:t>61.9</w:t>
             </w:r>
           </w:p>
         </w:tc>
@@ -563,7 +565,7 @@
           </w:tcPr>
           <w:p>
             <w:r>
-              <w:t>90.4</w:t>
+              <w:t>90.9</w:t>
             </w:r>
           </w:p>
         </w:tc>
@@ -583,7 +585,7 @@
           </w:tcPr>
           <w:p>
             <w:r>
-              <w:t>64.6</w:t>
+              <w:t>65.4</w:t>
             </w:r>
           </w:p>
         </w:tc>
@@ -593,7 +595,7 @@
           </w:tcPr>
           <w:p>
             <w:r>
-              <w:t>255</w:t>
+              <w:t>352</w:t>
             </w:r>
           </w:p>
         </w:tc>
@@ -605,7 +607,7 @@
           </w:tcPr>
           <w:p>
             <w:r>
-              <w:t>2026-06-28 01:03:04</w:t>
+              <w:t>2026-06-28 04:18:10</w:t>
             </w:r>
           </w:p>
         </w:tc>
@@ -615,7 +617,7 @@
           </w:tcPr>
           <w:p>
             <w:r>
-              <w:t>96</w:t>
+              <w:t>99</w:t>
             </w:r>
           </w:p>
         </w:tc>
@@ -625,7 +627,7 @@
           </w:tcPr>
           <w:p>
             <w:r>
-              <w:t>62.7</w:t>
+              <w:t>59.5</w:t>
             </w:r>
           </w:p>
         </w:tc>
@@ -635,7 +637,7 @@
           </w:tcPr>
           <w:p>
             <w:r>
-              <w:t>90.4</w:t>
+              <w:t>90.9</w:t>
             </w:r>
           </w:p>
         </w:tc>
@@ -655,7 +657,7 @@
           </w:tcPr>
           <w:p>
             <w:r>
-              <w:t>65.7</w:t>
+              <w:t>64.2</w:t>
             </w:r>
           </w:p>
         </w:tc>
@@ -665,7 +667,7 @@
           </w:tcPr>
           <w:p>
             <w:r>
-              <w:t>315</w:t>
+              <w:t>411</w:t>
             </w:r>
           </w:p>
         </w:tc>
@@ -677,7 +679,7 @@
           </w:tcPr>
           <w:p>
             <w:r>
-              <w:t>2026-06-28 01:33:15</w:t>
+              <w:t>2026-06-28 04:33:10</w:t>
             </w:r>
           </w:p>
         </w:tc>
@@ -687,7 +689,7 @@
           </w:tcPr>
           <w:p>
             <w:r>
-              <w:t>96</w:t>
+              <w:t>100</w:t>
             </w:r>
           </w:p>
         </w:tc>
@@ -697,7 +699,7 @@
           </w:tcPr>
           <w:p>
             <w:r>
-              <w:t>62.7</w:t>
+              <w:t>61.4</w:t>
             </w:r>
           </w:p>
         </w:tc>
@@ -707,7 +709,7 @@
           </w:tcPr>
           <w:p>
             <w:r>
-              <w:t>90.4</w:t>
+              <w:t>90.9</w:t>
             </w:r>
           </w:p>
         </w:tc>
@@ -727,7 +729,7 @@
           </w:tcPr>
           <w:p>
             <w:r>
-              <w:t>65.7</w:t>
+              <w:t>65.2</w:t>
             </w:r>
           </w:p>
         </w:tc>
@@ -737,7 +739,7 @@
           </w:tcPr>
           <w:p>
             <w:r>
-              <w:t>51</w:t>
+              <w:t>471</w:t>
             </w:r>
           </w:p>
         </w:tc>
@@ -749,7 +751,7 @@
           </w:tcPr>
           <w:p>
             <w:r>
-              <w:t>2026-06-28 02:02:51</w:t>
+              <w:t>2026-06-28 05:00:13</w:t>
             </w:r>
           </w:p>
         </w:tc>
@@ -759,7 +761,7 @@
           </w:tcPr>
           <w:p>
             <w:r>
-              <w:t>97</w:t>
+              <w:t>101</w:t>
             </w:r>
           </w:p>
         </w:tc>
@@ -769,7 +771,7 @@
           </w:tcPr>
           <w:p>
             <w:r>
-              <w:t>64.3</w:t>
+              <w:t>63.6</w:t>
             </w:r>
           </w:p>
         </w:tc>
@@ -779,7 +781,7 @@
           </w:tcPr>
           <w:p>
             <w:r>
-              <w:t>90.4</w:t>
+              <w:t>90.9</w:t>
             </w:r>
           </w:p>
         </w:tc>
@@ -799,7 +801,7 @@
           </w:tcPr>
           <w:p>
             <w:r>
-              <w:t>66.5</w:t>
+              <w:t>66.3</w:t>
             </w:r>
           </w:p>
         </w:tc>
@@ -809,7 +811,7 @@
           </w:tcPr>
           <w:p>
             <w:r>
-              <w:t>91</w:t>
+              <w:t>89</w:t>
             </w:r>
           </w:p>
         </w:tc>
@@ -821,7 +823,7 @@
           </w:tcPr>
           <w:p>
             <w:r>
-              <w:t>2026-06-28 02:33:06</w:t>
+              <w:t>2026-06-28 05:30:14</w:t>
             </w:r>
           </w:p>
         </w:tc>
@@ -831,7 +833,7 @@
           </w:tcPr>
           <w:p>
             <w:r>
-              <w:t>97</w:t>
+              <w:t>102</w:t>
             </w:r>
           </w:p>
         </w:tc>
@@ -841,7 +843,7 @@
           </w:tcPr>
           <w:p>
             <w:r>
-              <w:t>64.3</w:t>
+              <w:t>65.7</w:t>
             </w:r>
           </w:p>
         </w:tc>
@@ -851,7 +853,7 @@
           </w:tcPr>
           <w:p>
             <w:r>
-              <w:t>90.4</w:t>
+              <w:t>90.9</w:t>
             </w:r>
           </w:p>
         </w:tc>
@@ -871,7 +873,7 @@
           </w:tcPr>
           <w:p>
             <w:r>
-              <w:t>66.5</w:t>
+              <w:t>67.3</w:t>
             </w:r>
           </w:p>
         </w:tc>
@@ -881,7 +883,7 @@
           </w:tcPr>
           <w:p>
             <w:r>
-              <w:t>3</w:t>
+              <w:t>209</w:t>
             </w:r>
           </w:p>
         </w:tc>
@@ -893,7 +895,7 @@
           </w:tcPr>
           <w:p>
             <w:r>
-              <w:t>2026-06-28 03:03:10</w:t>
+              <w:t>2026-06-28 06:00:22</w:t>
             </w:r>
           </w:p>
         </w:tc>
@@ -903,7 +905,7 @@
           </w:tcPr>
           <w:p>
             <w:r>
-              <w:t>98</w:t>
+              <w:t>102</w:t>
             </w:r>
           </w:p>
         </w:tc>
@@ -913,7 +915,7 @@
           </w:tcPr>
           <w:p>
             <w:r>
-              <w:t>61.9</w:t>
+              <w:t>65.7</w:t>
             </w:r>
           </w:p>
         </w:tc>
@@ -923,7 +925,7 @@
           </w:tcPr>
           <w:p>
             <w:r>
-              <w:t>90.9</w:t>
+              <w:t>90.7</w:t>
             </w:r>
           </w:p>
         </w:tc>
@@ -943,7 +945,7 @@
           </w:tcPr>
           <w:p>
             <w:r>
-              <w:t>65.4</w:t>
+              <w:t>67.3</w:t>
             </w:r>
           </w:p>
         </w:tc>
@@ -953,7 +955,7 @@
           </w:tcPr>
           <w:p>
             <w:r>
-              <w:t>111</w:t>
+              <w:t>32</w:t>
             </w:r>
           </w:p>
         </w:tc>
@@ -965,7 +967,7 @@
           </w:tcPr>
           <w:p>
             <w:r>
-              <w:t>2026-06-28 03:33:10</w:t>
+              <w:t>2026-06-28 06:18:06</w:t>
             </w:r>
           </w:p>
         </w:tc>
@@ -975,7 +977,7 @@
           </w:tcPr>
           <w:p>
             <w:r>
-              <w:t>98</w:t>
+              <w:t>103</w:t>
             </w:r>
           </w:p>
         </w:tc>
@@ -985,7 +987,7 @@
           </w:tcPr>
           <w:p>
             <w:r>
-              <w:t>61.9</w:t>
+              <w:t>67.0</w:t>
             </w:r>
           </w:p>
         </w:tc>
@@ -995,7 +997,7 @@
           </w:tcPr>
           <w:p>
             <w:r>
-              <w:t>90.9</w:t>
+              <w:t>90.6</w:t>
             </w:r>
           </w:p>
         </w:tc>
@@ -1015,7 +1017,7 @@
           </w:tcPr>
           <w:p>
             <w:r>
-              <w:t>65.4</w:t>
+              <w:t>67.9</w:t>
             </w:r>
           </w:p>
         </w:tc>
@@ -1025,7 +1027,7 @@
           </w:tcPr>
           <w:p>
             <w:r>
-              <w:t>231</w:t>
+              <w:t>14</w:t>
             </w:r>
           </w:p>
         </w:tc>
@@ -1037,7 +1039,7 @@
           </w:tcPr>
           <w:p>
             <w:r>
-              <w:t>2026-06-28 04:03:25</w:t>
+              <w:t>2026-06-28 06:48:20</w:t>
             </w:r>
           </w:p>
         </w:tc>
@@ -1047,7 +1049,7 @@
           </w:tcPr>
           <w:p>
             <w:r>
-              <w:t>98</w:t>
+              <w:t>103</w:t>
             </w:r>
           </w:p>
         </w:tc>
@@ -1057,7 +1059,7 @@
           </w:tcPr>
           <w:p>
             <w:r>
-              <w:t>61.9</w:t>
+              <w:t>67.0</w:t>
             </w:r>
           </w:p>
         </w:tc>
@@ -1067,7 +1069,7 @@
           </w:tcPr>
           <w:p>
             <w:r>
-              <w:t>90.9</w:t>
+              <w:t>90.4</w:t>
             </w:r>
           </w:p>
         </w:tc>
@@ -1087,7 +1089,7 @@
           </w:tcPr>
           <w:p>
             <w:r>
-              <w:t>65.4</w:t>
+              <w:t>67.8</w:t>
             </w:r>
           </w:p>
         </w:tc>
@@ -1097,7 +1099,7 @@
           </w:tcPr>
           <w:p>
             <w:r>
-              <w:t>352</w:t>
+              <w:t>14</w:t>
             </w:r>
           </w:p>
         </w:tc>
@@ -1109,7 +1111,7 @@
           </w:tcPr>
           <w:p>
             <w:r>
-              <w:t>2026-06-28 04:18:10</w:t>
+              <w:t>2026-06-28 07:18:24</w:t>
             </w:r>
           </w:p>
         </w:tc>
@@ -1119,7 +1121,7 @@
           </w:tcPr>
           <w:p>
             <w:r>
-              <w:t>99</w:t>
+              <w:t>103</w:t>
             </w:r>
           </w:p>
         </w:tc>
@@ -1129,7 +1131,7 @@
           </w:tcPr>
           <w:p>
             <w:r>
-              <w:t>59.5</w:t>
+              <w:t>67.0</w:t>
             </w:r>
           </w:p>
         </w:tc>
@@ -1139,7 +1141,7 @@
           </w:tcPr>
           <w:p>
             <w:r>
-              <w:t>90.9</w:t>
+              <w:t>90.2</w:t>
             </w:r>
           </w:p>
         </w:tc>
@@ -1159,7 +1161,7 @@
           </w:tcPr>
           <w:p>
             <w:r>
-              <w:t>64.2</w:t>
+              <w:t>67.8</w:t>
             </w:r>
           </w:p>
         </w:tc>
@@ -1169,7 +1171,7 @@
           </w:tcPr>
           <w:p>
             <w:r>
-              <w:t>411</w:t>
+              <w:t>16</w:t>
             </w:r>
           </w:p>
         </w:tc>
@@ -1181,7 +1183,7 @@
           </w:tcPr>
           <w:p>
             <w:r>
-              <w:t>2026-06-28 04:33:10</w:t>
+              <w:t>2026-06-28 07:48:31</w:t>
             </w:r>
           </w:p>
         </w:tc>
@@ -1191,7 +1193,7 @@
           </w:tcPr>
           <w:p>
             <w:r>
-              <w:t>100</w:t>
+              <w:t>103</w:t>
             </w:r>
           </w:p>
         </w:tc>
@@ -1201,7 +1203,7 @@
           </w:tcPr>
           <w:p>
             <w:r>
-              <w:t>61.4</w:t>
+              <w:t>67.0</w:t>
             </w:r>
           </w:p>
         </w:tc>
@@ -1211,7 +1213,7 @@
           </w:tcPr>
           <w:p>
             <w:r>
-              <w:t>90.9</w:t>
+              <w:t>90.0</w:t>
             </w:r>
           </w:p>
         </w:tc>
@@ -1231,7 +1233,7 @@
           </w:tcPr>
           <w:p>
             <w:r>
-              <w:t>65.2</w:t>
+              <w:t>67.8</w:t>
             </w:r>
           </w:p>
         </w:tc>
@@ -1241,7 +1243,7 @@
           </w:tcPr>
           <w:p>
             <w:r>
-              <w:t>471</w:t>
+              <w:t>3</w:t>
             </w:r>
           </w:p>
         </w:tc>
@@ -1253,7 +1255,7 @@
           </w:tcPr>
           <w:p>
             <w:r>
-              <w:t>2026-06-28 05:00:13</w:t>
+              <w:t>2026-06-28 08:03:28</w:t>
             </w:r>
           </w:p>
         </w:tc>
@@ -1263,7 +1265,7 @@
           </w:tcPr>
           <w:p>
             <w:r>
-              <w:t>101</w:t>
+              <w:t>104</w:t>
             </w:r>
           </w:p>
         </w:tc>
@@ -1273,7 +1275,7 @@
           </w:tcPr>
           <w:p>
             <w:r>
-              <w:t>63.6</w:t>
+              <w:t>69.3</w:t>
             </w:r>
           </w:p>
         </w:tc>
@@ -1283,7 +1285,7 @@
           </w:tcPr>
           <w:p>
             <w:r>
-              <w:t>90.9</w:t>
+              <w:t>89.9</w:t>
             </w:r>
           </w:p>
         </w:tc>
@@ -1303,7 +1305,7 @@
           </w:tcPr>
           <w:p>
             <w:r>
-              <w:t>66.3</w:t>
+              <w:t>68.9</w:t>
             </w:r>
           </w:p>
         </w:tc>
@@ -1313,7 +1315,7 @@
           </w:tcPr>
           <w:p>
             <w:r>
-              <w:t>89</w:t>
+              <w:t>25</w:t>
             </w:r>
           </w:p>
         </w:tc>
@@ -1325,7 +1327,7 @@
           </w:tcPr>
           <w:p>
             <w:r>
-              <w:t>2026-06-28 05:30:14</w:t>
+              <w:t>2026-06-28 08:18:15</w:t>
             </w:r>
           </w:p>
         </w:tc>
@@ -1335,7 +1337,7 @@
           </w:tcPr>
           <w:p>
             <w:r>
-              <w:t>102</w:t>
+              <w:t>105</w:t>
             </w:r>
           </w:p>
         </w:tc>
@@ -1345,7 +1347,7 @@
           </w:tcPr>
           <w:p>
             <w:r>
-              <w:t>65.7</w:t>
+              <w:t>72.0</w:t>
             </w:r>
           </w:p>
         </w:tc>
@@ -1355,7 +1357,7 @@
           </w:tcPr>
           <w:p>
             <w:r>
-              <w:t>90.9</w:t>
+              <w:t>89.9</w:t>
             </w:r>
           </w:p>
         </w:tc>
@@ -1375,7 +1377,7 @@
           </w:tcPr>
           <w:p>
             <w:r>
-              <w:t>67.3</w:t>
+              <w:t>70.2</w:t>
             </w:r>
           </w:p>
         </w:tc>
@@ -1385,7 +1387,7 @@
           </w:tcPr>
           <w:p>
             <w:r>
-              <w:t>209</w:t>
+              <w:t>84</w:t>
             </w:r>
           </w:p>
         </w:tc>
@@ -1397,7 +1399,7 @@
           </w:tcPr>
           <w:p>
             <w:r>
-              <w:t>2026-06-28 06:00:22</w:t>
+              <w:t>2026-06-28 08:33:15</w:t>
             </w:r>
           </w:p>
         </w:tc>
@@ -1407,7 +1409,7 @@
           </w:tcPr>
           <w:p>
             <w:r>
-              <w:t>102</w:t>
+              <w:t>106</w:t>
             </w:r>
           </w:p>
         </w:tc>
@@ -1417,7 +1419,7 @@
           </w:tcPr>
           <w:p>
             <w:r>
-              <w:t>65.7</w:t>
+              <w:t>69.5</w:t>
             </w:r>
           </w:p>
         </w:tc>
@@ -1427,7 +1429,7 @@
           </w:tcPr>
           <w:p>
             <w:r>
-              <w:t>90.7</w:t>
+              <w:t>89.9</w:t>
             </w:r>
           </w:p>
         </w:tc>
@@ -1447,7 +1449,7 @@
           </w:tcPr>
           <w:p>
             <w:r>
-              <w:t>67.3</w:t>
+              <w:t>69.0</w:t>
             </w:r>
           </w:p>
         </w:tc>
@@ -1457,7 +1459,7 @@
           </w:tcPr>
           <w:p>
             <w:r>
-              <w:t>32</w:t>
+              <w:t>144</w:t>
             </w:r>
           </w:p>
         </w:tc>
@@ -1469,7 +1471,7 @@
           </w:tcPr>
           <w:p>
             <w:r>
-              <w:t>2026-06-28 06:18:06</w:t>
+              <w:t>2026-06-28 08:47:00</w:t>
             </w:r>
           </w:p>
         </w:tc>
@@ -1479,7 +1481,7 @@
           </w:tcPr>
           <w:p>
             <w:r>
-              <w:t>103</w:t>
+              <w:t>107</w:t>
             </w:r>
           </w:p>
         </w:tc>
@@ -1489,7 +1491,7 @@
           </w:tcPr>
           <w:p>
             <w:r>
-              <w:t>67.0</w:t>
+              <w:t>67.1</w:t>
             </w:r>
           </w:p>
         </w:tc>
@@ -1499,7 +1501,7 @@
           </w:tcPr>
           <w:p>
             <w:r>
-              <w:t>90.6</w:t>
+              <w:t>89.9</w:t>
             </w:r>
           </w:p>
         </w:tc>
@@ -1519,7 +1521,7 @@
           </w:tcPr>
           <w:p>
             <w:r>
-              <w:t>67.9</w:t>
+              <w:t>67.8</w:t>
             </w:r>
           </w:p>
         </w:tc>
@@ -1529,7 +1531,7 @@
           </w:tcPr>
           <w:p>
             <w:r>
-              <w:t>14</w:t>
+              <w:t>199</w:t>
             </w:r>
           </w:p>
         </w:tc>
@@ -1541,7 +1543,7 @@
           </w:tcPr>
           <w:p>
             <w:r>
-              <w:t>2026-06-28 06:48:20</w:t>
+              <w:t>2026-06-28 09:03:28</w:t>
             </w:r>
           </w:p>
         </w:tc>
@@ -1551,7 +1553,7 @@
           </w:tcPr>
           <w:p>
             <w:r>
-              <w:t>103</w:t>
+              <w:t>108</w:t>
             </w:r>
           </w:p>
         </w:tc>
@@ -1561,7 +1563,7 @@
           </w:tcPr>
           <w:p>
             <w:r>
-              <w:t>67.0</w:t>
+              <w:t>68.9</w:t>
             </w:r>
           </w:p>
         </w:tc>
@@ -1571,7 +1573,7 @@
           </w:tcPr>
           <w:p>
             <w:r>
-              <w:t>90.4</w:t>
+              <w:t>89.8</w:t>
             </w:r>
           </w:p>
         </w:tc>
@@ -1591,7 +1593,7 @@
           </w:tcPr>
           <w:p>
             <w:r>
-              <w:t>67.8</w:t>
+              <w:t>68.7</w:t>
             </w:r>
           </w:p>
         </w:tc>
@@ -1601,7 +1603,7 @@
           </w:tcPr>
           <w:p>
             <w:r>
-              <w:t>14</w:t>
+              <w:t>265</w:t>
             </w:r>
           </w:p>
         </w:tc>
@@ -1613,7 +1615,7 @@
           </w:tcPr>
           <w:p>
             <w:r>
-              <w:t>2026-06-28 07:18:24</w:t>
+              <w:t>2026-06-28 09:18:28</w:t>
             </w:r>
           </w:p>
         </w:tc>
@@ -1623,7 +1625,7 @@
           </w:tcPr>
           <w:p>
             <w:r>
-              <w:t>103</w:t>
+              <w:t>109</w:t>
             </w:r>
           </w:p>
         </w:tc>
@@ -1633,7 +1635,7 @@
           </w:tcPr>
           <w:p>
             <w:r>
-              <w:t>67.0</w:t>
+              <w:t>70.9</w:t>
             </w:r>
           </w:p>
         </w:tc>
@@ -1643,7 +1645,7 @@
           </w:tcPr>
           <w:p>
             <w:r>
-              <w:t>90.2</w:t>
+              <w:t>89.8</w:t>
             </w:r>
           </w:p>
         </w:tc>
@@ -1663,7 +1665,7 @@
           </w:tcPr>
           <w:p>
             <w:r>
-              <w:t>67.8</w:t>
+              <w:t>69.7</w:t>
             </w:r>
           </w:p>
         </w:tc>
@@ -1673,7 +1675,7 @@
           </w:tcPr>
           <w:p>
             <w:r>
-              <w:t>16</w:t>
+              <w:t>325</w:t>
             </w:r>
           </w:p>
         </w:tc>
@@ -1685,7 +1687,7 @@
           </w:tcPr>
           <w:p>
             <w:r>
-              <w:t>2026-06-28 07:48:31</w:t>
+              <w:t>2026-06-28 09:33:15</w:t>
             </w:r>
           </w:p>
         </w:tc>
@@ -1695,7 +1697,7 @@
           </w:tcPr>
           <w:p>
             <w:r>
-              <w:t>103</w:t>
+              <w:t>110</w:t>
             </w:r>
           </w:p>
         </w:tc>
@@ -1705,7 +1707,7 @@
           </w:tcPr>
           <w:p>
             <w:r>
-              <w:t>67.0</w:t>
+              <w:t>73.3</w:t>
             </w:r>
           </w:p>
         </w:tc>
@@ -1715,7 +1717,7 @@
           </w:tcPr>
           <w:p>
             <w:r>
-              <w:t>90.0</w:t>
+              <w:t>89.8</w:t>
             </w:r>
           </w:p>
         </w:tc>
@@ -1735,7 +1737,7 @@
           </w:tcPr>
           <w:p>
             <w:r>
-              <w:t>67.8</w:t>
+              <w:t>70.8</w:t>
             </w:r>
           </w:p>
         </w:tc>
@@ -1745,7 +1747,7 @@
           </w:tcPr>
           <w:p>
             <w:r>
-              <w:t>3</w:t>
+              <w:t>384</w:t>
             </w:r>
           </w:p>
         </w:tc>
@@ -1766,7 +1768,7 @@
     </w:p>
     <w:p>
       <w:r>
-        <w:t>Section score: 67.0 / 100  (Grade: D)</w:t>
+        <w:t>Section score: 73.3 / 100  (Grade: C)</w:t>
       </w:r>
     </w:p>
     <w:p>
@@ -1877,7 +1879,7 @@
           </w:tcPr>
           <w:p>
             <w:r>
-              <w:t>55.4</w:t>
+              <w:t>85.3</w:t>
             </w:r>
           </w:p>
         </w:tc>
@@ -1887,7 +1889,7 @@
           </w:tcPr>
           <w:p>
             <w:r>
-              <w:t>8.3</w:t>
+              <w:t>12.8</w:t>
             </w:r>
           </w:p>
         </w:tc>
@@ -1909,7 +1911,7 @@
           </w:tcPr>
           <w:p>
             <w:r>
-              <w:t>39.3</w:t>
+              <w:t>48.8</w:t>
             </w:r>
           </w:p>
         </w:tc>
@@ -1919,7 +1921,7 @@
           </w:tcPr>
           <w:p>
             <w:r>
-              <w:t>5.9</w:t>
+              <w:t>7.3</w:t>
             </w:r>
           </w:p>
         </w:tc>
@@ -2005,7 +2007,7 @@
           </w:tcPr>
           <w:p>
             <w:r>
-              <w:t>72.2</w:t>
+              <w:t>73.1</w:t>
             </w:r>
           </w:p>
         </w:tc>
@@ -2015,7 +2017,7 @@
           </w:tcPr>
           <w:p>
             <w:r>
-              <w:t>7.2</w:t>
+              <w:t>7.3</w:t>
             </w:r>
           </w:p>
         </w:tc>
@@ -2037,7 +2039,7 @@
           </w:tcPr>
           <w:p>
             <w:r>
-              <w:t>42.3</w:t>
+              <w:t>43.6</w:t>
             </w:r>
           </w:p>
         </w:tc>
@@ -2047,7 +2049,7 @@
           </w:tcPr>
           <w:p>
             <w:r>
-              <w:t>10.6</w:t>
+              <w:t>10.9</w:t>
             </w:r>
           </w:p>
         </w:tc>
@@ -2088,7 +2090,7 @@
           </w:tcPr>
           <w:p>
             <w:r>
-              <w:t>$585.00</w:t>
+              <w:t>$600.98</w:t>
             </w:r>
           </w:p>
         </w:tc>
@@ -2110,7 +2112,7 @@
           </w:tcPr>
           <w:p>
             <w:r>
-              <w:t>17.00%</w:t>
+              <w:t>20.20%</w:t>
             </w:r>
           </w:p>
         </w:tc>
@@ -2132,7 +2134,7 @@
           </w:tcPr>
           <w:p>
             <w:r>
-              <w:t>$2.71</w:t>
+              <w:t>$17.67</w:t>
             </w:r>
           </w:p>
         </w:tc>
@@ -2176,7 +2178,7 @@
           </w:tcPr>
           <w:p>
             <w:r>
-              <w:t>0.6117</w:t>
+              <w:t>0.6182</w:t>
             </w:r>
           </w:p>
         </w:tc>
@@ -2198,7 +2200,7 @@
           </w:tcPr>
           <w:p>
             <w:r>
-              <w:t>0.5000 / 0.6386</w:t>
+              <w:t>0.5000 / 0.6444</w:t>
             </w:r>
           </w:p>
         </w:tc>
@@ -2220,7 +2222,7 @@
           </w:tcPr>
           <w:p>
             <w:r>
-              <w:t>1.0147</w:t>
+              <w:t>1.0906</w:t>
             </w:r>
           </w:p>
         </w:tc>
@@ -2242,7 +2244,7 @@
           </w:tcPr>
           <w:p>
             <w:r>
-              <w:t>104 / 103</w:t>
+              <w:t>110 / 110</w:t>
             </w:r>
           </w:p>
         </w:tc>
@@ -2264,7 +2266,7 @@
           </w:tcPr>
           <w:p>
             <w:r>
-              <w:t>$0.03</w:t>
+              <w:t>$0.16</w:t>
             </w:r>
           </w:p>
         </w:tc>
@@ -2395,7 +2397,7 @@
           </w:tcPr>
           <w:p>
             <w:r>
-              <w:t>0.500</w:t>
+              <w:t>0.470</w:t>
             </w:r>
           </w:p>
         </w:tc>
@@ -2405,7 +2407,7 @@
           </w:tcPr>
           <w:p>
             <w:r>
-              <w:t>—</w:t>
+              <w:t>down</w:t>
             </w:r>
           </w:p>
         </w:tc>
@@ -2415,7 +2417,7 @@
           </w:tcPr>
           <w:p>
             <w:r>
-              <w:t>—</w:t>
+              <w:t>Yes</w:t>
             </w:r>
           </w:p>
         </w:tc>
@@ -2425,7 +2427,7 @@
           </w:tcPr>
           <w:p>
             <w:r>
-              <w:t>$—</w:t>
+              <w:t>$5.64</w:t>
             </w:r>
           </w:p>
         </w:tc>
@@ -2447,7 +2449,7 @@
           </w:tcPr>
           <w:p>
             <w:r>
-              <w:t>0.660</w:t>
+              <w:t>0.530</w:t>
             </w:r>
           </w:p>
         </w:tc>
@@ -2477,7 +2479,7 @@
           </w:tcPr>
           <w:p>
             <w:r>
-              <w:t>$2.58</w:t>
+              <w:t>$4.43</w:t>
             </w:r>
           </w:p>
         </w:tc>
@@ -2499,7 +2501,7 @@
           </w:tcPr>
           <w:p>
             <w:r>
-              <w:t>0.520</w:t>
+              <w:t>0.570</w:t>
             </w:r>
           </w:p>
         </w:tc>
@@ -2529,7 +2531,7 @@
           </w:tcPr>
           <w:p>
             <w:r>
-              <w:t>$4.62</w:t>
+              <w:t>$3.77</w:t>
             </w:r>
           </w:p>
         </w:tc>
@@ -2551,7 +2553,7 @@
           </w:tcPr>
           <w:p>
             <w:r>
-              <w:t>0.510</w:t>
+              <w:t>0.420</w:t>
             </w:r>
           </w:p>
         </w:tc>
@@ -2561,7 +2563,7 @@
           </w:tcPr>
           <w:p>
             <w:r>
-              <w:t>down</w:t>
+              <w:t>up</w:t>
             </w:r>
           </w:p>
         </w:tc>
@@ -2571,7 +2573,7 @@
           </w:tcPr>
           <w:p>
             <w:r>
-              <w:t>Yes</w:t>
+              <w:t>No</w:t>
             </w:r>
           </w:p>
         </w:tc>
@@ -2581,7 +2583,7 @@
           </w:tcPr>
           <w:p>
             <w:r>
-              <w:t>$4.80</w:t>
+              <w:t>$-5.00</w:t>
             </w:r>
           </w:p>
         </w:tc>
@@ -2603,7 +2605,7 @@
           </w:tcPr>
           <w:p>
             <w:r>
-              <w:t>0.550</w:t>
+              <w:t>0.420</w:t>
             </w:r>
           </w:p>
         </w:tc>
@@ -2613,7 +2615,7 @@
           </w:tcPr>
           <w:p>
             <w:r>
-              <w:t>down</w:t>
+              <w:t>up</w:t>
             </w:r>
           </w:p>
         </w:tc>
@@ -2623,7 +2625,7 @@
           </w:tcPr>
           <w:p>
             <w:r>
-              <w:t>Yes</w:t>
+              <w:t>No</w:t>
             </w:r>
           </w:p>
         </w:tc>
@@ -2633,7 +2635,7 @@
           </w:tcPr>
           <w:p>
             <w:r>
-              <w:t>$4.09</w:t>
+              <w:t>$-5.00</w:t>
             </w:r>
           </w:p>
         </w:tc>
@@ -2655,7 +2657,7 @@
           </w:tcPr>
           <w:p>
             <w:r>
-              <w:t>0.590</w:t>
+              <w:t>0.450</w:t>
             </w:r>
           </w:p>
         </w:tc>
@@ -2665,7 +2667,7 @@
           </w:tcPr>
           <w:p>
             <w:r>
-              <w:t>up</w:t>
+              <w:t>down</w:t>
             </w:r>
           </w:p>
         </w:tc>
@@ -2675,7 +2677,7 @@
           </w:tcPr>
           <w:p>
             <w:r>
-              <w:t>No</w:t>
+              <w:t>Yes</w:t>
             </w:r>
           </w:p>
         </w:tc>
@@ -2685,7 +2687,7 @@
           </w:tcPr>
           <w:p>
             <w:r>
-              <w:t>$-5.00</w:t>
+              <w:t>$6.11</w:t>
             </w:r>
           </w:p>
         </w:tc>
@@ -2707,7 +2709,7 @@
           </w:tcPr>
           <w:p>
             <w:r>
-              <w:t>0.520</w:t>
+              <w:t>0.500</w:t>
             </w:r>
           </w:p>
         </w:tc>
@@ -2717,7 +2719,7 @@
           </w:tcPr>
           <w:p>
             <w:r>
-              <w:t>up</w:t>
+              <w:t>down</w:t>
             </w:r>
           </w:p>
         </w:tc>
@@ -2727,7 +2729,7 @@
           </w:tcPr>
           <w:p>
             <w:r>
-              <w:t>No</w:t>
+              <w:t>Yes</w:t>
             </w:r>
           </w:p>
         </w:tc>
@@ -2737,7 +2739,7 @@
           </w:tcPr>
           <w:p>
             <w:r>
-              <w:t>$-5.00</w:t>
+              <w:t>$5.00</w:t>
             </w:r>
           </w:p>
         </w:tc>
@@ -2759,7 +2761,7 @@
           </w:tcPr>
           <w:p>
             <w:r>
-              <w:t>0.590</w:t>
+              <w:t>0.660</w:t>
             </w:r>
           </w:p>
         </w:tc>
@@ -2789,7 +2791,7 @@
           </w:tcPr>
           <w:p>
             <w:r>
-              <w:t>$3.47</w:t>
+              <w:t>$2.58</w:t>
             </w:r>
           </w:p>
         </w:tc>
@@ -2811,7 +2813,7 @@
           </w:tcPr>
           <w:p>
             <w:r>
-              <w:t>0.550</w:t>
+              <w:t>0.520</w:t>
             </w:r>
           </w:p>
         </w:tc>
@@ -2841,7 +2843,7 @@
           </w:tcPr>
           <w:p>
             <w:r>
-              <w:t>$4.09</w:t>
+              <w:t>$4.62</w:t>
             </w:r>
           </w:p>
         </w:tc>
@@ -2863,7 +2865,7 @@
           </w:tcPr>
           <w:p>
             <w:r>
-              <w:t>0.632</w:t>
+              <w:t>0.510</w:t>
             </w:r>
           </w:p>
         </w:tc>
@@ -2873,7 +2875,7 @@
           </w:tcPr>
           <w:p>
             <w:r>
-              <w:t>up</w:t>
+              <w:t>down</w:t>
             </w:r>
           </w:p>
         </w:tc>
@@ -2883,7 +2885,7 @@
           </w:tcPr>
           <w:p>
             <w:r>
-              <w:t>No</w:t>
+              <w:t>Yes</w:t>
             </w:r>
           </w:p>
         </w:tc>
@@ -2893,7 +2895,7 @@
           </w:tcPr>
           <w:p>
             <w:r>
-              <w:t>$-5.00</w:t>
+              <w:t>$4.80</w:t>
             </w:r>
           </w:p>
         </w:tc>
@@ -2967,7 +2969,7 @@
           </w:tcPr>
           <w:p>
             <w:r>
-              <w:t>0.530</w:t>
+              <w:t>0.590</w:t>
             </w:r>
           </w:p>
         </w:tc>
@@ -2977,7 +2979,7 @@
           </w:tcPr>
           <w:p>
             <w:r>
-              <w:t>down</w:t>
+              <w:t>up</w:t>
             </w:r>
           </w:p>
         </w:tc>
@@ -2987,7 +2989,7 @@
           </w:tcPr>
           <w:p>
             <w:r>
-              <w:t>Yes</w:t>
+              <w:t>No</w:t>
             </w:r>
           </w:p>
         </w:tc>
@@ -2997,7 +2999,7 @@
           </w:tcPr>
           <w:p>
             <w:r>
-              <w:t>$4.43</w:t>
+              <w:t>$-5.00</w:t>
             </w:r>
           </w:p>
         </w:tc>
@@ -3019,7 +3021,7 @@
           </w:tcPr>
           <w:p>
             <w:r>
-              <w:t>0.500</w:t>
+              <w:t>0.520</w:t>
             </w:r>
           </w:p>
         </w:tc>
@@ -3029,7 +3031,7 @@
           </w:tcPr>
           <w:p>
             <w:r>
-              <w:t>down</w:t>
+              <w:t>up</w:t>
             </w:r>
           </w:p>
         </w:tc>
@@ -3039,7 +3041,7 @@
           </w:tcPr>
           <w:p>
             <w:r>
-              <w:t>Yes</w:t>
+              <w:t>No</w:t>
             </w:r>
           </w:p>
         </w:tc>
@@ -3049,7 +3051,7 @@
           </w:tcPr>
           <w:p>
             <w:r>
-              <w:t>$5.00</w:t>
+              <w:t>$-5.00</w:t>
             </w:r>
           </w:p>
         </w:tc>
@@ -3071,7 +3073,7 @@
           </w:tcPr>
           <w:p>
             <w:r>
-              <w:t>0.640</w:t>
+              <w:t>0.590</w:t>
             </w:r>
           </w:p>
         </w:tc>
@@ -3081,7 +3083,7 @@
           </w:tcPr>
           <w:p>
             <w:r>
-              <w:t>up</w:t>
+              <w:t>down</w:t>
             </w:r>
           </w:p>
         </w:tc>
@@ -3091,7 +3093,7 @@
           </w:tcPr>
           <w:p>
             <w:r>
-              <w:t>No</w:t>
+              <w:t>Yes</w:t>
             </w:r>
           </w:p>
         </w:tc>
@@ -3101,7 +3103,7 @@
           </w:tcPr>
           <w:p>
             <w:r>
-              <w:t>$-5.00</w:t>
+              <w:t>$3.47</w:t>
             </w:r>
           </w:p>
         </w:tc>
@@ -3123,7 +3125,7 @@
           </w:tcPr>
           <w:p>
             <w:r>
-              <w:t>0.640</w:t>
+              <w:t>0.550</w:t>
             </w:r>
           </w:p>
         </w:tc>
@@ -3133,7 +3135,7 @@
           </w:tcPr>
           <w:p>
             <w:r>
-              <w:t>up</w:t>
+              <w:t>down</w:t>
             </w:r>
           </w:p>
         </w:tc>
@@ -3143,7 +3145,7 @@
           </w:tcPr>
           <w:p>
             <w:r>
-              <w:t>No</w:t>
+              <w:t>Yes</w:t>
             </w:r>
           </w:p>
         </w:tc>
@@ -3153,7 +3155,7 @@
           </w:tcPr>
           <w:p>
             <w:r>
-              <w:t>$-5.00</w:t>
+              <w:t>$4.09</w:t>
             </w:r>
           </w:p>
         </w:tc>
@@ -3317,7 +3319,7 @@
           </w:tcPr>
           <w:p>
             <w:r>
-              <w:t>92.3</w:t>
+              <w:t>92.2</w:t>
             </w:r>
           </w:p>
         </w:tc>
@@ -3431,17 +3433,17 @@
     </w:tbl>
     <w:p>
       <w:r>
-        <w:t>Ticks: 34 · Reconciled: True · Readiness: not_ready</w:t>
+        <w:t>Ticks: 386 · Reconciled: True · Readiness: not_ready</w:t>
       </w:r>
     </w:p>
     <w:p>
       <w:r>
-        <w:t>Candidates created: 53655 · Terminals: {'accepted': 86, 'rejected': 44085, 'skipped': 9192, 'expired': 0, 'missing_data': 292}</w:t>
+        <w:t>Candidates created: 54138 · Terminals: {'accepted': 86, 'rejected': 44178, 'skipped': 9581, 'expired': 0, 'missing_data': 293}</w:t>
       </w:r>
     </w:p>
     <w:p>
       <w:r>
-        <w:t>Rejected by stage: {'directional': 33858, 'execution_gate': 177, 'context_gate': 879, 'directional_allowlist': 1364, 'down_bias_gate': 538, 'mtf_gate': 276, 'grok_decider': 3540, 'execution_realistic': 3, 'verifier': 61, 'mispricing_gate': 50, 'baseline_cohort_gate': 3339}</w:t>
+        <w:t>Rejected by stage: {'directional': 33895, 'execution_gate': 179, 'context_gate': 879, 'directional_allowlist': 1364, 'down_bias_gate': 538, 'mtf_gate': 276, 'grok_decider': 3540, 'execution_realistic': 3, 'verifier': 61, 'mispricing_gate': 50, 'baseline_cohort_gate': 3393}</w:t>
       </w:r>
     </w:p>
     <w:p>
@@ -4372,7 +4374,7 @@
           </w:tcPr>
           <w:p>
             <w:r>
-              <w:t>0.4103</w:t>
+              <w:t>0.4118</w:t>
             </w:r>
           </w:p>
         </w:tc>
@@ -4394,7 +4396,7 @@
           </w:tcPr>
           <w:p>
             <w:r>
-              <w:t>0.4821</w:t>
+              <w:t>0.4799</w:t>
             </w:r>
           </w:p>
         </w:tc>
@@ -4424,7 +4426,7 @@
     </w:tbl>
     <w:p>
       <w:r>
-        <w:t>TV alerts: received 1048 · valid 1029 · rejected 2</w:t>
+        <w:t>TV alerts: received 1136 · valid 1117 · rejected 2</w:t>
       </w:r>
     </w:p>
     <w:sectPr>

</xml_diff>

<commit_message>
chore(reports): VPS full report 2026-06-28 12:33 UTC (116 settled, WR 61.2%, PF 1.0795, grade C)
</commit_message>
<xml_diff>
--- a/vps_full_reports/latest/report.docx
+++ b/vps_full_reports/latest/report.docx
@@ -20,7 +20,7 @@
           <w:color w:val="666666"/>
           <w:sz w:val="20"/>
         </w:rPr>
-        <w:t>PAPER ONLY  ·  reconciled=True  ·  ticks=243</w:t>
+        <w:t>PAPER ONLY  ·  reconciled=True  ·  ticks=467</w:t>
       </w:r>
     </w:p>
     <w:p>
@@ -33,7 +33,7 @@
     </w:p>
     <w:p>
       <w:r>
-        <w:t>Overall score: 71.9 / 100  (Grade: C)</w:t>
+        <w:t>Overall score: 70.3 / 100  (Grade: C)</w:t>
       </w:r>
     </w:p>
     <w:tbl>
@@ -107,7 +107,7 @@
           </w:tcPr>
           <w:p>
             <w:r>
-              <w:t>75.5</w:t>
+              <w:t>72.4</w:t>
             </w:r>
           </w:p>
         </w:tc>
@@ -117,7 +117,7 @@
           </w:tcPr>
           <w:p>
             <w:r>
-              <w:t>C+</w:t>
+              <w:t>C</w:t>
             </w:r>
           </w:p>
         </w:tc>
@@ -149,7 +149,7 @@
           </w:tcPr>
           <w:p>
             <w:r>
-              <w:t>89.6</w:t>
+              <w:t>89.3</w:t>
             </w:r>
           </w:p>
         </w:tc>
@@ -319,7 +319,7 @@
           </w:tcPr>
           <w:p>
             <w:r>
-              <w:t>2026-06-28 03:33:10</w:t>
+              <w:t>2026-06-28 06:00:22</w:t>
             </w:r>
           </w:p>
         </w:tc>
@@ -329,7 +329,7 @@
           </w:tcPr>
           <w:p>
             <w:r>
-              <w:t>98</w:t>
+              <w:t>102</w:t>
             </w:r>
           </w:p>
         </w:tc>
@@ -339,7 +339,7 @@
           </w:tcPr>
           <w:p>
             <w:r>
-              <w:t>61.9</w:t>
+              <w:t>65.7</w:t>
             </w:r>
           </w:p>
         </w:tc>
@@ -349,7 +349,7 @@
           </w:tcPr>
           <w:p>
             <w:r>
-              <w:t>90.9</w:t>
+              <w:t>90.7</w:t>
             </w:r>
           </w:p>
         </w:tc>
@@ -369,7 +369,7 @@
           </w:tcPr>
           <w:p>
             <w:r>
-              <w:t>65.4</w:t>
+              <w:t>67.3</w:t>
             </w:r>
           </w:p>
         </w:tc>
@@ -379,7 +379,7 @@
           </w:tcPr>
           <w:p>
             <w:r>
-              <w:t>231</w:t>
+              <w:t>32</w:t>
             </w:r>
           </w:p>
         </w:tc>
@@ -391,7 +391,7 @@
           </w:tcPr>
           <w:p>
             <w:r>
-              <w:t>2026-06-28 04:03:25</w:t>
+              <w:t>2026-06-28 06:18:06</w:t>
             </w:r>
           </w:p>
         </w:tc>
@@ -401,7 +401,7 @@
           </w:tcPr>
           <w:p>
             <w:r>
-              <w:t>98</w:t>
+              <w:t>103</w:t>
             </w:r>
           </w:p>
         </w:tc>
@@ -411,7 +411,7 @@
           </w:tcPr>
           <w:p>
             <w:r>
-              <w:t>61.9</w:t>
+              <w:t>67.0</w:t>
             </w:r>
           </w:p>
         </w:tc>
@@ -421,7 +421,7 @@
           </w:tcPr>
           <w:p>
             <w:r>
-              <w:t>90.9</w:t>
+              <w:t>90.6</w:t>
             </w:r>
           </w:p>
         </w:tc>
@@ -441,7 +441,7 @@
           </w:tcPr>
           <w:p>
             <w:r>
-              <w:t>65.4</w:t>
+              <w:t>67.9</w:t>
             </w:r>
           </w:p>
         </w:tc>
@@ -451,7 +451,7 @@
           </w:tcPr>
           <w:p>
             <w:r>
-              <w:t>352</w:t>
+              <w:t>14</w:t>
             </w:r>
           </w:p>
         </w:tc>
@@ -463,7 +463,7 @@
           </w:tcPr>
           <w:p>
             <w:r>
-              <w:t>2026-06-28 04:18:10</w:t>
+              <w:t>2026-06-28 06:48:20</w:t>
             </w:r>
           </w:p>
         </w:tc>
@@ -473,7 +473,7 @@
           </w:tcPr>
           <w:p>
             <w:r>
-              <w:t>99</w:t>
+              <w:t>103</w:t>
             </w:r>
           </w:p>
         </w:tc>
@@ -483,7 +483,7 @@
           </w:tcPr>
           <w:p>
             <w:r>
-              <w:t>59.5</w:t>
+              <w:t>67.0</w:t>
             </w:r>
           </w:p>
         </w:tc>
@@ -493,7 +493,7 @@
           </w:tcPr>
           <w:p>
             <w:r>
-              <w:t>90.9</w:t>
+              <w:t>90.4</w:t>
             </w:r>
           </w:p>
         </w:tc>
@@ -513,7 +513,7 @@
           </w:tcPr>
           <w:p>
             <w:r>
-              <w:t>64.2</w:t>
+              <w:t>67.8</w:t>
             </w:r>
           </w:p>
         </w:tc>
@@ -523,7 +523,7 @@
           </w:tcPr>
           <w:p>
             <w:r>
-              <w:t>411</w:t>
+              <w:t>14</w:t>
             </w:r>
           </w:p>
         </w:tc>
@@ -535,7 +535,7 @@
           </w:tcPr>
           <w:p>
             <w:r>
-              <w:t>2026-06-28 04:33:10</w:t>
+              <w:t>2026-06-28 07:18:24</w:t>
             </w:r>
           </w:p>
         </w:tc>
@@ -545,7 +545,7 @@
           </w:tcPr>
           <w:p>
             <w:r>
-              <w:t>100</w:t>
+              <w:t>103</w:t>
             </w:r>
           </w:p>
         </w:tc>
@@ -555,7 +555,7 @@
           </w:tcPr>
           <w:p>
             <w:r>
-              <w:t>61.4</w:t>
+              <w:t>67.0</w:t>
             </w:r>
           </w:p>
         </w:tc>
@@ -565,7 +565,7 @@
           </w:tcPr>
           <w:p>
             <w:r>
-              <w:t>90.9</w:t>
+              <w:t>90.2</w:t>
             </w:r>
           </w:p>
         </w:tc>
@@ -585,7 +585,7 @@
           </w:tcPr>
           <w:p>
             <w:r>
-              <w:t>65.2</w:t>
+              <w:t>67.8</w:t>
             </w:r>
           </w:p>
         </w:tc>
@@ -595,7 +595,7 @@
           </w:tcPr>
           <w:p>
             <w:r>
-              <w:t>471</w:t>
+              <w:t>16</w:t>
             </w:r>
           </w:p>
         </w:tc>
@@ -607,7 +607,7 @@
           </w:tcPr>
           <w:p>
             <w:r>
-              <w:t>2026-06-28 05:00:13</w:t>
+              <w:t>2026-06-28 07:48:31</w:t>
             </w:r>
           </w:p>
         </w:tc>
@@ -617,7 +617,7 @@
           </w:tcPr>
           <w:p>
             <w:r>
-              <w:t>101</w:t>
+              <w:t>103</w:t>
             </w:r>
           </w:p>
         </w:tc>
@@ -627,7 +627,7 @@
           </w:tcPr>
           <w:p>
             <w:r>
-              <w:t>63.6</w:t>
+              <w:t>67.0</w:t>
             </w:r>
           </w:p>
         </w:tc>
@@ -637,7 +637,7 @@
           </w:tcPr>
           <w:p>
             <w:r>
-              <w:t>90.9</w:t>
+              <w:t>90.0</w:t>
             </w:r>
           </w:p>
         </w:tc>
@@ -657,7 +657,7 @@
           </w:tcPr>
           <w:p>
             <w:r>
-              <w:t>66.3</w:t>
+              <w:t>67.8</w:t>
             </w:r>
           </w:p>
         </w:tc>
@@ -667,7 +667,7 @@
           </w:tcPr>
           <w:p>
             <w:r>
-              <w:t>89</w:t>
+              <w:t>3</w:t>
             </w:r>
           </w:p>
         </w:tc>
@@ -679,7 +679,7 @@
           </w:tcPr>
           <w:p>
             <w:r>
-              <w:t>2026-06-28 05:30:14</w:t>
+              <w:t>2026-06-28 08:03:28</w:t>
             </w:r>
           </w:p>
         </w:tc>
@@ -689,7 +689,7 @@
           </w:tcPr>
           <w:p>
             <w:r>
-              <w:t>102</w:t>
+              <w:t>104</w:t>
             </w:r>
           </w:p>
         </w:tc>
@@ -699,7 +699,7 @@
           </w:tcPr>
           <w:p>
             <w:r>
-              <w:t>65.7</w:t>
+              <w:t>69.3</w:t>
             </w:r>
           </w:p>
         </w:tc>
@@ -709,7 +709,7 @@
           </w:tcPr>
           <w:p>
             <w:r>
-              <w:t>90.9</w:t>
+              <w:t>89.9</w:t>
             </w:r>
           </w:p>
         </w:tc>
@@ -729,7 +729,7 @@
           </w:tcPr>
           <w:p>
             <w:r>
-              <w:t>67.3</w:t>
+              <w:t>68.9</w:t>
             </w:r>
           </w:p>
         </w:tc>
@@ -739,7 +739,7 @@
           </w:tcPr>
           <w:p>
             <w:r>
-              <w:t>209</w:t>
+              <w:t>25</w:t>
             </w:r>
           </w:p>
         </w:tc>
@@ -751,7 +751,7 @@
           </w:tcPr>
           <w:p>
             <w:r>
-              <w:t>2026-06-28 06:00:22</w:t>
+              <w:t>2026-06-28 08:18:15</w:t>
             </w:r>
           </w:p>
         </w:tc>
@@ -761,7 +761,7 @@
           </w:tcPr>
           <w:p>
             <w:r>
-              <w:t>102</w:t>
+              <w:t>105</w:t>
             </w:r>
           </w:p>
         </w:tc>
@@ -771,7 +771,7 @@
           </w:tcPr>
           <w:p>
             <w:r>
-              <w:t>65.7</w:t>
+              <w:t>72.0</w:t>
             </w:r>
           </w:p>
         </w:tc>
@@ -781,7 +781,7 @@
           </w:tcPr>
           <w:p>
             <w:r>
-              <w:t>90.7</w:t>
+              <w:t>89.9</w:t>
             </w:r>
           </w:p>
         </w:tc>
@@ -801,7 +801,7 @@
           </w:tcPr>
           <w:p>
             <w:r>
-              <w:t>67.3</w:t>
+              <w:t>70.2</w:t>
             </w:r>
           </w:p>
         </w:tc>
@@ -811,7 +811,7 @@
           </w:tcPr>
           <w:p>
             <w:r>
-              <w:t>32</w:t>
+              <w:t>84</w:t>
             </w:r>
           </w:p>
         </w:tc>
@@ -823,7 +823,7 @@
           </w:tcPr>
           <w:p>
             <w:r>
-              <w:t>2026-06-28 06:18:06</w:t>
+              <w:t>2026-06-28 08:33:15</w:t>
             </w:r>
           </w:p>
         </w:tc>
@@ -833,7 +833,7 @@
           </w:tcPr>
           <w:p>
             <w:r>
-              <w:t>103</w:t>
+              <w:t>106</w:t>
             </w:r>
           </w:p>
         </w:tc>
@@ -843,7 +843,7 @@
           </w:tcPr>
           <w:p>
             <w:r>
-              <w:t>67.0</w:t>
+              <w:t>69.5</w:t>
             </w:r>
           </w:p>
         </w:tc>
@@ -853,7 +853,7 @@
           </w:tcPr>
           <w:p>
             <w:r>
-              <w:t>90.6</w:t>
+              <w:t>89.9</w:t>
             </w:r>
           </w:p>
         </w:tc>
@@ -873,7 +873,7 @@
           </w:tcPr>
           <w:p>
             <w:r>
-              <w:t>67.9</w:t>
+              <w:t>69.0</w:t>
             </w:r>
           </w:p>
         </w:tc>
@@ -883,7 +883,7 @@
           </w:tcPr>
           <w:p>
             <w:r>
-              <w:t>14</w:t>
+              <w:t>144</w:t>
             </w:r>
           </w:p>
         </w:tc>
@@ -895,7 +895,7 @@
           </w:tcPr>
           <w:p>
             <w:r>
-              <w:t>2026-06-28 06:48:20</w:t>
+              <w:t>2026-06-28 08:47:00</w:t>
             </w:r>
           </w:p>
         </w:tc>
@@ -905,7 +905,7 @@
           </w:tcPr>
           <w:p>
             <w:r>
-              <w:t>103</w:t>
+              <w:t>107</w:t>
             </w:r>
           </w:p>
         </w:tc>
@@ -915,7 +915,7 @@
           </w:tcPr>
           <w:p>
             <w:r>
-              <w:t>67.0</w:t>
+              <w:t>67.1</w:t>
             </w:r>
           </w:p>
         </w:tc>
@@ -925,7 +925,7 @@
           </w:tcPr>
           <w:p>
             <w:r>
-              <w:t>90.4</w:t>
+              <w:t>89.9</w:t>
             </w:r>
           </w:p>
         </w:tc>
@@ -955,7 +955,7 @@
           </w:tcPr>
           <w:p>
             <w:r>
-              <w:t>14</w:t>
+              <w:t>199</w:t>
             </w:r>
           </w:p>
         </w:tc>
@@ -967,7 +967,7 @@
           </w:tcPr>
           <w:p>
             <w:r>
-              <w:t>2026-06-28 07:18:24</w:t>
+              <w:t>2026-06-28 09:03:28</w:t>
             </w:r>
           </w:p>
         </w:tc>
@@ -977,7 +977,7 @@
           </w:tcPr>
           <w:p>
             <w:r>
-              <w:t>103</w:t>
+              <w:t>108</w:t>
             </w:r>
           </w:p>
         </w:tc>
@@ -987,7 +987,7 @@
           </w:tcPr>
           <w:p>
             <w:r>
-              <w:t>67.0</w:t>
+              <w:t>68.9</w:t>
             </w:r>
           </w:p>
         </w:tc>
@@ -997,7 +997,7 @@
           </w:tcPr>
           <w:p>
             <w:r>
-              <w:t>90.2</w:t>
+              <w:t>89.8</w:t>
             </w:r>
           </w:p>
         </w:tc>
@@ -1017,7 +1017,7 @@
           </w:tcPr>
           <w:p>
             <w:r>
-              <w:t>67.8</w:t>
+              <w:t>68.7</w:t>
             </w:r>
           </w:p>
         </w:tc>
@@ -1027,7 +1027,7 @@
           </w:tcPr>
           <w:p>
             <w:r>
-              <w:t>16</w:t>
+              <w:t>265</w:t>
             </w:r>
           </w:p>
         </w:tc>
@@ -1039,7 +1039,7 @@
           </w:tcPr>
           <w:p>
             <w:r>
-              <w:t>2026-06-28 07:48:31</w:t>
+              <w:t>2026-06-28 09:18:28</w:t>
             </w:r>
           </w:p>
         </w:tc>
@@ -1049,7 +1049,7 @@
           </w:tcPr>
           <w:p>
             <w:r>
-              <w:t>103</w:t>
+              <w:t>109</w:t>
             </w:r>
           </w:p>
         </w:tc>
@@ -1059,7 +1059,7 @@
           </w:tcPr>
           <w:p>
             <w:r>
-              <w:t>67.0</w:t>
+              <w:t>70.9</w:t>
             </w:r>
           </w:p>
         </w:tc>
@@ -1069,7 +1069,7 @@
           </w:tcPr>
           <w:p>
             <w:r>
-              <w:t>90.0</w:t>
+              <w:t>89.8</w:t>
             </w:r>
           </w:p>
         </w:tc>
@@ -1089,7 +1089,7 @@
           </w:tcPr>
           <w:p>
             <w:r>
-              <w:t>67.8</w:t>
+              <w:t>69.7</w:t>
             </w:r>
           </w:p>
         </w:tc>
@@ -1099,7 +1099,7 @@
           </w:tcPr>
           <w:p>
             <w:r>
-              <w:t>3</w:t>
+              <w:t>325</w:t>
             </w:r>
           </w:p>
         </w:tc>
@@ -1111,7 +1111,7 @@
           </w:tcPr>
           <w:p>
             <w:r>
-              <w:t>2026-06-28 08:03:28</w:t>
+              <w:t>2026-06-28 09:33:15</w:t>
             </w:r>
           </w:p>
         </w:tc>
@@ -1121,7 +1121,7 @@
           </w:tcPr>
           <w:p>
             <w:r>
-              <w:t>104</w:t>
+              <w:t>110</w:t>
             </w:r>
           </w:p>
         </w:tc>
@@ -1131,7 +1131,7 @@
           </w:tcPr>
           <w:p>
             <w:r>
-              <w:t>69.3</w:t>
+              <w:t>73.3</w:t>
             </w:r>
           </w:p>
         </w:tc>
@@ -1141,7 +1141,7 @@
           </w:tcPr>
           <w:p>
             <w:r>
-              <w:t>89.9</w:t>
+              <w:t>89.8</w:t>
             </w:r>
           </w:p>
         </w:tc>
@@ -1161,7 +1161,7 @@
           </w:tcPr>
           <w:p>
             <w:r>
-              <w:t>68.9</w:t>
+              <w:t>70.8</w:t>
             </w:r>
           </w:p>
         </w:tc>
@@ -1171,7 +1171,7 @@
           </w:tcPr>
           <w:p>
             <w:r>
-              <w:t>25</w:t>
+              <w:t>384</w:t>
             </w:r>
           </w:p>
         </w:tc>
@@ -1183,7 +1183,7 @@
           </w:tcPr>
           <w:p>
             <w:r>
-              <w:t>2026-06-28 08:18:15</w:t>
+              <w:t>2026-06-28 10:03:20</w:t>
             </w:r>
           </w:p>
         </w:tc>
@@ -1193,7 +1193,7 @@
           </w:tcPr>
           <w:p>
             <w:r>
-              <w:t>105</w:t>
+              <w:t>110</w:t>
             </w:r>
           </w:p>
         </w:tc>
@@ -1203,7 +1203,7 @@
           </w:tcPr>
           <w:p>
             <w:r>
-              <w:t>72.0</w:t>
+              <w:t>73.3</w:t>
             </w:r>
           </w:p>
         </w:tc>
@@ -1213,7 +1213,7 @@
           </w:tcPr>
           <w:p>
             <w:r>
-              <w:t>89.9</w:t>
+              <w:t>89.7</w:t>
             </w:r>
           </w:p>
         </w:tc>
@@ -1233,7 +1233,7 @@
           </w:tcPr>
           <w:p>
             <w:r>
-              <w:t>70.2</w:t>
+              <w:t>70.8</w:t>
             </w:r>
           </w:p>
         </w:tc>
@@ -1243,7 +1243,7 @@
           </w:tcPr>
           <w:p>
             <w:r>
-              <w:t>84</w:t>
+              <w:t>114</w:t>
             </w:r>
           </w:p>
         </w:tc>
@@ -1255,7 +1255,7 @@
           </w:tcPr>
           <w:p>
             <w:r>
-              <w:t>2026-06-28 08:33:15</w:t>
+              <w:t>2026-06-28 10:18:06</w:t>
             </w:r>
           </w:p>
         </w:tc>
@@ -1265,7 +1265,7 @@
           </w:tcPr>
           <w:p>
             <w:r>
-              <w:t>106</w:t>
+              <w:t>111</w:t>
             </w:r>
           </w:p>
         </w:tc>
@@ -1275,7 +1275,7 @@
           </w:tcPr>
           <w:p>
             <w:r>
-              <w:t>69.5</w:t>
+              <w:t>75.5</w:t>
             </w:r>
           </w:p>
         </w:tc>
@@ -1285,7 +1285,7 @@
           </w:tcPr>
           <w:p>
             <w:r>
-              <w:t>89.9</w:t>
+              <w:t>89.7</w:t>
             </w:r>
           </w:p>
         </w:tc>
@@ -1305,7 +1305,7 @@
           </w:tcPr>
           <w:p>
             <w:r>
-              <w:t>69.0</w:t>
+              <w:t>71.9</w:t>
             </w:r>
           </w:p>
         </w:tc>
@@ -1315,7 +1315,7 @@
           </w:tcPr>
           <w:p>
             <w:r>
-              <w:t>144</w:t>
+              <w:t>173</w:t>
             </w:r>
           </w:p>
         </w:tc>
@@ -1327,7 +1327,7 @@
           </w:tcPr>
           <w:p>
             <w:r>
-              <w:t>2026-06-28 08:47:00</w:t>
+              <w:t>2026-06-28 10:48:07</w:t>
             </w:r>
           </w:p>
         </w:tc>
@@ -1337,7 +1337,7 @@
           </w:tcPr>
           <w:p>
             <w:r>
-              <w:t>107</w:t>
+              <w:t>112</w:t>
             </w:r>
           </w:p>
         </w:tc>
@@ -1347,7 +1347,7 @@
           </w:tcPr>
           <w:p>
             <w:r>
-              <w:t>67.1</w:t>
+              <w:t>73.1</w:t>
             </w:r>
           </w:p>
         </w:tc>
@@ -1357,7 +1357,7 @@
           </w:tcPr>
           <w:p>
             <w:r>
-              <w:t>89.9</w:t>
+              <w:t>89.6</w:t>
             </w:r>
           </w:p>
         </w:tc>
@@ -1377,7 +1377,7 @@
           </w:tcPr>
           <w:p>
             <w:r>
-              <w:t>67.8</w:t>
+              <w:t>70.7</w:t>
             </w:r>
           </w:p>
         </w:tc>
@@ -1387,7 +1387,7 @@
           </w:tcPr>
           <w:p>
             <w:r>
-              <w:t>199</w:t>
+              <w:t>44</w:t>
             </w:r>
           </w:p>
         </w:tc>
@@ -1399,7 +1399,7 @@
           </w:tcPr>
           <w:p>
             <w:r>
-              <w:t>2026-06-28 09:03:28</w:t>
+              <w:t>2026-06-28 11:02:37</w:t>
             </w:r>
           </w:p>
         </w:tc>
@@ -1409,7 +1409,7 @@
           </w:tcPr>
           <w:p>
             <w:r>
-              <w:t>108</w:t>
+              <w:t>113</w:t>
             </w:r>
           </w:p>
         </w:tc>
@@ -1419,7 +1419,7 @@
           </w:tcPr>
           <w:p>
             <w:r>
-              <w:t>68.9</w:t>
+              <w:t>70.7</w:t>
             </w:r>
           </w:p>
         </w:tc>
@@ -1429,7 +1429,7 @@
           </w:tcPr>
           <w:p>
             <w:r>
-              <w:t>89.8</w:t>
+              <w:t>89.5</w:t>
             </w:r>
           </w:p>
         </w:tc>
@@ -1449,7 +1449,7 @@
           </w:tcPr>
           <w:p>
             <w:r>
-              <w:t>68.7</w:t>
+              <w:t>69.5</w:t>
             </w:r>
           </w:p>
         </w:tc>
@@ -1459,7 +1459,7 @@
           </w:tcPr>
           <w:p>
             <w:r>
-              <w:t>265</w:t>
+              <w:t>102</w:t>
             </w:r>
           </w:p>
         </w:tc>
@@ -1471,7 +1471,7 @@
           </w:tcPr>
           <w:p>
             <w:r>
-              <w:t>2026-06-28 09:18:28</w:t>
+              <w:t>2026-06-28 11:32:52</w:t>
             </w:r>
           </w:p>
         </w:tc>
@@ -1481,7 +1481,7 @@
           </w:tcPr>
           <w:p>
             <w:r>
-              <w:t>109</w:t>
+              <w:t>113</w:t>
             </w:r>
           </w:p>
         </w:tc>
@@ -1491,7 +1491,7 @@
           </w:tcPr>
           <w:p>
             <w:r>
-              <w:t>70.9</w:t>
+              <w:t>70.7</w:t>
             </w:r>
           </w:p>
         </w:tc>
@@ -1501,7 +1501,7 @@
           </w:tcPr>
           <w:p>
             <w:r>
-              <w:t>89.8</w:t>
+              <w:t>89.4</w:t>
             </w:r>
           </w:p>
         </w:tc>
@@ -1521,7 +1521,7 @@
           </w:tcPr>
           <w:p>
             <w:r>
-              <w:t>69.7</w:t>
+              <w:t>69.5</w:t>
             </w:r>
           </w:p>
         </w:tc>
@@ -1531,7 +1531,7 @@
           </w:tcPr>
           <w:p>
             <w:r>
-              <w:t>325</w:t>
+              <w:t>223</w:t>
             </w:r>
           </w:p>
         </w:tc>
@@ -1543,7 +1543,7 @@
           </w:tcPr>
           <w:p>
             <w:r>
-              <w:t>2026-06-28 09:33:15</w:t>
+              <w:t>2026-06-28 11:48:20</w:t>
             </w:r>
           </w:p>
         </w:tc>
@@ -1553,7 +1553,7 @@
           </w:tcPr>
           <w:p>
             <w:r>
-              <w:t>110</w:t>
+              <w:t>114</w:t>
             </w:r>
           </w:p>
         </w:tc>
@@ -1563,7 +1563,7 @@
           </w:tcPr>
           <w:p>
             <w:r>
-              <w:t>73.3</w:t>
+              <w:t>72.8</w:t>
             </w:r>
           </w:p>
         </w:tc>
@@ -1573,7 +1573,7 @@
           </w:tcPr>
           <w:p>
             <w:r>
-              <w:t>89.8</w:t>
+              <w:t>89.4</w:t>
             </w:r>
           </w:p>
         </w:tc>
@@ -1593,7 +1593,7 @@
           </w:tcPr>
           <w:p>
             <w:r>
-              <w:t>70.8</w:t>
+              <w:t>70.5</w:t>
             </w:r>
           </w:p>
         </w:tc>
@@ -1603,7 +1603,7 @@
           </w:tcPr>
           <w:p>
             <w:r>
-              <w:t>384</w:t>
+              <w:t>285</w:t>
             </w:r>
           </w:p>
         </w:tc>
@@ -1615,7 +1615,7 @@
           </w:tcPr>
           <w:p>
             <w:r>
-              <w:t>2026-06-28 10:03:20</w:t>
+              <w:t>2026-06-28 12:03:07</w:t>
             </w:r>
           </w:p>
         </w:tc>
@@ -1625,7 +1625,7 @@
           </w:tcPr>
           <w:p>
             <w:r>
-              <w:t>110</w:t>
+              <w:t>115</w:t>
             </w:r>
           </w:p>
         </w:tc>
@@ -1635,7 +1635,7 @@
           </w:tcPr>
           <w:p>
             <w:r>
-              <w:t>73.3</w:t>
+              <w:t>70.4</w:t>
             </w:r>
           </w:p>
         </w:tc>
@@ -1645,7 +1645,7 @@
           </w:tcPr>
           <w:p>
             <w:r>
-              <w:t>89.7</w:t>
+              <w:t>89.4</w:t>
             </w:r>
           </w:p>
         </w:tc>
@@ -1665,7 +1665,7 @@
           </w:tcPr>
           <w:p>
             <w:r>
-              <w:t>70.8</w:t>
+              <w:t>69.3</w:t>
             </w:r>
           </w:p>
         </w:tc>
@@ -1675,7 +1675,7 @@
           </w:tcPr>
           <w:p>
             <w:r>
-              <w:t>114</w:t>
+              <w:t>344</w:t>
             </w:r>
           </w:p>
         </w:tc>
@@ -1687,7 +1687,7 @@
           </w:tcPr>
           <w:p>
             <w:r>
-              <w:t>2026-06-28 10:18:06</w:t>
+              <w:t>2026-06-28 12:16:52</w:t>
             </w:r>
           </w:p>
         </w:tc>
@@ -1697,7 +1697,7 @@
           </w:tcPr>
           <w:p>
             <w:r>
-              <w:t>111</w:t>
+              <w:t>116</w:t>
             </w:r>
           </w:p>
         </w:tc>
@@ -1707,7 +1707,7 @@
           </w:tcPr>
           <w:p>
             <w:r>
-              <w:t>75.5</w:t>
+              <w:t>72.4</w:t>
             </w:r>
           </w:p>
         </w:tc>
@@ -1717,7 +1717,7 @@
           </w:tcPr>
           <w:p>
             <w:r>
-              <w:t>89.7</w:t>
+              <w:t>89.4</w:t>
             </w:r>
           </w:p>
         </w:tc>
@@ -1737,7 +1737,7 @@
           </w:tcPr>
           <w:p>
             <w:r>
-              <w:t>71.9</w:t>
+              <w:t>70.3</w:t>
             </w:r>
           </w:p>
         </w:tc>
@@ -1747,7 +1747,7 @@
           </w:tcPr>
           <w:p>
             <w:r>
-              <w:t>173</w:t>
+              <w:t>399</w:t>
             </w:r>
           </w:p>
         </w:tc>
@@ -1768,7 +1768,7 @@
     </w:p>
     <w:p>
       <w:r>
-        <w:t>Section score: 75.5 / 100  (Grade: C+)</w:t>
+        <w:t>Section score: 72.4 / 100  (Grade: C)</w:t>
       </w:r>
     </w:p>
     <w:p>
@@ -1879,7 +1879,7 @@
           </w:tcPr>
           <w:p>
             <w:r>
-              <w:t>94.9</w:t>
+              <w:t>83.4</w:t>
             </w:r>
           </w:p>
         </w:tc>
@@ -1889,7 +1889,7 @@
           </w:tcPr>
           <w:p>
             <w:r>
-              <w:t>14.2</w:t>
+              <w:t>12.5</w:t>
             </w:r>
           </w:p>
         </w:tc>
@@ -1911,7 +1911,7 @@
           </w:tcPr>
           <w:p>
             <w:r>
-              <w:t>51.9</w:t>
+              <w:t>47.4</w:t>
             </w:r>
           </w:p>
         </w:tc>
@@ -1921,7 +1921,7 @@
           </w:tcPr>
           <w:p>
             <w:r>
-              <w:t>7.8</w:t>
+              <w:t>7.1</w:t>
             </w:r>
           </w:p>
         </w:tc>
@@ -2007,7 +2007,7 @@
           </w:tcPr>
           <w:p>
             <w:r>
-              <w:t>73.7</w:t>
+              <w:t>71.7</w:t>
             </w:r>
           </w:p>
         </w:tc>
@@ -2017,7 +2017,7 @@
           </w:tcPr>
           <w:p>
             <w:r>
-              <w:t>7.4</w:t>
+              <w:t>7.2</w:t>
             </w:r>
           </w:p>
         </w:tc>
@@ -2039,7 +2039,7 @@
           </w:tcPr>
           <w:p>
             <w:r>
-              <w:t>44.3</w:t>
+              <w:t>42.4</w:t>
             </w:r>
           </w:p>
         </w:tc>
@@ -2049,7 +2049,7 @@
           </w:tcPr>
           <w:p>
             <w:r>
-              <w:t>11.1</w:t>
+              <w:t>10.6</w:t>
             </w:r>
           </w:p>
         </w:tc>
@@ -2090,7 +2090,7 @@
           </w:tcPr>
           <w:p>
             <w:r>
-              <w:t>$606.41</w:t>
+              <w:t>$601.12</w:t>
             </w:r>
           </w:p>
         </w:tc>
@@ -2112,7 +2112,7 @@
           </w:tcPr>
           <w:p>
             <w:r>
-              <w:t>21.28%</w:t>
+              <w:t>20.22%</w:t>
             </w:r>
           </w:p>
         </w:tc>
@@ -2134,7 +2134,7 @@
           </w:tcPr>
           <w:p>
             <w:r>
-              <w:t>$22.47</w:t>
+              <w:t>$16.70</w:t>
             </w:r>
           </w:p>
         </w:tc>
@@ -2178,7 +2178,7 @@
           </w:tcPr>
           <w:p>
             <w:r>
-              <w:t>0.6216</w:t>
+              <w:t>0.6121</w:t>
             </w:r>
           </w:p>
         </w:tc>
@@ -2200,7 +2200,7 @@
           </w:tcPr>
           <w:p>
             <w:r>
-              <w:t>0.5000 / 0.6484</w:t>
+              <w:t>0.5000 / 0.6354</w:t>
             </w:r>
           </w:p>
         </w:tc>
@@ -2222,7 +2222,7 @@
           </w:tcPr>
           <w:p>
             <w:r>
-              <w:t>1.1152</w:t>
+              <w:t>1.0795</w:t>
             </w:r>
           </w:p>
         </w:tc>
@@ -2244,7 +2244,7 @@
           </w:tcPr>
           <w:p>
             <w:r>
-              <w:t>112 / 111</w:t>
+              <w:t>117 / 116</w:t>
             </w:r>
           </w:p>
         </w:tc>
@@ -2266,7 +2266,7 @@
           </w:tcPr>
           <w:p>
             <w:r>
-              <w:t>$0.20</w:t>
+              <w:t>$0.14</w:t>
             </w:r>
           </w:p>
         </w:tc>
@@ -2397,7 +2397,7 @@
           </w:tcPr>
           <w:p>
             <w:r>
-              <w:t>0.440</w:t>
+              <w:t>0.500</w:t>
             </w:r>
           </w:p>
         </w:tc>
@@ -2449,7 +2449,7 @@
           </w:tcPr>
           <w:p>
             <w:r>
-              <w:t>0.510</w:t>
+              <w:t>0.530</w:t>
             </w:r>
           </w:p>
         </w:tc>
@@ -2479,7 +2479,7 @@
           </w:tcPr>
           <w:p>
             <w:r>
-              <w:t>$4.80</w:t>
+              <w:t>$4.43</w:t>
             </w:r>
           </w:p>
         </w:tc>
@@ -2501,7 +2501,7 @@
           </w:tcPr>
           <w:p>
             <w:r>
-              <w:t>0.470</w:t>
+              <w:t>0.670</w:t>
             </w:r>
           </w:p>
         </w:tc>
@@ -2511,7 +2511,7 @@
           </w:tcPr>
           <w:p>
             <w:r>
-              <w:t>down</w:t>
+              <w:t>up</w:t>
             </w:r>
           </w:p>
         </w:tc>
@@ -2521,7 +2521,7 @@
           </w:tcPr>
           <w:p>
             <w:r>
-              <w:t>Yes</w:t>
+              <w:t>No</w:t>
             </w:r>
           </w:p>
         </w:tc>
@@ -2531,7 +2531,7 @@
           </w:tcPr>
           <w:p>
             <w:r>
-              <w:t>$5.64</w:t>
+              <w:t>$-5.00</w:t>
             </w:r>
           </w:p>
         </w:tc>
@@ -2553,7 +2553,7 @@
           </w:tcPr>
           <w:p>
             <w:r>
-              <w:t>0.530</w:t>
+              <w:t>0.510</w:t>
             </w:r>
           </w:p>
         </w:tc>
@@ -2583,7 +2583,7 @@
           </w:tcPr>
           <w:p>
             <w:r>
-              <w:t>$4.43</w:t>
+              <w:t>$4.80</w:t>
             </w:r>
           </w:p>
         </w:tc>
@@ -2605,7 +2605,7 @@
           </w:tcPr>
           <w:p>
             <w:r>
-              <w:t>0.570</w:t>
+              <w:t>0.430</w:t>
             </w:r>
           </w:p>
         </w:tc>
@@ -2615,7 +2615,7 @@
           </w:tcPr>
           <w:p>
             <w:r>
-              <w:t>down</w:t>
+              <w:t>up</w:t>
             </w:r>
           </w:p>
         </w:tc>
@@ -2625,7 +2625,7 @@
           </w:tcPr>
           <w:p>
             <w:r>
-              <w:t>Yes</w:t>
+              <w:t>No</w:t>
             </w:r>
           </w:p>
         </w:tc>
@@ -2635,7 +2635,7 @@
           </w:tcPr>
           <w:p>
             <w:r>
-              <w:t>$3.77</w:t>
+              <w:t>$-5.00</w:t>
             </w:r>
           </w:p>
         </w:tc>
@@ -2657,7 +2657,7 @@
           </w:tcPr>
           <w:p>
             <w:r>
-              <w:t>0.420</w:t>
+              <w:t>0.440</w:t>
             </w:r>
           </w:p>
         </w:tc>
@@ -2709,7 +2709,7 @@
           </w:tcPr>
           <w:p>
             <w:r>
-              <w:t>0.420</w:t>
+              <w:t>0.510</w:t>
             </w:r>
           </w:p>
         </w:tc>
@@ -2719,7 +2719,7 @@
           </w:tcPr>
           <w:p>
             <w:r>
-              <w:t>up</w:t>
+              <w:t>down</w:t>
             </w:r>
           </w:p>
         </w:tc>
@@ -2729,7 +2729,7 @@
           </w:tcPr>
           <w:p>
             <w:r>
-              <w:t>No</w:t>
+              <w:t>Yes</w:t>
             </w:r>
           </w:p>
         </w:tc>
@@ -2739,7 +2739,7 @@
           </w:tcPr>
           <w:p>
             <w:r>
-              <w:t>$-5.00</w:t>
+              <w:t>$4.80</w:t>
             </w:r>
           </w:p>
         </w:tc>
@@ -2761,7 +2761,7 @@
           </w:tcPr>
           <w:p>
             <w:r>
-              <w:t>0.450</w:t>
+              <w:t>0.470</w:t>
             </w:r>
           </w:p>
         </w:tc>
@@ -2791,7 +2791,7 @@
           </w:tcPr>
           <w:p>
             <w:r>
-              <w:t>$6.11</w:t>
+              <w:t>$5.64</w:t>
             </w:r>
           </w:p>
         </w:tc>
@@ -2813,7 +2813,7 @@
           </w:tcPr>
           <w:p>
             <w:r>
-              <w:t>0.500</w:t>
+              <w:t>0.530</w:t>
             </w:r>
           </w:p>
         </w:tc>
@@ -2843,7 +2843,7 @@
           </w:tcPr>
           <w:p>
             <w:r>
-              <w:t>$5.00</w:t>
+              <w:t>$4.43</w:t>
             </w:r>
           </w:p>
         </w:tc>
@@ -2865,7 +2865,7 @@
           </w:tcPr>
           <w:p>
             <w:r>
-              <w:t>0.660</w:t>
+              <w:t>0.570</w:t>
             </w:r>
           </w:p>
         </w:tc>
@@ -2895,7 +2895,7 @@
           </w:tcPr>
           <w:p>
             <w:r>
-              <w:t>$2.58</w:t>
+              <w:t>$3.77</w:t>
             </w:r>
           </w:p>
         </w:tc>
@@ -2917,7 +2917,7 @@
           </w:tcPr>
           <w:p>
             <w:r>
-              <w:t>0.520</w:t>
+              <w:t>0.420</w:t>
             </w:r>
           </w:p>
         </w:tc>
@@ -2927,7 +2927,7 @@
           </w:tcPr>
           <w:p>
             <w:r>
-              <w:t>down</w:t>
+              <w:t>up</w:t>
             </w:r>
           </w:p>
         </w:tc>
@@ -2937,7 +2937,7 @@
           </w:tcPr>
           <w:p>
             <w:r>
-              <w:t>Yes</w:t>
+              <w:t>No</w:t>
             </w:r>
           </w:p>
         </w:tc>
@@ -2947,7 +2947,7 @@
           </w:tcPr>
           <w:p>
             <w:r>
-              <w:t>$4.62</w:t>
+              <w:t>$-5.00</w:t>
             </w:r>
           </w:p>
         </w:tc>
@@ -2969,7 +2969,7 @@
           </w:tcPr>
           <w:p>
             <w:r>
-              <w:t>0.510</w:t>
+              <w:t>0.420</w:t>
             </w:r>
           </w:p>
         </w:tc>
@@ -2979,7 +2979,7 @@
           </w:tcPr>
           <w:p>
             <w:r>
-              <w:t>down</w:t>
+              <w:t>up</w:t>
             </w:r>
           </w:p>
         </w:tc>
@@ -2989,7 +2989,7 @@
           </w:tcPr>
           <w:p>
             <w:r>
-              <w:t>Yes</w:t>
+              <w:t>No</w:t>
             </w:r>
           </w:p>
         </w:tc>
@@ -2999,7 +2999,7 @@
           </w:tcPr>
           <w:p>
             <w:r>
-              <w:t>$4.80</w:t>
+              <w:t>$-5.00</w:t>
             </w:r>
           </w:p>
         </w:tc>
@@ -3021,7 +3021,7 @@
           </w:tcPr>
           <w:p>
             <w:r>
-              <w:t>0.550</w:t>
+              <w:t>0.450</w:t>
             </w:r>
           </w:p>
         </w:tc>
@@ -3051,7 +3051,7 @@
           </w:tcPr>
           <w:p>
             <w:r>
-              <w:t>$4.09</w:t>
+              <w:t>$6.11</w:t>
             </w:r>
           </w:p>
         </w:tc>
@@ -3073,7 +3073,7 @@
           </w:tcPr>
           <w:p>
             <w:r>
-              <w:t>0.590</w:t>
+              <w:t>0.500</w:t>
             </w:r>
           </w:p>
         </w:tc>
@@ -3083,7 +3083,7 @@
           </w:tcPr>
           <w:p>
             <w:r>
-              <w:t>up</w:t>
+              <w:t>down</w:t>
             </w:r>
           </w:p>
         </w:tc>
@@ -3093,7 +3093,7 @@
           </w:tcPr>
           <w:p>
             <w:r>
-              <w:t>No</w:t>
+              <w:t>Yes</w:t>
             </w:r>
           </w:p>
         </w:tc>
@@ -3103,7 +3103,7 @@
           </w:tcPr>
           <w:p>
             <w:r>
-              <w:t>$-5.00</w:t>
+              <w:t>$5.00</w:t>
             </w:r>
           </w:p>
         </w:tc>
@@ -3125,7 +3125,7 @@
           </w:tcPr>
           <w:p>
             <w:r>
-              <w:t>0.520</w:t>
+              <w:t>0.660</w:t>
             </w:r>
           </w:p>
         </w:tc>
@@ -3135,7 +3135,7 @@
           </w:tcPr>
           <w:p>
             <w:r>
-              <w:t>up</w:t>
+              <w:t>down</w:t>
             </w:r>
           </w:p>
         </w:tc>
@@ -3145,7 +3145,7 @@
           </w:tcPr>
           <w:p>
             <w:r>
-              <w:t>No</w:t>
+              <w:t>Yes</w:t>
             </w:r>
           </w:p>
         </w:tc>
@@ -3155,7 +3155,7 @@
           </w:tcPr>
           <w:p>
             <w:r>
-              <w:t>$-5.00</w:t>
+              <w:t>$2.58</w:t>
             </w:r>
           </w:p>
         </w:tc>
@@ -3176,7 +3176,7 @@
     </w:p>
     <w:p>
       <w:r>
-        <w:t>Section score: 89.6 / 100  (Grade: B+)</w:t>
+        <w:t>Section score: 89.3 / 100  (Grade: B+)</w:t>
       </w:r>
     </w:p>
     <w:p>
@@ -3319,7 +3319,7 @@
           </w:tcPr>
           <w:p>
             <w:r>
-              <w:t>90.4</w:t>
+              <w:t>88.8</w:t>
             </w:r>
           </w:p>
         </w:tc>
@@ -3329,7 +3329,7 @@
           </w:tcPr>
           <w:p>
             <w:r>
-              <w:t>13.6</w:t>
+              <w:t>13.3</w:t>
             </w:r>
           </w:p>
         </w:tc>
@@ -3433,17 +3433,17 @@
     </w:tbl>
     <w:p>
       <w:r>
-        <w:t>Ticks: 243 · Reconciled: True · Readiness: not_ready</w:t>
+        <w:t>Ticks: 467 · Reconciled: True · Readiness: not_ready</w:t>
       </w:r>
     </w:p>
     <w:p>
       <w:r>
-        <w:t>Candidates created: 54575 · Terminals: {'accepted': 86, 'rejected': 44366, 'skipped': 9828, 'expired': 0, 'missing_data': 295}</w:t>
+        <w:t>Candidates created: 55301 · Terminals: {'accepted': 86, 'rejected': 44619, 'skipped': 10299, 'expired': 0, 'missing_data': 297}</w:t>
       </w:r>
     </w:p>
     <w:p>
       <w:r>
-        <w:t>Rejected by stage: {'directional': 34033, 'execution_gate': 183, 'context_gate': 879, 'directional_allowlist': 1364, 'down_bias_gate': 538, 'mtf_gate': 276, 'grok_decider': 3540, 'execution_realistic': 3, 'verifier': 61, 'mispricing_gate': 50, 'baseline_cohort_gate': 3439}</w:t>
+        <w:t>Rejected by stage: {'directional': 34160, 'execution_gate': 209, 'context_gate': 879, 'directional_allowlist': 1364, 'down_bias_gate': 538, 'mtf_gate': 276, 'grok_decider': 3540, 'execution_realistic': 3, 'verifier': 61, 'mispricing_gate': 50, 'baseline_cohort_gate': 3539}</w:t>
       </w:r>
     </w:p>
     <w:p>
@@ -4374,7 +4374,7 @@
           </w:tcPr>
           <w:p>
             <w:r>
-              <w:t>0.4118</w:t>
+              <w:t>0.4167</w:t>
             </w:r>
           </w:p>
         </w:tc>
@@ -4396,7 +4396,7 @@
           </w:tcPr>
           <w:p>
             <w:r>
-              <w:t>0.4785</w:t>
+              <w:t>0.4756</w:t>
             </w:r>
           </w:p>
         </w:tc>
@@ -4426,7 +4426,7 @@
     </w:tbl>
     <w:p>
       <w:r>
-        <w:t>TV alerts: received 1192 · valid 1173 · rejected 2</w:t>
+        <w:t>TV alerts: received 1299 · valid 1280 · rejected 2</w:t>
       </w:r>
     </w:p>
     <w:sectPr>

</xml_diff>

<commit_message>
chore(reports): VPS full report 2026-06-28 21:34 UTC (133 settled, WR 63.9%, PF 1.2525, grade C+)
</commit_message>
<xml_diff>
--- a/vps_full_reports/latest/report.docx
+++ b/vps_full_reports/latest/report.docx
@@ -20,7 +20,7 @@
           <w:color w:val="666666"/>
           <w:sz w:val="20"/>
         </w:rPr>
-        <w:t>PAPER ONLY  ·  reconciled=True  ·  ticks=367</w:t>
+        <w:t>PAPER ONLY  ·  reconciled=True  ·  ticks=262</w:t>
       </w:r>
     </w:p>
     <w:p>
@@ -33,7 +33,7 @@
     </w:p>
     <w:p>
       <w:r>
-        <w:t>Overall score: 74.1 / 100  (Grade: C)</w:t>
+        <w:t>Overall score: 73.6 / 100  (Grade: C)</w:t>
       </w:r>
     </w:p>
     <w:tbl>
@@ -107,7 +107,7 @@
           </w:tcPr>
           <w:p>
             <w:r>
-              <w:t>80.8</w:t>
+              <w:t>79.9</w:t>
             </w:r>
           </w:p>
         </w:tc>
@@ -117,7 +117,7 @@
           </w:tcPr>
           <w:p>
             <w:r>
-              <w:t>B</w:t>
+              <w:t>C+</w:t>
             </w:r>
           </w:p>
         </w:tc>
@@ -149,7 +149,7 @@
           </w:tcPr>
           <w:p>
             <w:r>
-              <w:t>87.9</w:t>
+              <w:t>87.7</w:t>
             </w:r>
           </w:p>
         </w:tc>
@@ -319,7 +319,7 @@
           </w:tcPr>
           <w:p>
             <w:r>
-              <w:t>2026-06-28 14:16:37</w:t>
+              <w:t>2026-06-28 15:30:37</w:t>
             </w:r>
           </w:p>
         </w:tc>
@@ -329,7 +329,7 @@
           </w:tcPr>
           <w:p>
             <w:r>
-              <w:t>120</w:t>
+              <w:t>121</w:t>
             </w:r>
           </w:p>
         </w:tc>
@@ -339,7 +339,7 @@
           </w:tcPr>
           <w:p>
             <w:r>
-              <w:t>74.9</w:t>
+              <w:t>76.3</w:t>
             </w:r>
           </w:p>
         </w:tc>
@@ -349,7 +349,7 @@
           </w:tcPr>
           <w:p>
             <w:r>
-              <w:t>89.1</w:t>
+              <w:t>88.8</w:t>
             </w:r>
           </w:p>
         </w:tc>
@@ -369,7 +369,7 @@
           </w:tcPr>
           <w:p>
             <w:r>
-              <w:t>71.5</w:t>
+              <w:t>72.1</w:t>
             </w:r>
           </w:p>
         </w:tc>
@@ -379,7 +379,7 @@
           </w:tcPr>
           <w:p>
             <w:r>
-              <w:t>55</w:t>
+              <w:t>351</w:t>
             </w:r>
           </w:p>
         </w:tc>
@@ -391,7 +391,7 @@
           </w:tcPr>
           <w:p>
             <w:r>
-              <w:t>2026-06-28 14:46:37</w:t>
+              <w:t>2026-06-28 15:30:52</w:t>
             </w:r>
           </w:p>
         </w:tc>
@@ -401,7 +401,7 @@
           </w:tcPr>
           <w:p>
             <w:r>
-              <w:t>120</w:t>
+              <w:t>122</w:t>
             </w:r>
           </w:p>
         </w:tc>
@@ -411,7 +411,7 @@
           </w:tcPr>
           <w:p>
             <w:r>
-              <w:t>74.9</w:t>
+              <w:t>76.8</w:t>
             </w:r>
           </w:p>
         </w:tc>
@@ -421,7 +421,7 @@
           </w:tcPr>
           <w:p>
             <w:r>
-              <w:t>88.9</w:t>
+              <w:t>88.8</w:t>
             </w:r>
           </w:p>
         </w:tc>
@@ -441,7 +441,7 @@
           </w:tcPr>
           <w:p>
             <w:r>
-              <w:t>71.4</w:t>
+              <w:t>72.3</w:t>
             </w:r>
           </w:p>
         </w:tc>
@@ -451,7 +451,7 @@
           </w:tcPr>
           <w:p>
             <w:r>
-              <w:t>175</w:t>
+              <w:t>352</w:t>
             </w:r>
           </w:p>
         </w:tc>
@@ -463,7 +463,7 @@
           </w:tcPr>
           <w:p>
             <w:r>
-              <w:t>2026-06-28 15:00:37</w:t>
+              <w:t>2026-06-28 16:00:52</w:t>
             </w:r>
           </w:p>
         </w:tc>
@@ -473,7 +473,7 @@
           </w:tcPr>
           <w:p>
             <w:r>
-              <w:t>121</w:t>
+              <w:t>122</w:t>
             </w:r>
           </w:p>
         </w:tc>
@@ -483,7 +483,7 @@
           </w:tcPr>
           <w:p>
             <w:r>
-              <w:t>76.3</w:t>
+              <w:t>76.8</w:t>
             </w:r>
           </w:p>
         </w:tc>
@@ -493,7 +493,7 @@
           </w:tcPr>
           <w:p>
             <w:r>
-              <w:t>88.9</w:t>
+              <w:t>88.6</w:t>
             </w:r>
           </w:p>
         </w:tc>
@@ -513,7 +513,7 @@
           </w:tcPr>
           <w:p>
             <w:r>
-              <w:t>72.1</w:t>
+              <w:t>72.3</w:t>
             </w:r>
           </w:p>
         </w:tc>
@@ -523,7 +523,7 @@
           </w:tcPr>
           <w:p>
             <w:r>
-              <w:t>231</w:t>
+              <w:t>472</w:t>
             </w:r>
           </w:p>
         </w:tc>
@@ -535,7 +535,7 @@
           </w:tcPr>
           <w:p>
             <w:r>
-              <w:t>2026-06-28 15:30:37</w:t>
+              <w:t>2026-06-28 16:01:07</w:t>
             </w:r>
           </w:p>
         </w:tc>
@@ -545,7 +545,7 @@
           </w:tcPr>
           <w:p>
             <w:r>
-              <w:t>121</w:t>
+              <w:t>123</w:t>
             </w:r>
           </w:p>
         </w:tc>
@@ -555,7 +555,7 @@
           </w:tcPr>
           <w:p>
             <w:r>
-              <w:t>76.3</w:t>
+              <w:t>77.3</w:t>
             </w:r>
           </w:p>
         </w:tc>
@@ -565,7 +565,7 @@
           </w:tcPr>
           <w:p>
             <w:r>
-              <w:t>88.8</w:t>
+              <w:t>88.6</w:t>
             </w:r>
           </w:p>
         </w:tc>
@@ -585,7 +585,7 @@
           </w:tcPr>
           <w:p>
             <w:r>
-              <w:t>72.1</w:t>
+              <w:t>72.5</w:t>
             </w:r>
           </w:p>
         </w:tc>
@@ -595,7 +595,7 @@
           </w:tcPr>
           <w:p>
             <w:r>
-              <w:t>351</w:t>
+              <w:t>473</w:t>
             </w:r>
           </w:p>
         </w:tc>
@@ -607,7 +607,7 @@
           </w:tcPr>
           <w:p>
             <w:r>
-              <w:t>2026-06-28 15:30:52</w:t>
+              <w:t>2026-06-28 16:16:22</w:t>
             </w:r>
           </w:p>
         </w:tc>
@@ -617,7 +617,7 @@
           </w:tcPr>
           <w:p>
             <w:r>
-              <w:t>122</w:t>
+              <w:t>124</w:t>
             </w:r>
           </w:p>
         </w:tc>
@@ -627,7 +627,7 @@
           </w:tcPr>
           <w:p>
             <w:r>
-              <w:t>76.8</w:t>
+              <w:t>78.0</w:t>
             </w:r>
           </w:p>
         </w:tc>
@@ -637,7 +637,7 @@
           </w:tcPr>
           <w:p>
             <w:r>
-              <w:t>88.8</w:t>
+              <w:t>88.6</w:t>
             </w:r>
           </w:p>
         </w:tc>
@@ -657,7 +657,7 @@
           </w:tcPr>
           <w:p>
             <w:r>
-              <w:t>72.3</w:t>
+              <w:t>72.9</w:t>
             </w:r>
           </w:p>
         </w:tc>
@@ -667,7 +667,7 @@
           </w:tcPr>
           <w:p>
             <w:r>
-              <w:t>352</w:t>
+              <w:t>534</w:t>
             </w:r>
           </w:p>
         </w:tc>
@@ -679,7 +679,7 @@
           </w:tcPr>
           <w:p>
             <w:r>
-              <w:t>2026-06-28 16:00:52</w:t>
+              <w:t>2026-06-28 16:46:22</w:t>
             </w:r>
           </w:p>
         </w:tc>
@@ -689,7 +689,7 @@
           </w:tcPr>
           <w:p>
             <w:r>
-              <w:t>122</w:t>
+              <w:t>124</w:t>
             </w:r>
           </w:p>
         </w:tc>
@@ -699,7 +699,7 @@
           </w:tcPr>
           <w:p>
             <w:r>
-              <w:t>76.8</w:t>
+              <w:t>78.0</w:t>
             </w:r>
           </w:p>
         </w:tc>
@@ -709,7 +709,7 @@
           </w:tcPr>
           <w:p>
             <w:r>
-              <w:t>88.6</w:t>
+              <w:t>88.5</w:t>
             </w:r>
           </w:p>
         </w:tc>
@@ -729,7 +729,7 @@
           </w:tcPr>
           <w:p>
             <w:r>
-              <w:t>72.3</w:t>
+              <w:t>72.9</w:t>
             </w:r>
           </w:p>
         </w:tc>
@@ -739,7 +739,7 @@
           </w:tcPr>
           <w:p>
             <w:r>
-              <w:t>472</w:t>
+              <w:t>654</w:t>
             </w:r>
           </w:p>
         </w:tc>
@@ -751,7 +751,7 @@
           </w:tcPr>
           <w:p>
             <w:r>
-              <w:t>2026-06-28 16:01:07</w:t>
+              <w:t>2026-06-28 16:46:37</w:t>
             </w:r>
           </w:p>
         </w:tc>
@@ -761,7 +761,7 @@
           </w:tcPr>
           <w:p>
             <w:r>
-              <w:t>123</w:t>
+              <w:t>125</w:t>
             </w:r>
           </w:p>
         </w:tc>
@@ -771,7 +771,7 @@
           </w:tcPr>
           <w:p>
             <w:r>
-              <w:t>77.3</w:t>
+              <w:t>78.5</w:t>
             </w:r>
           </w:p>
         </w:tc>
@@ -781,7 +781,7 @@
           </w:tcPr>
           <w:p>
             <w:r>
-              <w:t>88.6</w:t>
+              <w:t>88.5</w:t>
             </w:r>
           </w:p>
         </w:tc>
@@ -801,7 +801,7 @@
           </w:tcPr>
           <w:p>
             <w:r>
-              <w:t>72.5</w:t>
+              <w:t>73.1</w:t>
             </w:r>
           </w:p>
         </w:tc>
@@ -811,7 +811,7 @@
           </w:tcPr>
           <w:p>
             <w:r>
-              <w:t>473</w:t>
+              <w:t>655</w:t>
             </w:r>
           </w:p>
         </w:tc>
@@ -823,7 +823,7 @@
           </w:tcPr>
           <w:p>
             <w:r>
-              <w:t>2026-06-28 16:16:22</w:t>
+              <w:t>2026-06-28 17:16:41</w:t>
             </w:r>
           </w:p>
         </w:tc>
@@ -833,7 +833,7 @@
           </w:tcPr>
           <w:p>
             <w:r>
-              <w:t>124</w:t>
+              <w:t>125</w:t>
             </w:r>
           </w:p>
         </w:tc>
@@ -843,7 +843,7 @@
           </w:tcPr>
           <w:p>
             <w:r>
-              <w:t>78.0</w:t>
+              <w:t>78.5</w:t>
             </w:r>
           </w:p>
         </w:tc>
@@ -853,7 +853,7 @@
           </w:tcPr>
           <w:p>
             <w:r>
-              <w:t>88.6</w:t>
+              <w:t>88.5</w:t>
             </w:r>
           </w:p>
         </w:tc>
@@ -873,7 +873,7 @@
           </w:tcPr>
           <w:p>
             <w:r>
-              <w:t>72.9</w:t>
+              <w:t>73.1</w:t>
             </w:r>
           </w:p>
         </w:tc>
@@ -883,7 +883,7 @@
           </w:tcPr>
           <w:p>
             <w:r>
-              <w:t>534</w:t>
+              <w:t>58</w:t>
             </w:r>
           </w:p>
         </w:tc>
@@ -895,7 +895,7 @@
           </w:tcPr>
           <w:p>
             <w:r>
-              <w:t>2026-06-28 16:46:22</w:t>
+              <w:t>2026-06-28 17:16:56</w:t>
             </w:r>
           </w:p>
         </w:tc>
@@ -905,7 +905,7 @@
           </w:tcPr>
           <w:p>
             <w:r>
-              <w:t>124</w:t>
+              <w:t>126</w:t>
             </w:r>
           </w:p>
         </w:tc>
@@ -915,7 +915,7 @@
           </w:tcPr>
           <w:p>
             <w:r>
-              <w:t>78.0</w:t>
+              <w:t>79.1</w:t>
             </w:r>
           </w:p>
         </w:tc>
@@ -945,7 +945,7 @@
           </w:tcPr>
           <w:p>
             <w:r>
-              <w:t>72.9</w:t>
+              <w:t>73.4</w:t>
             </w:r>
           </w:p>
         </w:tc>
@@ -955,7 +955,7 @@
           </w:tcPr>
           <w:p>
             <w:r>
-              <w:t>654</w:t>
+              <w:t>59</w:t>
             </w:r>
           </w:p>
         </w:tc>
@@ -967,7 +967,7 @@
           </w:tcPr>
           <w:p>
             <w:r>
-              <w:t>2026-06-28 16:46:37</w:t>
+              <w:t>2026-06-28 17:31:56</w:t>
             </w:r>
           </w:p>
         </w:tc>
@@ -977,7 +977,7 @@
           </w:tcPr>
           <w:p>
             <w:r>
-              <w:t>125</w:t>
+              <w:t>127</w:t>
             </w:r>
           </w:p>
         </w:tc>
@@ -987,7 +987,7 @@
           </w:tcPr>
           <w:p>
             <w:r>
-              <w:t>78.5</w:t>
+              <w:t>79.7</w:t>
             </w:r>
           </w:p>
         </w:tc>
@@ -1017,7 +1017,7 @@
           </w:tcPr>
           <w:p>
             <w:r>
-              <w:t>73.1</w:t>
+              <w:t>73.7</w:t>
             </w:r>
           </w:p>
         </w:tc>
@@ -1027,7 +1027,7 @@
           </w:tcPr>
           <w:p>
             <w:r>
-              <w:t>655</w:t>
+              <w:t>119</w:t>
             </w:r>
           </w:p>
         </w:tc>
@@ -1039,7 +1039,7 @@
           </w:tcPr>
           <w:p>
             <w:r>
-              <w:t>2026-06-28 17:16:41</w:t>
+              <w:t>2026-06-28 17:47:11</w:t>
             </w:r>
           </w:p>
         </w:tc>
@@ -1049,7 +1049,7 @@
           </w:tcPr>
           <w:p>
             <w:r>
-              <w:t>125</w:t>
+              <w:t>128</w:t>
             </w:r>
           </w:p>
         </w:tc>
@@ -1059,7 +1059,7 @@
           </w:tcPr>
           <w:p>
             <w:r>
-              <w:t>78.5</w:t>
+              <w:t>80.1</w:t>
             </w:r>
           </w:p>
         </w:tc>
@@ -1069,7 +1069,7 @@
           </w:tcPr>
           <w:p>
             <w:r>
-              <w:t>88.5</w:t>
+              <w:t>88.4</w:t>
             </w:r>
           </w:p>
         </w:tc>
@@ -1089,7 +1089,7 @@
           </w:tcPr>
           <w:p>
             <w:r>
-              <w:t>73.1</w:t>
+              <w:t>73.9</w:t>
             </w:r>
           </w:p>
         </w:tc>
@@ -1099,7 +1099,7 @@
           </w:tcPr>
           <w:p>
             <w:r>
-              <w:t>58</w:t>
+              <w:t>180</w:t>
             </w:r>
           </w:p>
         </w:tc>
@@ -1111,7 +1111,7 @@
           </w:tcPr>
           <w:p>
             <w:r>
-              <w:t>2026-06-28 17:16:56</w:t>
+              <w:t>2026-06-28 18:17:11</w:t>
             </w:r>
           </w:p>
         </w:tc>
@@ -1121,7 +1121,7 @@
           </w:tcPr>
           <w:p>
             <w:r>
-              <w:t>126</w:t>
+              <w:t>128</w:t>
             </w:r>
           </w:p>
         </w:tc>
@@ -1131,7 +1131,7 @@
           </w:tcPr>
           <w:p>
             <w:r>
-              <w:t>79.1</w:t>
+              <w:t>80.1</w:t>
             </w:r>
           </w:p>
         </w:tc>
@@ -1141,7 +1141,7 @@
           </w:tcPr>
           <w:p>
             <w:r>
-              <w:t>88.5</w:t>
+              <w:t>88.3</w:t>
             </w:r>
           </w:p>
         </w:tc>
@@ -1161,7 +1161,7 @@
           </w:tcPr>
           <w:p>
             <w:r>
-              <w:t>73.4</w:t>
+              <w:t>73.9</w:t>
             </w:r>
           </w:p>
         </w:tc>
@@ -1171,7 +1171,7 @@
           </w:tcPr>
           <w:p>
             <w:r>
-              <w:t>59</w:t>
+              <w:t>300</w:t>
             </w:r>
           </w:p>
         </w:tc>
@@ -1183,7 +1183,7 @@
           </w:tcPr>
           <w:p>
             <w:r>
-              <w:t>2026-06-28 17:31:56</w:t>
+              <w:t>2026-06-28 18:31:11</w:t>
             </w:r>
           </w:p>
         </w:tc>
@@ -1193,7 +1193,7 @@
           </w:tcPr>
           <w:p>
             <w:r>
-              <w:t>127</w:t>
+              <w:t>129</w:t>
             </w:r>
           </w:p>
         </w:tc>
@@ -1203,7 +1203,7 @@
           </w:tcPr>
           <w:p>
             <w:r>
-              <w:t>79.7</w:t>
+              <w:t>80.6</w:t>
             </w:r>
           </w:p>
         </w:tc>
@@ -1213,7 +1213,7 @@
           </w:tcPr>
           <w:p>
             <w:r>
-              <w:t>88.5</w:t>
+              <w:t>88.3</w:t>
             </w:r>
           </w:p>
         </w:tc>
@@ -1233,7 +1233,7 @@
           </w:tcPr>
           <w:p>
             <w:r>
-              <w:t>73.7</w:t>
+              <w:t>74.1</w:t>
             </w:r>
           </w:p>
         </w:tc>
@@ -1243,7 +1243,7 @@
           </w:tcPr>
           <w:p>
             <w:r>
-              <w:t>119</w:t>
+              <w:t>356</w:t>
             </w:r>
           </w:p>
         </w:tc>
@@ -1255,7 +1255,7 @@
           </w:tcPr>
           <w:p>
             <w:r>
-              <w:t>2026-06-28 17:47:11</w:t>
+              <w:t>2026-06-28 18:48:12</w:t>
             </w:r>
           </w:p>
         </w:tc>
@@ -1265,7 +1265,7 @@
           </w:tcPr>
           <w:p>
             <w:r>
-              <w:t>128</w:t>
+              <w:t>130</w:t>
             </w:r>
           </w:p>
         </w:tc>
@@ -1275,7 +1275,7 @@
           </w:tcPr>
           <w:p>
             <w:r>
-              <w:t>80.1</w:t>
+              <w:t>81.2</w:t>
             </w:r>
           </w:p>
         </w:tc>
@@ -1285,7 +1285,7 @@
           </w:tcPr>
           <w:p>
             <w:r>
-              <w:t>88.4</w:t>
+              <w:t>88.2</w:t>
             </w:r>
           </w:p>
         </w:tc>
@@ -1305,7 +1305,7 @@
           </w:tcPr>
           <w:p>
             <w:r>
-              <w:t>73.9</w:t>
+              <w:t>74.4</w:t>
             </w:r>
           </w:p>
         </w:tc>
@@ -1315,7 +1315,7 @@
           </w:tcPr>
           <w:p>
             <w:r>
-              <w:t>180</w:t>
+              <w:t>29</w:t>
             </w:r>
           </w:p>
         </w:tc>
@@ -1327,7 +1327,7 @@
           </w:tcPr>
           <w:p>
             <w:r>
-              <w:t>2026-06-28 18:17:11</w:t>
+              <w:t>2026-06-28 19:18:12</w:t>
             </w:r>
           </w:p>
         </w:tc>
@@ -1337,7 +1337,7 @@
           </w:tcPr>
           <w:p>
             <w:r>
-              <w:t>128</w:t>
+              <w:t>130</w:t>
             </w:r>
           </w:p>
         </w:tc>
@@ -1347,7 +1347,7 @@
           </w:tcPr>
           <w:p>
             <w:r>
-              <w:t>80.1</w:t>
+              <w:t>81.2</w:t>
             </w:r>
           </w:p>
         </w:tc>
@@ -1357,7 +1357,7 @@
           </w:tcPr>
           <w:p>
             <w:r>
-              <w:t>88.3</w:t>
+              <w:t>88.1</w:t>
             </w:r>
           </w:p>
         </w:tc>
@@ -1377,7 +1377,7 @@
           </w:tcPr>
           <w:p>
             <w:r>
-              <w:t>73.9</w:t>
+              <w:t>74.4</w:t>
             </w:r>
           </w:p>
         </w:tc>
@@ -1387,7 +1387,7 @@
           </w:tcPr>
           <w:p>
             <w:r>
-              <w:t>300</w:t>
+              <w:t>149</w:t>
             </w:r>
           </w:p>
         </w:tc>
@@ -1399,7 +1399,7 @@
           </w:tcPr>
           <w:p>
             <w:r>
-              <w:t>2026-06-28 18:31:11</w:t>
+              <w:t>2026-06-28 19:30:27</w:t>
             </w:r>
           </w:p>
         </w:tc>
@@ -1409,7 +1409,7 @@
           </w:tcPr>
           <w:p>
             <w:r>
-              <w:t>129</w:t>
+              <w:t>131</w:t>
             </w:r>
           </w:p>
         </w:tc>
@@ -1419,7 +1419,7 @@
           </w:tcPr>
           <w:p>
             <w:r>
-              <w:t>80.6</w:t>
+              <w:t>80.3</w:t>
             </w:r>
           </w:p>
         </w:tc>
@@ -1429,7 +1429,7 @@
           </w:tcPr>
           <w:p>
             <w:r>
-              <w:t>88.3</w:t>
+              <w:t>88.1</w:t>
             </w:r>
           </w:p>
         </w:tc>
@@ -1449,7 +1449,7 @@
           </w:tcPr>
           <w:p>
             <w:r>
-              <w:t>74.1</w:t>
+              <w:t>73.9</w:t>
             </w:r>
           </w:p>
         </w:tc>
@@ -1459,7 +1459,7 @@
           </w:tcPr>
           <w:p>
             <w:r>
-              <w:t>356</w:t>
+              <w:t>198</w:t>
             </w:r>
           </w:p>
         </w:tc>
@@ -1471,7 +1471,7 @@
           </w:tcPr>
           <w:p>
             <w:r>
-              <w:t>2026-06-28 18:48:12</w:t>
+              <w:t>2026-06-28 19:48:12</w:t>
             </w:r>
           </w:p>
         </w:tc>
@@ -1481,7 +1481,7 @@
           </w:tcPr>
           <w:p>
             <w:r>
-              <w:t>130</w:t>
+              <w:t>132</w:t>
             </w:r>
           </w:p>
         </w:tc>
@@ -1491,7 +1491,7 @@
           </w:tcPr>
           <w:p>
             <w:r>
-              <w:t>81.2</w:t>
+              <w:t>80.8</w:t>
             </w:r>
           </w:p>
         </w:tc>
@@ -1501,7 +1501,7 @@
           </w:tcPr>
           <w:p>
             <w:r>
-              <w:t>88.2</w:t>
+              <w:t>88.1</w:t>
             </w:r>
           </w:p>
         </w:tc>
@@ -1521,7 +1521,7 @@
           </w:tcPr>
           <w:p>
             <w:r>
-              <w:t>74.4</w:t>
+              <w:t>74.2</w:t>
             </w:r>
           </w:p>
         </w:tc>
@@ -1531,7 +1531,7 @@
           </w:tcPr>
           <w:p>
             <w:r>
-              <w:t>29</w:t>
+              <w:t>269</w:t>
             </w:r>
           </w:p>
         </w:tc>
@@ -1543,7 +1543,7 @@
           </w:tcPr>
           <w:p>
             <w:r>
-              <w:t>2026-06-28 19:18:12</w:t>
+              <w:t>2026-06-28 20:18:14</w:t>
             </w:r>
           </w:p>
         </w:tc>
@@ -1553,7 +1553,7 @@
           </w:tcPr>
           <w:p>
             <w:r>
-              <w:t>130</w:t>
+              <w:t>132</w:t>
             </w:r>
           </w:p>
         </w:tc>
@@ -1563,7 +1563,7 @@
           </w:tcPr>
           <w:p>
             <w:r>
-              <w:t>81.2</w:t>
+              <w:t>80.8</w:t>
             </w:r>
           </w:p>
         </w:tc>
@@ -1573,7 +1573,7 @@
           </w:tcPr>
           <w:p>
             <w:r>
-              <w:t>88.1</w:t>
+              <w:t>87.9</w:t>
             </w:r>
           </w:p>
         </w:tc>
@@ -1593,7 +1593,7 @@
           </w:tcPr>
           <w:p>
             <w:r>
-              <w:t>74.4</w:t>
+              <w:t>74.1</w:t>
             </w:r>
           </w:p>
         </w:tc>
@@ -1603,7 +1603,7 @@
           </w:tcPr>
           <w:p>
             <w:r>
-              <w:t>149</w:t>
+              <w:t>7</w:t>
             </w:r>
           </w:p>
         </w:tc>
@@ -1615,7 +1615,7 @@
           </w:tcPr>
           <w:p>
             <w:r>
-              <w:t>2026-06-28 19:30:27</w:t>
+              <w:t>2026-06-28 20:48:15</w:t>
             </w:r>
           </w:p>
         </w:tc>
@@ -1625,7 +1625,7 @@
           </w:tcPr>
           <w:p>
             <w:r>
-              <w:t>131</w:t>
+              <w:t>132</w:t>
             </w:r>
           </w:p>
         </w:tc>
@@ -1635,7 +1635,7 @@
           </w:tcPr>
           <w:p>
             <w:r>
-              <w:t>80.3</w:t>
+              <w:t>80.8</w:t>
             </w:r>
           </w:p>
         </w:tc>
@@ -1645,7 +1645,7 @@
           </w:tcPr>
           <w:p>
             <w:r>
-              <w:t>88.1</w:t>
+              <w:t>87.8</w:t>
             </w:r>
           </w:p>
         </w:tc>
@@ -1665,7 +1665,7 @@
           </w:tcPr>
           <w:p>
             <w:r>
-              <w:t>73.9</w:t>
+              <w:t>74.1</w:t>
             </w:r>
           </w:p>
         </w:tc>
@@ -1675,7 +1675,7 @@
           </w:tcPr>
           <w:p>
             <w:r>
-              <w:t>198</w:t>
+              <w:t>79</w:t>
             </w:r>
           </w:p>
         </w:tc>
@@ -1687,7 +1687,7 @@
           </w:tcPr>
           <w:p>
             <w:r>
-              <w:t>2026-06-28 19:48:12</w:t>
+              <w:t>2026-06-28 21:17:00</w:t>
             </w:r>
           </w:p>
         </w:tc>
@@ -1697,7 +1697,7 @@
           </w:tcPr>
           <w:p>
             <w:r>
-              <w:t>132</w:t>
+              <w:t>133</w:t>
             </w:r>
           </w:p>
         </w:tc>
@@ -1707,7 +1707,7 @@
           </w:tcPr>
           <w:p>
             <w:r>
-              <w:t>80.8</w:t>
+              <w:t>79.9</w:t>
             </w:r>
           </w:p>
         </w:tc>
@@ -1717,7 +1717,7 @@
           </w:tcPr>
           <w:p>
             <w:r>
-              <w:t>88.1</w:t>
+              <w:t>87.8</w:t>
             </w:r>
           </w:p>
         </w:tc>
@@ -1737,7 +1737,7 @@
           </w:tcPr>
           <w:p>
             <w:r>
-              <w:t>74.2</w:t>
+              <w:t>73.7</w:t>
             </w:r>
           </w:p>
         </w:tc>
@@ -1747,7 +1747,7 @@
           </w:tcPr>
           <w:p>
             <w:r>
-              <w:t>269</w:t>
+              <w:t>194</w:t>
             </w:r>
           </w:p>
         </w:tc>
@@ -1768,7 +1768,7 @@
     </w:p>
     <w:p>
       <w:r>
-        <w:t>Section score: 80.8 / 100  (Grade: B)</w:t>
+        <w:t>Section score: 79.9 / 100  (Grade: C+)</w:t>
       </w:r>
     </w:p>
     <w:p>
@@ -1911,7 +1911,7 @@
           </w:tcPr>
           <w:p>
             <w:r>
-              <w:t>72.6</w:t>
+              <w:t>69.1</w:t>
             </w:r>
           </w:p>
         </w:tc>
@@ -1921,7 +1921,7 @@
           </w:tcPr>
           <w:p>
             <w:r>
-              <w:t>10.9</w:t>
+              <w:t>10.4</w:t>
             </w:r>
           </w:p>
         </w:tc>
@@ -2007,7 +2007,7 @@
           </w:tcPr>
           <w:p>
             <w:r>
-              <w:t>77.1</w:t>
+              <w:t>76.2</w:t>
             </w:r>
           </w:p>
         </w:tc>
@@ -2017,7 +2017,7 @@
           </w:tcPr>
           <w:p>
             <w:r>
-              <w:t>7.7</w:t>
+              <w:t>7.6</w:t>
             </w:r>
           </w:p>
         </w:tc>
@@ -2039,7 +2039,7 @@
           </w:tcPr>
           <w:p>
             <w:r>
-              <w:t>48.8</w:t>
+              <w:t>47.8</w:t>
             </w:r>
           </w:p>
         </w:tc>
@@ -2049,7 +2049,7 @@
           </w:tcPr>
           <w:p>
             <w:r>
-              <w:t>12.2</w:t>
+              <w:t>12.0</w:t>
             </w:r>
           </w:p>
         </w:tc>
@@ -2090,7 +2090,7 @@
           </w:tcPr>
           <w:p>
             <w:r>
-              <w:t>$669.12</w:t>
+              <w:t>$665.45</w:t>
             </w:r>
           </w:p>
         </w:tc>
@@ -2112,7 +2112,7 @@
           </w:tcPr>
           <w:p>
             <w:r>
-              <w:t>33.82%</w:t>
+              <w:t>33.09%</w:t>
             </w:r>
           </w:p>
         </w:tc>
@@ -2134,7 +2134,7 @@
           </w:tcPr>
           <w:p>
             <w:r>
-              <w:t>$61.81</w:t>
+              <w:t>$56.81</w:t>
             </w:r>
           </w:p>
         </w:tc>
@@ -2178,7 +2178,7 @@
           </w:tcPr>
           <w:p>
             <w:r>
-              <w:t>0.6439</w:t>
+              <w:t>0.6391</w:t>
             </w:r>
           </w:p>
         </w:tc>
@@ -2200,7 +2200,7 @@
           </w:tcPr>
           <w:p>
             <w:r>
-              <w:t>0.5000 / 0.6696</w:t>
+              <w:t>0.5000 / 0.6637</w:t>
             </w:r>
           </w:p>
         </w:tc>
@@ -2222,7 +2222,7 @@
           </w:tcPr>
           <w:p>
             <w:r>
-              <w:t>1.2810</w:t>
+              <w:t>1.2525</w:t>
             </w:r>
           </w:p>
         </w:tc>
@@ -2244,7 +2244,7 @@
           </w:tcPr>
           <w:p>
             <w:r>
-              <w:t>132 / 132</w:t>
+              <w:t>133 / 133</w:t>
             </w:r>
           </w:p>
         </w:tc>
@@ -2266,7 +2266,7 @@
           </w:tcPr>
           <w:p>
             <w:r>
-              <w:t>$0.47</w:t>
+              <w:t>$0.43</w:t>
             </w:r>
           </w:p>
         </w:tc>
@@ -2407,7 +2407,7 @@
           </w:tcPr>
           <w:p>
             <w:r>
-              <w:t>down</w:t>
+              <w:t>up</w:t>
             </w:r>
           </w:p>
         </w:tc>
@@ -2417,7 +2417,7 @@
           </w:tcPr>
           <w:p>
             <w:r>
-              <w:t>Yes</w:t>
+              <w:t>No</w:t>
             </w:r>
           </w:p>
         </w:tc>
@@ -2427,7 +2427,7 @@
           </w:tcPr>
           <w:p>
             <w:r>
-              <w:t>$4.26</w:t>
+              <w:t>$-5.00</w:t>
             </w:r>
           </w:p>
         </w:tc>
@@ -2449,7 +2449,7 @@
           </w:tcPr>
           <w:p>
             <w:r>
-              <w:t>0.620</w:t>
+              <w:t>0.540</w:t>
             </w:r>
           </w:p>
         </w:tc>
@@ -2459,7 +2459,7 @@
           </w:tcPr>
           <w:p>
             <w:r>
-              <w:t>up</w:t>
+              <w:t>down</w:t>
             </w:r>
           </w:p>
         </w:tc>
@@ -2469,7 +2469,7 @@
           </w:tcPr>
           <w:p>
             <w:r>
-              <w:t>No</w:t>
+              <w:t>Yes</w:t>
             </w:r>
           </w:p>
         </w:tc>
@@ -2479,7 +2479,7 @@
           </w:tcPr>
           <w:p>
             <w:r>
-              <w:t>$-5.00</w:t>
+              <w:t>$4.26</w:t>
             </w:r>
           </w:p>
         </w:tc>
@@ -2501,7 +2501,7 @@
           </w:tcPr>
           <w:p>
             <w:r>
-              <w:t>0.570</w:t>
+              <w:t>0.620</w:t>
             </w:r>
           </w:p>
         </w:tc>
@@ -2511,7 +2511,7 @@
           </w:tcPr>
           <w:p>
             <w:r>
-              <w:t>down</w:t>
+              <w:t>up</w:t>
             </w:r>
           </w:p>
         </w:tc>
@@ -2521,7 +2521,7 @@
           </w:tcPr>
           <w:p>
             <w:r>
-              <w:t>Yes</w:t>
+              <w:t>No</w:t>
             </w:r>
           </w:p>
         </w:tc>
@@ -2531,7 +2531,7 @@
           </w:tcPr>
           <w:p>
             <w:r>
-              <w:t>$3.77</w:t>
+              <w:t>$-5.00</w:t>
             </w:r>
           </w:p>
         </w:tc>
@@ -2553,7 +2553,7 @@
           </w:tcPr>
           <w:p>
             <w:r>
-              <w:t>0.590</w:t>
+              <w:t>0.570</w:t>
             </w:r>
           </w:p>
         </w:tc>
@@ -2583,7 +2583,7 @@
           </w:tcPr>
           <w:p>
             <w:r>
-              <w:t>$3.47</w:t>
+              <w:t>$3.77</w:t>
             </w:r>
           </w:p>
         </w:tc>
@@ -2605,7 +2605,7 @@
           </w:tcPr>
           <w:p>
             <w:r>
-              <w:t>0.610</w:t>
+              <w:t>0.590</w:t>
             </w:r>
           </w:p>
         </w:tc>
@@ -2635,7 +2635,7 @@
           </w:tcPr>
           <w:p>
             <w:r>
-              <w:t>$3.20</w:t>
+              <w:t>$3.47</w:t>
             </w:r>
           </w:p>
         </w:tc>
@@ -2657,7 +2657,7 @@
           </w:tcPr>
           <w:p>
             <w:r>
-              <w:t>0.510</w:t>
+              <w:t>0.610</w:t>
             </w:r>
           </w:p>
         </w:tc>
@@ -2687,7 +2687,7 @@
           </w:tcPr>
           <w:p>
             <w:r>
-              <w:t>$4.80</w:t>
+              <w:t>$3.20</w:t>
             </w:r>
           </w:p>
         </w:tc>
@@ -2709,7 +2709,7 @@
           </w:tcPr>
           <w:p>
             <w:r>
-              <w:t>0.550</w:t>
+              <w:t>0.510</w:t>
             </w:r>
           </w:p>
         </w:tc>
@@ -2739,7 +2739,7 @@
           </w:tcPr>
           <w:p>
             <w:r>
-              <w:t>$4.09</w:t>
+              <w:t>$4.80</w:t>
             </w:r>
           </w:p>
         </w:tc>
@@ -2761,7 +2761,7 @@
           </w:tcPr>
           <w:p>
             <w:r>
-              <w:t>0.590</w:t>
+              <w:t>0.550</w:t>
             </w:r>
           </w:p>
         </w:tc>
@@ -2791,7 +2791,7 @@
           </w:tcPr>
           <w:p>
             <w:r>
-              <w:t>$3.47</w:t>
+              <w:t>$4.09</w:t>
             </w:r>
           </w:p>
         </w:tc>
@@ -2813,7 +2813,7 @@
           </w:tcPr>
           <w:p>
             <w:r>
-              <w:t>0.480</w:t>
+              <w:t>0.590</w:t>
             </w:r>
           </w:p>
         </w:tc>
@@ -2843,7 +2843,7 @@
           </w:tcPr>
           <w:p>
             <w:r>
-              <w:t>$5.42</w:t>
+              <w:t>$3.47</w:t>
             </w:r>
           </w:p>
         </w:tc>
@@ -2865,7 +2865,7 @@
           </w:tcPr>
           <w:p>
             <w:r>
-              <w:t>0.580</w:t>
+              <w:t>0.480</w:t>
             </w:r>
           </w:p>
         </w:tc>
@@ -2895,7 +2895,7 @@
           </w:tcPr>
           <w:p>
             <w:r>
-              <w:t>$3.62</w:t>
+              <w:t>$5.42</w:t>
             </w:r>
           </w:p>
         </w:tc>
@@ -2917,7 +2917,7 @@
           </w:tcPr>
           <w:p>
             <w:r>
-              <w:t>0.570</w:t>
+              <w:t>0.580</w:t>
             </w:r>
           </w:p>
         </w:tc>
@@ -2947,7 +2947,7 @@
           </w:tcPr>
           <w:p>
             <w:r>
-              <w:t>$3.77</w:t>
+              <w:t>$3.62</w:t>
             </w:r>
           </w:p>
         </w:tc>
@@ -2969,7 +2969,7 @@
           </w:tcPr>
           <w:p>
             <w:r>
-              <w:t>0.530</w:t>
+              <w:t>0.570</w:t>
             </w:r>
           </w:p>
         </w:tc>
@@ -2999,7 +2999,7 @@
           </w:tcPr>
           <w:p>
             <w:r>
-              <w:t>$4.43</w:t>
+              <w:t>$3.77</w:t>
             </w:r>
           </w:p>
         </w:tc>
@@ -3021,7 +3021,7 @@
           </w:tcPr>
           <w:p>
             <w:r>
-              <w:t>0.590</w:t>
+              <w:t>0.530</w:t>
             </w:r>
           </w:p>
         </w:tc>
@@ -3031,7 +3031,7 @@
           </w:tcPr>
           <w:p>
             <w:r>
-              <w:t>up</w:t>
+              <w:t>down</w:t>
             </w:r>
           </w:p>
         </w:tc>
@@ -3041,7 +3041,7 @@
           </w:tcPr>
           <w:p>
             <w:r>
-              <w:t>No</w:t>
+              <w:t>Yes</w:t>
             </w:r>
           </w:p>
         </w:tc>
@@ -3051,7 +3051,7 @@
           </w:tcPr>
           <w:p>
             <w:r>
-              <w:t>$-5.00</w:t>
+              <w:t>$4.43</w:t>
             </w:r>
           </w:p>
         </w:tc>
@@ -3073,7 +3073,7 @@
           </w:tcPr>
           <w:p>
             <w:r>
-              <w:t>0.670</w:t>
+              <w:t>0.590</w:t>
             </w:r>
           </w:p>
         </w:tc>
@@ -3083,7 +3083,7 @@
           </w:tcPr>
           <w:p>
             <w:r>
-              <w:t>down</w:t>
+              <w:t>up</w:t>
             </w:r>
           </w:p>
         </w:tc>
@@ -3093,7 +3093,7 @@
           </w:tcPr>
           <w:p>
             <w:r>
-              <w:t>Yes</w:t>
+              <w:t>No</w:t>
             </w:r>
           </w:p>
         </w:tc>
@@ -3103,7 +3103,7 @@
           </w:tcPr>
           <w:p>
             <w:r>
-              <w:t>$2.46</w:t>
+              <w:t>$-5.00</w:t>
             </w:r>
           </w:p>
         </w:tc>
@@ -3125,7 +3125,7 @@
           </w:tcPr>
           <w:p>
             <w:r>
-              <w:t>0.600</w:t>
+              <w:t>0.670</w:t>
             </w:r>
           </w:p>
         </w:tc>
@@ -3155,7 +3155,7 @@
           </w:tcPr>
           <w:p>
             <w:r>
-              <w:t>$3.33</w:t>
+              <w:t>$2.46</w:t>
             </w:r>
           </w:p>
         </w:tc>
@@ -3176,7 +3176,7 @@
     </w:p>
     <w:p>
       <w:r>
-        <w:t>Section score: 87.9 / 100  (Grade: B+)</w:t>
+        <w:t>Section score: 87.7 / 100  (Grade: B+)</w:t>
       </w:r>
     </w:p>
     <w:p>
@@ -3319,7 +3319,7 @@
           </w:tcPr>
           <w:p>
             <w:r>
-              <w:t>79.5</w:t>
+              <w:t>78.0</w:t>
             </w:r>
           </w:p>
         </w:tc>
@@ -3329,7 +3329,7 @@
           </w:tcPr>
           <w:p>
             <w:r>
-              <w:t>11.9</w:t>
+              <w:t>11.7</w:t>
             </w:r>
           </w:p>
         </w:tc>
@@ -3433,17 +3433,17 @@
     </w:tbl>
     <w:p>
       <w:r>
-        <w:t>Ticks: 367 · Reconciled: True · Readiness: not_ready</w:t>
+        <w:t>Ticks: 262 · Reconciled: True · Readiness: not_ready</w:t>
       </w:r>
     </w:p>
     <w:p>
       <w:r>
-        <w:t>Candidates created: 58308 · Terminals: {'accepted': 86, 'rejected': 45783, 'skipped': 12130, 'expired': 0, 'missing_data': 309}</w:t>
+        <w:t>Candidates created: 58912 · Terminals: {'accepted': 86, 'rejected': 46058, 'skipped': 12453, 'expired': 0, 'missing_data': 315}</w:t>
       </w:r>
     </w:p>
     <w:p>
       <w:r>
-        <w:t>Rejected by stage: {'directional': 35177, 'execution_gate': 223, 'context_gate': 879, 'directional_allowlist': 1364, 'down_bias_gate': 538, 'mtf_gate': 276, 'grok_decider': 3540, 'execution_realistic': 3, 'verifier': 61, 'mispricing_gate': 50, 'baseline_cohort_gate': 3672}</w:t>
+        <w:t>Rejected by stage: {'directional': 35433, 'execution_gate': 224, 'context_gate': 879, 'directional_allowlist': 1364, 'down_bias_gate': 538, 'mtf_gate': 276, 'grok_decider': 3540, 'execution_realistic': 3, 'verifier': 61, 'mispricing_gate': 50, 'baseline_cohort_gate': 3690}</w:t>
       </w:r>
     </w:p>
     <w:p>
@@ -4374,7 +4374,7 @@
           </w:tcPr>
           <w:p>
             <w:r>
-              <w:t>0.4167</w:t>
+              <w:t>0.4132</w:t>
             </w:r>
           </w:p>
         </w:tc>
@@ -4396,7 +4396,7 @@
           </w:tcPr>
           <w:p>
             <w:r>
-              <w:t>0.4797</w:t>
+              <w:t>0.4799</w:t>
             </w:r>
           </w:p>
         </w:tc>
@@ -4426,7 +4426,7 @@
     </w:tbl>
     <w:p>
       <w:r>
-        <w:t>TV alerts: received 1719 · valid 1700 · rejected 2</w:t>
+        <w:t>TV alerts: received 1803 · valid 1784 · rejected 2</w:t>
       </w:r>
     </w:p>
     <w:sectPr>

</xml_diff>

<commit_message>
chore(reports): VPS full report 2026-06-29 00:07 UTC (134 settled, WR 64.2%, PF 1.2747, grade C+)
</commit_message>
<xml_diff>
--- a/vps_full_reports/latest/report.docx
+++ b/vps_full_reports/latest/report.docx
@@ -20,7 +20,7 @@
           <w:color w:val="666666"/>
           <w:sz w:val="20"/>
         </w:rPr>
-        <w:t>PAPER ONLY  ·  reconciled=True  ·  ticks=262</w:t>
+        <w:t>PAPER ONLY  ·  reconciled=True  ·  ticks=584</w:t>
       </w:r>
     </w:p>
     <w:p>
@@ -33,7 +33,7 @@
     </w:p>
     <w:p>
       <w:r>
-        <w:t>Overall score: 73.6 / 100  (Grade: C)</w:t>
+        <w:t>Overall score: 73.8 / 100  (Grade: C)</w:t>
       </w:r>
     </w:p>
     <w:tbl>
@@ -107,7 +107,7 @@
           </w:tcPr>
           <w:p>
             <w:r>
-              <w:t>79.9</w:t>
+              <w:t>80.5</w:t>
             </w:r>
           </w:p>
         </w:tc>
@@ -117,7 +117,7 @@
           </w:tcPr>
           <w:p>
             <w:r>
-              <w:t>C+</w:t>
+              <w:t>B</w:t>
             </w:r>
           </w:p>
         </w:tc>
@@ -149,7 +149,7 @@
           </w:tcPr>
           <w:p>
             <w:r>
-              <w:t>87.7</w:t>
+              <w:t>87.4</w:t>
             </w:r>
           </w:p>
         </w:tc>
@@ -319,7 +319,7 @@
           </w:tcPr>
           <w:p>
             <w:r>
-              <w:t>2026-06-28 15:30:37</w:t>
+              <w:t>2026-06-28 16:46:37</w:t>
             </w:r>
           </w:p>
         </w:tc>
@@ -329,7 +329,7 @@
           </w:tcPr>
           <w:p>
             <w:r>
-              <w:t>121</w:t>
+              <w:t>125</w:t>
             </w:r>
           </w:p>
         </w:tc>
@@ -339,7 +339,7 @@
           </w:tcPr>
           <w:p>
             <w:r>
-              <w:t>76.3</w:t>
+              <w:t>78.5</w:t>
             </w:r>
           </w:p>
         </w:tc>
@@ -349,7 +349,7 @@
           </w:tcPr>
           <w:p>
             <w:r>
-              <w:t>88.8</w:t>
+              <w:t>88.5</w:t>
             </w:r>
           </w:p>
         </w:tc>
@@ -369,7 +369,7 @@
           </w:tcPr>
           <w:p>
             <w:r>
-              <w:t>72.1</w:t>
+              <w:t>73.1</w:t>
             </w:r>
           </w:p>
         </w:tc>
@@ -379,7 +379,7 @@
           </w:tcPr>
           <w:p>
             <w:r>
-              <w:t>351</w:t>
+              <w:t>655</w:t>
             </w:r>
           </w:p>
         </w:tc>
@@ -391,7 +391,7 @@
           </w:tcPr>
           <w:p>
             <w:r>
-              <w:t>2026-06-28 15:30:52</w:t>
+              <w:t>2026-06-28 17:16:41</w:t>
             </w:r>
           </w:p>
         </w:tc>
@@ -401,7 +401,7 @@
           </w:tcPr>
           <w:p>
             <w:r>
-              <w:t>122</w:t>
+              <w:t>125</w:t>
             </w:r>
           </w:p>
         </w:tc>
@@ -411,7 +411,7 @@
           </w:tcPr>
           <w:p>
             <w:r>
-              <w:t>76.8</w:t>
+              <w:t>78.5</w:t>
             </w:r>
           </w:p>
         </w:tc>
@@ -421,7 +421,7 @@
           </w:tcPr>
           <w:p>
             <w:r>
-              <w:t>88.8</w:t>
+              <w:t>88.5</w:t>
             </w:r>
           </w:p>
         </w:tc>
@@ -441,7 +441,7 @@
           </w:tcPr>
           <w:p>
             <w:r>
-              <w:t>72.3</w:t>
+              <w:t>73.1</w:t>
             </w:r>
           </w:p>
         </w:tc>
@@ -451,7 +451,7 @@
           </w:tcPr>
           <w:p>
             <w:r>
-              <w:t>352</w:t>
+              <w:t>58</w:t>
             </w:r>
           </w:p>
         </w:tc>
@@ -463,7 +463,7 @@
           </w:tcPr>
           <w:p>
             <w:r>
-              <w:t>2026-06-28 16:00:52</w:t>
+              <w:t>2026-06-28 17:16:56</w:t>
             </w:r>
           </w:p>
         </w:tc>
@@ -473,7 +473,7 @@
           </w:tcPr>
           <w:p>
             <w:r>
-              <w:t>122</w:t>
+              <w:t>126</w:t>
             </w:r>
           </w:p>
         </w:tc>
@@ -483,7 +483,7 @@
           </w:tcPr>
           <w:p>
             <w:r>
-              <w:t>76.8</w:t>
+              <w:t>79.1</w:t>
             </w:r>
           </w:p>
         </w:tc>
@@ -493,7 +493,7 @@
           </w:tcPr>
           <w:p>
             <w:r>
-              <w:t>88.6</w:t>
+              <w:t>88.5</w:t>
             </w:r>
           </w:p>
         </w:tc>
@@ -513,7 +513,7 @@
           </w:tcPr>
           <w:p>
             <w:r>
-              <w:t>72.3</w:t>
+              <w:t>73.4</w:t>
             </w:r>
           </w:p>
         </w:tc>
@@ -523,7 +523,7 @@
           </w:tcPr>
           <w:p>
             <w:r>
-              <w:t>472</w:t>
+              <w:t>59</w:t>
             </w:r>
           </w:p>
         </w:tc>
@@ -535,7 +535,7 @@
           </w:tcPr>
           <w:p>
             <w:r>
-              <w:t>2026-06-28 16:01:07</w:t>
+              <w:t>2026-06-28 17:31:56</w:t>
             </w:r>
           </w:p>
         </w:tc>
@@ -545,7 +545,7 @@
           </w:tcPr>
           <w:p>
             <w:r>
-              <w:t>123</w:t>
+              <w:t>127</w:t>
             </w:r>
           </w:p>
         </w:tc>
@@ -555,7 +555,7 @@
           </w:tcPr>
           <w:p>
             <w:r>
-              <w:t>77.3</w:t>
+              <w:t>79.7</w:t>
             </w:r>
           </w:p>
         </w:tc>
@@ -565,7 +565,7 @@
           </w:tcPr>
           <w:p>
             <w:r>
-              <w:t>88.6</w:t>
+              <w:t>88.5</w:t>
             </w:r>
           </w:p>
         </w:tc>
@@ -585,7 +585,7 @@
           </w:tcPr>
           <w:p>
             <w:r>
-              <w:t>72.5</w:t>
+              <w:t>73.7</w:t>
             </w:r>
           </w:p>
         </w:tc>
@@ -595,7 +595,7 @@
           </w:tcPr>
           <w:p>
             <w:r>
-              <w:t>473</w:t>
+              <w:t>119</w:t>
             </w:r>
           </w:p>
         </w:tc>
@@ -607,7 +607,7 @@
           </w:tcPr>
           <w:p>
             <w:r>
-              <w:t>2026-06-28 16:16:22</w:t>
+              <w:t>2026-06-28 17:47:11</w:t>
             </w:r>
           </w:p>
         </w:tc>
@@ -617,7 +617,7 @@
           </w:tcPr>
           <w:p>
             <w:r>
-              <w:t>124</w:t>
+              <w:t>128</w:t>
             </w:r>
           </w:p>
         </w:tc>
@@ -627,7 +627,7 @@
           </w:tcPr>
           <w:p>
             <w:r>
-              <w:t>78.0</w:t>
+              <w:t>80.1</w:t>
             </w:r>
           </w:p>
         </w:tc>
@@ -637,7 +637,7 @@
           </w:tcPr>
           <w:p>
             <w:r>
-              <w:t>88.6</w:t>
+              <w:t>88.4</w:t>
             </w:r>
           </w:p>
         </w:tc>
@@ -657,7 +657,7 @@
           </w:tcPr>
           <w:p>
             <w:r>
-              <w:t>72.9</w:t>
+              <w:t>73.9</w:t>
             </w:r>
           </w:p>
         </w:tc>
@@ -667,7 +667,7 @@
           </w:tcPr>
           <w:p>
             <w:r>
-              <w:t>534</w:t>
+              <w:t>180</w:t>
             </w:r>
           </w:p>
         </w:tc>
@@ -679,7 +679,7 @@
           </w:tcPr>
           <w:p>
             <w:r>
-              <w:t>2026-06-28 16:46:22</w:t>
+              <w:t>2026-06-28 18:17:11</w:t>
             </w:r>
           </w:p>
         </w:tc>
@@ -689,7 +689,7 @@
           </w:tcPr>
           <w:p>
             <w:r>
-              <w:t>124</w:t>
+              <w:t>128</w:t>
             </w:r>
           </w:p>
         </w:tc>
@@ -699,7 +699,7 @@
           </w:tcPr>
           <w:p>
             <w:r>
-              <w:t>78.0</w:t>
+              <w:t>80.1</w:t>
             </w:r>
           </w:p>
         </w:tc>
@@ -709,7 +709,7 @@
           </w:tcPr>
           <w:p>
             <w:r>
-              <w:t>88.5</w:t>
+              <w:t>88.3</w:t>
             </w:r>
           </w:p>
         </w:tc>
@@ -729,7 +729,7 @@
           </w:tcPr>
           <w:p>
             <w:r>
-              <w:t>72.9</w:t>
+              <w:t>73.9</w:t>
             </w:r>
           </w:p>
         </w:tc>
@@ -739,7 +739,7 @@
           </w:tcPr>
           <w:p>
             <w:r>
-              <w:t>654</w:t>
+              <w:t>300</w:t>
             </w:r>
           </w:p>
         </w:tc>
@@ -751,7 +751,7 @@
           </w:tcPr>
           <w:p>
             <w:r>
-              <w:t>2026-06-28 16:46:37</w:t>
+              <w:t>2026-06-28 18:31:11</w:t>
             </w:r>
           </w:p>
         </w:tc>
@@ -761,7 +761,7 @@
           </w:tcPr>
           <w:p>
             <w:r>
-              <w:t>125</w:t>
+              <w:t>129</w:t>
             </w:r>
           </w:p>
         </w:tc>
@@ -771,7 +771,7 @@
           </w:tcPr>
           <w:p>
             <w:r>
-              <w:t>78.5</w:t>
+              <w:t>80.6</w:t>
             </w:r>
           </w:p>
         </w:tc>
@@ -781,7 +781,7 @@
           </w:tcPr>
           <w:p>
             <w:r>
-              <w:t>88.5</w:t>
+              <w:t>88.3</w:t>
             </w:r>
           </w:p>
         </w:tc>
@@ -801,7 +801,7 @@
           </w:tcPr>
           <w:p>
             <w:r>
-              <w:t>73.1</w:t>
+              <w:t>74.1</w:t>
             </w:r>
           </w:p>
         </w:tc>
@@ -811,7 +811,7 @@
           </w:tcPr>
           <w:p>
             <w:r>
-              <w:t>655</w:t>
+              <w:t>356</w:t>
             </w:r>
           </w:p>
         </w:tc>
@@ -823,7 +823,7 @@
           </w:tcPr>
           <w:p>
             <w:r>
-              <w:t>2026-06-28 17:16:41</w:t>
+              <w:t>2026-06-28 18:48:12</w:t>
             </w:r>
           </w:p>
         </w:tc>
@@ -833,7 +833,7 @@
           </w:tcPr>
           <w:p>
             <w:r>
-              <w:t>125</w:t>
+              <w:t>130</w:t>
             </w:r>
           </w:p>
         </w:tc>
@@ -843,7 +843,7 @@
           </w:tcPr>
           <w:p>
             <w:r>
-              <w:t>78.5</w:t>
+              <w:t>81.2</w:t>
             </w:r>
           </w:p>
         </w:tc>
@@ -853,7 +853,7 @@
           </w:tcPr>
           <w:p>
             <w:r>
-              <w:t>88.5</w:t>
+              <w:t>88.2</w:t>
             </w:r>
           </w:p>
         </w:tc>
@@ -873,7 +873,7 @@
           </w:tcPr>
           <w:p>
             <w:r>
-              <w:t>73.1</w:t>
+              <w:t>74.4</w:t>
             </w:r>
           </w:p>
         </w:tc>
@@ -883,7 +883,7 @@
           </w:tcPr>
           <w:p>
             <w:r>
-              <w:t>58</w:t>
+              <w:t>29</w:t>
             </w:r>
           </w:p>
         </w:tc>
@@ -895,7 +895,7 @@
           </w:tcPr>
           <w:p>
             <w:r>
-              <w:t>2026-06-28 17:16:56</w:t>
+              <w:t>2026-06-28 19:18:12</w:t>
             </w:r>
           </w:p>
         </w:tc>
@@ -905,7 +905,7 @@
           </w:tcPr>
           <w:p>
             <w:r>
-              <w:t>126</w:t>
+              <w:t>130</w:t>
             </w:r>
           </w:p>
         </w:tc>
@@ -915,7 +915,7 @@
           </w:tcPr>
           <w:p>
             <w:r>
-              <w:t>79.1</w:t>
+              <w:t>81.2</w:t>
             </w:r>
           </w:p>
         </w:tc>
@@ -925,7 +925,7 @@
           </w:tcPr>
           <w:p>
             <w:r>
-              <w:t>88.5</w:t>
+              <w:t>88.1</w:t>
             </w:r>
           </w:p>
         </w:tc>
@@ -945,7 +945,7 @@
           </w:tcPr>
           <w:p>
             <w:r>
-              <w:t>73.4</w:t>
+              <w:t>74.4</w:t>
             </w:r>
           </w:p>
         </w:tc>
@@ -955,7 +955,7 @@
           </w:tcPr>
           <w:p>
             <w:r>
-              <w:t>59</w:t>
+              <w:t>149</w:t>
             </w:r>
           </w:p>
         </w:tc>
@@ -967,7 +967,7 @@
           </w:tcPr>
           <w:p>
             <w:r>
-              <w:t>2026-06-28 17:31:56</w:t>
+              <w:t>2026-06-28 19:30:27</w:t>
             </w:r>
           </w:p>
         </w:tc>
@@ -977,7 +977,7 @@
           </w:tcPr>
           <w:p>
             <w:r>
-              <w:t>127</w:t>
+              <w:t>131</w:t>
             </w:r>
           </w:p>
         </w:tc>
@@ -987,7 +987,7 @@
           </w:tcPr>
           <w:p>
             <w:r>
-              <w:t>79.7</w:t>
+              <w:t>80.3</w:t>
             </w:r>
           </w:p>
         </w:tc>
@@ -997,7 +997,7 @@
           </w:tcPr>
           <w:p>
             <w:r>
-              <w:t>88.5</w:t>
+              <w:t>88.1</w:t>
             </w:r>
           </w:p>
         </w:tc>
@@ -1017,7 +1017,7 @@
           </w:tcPr>
           <w:p>
             <w:r>
-              <w:t>73.7</w:t>
+              <w:t>73.9</w:t>
             </w:r>
           </w:p>
         </w:tc>
@@ -1027,7 +1027,7 @@
           </w:tcPr>
           <w:p>
             <w:r>
-              <w:t>119</w:t>
+              <w:t>198</w:t>
             </w:r>
           </w:p>
         </w:tc>
@@ -1039,7 +1039,7 @@
           </w:tcPr>
           <w:p>
             <w:r>
-              <w:t>2026-06-28 17:47:11</w:t>
+              <w:t>2026-06-28 19:48:12</w:t>
             </w:r>
           </w:p>
         </w:tc>
@@ -1049,7 +1049,7 @@
           </w:tcPr>
           <w:p>
             <w:r>
-              <w:t>128</w:t>
+              <w:t>132</w:t>
             </w:r>
           </w:p>
         </w:tc>
@@ -1059,7 +1059,7 @@
           </w:tcPr>
           <w:p>
             <w:r>
-              <w:t>80.1</w:t>
+              <w:t>80.8</w:t>
             </w:r>
           </w:p>
         </w:tc>
@@ -1069,7 +1069,7 @@
           </w:tcPr>
           <w:p>
             <w:r>
-              <w:t>88.4</w:t>
+              <w:t>88.1</w:t>
             </w:r>
           </w:p>
         </w:tc>
@@ -1089,7 +1089,7 @@
           </w:tcPr>
           <w:p>
             <w:r>
-              <w:t>73.9</w:t>
+              <w:t>74.2</w:t>
             </w:r>
           </w:p>
         </w:tc>
@@ -1099,7 +1099,7 @@
           </w:tcPr>
           <w:p>
             <w:r>
-              <w:t>180</w:t>
+              <w:t>269</w:t>
             </w:r>
           </w:p>
         </w:tc>
@@ -1111,7 +1111,7 @@
           </w:tcPr>
           <w:p>
             <w:r>
-              <w:t>2026-06-28 18:17:11</w:t>
+              <w:t>2026-06-28 20:18:14</w:t>
             </w:r>
           </w:p>
         </w:tc>
@@ -1121,7 +1121,7 @@
           </w:tcPr>
           <w:p>
             <w:r>
-              <w:t>128</w:t>
+              <w:t>132</w:t>
             </w:r>
           </w:p>
         </w:tc>
@@ -1131,7 +1131,7 @@
           </w:tcPr>
           <w:p>
             <w:r>
-              <w:t>80.1</w:t>
+              <w:t>80.8</w:t>
             </w:r>
           </w:p>
         </w:tc>
@@ -1141,7 +1141,7 @@
           </w:tcPr>
           <w:p>
             <w:r>
-              <w:t>88.3</w:t>
+              <w:t>87.9</w:t>
             </w:r>
           </w:p>
         </w:tc>
@@ -1161,7 +1161,7 @@
           </w:tcPr>
           <w:p>
             <w:r>
-              <w:t>73.9</w:t>
+              <w:t>74.1</w:t>
             </w:r>
           </w:p>
         </w:tc>
@@ -1171,7 +1171,7 @@
           </w:tcPr>
           <w:p>
             <w:r>
-              <w:t>300</w:t>
+              <w:t>7</w:t>
             </w:r>
           </w:p>
         </w:tc>
@@ -1183,7 +1183,7 @@
           </w:tcPr>
           <w:p>
             <w:r>
-              <w:t>2026-06-28 18:31:11</w:t>
+              <w:t>2026-06-28 20:48:15</w:t>
             </w:r>
           </w:p>
         </w:tc>
@@ -1193,7 +1193,7 @@
           </w:tcPr>
           <w:p>
             <w:r>
-              <w:t>129</w:t>
+              <w:t>132</w:t>
             </w:r>
           </w:p>
         </w:tc>
@@ -1203,7 +1203,7 @@
           </w:tcPr>
           <w:p>
             <w:r>
-              <w:t>80.6</w:t>
+              <w:t>80.8</w:t>
             </w:r>
           </w:p>
         </w:tc>
@@ -1213,7 +1213,7 @@
           </w:tcPr>
           <w:p>
             <w:r>
-              <w:t>88.3</w:t>
+              <w:t>87.8</w:t>
             </w:r>
           </w:p>
         </w:tc>
@@ -1243,7 +1243,7 @@
           </w:tcPr>
           <w:p>
             <w:r>
-              <w:t>356</w:t>
+              <w:t>79</w:t>
             </w:r>
           </w:p>
         </w:tc>
@@ -1255,7 +1255,7 @@
           </w:tcPr>
           <w:p>
             <w:r>
-              <w:t>2026-06-28 18:48:12</w:t>
+              <w:t>2026-06-28 21:17:00</w:t>
             </w:r>
           </w:p>
         </w:tc>
@@ -1265,7 +1265,7 @@
           </w:tcPr>
           <w:p>
             <w:r>
-              <w:t>130</w:t>
+              <w:t>133</w:t>
             </w:r>
           </w:p>
         </w:tc>
@@ -1275,7 +1275,7 @@
           </w:tcPr>
           <w:p>
             <w:r>
-              <w:t>81.2</w:t>
+              <w:t>79.9</w:t>
             </w:r>
           </w:p>
         </w:tc>
@@ -1285,7 +1285,7 @@
           </w:tcPr>
           <w:p>
             <w:r>
-              <w:t>88.2</w:t>
+              <w:t>87.8</w:t>
             </w:r>
           </w:p>
         </w:tc>
@@ -1305,7 +1305,7 @@
           </w:tcPr>
           <w:p>
             <w:r>
-              <w:t>74.4</w:t>
+              <w:t>73.7</w:t>
             </w:r>
           </w:p>
         </w:tc>
@@ -1315,7 +1315,7 @@
           </w:tcPr>
           <w:p>
             <w:r>
-              <w:t>29</w:t>
+              <w:t>194</w:t>
             </w:r>
           </w:p>
         </w:tc>
@@ -1327,7 +1327,7 @@
           </w:tcPr>
           <w:p>
             <w:r>
-              <w:t>2026-06-28 19:18:12</w:t>
+              <w:t>2026-06-28 21:47:05</w:t>
             </w:r>
           </w:p>
         </w:tc>
@@ -1337,7 +1337,7 @@
           </w:tcPr>
           <w:p>
             <w:r>
-              <w:t>130</w:t>
+              <w:t>133</w:t>
             </w:r>
           </w:p>
         </w:tc>
@@ -1347,7 +1347,7 @@
           </w:tcPr>
           <w:p>
             <w:r>
-              <w:t>81.2</w:t>
+              <w:t>79.9</w:t>
             </w:r>
           </w:p>
         </w:tc>
@@ -1357,7 +1357,7 @@
           </w:tcPr>
           <w:p>
             <w:r>
-              <w:t>88.1</w:t>
+              <w:t>87.7</w:t>
             </w:r>
           </w:p>
         </w:tc>
@@ -1377,7 +1377,7 @@
           </w:tcPr>
           <w:p>
             <w:r>
-              <w:t>74.4</w:t>
+              <w:t>73.6</w:t>
             </w:r>
           </w:p>
         </w:tc>
@@ -1387,7 +1387,7 @@
           </w:tcPr>
           <w:p>
             <w:r>
-              <w:t>149</w:t>
+              <w:t>23</w:t>
             </w:r>
           </w:p>
         </w:tc>
@@ -1399,7 +1399,7 @@
           </w:tcPr>
           <w:p>
             <w:r>
-              <w:t>2026-06-28 19:30:27</w:t>
+              <w:t>2026-06-28 22:17:05</w:t>
             </w:r>
           </w:p>
         </w:tc>
@@ -1409,7 +1409,7 @@
           </w:tcPr>
           <w:p>
             <w:r>
-              <w:t>131</w:t>
+              <w:t>133</w:t>
             </w:r>
           </w:p>
         </w:tc>
@@ -1419,7 +1419,7 @@
           </w:tcPr>
           <w:p>
             <w:r>
-              <w:t>80.3</w:t>
+              <w:t>79.9</w:t>
             </w:r>
           </w:p>
         </w:tc>
@@ -1429,7 +1429,7 @@
           </w:tcPr>
           <w:p>
             <w:r>
-              <w:t>88.1</w:t>
+              <w:t>87.6</w:t>
             </w:r>
           </w:p>
         </w:tc>
@@ -1449,7 +1449,7 @@
           </w:tcPr>
           <w:p>
             <w:r>
-              <w:t>73.9</w:t>
+              <w:t>73.6</w:t>
             </w:r>
           </w:p>
         </w:tc>
@@ -1459,7 +1459,7 @@
           </w:tcPr>
           <w:p>
             <w:r>
-              <w:t>198</w:t>
+              <w:t>143</w:t>
             </w:r>
           </w:p>
         </w:tc>
@@ -1471,7 +1471,7 @@
           </w:tcPr>
           <w:p>
             <w:r>
-              <w:t>2026-06-28 19:48:12</w:t>
+              <w:t>2026-06-28 22:47:19</w:t>
             </w:r>
           </w:p>
         </w:tc>
@@ -1481,7 +1481,7 @@
           </w:tcPr>
           <w:p>
             <w:r>
-              <w:t>132</w:t>
+              <w:t>133</w:t>
             </w:r>
           </w:p>
         </w:tc>
@@ -1491,7 +1491,7 @@
           </w:tcPr>
           <w:p>
             <w:r>
-              <w:t>80.8</w:t>
+              <w:t>79.9</w:t>
             </w:r>
           </w:p>
         </w:tc>
@@ -1501,7 +1501,7 @@
           </w:tcPr>
           <w:p>
             <w:r>
-              <w:t>88.1</w:t>
+              <w:t>87.6</w:t>
             </w:r>
           </w:p>
         </w:tc>
@@ -1521,7 +1521,7 @@
           </w:tcPr>
           <w:p>
             <w:r>
-              <w:t>74.2</w:t>
+              <w:t>73.6</w:t>
             </w:r>
           </w:p>
         </w:tc>
@@ -1531,7 +1531,7 @@
           </w:tcPr>
           <w:p>
             <w:r>
-              <w:t>269</w:t>
+              <w:t>264</w:t>
             </w:r>
           </w:p>
         </w:tc>
@@ -1543,7 +1543,7 @@
           </w:tcPr>
           <w:p>
             <w:r>
-              <w:t>2026-06-28 20:18:14</w:t>
+              <w:t>2026-06-28 23:03:05</w:t>
             </w:r>
           </w:p>
         </w:tc>
@@ -1553,7 +1553,7 @@
           </w:tcPr>
           <w:p>
             <w:r>
-              <w:t>132</w:t>
+              <w:t>134</w:t>
             </w:r>
           </w:p>
         </w:tc>
@@ -1563,7 +1563,7 @@
           </w:tcPr>
           <w:p>
             <w:r>
-              <w:t>80.8</w:t>
+              <w:t>80.5</w:t>
             </w:r>
           </w:p>
         </w:tc>
@@ -1573,7 +1573,7 @@
           </w:tcPr>
           <w:p>
             <w:r>
-              <w:t>87.9</w:t>
+              <w:t>87.5</w:t>
             </w:r>
           </w:p>
         </w:tc>
@@ -1593,7 +1593,7 @@
           </w:tcPr>
           <w:p>
             <w:r>
-              <w:t>74.1</w:t>
+              <w:t>73.9</w:t>
             </w:r>
           </w:p>
         </w:tc>
@@ -1603,7 +1603,7 @@
           </w:tcPr>
           <w:p>
             <w:r>
-              <w:t>7</w:t>
+              <w:t>327</w:t>
             </w:r>
           </w:p>
         </w:tc>
@@ -1615,7 +1615,7 @@
           </w:tcPr>
           <w:p>
             <w:r>
-              <w:t>2026-06-28 20:48:15</w:t>
+              <w:t>2026-06-28 23:33:19</w:t>
             </w:r>
           </w:p>
         </w:tc>
@@ -1625,7 +1625,7 @@
           </w:tcPr>
           <w:p>
             <w:r>
-              <w:t>132</w:t>
+              <w:t>134</w:t>
             </w:r>
           </w:p>
         </w:tc>
@@ -1635,7 +1635,7 @@
           </w:tcPr>
           <w:p>
             <w:r>
-              <w:t>80.8</w:t>
+              <w:t>80.5</w:t>
             </w:r>
           </w:p>
         </w:tc>
@@ -1645,7 +1645,7 @@
           </w:tcPr>
           <w:p>
             <w:r>
-              <w:t>87.8</w:t>
+              <w:t>87.4</w:t>
             </w:r>
           </w:p>
         </w:tc>
@@ -1665,7 +1665,7 @@
           </w:tcPr>
           <w:p>
             <w:r>
-              <w:t>74.1</w:t>
+              <w:t>73.8</w:t>
             </w:r>
           </w:p>
         </w:tc>
@@ -1675,7 +1675,7 @@
           </w:tcPr>
           <w:p>
             <w:r>
-              <w:t>79</w:t>
+              <w:t>448</w:t>
             </w:r>
           </w:p>
         </w:tc>
@@ -1687,7 +1687,7 @@
           </w:tcPr>
           <w:p>
             <w:r>
-              <w:t>2026-06-28 21:17:00</w:t>
+              <w:t>2026-06-29 00:03:19</w:t>
             </w:r>
           </w:p>
         </w:tc>
@@ -1697,7 +1697,7 @@
           </w:tcPr>
           <w:p>
             <w:r>
-              <w:t>133</w:t>
+              <w:t>134</w:t>
             </w:r>
           </w:p>
         </w:tc>
@@ -1707,7 +1707,7 @@
           </w:tcPr>
           <w:p>
             <w:r>
-              <w:t>79.9</w:t>
+              <w:t>80.5</w:t>
             </w:r>
           </w:p>
         </w:tc>
@@ -1717,7 +1717,7 @@
           </w:tcPr>
           <w:p>
             <w:r>
-              <w:t>87.8</w:t>
+              <w:t>87.4</w:t>
             </w:r>
           </w:p>
         </w:tc>
@@ -1737,7 +1737,7 @@
           </w:tcPr>
           <w:p>
             <w:r>
-              <w:t>73.7</w:t>
+              <w:t>73.8</w:t>
             </w:r>
           </w:p>
         </w:tc>
@@ -1747,7 +1747,7 @@
           </w:tcPr>
           <w:p>
             <w:r>
-              <w:t>194</w:t>
+              <w:t>568</w:t>
             </w:r>
           </w:p>
         </w:tc>
@@ -1768,7 +1768,7 @@
     </w:p>
     <w:p>
       <w:r>
-        <w:t>Section score: 79.9 / 100  (Grade: C+)</w:t>
+        <w:t>Section score: 80.5 / 100  (Grade: B)</w:t>
       </w:r>
     </w:p>
     <w:p>
@@ -1911,7 +1911,7 @@
           </w:tcPr>
           <w:p>
             <w:r>
-              <w:t>69.1</w:t>
+              <w:t>71.8</w:t>
             </w:r>
           </w:p>
         </w:tc>
@@ -1921,7 +1921,7 @@
           </w:tcPr>
           <w:p>
             <w:r>
-              <w:t>10.4</w:t>
+              <w:t>10.8</w:t>
             </w:r>
           </w:p>
         </w:tc>
@@ -2007,7 +2007,7 @@
           </w:tcPr>
           <w:p>
             <w:r>
-              <w:t>76.2</w:t>
+              <w:t>76.7</w:t>
             </w:r>
           </w:p>
         </w:tc>
@@ -2017,7 +2017,7 @@
           </w:tcPr>
           <w:p>
             <w:r>
-              <w:t>7.6</w:t>
+              <w:t>7.7</w:t>
             </w:r>
           </w:p>
         </w:tc>
@@ -2039,7 +2039,7 @@
           </w:tcPr>
           <w:p>
             <w:r>
-              <w:t>47.8</w:t>
+              <w:t>48.4</w:t>
             </w:r>
           </w:p>
         </w:tc>
@@ -2049,7 +2049,7 @@
           </w:tcPr>
           <w:p>
             <w:r>
-              <w:t>12.0</w:t>
+              <w:t>12.1</w:t>
             </w:r>
           </w:p>
         </w:tc>
@@ -2090,7 +2090,7 @@
           </w:tcPr>
           <w:p>
             <w:r>
-              <w:t>$665.45</w:t>
+              <w:t>$677.28</w:t>
             </w:r>
           </w:p>
         </w:tc>
@@ -2112,7 +2112,7 @@
           </w:tcPr>
           <w:p>
             <w:r>
-              <w:t>33.09%</w:t>
+              <w:t>35.46%</w:t>
             </w:r>
           </w:p>
         </w:tc>
@@ -2134,7 +2134,7 @@
           </w:tcPr>
           <w:p>
             <w:r>
-              <w:t>$56.81</w:t>
+              <w:t>$61.81</w:t>
             </w:r>
           </w:p>
         </w:tc>
@@ -2178,7 +2178,7 @@
           </w:tcPr>
           <w:p>
             <w:r>
-              <w:t>0.6391</w:t>
+              <w:t>0.6418</w:t>
             </w:r>
           </w:p>
         </w:tc>
@@ -2200,7 +2200,7 @@
           </w:tcPr>
           <w:p>
             <w:r>
-              <w:t>0.5000 / 0.6637</w:t>
+              <w:t>0.5000 / 0.6667</w:t>
             </w:r>
           </w:p>
         </w:tc>
@@ -2222,7 +2222,7 @@
           </w:tcPr>
           <w:p>
             <w:r>
-              <w:t>1.2525</w:t>
+              <w:t>1.2747</w:t>
             </w:r>
           </w:p>
         </w:tc>
@@ -2244,7 +2244,7 @@
           </w:tcPr>
           <w:p>
             <w:r>
-              <w:t>133 / 133</w:t>
+              <w:t>134 / 134</w:t>
             </w:r>
           </w:p>
         </w:tc>
@@ -2266,7 +2266,7 @@
           </w:tcPr>
           <w:p>
             <w:r>
-              <w:t>$0.43</w:t>
+              <w:t>$0.46</w:t>
             </w:r>
           </w:p>
         </w:tc>
@@ -2397,7 +2397,7 @@
           </w:tcPr>
           <w:p>
             <w:r>
-              <w:t>0.540</w:t>
+              <w:t>0.500</w:t>
             </w:r>
           </w:p>
         </w:tc>
@@ -2407,7 +2407,7 @@
           </w:tcPr>
           <w:p>
             <w:r>
-              <w:t>up</w:t>
+              <w:t>down</w:t>
             </w:r>
           </w:p>
         </w:tc>
@@ -2417,7 +2417,7 @@
           </w:tcPr>
           <w:p>
             <w:r>
-              <w:t>No</w:t>
+              <w:t>Yes</w:t>
             </w:r>
           </w:p>
         </w:tc>
@@ -2427,7 +2427,7 @@
           </w:tcPr>
           <w:p>
             <w:r>
-              <w:t>$-5.00</w:t>
+              <w:t>$5.00</w:t>
             </w:r>
           </w:p>
         </w:tc>
@@ -2459,7 +2459,7 @@
           </w:tcPr>
           <w:p>
             <w:r>
-              <w:t>down</w:t>
+              <w:t>up</w:t>
             </w:r>
           </w:p>
         </w:tc>
@@ -2469,7 +2469,7 @@
           </w:tcPr>
           <w:p>
             <w:r>
-              <w:t>Yes</w:t>
+              <w:t>No</w:t>
             </w:r>
           </w:p>
         </w:tc>
@@ -2479,7 +2479,7 @@
           </w:tcPr>
           <w:p>
             <w:r>
-              <w:t>$4.26</w:t>
+              <w:t>$-5.00</w:t>
             </w:r>
           </w:p>
         </w:tc>
@@ -2501,7 +2501,7 @@
           </w:tcPr>
           <w:p>
             <w:r>
-              <w:t>0.620</w:t>
+              <w:t>0.540</w:t>
             </w:r>
           </w:p>
         </w:tc>
@@ -2511,7 +2511,7 @@
           </w:tcPr>
           <w:p>
             <w:r>
-              <w:t>up</w:t>
+              <w:t>down</w:t>
             </w:r>
           </w:p>
         </w:tc>
@@ -2521,7 +2521,7 @@
           </w:tcPr>
           <w:p>
             <w:r>
-              <w:t>No</w:t>
+              <w:t>Yes</w:t>
             </w:r>
           </w:p>
         </w:tc>
@@ -2531,7 +2531,7 @@
           </w:tcPr>
           <w:p>
             <w:r>
-              <w:t>$-5.00</w:t>
+              <w:t>$4.26</w:t>
             </w:r>
           </w:p>
         </w:tc>
@@ -2553,7 +2553,7 @@
           </w:tcPr>
           <w:p>
             <w:r>
-              <w:t>0.570</w:t>
+              <w:t>0.620</w:t>
             </w:r>
           </w:p>
         </w:tc>
@@ -2563,7 +2563,7 @@
           </w:tcPr>
           <w:p>
             <w:r>
-              <w:t>down</w:t>
+              <w:t>up</w:t>
             </w:r>
           </w:p>
         </w:tc>
@@ -2573,7 +2573,7 @@
           </w:tcPr>
           <w:p>
             <w:r>
-              <w:t>Yes</w:t>
+              <w:t>No</w:t>
             </w:r>
           </w:p>
         </w:tc>
@@ -2583,7 +2583,7 @@
           </w:tcPr>
           <w:p>
             <w:r>
-              <w:t>$3.77</w:t>
+              <w:t>$-5.00</w:t>
             </w:r>
           </w:p>
         </w:tc>
@@ -2605,7 +2605,7 @@
           </w:tcPr>
           <w:p>
             <w:r>
-              <w:t>0.590</w:t>
+              <w:t>0.570</w:t>
             </w:r>
           </w:p>
         </w:tc>
@@ -2635,7 +2635,7 @@
           </w:tcPr>
           <w:p>
             <w:r>
-              <w:t>$3.47</w:t>
+              <w:t>$3.77</w:t>
             </w:r>
           </w:p>
         </w:tc>
@@ -2657,7 +2657,7 @@
           </w:tcPr>
           <w:p>
             <w:r>
-              <w:t>0.610</w:t>
+              <w:t>0.590</w:t>
             </w:r>
           </w:p>
         </w:tc>
@@ -2687,7 +2687,7 @@
           </w:tcPr>
           <w:p>
             <w:r>
-              <w:t>$3.20</w:t>
+              <w:t>$3.47</w:t>
             </w:r>
           </w:p>
         </w:tc>
@@ -2709,7 +2709,7 @@
           </w:tcPr>
           <w:p>
             <w:r>
-              <w:t>0.510</w:t>
+              <w:t>0.610</w:t>
             </w:r>
           </w:p>
         </w:tc>
@@ -2739,7 +2739,7 @@
           </w:tcPr>
           <w:p>
             <w:r>
-              <w:t>$4.80</w:t>
+              <w:t>$3.20</w:t>
             </w:r>
           </w:p>
         </w:tc>
@@ -2761,7 +2761,7 @@
           </w:tcPr>
           <w:p>
             <w:r>
-              <w:t>0.550</w:t>
+              <w:t>0.510</w:t>
             </w:r>
           </w:p>
         </w:tc>
@@ -2791,7 +2791,7 @@
           </w:tcPr>
           <w:p>
             <w:r>
-              <w:t>$4.09</w:t>
+              <w:t>$4.80</w:t>
             </w:r>
           </w:p>
         </w:tc>
@@ -2813,7 +2813,7 @@
           </w:tcPr>
           <w:p>
             <w:r>
-              <w:t>0.590</w:t>
+              <w:t>0.550</w:t>
             </w:r>
           </w:p>
         </w:tc>
@@ -2843,7 +2843,7 @@
           </w:tcPr>
           <w:p>
             <w:r>
-              <w:t>$3.47</w:t>
+              <w:t>$4.09</w:t>
             </w:r>
           </w:p>
         </w:tc>
@@ -2865,7 +2865,7 @@
           </w:tcPr>
           <w:p>
             <w:r>
-              <w:t>0.480</w:t>
+              <w:t>0.590</w:t>
             </w:r>
           </w:p>
         </w:tc>
@@ -2895,7 +2895,7 @@
           </w:tcPr>
           <w:p>
             <w:r>
-              <w:t>$5.42</w:t>
+              <w:t>$3.47</w:t>
             </w:r>
           </w:p>
         </w:tc>
@@ -2917,7 +2917,7 @@
           </w:tcPr>
           <w:p>
             <w:r>
-              <w:t>0.580</w:t>
+              <w:t>0.480</w:t>
             </w:r>
           </w:p>
         </w:tc>
@@ -2947,7 +2947,7 @@
           </w:tcPr>
           <w:p>
             <w:r>
-              <w:t>$3.62</w:t>
+              <w:t>$5.42</w:t>
             </w:r>
           </w:p>
         </w:tc>
@@ -2969,7 +2969,7 @@
           </w:tcPr>
           <w:p>
             <w:r>
-              <w:t>0.570</w:t>
+              <w:t>0.580</w:t>
             </w:r>
           </w:p>
         </w:tc>
@@ -2999,7 +2999,7 @@
           </w:tcPr>
           <w:p>
             <w:r>
-              <w:t>$3.77</w:t>
+              <w:t>$3.62</w:t>
             </w:r>
           </w:p>
         </w:tc>
@@ -3021,7 +3021,7 @@
           </w:tcPr>
           <w:p>
             <w:r>
-              <w:t>0.530</w:t>
+              <w:t>0.570</w:t>
             </w:r>
           </w:p>
         </w:tc>
@@ -3051,7 +3051,7 @@
           </w:tcPr>
           <w:p>
             <w:r>
-              <w:t>$4.43</w:t>
+              <w:t>$3.77</w:t>
             </w:r>
           </w:p>
         </w:tc>
@@ -3073,7 +3073,7 @@
           </w:tcPr>
           <w:p>
             <w:r>
-              <w:t>0.590</w:t>
+              <w:t>0.530</w:t>
             </w:r>
           </w:p>
         </w:tc>
@@ -3083,7 +3083,7 @@
           </w:tcPr>
           <w:p>
             <w:r>
-              <w:t>up</w:t>
+              <w:t>down</w:t>
             </w:r>
           </w:p>
         </w:tc>
@@ -3093,7 +3093,7 @@
           </w:tcPr>
           <w:p>
             <w:r>
-              <w:t>No</w:t>
+              <w:t>Yes</w:t>
             </w:r>
           </w:p>
         </w:tc>
@@ -3103,7 +3103,7 @@
           </w:tcPr>
           <w:p>
             <w:r>
-              <w:t>$-5.00</w:t>
+              <w:t>$4.43</w:t>
             </w:r>
           </w:p>
         </w:tc>
@@ -3125,7 +3125,7 @@
           </w:tcPr>
           <w:p>
             <w:r>
-              <w:t>0.670</w:t>
+              <w:t>0.590</w:t>
             </w:r>
           </w:p>
         </w:tc>
@@ -3135,7 +3135,7 @@
           </w:tcPr>
           <w:p>
             <w:r>
-              <w:t>down</w:t>
+              <w:t>up</w:t>
             </w:r>
           </w:p>
         </w:tc>
@@ -3145,7 +3145,7 @@
           </w:tcPr>
           <w:p>
             <w:r>
-              <w:t>Yes</w:t>
+              <w:t>No</w:t>
             </w:r>
           </w:p>
         </w:tc>
@@ -3155,7 +3155,7 @@
           </w:tcPr>
           <w:p>
             <w:r>
-              <w:t>$2.46</w:t>
+              <w:t>$-5.00</w:t>
             </w:r>
           </w:p>
         </w:tc>
@@ -3176,7 +3176,7 @@
     </w:p>
     <w:p>
       <w:r>
-        <w:t>Section score: 87.7 / 100  (Grade: B+)</w:t>
+        <w:t>Section score: 87.4 / 100  (Grade: B+)</w:t>
       </w:r>
     </w:p>
     <w:p>
@@ -3319,7 +3319,7 @@
           </w:tcPr>
           <w:p>
             <w:r>
-              <w:t>78.0</w:t>
+              <w:t>75.7</w:t>
             </w:r>
           </w:p>
         </w:tc>
@@ -3329,7 +3329,7 @@
           </w:tcPr>
           <w:p>
             <w:r>
-              <w:t>11.7</w:t>
+              <w:t>11.4</w:t>
             </w:r>
           </w:p>
         </w:tc>
@@ -3433,17 +3433,17 @@
     </w:tbl>
     <w:p>
       <w:r>
-        <w:t>Ticks: 262 · Reconciled: True · Readiness: not_ready</w:t>
+        <w:t>Ticks: 584 · Reconciled: True · Readiness: not_ready</w:t>
       </w:r>
     </w:p>
     <w:p>
       <w:r>
-        <w:t>Candidates created: 58912 · Terminals: {'accepted': 86, 'rejected': 46058, 'skipped': 12453, 'expired': 0, 'missing_data': 315}</w:t>
+        <w:t>Candidates created: 60106 · Terminals: {'accepted': 86, 'rejected': 46636, 'skipped': 13063, 'expired': 0, 'missing_data': 321}</w:t>
       </w:r>
     </w:p>
     <w:p>
       <w:r>
-        <w:t>Rejected by stage: {'directional': 35433, 'execution_gate': 224, 'context_gate': 879, 'directional_allowlist': 1364, 'down_bias_gate': 538, 'mtf_gate': 276, 'grok_decider': 3540, 'execution_realistic': 3, 'verifier': 61, 'mispricing_gate': 50, 'baseline_cohort_gate': 3690}</w:t>
+        <w:t>Rejected by stage: {'directional': 35990, 'execution_gate': 226, 'context_gate': 879, 'directional_allowlist': 1364, 'down_bias_gate': 538, 'mtf_gate': 276, 'grok_decider': 3540, 'execution_realistic': 3, 'verifier': 61, 'mispricing_gate': 50, 'baseline_cohort_gate': 3709}</w:t>
       </w:r>
     </w:p>
     <w:p>
@@ -4396,7 +4396,7 @@
           </w:tcPr>
           <w:p>
             <w:r>
-              <w:t>0.4799</w:t>
+              <w:t>0.4787</w:t>
             </w:r>
           </w:p>
         </w:tc>
@@ -4426,7 +4426,7 @@
     </w:tbl>
     <w:p>
       <w:r>
-        <w:t>TV alerts: received 1803 · valid 1784 · rejected 2</w:t>
+        <w:t>TV alerts: received 1935 · valid 1916 · rejected 2</w:t>
       </w:r>
     </w:p>
     <w:sectPr>

</xml_diff>

<commit_message>
chore(reports): VPS full report 2026-06-29 01:34 UTC (135 settled, WR 63.7%, PF 1.247, grade C+)
</commit_message>
<xml_diff>
--- a/vps_full_reports/latest/report.docx
+++ b/vps_full_reports/latest/report.docx
@@ -20,7 +20,7 @@
           <w:color w:val="666666"/>
           <w:sz w:val="20"/>
         </w:rPr>
-        <w:t>PAPER ONLY  ·  reconciled=True  ·  ticks=584</w:t>
+        <w:t>PAPER ONLY  ·  reconciled=True  ·  ticks=188</w:t>
       </w:r>
     </w:p>
     <w:p>
@@ -33,7 +33,7 @@
     </w:p>
     <w:p>
       <w:r>
-        <w:t>Overall score: 73.8 / 100  (Grade: C)</w:t>
+        <w:t>Overall score: 73.4 / 100  (Grade: C)</w:t>
       </w:r>
     </w:p>
     <w:tbl>
@@ -107,7 +107,7 @@
           </w:tcPr>
           <w:p>
             <w:r>
-              <w:t>80.5</w:t>
+              <w:t>79.7</w:t>
             </w:r>
           </w:p>
         </w:tc>
@@ -117,7 +117,7 @@
           </w:tcPr>
           <w:p>
             <w:r>
-              <w:t>B</w:t>
+              <w:t>C+</w:t>
             </w:r>
           </w:p>
         </w:tc>
@@ -149,7 +149,7 @@
           </w:tcPr>
           <w:p>
             <w:r>
-              <w:t>87.4</w:t>
+              <w:t>87.3</w:t>
             </w:r>
           </w:p>
         </w:tc>
@@ -319,7 +319,7 @@
           </w:tcPr>
           <w:p>
             <w:r>
-              <w:t>2026-06-28 16:46:37</w:t>
+              <w:t>2026-06-28 17:31:56</w:t>
             </w:r>
           </w:p>
         </w:tc>
@@ -329,7 +329,7 @@
           </w:tcPr>
           <w:p>
             <w:r>
-              <w:t>125</w:t>
+              <w:t>127</w:t>
             </w:r>
           </w:p>
         </w:tc>
@@ -339,7 +339,7 @@
           </w:tcPr>
           <w:p>
             <w:r>
-              <w:t>78.5</w:t>
+              <w:t>79.7</w:t>
             </w:r>
           </w:p>
         </w:tc>
@@ -369,7 +369,7 @@
           </w:tcPr>
           <w:p>
             <w:r>
-              <w:t>73.1</w:t>
+              <w:t>73.7</w:t>
             </w:r>
           </w:p>
         </w:tc>
@@ -379,7 +379,7 @@
           </w:tcPr>
           <w:p>
             <w:r>
-              <w:t>655</w:t>
+              <w:t>119</w:t>
             </w:r>
           </w:p>
         </w:tc>
@@ -391,7 +391,7 @@
           </w:tcPr>
           <w:p>
             <w:r>
-              <w:t>2026-06-28 17:16:41</w:t>
+              <w:t>2026-06-28 17:47:11</w:t>
             </w:r>
           </w:p>
         </w:tc>
@@ -401,7 +401,7 @@
           </w:tcPr>
           <w:p>
             <w:r>
-              <w:t>125</w:t>
+              <w:t>128</w:t>
             </w:r>
           </w:p>
         </w:tc>
@@ -411,7 +411,7 @@
           </w:tcPr>
           <w:p>
             <w:r>
-              <w:t>78.5</w:t>
+              <w:t>80.1</w:t>
             </w:r>
           </w:p>
         </w:tc>
@@ -421,7 +421,7 @@
           </w:tcPr>
           <w:p>
             <w:r>
-              <w:t>88.5</w:t>
+              <w:t>88.4</w:t>
             </w:r>
           </w:p>
         </w:tc>
@@ -441,7 +441,7 @@
           </w:tcPr>
           <w:p>
             <w:r>
-              <w:t>73.1</w:t>
+              <w:t>73.9</w:t>
             </w:r>
           </w:p>
         </w:tc>
@@ -451,7 +451,7 @@
           </w:tcPr>
           <w:p>
             <w:r>
-              <w:t>58</w:t>
+              <w:t>180</w:t>
             </w:r>
           </w:p>
         </w:tc>
@@ -463,7 +463,7 @@
           </w:tcPr>
           <w:p>
             <w:r>
-              <w:t>2026-06-28 17:16:56</w:t>
+              <w:t>2026-06-28 18:17:11</w:t>
             </w:r>
           </w:p>
         </w:tc>
@@ -473,7 +473,7 @@
           </w:tcPr>
           <w:p>
             <w:r>
-              <w:t>126</w:t>
+              <w:t>128</w:t>
             </w:r>
           </w:p>
         </w:tc>
@@ -483,7 +483,7 @@
           </w:tcPr>
           <w:p>
             <w:r>
-              <w:t>79.1</w:t>
+              <w:t>80.1</w:t>
             </w:r>
           </w:p>
         </w:tc>
@@ -493,7 +493,7 @@
           </w:tcPr>
           <w:p>
             <w:r>
-              <w:t>88.5</w:t>
+              <w:t>88.3</w:t>
             </w:r>
           </w:p>
         </w:tc>
@@ -513,7 +513,7 @@
           </w:tcPr>
           <w:p>
             <w:r>
-              <w:t>73.4</w:t>
+              <w:t>73.9</w:t>
             </w:r>
           </w:p>
         </w:tc>
@@ -523,7 +523,7 @@
           </w:tcPr>
           <w:p>
             <w:r>
-              <w:t>59</w:t>
+              <w:t>300</w:t>
             </w:r>
           </w:p>
         </w:tc>
@@ -535,7 +535,7 @@
           </w:tcPr>
           <w:p>
             <w:r>
-              <w:t>2026-06-28 17:31:56</w:t>
+              <w:t>2026-06-28 18:31:11</w:t>
             </w:r>
           </w:p>
         </w:tc>
@@ -545,7 +545,7 @@
           </w:tcPr>
           <w:p>
             <w:r>
-              <w:t>127</w:t>
+              <w:t>129</w:t>
             </w:r>
           </w:p>
         </w:tc>
@@ -555,7 +555,7 @@
           </w:tcPr>
           <w:p>
             <w:r>
-              <w:t>79.7</w:t>
+              <w:t>80.6</w:t>
             </w:r>
           </w:p>
         </w:tc>
@@ -565,7 +565,7 @@
           </w:tcPr>
           <w:p>
             <w:r>
-              <w:t>88.5</w:t>
+              <w:t>88.3</w:t>
             </w:r>
           </w:p>
         </w:tc>
@@ -585,7 +585,7 @@
           </w:tcPr>
           <w:p>
             <w:r>
-              <w:t>73.7</w:t>
+              <w:t>74.1</w:t>
             </w:r>
           </w:p>
         </w:tc>
@@ -595,7 +595,7 @@
           </w:tcPr>
           <w:p>
             <w:r>
-              <w:t>119</w:t>
+              <w:t>356</w:t>
             </w:r>
           </w:p>
         </w:tc>
@@ -607,7 +607,7 @@
           </w:tcPr>
           <w:p>
             <w:r>
-              <w:t>2026-06-28 17:47:11</w:t>
+              <w:t>2026-06-28 18:48:12</w:t>
             </w:r>
           </w:p>
         </w:tc>
@@ -617,7 +617,7 @@
           </w:tcPr>
           <w:p>
             <w:r>
-              <w:t>128</w:t>
+              <w:t>130</w:t>
             </w:r>
           </w:p>
         </w:tc>
@@ -627,7 +627,7 @@
           </w:tcPr>
           <w:p>
             <w:r>
-              <w:t>80.1</w:t>
+              <w:t>81.2</w:t>
             </w:r>
           </w:p>
         </w:tc>
@@ -637,7 +637,7 @@
           </w:tcPr>
           <w:p>
             <w:r>
-              <w:t>88.4</w:t>
+              <w:t>88.2</w:t>
             </w:r>
           </w:p>
         </w:tc>
@@ -657,7 +657,7 @@
           </w:tcPr>
           <w:p>
             <w:r>
-              <w:t>73.9</w:t>
+              <w:t>74.4</w:t>
             </w:r>
           </w:p>
         </w:tc>
@@ -667,7 +667,7 @@
           </w:tcPr>
           <w:p>
             <w:r>
-              <w:t>180</w:t>
+              <w:t>29</w:t>
             </w:r>
           </w:p>
         </w:tc>
@@ -679,7 +679,7 @@
           </w:tcPr>
           <w:p>
             <w:r>
-              <w:t>2026-06-28 18:17:11</w:t>
+              <w:t>2026-06-28 19:18:12</w:t>
             </w:r>
           </w:p>
         </w:tc>
@@ -689,7 +689,7 @@
           </w:tcPr>
           <w:p>
             <w:r>
-              <w:t>128</w:t>
+              <w:t>130</w:t>
             </w:r>
           </w:p>
         </w:tc>
@@ -699,7 +699,7 @@
           </w:tcPr>
           <w:p>
             <w:r>
-              <w:t>80.1</w:t>
+              <w:t>81.2</w:t>
             </w:r>
           </w:p>
         </w:tc>
@@ -709,7 +709,7 @@
           </w:tcPr>
           <w:p>
             <w:r>
-              <w:t>88.3</w:t>
+              <w:t>88.1</w:t>
             </w:r>
           </w:p>
         </w:tc>
@@ -729,7 +729,7 @@
           </w:tcPr>
           <w:p>
             <w:r>
-              <w:t>73.9</w:t>
+              <w:t>74.4</w:t>
             </w:r>
           </w:p>
         </w:tc>
@@ -739,7 +739,7 @@
           </w:tcPr>
           <w:p>
             <w:r>
-              <w:t>300</w:t>
+              <w:t>149</w:t>
             </w:r>
           </w:p>
         </w:tc>
@@ -751,7 +751,7 @@
           </w:tcPr>
           <w:p>
             <w:r>
-              <w:t>2026-06-28 18:31:11</w:t>
+              <w:t>2026-06-28 19:30:27</w:t>
             </w:r>
           </w:p>
         </w:tc>
@@ -761,7 +761,7 @@
           </w:tcPr>
           <w:p>
             <w:r>
-              <w:t>129</w:t>
+              <w:t>131</w:t>
             </w:r>
           </w:p>
         </w:tc>
@@ -771,7 +771,7 @@
           </w:tcPr>
           <w:p>
             <w:r>
-              <w:t>80.6</w:t>
+              <w:t>80.3</w:t>
             </w:r>
           </w:p>
         </w:tc>
@@ -781,7 +781,7 @@
           </w:tcPr>
           <w:p>
             <w:r>
-              <w:t>88.3</w:t>
+              <w:t>88.1</w:t>
             </w:r>
           </w:p>
         </w:tc>
@@ -801,7 +801,7 @@
           </w:tcPr>
           <w:p>
             <w:r>
-              <w:t>74.1</w:t>
+              <w:t>73.9</w:t>
             </w:r>
           </w:p>
         </w:tc>
@@ -811,7 +811,7 @@
           </w:tcPr>
           <w:p>
             <w:r>
-              <w:t>356</w:t>
+              <w:t>198</w:t>
             </w:r>
           </w:p>
         </w:tc>
@@ -823,7 +823,7 @@
           </w:tcPr>
           <w:p>
             <w:r>
-              <w:t>2026-06-28 18:48:12</w:t>
+              <w:t>2026-06-28 19:48:12</w:t>
             </w:r>
           </w:p>
         </w:tc>
@@ -833,7 +833,7 @@
           </w:tcPr>
           <w:p>
             <w:r>
-              <w:t>130</w:t>
+              <w:t>132</w:t>
             </w:r>
           </w:p>
         </w:tc>
@@ -843,7 +843,7 @@
           </w:tcPr>
           <w:p>
             <w:r>
-              <w:t>81.2</w:t>
+              <w:t>80.8</w:t>
             </w:r>
           </w:p>
         </w:tc>
@@ -853,7 +853,7 @@
           </w:tcPr>
           <w:p>
             <w:r>
-              <w:t>88.2</w:t>
+              <w:t>88.1</w:t>
             </w:r>
           </w:p>
         </w:tc>
@@ -873,7 +873,7 @@
           </w:tcPr>
           <w:p>
             <w:r>
-              <w:t>74.4</w:t>
+              <w:t>74.2</w:t>
             </w:r>
           </w:p>
         </w:tc>
@@ -883,7 +883,7 @@
           </w:tcPr>
           <w:p>
             <w:r>
-              <w:t>29</w:t>
+              <w:t>269</w:t>
             </w:r>
           </w:p>
         </w:tc>
@@ -895,7 +895,7 @@
           </w:tcPr>
           <w:p>
             <w:r>
-              <w:t>2026-06-28 19:18:12</w:t>
+              <w:t>2026-06-28 20:18:14</w:t>
             </w:r>
           </w:p>
         </w:tc>
@@ -905,7 +905,7 @@
           </w:tcPr>
           <w:p>
             <w:r>
-              <w:t>130</w:t>
+              <w:t>132</w:t>
             </w:r>
           </w:p>
         </w:tc>
@@ -915,7 +915,7 @@
           </w:tcPr>
           <w:p>
             <w:r>
-              <w:t>81.2</w:t>
+              <w:t>80.8</w:t>
             </w:r>
           </w:p>
         </w:tc>
@@ -925,7 +925,7 @@
           </w:tcPr>
           <w:p>
             <w:r>
-              <w:t>88.1</w:t>
+              <w:t>87.9</w:t>
             </w:r>
           </w:p>
         </w:tc>
@@ -945,7 +945,7 @@
           </w:tcPr>
           <w:p>
             <w:r>
-              <w:t>74.4</w:t>
+              <w:t>74.1</w:t>
             </w:r>
           </w:p>
         </w:tc>
@@ -955,7 +955,7 @@
           </w:tcPr>
           <w:p>
             <w:r>
-              <w:t>149</w:t>
+              <w:t>7</w:t>
             </w:r>
           </w:p>
         </w:tc>
@@ -967,7 +967,7 @@
           </w:tcPr>
           <w:p>
             <w:r>
-              <w:t>2026-06-28 19:30:27</w:t>
+              <w:t>2026-06-28 20:48:15</w:t>
             </w:r>
           </w:p>
         </w:tc>
@@ -977,7 +977,7 @@
           </w:tcPr>
           <w:p>
             <w:r>
-              <w:t>131</w:t>
+              <w:t>132</w:t>
             </w:r>
           </w:p>
         </w:tc>
@@ -987,7 +987,7 @@
           </w:tcPr>
           <w:p>
             <w:r>
-              <w:t>80.3</w:t>
+              <w:t>80.8</w:t>
             </w:r>
           </w:p>
         </w:tc>
@@ -997,7 +997,7 @@
           </w:tcPr>
           <w:p>
             <w:r>
-              <w:t>88.1</w:t>
+              <w:t>87.8</w:t>
             </w:r>
           </w:p>
         </w:tc>
@@ -1017,7 +1017,7 @@
           </w:tcPr>
           <w:p>
             <w:r>
-              <w:t>73.9</w:t>
+              <w:t>74.1</w:t>
             </w:r>
           </w:p>
         </w:tc>
@@ -1027,7 +1027,7 @@
           </w:tcPr>
           <w:p>
             <w:r>
-              <w:t>198</w:t>
+              <w:t>79</w:t>
             </w:r>
           </w:p>
         </w:tc>
@@ -1039,7 +1039,7 @@
           </w:tcPr>
           <w:p>
             <w:r>
-              <w:t>2026-06-28 19:48:12</w:t>
+              <w:t>2026-06-28 21:17:00</w:t>
             </w:r>
           </w:p>
         </w:tc>
@@ -1049,7 +1049,7 @@
           </w:tcPr>
           <w:p>
             <w:r>
-              <w:t>132</w:t>
+              <w:t>133</w:t>
             </w:r>
           </w:p>
         </w:tc>
@@ -1059,7 +1059,7 @@
           </w:tcPr>
           <w:p>
             <w:r>
-              <w:t>80.8</w:t>
+              <w:t>79.9</w:t>
             </w:r>
           </w:p>
         </w:tc>
@@ -1069,7 +1069,7 @@
           </w:tcPr>
           <w:p>
             <w:r>
-              <w:t>88.1</w:t>
+              <w:t>87.8</w:t>
             </w:r>
           </w:p>
         </w:tc>
@@ -1089,7 +1089,7 @@
           </w:tcPr>
           <w:p>
             <w:r>
-              <w:t>74.2</w:t>
+              <w:t>73.7</w:t>
             </w:r>
           </w:p>
         </w:tc>
@@ -1099,7 +1099,7 @@
           </w:tcPr>
           <w:p>
             <w:r>
-              <w:t>269</w:t>
+              <w:t>194</w:t>
             </w:r>
           </w:p>
         </w:tc>
@@ -1111,7 +1111,7 @@
           </w:tcPr>
           <w:p>
             <w:r>
-              <w:t>2026-06-28 20:18:14</w:t>
+              <w:t>2026-06-28 21:47:05</w:t>
             </w:r>
           </w:p>
         </w:tc>
@@ -1121,7 +1121,7 @@
           </w:tcPr>
           <w:p>
             <w:r>
-              <w:t>132</w:t>
+              <w:t>133</w:t>
             </w:r>
           </w:p>
         </w:tc>
@@ -1131,7 +1131,7 @@
           </w:tcPr>
           <w:p>
             <w:r>
-              <w:t>80.8</w:t>
+              <w:t>79.9</w:t>
             </w:r>
           </w:p>
         </w:tc>
@@ -1141,7 +1141,7 @@
           </w:tcPr>
           <w:p>
             <w:r>
-              <w:t>87.9</w:t>
+              <w:t>87.7</w:t>
             </w:r>
           </w:p>
         </w:tc>
@@ -1161,7 +1161,7 @@
           </w:tcPr>
           <w:p>
             <w:r>
-              <w:t>74.1</w:t>
+              <w:t>73.6</w:t>
             </w:r>
           </w:p>
         </w:tc>
@@ -1171,7 +1171,7 @@
           </w:tcPr>
           <w:p>
             <w:r>
-              <w:t>7</w:t>
+              <w:t>23</w:t>
             </w:r>
           </w:p>
         </w:tc>
@@ -1183,7 +1183,7 @@
           </w:tcPr>
           <w:p>
             <w:r>
-              <w:t>2026-06-28 20:48:15</w:t>
+              <w:t>2026-06-28 22:17:05</w:t>
             </w:r>
           </w:p>
         </w:tc>
@@ -1193,7 +1193,7 @@
           </w:tcPr>
           <w:p>
             <w:r>
-              <w:t>132</w:t>
+              <w:t>133</w:t>
             </w:r>
           </w:p>
         </w:tc>
@@ -1203,7 +1203,7 @@
           </w:tcPr>
           <w:p>
             <w:r>
-              <w:t>80.8</w:t>
+              <w:t>79.9</w:t>
             </w:r>
           </w:p>
         </w:tc>
@@ -1213,7 +1213,7 @@
           </w:tcPr>
           <w:p>
             <w:r>
-              <w:t>87.8</w:t>
+              <w:t>87.6</w:t>
             </w:r>
           </w:p>
         </w:tc>
@@ -1233,7 +1233,7 @@
           </w:tcPr>
           <w:p>
             <w:r>
-              <w:t>74.1</w:t>
+              <w:t>73.6</w:t>
             </w:r>
           </w:p>
         </w:tc>
@@ -1243,7 +1243,7 @@
           </w:tcPr>
           <w:p>
             <w:r>
-              <w:t>79</w:t>
+              <w:t>143</w:t>
             </w:r>
           </w:p>
         </w:tc>
@@ -1255,7 +1255,7 @@
           </w:tcPr>
           <w:p>
             <w:r>
-              <w:t>2026-06-28 21:17:00</w:t>
+              <w:t>2026-06-28 22:47:19</w:t>
             </w:r>
           </w:p>
         </w:tc>
@@ -1285,7 +1285,7 @@
           </w:tcPr>
           <w:p>
             <w:r>
-              <w:t>87.8</w:t>
+              <w:t>87.6</w:t>
             </w:r>
           </w:p>
         </w:tc>
@@ -1305,7 +1305,7 @@
           </w:tcPr>
           <w:p>
             <w:r>
-              <w:t>73.7</w:t>
+              <w:t>73.6</w:t>
             </w:r>
           </w:p>
         </w:tc>
@@ -1315,7 +1315,7 @@
           </w:tcPr>
           <w:p>
             <w:r>
-              <w:t>194</w:t>
+              <w:t>264</w:t>
             </w:r>
           </w:p>
         </w:tc>
@@ -1327,7 +1327,7 @@
           </w:tcPr>
           <w:p>
             <w:r>
-              <w:t>2026-06-28 21:47:05</w:t>
+              <w:t>2026-06-28 23:03:05</w:t>
             </w:r>
           </w:p>
         </w:tc>
@@ -1337,7 +1337,7 @@
           </w:tcPr>
           <w:p>
             <w:r>
-              <w:t>133</w:t>
+              <w:t>134</w:t>
             </w:r>
           </w:p>
         </w:tc>
@@ -1347,7 +1347,7 @@
           </w:tcPr>
           <w:p>
             <w:r>
-              <w:t>79.9</w:t>
+              <w:t>80.5</w:t>
             </w:r>
           </w:p>
         </w:tc>
@@ -1357,7 +1357,7 @@
           </w:tcPr>
           <w:p>
             <w:r>
-              <w:t>87.7</w:t>
+              <w:t>87.5</w:t>
             </w:r>
           </w:p>
         </w:tc>
@@ -1377,7 +1377,7 @@
           </w:tcPr>
           <w:p>
             <w:r>
-              <w:t>73.6</w:t>
+              <w:t>73.9</w:t>
             </w:r>
           </w:p>
         </w:tc>
@@ -1387,7 +1387,7 @@
           </w:tcPr>
           <w:p>
             <w:r>
-              <w:t>23</w:t>
+              <w:t>327</w:t>
             </w:r>
           </w:p>
         </w:tc>
@@ -1399,7 +1399,7 @@
           </w:tcPr>
           <w:p>
             <w:r>
-              <w:t>2026-06-28 22:17:05</w:t>
+              <w:t>2026-06-28 23:33:19</w:t>
             </w:r>
           </w:p>
         </w:tc>
@@ -1409,7 +1409,7 @@
           </w:tcPr>
           <w:p>
             <w:r>
-              <w:t>133</w:t>
+              <w:t>134</w:t>
             </w:r>
           </w:p>
         </w:tc>
@@ -1419,7 +1419,7 @@
           </w:tcPr>
           <w:p>
             <w:r>
-              <w:t>79.9</w:t>
+              <w:t>80.5</w:t>
             </w:r>
           </w:p>
         </w:tc>
@@ -1429,7 +1429,7 @@
           </w:tcPr>
           <w:p>
             <w:r>
-              <w:t>87.6</w:t>
+              <w:t>87.4</w:t>
             </w:r>
           </w:p>
         </w:tc>
@@ -1449,7 +1449,7 @@
           </w:tcPr>
           <w:p>
             <w:r>
-              <w:t>73.6</w:t>
+              <w:t>73.8</w:t>
             </w:r>
           </w:p>
         </w:tc>
@@ -1459,7 +1459,7 @@
           </w:tcPr>
           <w:p>
             <w:r>
-              <w:t>143</w:t>
+              <w:t>448</w:t>
             </w:r>
           </w:p>
         </w:tc>
@@ -1471,7 +1471,7 @@
           </w:tcPr>
           <w:p>
             <w:r>
-              <w:t>2026-06-28 22:47:19</w:t>
+              <w:t>2026-06-29 00:03:19</w:t>
             </w:r>
           </w:p>
         </w:tc>
@@ -1481,7 +1481,7 @@
           </w:tcPr>
           <w:p>
             <w:r>
-              <w:t>133</w:t>
+              <w:t>134</w:t>
             </w:r>
           </w:p>
         </w:tc>
@@ -1491,7 +1491,7 @@
           </w:tcPr>
           <w:p>
             <w:r>
-              <w:t>79.9</w:t>
+              <w:t>80.5</w:t>
             </w:r>
           </w:p>
         </w:tc>
@@ -1501,7 +1501,7 @@
           </w:tcPr>
           <w:p>
             <w:r>
-              <w:t>87.6</w:t>
+              <w:t>87.4</w:t>
             </w:r>
           </w:p>
         </w:tc>
@@ -1521,7 +1521,7 @@
           </w:tcPr>
           <w:p>
             <w:r>
-              <w:t>73.6</w:t>
+              <w:t>73.8</w:t>
             </w:r>
           </w:p>
         </w:tc>
@@ -1531,7 +1531,7 @@
           </w:tcPr>
           <w:p>
             <w:r>
-              <w:t>264</w:t>
+              <w:t>568</w:t>
             </w:r>
           </w:p>
         </w:tc>
@@ -1543,7 +1543,7 @@
           </w:tcPr>
           <w:p>
             <w:r>
-              <w:t>2026-06-28 23:03:05</w:t>
+              <w:t>2026-06-29 00:33:34</w:t>
             </w:r>
           </w:p>
         </w:tc>
@@ -1573,7 +1573,7 @@
           </w:tcPr>
           <w:p>
             <w:r>
-              <w:t>87.5</w:t>
+              <w:t>87.4</w:t>
             </w:r>
           </w:p>
         </w:tc>
@@ -1593,7 +1593,7 @@
           </w:tcPr>
           <w:p>
             <w:r>
-              <w:t>73.9</w:t>
+              <w:t>73.8</w:t>
             </w:r>
           </w:p>
         </w:tc>
@@ -1603,7 +1603,7 @@
           </w:tcPr>
           <w:p>
             <w:r>
-              <w:t>327</w:t>
+              <w:t>79</w:t>
             </w:r>
           </w:p>
         </w:tc>
@@ -1615,7 +1615,7 @@
           </w:tcPr>
           <w:p>
             <w:r>
-              <w:t>2026-06-28 23:33:19</w:t>
+              <w:t>2026-06-29 00:48:02</w:t>
             </w:r>
           </w:p>
         </w:tc>
@@ -1625,7 +1625,7 @@
           </w:tcPr>
           <w:p>
             <w:r>
-              <w:t>134</w:t>
+              <w:t>135</w:t>
             </w:r>
           </w:p>
         </w:tc>
@@ -1635,7 +1635,7 @@
           </w:tcPr>
           <w:p>
             <w:r>
-              <w:t>80.5</w:t>
+              <w:t>79.7</w:t>
             </w:r>
           </w:p>
         </w:tc>
@@ -1665,7 +1665,7 @@
           </w:tcPr>
           <w:p>
             <w:r>
-              <w:t>73.8</w:t>
+              <w:t>73.5</w:t>
             </w:r>
           </w:p>
         </w:tc>
@@ -1675,7 +1675,7 @@
           </w:tcPr>
           <w:p>
             <w:r>
-              <w:t>448</w:t>
+              <w:t>4</w:t>
             </w:r>
           </w:p>
         </w:tc>
@@ -1687,7 +1687,7 @@
           </w:tcPr>
           <w:p>
             <w:r>
-              <w:t>2026-06-29 00:03:19</w:t>
+              <w:t>2026-06-29 01:18:18</w:t>
             </w:r>
           </w:p>
         </w:tc>
@@ -1697,7 +1697,7 @@
           </w:tcPr>
           <w:p>
             <w:r>
-              <w:t>134</w:t>
+              <w:t>135</w:t>
             </w:r>
           </w:p>
         </w:tc>
@@ -1707,7 +1707,7 @@
           </w:tcPr>
           <w:p>
             <w:r>
-              <w:t>80.5</w:t>
+              <w:t>79.7</w:t>
             </w:r>
           </w:p>
         </w:tc>
@@ -1717,7 +1717,7 @@
           </w:tcPr>
           <w:p>
             <w:r>
-              <w:t>87.4</w:t>
+              <w:t>87.3</w:t>
             </w:r>
           </w:p>
         </w:tc>
@@ -1737,7 +1737,7 @@
           </w:tcPr>
           <w:p>
             <w:r>
-              <w:t>73.8</w:t>
+              <w:t>73.4</w:t>
             </w:r>
           </w:p>
         </w:tc>
@@ -1747,7 +1747,7 @@
           </w:tcPr>
           <w:p>
             <w:r>
-              <w:t>568</w:t>
+              <w:t>125</w:t>
             </w:r>
           </w:p>
         </w:tc>
@@ -1768,7 +1768,7 @@
     </w:p>
     <w:p>
       <w:r>
-        <w:t>Section score: 80.5 / 100  (Grade: B)</w:t>
+        <w:t>Section score: 79.7 / 100  (Grade: C+)</w:t>
       </w:r>
     </w:p>
     <w:p>
@@ -1911,7 +1911,7 @@
           </w:tcPr>
           <w:p>
             <w:r>
-              <w:t>71.8</w:t>
+              <w:t>68.4</w:t>
             </w:r>
           </w:p>
         </w:tc>
@@ -1921,7 +1921,7 @@
           </w:tcPr>
           <w:p>
             <w:r>
-              <w:t>10.8</w:t>
+              <w:t>10.3</w:t>
             </w:r>
           </w:p>
         </w:tc>
@@ -2007,7 +2007,7 @@
           </w:tcPr>
           <w:p>
             <w:r>
-              <w:t>76.7</w:t>
+              <w:t>75.7</w:t>
             </w:r>
           </w:p>
         </w:tc>
@@ -2017,7 +2017,7 @@
           </w:tcPr>
           <w:p>
             <w:r>
-              <w:t>7.7</w:t>
+              <w:t>7.6</w:t>
             </w:r>
           </w:p>
         </w:tc>
@@ -2039,7 +2039,7 @@
           </w:tcPr>
           <w:p>
             <w:r>
-              <w:t>48.4</w:t>
+              <w:t>47.4</w:t>
             </w:r>
           </w:p>
         </w:tc>
@@ -2049,7 +2049,7 @@
           </w:tcPr>
           <w:p>
             <w:r>
-              <w:t>12.1</w:t>
+              <w:t>11.8</w:t>
             </w:r>
           </w:p>
         </w:tc>
@@ -2090,7 +2090,7 @@
           </w:tcPr>
           <w:p>
             <w:r>
-              <w:t>$677.28</w:t>
+              <w:t>$677.60</w:t>
             </w:r>
           </w:p>
         </w:tc>
@@ -2112,7 +2112,7 @@
           </w:tcPr>
           <w:p>
             <w:r>
-              <w:t>35.46%</w:t>
+              <w:t>35.52%</w:t>
             </w:r>
           </w:p>
         </w:tc>
@@ -2134,7 +2134,7 @@
           </w:tcPr>
           <w:p>
             <w:r>
-              <w:t>$61.81</w:t>
+              <w:t>$56.81</w:t>
             </w:r>
           </w:p>
         </w:tc>
@@ -2178,7 +2178,7 @@
           </w:tcPr>
           <w:p>
             <w:r>
-              <w:t>0.6418</w:t>
+              <w:t>0.6370</w:t>
             </w:r>
           </w:p>
         </w:tc>
@@ -2200,7 +2200,7 @@
           </w:tcPr>
           <w:p>
             <w:r>
-              <w:t>0.5000 / 0.6667</w:t>
+              <w:t>0.5000 / 0.6609</w:t>
             </w:r>
           </w:p>
         </w:tc>
@@ -2222,7 +2222,7 @@
           </w:tcPr>
           <w:p>
             <w:r>
-              <w:t>1.2747</w:t>
+              <w:t>1.2470</w:t>
             </w:r>
           </w:p>
         </w:tc>
@@ -2244,7 +2244,7 @@
           </w:tcPr>
           <w:p>
             <w:r>
-              <w:t>134 / 134</w:t>
+              <w:t>135 / 135</w:t>
             </w:r>
           </w:p>
         </w:tc>
@@ -2266,7 +2266,7 @@
           </w:tcPr>
           <w:p>
             <w:r>
-              <w:t>$0.46</w:t>
+              <w:t>$0.42</w:t>
             </w:r>
           </w:p>
         </w:tc>
@@ -2397,7 +2397,7 @@
           </w:tcPr>
           <w:p>
             <w:r>
-              <w:t>0.500</w:t>
+              <w:t>0.510</w:t>
             </w:r>
           </w:p>
         </w:tc>
@@ -2407,7 +2407,7 @@
           </w:tcPr>
           <w:p>
             <w:r>
-              <w:t>down</w:t>
+              <w:t>up</w:t>
             </w:r>
           </w:p>
         </w:tc>
@@ -2417,7 +2417,7 @@
           </w:tcPr>
           <w:p>
             <w:r>
-              <w:t>Yes</w:t>
+              <w:t>No</w:t>
             </w:r>
           </w:p>
         </w:tc>
@@ -2427,7 +2427,7 @@
           </w:tcPr>
           <w:p>
             <w:r>
-              <w:t>$5.00</w:t>
+              <w:t>$-5.00</w:t>
             </w:r>
           </w:p>
         </w:tc>
@@ -2449,7 +2449,7 @@
           </w:tcPr>
           <w:p>
             <w:r>
-              <w:t>0.540</w:t>
+              <w:t>0.500</w:t>
             </w:r>
           </w:p>
         </w:tc>
@@ -2459,7 +2459,7 @@
           </w:tcPr>
           <w:p>
             <w:r>
-              <w:t>up</w:t>
+              <w:t>down</w:t>
             </w:r>
           </w:p>
         </w:tc>
@@ -2469,7 +2469,7 @@
           </w:tcPr>
           <w:p>
             <w:r>
-              <w:t>No</w:t>
+              <w:t>Yes</w:t>
             </w:r>
           </w:p>
         </w:tc>
@@ -2479,7 +2479,7 @@
           </w:tcPr>
           <w:p>
             <w:r>
-              <w:t>$-5.00</w:t>
+              <w:t>$5.00</w:t>
             </w:r>
           </w:p>
         </w:tc>
@@ -2511,7 +2511,7 @@
           </w:tcPr>
           <w:p>
             <w:r>
-              <w:t>down</w:t>
+              <w:t>up</w:t>
             </w:r>
           </w:p>
         </w:tc>
@@ -2521,7 +2521,7 @@
           </w:tcPr>
           <w:p>
             <w:r>
-              <w:t>Yes</w:t>
+              <w:t>No</w:t>
             </w:r>
           </w:p>
         </w:tc>
@@ -2531,7 +2531,7 @@
           </w:tcPr>
           <w:p>
             <w:r>
-              <w:t>$4.26</w:t>
+              <w:t>$-5.00</w:t>
             </w:r>
           </w:p>
         </w:tc>
@@ -2553,7 +2553,7 @@
           </w:tcPr>
           <w:p>
             <w:r>
-              <w:t>0.620</w:t>
+              <w:t>0.540</w:t>
             </w:r>
           </w:p>
         </w:tc>
@@ -2563,7 +2563,7 @@
           </w:tcPr>
           <w:p>
             <w:r>
-              <w:t>up</w:t>
+              <w:t>down</w:t>
             </w:r>
           </w:p>
         </w:tc>
@@ -2573,7 +2573,7 @@
           </w:tcPr>
           <w:p>
             <w:r>
-              <w:t>No</w:t>
+              <w:t>Yes</w:t>
             </w:r>
           </w:p>
         </w:tc>
@@ -2583,7 +2583,7 @@
           </w:tcPr>
           <w:p>
             <w:r>
-              <w:t>$-5.00</w:t>
+              <w:t>$4.26</w:t>
             </w:r>
           </w:p>
         </w:tc>
@@ -2605,7 +2605,7 @@
           </w:tcPr>
           <w:p>
             <w:r>
-              <w:t>0.570</w:t>
+              <w:t>0.620</w:t>
             </w:r>
           </w:p>
         </w:tc>
@@ -2615,7 +2615,7 @@
           </w:tcPr>
           <w:p>
             <w:r>
-              <w:t>down</w:t>
+              <w:t>up</w:t>
             </w:r>
           </w:p>
         </w:tc>
@@ -2625,7 +2625,7 @@
           </w:tcPr>
           <w:p>
             <w:r>
-              <w:t>Yes</w:t>
+              <w:t>No</w:t>
             </w:r>
           </w:p>
         </w:tc>
@@ -2635,7 +2635,7 @@
           </w:tcPr>
           <w:p>
             <w:r>
-              <w:t>$3.77</w:t>
+              <w:t>$-5.00</w:t>
             </w:r>
           </w:p>
         </w:tc>
@@ -2657,7 +2657,7 @@
           </w:tcPr>
           <w:p>
             <w:r>
-              <w:t>0.590</w:t>
+              <w:t>0.570</w:t>
             </w:r>
           </w:p>
         </w:tc>
@@ -2687,7 +2687,7 @@
           </w:tcPr>
           <w:p>
             <w:r>
-              <w:t>$3.47</w:t>
+              <w:t>$3.77</w:t>
             </w:r>
           </w:p>
         </w:tc>
@@ -2709,7 +2709,7 @@
           </w:tcPr>
           <w:p>
             <w:r>
-              <w:t>0.610</w:t>
+              <w:t>0.590</w:t>
             </w:r>
           </w:p>
         </w:tc>
@@ -2739,7 +2739,7 @@
           </w:tcPr>
           <w:p>
             <w:r>
-              <w:t>$3.20</w:t>
+              <w:t>$3.47</w:t>
             </w:r>
           </w:p>
         </w:tc>
@@ -2761,7 +2761,7 @@
           </w:tcPr>
           <w:p>
             <w:r>
-              <w:t>0.510</w:t>
+              <w:t>0.610</w:t>
             </w:r>
           </w:p>
         </w:tc>
@@ -2791,7 +2791,7 @@
           </w:tcPr>
           <w:p>
             <w:r>
-              <w:t>$4.80</w:t>
+              <w:t>$3.20</w:t>
             </w:r>
           </w:p>
         </w:tc>
@@ -2813,7 +2813,7 @@
           </w:tcPr>
           <w:p>
             <w:r>
-              <w:t>0.550</w:t>
+              <w:t>0.510</w:t>
             </w:r>
           </w:p>
         </w:tc>
@@ -2843,7 +2843,7 @@
           </w:tcPr>
           <w:p>
             <w:r>
-              <w:t>$4.09</w:t>
+              <w:t>$4.80</w:t>
             </w:r>
           </w:p>
         </w:tc>
@@ -2865,7 +2865,7 @@
           </w:tcPr>
           <w:p>
             <w:r>
-              <w:t>0.590</w:t>
+              <w:t>0.550</w:t>
             </w:r>
           </w:p>
         </w:tc>
@@ -2895,7 +2895,7 @@
           </w:tcPr>
           <w:p>
             <w:r>
-              <w:t>$3.47</w:t>
+              <w:t>$4.09</w:t>
             </w:r>
           </w:p>
         </w:tc>
@@ -2917,7 +2917,7 @@
           </w:tcPr>
           <w:p>
             <w:r>
-              <w:t>0.480</w:t>
+              <w:t>0.590</w:t>
             </w:r>
           </w:p>
         </w:tc>
@@ -2947,7 +2947,7 @@
           </w:tcPr>
           <w:p>
             <w:r>
-              <w:t>$5.42</w:t>
+              <w:t>$3.47</w:t>
             </w:r>
           </w:p>
         </w:tc>
@@ -2969,7 +2969,7 @@
           </w:tcPr>
           <w:p>
             <w:r>
-              <w:t>0.580</w:t>
+              <w:t>0.480</w:t>
             </w:r>
           </w:p>
         </w:tc>
@@ -2999,7 +2999,7 @@
           </w:tcPr>
           <w:p>
             <w:r>
-              <w:t>$3.62</w:t>
+              <w:t>$5.42</w:t>
             </w:r>
           </w:p>
         </w:tc>
@@ -3021,7 +3021,7 @@
           </w:tcPr>
           <w:p>
             <w:r>
-              <w:t>0.570</w:t>
+              <w:t>0.580</w:t>
             </w:r>
           </w:p>
         </w:tc>
@@ -3051,7 +3051,7 @@
           </w:tcPr>
           <w:p>
             <w:r>
-              <w:t>$3.77</w:t>
+              <w:t>$3.62</w:t>
             </w:r>
           </w:p>
         </w:tc>
@@ -3073,7 +3073,7 @@
           </w:tcPr>
           <w:p>
             <w:r>
-              <w:t>0.530</w:t>
+              <w:t>0.570</w:t>
             </w:r>
           </w:p>
         </w:tc>
@@ -3103,7 +3103,7 @@
           </w:tcPr>
           <w:p>
             <w:r>
-              <w:t>$4.43</w:t>
+              <w:t>$3.77</w:t>
             </w:r>
           </w:p>
         </w:tc>
@@ -3125,7 +3125,7 @@
           </w:tcPr>
           <w:p>
             <w:r>
-              <w:t>0.590</w:t>
+              <w:t>0.530</w:t>
             </w:r>
           </w:p>
         </w:tc>
@@ -3135,7 +3135,7 @@
           </w:tcPr>
           <w:p>
             <w:r>
-              <w:t>up</w:t>
+              <w:t>down</w:t>
             </w:r>
           </w:p>
         </w:tc>
@@ -3145,7 +3145,7 @@
           </w:tcPr>
           <w:p>
             <w:r>
-              <w:t>No</w:t>
+              <w:t>Yes</w:t>
             </w:r>
           </w:p>
         </w:tc>
@@ -3155,7 +3155,7 @@
           </w:tcPr>
           <w:p>
             <w:r>
-              <w:t>$-5.00</w:t>
+              <w:t>$4.43</w:t>
             </w:r>
           </w:p>
         </w:tc>
@@ -3176,7 +3176,7 @@
     </w:p>
     <w:p>
       <w:r>
-        <w:t>Section score: 87.4 / 100  (Grade: B+)</w:t>
+        <w:t>Section score: 87.3 / 100  (Grade: B+)</w:t>
       </w:r>
     </w:p>
     <w:p>
@@ -3319,7 +3319,7 @@
           </w:tcPr>
           <w:p>
             <w:r>
-              <w:t>75.7</w:t>
+              <w:t>75.1</w:t>
             </w:r>
           </w:p>
         </w:tc>
@@ -3329,7 +3329,7 @@
           </w:tcPr>
           <w:p>
             <w:r>
-              <w:t>11.4</w:t>
+              <w:t>11.3</w:t>
             </w:r>
           </w:p>
         </w:tc>
@@ -3433,17 +3433,17 @@
     </w:tbl>
     <w:p>
       <w:r>
-        <w:t>Ticks: 584 · Reconciled: True · Readiness: not_ready</w:t>
+        <w:t>Ticks: 188 · Reconciled: True · Readiness: not_ready</w:t>
       </w:r>
     </w:p>
     <w:p>
       <w:r>
-        <w:t>Candidates created: 60106 · Terminals: {'accepted': 86, 'rejected': 46636, 'skipped': 13063, 'expired': 0, 'missing_data': 321}</w:t>
+        <w:t>Candidates created: 60761 · Terminals: {'accepted': 86, 'rejected': 46939, 'skipped': 13407, 'expired': 0, 'missing_data': 329}</w:t>
       </w:r>
     </w:p>
     <w:p>
       <w:r>
-        <w:t>Rejected by stage: {'directional': 35990, 'execution_gate': 226, 'context_gate': 879, 'directional_allowlist': 1364, 'down_bias_gate': 538, 'mtf_gate': 276, 'grok_decider': 3540, 'execution_realistic': 3, 'verifier': 61, 'mispricing_gate': 50, 'baseline_cohort_gate': 3709}</w:t>
+        <w:t>Rejected by stage: {'directional': 36281, 'execution_gate': 227, 'context_gate': 879, 'directional_allowlist': 1364, 'down_bias_gate': 538, 'mtf_gate': 276, 'grok_decider': 3540, 'execution_realistic': 3, 'verifier': 61, 'mispricing_gate': 50, 'baseline_cohort_gate': 3720}</w:t>
       </w:r>
     </w:p>
     <w:p>
@@ -4396,7 +4396,7 @@
           </w:tcPr>
           <w:p>
             <w:r>
-              <w:t>0.4787</w:t>
+              <w:t>0.4760</w:t>
             </w:r>
           </w:p>
         </w:tc>
@@ -4426,7 +4426,7 @@
     </w:tbl>
     <w:p>
       <w:r>
-        <w:t>TV alerts: received 1935 · valid 1916 · rejected 2</w:t>
+        <w:t>TV alerts: received 1967 · valid 1948 · rejected 2</w:t>
       </w:r>
     </w:p>
     <w:sectPr>

</xml_diff>

<commit_message>
chore(reports): VPS full report 2026-06-29 02:58 UTC (136 settled, WR 63.2%, PF 1.2205, grade C+)
</commit_message>
<xml_diff>
--- a/vps_full_reports/latest/report.docx
+++ b/vps_full_reports/latest/report.docx
@@ -20,7 +20,7 @@
           <w:color w:val="666666"/>
           <w:sz w:val="20"/>
         </w:rPr>
-        <w:t>PAPER ONLY  ·  reconciled=True  ·  ticks=188</w:t>
+        <w:t>PAPER ONLY  ·  reconciled=True  ·  ticks=307</w:t>
       </w:r>
     </w:p>
     <w:p>
@@ -33,7 +33,7 @@
     </w:p>
     <w:p>
       <w:r>
-        <w:t>Overall score: 73.4 / 100  (Grade: C)</w:t>
+        <w:t>Overall score: 73.0 / 100  (Grade: C)</w:t>
       </w:r>
     </w:p>
     <w:tbl>
@@ -107,7 +107,7 @@
           </w:tcPr>
           <w:p>
             <w:r>
-              <w:t>79.7</w:t>
+              <w:t>78.9</w:t>
             </w:r>
           </w:p>
         </w:tc>
@@ -149,7 +149,7 @@
           </w:tcPr>
           <w:p>
             <w:r>
-              <w:t>87.3</w:t>
+              <w:t>87.1</w:t>
             </w:r>
           </w:p>
         </w:tc>
@@ -319,7 +319,7 @@
           </w:tcPr>
           <w:p>
             <w:r>
-              <w:t>2026-06-28 17:31:56</w:t>
+              <w:t>2026-06-28 18:31:11</w:t>
             </w:r>
           </w:p>
         </w:tc>
@@ -329,7 +329,7 @@
           </w:tcPr>
           <w:p>
             <w:r>
-              <w:t>127</w:t>
+              <w:t>129</w:t>
             </w:r>
           </w:p>
         </w:tc>
@@ -339,7 +339,7 @@
           </w:tcPr>
           <w:p>
             <w:r>
-              <w:t>79.7</w:t>
+              <w:t>80.6</w:t>
             </w:r>
           </w:p>
         </w:tc>
@@ -349,7 +349,7 @@
           </w:tcPr>
           <w:p>
             <w:r>
-              <w:t>88.5</w:t>
+              <w:t>88.3</w:t>
             </w:r>
           </w:p>
         </w:tc>
@@ -369,7 +369,7 @@
           </w:tcPr>
           <w:p>
             <w:r>
-              <w:t>73.7</w:t>
+              <w:t>74.1</w:t>
             </w:r>
           </w:p>
         </w:tc>
@@ -379,7 +379,7 @@
           </w:tcPr>
           <w:p>
             <w:r>
-              <w:t>119</w:t>
+              <w:t>356</w:t>
             </w:r>
           </w:p>
         </w:tc>
@@ -391,7 +391,7 @@
           </w:tcPr>
           <w:p>
             <w:r>
-              <w:t>2026-06-28 17:47:11</w:t>
+              <w:t>2026-06-28 18:48:12</w:t>
             </w:r>
           </w:p>
         </w:tc>
@@ -401,7 +401,7 @@
           </w:tcPr>
           <w:p>
             <w:r>
-              <w:t>128</w:t>
+              <w:t>130</w:t>
             </w:r>
           </w:p>
         </w:tc>
@@ -411,7 +411,7 @@
           </w:tcPr>
           <w:p>
             <w:r>
-              <w:t>80.1</w:t>
+              <w:t>81.2</w:t>
             </w:r>
           </w:p>
         </w:tc>
@@ -421,7 +421,7 @@
           </w:tcPr>
           <w:p>
             <w:r>
-              <w:t>88.4</w:t>
+              <w:t>88.2</w:t>
             </w:r>
           </w:p>
         </w:tc>
@@ -441,7 +441,7 @@
           </w:tcPr>
           <w:p>
             <w:r>
-              <w:t>73.9</w:t>
+              <w:t>74.4</w:t>
             </w:r>
           </w:p>
         </w:tc>
@@ -451,7 +451,7 @@
           </w:tcPr>
           <w:p>
             <w:r>
-              <w:t>180</w:t>
+              <w:t>29</w:t>
             </w:r>
           </w:p>
         </w:tc>
@@ -463,7 +463,7 @@
           </w:tcPr>
           <w:p>
             <w:r>
-              <w:t>2026-06-28 18:17:11</w:t>
+              <w:t>2026-06-28 19:18:12</w:t>
             </w:r>
           </w:p>
         </w:tc>
@@ -473,7 +473,7 @@
           </w:tcPr>
           <w:p>
             <w:r>
-              <w:t>128</w:t>
+              <w:t>130</w:t>
             </w:r>
           </w:p>
         </w:tc>
@@ -483,7 +483,7 @@
           </w:tcPr>
           <w:p>
             <w:r>
-              <w:t>80.1</w:t>
+              <w:t>81.2</w:t>
             </w:r>
           </w:p>
         </w:tc>
@@ -493,7 +493,7 @@
           </w:tcPr>
           <w:p>
             <w:r>
-              <w:t>88.3</w:t>
+              <w:t>88.1</w:t>
             </w:r>
           </w:p>
         </w:tc>
@@ -513,7 +513,7 @@
           </w:tcPr>
           <w:p>
             <w:r>
-              <w:t>73.9</w:t>
+              <w:t>74.4</w:t>
             </w:r>
           </w:p>
         </w:tc>
@@ -523,7 +523,7 @@
           </w:tcPr>
           <w:p>
             <w:r>
-              <w:t>300</w:t>
+              <w:t>149</w:t>
             </w:r>
           </w:p>
         </w:tc>
@@ -535,7 +535,7 @@
           </w:tcPr>
           <w:p>
             <w:r>
-              <w:t>2026-06-28 18:31:11</w:t>
+              <w:t>2026-06-28 19:30:27</w:t>
             </w:r>
           </w:p>
         </w:tc>
@@ -545,7 +545,7 @@
           </w:tcPr>
           <w:p>
             <w:r>
-              <w:t>129</w:t>
+              <w:t>131</w:t>
             </w:r>
           </w:p>
         </w:tc>
@@ -555,7 +555,7 @@
           </w:tcPr>
           <w:p>
             <w:r>
-              <w:t>80.6</w:t>
+              <w:t>80.3</w:t>
             </w:r>
           </w:p>
         </w:tc>
@@ -565,7 +565,7 @@
           </w:tcPr>
           <w:p>
             <w:r>
-              <w:t>88.3</w:t>
+              <w:t>88.1</w:t>
             </w:r>
           </w:p>
         </w:tc>
@@ -585,7 +585,7 @@
           </w:tcPr>
           <w:p>
             <w:r>
-              <w:t>74.1</w:t>
+              <w:t>73.9</w:t>
             </w:r>
           </w:p>
         </w:tc>
@@ -595,7 +595,7 @@
           </w:tcPr>
           <w:p>
             <w:r>
-              <w:t>356</w:t>
+              <w:t>198</w:t>
             </w:r>
           </w:p>
         </w:tc>
@@ -607,7 +607,7 @@
           </w:tcPr>
           <w:p>
             <w:r>
-              <w:t>2026-06-28 18:48:12</w:t>
+              <w:t>2026-06-28 19:48:12</w:t>
             </w:r>
           </w:p>
         </w:tc>
@@ -617,7 +617,7 @@
           </w:tcPr>
           <w:p>
             <w:r>
-              <w:t>130</w:t>
+              <w:t>132</w:t>
             </w:r>
           </w:p>
         </w:tc>
@@ -627,7 +627,7 @@
           </w:tcPr>
           <w:p>
             <w:r>
-              <w:t>81.2</w:t>
+              <w:t>80.8</w:t>
             </w:r>
           </w:p>
         </w:tc>
@@ -637,7 +637,7 @@
           </w:tcPr>
           <w:p>
             <w:r>
-              <w:t>88.2</w:t>
+              <w:t>88.1</w:t>
             </w:r>
           </w:p>
         </w:tc>
@@ -657,7 +657,7 @@
           </w:tcPr>
           <w:p>
             <w:r>
-              <w:t>74.4</w:t>
+              <w:t>74.2</w:t>
             </w:r>
           </w:p>
         </w:tc>
@@ -667,7 +667,7 @@
           </w:tcPr>
           <w:p>
             <w:r>
-              <w:t>29</w:t>
+              <w:t>269</w:t>
             </w:r>
           </w:p>
         </w:tc>
@@ -679,7 +679,7 @@
           </w:tcPr>
           <w:p>
             <w:r>
-              <w:t>2026-06-28 19:18:12</w:t>
+              <w:t>2026-06-28 20:18:14</w:t>
             </w:r>
           </w:p>
         </w:tc>
@@ -689,7 +689,7 @@
           </w:tcPr>
           <w:p>
             <w:r>
-              <w:t>130</w:t>
+              <w:t>132</w:t>
             </w:r>
           </w:p>
         </w:tc>
@@ -699,7 +699,7 @@
           </w:tcPr>
           <w:p>
             <w:r>
-              <w:t>81.2</w:t>
+              <w:t>80.8</w:t>
             </w:r>
           </w:p>
         </w:tc>
@@ -709,7 +709,7 @@
           </w:tcPr>
           <w:p>
             <w:r>
-              <w:t>88.1</w:t>
+              <w:t>87.9</w:t>
             </w:r>
           </w:p>
         </w:tc>
@@ -729,7 +729,7 @@
           </w:tcPr>
           <w:p>
             <w:r>
-              <w:t>74.4</w:t>
+              <w:t>74.1</w:t>
             </w:r>
           </w:p>
         </w:tc>
@@ -739,7 +739,7 @@
           </w:tcPr>
           <w:p>
             <w:r>
-              <w:t>149</w:t>
+              <w:t>7</w:t>
             </w:r>
           </w:p>
         </w:tc>
@@ -751,7 +751,7 @@
           </w:tcPr>
           <w:p>
             <w:r>
-              <w:t>2026-06-28 19:30:27</w:t>
+              <w:t>2026-06-28 20:48:15</w:t>
             </w:r>
           </w:p>
         </w:tc>
@@ -761,7 +761,7 @@
           </w:tcPr>
           <w:p>
             <w:r>
-              <w:t>131</w:t>
+              <w:t>132</w:t>
             </w:r>
           </w:p>
         </w:tc>
@@ -771,7 +771,7 @@
           </w:tcPr>
           <w:p>
             <w:r>
-              <w:t>80.3</w:t>
+              <w:t>80.8</w:t>
             </w:r>
           </w:p>
         </w:tc>
@@ -781,7 +781,7 @@
           </w:tcPr>
           <w:p>
             <w:r>
-              <w:t>88.1</w:t>
+              <w:t>87.8</w:t>
             </w:r>
           </w:p>
         </w:tc>
@@ -801,7 +801,7 @@
           </w:tcPr>
           <w:p>
             <w:r>
-              <w:t>73.9</w:t>
+              <w:t>74.1</w:t>
             </w:r>
           </w:p>
         </w:tc>
@@ -811,7 +811,7 @@
           </w:tcPr>
           <w:p>
             <w:r>
-              <w:t>198</w:t>
+              <w:t>79</w:t>
             </w:r>
           </w:p>
         </w:tc>
@@ -823,7 +823,7 @@
           </w:tcPr>
           <w:p>
             <w:r>
-              <w:t>2026-06-28 19:48:12</w:t>
+              <w:t>2026-06-28 21:17:00</w:t>
             </w:r>
           </w:p>
         </w:tc>
@@ -833,7 +833,7 @@
           </w:tcPr>
           <w:p>
             <w:r>
-              <w:t>132</w:t>
+              <w:t>133</w:t>
             </w:r>
           </w:p>
         </w:tc>
@@ -843,7 +843,7 @@
           </w:tcPr>
           <w:p>
             <w:r>
-              <w:t>80.8</w:t>
+              <w:t>79.9</w:t>
             </w:r>
           </w:p>
         </w:tc>
@@ -853,7 +853,7 @@
           </w:tcPr>
           <w:p>
             <w:r>
-              <w:t>88.1</w:t>
+              <w:t>87.8</w:t>
             </w:r>
           </w:p>
         </w:tc>
@@ -873,7 +873,7 @@
           </w:tcPr>
           <w:p>
             <w:r>
-              <w:t>74.2</w:t>
+              <w:t>73.7</w:t>
             </w:r>
           </w:p>
         </w:tc>
@@ -883,7 +883,7 @@
           </w:tcPr>
           <w:p>
             <w:r>
-              <w:t>269</w:t>
+              <w:t>194</w:t>
             </w:r>
           </w:p>
         </w:tc>
@@ -895,7 +895,7 @@
           </w:tcPr>
           <w:p>
             <w:r>
-              <w:t>2026-06-28 20:18:14</w:t>
+              <w:t>2026-06-28 21:47:05</w:t>
             </w:r>
           </w:p>
         </w:tc>
@@ -905,7 +905,7 @@
           </w:tcPr>
           <w:p>
             <w:r>
-              <w:t>132</w:t>
+              <w:t>133</w:t>
             </w:r>
           </w:p>
         </w:tc>
@@ -915,7 +915,7 @@
           </w:tcPr>
           <w:p>
             <w:r>
-              <w:t>80.8</w:t>
+              <w:t>79.9</w:t>
             </w:r>
           </w:p>
         </w:tc>
@@ -925,7 +925,7 @@
           </w:tcPr>
           <w:p>
             <w:r>
-              <w:t>87.9</w:t>
+              <w:t>87.7</w:t>
             </w:r>
           </w:p>
         </w:tc>
@@ -945,7 +945,7 @@
           </w:tcPr>
           <w:p>
             <w:r>
-              <w:t>74.1</w:t>
+              <w:t>73.6</w:t>
             </w:r>
           </w:p>
         </w:tc>
@@ -955,7 +955,7 @@
           </w:tcPr>
           <w:p>
             <w:r>
-              <w:t>7</w:t>
+              <w:t>23</w:t>
             </w:r>
           </w:p>
         </w:tc>
@@ -967,7 +967,7 @@
           </w:tcPr>
           <w:p>
             <w:r>
-              <w:t>2026-06-28 20:48:15</w:t>
+              <w:t>2026-06-28 22:17:05</w:t>
             </w:r>
           </w:p>
         </w:tc>
@@ -977,7 +977,7 @@
           </w:tcPr>
           <w:p>
             <w:r>
-              <w:t>132</w:t>
+              <w:t>133</w:t>
             </w:r>
           </w:p>
         </w:tc>
@@ -987,7 +987,7 @@
           </w:tcPr>
           <w:p>
             <w:r>
-              <w:t>80.8</w:t>
+              <w:t>79.9</w:t>
             </w:r>
           </w:p>
         </w:tc>
@@ -997,7 +997,7 @@
           </w:tcPr>
           <w:p>
             <w:r>
-              <w:t>87.8</w:t>
+              <w:t>87.6</w:t>
             </w:r>
           </w:p>
         </w:tc>
@@ -1017,7 +1017,7 @@
           </w:tcPr>
           <w:p>
             <w:r>
-              <w:t>74.1</w:t>
+              <w:t>73.6</w:t>
             </w:r>
           </w:p>
         </w:tc>
@@ -1027,7 +1027,7 @@
           </w:tcPr>
           <w:p>
             <w:r>
-              <w:t>79</w:t>
+              <w:t>143</w:t>
             </w:r>
           </w:p>
         </w:tc>
@@ -1039,7 +1039,7 @@
           </w:tcPr>
           <w:p>
             <w:r>
-              <w:t>2026-06-28 21:17:00</w:t>
+              <w:t>2026-06-28 22:47:19</w:t>
             </w:r>
           </w:p>
         </w:tc>
@@ -1069,7 +1069,7 @@
           </w:tcPr>
           <w:p>
             <w:r>
-              <w:t>87.8</w:t>
+              <w:t>87.6</w:t>
             </w:r>
           </w:p>
         </w:tc>
@@ -1089,7 +1089,7 @@
           </w:tcPr>
           <w:p>
             <w:r>
-              <w:t>73.7</w:t>
+              <w:t>73.6</w:t>
             </w:r>
           </w:p>
         </w:tc>
@@ -1099,7 +1099,7 @@
           </w:tcPr>
           <w:p>
             <w:r>
-              <w:t>194</w:t>
+              <w:t>264</w:t>
             </w:r>
           </w:p>
         </w:tc>
@@ -1111,7 +1111,7 @@
           </w:tcPr>
           <w:p>
             <w:r>
-              <w:t>2026-06-28 21:47:05</w:t>
+              <w:t>2026-06-28 23:03:05</w:t>
             </w:r>
           </w:p>
         </w:tc>
@@ -1121,7 +1121,7 @@
           </w:tcPr>
           <w:p>
             <w:r>
-              <w:t>133</w:t>
+              <w:t>134</w:t>
             </w:r>
           </w:p>
         </w:tc>
@@ -1131,7 +1131,7 @@
           </w:tcPr>
           <w:p>
             <w:r>
-              <w:t>79.9</w:t>
+              <w:t>80.5</w:t>
             </w:r>
           </w:p>
         </w:tc>
@@ -1141,7 +1141,7 @@
           </w:tcPr>
           <w:p>
             <w:r>
-              <w:t>87.7</w:t>
+              <w:t>87.5</w:t>
             </w:r>
           </w:p>
         </w:tc>
@@ -1161,7 +1161,7 @@
           </w:tcPr>
           <w:p>
             <w:r>
-              <w:t>73.6</w:t>
+              <w:t>73.9</w:t>
             </w:r>
           </w:p>
         </w:tc>
@@ -1171,7 +1171,7 @@
           </w:tcPr>
           <w:p>
             <w:r>
-              <w:t>23</w:t>
+              <w:t>327</w:t>
             </w:r>
           </w:p>
         </w:tc>
@@ -1183,7 +1183,7 @@
           </w:tcPr>
           <w:p>
             <w:r>
-              <w:t>2026-06-28 22:17:05</w:t>
+              <w:t>2026-06-28 23:33:19</w:t>
             </w:r>
           </w:p>
         </w:tc>
@@ -1193,7 +1193,7 @@
           </w:tcPr>
           <w:p>
             <w:r>
-              <w:t>133</w:t>
+              <w:t>134</w:t>
             </w:r>
           </w:p>
         </w:tc>
@@ -1203,7 +1203,7 @@
           </w:tcPr>
           <w:p>
             <w:r>
-              <w:t>79.9</w:t>
+              <w:t>80.5</w:t>
             </w:r>
           </w:p>
         </w:tc>
@@ -1213,7 +1213,7 @@
           </w:tcPr>
           <w:p>
             <w:r>
-              <w:t>87.6</w:t>
+              <w:t>87.4</w:t>
             </w:r>
           </w:p>
         </w:tc>
@@ -1233,7 +1233,7 @@
           </w:tcPr>
           <w:p>
             <w:r>
-              <w:t>73.6</w:t>
+              <w:t>73.8</w:t>
             </w:r>
           </w:p>
         </w:tc>
@@ -1243,7 +1243,7 @@
           </w:tcPr>
           <w:p>
             <w:r>
-              <w:t>143</w:t>
+              <w:t>448</w:t>
             </w:r>
           </w:p>
         </w:tc>
@@ -1255,7 +1255,7 @@
           </w:tcPr>
           <w:p>
             <w:r>
-              <w:t>2026-06-28 22:47:19</w:t>
+              <w:t>2026-06-29 00:03:19</w:t>
             </w:r>
           </w:p>
         </w:tc>
@@ -1265,7 +1265,7 @@
           </w:tcPr>
           <w:p>
             <w:r>
-              <w:t>133</w:t>
+              <w:t>134</w:t>
             </w:r>
           </w:p>
         </w:tc>
@@ -1275,7 +1275,7 @@
           </w:tcPr>
           <w:p>
             <w:r>
-              <w:t>79.9</w:t>
+              <w:t>80.5</w:t>
             </w:r>
           </w:p>
         </w:tc>
@@ -1285,7 +1285,7 @@
           </w:tcPr>
           <w:p>
             <w:r>
-              <w:t>87.6</w:t>
+              <w:t>87.4</w:t>
             </w:r>
           </w:p>
         </w:tc>
@@ -1305,7 +1305,7 @@
           </w:tcPr>
           <w:p>
             <w:r>
-              <w:t>73.6</w:t>
+              <w:t>73.8</w:t>
             </w:r>
           </w:p>
         </w:tc>
@@ -1315,7 +1315,7 @@
           </w:tcPr>
           <w:p>
             <w:r>
-              <w:t>264</w:t>
+              <w:t>568</w:t>
             </w:r>
           </w:p>
         </w:tc>
@@ -1327,7 +1327,7 @@
           </w:tcPr>
           <w:p>
             <w:r>
-              <w:t>2026-06-28 23:03:05</w:t>
+              <w:t>2026-06-29 00:33:34</w:t>
             </w:r>
           </w:p>
         </w:tc>
@@ -1357,7 +1357,7 @@
           </w:tcPr>
           <w:p>
             <w:r>
-              <w:t>87.5</w:t>
+              <w:t>87.4</w:t>
             </w:r>
           </w:p>
         </w:tc>
@@ -1377,7 +1377,7 @@
           </w:tcPr>
           <w:p>
             <w:r>
-              <w:t>73.9</w:t>
+              <w:t>73.8</w:t>
             </w:r>
           </w:p>
         </w:tc>
@@ -1387,7 +1387,7 @@
           </w:tcPr>
           <w:p>
             <w:r>
-              <w:t>327</w:t>
+              <w:t>79</w:t>
             </w:r>
           </w:p>
         </w:tc>
@@ -1399,7 +1399,7 @@
           </w:tcPr>
           <w:p>
             <w:r>
-              <w:t>2026-06-28 23:33:19</w:t>
+              <w:t>2026-06-29 00:48:02</w:t>
             </w:r>
           </w:p>
         </w:tc>
@@ -1409,7 +1409,7 @@
           </w:tcPr>
           <w:p>
             <w:r>
-              <w:t>134</w:t>
+              <w:t>135</w:t>
             </w:r>
           </w:p>
         </w:tc>
@@ -1419,7 +1419,7 @@
           </w:tcPr>
           <w:p>
             <w:r>
-              <w:t>80.5</w:t>
+              <w:t>79.7</w:t>
             </w:r>
           </w:p>
         </w:tc>
@@ -1449,7 +1449,7 @@
           </w:tcPr>
           <w:p>
             <w:r>
-              <w:t>73.8</w:t>
+              <w:t>73.5</w:t>
             </w:r>
           </w:p>
         </w:tc>
@@ -1459,7 +1459,7 @@
           </w:tcPr>
           <w:p>
             <w:r>
-              <w:t>448</w:t>
+              <w:t>4</w:t>
             </w:r>
           </w:p>
         </w:tc>
@@ -1471,7 +1471,7 @@
           </w:tcPr>
           <w:p>
             <w:r>
-              <w:t>2026-06-29 00:03:19</w:t>
+              <w:t>2026-06-29 01:18:18</w:t>
             </w:r>
           </w:p>
         </w:tc>
@@ -1481,7 +1481,7 @@
           </w:tcPr>
           <w:p>
             <w:r>
-              <w:t>134</w:t>
+              <w:t>135</w:t>
             </w:r>
           </w:p>
         </w:tc>
@@ -1491,7 +1491,7 @@
           </w:tcPr>
           <w:p>
             <w:r>
-              <w:t>80.5</w:t>
+              <w:t>79.7</w:t>
             </w:r>
           </w:p>
         </w:tc>
@@ -1501,7 +1501,7 @@
           </w:tcPr>
           <w:p>
             <w:r>
-              <w:t>87.4</w:t>
+              <w:t>87.3</w:t>
             </w:r>
           </w:p>
         </w:tc>
@@ -1521,7 +1521,7 @@
           </w:tcPr>
           <w:p>
             <w:r>
-              <w:t>73.8</w:t>
+              <w:t>73.4</w:t>
             </w:r>
           </w:p>
         </w:tc>
@@ -1531,7 +1531,7 @@
           </w:tcPr>
           <w:p>
             <w:r>
-              <w:t>568</w:t>
+              <w:t>125</w:t>
             </w:r>
           </w:p>
         </w:tc>
@@ -1543,7 +1543,7 @@
           </w:tcPr>
           <w:p>
             <w:r>
-              <w:t>2026-06-29 00:33:34</w:t>
+              <w:t>2026-06-29 01:45:25</w:t>
             </w:r>
           </w:p>
         </w:tc>
@@ -1553,7 +1553,7 @@
           </w:tcPr>
           <w:p>
             <w:r>
-              <w:t>134</w:t>
+              <w:t>136</w:t>
             </w:r>
           </w:p>
         </w:tc>
@@ -1563,7 +1563,7 @@
           </w:tcPr>
           <w:p>
             <w:r>
-              <w:t>80.5</w:t>
+              <w:t>78.9</w:t>
             </w:r>
           </w:p>
         </w:tc>
@@ -1573,7 +1573,7 @@
           </w:tcPr>
           <w:p>
             <w:r>
-              <w:t>87.4</w:t>
+              <w:t>87.2</w:t>
             </w:r>
           </w:p>
         </w:tc>
@@ -1593,7 +1593,7 @@
           </w:tcPr>
           <w:p>
             <w:r>
-              <w:t>73.8</w:t>
+              <w:t>73.0</w:t>
             </w:r>
           </w:p>
         </w:tc>
@@ -1603,7 +1603,7 @@
           </w:tcPr>
           <w:p>
             <w:r>
-              <w:t>79</w:t>
+              <w:t>14</w:t>
             </w:r>
           </w:p>
         </w:tc>
@@ -1615,7 +1615,7 @@
           </w:tcPr>
           <w:p>
             <w:r>
-              <w:t>2026-06-29 00:48:02</w:t>
+              <w:t>2026-06-29 02:15:25</w:t>
             </w:r>
           </w:p>
         </w:tc>
@@ -1625,7 +1625,7 @@
           </w:tcPr>
           <w:p>
             <w:r>
-              <w:t>135</w:t>
+              <w:t>136</w:t>
             </w:r>
           </w:p>
         </w:tc>
@@ -1635,7 +1635,7 @@
           </w:tcPr>
           <w:p>
             <w:r>
-              <w:t>79.7</w:t>
+              <w:t>78.9</w:t>
             </w:r>
           </w:p>
         </w:tc>
@@ -1645,7 +1645,7 @@
           </w:tcPr>
           <w:p>
             <w:r>
-              <w:t>87.4</w:t>
+              <w:t>87.2</w:t>
             </w:r>
           </w:p>
         </w:tc>
@@ -1665,7 +1665,7 @@
           </w:tcPr>
           <w:p>
             <w:r>
-              <w:t>73.5</w:t>
+              <w:t>73.0</w:t>
             </w:r>
           </w:p>
         </w:tc>
@@ -1675,7 +1675,7 @@
           </w:tcPr>
           <w:p>
             <w:r>
-              <w:t>4</w:t>
+              <w:t>134</w:t>
             </w:r>
           </w:p>
         </w:tc>
@@ -1687,7 +1687,7 @@
           </w:tcPr>
           <w:p>
             <w:r>
-              <w:t>2026-06-29 01:18:18</w:t>
+              <w:t>2026-06-29 02:45:25</w:t>
             </w:r>
           </w:p>
         </w:tc>
@@ -1697,7 +1697,7 @@
           </w:tcPr>
           <w:p>
             <w:r>
-              <w:t>135</w:t>
+              <w:t>136</w:t>
             </w:r>
           </w:p>
         </w:tc>
@@ -1707,7 +1707,7 @@
           </w:tcPr>
           <w:p>
             <w:r>
-              <w:t>79.7</w:t>
+              <w:t>78.9</w:t>
             </w:r>
           </w:p>
         </w:tc>
@@ -1717,7 +1717,7 @@
           </w:tcPr>
           <w:p>
             <w:r>
-              <w:t>87.3</w:t>
+              <w:t>87.2</w:t>
             </w:r>
           </w:p>
         </w:tc>
@@ -1737,7 +1737,7 @@
           </w:tcPr>
           <w:p>
             <w:r>
-              <w:t>73.4</w:t>
+              <w:t>73.0</w:t>
             </w:r>
           </w:p>
         </w:tc>
@@ -1747,7 +1747,7 @@
           </w:tcPr>
           <w:p>
             <w:r>
-              <w:t>125</w:t>
+              <w:t>254</w:t>
             </w:r>
           </w:p>
         </w:tc>
@@ -1768,7 +1768,7 @@
     </w:p>
     <w:p>
       <w:r>
-        <w:t>Section score: 79.7 / 100  (Grade: C+)</w:t>
+        <w:t>Section score: 78.9 / 100  (Grade: C+)</w:t>
       </w:r>
     </w:p>
     <w:p>
@@ -1911,7 +1911,7 @@
           </w:tcPr>
           <w:p>
             <w:r>
-              <w:t>68.4</w:t>
+              <w:t>65.1</w:t>
             </w:r>
           </w:p>
         </w:tc>
@@ -1921,7 +1921,7 @@
           </w:tcPr>
           <w:p>
             <w:r>
-              <w:t>10.3</w:t>
+              <w:t>9.8</w:t>
             </w:r>
           </w:p>
         </w:tc>
@@ -2007,7 +2007,7 @@
           </w:tcPr>
           <w:p>
             <w:r>
-              <w:t>75.7</w:t>
+              <w:t>74.8</w:t>
             </w:r>
           </w:p>
         </w:tc>
@@ -2017,7 +2017,7 @@
           </w:tcPr>
           <w:p>
             <w:r>
-              <w:t>7.6</w:t>
+              <w:t>7.5</w:t>
             </w:r>
           </w:p>
         </w:tc>
@@ -2039,7 +2039,7 @@
           </w:tcPr>
           <w:p>
             <w:r>
-              <w:t>47.4</w:t>
+              <w:t>46.5</w:t>
             </w:r>
           </w:p>
         </w:tc>
@@ -2049,7 +2049,7 @@
           </w:tcPr>
           <w:p>
             <w:r>
-              <w:t>11.8</w:t>
+              <w:t>11.6</w:t>
             </w:r>
           </w:p>
         </w:tc>
@@ -2090,7 +2090,7 @@
           </w:tcPr>
           <w:p>
             <w:r>
-              <w:t>$677.60</w:t>
+              <w:t>$672.90</w:t>
             </w:r>
           </w:p>
         </w:tc>
@@ -2112,7 +2112,7 @@
           </w:tcPr>
           <w:p>
             <w:r>
-              <w:t>35.52%</w:t>
+              <w:t>34.58%</w:t>
             </w:r>
           </w:p>
         </w:tc>
@@ -2134,7 +2134,7 @@
           </w:tcPr>
           <w:p>
             <w:r>
-              <w:t>$56.81</w:t>
+              <w:t>$51.81</w:t>
             </w:r>
           </w:p>
         </w:tc>
@@ -2178,7 +2178,7 @@
           </w:tcPr>
           <w:p>
             <w:r>
-              <w:t>0.6370</w:t>
+              <w:t>0.6324</w:t>
             </w:r>
           </w:p>
         </w:tc>
@@ -2200,7 +2200,7 @@
           </w:tcPr>
           <w:p>
             <w:r>
-              <w:t>0.5000 / 0.6609</w:t>
+              <w:t>0.5000 / 0.6552</w:t>
             </w:r>
           </w:p>
         </w:tc>
@@ -2222,7 +2222,7 @@
           </w:tcPr>
           <w:p>
             <w:r>
-              <w:t>1.2470</w:t>
+              <w:t>1.2205</w:t>
             </w:r>
           </w:p>
         </w:tc>
@@ -2244,7 +2244,7 @@
           </w:tcPr>
           <w:p>
             <w:r>
-              <w:t>135 / 135</w:t>
+              <w:t>136 / 136</w:t>
             </w:r>
           </w:p>
         </w:tc>
@@ -2266,7 +2266,7 @@
           </w:tcPr>
           <w:p>
             <w:r>
-              <w:t>$0.42</w:t>
+              <w:t>$0.38</w:t>
             </w:r>
           </w:p>
         </w:tc>
@@ -2397,7 +2397,7 @@
           </w:tcPr>
           <w:p>
             <w:r>
-              <w:t>0.510</w:t>
+              <w:t>0.520</w:t>
             </w:r>
           </w:p>
         </w:tc>
@@ -2449,7 +2449,7 @@
           </w:tcPr>
           <w:p>
             <w:r>
-              <w:t>0.500</w:t>
+              <w:t>0.510</w:t>
             </w:r>
           </w:p>
         </w:tc>
@@ -2459,7 +2459,7 @@
           </w:tcPr>
           <w:p>
             <w:r>
-              <w:t>down</w:t>
+              <w:t>up</w:t>
             </w:r>
           </w:p>
         </w:tc>
@@ -2469,7 +2469,7 @@
           </w:tcPr>
           <w:p>
             <w:r>
-              <w:t>Yes</w:t>
+              <w:t>No</w:t>
             </w:r>
           </w:p>
         </w:tc>
@@ -2479,7 +2479,7 @@
           </w:tcPr>
           <w:p>
             <w:r>
-              <w:t>$5.00</w:t>
+              <w:t>$-5.00</w:t>
             </w:r>
           </w:p>
         </w:tc>
@@ -2501,7 +2501,7 @@
           </w:tcPr>
           <w:p>
             <w:r>
-              <w:t>0.540</w:t>
+              <w:t>0.500</w:t>
             </w:r>
           </w:p>
         </w:tc>
@@ -2511,7 +2511,7 @@
           </w:tcPr>
           <w:p>
             <w:r>
-              <w:t>up</w:t>
+              <w:t>down</w:t>
             </w:r>
           </w:p>
         </w:tc>
@@ -2521,7 +2521,7 @@
           </w:tcPr>
           <w:p>
             <w:r>
-              <w:t>No</w:t>
+              <w:t>Yes</w:t>
             </w:r>
           </w:p>
         </w:tc>
@@ -2531,7 +2531,7 @@
           </w:tcPr>
           <w:p>
             <w:r>
-              <w:t>$-5.00</w:t>
+              <w:t>$5.00</w:t>
             </w:r>
           </w:p>
         </w:tc>
@@ -2563,7 +2563,7 @@
           </w:tcPr>
           <w:p>
             <w:r>
-              <w:t>down</w:t>
+              <w:t>up</w:t>
             </w:r>
           </w:p>
         </w:tc>
@@ -2573,7 +2573,7 @@
           </w:tcPr>
           <w:p>
             <w:r>
-              <w:t>Yes</w:t>
+              <w:t>No</w:t>
             </w:r>
           </w:p>
         </w:tc>
@@ -2583,7 +2583,7 @@
           </w:tcPr>
           <w:p>
             <w:r>
-              <w:t>$4.26</w:t>
+              <w:t>$-5.00</w:t>
             </w:r>
           </w:p>
         </w:tc>
@@ -2605,7 +2605,7 @@
           </w:tcPr>
           <w:p>
             <w:r>
-              <w:t>0.620</w:t>
+              <w:t>0.540</w:t>
             </w:r>
           </w:p>
         </w:tc>
@@ -2615,7 +2615,7 @@
           </w:tcPr>
           <w:p>
             <w:r>
-              <w:t>up</w:t>
+              <w:t>down</w:t>
             </w:r>
           </w:p>
         </w:tc>
@@ -2625,7 +2625,7 @@
           </w:tcPr>
           <w:p>
             <w:r>
-              <w:t>No</w:t>
+              <w:t>Yes</w:t>
             </w:r>
           </w:p>
         </w:tc>
@@ -2635,7 +2635,7 @@
           </w:tcPr>
           <w:p>
             <w:r>
-              <w:t>$-5.00</w:t>
+              <w:t>$4.26</w:t>
             </w:r>
           </w:p>
         </w:tc>
@@ -2657,7 +2657,7 @@
           </w:tcPr>
           <w:p>
             <w:r>
-              <w:t>0.570</w:t>
+              <w:t>0.620</w:t>
             </w:r>
           </w:p>
         </w:tc>
@@ -2667,7 +2667,7 @@
           </w:tcPr>
           <w:p>
             <w:r>
-              <w:t>down</w:t>
+              <w:t>up</w:t>
             </w:r>
           </w:p>
         </w:tc>
@@ -2677,7 +2677,7 @@
           </w:tcPr>
           <w:p>
             <w:r>
-              <w:t>Yes</w:t>
+              <w:t>No</w:t>
             </w:r>
           </w:p>
         </w:tc>
@@ -2687,7 +2687,7 @@
           </w:tcPr>
           <w:p>
             <w:r>
-              <w:t>$3.77</w:t>
+              <w:t>$-5.00</w:t>
             </w:r>
           </w:p>
         </w:tc>
@@ -2709,7 +2709,7 @@
           </w:tcPr>
           <w:p>
             <w:r>
-              <w:t>0.590</w:t>
+              <w:t>0.570</w:t>
             </w:r>
           </w:p>
         </w:tc>
@@ -2739,7 +2739,7 @@
           </w:tcPr>
           <w:p>
             <w:r>
-              <w:t>$3.47</w:t>
+              <w:t>$3.77</w:t>
             </w:r>
           </w:p>
         </w:tc>
@@ -2761,7 +2761,7 @@
           </w:tcPr>
           <w:p>
             <w:r>
-              <w:t>0.610</w:t>
+              <w:t>0.590</w:t>
             </w:r>
           </w:p>
         </w:tc>
@@ -2791,7 +2791,7 @@
           </w:tcPr>
           <w:p>
             <w:r>
-              <w:t>$3.20</w:t>
+              <w:t>$3.47</w:t>
             </w:r>
           </w:p>
         </w:tc>
@@ -2813,7 +2813,7 @@
           </w:tcPr>
           <w:p>
             <w:r>
-              <w:t>0.510</w:t>
+              <w:t>0.610</w:t>
             </w:r>
           </w:p>
         </w:tc>
@@ -2843,7 +2843,7 @@
           </w:tcPr>
           <w:p>
             <w:r>
-              <w:t>$4.80</w:t>
+              <w:t>$3.20</w:t>
             </w:r>
           </w:p>
         </w:tc>
@@ -2865,7 +2865,7 @@
           </w:tcPr>
           <w:p>
             <w:r>
-              <w:t>0.550</w:t>
+              <w:t>0.510</w:t>
             </w:r>
           </w:p>
         </w:tc>
@@ -2895,7 +2895,7 @@
           </w:tcPr>
           <w:p>
             <w:r>
-              <w:t>$4.09</w:t>
+              <w:t>$4.80</w:t>
             </w:r>
           </w:p>
         </w:tc>
@@ -2917,7 +2917,7 @@
           </w:tcPr>
           <w:p>
             <w:r>
-              <w:t>0.590</w:t>
+              <w:t>0.550</w:t>
             </w:r>
           </w:p>
         </w:tc>
@@ -2947,7 +2947,7 @@
           </w:tcPr>
           <w:p>
             <w:r>
-              <w:t>$3.47</w:t>
+              <w:t>$4.09</w:t>
             </w:r>
           </w:p>
         </w:tc>
@@ -2969,7 +2969,7 @@
           </w:tcPr>
           <w:p>
             <w:r>
-              <w:t>0.480</w:t>
+              <w:t>0.590</w:t>
             </w:r>
           </w:p>
         </w:tc>
@@ -2999,7 +2999,7 @@
           </w:tcPr>
           <w:p>
             <w:r>
-              <w:t>$5.42</w:t>
+              <w:t>$3.47</w:t>
             </w:r>
           </w:p>
         </w:tc>
@@ -3021,7 +3021,7 @@
           </w:tcPr>
           <w:p>
             <w:r>
-              <w:t>0.580</w:t>
+              <w:t>0.480</w:t>
             </w:r>
           </w:p>
         </w:tc>
@@ -3051,7 +3051,7 @@
           </w:tcPr>
           <w:p>
             <w:r>
-              <w:t>$3.62</w:t>
+              <w:t>$5.42</w:t>
             </w:r>
           </w:p>
         </w:tc>
@@ -3073,7 +3073,7 @@
           </w:tcPr>
           <w:p>
             <w:r>
-              <w:t>0.570</w:t>
+              <w:t>0.580</w:t>
             </w:r>
           </w:p>
         </w:tc>
@@ -3103,7 +3103,7 @@
           </w:tcPr>
           <w:p>
             <w:r>
-              <w:t>$3.77</w:t>
+              <w:t>$3.62</w:t>
             </w:r>
           </w:p>
         </w:tc>
@@ -3125,7 +3125,7 @@
           </w:tcPr>
           <w:p>
             <w:r>
-              <w:t>0.530</w:t>
+              <w:t>0.570</w:t>
             </w:r>
           </w:p>
         </w:tc>
@@ -3155,7 +3155,7 @@
           </w:tcPr>
           <w:p>
             <w:r>
-              <w:t>$4.43</w:t>
+              <w:t>$3.77</w:t>
             </w:r>
           </w:p>
         </w:tc>
@@ -3176,7 +3176,7 @@
     </w:p>
     <w:p>
       <w:r>
-        <w:t>Section score: 87.3 / 100  (Grade: B+)</w:t>
+        <w:t>Section score: 87.1 / 100  (Grade: B+)</w:t>
       </w:r>
     </w:p>
     <w:p>
@@ -3319,7 +3319,7 @@
           </w:tcPr>
           <w:p>
             <w:r>
-              <w:t>75.1</w:t>
+              <w:t>74.3</w:t>
             </w:r>
           </w:p>
         </w:tc>
@@ -3329,7 +3329,7 @@
           </w:tcPr>
           <w:p>
             <w:r>
-              <w:t>11.3</w:t>
+              <w:t>11.1</w:t>
             </w:r>
           </w:p>
         </w:tc>
@@ -3433,17 +3433,17 @@
     </w:tbl>
     <w:p>
       <w:r>
-        <w:t>Ticks: 188 · Reconciled: True · Readiness: not_ready</w:t>
+        <w:t>Ticks: 307 · Reconciled: True · Readiness: not_ready</w:t>
       </w:r>
     </w:p>
     <w:p>
       <w:r>
-        <w:t>Candidates created: 60761 · Terminals: {'accepted': 86, 'rejected': 46939, 'skipped': 13407, 'expired': 0, 'missing_data': 329}</w:t>
+        <w:t>Candidates created: 61401 · Terminals: {'accepted': 86, 'rejected': 47238, 'skipped': 13744, 'expired': 0, 'missing_data': 333}</w:t>
       </w:r>
     </w:p>
     <w:p>
       <w:r>
-        <w:t>Rejected by stage: {'directional': 36281, 'execution_gate': 227, 'context_gate': 879, 'directional_allowlist': 1364, 'down_bias_gate': 538, 'mtf_gate': 276, 'grok_decider': 3540, 'execution_realistic': 3, 'verifier': 61, 'mispricing_gate': 50, 'baseline_cohort_gate': 3720}</w:t>
+        <w:t>Rejected by stage: {'directional': 36556, 'execution_gate': 237, 'context_gate': 879, 'directional_allowlist': 1364, 'down_bias_gate': 538, 'mtf_gate': 276, 'grok_decider': 3540, 'execution_realistic': 3, 'verifier': 61, 'mispricing_gate': 50, 'baseline_cohort_gate': 3734}</w:t>
       </w:r>
     </w:p>
     <w:p>
@@ -4396,7 +4396,7 @@
           </w:tcPr>
           <w:p>
             <w:r>
-              <w:t>0.4760</w:t>
+              <w:t>0.4769</w:t>
             </w:r>
           </w:p>
         </w:tc>
@@ -4426,7 +4426,7 @@
     </w:tbl>
     <w:p>
       <w:r>
-        <w:t>TV alerts: received 1967 · valid 1948 · rejected 2</w:t>
+        <w:t>TV alerts: received 2000 · valid 1981 · rejected 2</w:t>
       </w:r>
     </w:p>
     <w:sectPr>

</xml_diff>

<commit_message>
chore(reports): VPS full report 2026-06-29 03:23 UTC (136 settled, WR 63.2%, PF 1.2205, grade C+)
</commit_message>
<xml_diff>
--- a/vps_full_reports/latest/report.docx
+++ b/vps_full_reports/latest/report.docx
@@ -20,7 +20,7 @@
           <w:color w:val="666666"/>
           <w:sz w:val="20"/>
         </w:rPr>
-        <w:t>PAPER ONLY  ·  reconciled=True  ·  ticks=52</w:t>
+        <w:t>PAPER ONLY  ·  reconciled=True  ·  ticks=63</w:t>
       </w:r>
     </w:p>
     <w:p>
@@ -3319,7 +3319,7 @@
           </w:tcPr>
           <w:p>
             <w:r>
-              <w:t>74.0</w:t>
+              <w:t>73.9</w:t>
             </w:r>
           </w:p>
         </w:tc>
@@ -3433,17 +3433,17 @@
     </w:tbl>
     <w:p>
       <w:r>
-        <w:t>Ticks: 52 · Reconciled: True · Readiness: not_ready</w:t>
+        <w:t>Ticks: 63 · Reconciled: True · Readiness: not_ready</w:t>
       </w:r>
     </w:p>
     <w:p>
       <w:r>
-        <w:t>Candidates created: 61577 · Terminals: {'accepted': 86, 'rejected': 47325, 'skipped': 13831, 'expired': 0, 'missing_data': 335}</w:t>
+        <w:t>Candidates created: 61599 · Terminals: {'accepted': 86, 'rejected': 47336, 'skipped': 13842, 'expired': 0, 'missing_data': 335}</w:t>
       </w:r>
     </w:p>
     <w:p>
       <w:r>
-        <w:t>Rejected by stage: {'directional': 36640, 'execution_gate': 237, 'context_gate': 879, 'directional_allowlist': 1364, 'down_bias_gate': 538, 'mtf_gate': 276, 'grok_decider': 3540, 'execution_realistic': 3, 'verifier': 61, 'mispricing_gate': 50, 'baseline_cohort_gate': 3737}</w:t>
+        <w:t>Rejected by stage: {'directional': 36651, 'execution_gate': 237, 'context_gate': 879, 'directional_allowlist': 1364, 'down_bias_gate': 538, 'mtf_gate': 276, 'grok_decider': 3540, 'execution_realistic': 3, 'verifier': 61, 'mispricing_gate': 50, 'baseline_cohort_gate': 3737}</w:t>
       </w:r>
     </w:p>
     <w:p>
@@ -4426,7 +4426,7 @@
     </w:tbl>
     <w:p>
       <w:r>
-        <w:t>TV alerts: received 2024 · valid 2005 · rejected 2</w:t>
+        <w:t>TV alerts: received 2026 · valid 2007 · rejected 2</w:t>
       </w:r>
     </w:p>
     <w:sectPr>

</xml_diff>

<commit_message>
chore(reports): VPS full report 2026-06-29 04:44 UTC (137 settled, WR 62.8%, PF 1.1951, grade C+)
</commit_message>
<xml_diff>
--- a/vps_full_reports/latest/report.docx
+++ b/vps_full_reports/latest/report.docx
@@ -20,7 +20,7 @@
           <w:color w:val="666666"/>
           <w:sz w:val="20"/>
         </w:rPr>
-        <w:t>PAPER ONLY  ·  reconciled=True  ·  ticks=63</w:t>
+        <w:t>PAPER ONLY  ·  reconciled=True  ·  ticks=321</w:t>
       </w:r>
     </w:p>
     <w:p>
@@ -33,7 +33,7 @@
     </w:p>
     <w:p>
       <w:r>
-        <w:t>Overall score: 73.0 / 100  (Grade: C)</w:t>
+        <w:t>Overall score: 72.5 / 100  (Grade: C)</w:t>
       </w:r>
     </w:p>
     <w:tbl>
@@ -107,7 +107,7 @@
           </w:tcPr>
           <w:p>
             <w:r>
-              <w:t>78.9</w:t>
+              <w:t>78.1</w:t>
             </w:r>
           </w:p>
         </w:tc>
@@ -149,7 +149,7 @@
           </w:tcPr>
           <w:p>
             <w:r>
-              <w:t>87.1</w:t>
+              <w:t>86.9</w:t>
             </w:r>
           </w:p>
         </w:tc>
@@ -319,7 +319,7 @@
           </w:tcPr>
           <w:p>
             <w:r>
-              <w:t>2026-06-28 18:48:12</w:t>
+              <w:t>2026-06-28 19:48:12</w:t>
             </w:r>
           </w:p>
         </w:tc>
@@ -329,7 +329,7 @@
           </w:tcPr>
           <w:p>
             <w:r>
-              <w:t>130</w:t>
+              <w:t>132</w:t>
             </w:r>
           </w:p>
         </w:tc>
@@ -339,7 +339,7 @@
           </w:tcPr>
           <w:p>
             <w:r>
-              <w:t>81.2</w:t>
+              <w:t>80.8</w:t>
             </w:r>
           </w:p>
         </w:tc>
@@ -349,7 +349,7 @@
           </w:tcPr>
           <w:p>
             <w:r>
-              <w:t>88.2</w:t>
+              <w:t>88.1</w:t>
             </w:r>
           </w:p>
         </w:tc>
@@ -369,7 +369,7 @@
           </w:tcPr>
           <w:p>
             <w:r>
-              <w:t>74.4</w:t>
+              <w:t>74.2</w:t>
             </w:r>
           </w:p>
         </w:tc>
@@ -379,7 +379,7 @@
           </w:tcPr>
           <w:p>
             <w:r>
-              <w:t>29</w:t>
+              <w:t>269</w:t>
             </w:r>
           </w:p>
         </w:tc>
@@ -391,7 +391,7 @@
           </w:tcPr>
           <w:p>
             <w:r>
-              <w:t>2026-06-28 19:18:12</w:t>
+              <w:t>2026-06-28 20:18:14</w:t>
             </w:r>
           </w:p>
         </w:tc>
@@ -401,7 +401,7 @@
           </w:tcPr>
           <w:p>
             <w:r>
-              <w:t>130</w:t>
+              <w:t>132</w:t>
             </w:r>
           </w:p>
         </w:tc>
@@ -411,7 +411,7 @@
           </w:tcPr>
           <w:p>
             <w:r>
-              <w:t>81.2</w:t>
+              <w:t>80.8</w:t>
             </w:r>
           </w:p>
         </w:tc>
@@ -421,7 +421,7 @@
           </w:tcPr>
           <w:p>
             <w:r>
-              <w:t>88.1</w:t>
+              <w:t>87.9</w:t>
             </w:r>
           </w:p>
         </w:tc>
@@ -441,7 +441,7 @@
           </w:tcPr>
           <w:p>
             <w:r>
-              <w:t>74.4</w:t>
+              <w:t>74.1</w:t>
             </w:r>
           </w:p>
         </w:tc>
@@ -451,7 +451,7 @@
           </w:tcPr>
           <w:p>
             <w:r>
-              <w:t>149</w:t>
+              <w:t>7</w:t>
             </w:r>
           </w:p>
         </w:tc>
@@ -463,7 +463,7 @@
           </w:tcPr>
           <w:p>
             <w:r>
-              <w:t>2026-06-28 19:30:27</w:t>
+              <w:t>2026-06-28 20:48:15</w:t>
             </w:r>
           </w:p>
         </w:tc>
@@ -473,7 +473,7 @@
           </w:tcPr>
           <w:p>
             <w:r>
-              <w:t>131</w:t>
+              <w:t>132</w:t>
             </w:r>
           </w:p>
         </w:tc>
@@ -483,7 +483,7 @@
           </w:tcPr>
           <w:p>
             <w:r>
-              <w:t>80.3</w:t>
+              <w:t>80.8</w:t>
             </w:r>
           </w:p>
         </w:tc>
@@ -493,7 +493,7 @@
           </w:tcPr>
           <w:p>
             <w:r>
-              <w:t>88.1</w:t>
+              <w:t>87.8</w:t>
             </w:r>
           </w:p>
         </w:tc>
@@ -513,7 +513,7 @@
           </w:tcPr>
           <w:p>
             <w:r>
-              <w:t>73.9</w:t>
+              <w:t>74.1</w:t>
             </w:r>
           </w:p>
         </w:tc>
@@ -523,7 +523,7 @@
           </w:tcPr>
           <w:p>
             <w:r>
-              <w:t>198</w:t>
+              <w:t>79</w:t>
             </w:r>
           </w:p>
         </w:tc>
@@ -535,7 +535,7 @@
           </w:tcPr>
           <w:p>
             <w:r>
-              <w:t>2026-06-28 19:48:12</w:t>
+              <w:t>2026-06-28 21:17:00</w:t>
             </w:r>
           </w:p>
         </w:tc>
@@ -545,7 +545,7 @@
           </w:tcPr>
           <w:p>
             <w:r>
-              <w:t>132</w:t>
+              <w:t>133</w:t>
             </w:r>
           </w:p>
         </w:tc>
@@ -555,7 +555,7 @@
           </w:tcPr>
           <w:p>
             <w:r>
-              <w:t>80.8</w:t>
+              <w:t>79.9</w:t>
             </w:r>
           </w:p>
         </w:tc>
@@ -565,7 +565,7 @@
           </w:tcPr>
           <w:p>
             <w:r>
-              <w:t>88.1</w:t>
+              <w:t>87.8</w:t>
             </w:r>
           </w:p>
         </w:tc>
@@ -585,7 +585,7 @@
           </w:tcPr>
           <w:p>
             <w:r>
-              <w:t>74.2</w:t>
+              <w:t>73.7</w:t>
             </w:r>
           </w:p>
         </w:tc>
@@ -595,7 +595,7 @@
           </w:tcPr>
           <w:p>
             <w:r>
-              <w:t>269</w:t>
+              <w:t>194</w:t>
             </w:r>
           </w:p>
         </w:tc>
@@ -607,7 +607,7 @@
           </w:tcPr>
           <w:p>
             <w:r>
-              <w:t>2026-06-28 20:18:14</w:t>
+              <w:t>2026-06-28 21:47:05</w:t>
             </w:r>
           </w:p>
         </w:tc>
@@ -617,7 +617,7 @@
           </w:tcPr>
           <w:p>
             <w:r>
-              <w:t>132</w:t>
+              <w:t>133</w:t>
             </w:r>
           </w:p>
         </w:tc>
@@ -627,7 +627,7 @@
           </w:tcPr>
           <w:p>
             <w:r>
-              <w:t>80.8</w:t>
+              <w:t>79.9</w:t>
             </w:r>
           </w:p>
         </w:tc>
@@ -637,7 +637,7 @@
           </w:tcPr>
           <w:p>
             <w:r>
-              <w:t>87.9</w:t>
+              <w:t>87.7</w:t>
             </w:r>
           </w:p>
         </w:tc>
@@ -657,7 +657,7 @@
           </w:tcPr>
           <w:p>
             <w:r>
-              <w:t>74.1</w:t>
+              <w:t>73.6</w:t>
             </w:r>
           </w:p>
         </w:tc>
@@ -667,7 +667,7 @@
           </w:tcPr>
           <w:p>
             <w:r>
-              <w:t>7</w:t>
+              <w:t>23</w:t>
             </w:r>
           </w:p>
         </w:tc>
@@ -679,7 +679,7 @@
           </w:tcPr>
           <w:p>
             <w:r>
-              <w:t>2026-06-28 20:48:15</w:t>
+              <w:t>2026-06-28 22:17:05</w:t>
             </w:r>
           </w:p>
         </w:tc>
@@ -689,7 +689,7 @@
           </w:tcPr>
           <w:p>
             <w:r>
-              <w:t>132</w:t>
+              <w:t>133</w:t>
             </w:r>
           </w:p>
         </w:tc>
@@ -699,7 +699,7 @@
           </w:tcPr>
           <w:p>
             <w:r>
-              <w:t>80.8</w:t>
+              <w:t>79.9</w:t>
             </w:r>
           </w:p>
         </w:tc>
@@ -709,7 +709,7 @@
           </w:tcPr>
           <w:p>
             <w:r>
-              <w:t>87.8</w:t>
+              <w:t>87.6</w:t>
             </w:r>
           </w:p>
         </w:tc>
@@ -729,7 +729,7 @@
           </w:tcPr>
           <w:p>
             <w:r>
-              <w:t>74.1</w:t>
+              <w:t>73.6</w:t>
             </w:r>
           </w:p>
         </w:tc>
@@ -739,7 +739,7 @@
           </w:tcPr>
           <w:p>
             <w:r>
-              <w:t>79</w:t>
+              <w:t>143</w:t>
             </w:r>
           </w:p>
         </w:tc>
@@ -751,7 +751,7 @@
           </w:tcPr>
           <w:p>
             <w:r>
-              <w:t>2026-06-28 21:17:00</w:t>
+              <w:t>2026-06-28 22:47:19</w:t>
             </w:r>
           </w:p>
         </w:tc>
@@ -781,7 +781,7 @@
           </w:tcPr>
           <w:p>
             <w:r>
-              <w:t>87.8</w:t>
+              <w:t>87.6</w:t>
             </w:r>
           </w:p>
         </w:tc>
@@ -801,7 +801,7 @@
           </w:tcPr>
           <w:p>
             <w:r>
-              <w:t>73.7</w:t>
+              <w:t>73.6</w:t>
             </w:r>
           </w:p>
         </w:tc>
@@ -811,7 +811,7 @@
           </w:tcPr>
           <w:p>
             <w:r>
-              <w:t>194</w:t>
+              <w:t>264</w:t>
             </w:r>
           </w:p>
         </w:tc>
@@ -823,7 +823,7 @@
           </w:tcPr>
           <w:p>
             <w:r>
-              <w:t>2026-06-28 21:47:05</w:t>
+              <w:t>2026-06-28 23:03:05</w:t>
             </w:r>
           </w:p>
         </w:tc>
@@ -833,7 +833,7 @@
           </w:tcPr>
           <w:p>
             <w:r>
-              <w:t>133</w:t>
+              <w:t>134</w:t>
             </w:r>
           </w:p>
         </w:tc>
@@ -843,7 +843,7 @@
           </w:tcPr>
           <w:p>
             <w:r>
-              <w:t>79.9</w:t>
+              <w:t>80.5</w:t>
             </w:r>
           </w:p>
         </w:tc>
@@ -853,7 +853,7 @@
           </w:tcPr>
           <w:p>
             <w:r>
-              <w:t>87.7</w:t>
+              <w:t>87.5</w:t>
             </w:r>
           </w:p>
         </w:tc>
@@ -873,7 +873,7 @@
           </w:tcPr>
           <w:p>
             <w:r>
-              <w:t>73.6</w:t>
+              <w:t>73.9</w:t>
             </w:r>
           </w:p>
         </w:tc>
@@ -883,7 +883,7 @@
           </w:tcPr>
           <w:p>
             <w:r>
-              <w:t>23</w:t>
+              <w:t>327</w:t>
             </w:r>
           </w:p>
         </w:tc>
@@ -895,7 +895,7 @@
           </w:tcPr>
           <w:p>
             <w:r>
-              <w:t>2026-06-28 22:17:05</w:t>
+              <w:t>2026-06-28 23:33:19</w:t>
             </w:r>
           </w:p>
         </w:tc>
@@ -905,7 +905,7 @@
           </w:tcPr>
           <w:p>
             <w:r>
-              <w:t>133</w:t>
+              <w:t>134</w:t>
             </w:r>
           </w:p>
         </w:tc>
@@ -915,7 +915,7 @@
           </w:tcPr>
           <w:p>
             <w:r>
-              <w:t>79.9</w:t>
+              <w:t>80.5</w:t>
             </w:r>
           </w:p>
         </w:tc>
@@ -925,7 +925,7 @@
           </w:tcPr>
           <w:p>
             <w:r>
-              <w:t>87.6</w:t>
+              <w:t>87.4</w:t>
             </w:r>
           </w:p>
         </w:tc>
@@ -945,7 +945,7 @@
           </w:tcPr>
           <w:p>
             <w:r>
-              <w:t>73.6</w:t>
+              <w:t>73.8</w:t>
             </w:r>
           </w:p>
         </w:tc>
@@ -955,7 +955,7 @@
           </w:tcPr>
           <w:p>
             <w:r>
-              <w:t>143</w:t>
+              <w:t>448</w:t>
             </w:r>
           </w:p>
         </w:tc>
@@ -967,7 +967,7 @@
           </w:tcPr>
           <w:p>
             <w:r>
-              <w:t>2026-06-28 22:47:19</w:t>
+              <w:t>2026-06-29 00:03:19</w:t>
             </w:r>
           </w:p>
         </w:tc>
@@ -977,7 +977,7 @@
           </w:tcPr>
           <w:p>
             <w:r>
-              <w:t>133</w:t>
+              <w:t>134</w:t>
             </w:r>
           </w:p>
         </w:tc>
@@ -987,7 +987,7 @@
           </w:tcPr>
           <w:p>
             <w:r>
-              <w:t>79.9</w:t>
+              <w:t>80.5</w:t>
             </w:r>
           </w:p>
         </w:tc>
@@ -997,7 +997,7 @@
           </w:tcPr>
           <w:p>
             <w:r>
-              <w:t>87.6</w:t>
+              <w:t>87.4</w:t>
             </w:r>
           </w:p>
         </w:tc>
@@ -1017,7 +1017,7 @@
           </w:tcPr>
           <w:p>
             <w:r>
-              <w:t>73.6</w:t>
+              <w:t>73.8</w:t>
             </w:r>
           </w:p>
         </w:tc>
@@ -1027,7 +1027,7 @@
           </w:tcPr>
           <w:p>
             <w:r>
-              <w:t>264</w:t>
+              <w:t>568</w:t>
             </w:r>
           </w:p>
         </w:tc>
@@ -1039,7 +1039,7 @@
           </w:tcPr>
           <w:p>
             <w:r>
-              <w:t>2026-06-28 23:03:05</w:t>
+              <w:t>2026-06-29 00:33:34</w:t>
             </w:r>
           </w:p>
         </w:tc>
@@ -1069,7 +1069,7 @@
           </w:tcPr>
           <w:p>
             <w:r>
-              <w:t>87.5</w:t>
+              <w:t>87.4</w:t>
             </w:r>
           </w:p>
         </w:tc>
@@ -1089,7 +1089,7 @@
           </w:tcPr>
           <w:p>
             <w:r>
-              <w:t>73.9</w:t>
+              <w:t>73.8</w:t>
             </w:r>
           </w:p>
         </w:tc>
@@ -1099,7 +1099,7 @@
           </w:tcPr>
           <w:p>
             <w:r>
-              <w:t>327</w:t>
+              <w:t>79</w:t>
             </w:r>
           </w:p>
         </w:tc>
@@ -1111,7 +1111,7 @@
           </w:tcPr>
           <w:p>
             <w:r>
-              <w:t>2026-06-28 23:33:19</w:t>
+              <w:t>2026-06-29 00:48:02</w:t>
             </w:r>
           </w:p>
         </w:tc>
@@ -1121,7 +1121,7 @@
           </w:tcPr>
           <w:p>
             <w:r>
-              <w:t>134</w:t>
+              <w:t>135</w:t>
             </w:r>
           </w:p>
         </w:tc>
@@ -1131,7 +1131,7 @@
           </w:tcPr>
           <w:p>
             <w:r>
-              <w:t>80.5</w:t>
+              <w:t>79.7</w:t>
             </w:r>
           </w:p>
         </w:tc>
@@ -1161,7 +1161,7 @@
           </w:tcPr>
           <w:p>
             <w:r>
-              <w:t>73.8</w:t>
+              <w:t>73.5</w:t>
             </w:r>
           </w:p>
         </w:tc>
@@ -1171,7 +1171,7 @@
           </w:tcPr>
           <w:p>
             <w:r>
-              <w:t>448</w:t>
+              <w:t>4</w:t>
             </w:r>
           </w:p>
         </w:tc>
@@ -1183,7 +1183,7 @@
           </w:tcPr>
           <w:p>
             <w:r>
-              <w:t>2026-06-29 00:03:19</w:t>
+              <w:t>2026-06-29 01:18:18</w:t>
             </w:r>
           </w:p>
         </w:tc>
@@ -1193,7 +1193,7 @@
           </w:tcPr>
           <w:p>
             <w:r>
-              <w:t>134</w:t>
+              <w:t>135</w:t>
             </w:r>
           </w:p>
         </w:tc>
@@ -1203,7 +1203,7 @@
           </w:tcPr>
           <w:p>
             <w:r>
-              <w:t>80.5</w:t>
+              <w:t>79.7</w:t>
             </w:r>
           </w:p>
         </w:tc>
@@ -1213,7 +1213,7 @@
           </w:tcPr>
           <w:p>
             <w:r>
-              <w:t>87.4</w:t>
+              <w:t>87.3</w:t>
             </w:r>
           </w:p>
         </w:tc>
@@ -1233,7 +1233,7 @@
           </w:tcPr>
           <w:p>
             <w:r>
-              <w:t>73.8</w:t>
+              <w:t>73.4</w:t>
             </w:r>
           </w:p>
         </w:tc>
@@ -1243,7 +1243,7 @@
           </w:tcPr>
           <w:p>
             <w:r>
-              <w:t>568</w:t>
+              <w:t>125</w:t>
             </w:r>
           </w:p>
         </w:tc>
@@ -1255,7 +1255,7 @@
           </w:tcPr>
           <w:p>
             <w:r>
-              <w:t>2026-06-29 00:33:34</w:t>
+              <w:t>2026-06-29 01:45:25</w:t>
             </w:r>
           </w:p>
         </w:tc>
@@ -1265,7 +1265,7 @@
           </w:tcPr>
           <w:p>
             <w:r>
-              <w:t>134</w:t>
+              <w:t>136</w:t>
             </w:r>
           </w:p>
         </w:tc>
@@ -1275,7 +1275,7 @@
           </w:tcPr>
           <w:p>
             <w:r>
-              <w:t>80.5</w:t>
+              <w:t>78.9</w:t>
             </w:r>
           </w:p>
         </w:tc>
@@ -1285,7 +1285,7 @@
           </w:tcPr>
           <w:p>
             <w:r>
-              <w:t>87.4</w:t>
+              <w:t>87.2</w:t>
             </w:r>
           </w:p>
         </w:tc>
@@ -1305,7 +1305,7 @@
           </w:tcPr>
           <w:p>
             <w:r>
-              <w:t>73.8</w:t>
+              <w:t>73.0</w:t>
             </w:r>
           </w:p>
         </w:tc>
@@ -1315,7 +1315,7 @@
           </w:tcPr>
           <w:p>
             <w:r>
-              <w:t>79</w:t>
+              <w:t>14</w:t>
             </w:r>
           </w:p>
         </w:tc>
@@ -1327,7 +1327,7 @@
           </w:tcPr>
           <w:p>
             <w:r>
-              <w:t>2026-06-29 00:48:02</w:t>
+              <w:t>2026-06-29 02:15:25</w:t>
             </w:r>
           </w:p>
         </w:tc>
@@ -1337,7 +1337,7 @@
           </w:tcPr>
           <w:p>
             <w:r>
-              <w:t>135</w:t>
+              <w:t>136</w:t>
             </w:r>
           </w:p>
         </w:tc>
@@ -1347,7 +1347,7 @@
           </w:tcPr>
           <w:p>
             <w:r>
-              <w:t>79.7</w:t>
+              <w:t>78.9</w:t>
             </w:r>
           </w:p>
         </w:tc>
@@ -1357,7 +1357,7 @@
           </w:tcPr>
           <w:p>
             <w:r>
-              <w:t>87.4</w:t>
+              <w:t>87.2</w:t>
             </w:r>
           </w:p>
         </w:tc>
@@ -1377,7 +1377,7 @@
           </w:tcPr>
           <w:p>
             <w:r>
-              <w:t>73.5</w:t>
+              <w:t>73.0</w:t>
             </w:r>
           </w:p>
         </w:tc>
@@ -1387,7 +1387,7 @@
           </w:tcPr>
           <w:p>
             <w:r>
-              <w:t>4</w:t>
+              <w:t>134</w:t>
             </w:r>
           </w:p>
         </w:tc>
@@ -1399,7 +1399,7 @@
           </w:tcPr>
           <w:p>
             <w:r>
-              <w:t>2026-06-29 01:18:18</w:t>
+              <w:t>2026-06-29 02:45:25</w:t>
             </w:r>
           </w:p>
         </w:tc>
@@ -1409,7 +1409,7 @@
           </w:tcPr>
           <w:p>
             <w:r>
-              <w:t>135</w:t>
+              <w:t>136</w:t>
             </w:r>
           </w:p>
         </w:tc>
@@ -1419,7 +1419,7 @@
           </w:tcPr>
           <w:p>
             <w:r>
-              <w:t>79.7</w:t>
+              <w:t>78.9</w:t>
             </w:r>
           </w:p>
         </w:tc>
@@ -1429,7 +1429,7 @@
           </w:tcPr>
           <w:p>
             <w:r>
-              <w:t>87.3</w:t>
+              <w:t>87.2</w:t>
             </w:r>
           </w:p>
         </w:tc>
@@ -1449,7 +1449,7 @@
           </w:tcPr>
           <w:p>
             <w:r>
-              <w:t>73.4</w:t>
+              <w:t>73.0</w:t>
             </w:r>
           </w:p>
         </w:tc>
@@ -1459,7 +1459,7 @@
           </w:tcPr>
           <w:p>
             <w:r>
-              <w:t>125</w:t>
+              <w:t>254</w:t>
             </w:r>
           </w:p>
         </w:tc>
@@ -1471,7 +1471,7 @@
           </w:tcPr>
           <w:p>
             <w:r>
-              <w:t>2026-06-29 01:45:25</w:t>
+              <w:t>2026-06-29 03:15:28</w:t>
             </w:r>
           </w:p>
         </w:tc>
@@ -1501,7 +1501,7 @@
           </w:tcPr>
           <w:p>
             <w:r>
-              <w:t>87.2</w:t>
+              <w:t>87.1</w:t>
             </w:r>
           </w:p>
         </w:tc>
@@ -1531,7 +1531,7 @@
           </w:tcPr>
           <w:p>
             <w:r>
-              <w:t>14</w:t>
+              <w:t>31</w:t>
             </w:r>
           </w:p>
         </w:tc>
@@ -1543,7 +1543,7 @@
           </w:tcPr>
           <w:p>
             <w:r>
-              <w:t>2026-06-29 02:15:25</w:t>
+              <w:t>2026-06-29 03:45:40</w:t>
             </w:r>
           </w:p>
         </w:tc>
@@ -1573,7 +1573,7 @@
           </w:tcPr>
           <w:p>
             <w:r>
-              <w:t>87.2</w:t>
+              <w:t>87.0</w:t>
             </w:r>
           </w:p>
         </w:tc>
@@ -1603,7 +1603,7 @@
           </w:tcPr>
           <w:p>
             <w:r>
-              <w:t>134</w:t>
+              <w:t>86</w:t>
             </w:r>
           </w:p>
         </w:tc>
@@ -1615,7 +1615,7 @@
           </w:tcPr>
           <w:p>
             <w:r>
-              <w:t>2026-06-29 02:45:25</w:t>
+              <w:t>2026-06-29 04:15:55</w:t>
             </w:r>
           </w:p>
         </w:tc>
@@ -1645,7 +1645,7 @@
           </w:tcPr>
           <w:p>
             <w:r>
-              <w:t>87.2</w:t>
+              <w:t>87.0</w:t>
             </w:r>
           </w:p>
         </w:tc>
@@ -1675,7 +1675,7 @@
           </w:tcPr>
           <w:p>
             <w:r>
-              <w:t>254</w:t>
+              <w:t>207</w:t>
             </w:r>
           </w:p>
         </w:tc>
@@ -1687,7 +1687,7 @@
           </w:tcPr>
           <w:p>
             <w:r>
-              <w:t>2026-06-29 03:15:28</w:t>
+              <w:t>2026-06-29 04:33:10</w:t>
             </w:r>
           </w:p>
         </w:tc>
@@ -1697,7 +1697,7 @@
           </w:tcPr>
           <w:p>
             <w:r>
-              <w:t>136</w:t>
+              <w:t>137</w:t>
             </w:r>
           </w:p>
         </w:tc>
@@ -1707,7 +1707,7 @@
           </w:tcPr>
           <w:p>
             <w:r>
-              <w:t>78.9</w:t>
+              <w:t>78.1</w:t>
             </w:r>
           </w:p>
         </w:tc>
@@ -1717,7 +1717,7 @@
           </w:tcPr>
           <w:p>
             <w:r>
-              <w:t>87.1</w:t>
+              <w:t>86.9</w:t>
             </w:r>
           </w:p>
         </w:tc>
@@ -1737,7 +1737,7 @@
           </w:tcPr>
           <w:p>
             <w:r>
-              <w:t>73.0</w:t>
+              <w:t>72.5</w:t>
             </w:r>
           </w:p>
         </w:tc>
@@ -1747,7 +1747,7 @@
           </w:tcPr>
           <w:p>
             <w:r>
-              <w:t>31</w:t>
+              <w:t>276</w:t>
             </w:r>
           </w:p>
         </w:tc>
@@ -1768,7 +1768,7 @@
     </w:p>
     <w:p>
       <w:r>
-        <w:t>Section score: 78.9 / 100  (Grade: C+)</w:t>
+        <w:t>Section score: 78.1 / 100  (Grade: C+)</w:t>
       </w:r>
     </w:p>
     <w:p>
@@ -1911,7 +1911,7 @@
           </w:tcPr>
           <w:p>
             <w:r>
-              <w:t>65.1</w:t>
+              <w:t>61.9</w:t>
             </w:r>
           </w:p>
         </w:tc>
@@ -1921,7 +1921,7 @@
           </w:tcPr>
           <w:p>
             <w:r>
-              <w:t>9.8</w:t>
+              <w:t>9.3</w:t>
             </w:r>
           </w:p>
         </w:tc>
@@ -2007,7 +2007,7 @@
           </w:tcPr>
           <w:p>
             <w:r>
-              <w:t>74.8</w:t>
+              <w:t>73.9</w:t>
             </w:r>
           </w:p>
         </w:tc>
@@ -2017,7 +2017,7 @@
           </w:tcPr>
           <w:p>
             <w:r>
-              <w:t>7.5</w:t>
+              <w:t>7.4</w:t>
             </w:r>
           </w:p>
         </w:tc>
@@ -2039,7 +2039,7 @@
           </w:tcPr>
           <w:p>
             <w:r>
-              <w:t>46.5</w:t>
+              <w:t>45.5</w:t>
             </w:r>
           </w:p>
         </w:tc>
@@ -2049,7 +2049,7 @@
           </w:tcPr>
           <w:p>
             <w:r>
-              <w:t>11.6</w:t>
+              <w:t>11.4</w:t>
             </w:r>
           </w:p>
         </w:tc>
@@ -2090,7 +2090,7 @@
           </w:tcPr>
           <w:p>
             <w:r>
-              <w:t>$673.38</w:t>
+              <w:t>$672.91</w:t>
             </w:r>
           </w:p>
         </w:tc>
@@ -2112,7 +2112,7 @@
           </w:tcPr>
           <w:p>
             <w:r>
-              <w:t>34.68%</w:t>
+              <w:t>34.58%</w:t>
             </w:r>
           </w:p>
         </w:tc>
@@ -2134,7 +2134,7 @@
           </w:tcPr>
           <w:p>
             <w:r>
-              <w:t>$51.81</w:t>
+              <w:t>$46.81</w:t>
             </w:r>
           </w:p>
         </w:tc>
@@ -2178,7 +2178,7 @@
           </w:tcPr>
           <w:p>
             <w:r>
-              <w:t>0.6324</w:t>
+              <w:t>0.6277</w:t>
             </w:r>
           </w:p>
         </w:tc>
@@ -2200,7 +2200,7 @@
           </w:tcPr>
           <w:p>
             <w:r>
-              <w:t>0.5000 / 0.6552</w:t>
+              <w:t>0.5000 / 0.6496</w:t>
             </w:r>
           </w:p>
         </w:tc>
@@ -2222,7 +2222,7 @@
           </w:tcPr>
           <w:p>
             <w:r>
-              <w:t>1.2205</w:t>
+              <w:t>1.1951</w:t>
             </w:r>
           </w:p>
         </w:tc>
@@ -2244,7 +2244,7 @@
           </w:tcPr>
           <w:p>
             <w:r>
-              <w:t>136 / 136</w:t>
+              <w:t>137 / 137</w:t>
             </w:r>
           </w:p>
         </w:tc>
@@ -2266,7 +2266,7 @@
           </w:tcPr>
           <w:p>
             <w:r>
-              <w:t>$0.38</w:t>
+              <w:t>$0.34</w:t>
             </w:r>
           </w:p>
         </w:tc>
@@ -2397,7 +2397,7 @@
           </w:tcPr>
           <w:p>
             <w:r>
-              <w:t>0.520</w:t>
+              <w:t>0.500</w:t>
             </w:r>
           </w:p>
         </w:tc>
@@ -2449,7 +2449,7 @@
           </w:tcPr>
           <w:p>
             <w:r>
-              <w:t>0.510</w:t>
+              <w:t>0.520</w:t>
             </w:r>
           </w:p>
         </w:tc>
@@ -2501,7 +2501,7 @@
           </w:tcPr>
           <w:p>
             <w:r>
-              <w:t>0.500</w:t>
+              <w:t>0.510</w:t>
             </w:r>
           </w:p>
         </w:tc>
@@ -2511,7 +2511,7 @@
           </w:tcPr>
           <w:p>
             <w:r>
-              <w:t>down</w:t>
+              <w:t>up</w:t>
             </w:r>
           </w:p>
         </w:tc>
@@ -2521,7 +2521,7 @@
           </w:tcPr>
           <w:p>
             <w:r>
-              <w:t>Yes</w:t>
+              <w:t>No</w:t>
             </w:r>
           </w:p>
         </w:tc>
@@ -2531,7 +2531,7 @@
           </w:tcPr>
           <w:p>
             <w:r>
-              <w:t>$5.00</w:t>
+              <w:t>$-5.00</w:t>
             </w:r>
           </w:p>
         </w:tc>
@@ -2553,7 +2553,7 @@
           </w:tcPr>
           <w:p>
             <w:r>
-              <w:t>0.540</w:t>
+              <w:t>0.500</w:t>
             </w:r>
           </w:p>
         </w:tc>
@@ -2563,7 +2563,7 @@
           </w:tcPr>
           <w:p>
             <w:r>
-              <w:t>up</w:t>
+              <w:t>down</w:t>
             </w:r>
           </w:p>
         </w:tc>
@@ -2573,7 +2573,7 @@
           </w:tcPr>
           <w:p>
             <w:r>
-              <w:t>No</w:t>
+              <w:t>Yes</w:t>
             </w:r>
           </w:p>
         </w:tc>
@@ -2583,7 +2583,7 @@
           </w:tcPr>
           <w:p>
             <w:r>
-              <w:t>$-5.00</w:t>
+              <w:t>$5.00</w:t>
             </w:r>
           </w:p>
         </w:tc>
@@ -2615,7 +2615,7 @@
           </w:tcPr>
           <w:p>
             <w:r>
-              <w:t>down</w:t>
+              <w:t>up</w:t>
             </w:r>
           </w:p>
         </w:tc>
@@ -2625,7 +2625,7 @@
           </w:tcPr>
           <w:p>
             <w:r>
-              <w:t>Yes</w:t>
+              <w:t>No</w:t>
             </w:r>
           </w:p>
         </w:tc>
@@ -2635,7 +2635,7 @@
           </w:tcPr>
           <w:p>
             <w:r>
-              <w:t>$4.26</w:t>
+              <w:t>$-5.00</w:t>
             </w:r>
           </w:p>
         </w:tc>
@@ -2657,7 +2657,7 @@
           </w:tcPr>
           <w:p>
             <w:r>
-              <w:t>0.620</w:t>
+              <w:t>0.540</w:t>
             </w:r>
           </w:p>
         </w:tc>
@@ -2667,7 +2667,7 @@
           </w:tcPr>
           <w:p>
             <w:r>
-              <w:t>up</w:t>
+              <w:t>down</w:t>
             </w:r>
           </w:p>
         </w:tc>
@@ -2677,7 +2677,7 @@
           </w:tcPr>
           <w:p>
             <w:r>
-              <w:t>No</w:t>
+              <w:t>Yes</w:t>
             </w:r>
           </w:p>
         </w:tc>
@@ -2687,7 +2687,7 @@
           </w:tcPr>
           <w:p>
             <w:r>
-              <w:t>$-5.00</w:t>
+              <w:t>$4.26</w:t>
             </w:r>
           </w:p>
         </w:tc>
@@ -2709,7 +2709,7 @@
           </w:tcPr>
           <w:p>
             <w:r>
-              <w:t>0.570</w:t>
+              <w:t>0.620</w:t>
             </w:r>
           </w:p>
         </w:tc>
@@ -2719,7 +2719,7 @@
           </w:tcPr>
           <w:p>
             <w:r>
-              <w:t>down</w:t>
+              <w:t>up</w:t>
             </w:r>
           </w:p>
         </w:tc>
@@ -2729,7 +2729,7 @@
           </w:tcPr>
           <w:p>
             <w:r>
-              <w:t>Yes</w:t>
+              <w:t>No</w:t>
             </w:r>
           </w:p>
         </w:tc>
@@ -2739,7 +2739,7 @@
           </w:tcPr>
           <w:p>
             <w:r>
-              <w:t>$3.77</w:t>
+              <w:t>$-5.00</w:t>
             </w:r>
           </w:p>
         </w:tc>
@@ -2761,7 +2761,7 @@
           </w:tcPr>
           <w:p>
             <w:r>
-              <w:t>0.590</w:t>
+              <w:t>0.570</w:t>
             </w:r>
           </w:p>
         </w:tc>
@@ -2791,7 +2791,7 @@
           </w:tcPr>
           <w:p>
             <w:r>
-              <w:t>$3.47</w:t>
+              <w:t>$3.77</w:t>
             </w:r>
           </w:p>
         </w:tc>
@@ -2813,7 +2813,7 @@
           </w:tcPr>
           <w:p>
             <w:r>
-              <w:t>0.610</w:t>
+              <w:t>0.590</w:t>
             </w:r>
           </w:p>
         </w:tc>
@@ -2843,7 +2843,7 @@
           </w:tcPr>
           <w:p>
             <w:r>
-              <w:t>$3.20</w:t>
+              <w:t>$3.47</w:t>
             </w:r>
           </w:p>
         </w:tc>
@@ -2865,7 +2865,7 @@
           </w:tcPr>
           <w:p>
             <w:r>
-              <w:t>0.510</w:t>
+              <w:t>0.610</w:t>
             </w:r>
           </w:p>
         </w:tc>
@@ -2895,7 +2895,7 @@
           </w:tcPr>
           <w:p>
             <w:r>
-              <w:t>$4.80</w:t>
+              <w:t>$3.20</w:t>
             </w:r>
           </w:p>
         </w:tc>
@@ -2917,7 +2917,7 @@
           </w:tcPr>
           <w:p>
             <w:r>
-              <w:t>0.550</w:t>
+              <w:t>0.510</w:t>
             </w:r>
           </w:p>
         </w:tc>
@@ -2947,7 +2947,7 @@
           </w:tcPr>
           <w:p>
             <w:r>
-              <w:t>$4.09</w:t>
+              <w:t>$4.80</w:t>
             </w:r>
           </w:p>
         </w:tc>
@@ -2969,7 +2969,7 @@
           </w:tcPr>
           <w:p>
             <w:r>
-              <w:t>0.590</w:t>
+              <w:t>0.550</w:t>
             </w:r>
           </w:p>
         </w:tc>
@@ -2999,7 +2999,7 @@
           </w:tcPr>
           <w:p>
             <w:r>
-              <w:t>$3.47</w:t>
+              <w:t>$4.09</w:t>
             </w:r>
           </w:p>
         </w:tc>
@@ -3021,7 +3021,7 @@
           </w:tcPr>
           <w:p>
             <w:r>
-              <w:t>0.480</w:t>
+              <w:t>0.590</w:t>
             </w:r>
           </w:p>
         </w:tc>
@@ -3051,7 +3051,7 @@
           </w:tcPr>
           <w:p>
             <w:r>
-              <w:t>$5.42</w:t>
+              <w:t>$3.47</w:t>
             </w:r>
           </w:p>
         </w:tc>
@@ -3073,7 +3073,7 @@
           </w:tcPr>
           <w:p>
             <w:r>
-              <w:t>0.580</w:t>
+              <w:t>0.480</w:t>
             </w:r>
           </w:p>
         </w:tc>
@@ -3103,7 +3103,7 @@
           </w:tcPr>
           <w:p>
             <w:r>
-              <w:t>$3.62</w:t>
+              <w:t>$5.42</w:t>
             </w:r>
           </w:p>
         </w:tc>
@@ -3125,7 +3125,7 @@
           </w:tcPr>
           <w:p>
             <w:r>
-              <w:t>0.570</w:t>
+              <w:t>0.580</w:t>
             </w:r>
           </w:p>
         </w:tc>
@@ -3155,7 +3155,7 @@
           </w:tcPr>
           <w:p>
             <w:r>
-              <w:t>$3.77</w:t>
+              <w:t>$3.62</w:t>
             </w:r>
           </w:p>
         </w:tc>
@@ -3176,7 +3176,7 @@
     </w:p>
     <w:p>
       <w:r>
-        <w:t>Section score: 87.1 / 100  (Grade: B+)</w:t>
+        <w:t>Section score: 86.9 / 100  (Grade: B+)</w:t>
       </w:r>
     </w:p>
     <w:p>
@@ -3319,7 +3319,7 @@
           </w:tcPr>
           <w:p>
             <w:r>
-              <w:t>73.9</w:t>
+              <w:t>72.7</w:t>
             </w:r>
           </w:p>
         </w:tc>
@@ -3329,7 +3329,7 @@
           </w:tcPr>
           <w:p>
             <w:r>
-              <w:t>11.1</w:t>
+              <w:t>10.9</w:t>
             </w:r>
           </w:p>
         </w:tc>
@@ -3433,17 +3433,17 @@
     </w:tbl>
     <w:p>
       <w:r>
-        <w:t>Ticks: 63 · Reconciled: True · Readiness: not_ready</w:t>
+        <w:t>Ticks: 321 · Reconciled: True · Readiness: not_ready</w:t>
       </w:r>
     </w:p>
     <w:p>
       <w:r>
-        <w:t>Candidates created: 61599 · Terminals: {'accepted': 86, 'rejected': 47336, 'skipped': 13842, 'expired': 0, 'missing_data': 335}</w:t>
+        <w:t>Candidates created: 62207 · Terminals: {'accepted': 86, 'rejected': 47619, 'skipped': 14165, 'expired': 0, 'missing_data': 337}</w:t>
       </w:r>
     </w:p>
     <w:p>
       <w:r>
-        <w:t>Rejected by stage: {'directional': 36651, 'execution_gate': 237, 'context_gate': 879, 'directional_allowlist': 1364, 'down_bias_gate': 538, 'mtf_gate': 276, 'grok_decider': 3540, 'execution_realistic': 3, 'verifier': 61, 'mispricing_gate': 50, 'baseline_cohort_gate': 3737}</w:t>
+        <w:t>Rejected by stage: {'directional': 36922, 'execution_gate': 238, 'context_gate': 879, 'directional_allowlist': 1364, 'down_bias_gate': 538, 'mtf_gate': 276, 'grok_decider': 3540, 'execution_realistic': 3, 'verifier': 61, 'mispricing_gate': 50, 'baseline_cohort_gate': 3748}</w:t>
       </w:r>
     </w:p>
     <w:p>
@@ -4374,7 +4374,7 @@
           </w:tcPr>
           <w:p>
             <w:r>
-              <w:t>0.4180</w:t>
+              <w:t>0.4194</w:t>
             </w:r>
           </w:p>
         </w:tc>
@@ -4396,7 +4396,7 @@
           </w:tcPr>
           <w:p>
             <w:r>
-              <w:t>0.4769</w:t>
+              <w:t>0.4778</w:t>
             </w:r>
           </w:p>
         </w:tc>
@@ -4426,7 +4426,7 @@
     </w:tbl>
     <w:p>
       <w:r>
-        <w:t>TV alerts: received 2026 · valid 2007 · rejected 2</w:t>
+        <w:t>TV alerts: received 2115 · valid 2096 · rejected 2</w:t>
       </w:r>
     </w:p>
     <w:sectPr>

</xml_diff>